<commit_message>
1. Fixed formatting for medium and high level checklists
</commit_message>
<xml_diff>
--- a/res/template_high.docx
+++ b/res/template_high.docx
@@ -13,6 +13,16 @@
           <w:u w:val="single"/>
         </w:rPr>
       </w:pPr>
+      <w:r>
+        <w:rPr>
+          <w:b/>
+          <w:bCs/>
+          <w:sz w:val="40"/>
+          <w:szCs w:val="40"/>
+          <w:u w:val="single"/>
+        </w:rPr>
+        <w:t>High Level</w:t>
+      </w:r>
       <w:r>
         <w:rPr>
           <w:rFonts w:hint="eastAsia"/>
@@ -22,7 +32,39 @@
           <w:szCs w:val="40"/>
           <w:u w:val="single"/>
         </w:rPr>
-        <w:t>Curation log</w:t>
+        <w:t xml:space="preserve"> </w:t>
+      </w:r>
+      <w:r>
+        <w:rPr>
+          <w:rFonts w:hint="eastAsia"/>
+          <w:b/>
+          <w:bCs/>
+          <w:sz w:val="40"/>
+          <w:szCs w:val="40"/>
+          <w:u w:val="single"/>
+        </w:rPr>
+        <w:t xml:space="preserve">Curation </w:t>
+      </w:r>
+      <w:r>
+        <w:rPr>
+          <w:b/>
+          <w:bCs/>
+          <w:sz w:val="40"/>
+          <w:szCs w:val="40"/>
+          <w:u w:val="single"/>
+        </w:rPr>
+        <w:t>L</w:t>
+      </w:r>
+      <w:r>
+        <w:rPr>
+          <w:rFonts w:hint="eastAsia"/>
+          <w:b/>
+          <w:bCs/>
+          <w:sz w:val="40"/>
+          <w:szCs w:val="40"/>
+          <w:u w:val="single"/>
+        </w:rPr>
+        <w:t>og</w:t>
       </w:r>
     </w:p>
     <w:p>
@@ -1284,15 +1326,15 @@
               <w:br/>
             </w:r>
             <w:r>
-              <w:t>{% for item in template_dict.dv_record.</w:t>
+              <w:t>{% for item in template_</w:t>
             </w:r>
             <w:proofErr w:type="gramStart"/>
             <w:r>
-              <w:t>comments %}</w:t>
+              <w:t>dict.dv</w:t>
             </w:r>
             <w:proofErr w:type="gramEnd"/>
             <w:r>
-              <w:t xml:space="preserve"> </w:t>
+              <w:t xml:space="preserve">_record.comments %} </w:t>
             </w:r>
           </w:p>
           <w:p>
@@ -1569,14 +1611,14 @@
               <w:rPr>
                 <w:lang w:val="en-US"/>
               </w:rPr>
-              <w:t xml:space="preserve"> %}</w:t>
+              <w:t xml:space="preserve"> %}X{</w:t>
             </w:r>
             <w:proofErr w:type="gramEnd"/>
             <w:r>
               <w:rPr>
                 <w:lang w:val="en-US"/>
               </w:rPr>
-              <w:t>X{% endif %}</w:t>
+              <w:t>% endif %}</w:t>
             </w:r>
           </w:p>
         </w:tc>
@@ -1617,7 +1659,11 @@
               <w:t xml:space="preserve"> </w:t>
             </w:r>
             <w:r>
-              <w:t>name_name_of_dataverse</w:t>
+              <w:t>name_name_of_</w:t>
+            </w:r>
+            <w:proofErr w:type="gramStart"/>
+            <w:r>
+              <w:t>dataverse</w:t>
             </w:r>
             <w:r>
               <w:rPr>
@@ -1631,6 +1677,7 @@
               </w:rPr>
               <w:t>!</w:t>
             </w:r>
+            <w:proofErr w:type="gramEnd"/>
             <w:r>
               <w:rPr>
                 <w:lang w:val="en-US"/>
@@ -1848,6 +1895,9 @@
           <w:p>
             <w:r>
               <w:t>Python script</w:t>
+            </w:r>
+            <w:r>
+              <w:t>ed</w:t>
             </w:r>
           </w:p>
         </w:tc>
@@ -2673,16 +2723,22 @@
               <w:rPr>
                 <w:lang w:val="en-US"/>
               </w:rPr>
-              <w:t>{% for item in template_dict.file_open.</w:t>
+              <w:t>{% for item in template_</w:t>
             </w:r>
             <w:proofErr w:type="gramStart"/>
             <w:r>
               <w:rPr>
                 <w:lang w:val="en-US"/>
               </w:rPr>
-              <w:t>comments %}</w:t>
+              <w:t>dict.file</w:t>
             </w:r>
             <w:proofErr w:type="gramEnd"/>
+            <w:r>
+              <w:rPr>
+                <w:lang w:val="en-US"/>
+              </w:rPr>
+              <w:t>_open.comments %}</w:t>
+            </w:r>
           </w:p>
           <w:p>
             <w:pPr>
@@ -2695,26 +2751,28 @@
                 <w:lang w:val="en-US"/>
               </w:rPr>
             </w:pPr>
+            <w:proofErr w:type="gramStart"/>
             <w:r>
               <w:rPr>
                 <w:lang w:val="en-US"/>
               </w:rPr>
-              <w:t>{{ item.file_</w:t>
+              <w:t>{{ item</w:t>
+            </w:r>
+            <w:proofErr w:type="gramEnd"/>
+            <w:r>
+              <w:rPr>
+                <w:lang w:val="en-US"/>
+              </w:rPr>
+              <w:t xml:space="preserve">.file_name }}{% </w:t>
             </w:r>
             <w:proofErr w:type="gramStart"/>
             <w:r>
               <w:rPr>
                 <w:lang w:val="en-US"/>
               </w:rPr>
-              <w:t>name }}{%</w:t>
+              <w:t>endfor %}</w:t>
             </w:r>
             <w:proofErr w:type="gramEnd"/>
-            <w:r>
-              <w:rPr>
-                <w:lang w:val="en-US"/>
-              </w:rPr>
-              <w:t xml:space="preserve"> endfor %}</w:t>
-            </w:r>
           </w:p>
           <w:p>
             <w:pPr>
@@ -2760,26 +2818,28 @@
                 <w:lang w:val="en-US"/>
               </w:rPr>
             </w:pPr>
+            <w:proofErr w:type="gramStart"/>
             <w:r>
               <w:rPr>
                 <w:lang w:val="en-US"/>
               </w:rPr>
-              <w:t>{{ item.file_</w:t>
+              <w:t>{{ item</w:t>
+            </w:r>
+            <w:proofErr w:type="gramEnd"/>
+            <w:r>
+              <w:rPr>
+                <w:lang w:val="en-US"/>
+              </w:rPr>
+              <w:t xml:space="preserve">.file_name }}{% </w:t>
             </w:r>
             <w:proofErr w:type="gramStart"/>
             <w:r>
               <w:rPr>
                 <w:lang w:val="en-US"/>
               </w:rPr>
-              <w:t>name }}{%</w:t>
+              <w:t>endfor %}</w:t>
             </w:r>
             <w:proofErr w:type="gramEnd"/>
-            <w:r>
-              <w:rPr>
-                <w:lang w:val="en-US"/>
-              </w:rPr>
-              <w:t xml:space="preserve"> endfor %}</w:t>
-            </w:r>
           </w:p>
           <w:p/>
         </w:tc>
@@ -3076,16 +3136,22 @@
               <w:rPr>
                 <w:lang w:val="en-US"/>
               </w:rPr>
-              <w:t>{% for item in template_dict.special_characters.</w:t>
+              <w:t>{% for item in template_</w:t>
             </w:r>
             <w:proofErr w:type="gramStart"/>
             <w:r>
               <w:rPr>
                 <w:lang w:val="en-US"/>
               </w:rPr>
-              <w:t>comments %}</w:t>
+              <w:t>dict.special</w:t>
             </w:r>
             <w:proofErr w:type="gramEnd"/>
+            <w:r>
+              <w:rPr>
+                <w:lang w:val="en-US"/>
+              </w:rPr>
+              <w:t>_characters.comments %}</w:t>
+            </w:r>
           </w:p>
           <w:p>
             <w:pPr>
@@ -3095,25 +3161,19 @@
                 <w:numId w:val="45"/>
               </w:numPr>
             </w:pPr>
+            <w:proofErr w:type="gramStart"/>
             <w:r>
               <w:rPr>
                 <w:lang w:val="en-US"/>
               </w:rPr>
-              <w:t>{{ item.file_</w:t>
-            </w:r>
-            <w:proofErr w:type="gramStart"/>
+              <w:t>{{ item</w:t>
+            </w:r>
+            <w:proofErr w:type="gramEnd"/>
             <w:r>
               <w:rPr>
                 <w:lang w:val="en-US"/>
               </w:rPr>
-              <w:t>name }}{%</w:t>
-            </w:r>
-            <w:proofErr w:type="gramEnd"/>
-            <w:r>
-              <w:rPr>
-                <w:lang w:val="en-US"/>
-              </w:rPr>
-              <w:t xml:space="preserve"> endfor %}</w:t>
+              <w:t>.file_name }}{% endfor %}</w:t>
             </w:r>
           </w:p>
         </w:tc>
@@ -3409,16 +3469,22 @@
                 <w:lang w:val="en-US"/>
               </w:rPr>
               <w:br/>
-              <w:t>{% for item in template_dict.file_ext.</w:t>
+              <w:t>{% for item in template_</w:t>
             </w:r>
             <w:proofErr w:type="gramStart"/>
             <w:r>
               <w:rPr>
                 <w:lang w:val="en-US"/>
               </w:rPr>
-              <w:t>comments %}</w:t>
+              <w:t>dict.file</w:t>
             </w:r>
             <w:proofErr w:type="gramEnd"/>
+            <w:r>
+              <w:rPr>
+                <w:lang w:val="en-US"/>
+              </w:rPr>
+              <w:t>_ext.comments %}</w:t>
+            </w:r>
           </w:p>
           <w:p>
             <w:pPr>
@@ -3429,25 +3495,19 @@
               </w:numPr>
               <w:spacing w:line="256" w:lineRule="auto"/>
             </w:pPr>
+            <w:proofErr w:type="gramStart"/>
             <w:r>
               <w:rPr>
                 <w:lang w:val="en-US"/>
               </w:rPr>
-              <w:t>{{ item.file_</w:t>
-            </w:r>
-            <w:proofErr w:type="gramStart"/>
+              <w:t>{{ item</w:t>
+            </w:r>
+            <w:proofErr w:type="gramEnd"/>
             <w:r>
               <w:rPr>
                 <w:lang w:val="en-US"/>
               </w:rPr>
-              <w:t>name }}{%</w:t>
-            </w:r>
-            <w:proofErr w:type="gramEnd"/>
-            <w:r>
-              <w:rPr>
-                <w:lang w:val="en-US"/>
-              </w:rPr>
-              <w:t xml:space="preserve"> endfor %}</w:t>
+              <w:t>.file_name }}{% endfor %}</w:t>
             </w:r>
           </w:p>
         </w:tc>
@@ -3775,28 +3835,34 @@
               <w:rPr>
                 <w:lang w:val="en-US"/>
               </w:rPr>
-              <w:t>{% for item in template_dict.</w:t>
-            </w:r>
+              <w:t>{% for item in template_</w:t>
+            </w:r>
+            <w:proofErr w:type="gramStart"/>
             <w:r>
               <w:rPr>
                 <w:lang w:val="en-US"/>
               </w:rPr>
-              <w:t>common_file_format</w:t>
+              <w:t>dict.</w:t>
             </w:r>
             <w:r>
               <w:rPr>
                 <w:lang w:val="en-US"/>
               </w:rPr>
-              <w:t>.</w:t>
-            </w:r>
-            <w:proofErr w:type="gramStart"/>
+              <w:t>common</w:t>
+            </w:r>
+            <w:proofErr w:type="gramEnd"/>
             <w:r>
               <w:rPr>
                 <w:lang w:val="en-US"/>
               </w:rPr>
-              <w:t>comments %}</w:t>
-            </w:r>
-            <w:proofErr w:type="gramEnd"/>
+              <w:t>_file_format</w:t>
+            </w:r>
+            <w:r>
+              <w:rPr>
+                <w:lang w:val="en-US"/>
+              </w:rPr>
+              <w:t>.comments %}</w:t>
+            </w:r>
           </w:p>
           <w:p>
             <w:pPr>
@@ -3805,25 +3871,19 @@
                 <w:numId w:val="9"/>
               </w:numPr>
             </w:pPr>
+            <w:proofErr w:type="gramStart"/>
             <w:r>
               <w:rPr>
                 <w:lang w:val="en-US"/>
               </w:rPr>
-              <w:t>{{ item.file_</w:t>
-            </w:r>
-            <w:proofErr w:type="gramStart"/>
+              <w:t>{{ item</w:t>
+            </w:r>
+            <w:proofErr w:type="gramEnd"/>
             <w:r>
               <w:rPr>
                 <w:lang w:val="en-US"/>
               </w:rPr>
-              <w:t>name }}{%</w:t>
-            </w:r>
-            <w:proofErr w:type="gramEnd"/>
-            <w:r>
-              <w:rPr>
-                <w:lang w:val="en-US"/>
-              </w:rPr>
-              <w:t xml:space="preserve"> endfor %}</w:t>
+              <w:t>.file_name }}{% endfor %}</w:t>
             </w:r>
           </w:p>
         </w:tc>
@@ -4674,21 +4734,35 @@
                 <w:lang w:val="en-US"/>
               </w:rPr>
               <w:br/>
-              <w:t>{% for item in template_dict.readme_file.</w:t>
+              <w:t>{% for item in template_</w:t>
             </w:r>
             <w:proofErr w:type="gramStart"/>
             <w:r>
               <w:rPr>
                 <w:lang w:val="en-US"/>
               </w:rPr>
-              <w:t>comments %}{{</w:t>
+              <w:t>dict.readme</w:t>
             </w:r>
             <w:proofErr w:type="gramEnd"/>
             <w:r>
               <w:rPr>
                 <w:lang w:val="en-US"/>
               </w:rPr>
-              <w:t xml:space="preserve"> loop.index }}. {{ item.file_name }}</w:t>
+              <w:t xml:space="preserve">_file.comments %}{{ loop.index }}. </w:t>
+            </w:r>
+            <w:proofErr w:type="gramStart"/>
+            <w:r>
+              <w:rPr>
+                <w:lang w:val="en-US"/>
+              </w:rPr>
+              <w:t>{{ item</w:t>
+            </w:r>
+            <w:proofErr w:type="gramEnd"/>
+            <w:r>
+              <w:rPr>
+                <w:lang w:val="en-US"/>
+              </w:rPr>
+              <w:t>.file_name }}</w:t>
             </w:r>
             <w:r>
               <w:rPr>
@@ -7050,7 +7124,21 @@
               <w:rPr>
                 <w:lang w:val="en-US"/>
               </w:rPr>
-              <w:t>{% for item in template_dict.typo.</w:t>
+              <w:t>{% for item in template_</w:t>
+            </w:r>
+            <w:proofErr w:type="gramStart"/>
+            <w:r>
+              <w:rPr>
+                <w:lang w:val="en-US"/>
+              </w:rPr>
+              <w:t>dict.typo</w:t>
+            </w:r>
+            <w:proofErr w:type="gramEnd"/>
+            <w:r>
+              <w:rPr>
+                <w:lang w:val="en-US"/>
+              </w:rPr>
+              <w:t>.</w:t>
             </w:r>
             <w:proofErr w:type="gramStart"/>
             <w:r>
@@ -7074,14 +7162,14 @@
               <w:rPr>
                 <w:lang w:val="en-US"/>
               </w:rPr>
-              <w:t>{{ item }}{%</w:t>
+              <w:t>{{ item</w:t>
             </w:r>
             <w:proofErr w:type="gramEnd"/>
             <w:r>
               <w:rPr>
                 <w:lang w:val="en-US"/>
               </w:rPr>
-              <w:t xml:space="preserve"> endfor %}</w:t>
+              <w:t xml:space="preserve"> }}{% endfor %}</w:t>
             </w:r>
           </w:p>
         </w:tc>
@@ -18637,6 +18725,7 @@
   <w:style w:type="character" w:default="1" w:styleId="DefaultParagraphFont">
     <w:name w:val="Default Paragraph Font"/>
     <w:uiPriority w:val="1"/>
+    <w:semiHidden/>
     <w:unhideWhenUsed/>
   </w:style>
   <w:style w:type="table" w:default="1" w:styleId="TableNormal">

</xml_diff>

<commit_message>
1. Changed special character checks for `<>:"/\\|?*,@$~\r\n`
</commit_message>
<xml_diff>
--- a/res/template_high.docx
+++ b/res/template_high.docx
@@ -2946,16 +2946,41 @@
                 <w:b/>
                 <w:bCs/>
               </w:rPr>
-              <w:t>Are all files free of the following special characters (</w:t>
-            </w:r>
-          </w:p>
-          <w:p>
+              <w:t xml:space="preserve">Are all files free of the following special characters </w:t>
+            </w:r>
             <w:r>
               <w:rPr>
                 <w:b/>
                 <w:bCs/>
-              </w:rPr>
-              <w:t>&amp; , * , % , . , # , * , ( ) , ! , @$ , ^ , ~ , ‘ , { } , [ ] , ? , &lt; &gt;) ?</w:t>
+                <w:lang w:val="en-US"/>
+              </w:rPr>
+              <w:t>(</w:t>
+            </w:r>
+            <w:r>
+              <w:rPr>
+                <w:b/>
+                <w:bCs/>
+                <w:lang w:val="en-US"/>
+              </w:rPr>
+              <w:t>&lt;&gt;:"/\</w:t>
+            </w:r>
+            <w:proofErr w:type="gramStart"/>
+            <w:r>
+              <w:rPr>
+                <w:b/>
+                <w:bCs/>
+                <w:lang w:val="en-US"/>
+              </w:rPr>
+              <w:t>|?*</w:t>
+            </w:r>
+            <w:proofErr w:type="gramEnd"/>
+            <w:r>
+              <w:rPr>
+                <w:b/>
+                <w:bCs/>
+                <w:lang w:val="en-US"/>
+              </w:rPr>
+              <w:t>,@$~)?</w:t>
             </w:r>
           </w:p>
         </w:tc>

</xml_diff>

<commit_message>
1. Fixed output in item 1.2 for both checklist in word.
</commit_message>
<xml_diff>
--- a/res/template_high.docx
+++ b/res/template_high.docx
@@ -72,14 +72,7 @@
         <w:rPr>
           <w:rFonts w:hint="eastAsia"/>
         </w:rPr>
-        <w:t xml:space="preserve">Ticket number: </w:t>
-      </w:r>
-      <w:proofErr w:type="gramStart"/>
-      <w:r>
-        <w:rPr>
-          <w:rFonts w:hint="eastAsia"/>
-        </w:rPr>
-        <w:t>{</w:t>
+        <w:t>Ticket number: {</w:t>
       </w:r>
       <w:r>
         <w:rPr>
@@ -93,12 +86,9 @@
         </w:rPr>
         <w:t xml:space="preserve"> </w:t>
       </w:r>
+      <w:proofErr w:type="spellStart"/>
       <w:r>
-        <w:t>project</w:t>
-      </w:r>
-      <w:proofErr w:type="gramEnd"/>
-      <w:r>
-        <w:t>_info</w:t>
+        <w:t>project_info</w:t>
       </w:r>
       <w:r>
         <w:rPr>
@@ -109,6 +99,7 @@
       <w:r>
         <w:t>ticket_number</w:t>
       </w:r>
+      <w:proofErr w:type="spellEnd"/>
       <w:r>
         <w:rPr>
           <w:rFonts w:hint="eastAsia"/>
@@ -139,27 +130,24 @@
         <w:rPr>
           <w:rFonts w:hint="eastAsia"/>
         </w:rPr>
-        <w:t xml:space="preserve"> </w:t>
+        <w:t xml:space="preserve"> {{ </w:t>
       </w:r>
-      <w:proofErr w:type="gramStart"/>
+      <w:proofErr w:type="spellStart"/>
       <w:r>
-        <w:rPr>
-          <w:rFonts w:hint="eastAsia"/>
-        </w:rPr>
-        <w:t xml:space="preserve">{{ </w:t>
-      </w:r>
-      <w:r>
-        <w:t>project</w:t>
-      </w:r>
-      <w:proofErr w:type="gramEnd"/>
-      <w:r>
-        <w:t>_info</w:t>
+        <w:t>project_info</w:t>
       </w:r>
       <w:r>
         <w:rPr>
           <w:rFonts w:hint="eastAsia"/>
         </w:rPr>
-        <w:t>.curator_name }}</w:t>
+        <w:t>.curator_name</w:t>
+      </w:r>
+      <w:proofErr w:type="spellEnd"/>
+      <w:r>
+        <w:rPr>
+          <w:rFonts w:hint="eastAsia"/>
+        </w:rPr>
+        <w:t xml:space="preserve"> }}</w:t>
       </w:r>
     </w:p>
     <w:p>
@@ -167,21 +155,11 @@
         <w:rPr>
           <w:rFonts w:hint="eastAsia"/>
         </w:rPr>
-        <w:t xml:space="preserve">Curator email: </w:t>
+        <w:t xml:space="preserve">Curator email: {{ </w:t>
       </w:r>
-      <w:proofErr w:type="gramStart"/>
+      <w:proofErr w:type="spellStart"/>
       <w:r>
-        <w:rPr>
-          <w:rFonts w:hint="eastAsia"/>
-        </w:rPr>
-        <w:t xml:space="preserve">{{ </w:t>
-      </w:r>
-      <w:r>
-        <w:t>project</w:t>
-      </w:r>
-      <w:proofErr w:type="gramEnd"/>
-      <w:r>
-        <w:t>_info</w:t>
+        <w:t>project_info</w:t>
       </w:r>
       <w:r>
         <w:rPr>
@@ -192,6 +170,7 @@
       <w:r>
         <w:t>curator_email</w:t>
       </w:r>
+      <w:proofErr w:type="spellEnd"/>
       <w:r>
         <w:rPr>
           <w:rFonts w:hint="eastAsia"/>
@@ -206,29 +185,23 @@
         </w:rPr>
         <w:t xml:space="preserve">Dataset title: </w:t>
       </w:r>
-      <w:proofErr w:type="gramStart"/>
       <w:r>
         <w:rPr>
           <w:rFonts w:hint="eastAsia"/>
         </w:rPr>
         <w:t xml:space="preserve">{{ </w:t>
       </w:r>
+      <w:proofErr w:type="spellStart"/>
       <w:r>
         <w:rPr>
           <w:rFonts w:hint="eastAsia"/>
         </w:rPr>
-        <w:t>dataset</w:t>
-      </w:r>
-      <w:proofErr w:type="gramEnd"/>
-      <w:r>
-        <w:rPr>
-          <w:rFonts w:hint="eastAsia"/>
-        </w:rPr>
-        <w:t>.</w:t>
+        <w:t>dataset.</w:t>
       </w:r>
       <w:r>
         <w:t>DatasetTitle</w:t>
       </w:r>
+      <w:proofErr w:type="spellEnd"/>
       <w:r>
         <w:rPr>
           <w:rFonts w:hint="eastAsia"/>
@@ -262,14 +235,7 @@
         <w:rPr>
           <w:rFonts w:hint="eastAsia"/>
         </w:rPr>
-        <w:t xml:space="preserve">: </w:t>
-      </w:r>
-      <w:proofErr w:type="gramStart"/>
-      <w:r>
-        <w:rPr>
-          <w:rFonts w:hint="eastAsia"/>
-        </w:rPr>
-        <w:t>{</w:t>
+        <w:t>: {</w:t>
       </w:r>
       <w:r>
         <w:rPr>
@@ -283,22 +249,17 @@
         </w:rPr>
         <w:t xml:space="preserve"> </w:t>
       </w:r>
+      <w:proofErr w:type="spellStart"/>
       <w:r>
         <w:rPr>
           <w:rFonts w:hint="eastAsia"/>
         </w:rPr>
-        <w:t>dataset</w:t>
-      </w:r>
-      <w:proofErr w:type="gramEnd"/>
-      <w:r>
-        <w:rPr>
-          <w:rFonts w:hint="eastAsia"/>
-        </w:rPr>
-        <w:t>.</w:t>
+        <w:t>dataset.</w:t>
       </w:r>
       <w:r>
         <w:t>DatasetPersistentId</w:t>
       </w:r>
+      <w:proofErr w:type="spellEnd"/>
       <w:r>
         <w:rPr>
           <w:rFonts w:hint="eastAsia"/>
@@ -317,21 +278,7 @@
         <w:rPr>
           <w:rFonts w:hint="eastAsia"/>
         </w:rPr>
-        <w:t xml:space="preserve">Dataset ID (versioned): </w:t>
-      </w:r>
-      <w:proofErr w:type="gramStart"/>
-      <w:r>
-        <w:rPr>
-          <w:rFonts w:hint="eastAsia"/>
-        </w:rPr>
-        <w:t>{{ dataset.ID</w:t>
-      </w:r>
-      <w:proofErr w:type="gramEnd"/>
-      <w:r>
-        <w:rPr>
-          <w:rFonts w:hint="eastAsia"/>
-        </w:rPr>
-        <w:t xml:space="preserve">  }}</w:t>
+        <w:t>Dataset ID (versioned): {{ dataset.ID  }}</w:t>
       </w:r>
     </w:p>
     <w:p>
@@ -339,14 +286,7 @@
         <w:rPr>
           <w:rFonts w:hint="eastAsia"/>
         </w:rPr>
-        <w:t xml:space="preserve">Dataset access URL: </w:t>
-      </w:r>
-      <w:proofErr w:type="gramStart"/>
-      <w:r>
-        <w:rPr>
-          <w:rFonts w:hint="eastAsia"/>
-        </w:rPr>
-        <w:t>{</w:t>
+        <w:t>Dataset access URL: {</w:t>
       </w:r>
       <w:r>
         <w:rPr>
@@ -358,18 +298,19 @@
         <w:rPr>
           <w:rFonts w:hint="eastAsia"/>
         </w:rPr>
-        <w:t xml:space="preserve"> dataset</w:t>
+        <w:t xml:space="preserve"> </w:t>
       </w:r>
-      <w:proofErr w:type="gramEnd"/>
+      <w:proofErr w:type="spellStart"/>
       <w:r>
         <w:rPr>
           <w:rFonts w:hint="eastAsia"/>
         </w:rPr>
-        <w:t>.</w:t>
+        <w:t>dataset.</w:t>
       </w:r>
       <w:r>
         <w:t>DatasetURL</w:t>
       </w:r>
+      <w:proofErr w:type="spellEnd"/>
       <w:r>
         <w:rPr>
           <w:rFonts w:hint="eastAsia"/>
@@ -417,7 +358,6 @@
         </w:rPr>
         <w:t xml:space="preserve">date: </w:t>
       </w:r>
-      <w:proofErr w:type="gramStart"/>
       <w:r>
         <w:rPr>
           <w:rFonts w:hint="eastAsia"/>
@@ -442,7 +382,6 @@
         </w:rPr>
         <w:t>timestamp</w:t>
       </w:r>
-      <w:proofErr w:type="gramEnd"/>
       <w:r>
         <w:rPr>
           <w:rFonts w:hint="eastAsia"/>
@@ -1139,7 +1078,14 @@
               <w:rPr>
                 <w:lang w:val="en-US"/>
               </w:rPr>
-              <w:t>{% if template_dict.</w:t>
+              <w:t xml:space="preserve">{% if </w:t>
+            </w:r>
+            <w:proofErr w:type="spellStart"/>
+            <w:r>
+              <w:rPr>
+                <w:lang w:val="en-US"/>
+              </w:rPr>
+              <w:t>template_dict.</w:t>
             </w:r>
             <w:r>
               <w:rPr>
@@ -1152,7 +1098,14 @@
               <w:rPr>
                 <w:lang w:val="en-US"/>
               </w:rPr>
-              <w:t xml:space="preserve">.comments|length </w:t>
+              <w:t>.comments|length</w:t>
+            </w:r>
+            <w:proofErr w:type="spellEnd"/>
+            <w:r>
+              <w:rPr>
+                <w:lang w:val="en-US"/>
+              </w:rPr>
+              <w:t xml:space="preserve"> </w:t>
             </w:r>
             <w:r>
               <w:rPr>
@@ -1198,7 +1151,14 @@
               <w:rPr>
                 <w:lang w:val="en-US"/>
               </w:rPr>
-              <w:t>{% if template_dict.</w:t>
+              <w:t xml:space="preserve">{% if </w:t>
+            </w:r>
+            <w:proofErr w:type="spellStart"/>
+            <w:r>
+              <w:rPr>
+                <w:lang w:val="en-US"/>
+              </w:rPr>
+              <w:t>template_dict.</w:t>
             </w:r>
             <w:r>
               <w:rPr>
@@ -1211,7 +1171,14 @@
               <w:rPr>
                 <w:lang w:val="en-US"/>
               </w:rPr>
-              <w:t xml:space="preserve">.comments|length </w:t>
+              <w:t>.comments|length</w:t>
+            </w:r>
+            <w:proofErr w:type="spellEnd"/>
+            <w:r>
+              <w:rPr>
+                <w:lang w:val="en-US"/>
+              </w:rPr>
+              <w:t xml:space="preserve"> </w:t>
             </w:r>
             <w:r>
               <w:rPr>
@@ -1317,7 +1284,21 @@
               <w:rPr>
                 <w:lang w:val="en-US"/>
               </w:rPr>
-              <w:t>If relevant, list previously created dataverse:</w:t>
+              <w:t xml:space="preserve">If relevant, list previously created </w:t>
+            </w:r>
+            <w:proofErr w:type="spellStart"/>
+            <w:r>
+              <w:rPr>
+                <w:lang w:val="en-US"/>
+              </w:rPr>
+              <w:t>dataverse</w:t>
+            </w:r>
+            <w:proofErr w:type="spellEnd"/>
+            <w:r>
+              <w:rPr>
+                <w:lang w:val="en-US"/>
+              </w:rPr>
+              <w:t>:</w:t>
             </w:r>
             <w:r>
               <w:rPr>
@@ -1326,26 +1307,34 @@
               <w:br/>
             </w:r>
             <w:r>
-              <w:t>{% for item in template_</w:t>
-            </w:r>
-            <w:proofErr w:type="gramStart"/>
-            <w:r>
-              <w:t>dict.dv</w:t>
-            </w:r>
-            <w:proofErr w:type="gramEnd"/>
-            <w:r>
-              <w:t xml:space="preserve">_record.comments %} </w:t>
-            </w:r>
-          </w:p>
-          <w:p>
-            <w:r>
-              <w:t xml:space="preserve">{% for author, dataverses in </w:t>
-            </w:r>
-            <w:proofErr w:type="gramStart"/>
+              <w:t xml:space="preserve">{% for item in </w:t>
+            </w:r>
+            <w:proofErr w:type="spellStart"/>
+            <w:r>
+              <w:t>template_dict.dv_record.comments</w:t>
+            </w:r>
+            <w:proofErr w:type="spellEnd"/>
+            <w:r>
+              <w:t xml:space="preserve"> %} </w:t>
+            </w:r>
+          </w:p>
+          <w:p>
+            <w:r>
+              <w:t xml:space="preserve">{% for author, </w:t>
+            </w:r>
+            <w:proofErr w:type="spellStart"/>
+            <w:r>
+              <w:t>dataverses</w:t>
+            </w:r>
+            <w:proofErr w:type="spellEnd"/>
+            <w:r>
+              <w:t xml:space="preserve"> in </w:t>
+            </w:r>
+            <w:proofErr w:type="spellStart"/>
             <w:r>
               <w:t>item.items</w:t>
             </w:r>
-            <w:proofErr w:type="gramEnd"/>
+            <w:proofErr w:type="spellEnd"/>
             <w:r>
               <w:t>() %} {{ author }}</w:t>
             </w:r>
@@ -1358,15 +1347,26 @@
           </w:p>
           <w:p>
             <w:r>
-              <w:t xml:space="preserve">{% for dataverse in dataverses %} </w:t>
-            </w:r>
-            <w:proofErr w:type="gramStart"/>
-            <w:r>
-              <w:t>{{ loop</w:t>
-            </w:r>
-            <w:proofErr w:type="gramEnd"/>
-            <w:r>
-              <w:t>.index }}.</w:t>
+              <w:t xml:space="preserve">{% for dataverse in </w:t>
+            </w:r>
+            <w:proofErr w:type="spellStart"/>
+            <w:r>
+              <w:t>dataverses</w:t>
+            </w:r>
+            <w:proofErr w:type="spellEnd"/>
+            <w:r>
+              <w:t xml:space="preserve"> %} </w:t>
+            </w:r>
+            <w:r>
+              <w:t xml:space="preserve">{{ </w:t>
+            </w:r>
+            <w:proofErr w:type="spellStart"/>
+            <w:r>
+              <w:t>loop.index</w:t>
+            </w:r>
+            <w:proofErr w:type="spellEnd"/>
+            <w:r>
+              <w:t xml:space="preserve"> }}.</w:t>
             </w:r>
             <w:r>
               <w:rPr>
@@ -1374,25 +1374,44 @@
               </w:rPr>
               <w:t xml:space="preserve"> </w:t>
             </w:r>
-            <w:proofErr w:type="gramStart"/>
-            <w:r>
-              <w:t>{{ dataverse</w:t>
-            </w:r>
-            <w:proofErr w:type="gramEnd"/>
-            <w:r>
-              <w:t xml:space="preserve"> }}</w:t>
+            <w:r>
+              <w:t>{{ dataverse }}</w:t>
             </w:r>
             <w:r>
               <w:br/>
             </w:r>
             <w:r>
-              <w:t xml:space="preserve">{% endfor %} </w:t>
+              <w:t xml:space="preserve">{% </w:t>
+            </w:r>
+            <w:proofErr w:type="spellStart"/>
+            <w:r>
+              <w:t>endfor</w:t>
+            </w:r>
+            <w:proofErr w:type="spellEnd"/>
+            <w:r>
+              <w:t xml:space="preserve"> %} </w:t>
             </w:r>
             <w:r>
               <w:br/>
             </w:r>
             <w:r>
-              <w:t>{% endfor %} {% endfor %}</w:t>
+              <w:t xml:space="preserve">{% </w:t>
+            </w:r>
+            <w:proofErr w:type="spellStart"/>
+            <w:r>
+              <w:t>endfor</w:t>
+            </w:r>
+            <w:proofErr w:type="spellEnd"/>
+            <w:r>
+              <w:t xml:space="preserve"> %} {% </w:t>
+            </w:r>
+            <w:proofErr w:type="spellStart"/>
+            <w:r>
+              <w:t>endfor</w:t>
+            </w:r>
+            <w:proofErr w:type="spellEnd"/>
+            <w:r>
+              <w:t xml:space="preserve"> %}</w:t>
             </w:r>
           </w:p>
         </w:tc>
@@ -1566,7 +1585,21 @@
                 <w:lang w:val="en-US"/>
               </w:rPr>
               <w:lastRenderedPageBreak/>
-              <w:t>{% if template_dict.</w:t>
+              <w:t xml:space="preserve">{% if </w:t>
+            </w:r>
+            <w:proofErr w:type="spellStart"/>
+            <w:r>
+              <w:rPr>
+                <w:lang w:val="en-US"/>
+              </w:rPr>
+              <w:t>template_dict</w:t>
+            </w:r>
+            <w:proofErr w:type="spellEnd"/>
+            <w:r>
+              <w:rPr>
+                <w:lang w:val="en-US"/>
+              </w:rPr>
+              <w:t>.</w:t>
             </w:r>
             <w:r>
               <w:rPr>
@@ -1579,9 +1612,11 @@
               </w:rPr>
               <w:t xml:space="preserve"> </w:t>
             </w:r>
+            <w:proofErr w:type="spellStart"/>
             <w:r>
               <w:t>name_name_of_dataverse</w:t>
             </w:r>
+            <w:proofErr w:type="spellEnd"/>
             <w:r>
               <w:rPr>
                 <w:lang w:val="en-US"/>
@@ -1600,7 +1635,6 @@
               </w:rPr>
               <w:t>University of Toronto Dataverse</w:t>
             </w:r>
-            <w:proofErr w:type="gramStart"/>
             <w:r>
               <w:rPr>
                 <w:lang w:val="en-US"/>
@@ -1611,14 +1645,7 @@
               <w:rPr>
                 <w:lang w:val="en-US"/>
               </w:rPr>
-              <w:t xml:space="preserve"> %}X{</w:t>
-            </w:r>
-            <w:proofErr w:type="gramEnd"/>
-            <w:r>
-              <w:rPr>
-                <w:lang w:val="en-US"/>
-              </w:rPr>
-              <w:t>% endif %}</w:t>
+              <w:t xml:space="preserve"> %}X{% endif %}</w:t>
             </w:r>
           </w:p>
         </w:tc>
@@ -1645,7 +1672,21 @@
               <w:rPr>
                 <w:lang w:val="en-US"/>
               </w:rPr>
-              <w:t>{% if template_dict.</w:t>
+              <w:t xml:space="preserve">{% if </w:t>
+            </w:r>
+            <w:proofErr w:type="spellStart"/>
+            <w:r>
+              <w:rPr>
+                <w:lang w:val="en-US"/>
+              </w:rPr>
+              <w:t>template_dict</w:t>
+            </w:r>
+            <w:proofErr w:type="spellEnd"/>
+            <w:r>
+              <w:rPr>
+                <w:lang w:val="en-US"/>
+              </w:rPr>
+              <w:t>.</w:t>
             </w:r>
             <w:r>
               <w:rPr>
@@ -1658,15 +1699,153 @@
               </w:rPr>
               <w:t xml:space="preserve"> </w:t>
             </w:r>
-            <w:r>
-              <w:t>name_name_of_</w:t>
-            </w:r>
-            <w:proofErr w:type="gramStart"/>
-            <w:r>
+            <w:proofErr w:type="spellStart"/>
+            <w:r>
+              <w:t>name_name_of_dataverse</w:t>
+            </w:r>
+            <w:proofErr w:type="spellEnd"/>
+            <w:r>
+              <w:rPr>
+                <w:lang w:val="en-US"/>
+              </w:rPr>
+              <w:t xml:space="preserve"> </w:t>
+            </w:r>
+            <w:r>
+              <w:rPr>
+                <w:lang w:val="en-US"/>
+              </w:rPr>
+              <w:t>!</w:t>
+            </w:r>
+            <w:r>
+              <w:rPr>
+                <w:lang w:val="en-US"/>
+              </w:rPr>
+              <w:t xml:space="preserve">= </w:t>
+            </w:r>
+            <w:r>
+              <w:rPr>
+                <w:lang w:val="en-US"/>
+              </w:rPr>
+              <w:t>‘</w:t>
+            </w:r>
+            <w:r>
+              <w:rPr>
+                <w:lang w:val="en-US"/>
+              </w:rPr>
+              <w:t>University of Toronto Dataverse</w:t>
+            </w:r>
+            <w:r>
+              <w:rPr>
+                <w:lang w:val="en-US"/>
+              </w:rPr>
+              <w:t>’</w:t>
+            </w:r>
+            <w:r>
+              <w:rPr>
+                <w:lang w:val="en-US"/>
+              </w:rPr>
+              <w:t xml:space="preserve"> %}X{% endif %}</w:t>
+            </w:r>
+          </w:p>
+        </w:tc>
+        <w:tc>
+          <w:tcPr>
+            <w:tcW w:w="0" w:type="auto"/>
+            <w:tcBorders>
+              <w:top w:val="single" w:sz="8" w:space="0" w:color="000000"/>
+              <w:left w:val="single" w:sz="8" w:space="0" w:color="000000"/>
+              <w:bottom w:val="single" w:sz="8" w:space="0" w:color="000000"/>
+              <w:right w:val="single" w:sz="8" w:space="0" w:color="000000"/>
+            </w:tcBorders>
+            <w:shd w:val="clear" w:color="auto" w:fill="EFEFEF"/>
+            <w:tcMar>
+              <w:top w:w="100" w:type="dxa"/>
+              <w:left w:w="100" w:type="dxa"/>
+              <w:bottom w:w="100" w:type="dxa"/>
+              <w:right w:w="100" w:type="dxa"/>
+            </w:tcMar>
+            <w:hideMark/>
+          </w:tcPr>
+          <w:p/>
+        </w:tc>
+        <w:tc>
+          <w:tcPr>
+            <w:tcW w:w="0" w:type="auto"/>
+            <w:tcBorders>
+              <w:top w:val="single" w:sz="8" w:space="0" w:color="000000"/>
+              <w:left w:val="single" w:sz="8" w:space="0" w:color="000000"/>
+              <w:bottom w:val="single" w:sz="8" w:space="0" w:color="000000"/>
+              <w:right w:val="single" w:sz="8" w:space="0" w:color="000000"/>
+            </w:tcBorders>
+            <w:shd w:val="clear" w:color="auto" w:fill="EFEFEF"/>
+            <w:tcMar>
+              <w:top w:w="100" w:type="dxa"/>
+              <w:left w:w="100" w:type="dxa"/>
+              <w:bottom w:w="100" w:type="dxa"/>
+              <w:right w:w="100" w:type="dxa"/>
+            </w:tcMar>
+            <w:hideMark/>
+          </w:tcPr>
+          <w:p/>
+        </w:tc>
+        <w:tc>
+          <w:tcPr>
+            <w:tcW w:w="0" w:type="auto"/>
+            <w:tcBorders>
+              <w:top w:val="single" w:sz="8" w:space="0" w:color="000000"/>
+              <w:left w:val="single" w:sz="8" w:space="0" w:color="000000"/>
+              <w:bottom w:val="single" w:sz="8" w:space="0" w:color="000000"/>
+              <w:right w:val="single" w:sz="8" w:space="0" w:color="000000"/>
+            </w:tcBorders>
+            <w:shd w:val="clear" w:color="auto" w:fill="EFEFEF"/>
+            <w:tcMar>
+              <w:top w:w="100" w:type="dxa"/>
+              <w:left w:w="100" w:type="dxa"/>
+              <w:bottom w:w="100" w:type="dxa"/>
+              <w:right w:w="100" w:type="dxa"/>
+            </w:tcMar>
+            <w:hideMark/>
+          </w:tcPr>
+          <w:p/>
+        </w:tc>
+        <w:tc>
+          <w:tcPr>
+            <w:tcW w:w="0" w:type="auto"/>
+            <w:tcBorders>
+              <w:top w:val="single" w:sz="8" w:space="0" w:color="000000"/>
+              <w:left w:val="single" w:sz="8" w:space="0" w:color="000000"/>
+              <w:bottom w:val="single" w:sz="8" w:space="0" w:color="000000"/>
+              <w:right w:val="single" w:sz="8" w:space="0" w:color="000000"/>
+            </w:tcBorders>
+            <w:shd w:val="clear" w:color="auto" w:fill="EFEFEF"/>
+            <w:tcMar>
+              <w:top w:w="100" w:type="dxa"/>
+              <w:left w:w="100" w:type="dxa"/>
+              <w:bottom w:w="100" w:type="dxa"/>
+              <w:right w:w="100" w:type="dxa"/>
+            </w:tcMar>
+            <w:hideMark/>
+          </w:tcPr>
+          <w:p>
+            <w:r>
+              <w:rPr>
+                <w:rFonts w:hint="eastAsia"/>
+                <w:lang w:val="en-US"/>
+              </w:rPr>
+              <w:t xml:space="preserve">List the </w:t>
+            </w:r>
+            <w:proofErr w:type="spellStart"/>
+            <w:r>
+              <w:rPr>
+                <w:rFonts w:hint="eastAsia"/>
+                <w:lang w:val="en-US"/>
+              </w:rPr>
               <w:t>dataverse</w:t>
             </w:r>
-            <w:r>
-              <w:rPr>
+            <w:proofErr w:type="spellEnd"/>
+            <w:r>
+              <w:rPr>
+                <w:rFonts w:hint="eastAsia"/>
                 <w:lang w:val="en-US"/>
               </w:rPr>
               <w:t xml:space="preserve"> </w:t>
@@ -1675,173 +1854,42 @@
               <w:rPr>
                 <w:lang w:val="en-US"/>
               </w:rPr>
-              <w:t>!</w:t>
-            </w:r>
-            <w:proofErr w:type="gramEnd"/>
-            <w:r>
-              <w:rPr>
-                <w:lang w:val="en-US"/>
-              </w:rPr>
-              <w:t xml:space="preserve">= </w:t>
-            </w:r>
-            <w:r>
-              <w:rPr>
-                <w:lang w:val="en-US"/>
-              </w:rPr>
-              <w:t>‘</w:t>
-            </w:r>
-            <w:r>
-              <w:rPr>
-                <w:lang w:val="en-US"/>
-              </w:rPr>
-              <w:t>University of Toronto Dataverse</w:t>
-            </w:r>
-            <w:proofErr w:type="gramStart"/>
-            <w:r>
-              <w:rPr>
-                <w:lang w:val="en-US"/>
-              </w:rPr>
-              <w:t>’</w:t>
-            </w:r>
-            <w:r>
-              <w:rPr>
-                <w:lang w:val="en-US"/>
-              </w:rPr>
-              <w:t xml:space="preserve"> %}</w:t>
-            </w:r>
-            <w:proofErr w:type="gramEnd"/>
-            <w:r>
-              <w:rPr>
-                <w:lang w:val="en-US"/>
-              </w:rPr>
-              <w:t>X{% endif %}</w:t>
-            </w:r>
-          </w:p>
-        </w:tc>
-        <w:tc>
-          <w:tcPr>
-            <w:tcW w:w="0" w:type="auto"/>
-            <w:tcBorders>
-              <w:top w:val="single" w:sz="8" w:space="0" w:color="000000"/>
-              <w:left w:val="single" w:sz="8" w:space="0" w:color="000000"/>
-              <w:bottom w:val="single" w:sz="8" w:space="0" w:color="000000"/>
-              <w:right w:val="single" w:sz="8" w:space="0" w:color="000000"/>
-            </w:tcBorders>
-            <w:shd w:val="clear" w:color="auto" w:fill="EFEFEF"/>
-            <w:tcMar>
-              <w:top w:w="100" w:type="dxa"/>
-              <w:left w:w="100" w:type="dxa"/>
-              <w:bottom w:w="100" w:type="dxa"/>
-              <w:right w:w="100" w:type="dxa"/>
-            </w:tcMar>
-            <w:hideMark/>
-          </w:tcPr>
-          <w:p/>
-        </w:tc>
-        <w:tc>
-          <w:tcPr>
-            <w:tcW w:w="0" w:type="auto"/>
-            <w:tcBorders>
-              <w:top w:val="single" w:sz="8" w:space="0" w:color="000000"/>
-              <w:left w:val="single" w:sz="8" w:space="0" w:color="000000"/>
-              <w:bottom w:val="single" w:sz="8" w:space="0" w:color="000000"/>
-              <w:right w:val="single" w:sz="8" w:space="0" w:color="000000"/>
-            </w:tcBorders>
-            <w:shd w:val="clear" w:color="auto" w:fill="EFEFEF"/>
-            <w:tcMar>
-              <w:top w:w="100" w:type="dxa"/>
-              <w:left w:w="100" w:type="dxa"/>
-              <w:bottom w:w="100" w:type="dxa"/>
-              <w:right w:w="100" w:type="dxa"/>
-            </w:tcMar>
-            <w:hideMark/>
-          </w:tcPr>
-          <w:p/>
-        </w:tc>
-        <w:tc>
-          <w:tcPr>
-            <w:tcW w:w="0" w:type="auto"/>
-            <w:tcBorders>
-              <w:top w:val="single" w:sz="8" w:space="0" w:color="000000"/>
-              <w:left w:val="single" w:sz="8" w:space="0" w:color="000000"/>
-              <w:bottom w:val="single" w:sz="8" w:space="0" w:color="000000"/>
-              <w:right w:val="single" w:sz="8" w:space="0" w:color="000000"/>
-            </w:tcBorders>
-            <w:shd w:val="clear" w:color="auto" w:fill="EFEFEF"/>
-            <w:tcMar>
-              <w:top w:w="100" w:type="dxa"/>
-              <w:left w:w="100" w:type="dxa"/>
-              <w:bottom w:w="100" w:type="dxa"/>
-              <w:right w:w="100" w:type="dxa"/>
-            </w:tcMar>
-            <w:hideMark/>
-          </w:tcPr>
-          <w:p/>
-        </w:tc>
-        <w:tc>
-          <w:tcPr>
-            <w:tcW w:w="0" w:type="auto"/>
-            <w:tcBorders>
-              <w:top w:val="single" w:sz="8" w:space="0" w:color="000000"/>
-              <w:left w:val="single" w:sz="8" w:space="0" w:color="000000"/>
-              <w:bottom w:val="single" w:sz="8" w:space="0" w:color="000000"/>
-              <w:right w:val="single" w:sz="8" w:space="0" w:color="000000"/>
-            </w:tcBorders>
-            <w:shd w:val="clear" w:color="auto" w:fill="EFEFEF"/>
-            <w:tcMar>
-              <w:top w:w="100" w:type="dxa"/>
-              <w:left w:w="100" w:type="dxa"/>
-              <w:bottom w:w="100" w:type="dxa"/>
-              <w:right w:w="100" w:type="dxa"/>
-            </w:tcMar>
-            <w:hideMark/>
-          </w:tcPr>
-          <w:p>
+              <w:t>collection</w:t>
+            </w:r>
             <w:r>
               <w:rPr>
                 <w:rFonts w:hint="eastAsia"/>
                 <w:lang w:val="en-US"/>
               </w:rPr>
-              <w:t xml:space="preserve">List the dataverse </w:t>
-            </w:r>
-            <w:r>
-              <w:rPr>
-                <w:lang w:val="en-US"/>
-              </w:rPr>
-              <w:t>collection</w:t>
+              <w:t xml:space="preserve"> name:</w:t>
+            </w:r>
+            <w:r>
+              <w:rPr>
+                <w:lang w:val="en-US"/>
+              </w:rPr>
+              <w:br/>
             </w:r>
             <w:r>
               <w:rPr>
                 <w:rFonts w:hint="eastAsia"/>
                 <w:lang w:val="en-US"/>
               </w:rPr>
-              <w:t xml:space="preserve"> name:</w:t>
-            </w:r>
-            <w:r>
-              <w:rPr>
-                <w:lang w:val="en-US"/>
-              </w:rPr>
-              <w:br/>
+              <w:t xml:space="preserve">{{ </w:t>
+            </w:r>
+            <w:proofErr w:type="spellStart"/>
+            <w:r>
+              <w:t>template_dict</w:t>
             </w:r>
             <w:r>
               <w:rPr>
                 <w:rFonts w:hint="eastAsia"/>
-                <w:lang w:val="en-US"/>
-              </w:rPr>
-              <w:t xml:space="preserve">{{ </w:t>
-            </w:r>
-            <w:r>
-              <w:t>template_dict</w:t>
-            </w:r>
-            <w:r>
-              <w:rPr>
-                <w:rFonts w:hint="eastAsia"/>
               </w:rPr>
               <w:t>.</w:t>
             </w:r>
             <w:r>
-              <w:t xml:space="preserve"> name_name_of_dataverse</w:t>
-            </w:r>
+              <w:t>name_of_dataverse</w:t>
+            </w:r>
+            <w:proofErr w:type="spellEnd"/>
             <w:r>
               <w:rPr>
                 <w:rFonts w:hint="eastAsia"/>
@@ -2023,15 +2071,7 @@
               </w:numPr>
             </w:pPr>
             <w:r>
-              <w:t xml:space="preserve">Confirm with the depositor that they </w:t>
-            </w:r>
-            <w:proofErr w:type="gramStart"/>
-            <w:r>
-              <w:t>actually require</w:t>
-            </w:r>
-            <w:proofErr w:type="gramEnd"/>
-            <w:r>
-              <w:t xml:space="preserve"> a datavers</w:t>
+              <w:t>Confirm with the depositor that they actually require a datavers</w:t>
             </w:r>
             <w:r>
               <w:lastRenderedPageBreak/>
@@ -2597,52 +2637,80 @@
               <w:rPr>
                 <w:lang w:val="en-US"/>
               </w:rPr>
-              <w:t>{% if template_dict.file_ext.comments|length == 0 %}X{% endif %}</w:t>
-            </w:r>
-          </w:p>
-        </w:tc>
-        <w:tc>
-          <w:tcPr>
-            <w:tcW w:w="0" w:type="auto"/>
-            <w:tcBorders>
-              <w:top w:val="single" w:sz="8" w:space="0" w:color="000000"/>
-              <w:left w:val="single" w:sz="8" w:space="0" w:color="000000"/>
-              <w:bottom w:val="single" w:sz="8" w:space="0" w:color="000000"/>
-              <w:right w:val="single" w:sz="8" w:space="0" w:color="000000"/>
-            </w:tcBorders>
-            <w:tcMar>
-              <w:top w:w="100" w:type="dxa"/>
-              <w:left w:w="100" w:type="dxa"/>
-              <w:bottom w:w="100" w:type="dxa"/>
-              <w:right w:w="100" w:type="dxa"/>
-            </w:tcMar>
-            <w:hideMark/>
-          </w:tcPr>
-          <w:p/>
-        </w:tc>
-        <w:tc>
-          <w:tcPr>
-            <w:tcW w:w="0" w:type="auto"/>
-            <w:tcBorders>
-              <w:top w:val="single" w:sz="8" w:space="0" w:color="000000"/>
-              <w:left w:val="single" w:sz="8" w:space="0" w:color="000000"/>
-              <w:bottom w:val="single" w:sz="8" w:space="0" w:color="000000"/>
-              <w:right w:val="single" w:sz="8" w:space="0" w:color="000000"/>
-            </w:tcBorders>
-            <w:tcMar>
-              <w:top w:w="100" w:type="dxa"/>
-              <w:left w:w="100" w:type="dxa"/>
-              <w:bottom w:w="100" w:type="dxa"/>
-              <w:right w:w="100" w:type="dxa"/>
-            </w:tcMar>
-            <w:hideMark/>
-          </w:tcPr>
-          <w:p>
-            <w:r>
-              <w:rPr>
-                <w:lang w:val="en-US"/>
-              </w:rPr>
-              <w:t>{% if template_dict.file_ext.comments|length &gt; 0 %}X{% endif %}</w:t>
+              <w:t xml:space="preserve">{% if </w:t>
+            </w:r>
+            <w:proofErr w:type="spellStart"/>
+            <w:r>
+              <w:rPr>
+                <w:lang w:val="en-US"/>
+              </w:rPr>
+              <w:t>template_dict.file_ext.comments|length</w:t>
+            </w:r>
+            <w:proofErr w:type="spellEnd"/>
+            <w:r>
+              <w:rPr>
+                <w:lang w:val="en-US"/>
+              </w:rPr>
+              <w:t xml:space="preserve"> == 0 %}X{% endif %}</w:t>
+            </w:r>
+          </w:p>
+        </w:tc>
+        <w:tc>
+          <w:tcPr>
+            <w:tcW w:w="0" w:type="auto"/>
+            <w:tcBorders>
+              <w:top w:val="single" w:sz="8" w:space="0" w:color="000000"/>
+              <w:left w:val="single" w:sz="8" w:space="0" w:color="000000"/>
+              <w:bottom w:val="single" w:sz="8" w:space="0" w:color="000000"/>
+              <w:right w:val="single" w:sz="8" w:space="0" w:color="000000"/>
+            </w:tcBorders>
+            <w:tcMar>
+              <w:top w:w="100" w:type="dxa"/>
+              <w:left w:w="100" w:type="dxa"/>
+              <w:bottom w:w="100" w:type="dxa"/>
+              <w:right w:w="100" w:type="dxa"/>
+            </w:tcMar>
+            <w:hideMark/>
+          </w:tcPr>
+          <w:p/>
+        </w:tc>
+        <w:tc>
+          <w:tcPr>
+            <w:tcW w:w="0" w:type="auto"/>
+            <w:tcBorders>
+              <w:top w:val="single" w:sz="8" w:space="0" w:color="000000"/>
+              <w:left w:val="single" w:sz="8" w:space="0" w:color="000000"/>
+              <w:bottom w:val="single" w:sz="8" w:space="0" w:color="000000"/>
+              <w:right w:val="single" w:sz="8" w:space="0" w:color="000000"/>
+            </w:tcBorders>
+            <w:tcMar>
+              <w:top w:w="100" w:type="dxa"/>
+              <w:left w:w="100" w:type="dxa"/>
+              <w:bottom w:w="100" w:type="dxa"/>
+              <w:right w:w="100" w:type="dxa"/>
+            </w:tcMar>
+            <w:hideMark/>
+          </w:tcPr>
+          <w:p>
+            <w:r>
+              <w:rPr>
+                <w:lang w:val="en-US"/>
+              </w:rPr>
+              <w:t xml:space="preserve">{% if </w:t>
+            </w:r>
+            <w:proofErr w:type="spellStart"/>
+            <w:r>
+              <w:rPr>
+                <w:lang w:val="en-US"/>
+              </w:rPr>
+              <w:t>template_dict.file_ext.comments|length</w:t>
+            </w:r>
+            <w:proofErr w:type="spellEnd"/>
+            <w:r>
+              <w:rPr>
+                <w:lang w:val="en-US"/>
+              </w:rPr>
+              <w:t xml:space="preserve"> &gt; 0 %}X{% endif %}</w:t>
             </w:r>
           </w:p>
         </w:tc>
@@ -2723,21 +2791,21 @@
               <w:rPr>
                 <w:lang w:val="en-US"/>
               </w:rPr>
-              <w:t>{% for item in template_</w:t>
-            </w:r>
-            <w:proofErr w:type="gramStart"/>
-            <w:r>
-              <w:rPr>
-                <w:lang w:val="en-US"/>
-              </w:rPr>
-              <w:t>dict.file</w:t>
-            </w:r>
-            <w:proofErr w:type="gramEnd"/>
-            <w:r>
-              <w:rPr>
-                <w:lang w:val="en-US"/>
-              </w:rPr>
-              <w:t>_open.comments %}</w:t>
+              <w:t xml:space="preserve">{% for item in </w:t>
+            </w:r>
+            <w:proofErr w:type="spellStart"/>
+            <w:r>
+              <w:rPr>
+                <w:lang w:val="en-US"/>
+              </w:rPr>
+              <w:t>template_dict.file_open.comments</w:t>
+            </w:r>
+            <w:proofErr w:type="spellEnd"/>
+            <w:r>
+              <w:rPr>
+                <w:lang w:val="en-US"/>
+              </w:rPr>
+              <w:t xml:space="preserve"> %}</w:t>
             </w:r>
           </w:p>
           <w:p>
@@ -2751,28 +2819,40 @@
                 <w:lang w:val="en-US"/>
               </w:rPr>
             </w:pPr>
-            <w:proofErr w:type="gramStart"/>
-            <w:r>
-              <w:rPr>
-                <w:lang w:val="en-US"/>
-              </w:rPr>
-              <w:t>{{ item</w:t>
-            </w:r>
-            <w:proofErr w:type="gramEnd"/>
-            <w:r>
-              <w:rPr>
-                <w:lang w:val="en-US"/>
-              </w:rPr>
-              <w:t xml:space="preserve">.file_name }}{% </w:t>
-            </w:r>
-            <w:proofErr w:type="gramStart"/>
-            <w:r>
-              <w:rPr>
-                <w:lang w:val="en-US"/>
-              </w:rPr>
-              <w:t>endfor %}</w:t>
-            </w:r>
-            <w:proofErr w:type="gramEnd"/>
+            <w:r>
+              <w:rPr>
+                <w:lang w:val="en-US"/>
+              </w:rPr>
+              <w:t xml:space="preserve">{{ </w:t>
+            </w:r>
+            <w:proofErr w:type="spellStart"/>
+            <w:r>
+              <w:rPr>
+                <w:lang w:val="en-US"/>
+              </w:rPr>
+              <w:t>item.file_name</w:t>
+            </w:r>
+            <w:proofErr w:type="spellEnd"/>
+            <w:r>
+              <w:rPr>
+                <w:lang w:val="en-US"/>
+              </w:rPr>
+              <w:t xml:space="preserve"> }}{% </w:t>
+            </w:r>
+            <w:proofErr w:type="spellStart"/>
+            <w:r>
+              <w:rPr>
+                <w:lang w:val="en-US"/>
+              </w:rPr>
+              <w:t>endfor</w:t>
+            </w:r>
+            <w:proofErr w:type="spellEnd"/>
+            <w:r>
+              <w:rPr>
+                <w:lang w:val="en-US"/>
+              </w:rPr>
+              <w:t xml:space="preserve"> %}</w:t>
+            </w:r>
           </w:p>
           <w:p>
             <w:pPr>
@@ -2804,7 +2884,21 @@
               <w:rPr>
                 <w:lang w:val="en-US"/>
               </w:rPr>
-              <w:t>{% for item in template_dict.file_open.not_checked %}</w:t>
+              <w:t xml:space="preserve">{% for item in </w:t>
+            </w:r>
+            <w:proofErr w:type="spellStart"/>
+            <w:r>
+              <w:rPr>
+                <w:lang w:val="en-US"/>
+              </w:rPr>
+              <w:t>template_dict.file_open.not_checked</w:t>
+            </w:r>
+            <w:proofErr w:type="spellEnd"/>
+            <w:r>
+              <w:rPr>
+                <w:lang w:val="en-US"/>
+              </w:rPr>
+              <w:t xml:space="preserve"> %}</w:t>
             </w:r>
           </w:p>
           <w:p>
@@ -2818,28 +2912,40 @@
                 <w:lang w:val="en-US"/>
               </w:rPr>
             </w:pPr>
-            <w:proofErr w:type="gramStart"/>
-            <w:r>
-              <w:rPr>
-                <w:lang w:val="en-US"/>
-              </w:rPr>
-              <w:t>{{ item</w:t>
-            </w:r>
-            <w:proofErr w:type="gramEnd"/>
-            <w:r>
-              <w:rPr>
-                <w:lang w:val="en-US"/>
-              </w:rPr>
-              <w:t xml:space="preserve">.file_name }}{% </w:t>
-            </w:r>
-            <w:proofErr w:type="gramStart"/>
-            <w:r>
-              <w:rPr>
-                <w:lang w:val="en-US"/>
-              </w:rPr>
-              <w:t>endfor %}</w:t>
-            </w:r>
-            <w:proofErr w:type="gramEnd"/>
+            <w:r>
+              <w:rPr>
+                <w:lang w:val="en-US"/>
+              </w:rPr>
+              <w:t xml:space="preserve">{{ </w:t>
+            </w:r>
+            <w:proofErr w:type="spellStart"/>
+            <w:r>
+              <w:rPr>
+                <w:lang w:val="en-US"/>
+              </w:rPr>
+              <w:t>item.file_name</w:t>
+            </w:r>
+            <w:proofErr w:type="spellEnd"/>
+            <w:r>
+              <w:rPr>
+                <w:lang w:val="en-US"/>
+              </w:rPr>
+              <w:t xml:space="preserve"> }}{% </w:t>
+            </w:r>
+            <w:proofErr w:type="spellStart"/>
+            <w:r>
+              <w:rPr>
+                <w:lang w:val="en-US"/>
+              </w:rPr>
+              <w:t>endfor</w:t>
+            </w:r>
+            <w:proofErr w:type="spellEnd"/>
+            <w:r>
+              <w:rPr>
+                <w:lang w:val="en-US"/>
+              </w:rPr>
+              <w:t xml:space="preserve"> %}</w:t>
+            </w:r>
           </w:p>
           <w:p/>
         </w:tc>
@@ -2962,24 +3068,14 @@
                 <w:bCs/>
                 <w:lang w:val="en-US"/>
               </w:rPr>
-              <w:t>&lt;&gt;:"/\</w:t>
-            </w:r>
-            <w:proofErr w:type="gramStart"/>
+              <w:t>&lt;&gt;:"/\|?*</w:t>
+            </w:r>
             <w:r>
               <w:rPr>
                 <w:b/>
                 <w:bCs/>
                 <w:lang w:val="en-US"/>
               </w:rPr>
-              <w:t>|?*</w:t>
-            </w:r>
-            <w:proofErr w:type="gramEnd"/>
-            <w:r>
-              <w:rPr>
-                <w:b/>
-                <w:bCs/>
-                <w:lang w:val="en-US"/>
-              </w:rPr>
               <w:t>,@$~)?</w:t>
             </w:r>
           </w:p>
@@ -3031,7 +3127,21 @@
               <w:rPr>
                 <w:lang w:val="en-US"/>
               </w:rPr>
-              <w:t>{% if template_dict.special_characters.comments|length == 0 %}X{% endif %}</w:t>
+              <w:t xml:space="preserve">{% if </w:t>
+            </w:r>
+            <w:proofErr w:type="spellStart"/>
+            <w:r>
+              <w:rPr>
+                <w:lang w:val="en-US"/>
+              </w:rPr>
+              <w:t>template_dict.special_characters.comments|length</w:t>
+            </w:r>
+            <w:proofErr w:type="spellEnd"/>
+            <w:r>
+              <w:rPr>
+                <w:lang w:val="en-US"/>
+              </w:rPr>
+              <w:t xml:space="preserve"> == 0 %}X{% endif %}</w:t>
             </w:r>
           </w:p>
         </w:tc>
@@ -3078,7 +3188,21 @@
               <w:rPr>
                 <w:lang w:val="en-US"/>
               </w:rPr>
-              <w:t>{% if template_dict.special_characters.comments|length &gt; 0 %}X{% endif %}</w:t>
+              <w:t xml:space="preserve">{% if </w:t>
+            </w:r>
+            <w:proofErr w:type="spellStart"/>
+            <w:r>
+              <w:rPr>
+                <w:lang w:val="en-US"/>
+              </w:rPr>
+              <w:t>template_dict.special_characters.comments|length</w:t>
+            </w:r>
+            <w:proofErr w:type="spellEnd"/>
+            <w:r>
+              <w:rPr>
+                <w:lang w:val="en-US"/>
+              </w:rPr>
+              <w:t xml:space="preserve"> &gt; 0 %}X{% endif %}</w:t>
             </w:r>
           </w:p>
         </w:tc>
@@ -3161,21 +3285,21 @@
               <w:rPr>
                 <w:lang w:val="en-US"/>
               </w:rPr>
-              <w:t>{% for item in template_</w:t>
-            </w:r>
-            <w:proofErr w:type="gramStart"/>
-            <w:r>
-              <w:rPr>
-                <w:lang w:val="en-US"/>
-              </w:rPr>
-              <w:t>dict.special</w:t>
-            </w:r>
-            <w:proofErr w:type="gramEnd"/>
-            <w:r>
-              <w:rPr>
-                <w:lang w:val="en-US"/>
-              </w:rPr>
-              <w:t>_characters.comments %}</w:t>
+              <w:t xml:space="preserve">{% for item in </w:t>
+            </w:r>
+            <w:proofErr w:type="spellStart"/>
+            <w:r>
+              <w:rPr>
+                <w:lang w:val="en-US"/>
+              </w:rPr>
+              <w:t>template_dict.special_characters.comments</w:t>
+            </w:r>
+            <w:proofErr w:type="spellEnd"/>
+            <w:r>
+              <w:rPr>
+                <w:lang w:val="en-US"/>
+              </w:rPr>
+              <w:t xml:space="preserve"> %}</w:t>
             </w:r>
           </w:p>
           <w:p>
@@ -3186,19 +3310,39 @@
                 <w:numId w:val="45"/>
               </w:numPr>
             </w:pPr>
-            <w:proofErr w:type="gramStart"/>
-            <w:r>
-              <w:rPr>
-                <w:lang w:val="en-US"/>
-              </w:rPr>
-              <w:t>{{ item</w:t>
-            </w:r>
-            <w:proofErr w:type="gramEnd"/>
-            <w:r>
-              <w:rPr>
-                <w:lang w:val="en-US"/>
-              </w:rPr>
-              <w:t>.file_name }}{% endfor %}</w:t>
+            <w:r>
+              <w:rPr>
+                <w:lang w:val="en-US"/>
+              </w:rPr>
+              <w:t xml:space="preserve">{{ </w:t>
+            </w:r>
+            <w:proofErr w:type="spellStart"/>
+            <w:r>
+              <w:rPr>
+                <w:lang w:val="en-US"/>
+              </w:rPr>
+              <w:t>item.file_name</w:t>
+            </w:r>
+            <w:proofErr w:type="spellEnd"/>
+            <w:r>
+              <w:rPr>
+                <w:lang w:val="en-US"/>
+              </w:rPr>
+              <w:t xml:space="preserve"> }}{% </w:t>
+            </w:r>
+            <w:proofErr w:type="spellStart"/>
+            <w:r>
+              <w:rPr>
+                <w:lang w:val="en-US"/>
+              </w:rPr>
+              <w:t>endfor</w:t>
+            </w:r>
+            <w:proofErr w:type="spellEnd"/>
+            <w:r>
+              <w:rPr>
+                <w:lang w:val="en-US"/>
+              </w:rPr>
+              <w:t xml:space="preserve"> %}</w:t>
             </w:r>
           </w:p>
         </w:tc>
@@ -3355,7 +3499,21 @@
               <w:rPr>
                 <w:lang w:val="en-US"/>
               </w:rPr>
-              <w:t xml:space="preserve">{% if template_dict.readme_file.comments|length </w:t>
+              <w:t xml:space="preserve">{% if </w:t>
+            </w:r>
+            <w:proofErr w:type="spellStart"/>
+            <w:r>
+              <w:rPr>
+                <w:lang w:val="en-US"/>
+              </w:rPr>
+              <w:t>template_dict.readme_file.comments|length</w:t>
+            </w:r>
+            <w:proofErr w:type="spellEnd"/>
+            <w:r>
+              <w:rPr>
+                <w:lang w:val="en-US"/>
+              </w:rPr>
+              <w:t xml:space="preserve"> </w:t>
             </w:r>
             <w:r>
               <w:rPr>
@@ -3415,7 +3573,21 @@
               <w:rPr>
                 <w:lang w:val="en-US"/>
               </w:rPr>
-              <w:t>{% if template_dict.file_ext.comments|length &gt; 0 %}X{% endif %}</w:t>
+              <w:t xml:space="preserve">{% if </w:t>
+            </w:r>
+            <w:proofErr w:type="spellStart"/>
+            <w:r>
+              <w:rPr>
+                <w:lang w:val="en-US"/>
+              </w:rPr>
+              <w:t>template_dict.file_ext.comments|length</w:t>
+            </w:r>
+            <w:proofErr w:type="spellEnd"/>
+            <w:r>
+              <w:rPr>
+                <w:lang w:val="en-US"/>
+              </w:rPr>
+              <w:t xml:space="preserve"> &gt; 0 %}X{% endif %}</w:t>
             </w:r>
           </w:p>
         </w:tc>
@@ -3494,21 +3666,21 @@
                 <w:lang w:val="en-US"/>
               </w:rPr>
               <w:br/>
-              <w:t>{% for item in template_</w:t>
-            </w:r>
-            <w:proofErr w:type="gramStart"/>
-            <w:r>
-              <w:rPr>
-                <w:lang w:val="en-US"/>
-              </w:rPr>
-              <w:t>dict.file</w:t>
-            </w:r>
-            <w:proofErr w:type="gramEnd"/>
-            <w:r>
-              <w:rPr>
-                <w:lang w:val="en-US"/>
-              </w:rPr>
-              <w:t>_ext.comments %}</w:t>
+              <w:t xml:space="preserve">{% for item in </w:t>
+            </w:r>
+            <w:proofErr w:type="spellStart"/>
+            <w:r>
+              <w:rPr>
+                <w:lang w:val="en-US"/>
+              </w:rPr>
+              <w:t>template_dict.file_ext.comments</w:t>
+            </w:r>
+            <w:proofErr w:type="spellEnd"/>
+            <w:r>
+              <w:rPr>
+                <w:lang w:val="en-US"/>
+              </w:rPr>
+              <w:t xml:space="preserve"> %}</w:t>
             </w:r>
           </w:p>
           <w:p>
@@ -3520,19 +3692,39 @@
               </w:numPr>
               <w:spacing w:line="256" w:lineRule="auto"/>
             </w:pPr>
-            <w:proofErr w:type="gramStart"/>
-            <w:r>
-              <w:rPr>
-                <w:lang w:val="en-US"/>
-              </w:rPr>
-              <w:t>{{ item</w:t>
-            </w:r>
-            <w:proofErr w:type="gramEnd"/>
-            <w:r>
-              <w:rPr>
-                <w:lang w:val="en-US"/>
-              </w:rPr>
-              <w:t>.file_name }}{% endfor %}</w:t>
+            <w:r>
+              <w:rPr>
+                <w:lang w:val="en-US"/>
+              </w:rPr>
+              <w:t xml:space="preserve">{{ </w:t>
+            </w:r>
+            <w:proofErr w:type="spellStart"/>
+            <w:r>
+              <w:rPr>
+                <w:lang w:val="en-US"/>
+              </w:rPr>
+              <w:t>item.file_name</w:t>
+            </w:r>
+            <w:proofErr w:type="spellEnd"/>
+            <w:r>
+              <w:rPr>
+                <w:lang w:val="en-US"/>
+              </w:rPr>
+              <w:t xml:space="preserve"> }}{% </w:t>
+            </w:r>
+            <w:proofErr w:type="spellStart"/>
+            <w:r>
+              <w:rPr>
+                <w:lang w:val="en-US"/>
+              </w:rPr>
+              <w:t>endfor</w:t>
+            </w:r>
+            <w:proofErr w:type="spellEnd"/>
+            <w:r>
+              <w:rPr>
+                <w:lang w:val="en-US"/>
+              </w:rPr>
+              <w:t xml:space="preserve"> %}</w:t>
             </w:r>
           </w:p>
         </w:tc>
@@ -3691,19 +3883,47 @@
               <w:rPr>
                 <w:lang w:val="en-US"/>
               </w:rPr>
-              <w:t>{% if template_dict.</w:t>
-            </w:r>
-            <w:r>
-              <w:rPr>
-                <w:lang w:val="en-US"/>
-              </w:rPr>
-              <w:t xml:space="preserve"> common_file_format</w:t>
-            </w:r>
-            <w:r>
-              <w:rPr>
-                <w:lang w:val="en-US"/>
-              </w:rPr>
-              <w:t xml:space="preserve">.comments|length </w:t>
+              <w:t xml:space="preserve">{% if </w:t>
+            </w:r>
+            <w:proofErr w:type="spellStart"/>
+            <w:r>
+              <w:rPr>
+                <w:lang w:val="en-US"/>
+              </w:rPr>
+              <w:t>template_dict</w:t>
+            </w:r>
+            <w:proofErr w:type="spellEnd"/>
+            <w:r>
+              <w:rPr>
+                <w:lang w:val="en-US"/>
+              </w:rPr>
+              <w:t>.</w:t>
+            </w:r>
+            <w:r>
+              <w:rPr>
+                <w:lang w:val="en-US"/>
+              </w:rPr>
+              <w:t xml:space="preserve"> </w:t>
+            </w:r>
+            <w:proofErr w:type="spellStart"/>
+            <w:r>
+              <w:rPr>
+                <w:lang w:val="en-US"/>
+              </w:rPr>
+              <w:t>common_file_format</w:t>
+            </w:r>
+            <w:r>
+              <w:rPr>
+                <w:lang w:val="en-US"/>
+              </w:rPr>
+              <w:t>.comments|length</w:t>
+            </w:r>
+            <w:proofErr w:type="spellEnd"/>
+            <w:r>
+              <w:rPr>
+                <w:lang w:val="en-US"/>
+              </w:rPr>
+              <w:t xml:space="preserve"> </w:t>
             </w:r>
             <w:r>
               <w:rPr>
@@ -3763,19 +3983,47 @@
               <w:rPr>
                 <w:lang w:val="en-US"/>
               </w:rPr>
-              <w:t>{% if template_dict.</w:t>
-            </w:r>
-            <w:r>
-              <w:rPr>
-                <w:lang w:val="en-US"/>
-              </w:rPr>
-              <w:t xml:space="preserve"> common_file_format</w:t>
-            </w:r>
-            <w:r>
-              <w:rPr>
-                <w:lang w:val="en-US"/>
-              </w:rPr>
-              <w:t>.comments|length &gt; 0 %}X{% endif %}</w:t>
+              <w:t xml:space="preserve">{% if </w:t>
+            </w:r>
+            <w:proofErr w:type="spellStart"/>
+            <w:r>
+              <w:rPr>
+                <w:lang w:val="en-US"/>
+              </w:rPr>
+              <w:t>template_dict</w:t>
+            </w:r>
+            <w:proofErr w:type="spellEnd"/>
+            <w:r>
+              <w:rPr>
+                <w:lang w:val="en-US"/>
+              </w:rPr>
+              <w:t>.</w:t>
+            </w:r>
+            <w:r>
+              <w:rPr>
+                <w:lang w:val="en-US"/>
+              </w:rPr>
+              <w:t xml:space="preserve"> </w:t>
+            </w:r>
+            <w:proofErr w:type="spellStart"/>
+            <w:r>
+              <w:rPr>
+                <w:lang w:val="en-US"/>
+              </w:rPr>
+              <w:t>common_file_format</w:t>
+            </w:r>
+            <w:r>
+              <w:rPr>
+                <w:lang w:val="en-US"/>
+              </w:rPr>
+              <w:t>.comments|length</w:t>
+            </w:r>
+            <w:proofErr w:type="spellEnd"/>
+            <w:r>
+              <w:rPr>
+                <w:lang w:val="en-US"/>
+              </w:rPr>
+              <w:t xml:space="preserve"> &gt; 0 %}X{% endif %}</w:t>
             </w:r>
           </w:p>
         </w:tc>
@@ -3860,33 +4108,33 @@
               <w:rPr>
                 <w:lang w:val="en-US"/>
               </w:rPr>
-              <w:t>{% for item in template_</w:t>
-            </w:r>
-            <w:proofErr w:type="gramStart"/>
-            <w:r>
-              <w:rPr>
-                <w:lang w:val="en-US"/>
-              </w:rPr>
-              <w:t>dict.</w:t>
-            </w:r>
-            <w:r>
-              <w:rPr>
-                <w:lang w:val="en-US"/>
-              </w:rPr>
-              <w:t>common</w:t>
-            </w:r>
-            <w:proofErr w:type="gramEnd"/>
-            <w:r>
-              <w:rPr>
-                <w:lang w:val="en-US"/>
-              </w:rPr>
-              <w:t>_file_format</w:t>
-            </w:r>
-            <w:r>
-              <w:rPr>
-                <w:lang w:val="en-US"/>
-              </w:rPr>
-              <w:t>.comments %}</w:t>
+              <w:t xml:space="preserve">{% for item in </w:t>
+            </w:r>
+            <w:proofErr w:type="spellStart"/>
+            <w:r>
+              <w:rPr>
+                <w:lang w:val="en-US"/>
+              </w:rPr>
+              <w:t>template_dict.</w:t>
+            </w:r>
+            <w:r>
+              <w:rPr>
+                <w:lang w:val="en-US"/>
+              </w:rPr>
+              <w:t>common_file_format</w:t>
+            </w:r>
+            <w:r>
+              <w:rPr>
+                <w:lang w:val="en-US"/>
+              </w:rPr>
+              <w:t>.comments</w:t>
+            </w:r>
+            <w:proofErr w:type="spellEnd"/>
+            <w:r>
+              <w:rPr>
+                <w:lang w:val="en-US"/>
+              </w:rPr>
+              <w:t xml:space="preserve"> %}</w:t>
             </w:r>
           </w:p>
           <w:p>
@@ -3896,19 +4144,39 @@
                 <w:numId w:val="9"/>
               </w:numPr>
             </w:pPr>
-            <w:proofErr w:type="gramStart"/>
-            <w:r>
-              <w:rPr>
-                <w:lang w:val="en-US"/>
-              </w:rPr>
-              <w:t>{{ item</w:t>
-            </w:r>
-            <w:proofErr w:type="gramEnd"/>
-            <w:r>
-              <w:rPr>
-                <w:lang w:val="en-US"/>
-              </w:rPr>
-              <w:t>.file_name }}{% endfor %}</w:t>
+            <w:r>
+              <w:rPr>
+                <w:lang w:val="en-US"/>
+              </w:rPr>
+              <w:t xml:space="preserve">{{ </w:t>
+            </w:r>
+            <w:proofErr w:type="spellStart"/>
+            <w:r>
+              <w:rPr>
+                <w:lang w:val="en-US"/>
+              </w:rPr>
+              <w:t>item.file_name</w:t>
+            </w:r>
+            <w:proofErr w:type="spellEnd"/>
+            <w:r>
+              <w:rPr>
+                <w:lang w:val="en-US"/>
+              </w:rPr>
+              <w:t xml:space="preserve"> }}{% </w:t>
+            </w:r>
+            <w:proofErr w:type="spellStart"/>
+            <w:r>
+              <w:rPr>
+                <w:lang w:val="en-US"/>
+              </w:rPr>
+              <w:t>endfor</w:t>
+            </w:r>
+            <w:proofErr w:type="spellEnd"/>
+            <w:r>
+              <w:rPr>
+                <w:lang w:val="en-US"/>
+              </w:rPr>
+              <w:t xml:space="preserve"> %}</w:t>
             </w:r>
           </w:p>
         </w:tc>
@@ -4627,7 +4895,21 @@
               <w:rPr>
                 <w:lang w:val="en-US"/>
               </w:rPr>
-              <w:t>{% if template_dict.readme_file.comments|length &gt; 0 %}X{% endif %}</w:t>
+              <w:t xml:space="preserve">{% if </w:t>
+            </w:r>
+            <w:proofErr w:type="spellStart"/>
+            <w:r>
+              <w:rPr>
+                <w:lang w:val="en-US"/>
+              </w:rPr>
+              <w:t>template_dict.readme_file.comments|length</w:t>
+            </w:r>
+            <w:proofErr w:type="spellEnd"/>
+            <w:r>
+              <w:rPr>
+                <w:lang w:val="en-US"/>
+              </w:rPr>
+              <w:t xml:space="preserve"> &gt; 0 %}X{% endif %}</w:t>
             </w:r>
           </w:p>
         </w:tc>
@@ -4659,7 +4941,21 @@
               <w:rPr>
                 <w:lang w:val="en-US"/>
               </w:rPr>
-              <w:t>{% if template_dict.readme_file.comments|length == 0 %}X{% endif %}</w:t>
+              <w:t xml:space="preserve">{% if </w:t>
+            </w:r>
+            <w:proofErr w:type="spellStart"/>
+            <w:r>
+              <w:rPr>
+                <w:lang w:val="en-US"/>
+              </w:rPr>
+              <w:t>template_dict.readme_file.comments|length</w:t>
+            </w:r>
+            <w:proofErr w:type="spellEnd"/>
+            <w:r>
+              <w:rPr>
+                <w:lang w:val="en-US"/>
+              </w:rPr>
+              <w:t xml:space="preserve"> == 0 %}X{% endif %}</w:t>
             </w:r>
           </w:p>
           <w:p/>
@@ -4759,35 +5055,49 @@
                 <w:lang w:val="en-US"/>
               </w:rPr>
               <w:br/>
-              <w:t>{% for item in template_</w:t>
-            </w:r>
-            <w:proofErr w:type="gramStart"/>
-            <w:r>
-              <w:rPr>
-                <w:lang w:val="en-US"/>
-              </w:rPr>
-              <w:t>dict.readme</w:t>
-            </w:r>
-            <w:proofErr w:type="gramEnd"/>
-            <w:r>
-              <w:rPr>
-                <w:lang w:val="en-US"/>
-              </w:rPr>
-              <w:t xml:space="preserve">_file.comments %}{{ loop.index }}. </w:t>
-            </w:r>
-            <w:proofErr w:type="gramStart"/>
-            <w:r>
-              <w:rPr>
-                <w:lang w:val="en-US"/>
-              </w:rPr>
-              <w:t>{{ item</w:t>
-            </w:r>
-            <w:proofErr w:type="gramEnd"/>
-            <w:r>
-              <w:rPr>
-                <w:lang w:val="en-US"/>
-              </w:rPr>
-              <w:t>.file_name }}</w:t>
+              <w:t xml:space="preserve">{% for item in </w:t>
+            </w:r>
+            <w:proofErr w:type="spellStart"/>
+            <w:r>
+              <w:rPr>
+                <w:lang w:val="en-US"/>
+              </w:rPr>
+              <w:t>template_dict.readme_file.comments</w:t>
+            </w:r>
+            <w:proofErr w:type="spellEnd"/>
+            <w:r>
+              <w:rPr>
+                <w:lang w:val="en-US"/>
+              </w:rPr>
+              <w:t xml:space="preserve"> %}{{ </w:t>
+            </w:r>
+            <w:proofErr w:type="spellStart"/>
+            <w:r>
+              <w:rPr>
+                <w:lang w:val="en-US"/>
+              </w:rPr>
+              <w:t>loop.index</w:t>
+            </w:r>
+            <w:proofErr w:type="spellEnd"/>
+            <w:r>
+              <w:rPr>
+                <w:lang w:val="en-US"/>
+              </w:rPr>
+              <w:t xml:space="preserve"> }}. {{ </w:t>
+            </w:r>
+            <w:proofErr w:type="spellStart"/>
+            <w:r>
+              <w:rPr>
+                <w:lang w:val="en-US"/>
+              </w:rPr>
+              <w:t>item.file_name</w:t>
+            </w:r>
+            <w:proofErr w:type="spellEnd"/>
+            <w:r>
+              <w:rPr>
+                <w:lang w:val="en-US"/>
+              </w:rPr>
+              <w:t xml:space="preserve"> }}</w:t>
             </w:r>
             <w:r>
               <w:rPr>
@@ -4796,14 +5106,20 @@
               <w:br/>
               <w:t xml:space="preserve">{% </w:t>
             </w:r>
-            <w:proofErr w:type="gramStart"/>
-            <w:r>
-              <w:rPr>
-                <w:lang w:val="en-US"/>
-              </w:rPr>
-              <w:t>endfor %}</w:t>
-            </w:r>
-            <w:proofErr w:type="gramEnd"/>
+            <w:proofErr w:type="spellStart"/>
+            <w:r>
+              <w:rPr>
+                <w:lang w:val="en-US"/>
+              </w:rPr>
+              <w:t>endfor</w:t>
+            </w:r>
+            <w:proofErr w:type="spellEnd"/>
+            <w:r>
+              <w:rPr>
+                <w:lang w:val="en-US"/>
+              </w:rPr>
+              <w:t xml:space="preserve"> %}</w:t>
+            </w:r>
           </w:p>
           <w:p/>
         </w:tc>
@@ -7149,30 +7465,22 @@
               <w:rPr>
                 <w:lang w:val="en-US"/>
               </w:rPr>
-              <w:t>{% for item in template_</w:t>
-            </w:r>
-            <w:proofErr w:type="gramStart"/>
-            <w:r>
-              <w:rPr>
-                <w:lang w:val="en-US"/>
-              </w:rPr>
-              <w:t>dict.typo</w:t>
-            </w:r>
-            <w:proofErr w:type="gramEnd"/>
-            <w:r>
-              <w:rPr>
-                <w:lang w:val="en-US"/>
-              </w:rPr>
-              <w:t>.</w:t>
-            </w:r>
-            <w:proofErr w:type="gramStart"/>
-            <w:r>
-              <w:rPr>
-                <w:lang w:val="en-US"/>
-              </w:rPr>
-              <w:t>comments %}</w:t>
-            </w:r>
-            <w:proofErr w:type="gramEnd"/>
+              <w:t xml:space="preserve">{% for item in </w:t>
+            </w:r>
+            <w:proofErr w:type="spellStart"/>
+            <w:r>
+              <w:rPr>
+                <w:lang w:val="en-US"/>
+              </w:rPr>
+              <w:t>template_dict.typo.comments</w:t>
+            </w:r>
+            <w:proofErr w:type="spellEnd"/>
+            <w:r>
+              <w:rPr>
+                <w:lang w:val="en-US"/>
+              </w:rPr>
+              <w:t xml:space="preserve"> %}</w:t>
+            </w:r>
           </w:p>
           <w:p>
             <w:pPr>
@@ -7182,19 +7490,25 @@
                 <w:numId w:val="46"/>
               </w:numPr>
             </w:pPr>
-            <w:proofErr w:type="gramStart"/>
-            <w:r>
-              <w:rPr>
-                <w:lang w:val="en-US"/>
-              </w:rPr>
-              <w:t>{{ item</w:t>
-            </w:r>
-            <w:proofErr w:type="gramEnd"/>
-            <w:r>
-              <w:rPr>
-                <w:lang w:val="en-US"/>
-              </w:rPr>
-              <w:t xml:space="preserve"> }}{% endfor %}</w:t>
+            <w:r>
+              <w:rPr>
+                <w:lang w:val="en-US"/>
+              </w:rPr>
+              <w:t xml:space="preserve">{{ item }}{% </w:t>
+            </w:r>
+            <w:proofErr w:type="spellStart"/>
+            <w:r>
+              <w:rPr>
+                <w:lang w:val="en-US"/>
+              </w:rPr>
+              <w:t>endfor</w:t>
+            </w:r>
+            <w:proofErr w:type="spellEnd"/>
+            <w:r>
+              <w:rPr>
+                <w:lang w:val="en-US"/>
+              </w:rPr>
+              <w:t xml:space="preserve"> %}</w:t>
             </w:r>
           </w:p>
         </w:tc>
@@ -7666,15 +7980,15 @@
           </w:tcPr>
           <w:p>
             <w:r>
-              <w:t>{% if not template_</w:t>
-            </w:r>
-            <w:proofErr w:type="gramStart"/>
-            <w:r>
-              <w:t>dict.none</w:t>
-            </w:r>
-            <w:proofErr w:type="gramEnd"/>
-            <w:r>
-              <w:t>_author_affiliation %}X{% endif %}</w:t>
+              <w:t xml:space="preserve">{% if not </w:t>
+            </w:r>
+            <w:proofErr w:type="spellStart"/>
+            <w:r>
+              <w:t>template_dict.none_author_affiliation</w:t>
+            </w:r>
+            <w:proofErr w:type="spellEnd"/>
+            <w:r>
+              <w:t xml:space="preserve"> %}X{% endif %}</w:t>
             </w:r>
           </w:p>
         </w:tc>
@@ -7697,15 +8011,15 @@
           </w:tcPr>
           <w:p>
             <w:r>
-              <w:t>{% if template_</w:t>
-            </w:r>
-            <w:proofErr w:type="gramStart"/>
-            <w:r>
-              <w:t>dict.none</w:t>
-            </w:r>
-            <w:proofErr w:type="gramEnd"/>
-            <w:r>
-              <w:t>_author_affiliation %}X{% endif %}</w:t>
+              <w:t xml:space="preserve">{% if </w:t>
+            </w:r>
+            <w:proofErr w:type="spellStart"/>
+            <w:r>
+              <w:t>template_dict.none_author_affiliation</w:t>
+            </w:r>
+            <w:proofErr w:type="spellEnd"/>
+            <w:r>
+              <w:t xml:space="preserve"> %}X{% endif %}</w:t>
             </w:r>
           </w:p>
         </w:tc>
@@ -9694,7 +10008,23 @@
           </w:tcPr>
           <w:p>
             <w:r>
-              <w:t>If not, provide the citation and the doi of the publication(s) below, with the format ‘publication: doi’:</w:t>
+              <w:t xml:space="preserve">If not, provide the citation and the </w:t>
+            </w:r>
+            <w:proofErr w:type="spellStart"/>
+            <w:r>
+              <w:t>doi</w:t>
+            </w:r>
+            <w:proofErr w:type="spellEnd"/>
+            <w:r>
+              <w:t xml:space="preserve"> of the publication(s) below, with the format ‘publication: </w:t>
+            </w:r>
+            <w:proofErr w:type="spellStart"/>
+            <w:r>
+              <w:t>doi</w:t>
+            </w:r>
+            <w:proofErr w:type="spellEnd"/>
+            <w:r>
+              <w:t>’:</w:t>
             </w:r>
           </w:p>
           <w:p>
@@ -10832,15 +11162,11 @@
               <w:br/>
             </w:r>
             <w:r>
-              <w:t>{% if template_</w:t>
-            </w:r>
-            <w:proofErr w:type="gramStart"/>
-            <w:r>
-              <w:t>dict.restricted</w:t>
-            </w:r>
-            <w:proofErr w:type="gramEnd"/>
-            <w:r>
-              <w:t>_files.comment</w:t>
+              <w:t xml:space="preserve">{% if </w:t>
+            </w:r>
+            <w:proofErr w:type="spellStart"/>
+            <w:r>
+              <w:t>template_dict.restricted_files.comment</w:t>
             </w:r>
             <w:r>
               <w:rPr>
@@ -10849,10 +11175,22 @@
               <w:t>s</w:t>
             </w:r>
             <w:r>
-              <w:t>|length &gt; 0</w:t>
-            </w:r>
-            <w:r>
-              <w:t xml:space="preserve"> %} {% for item in template_dict.restricted_files.comments %} </w:t>
+              <w:t>|length</w:t>
+            </w:r>
+            <w:proofErr w:type="spellEnd"/>
+            <w:r>
+              <w:t xml:space="preserve"> &gt; 0</w:t>
+            </w:r>
+            <w:r>
+              <w:t xml:space="preserve"> %} {% for item in </w:t>
+            </w:r>
+            <w:proofErr w:type="spellStart"/>
+            <w:r>
+              <w:t>template_dict.restricted_files.comments</w:t>
+            </w:r>
+            <w:proofErr w:type="spellEnd"/>
+            <w:r>
+              <w:t xml:space="preserve"> %} </w:t>
             </w:r>
           </w:p>
           <w:p>
@@ -10863,26 +11201,29 @@
                 <w:numId w:val="47"/>
               </w:numPr>
             </w:pPr>
-            <w:proofErr w:type="gramStart"/>
-            <w:r>
-              <w:t>{{ item</w:t>
-            </w:r>
-            <w:proofErr w:type="gramEnd"/>
-            <w:r>
-              <w:t>.file_name }} {% endfor %}</w:t>
-            </w:r>
-          </w:p>
-          <w:p>
-            <w:r>
-              <w:t xml:space="preserve">{% else </w:t>
-            </w:r>
-            <w:proofErr w:type="gramStart"/>
-            <w:r>
-              <w:t>%}(</w:t>
-            </w:r>
-            <w:proofErr w:type="gramEnd"/>
-            <w:r>
-              <w:t>NONE){% endif %}</w:t>
+            <w:r>
+              <w:t xml:space="preserve">{{ </w:t>
+            </w:r>
+            <w:proofErr w:type="spellStart"/>
+            <w:r>
+              <w:t>item.file_name</w:t>
+            </w:r>
+            <w:proofErr w:type="spellEnd"/>
+            <w:r>
+              <w:t xml:space="preserve"> }} {% </w:t>
+            </w:r>
+            <w:proofErr w:type="spellStart"/>
+            <w:r>
+              <w:t>endfor</w:t>
+            </w:r>
+            <w:proofErr w:type="spellEnd"/>
+            <w:r>
+              <w:t xml:space="preserve"> %}</w:t>
+            </w:r>
+          </w:p>
+          <w:p>
+            <w:r>
+              <w:t>{% else %}(NONE){% endif %}</w:t>
             </w:r>
           </w:p>
           <w:p>
@@ -10910,15 +11251,23 @@
               </w:rPr>
             </w:pPr>
             <w:r>
-              <w:t>{% if template_</w:t>
-            </w:r>
-            <w:proofErr w:type="gramStart"/>
-            <w:r>
-              <w:t>dict.terms</w:t>
-            </w:r>
-            <w:proofErr w:type="gramEnd"/>
-            <w:r>
-              <w:t>_license.licenseName is not none %}{{ template_dict.terms_license.licenseName }}{% else %}(NONE){% endif %}</w:t>
+              <w:t xml:space="preserve">{% if </w:t>
+            </w:r>
+            <w:proofErr w:type="spellStart"/>
+            <w:r>
+              <w:t>template_dict.terms_license.licenseName</w:t>
+            </w:r>
+            <w:proofErr w:type="spellEnd"/>
+            <w:r>
+              <w:t xml:space="preserve"> is not none %}{{ </w:t>
+            </w:r>
+            <w:proofErr w:type="spellStart"/>
+            <w:r>
+              <w:t>template_dict.terms_license.licenseName</w:t>
+            </w:r>
+            <w:proofErr w:type="spellEnd"/>
+            <w:r>
+              <w:t xml:space="preserve"> }}{% else %}(NONE){% endif %}</w:t>
             </w:r>
           </w:p>
           <w:p>
@@ -10959,25 +11308,27 @@
                     </w:rPr>
                   </w:pPr>
                   <w:r>
-                    <w:t>{% if template_</w:t>
+                    <w:t xml:space="preserve">{% if </w:t>
                   </w:r>
-                  <w:proofErr w:type="gramStart"/>
+                  <w:proofErr w:type="spellStart"/>
                   <w:r>
-                    <w:t>dict.terms</w:t>
-                  </w:r>
-                  <w:proofErr w:type="gramEnd"/>
-                  <w:r>
-                    <w:t>_license.</w:t>
+                    <w:t>template_dict.terms_license.</w:t>
                   </w:r>
                   <w:r>
                     <w:t>termsOfUse</w:t>
                   </w:r>
+                  <w:proofErr w:type="spellEnd"/>
                   <w:r>
-                    <w:t xml:space="preserve"> is not none %}{{ template_dict.terms_license.</w:t>
+                    <w:t xml:space="preserve"> is not none %}{{ </w:t>
+                  </w:r>
+                  <w:proofErr w:type="spellStart"/>
+                  <w:r>
+                    <w:t>template_dict.terms_license.</w:t>
                   </w:r>
                   <w:r>
                     <w:t>termsOfUse</w:t>
                   </w:r>
+                  <w:proofErr w:type="spellEnd"/>
                   <w:r>
                     <w:t xml:space="preserve"> }}{% else %}(NONE){% endif %}</w:t>
                   </w:r>
@@ -11168,11 +11519,19 @@
               <w:lastRenderedPageBreak/>
               <w:t xml:space="preserve">{% if </w:t>
             </w:r>
-            <w:r>
-              <w:rPr>
-                <w:lang w:val="en-US"/>
-              </w:rPr>
-              <w:t>template_dict.</w:t>
+            <w:proofErr w:type="spellStart"/>
+            <w:r>
+              <w:rPr>
+                <w:lang w:val="en-US"/>
+              </w:rPr>
+              <w:t>template_dict</w:t>
+            </w:r>
+            <w:proofErr w:type="spellEnd"/>
+            <w:r>
+              <w:rPr>
+                <w:lang w:val="en-US"/>
+              </w:rPr>
+              <w:t>.</w:t>
             </w:r>
             <w:r>
               <w:rPr>
@@ -11185,21 +11544,38 @@
               </w:rPr>
               <w:t xml:space="preserve"> </w:t>
             </w:r>
+            <w:proofErr w:type="spellStart"/>
             <w:r>
               <w:t>restricted_files</w:t>
             </w:r>
-            <w:r>
-              <w:rPr>
-                <w:lang w:val="en-US"/>
-              </w:rPr>
-              <w:t>.comments</w:t>
+            <w:proofErr w:type="spellEnd"/>
+            <w:r>
+              <w:rPr>
+                <w:lang w:val="en-US"/>
+              </w:rPr>
+              <w:t>.</w:t>
+            </w:r>
+            <w:proofErr w:type="spellStart"/>
+            <w:r>
+              <w:rPr>
+                <w:lang w:val="en-US"/>
+              </w:rPr>
+              <w:t>comments</w:t>
             </w:r>
             <w:r>
               <w:rPr>
                 <w:rFonts w:hint="eastAsia"/>
                 <w:lang w:val="en-US"/>
               </w:rPr>
-              <w:t>|length &gt;</w:t>
+              <w:t>|length</w:t>
+            </w:r>
+            <w:proofErr w:type="spellEnd"/>
+            <w:r>
+              <w:rPr>
+                <w:rFonts w:hint="eastAsia"/>
+                <w:lang w:val="en-US"/>
+              </w:rPr>
+              <w:t xml:space="preserve"> &gt;</w:t>
             </w:r>
             <w:r>
               <w:rPr>
@@ -11214,12 +11590,14 @@
               </w:rPr>
               <w:t xml:space="preserve">and </w:t>
             </w:r>
+            <w:proofErr w:type="spellStart"/>
             <w:r>
               <w:t>template_dict.terms_license.</w:t>
             </w:r>
             <w:r>
               <w:t>termsOfAccess</w:t>
             </w:r>
+            <w:proofErr w:type="spellEnd"/>
             <w:r>
               <w:t xml:space="preserve"> is not none</w:t>
             </w:r>
@@ -11258,11 +11636,19 @@
               </w:rPr>
               <w:t xml:space="preserve">{% if </w:t>
             </w:r>
-            <w:r>
-              <w:rPr>
-                <w:lang w:val="en-US"/>
-              </w:rPr>
-              <w:t>template_dict.</w:t>
+            <w:proofErr w:type="spellStart"/>
+            <w:r>
+              <w:rPr>
+                <w:lang w:val="en-US"/>
+              </w:rPr>
+              <w:t>template_dict</w:t>
+            </w:r>
+            <w:proofErr w:type="spellEnd"/>
+            <w:r>
+              <w:rPr>
+                <w:lang w:val="en-US"/>
+              </w:rPr>
+              <w:t>.</w:t>
             </w:r>
             <w:r>
               <w:rPr>
@@ -11275,21 +11661,38 @@
               </w:rPr>
               <w:t xml:space="preserve"> </w:t>
             </w:r>
+            <w:proofErr w:type="spellStart"/>
             <w:r>
               <w:t>restricted_files</w:t>
             </w:r>
-            <w:r>
-              <w:rPr>
-                <w:lang w:val="en-US"/>
-              </w:rPr>
-              <w:t>.comments</w:t>
+            <w:proofErr w:type="spellEnd"/>
+            <w:r>
+              <w:rPr>
+                <w:lang w:val="en-US"/>
+              </w:rPr>
+              <w:t>.</w:t>
+            </w:r>
+            <w:proofErr w:type="spellStart"/>
+            <w:r>
+              <w:rPr>
+                <w:lang w:val="en-US"/>
+              </w:rPr>
+              <w:t>comments</w:t>
             </w:r>
             <w:r>
               <w:rPr>
                 <w:rFonts w:hint="eastAsia"/>
                 <w:lang w:val="en-US"/>
               </w:rPr>
-              <w:t>|length &gt;</w:t>
+              <w:t>|length</w:t>
+            </w:r>
+            <w:proofErr w:type="spellEnd"/>
+            <w:r>
+              <w:rPr>
+                <w:rFonts w:hint="eastAsia"/>
+                <w:lang w:val="en-US"/>
+              </w:rPr>
+              <w:t xml:space="preserve"> &gt;</w:t>
             </w:r>
             <w:r>
               <w:rPr>
@@ -11304,12 +11707,14 @@
               </w:rPr>
               <w:t xml:space="preserve">and </w:t>
             </w:r>
+            <w:proofErr w:type="spellStart"/>
             <w:r>
               <w:t>template_dict.terms_license.</w:t>
             </w:r>
             <w:r>
               <w:t>termsOfAccess</w:t>
             </w:r>
+            <w:proofErr w:type="spellEnd"/>
             <w:r>
               <w:t xml:space="preserve"> is none</w:t>
             </w:r>
@@ -11384,11 +11789,19 @@
               </w:rPr>
               <w:t xml:space="preserve">{% if </w:t>
             </w:r>
-            <w:r>
-              <w:rPr>
-                <w:lang w:val="en-US"/>
-              </w:rPr>
-              <w:t>template_dict.</w:t>
+            <w:proofErr w:type="spellStart"/>
+            <w:r>
+              <w:rPr>
+                <w:lang w:val="en-US"/>
+              </w:rPr>
+              <w:t>template_dict</w:t>
+            </w:r>
+            <w:proofErr w:type="spellEnd"/>
+            <w:r>
+              <w:rPr>
+                <w:lang w:val="en-US"/>
+              </w:rPr>
+              <w:t>.</w:t>
             </w:r>
             <w:r>
               <w:rPr>
@@ -11401,21 +11814,38 @@
               </w:rPr>
               <w:t xml:space="preserve"> </w:t>
             </w:r>
+            <w:proofErr w:type="spellStart"/>
             <w:r>
               <w:t>restricted_files</w:t>
             </w:r>
-            <w:r>
-              <w:rPr>
-                <w:lang w:val="en-US"/>
-              </w:rPr>
-              <w:t>.comments</w:t>
+            <w:proofErr w:type="spellEnd"/>
+            <w:r>
+              <w:rPr>
+                <w:lang w:val="en-US"/>
+              </w:rPr>
+              <w:t>.</w:t>
+            </w:r>
+            <w:proofErr w:type="spellStart"/>
+            <w:r>
+              <w:rPr>
+                <w:lang w:val="en-US"/>
+              </w:rPr>
+              <w:t>comments</w:t>
             </w:r>
             <w:r>
               <w:rPr>
                 <w:rFonts w:hint="eastAsia"/>
                 <w:lang w:val="en-US"/>
               </w:rPr>
-              <w:t>|length ==</w:t>
+              <w:t>|length</w:t>
+            </w:r>
+            <w:proofErr w:type="spellEnd"/>
+            <w:r>
+              <w:rPr>
+                <w:rFonts w:hint="eastAsia"/>
+                <w:lang w:val="en-US"/>
+              </w:rPr>
+              <w:t xml:space="preserve"> ==</w:t>
             </w:r>
             <w:r>
               <w:rPr>
@@ -11489,25 +11919,27 @@
                     </w:rPr>
                   </w:pPr>
                   <w:r>
-                    <w:t>{% if template_</w:t>
+                    <w:t xml:space="preserve">{% if </w:t>
                   </w:r>
-                  <w:proofErr w:type="gramStart"/>
+                  <w:proofErr w:type="spellStart"/>
                   <w:r>
-                    <w:t>dict.terms</w:t>
-                  </w:r>
-                  <w:proofErr w:type="gramEnd"/>
-                  <w:r>
-                    <w:t>_license.</w:t>
+                    <w:t>template_dict.terms_license.</w:t>
                   </w:r>
                   <w:r>
                     <w:t>termsOfAccess</w:t>
                   </w:r>
+                  <w:proofErr w:type="spellEnd"/>
                   <w:r>
-                    <w:t xml:space="preserve"> is not none %}{{ template_dict.terms_license.</w:t>
+                    <w:t xml:space="preserve"> is not none %}{{ </w:t>
+                  </w:r>
+                  <w:proofErr w:type="spellStart"/>
+                  <w:r>
+                    <w:t>template_dict.terms_license.</w:t>
                   </w:r>
                   <w:r>
                     <w:t>termsOfAccess</w:t>
                   </w:r>
+                  <w:proofErr w:type="spellEnd"/>
                   <w:r>
                     <w:t xml:space="preserve"> }}{% else %}(NONE){% endif %}</w:t>
                   </w:r>

</xml_diff>

<commit_message>
1. Added showing the absolute path of the dataset inside the dataverse repository.
</commit_message>
<xml_diff>
--- a/res/template_high.docx
+++ b/res/template_high.docx
@@ -72,7 +72,14 @@
         <w:rPr>
           <w:rFonts w:hint="eastAsia"/>
         </w:rPr>
-        <w:t>Ticket number: {</w:t>
+        <w:t xml:space="preserve">Ticket number: </w:t>
+      </w:r>
+      <w:proofErr w:type="gramStart"/>
+      <w:r>
+        <w:rPr>
+          <w:rFonts w:hint="eastAsia"/>
+        </w:rPr>
+        <w:t>{</w:t>
       </w:r>
       <w:r>
         <w:rPr>
@@ -88,7 +95,11 @@
       </w:r>
       <w:proofErr w:type="spellStart"/>
       <w:r>
-        <w:t>project_info</w:t>
+        <w:t>project</w:t>
+      </w:r>
+      <w:proofErr w:type="gramEnd"/>
+      <w:r>
+        <w:t>_info</w:t>
       </w:r>
       <w:r>
         <w:rPr>
@@ -130,11 +141,22 @@
         <w:rPr>
           <w:rFonts w:hint="eastAsia"/>
         </w:rPr>
-        <w:t xml:space="preserve"> {{ </w:t>
+        <w:t xml:space="preserve"> </w:t>
+      </w:r>
+      <w:proofErr w:type="gramStart"/>
+      <w:r>
+        <w:rPr>
+          <w:rFonts w:hint="eastAsia"/>
+        </w:rPr>
+        <w:t xml:space="preserve">{{ </w:t>
       </w:r>
       <w:proofErr w:type="spellStart"/>
       <w:r>
-        <w:t>project_info</w:t>
+        <w:t>project</w:t>
+      </w:r>
+      <w:proofErr w:type="gramEnd"/>
+      <w:r>
+        <w:t>_info</w:t>
       </w:r>
       <w:r>
         <w:rPr>
@@ -155,11 +177,22 @@
         <w:rPr>
           <w:rFonts w:hint="eastAsia"/>
         </w:rPr>
-        <w:t xml:space="preserve">Curator email: {{ </w:t>
+        <w:t xml:space="preserve">Curator email: </w:t>
+      </w:r>
+      <w:proofErr w:type="gramStart"/>
+      <w:r>
+        <w:rPr>
+          <w:rFonts w:hint="eastAsia"/>
+        </w:rPr>
+        <w:t xml:space="preserve">{{ </w:t>
       </w:r>
       <w:proofErr w:type="spellStart"/>
       <w:r>
-        <w:t>project_info</w:t>
+        <w:t>project</w:t>
+      </w:r>
+      <w:proofErr w:type="gramEnd"/>
+      <w:r>
+        <w:t>_info</w:t>
       </w:r>
       <w:r>
         <w:rPr>
@@ -185,6 +218,7 @@
         </w:rPr>
         <w:t xml:space="preserve">Dataset title: </w:t>
       </w:r>
+      <w:proofErr w:type="gramStart"/>
       <w:r>
         <w:rPr>
           <w:rFonts w:hint="eastAsia"/>
@@ -196,7 +230,14 @@
         <w:rPr>
           <w:rFonts w:hint="eastAsia"/>
         </w:rPr>
-        <w:t>dataset.</w:t>
+        <w:t>dataset</w:t>
+      </w:r>
+      <w:proofErr w:type="gramEnd"/>
+      <w:r>
+        <w:rPr>
+          <w:rFonts w:hint="eastAsia"/>
+        </w:rPr>
+        <w:t>.</w:t>
       </w:r>
       <w:r>
         <w:t>DatasetTitle</w:t>
@@ -235,7 +276,14 @@
         <w:rPr>
           <w:rFonts w:hint="eastAsia"/>
         </w:rPr>
-        <w:t>: {</w:t>
+        <w:t xml:space="preserve">: </w:t>
+      </w:r>
+      <w:proofErr w:type="gramStart"/>
+      <w:r>
+        <w:rPr>
+          <w:rFonts w:hint="eastAsia"/>
+        </w:rPr>
+        <w:t>{</w:t>
       </w:r>
       <w:r>
         <w:rPr>
@@ -254,7 +302,14 @@
         <w:rPr>
           <w:rFonts w:hint="eastAsia"/>
         </w:rPr>
-        <w:t>dataset.</w:t>
+        <w:t>dataset</w:t>
+      </w:r>
+      <w:proofErr w:type="gramEnd"/>
+      <w:r>
+        <w:rPr>
+          <w:rFonts w:hint="eastAsia"/>
+        </w:rPr>
+        <w:t>.</w:t>
       </w:r>
       <w:r>
         <w:t>DatasetPersistentId</w:t>
@@ -278,7 +333,21 @@
         <w:rPr>
           <w:rFonts w:hint="eastAsia"/>
         </w:rPr>
-        <w:t>Dataset ID (versioned): {{ dataset.ID  }}</w:t>
+        <w:t xml:space="preserve">Dataset ID (versioned): </w:t>
+      </w:r>
+      <w:proofErr w:type="gramStart"/>
+      <w:r>
+        <w:rPr>
+          <w:rFonts w:hint="eastAsia"/>
+        </w:rPr>
+        <w:t>{{ dataset.ID</w:t>
+      </w:r>
+      <w:proofErr w:type="gramEnd"/>
+      <w:r>
+        <w:rPr>
+          <w:rFonts w:hint="eastAsia"/>
+        </w:rPr>
+        <w:t xml:space="preserve">  }}</w:t>
       </w:r>
     </w:p>
     <w:p>
@@ -286,7 +355,14 @@
         <w:rPr>
           <w:rFonts w:hint="eastAsia"/>
         </w:rPr>
-        <w:t>Dataset access URL: {</w:t>
+        <w:t xml:space="preserve">Dataset access URL: </w:t>
+      </w:r>
+      <w:proofErr w:type="gramStart"/>
+      <w:r>
+        <w:rPr>
+          <w:rFonts w:hint="eastAsia"/>
+        </w:rPr>
+        <w:t>{</w:t>
       </w:r>
       <w:r>
         <w:rPr>
@@ -305,7 +381,14 @@
         <w:rPr>
           <w:rFonts w:hint="eastAsia"/>
         </w:rPr>
-        <w:t>dataset.</w:t>
+        <w:t>dataset</w:t>
+      </w:r>
+      <w:proofErr w:type="gramEnd"/>
+      <w:r>
+        <w:rPr>
+          <w:rFonts w:hint="eastAsia"/>
+        </w:rPr>
+        <w:t>.</w:t>
       </w:r>
       <w:r>
         <w:t>DatasetURL</w:t>
@@ -358,6 +441,7 @@
         </w:rPr>
         <w:t xml:space="preserve">date: </w:t>
       </w:r>
+      <w:proofErr w:type="gramStart"/>
       <w:r>
         <w:rPr>
           <w:rFonts w:hint="eastAsia"/>
@@ -382,6 +466,7 @@
         </w:rPr>
         <w:t>timestamp</w:t>
       </w:r>
+      <w:proofErr w:type="gramEnd"/>
       <w:r>
         <w:rPr>
           <w:rFonts w:hint="eastAsia"/>
@@ -1085,14 +1170,29 @@
               <w:rPr>
                 <w:lang w:val="en-US"/>
               </w:rPr>
-              <w:t>template_dict.</w:t>
+              <w:t>template_</w:t>
+            </w:r>
+            <w:proofErr w:type="gramStart"/>
+            <w:r>
+              <w:rPr>
+                <w:lang w:val="en-US"/>
+              </w:rPr>
+              <w:t>dict.</w:t>
             </w:r>
             <w:r>
               <w:rPr>
                 <w:rFonts w:hint="eastAsia"/>
                 <w:lang w:val="en-US"/>
               </w:rPr>
-              <w:t>dv_record</w:t>
+              <w:t>dv</w:t>
+            </w:r>
+            <w:proofErr w:type="gramEnd"/>
+            <w:r>
+              <w:rPr>
+                <w:rFonts w:hint="eastAsia"/>
+                <w:lang w:val="en-US"/>
+              </w:rPr>
+              <w:t>_record</w:t>
             </w:r>
             <w:r>
               <w:rPr>
@@ -1158,14 +1258,29 @@
               <w:rPr>
                 <w:lang w:val="en-US"/>
               </w:rPr>
-              <w:t>template_dict.</w:t>
+              <w:t>template_</w:t>
+            </w:r>
+            <w:proofErr w:type="gramStart"/>
+            <w:r>
+              <w:rPr>
+                <w:lang w:val="en-US"/>
+              </w:rPr>
+              <w:t>dict.</w:t>
             </w:r>
             <w:r>
               <w:rPr>
                 <w:rFonts w:hint="eastAsia"/>
                 <w:lang w:val="en-US"/>
               </w:rPr>
-              <w:t>dv_record</w:t>
+              <w:t>dv</w:t>
+            </w:r>
+            <w:proofErr w:type="gramEnd"/>
+            <w:r>
+              <w:rPr>
+                <w:rFonts w:hint="eastAsia"/>
+                <w:lang w:val="en-US"/>
+              </w:rPr>
+              <w:t>_record</w:t>
             </w:r>
             <w:r>
               <w:rPr>
@@ -1311,7 +1426,15 @@
             </w:r>
             <w:proofErr w:type="spellStart"/>
             <w:r>
-              <w:t>template_dict.dv_record.comments</w:t>
+              <w:t>template_</w:t>
+            </w:r>
+            <w:proofErr w:type="gramStart"/>
+            <w:r>
+              <w:t>dict.dv</w:t>
+            </w:r>
+            <w:proofErr w:type="gramEnd"/>
+            <w:r>
+              <w:t>_record.comments</w:t>
             </w:r>
             <w:proofErr w:type="spellEnd"/>
             <w:r>
@@ -1331,10 +1454,12 @@
               <w:t xml:space="preserve"> in </w:t>
             </w:r>
             <w:proofErr w:type="spellStart"/>
+            <w:proofErr w:type="gramStart"/>
             <w:r>
               <w:t>item.items</w:t>
             </w:r>
             <w:proofErr w:type="spellEnd"/>
+            <w:proofErr w:type="gramEnd"/>
             <w:r>
               <w:t>() %} {{ author }}</w:t>
             </w:r>
@@ -1357,12 +1482,17 @@
             <w:r>
               <w:t xml:space="preserve"> %} </w:t>
             </w:r>
+            <w:proofErr w:type="gramStart"/>
             <w:r>
               <w:t xml:space="preserve">{{ </w:t>
             </w:r>
             <w:proofErr w:type="spellStart"/>
             <w:r>
-              <w:t>loop.index</w:t>
+              <w:t>loop</w:t>
+            </w:r>
+            <w:proofErr w:type="gramEnd"/>
+            <w:r>
+              <w:t>.index</w:t>
             </w:r>
             <w:proofErr w:type="spellEnd"/>
             <w:r>
@@ -1374,8 +1504,13 @@
               </w:rPr>
               <w:t xml:space="preserve"> </w:t>
             </w:r>
-            <w:r>
-              <w:t>{{ dataverse }}</w:t>
+            <w:proofErr w:type="gramStart"/>
+            <w:r>
+              <w:t>{{ dataverse</w:t>
+            </w:r>
+            <w:proofErr w:type="gramEnd"/>
+            <w:r>
+              <w:t xml:space="preserve"> }}</w:t>
             </w:r>
             <w:r>
               <w:br/>
@@ -1635,6 +1770,7 @@
               </w:rPr>
               <w:t>University of Toronto Dataverse</w:t>
             </w:r>
+            <w:proofErr w:type="gramStart"/>
             <w:r>
               <w:rPr>
                 <w:lang w:val="en-US"/>
@@ -1645,7 +1781,14 @@
               <w:rPr>
                 <w:lang w:val="en-US"/>
               </w:rPr>
-              <w:t xml:space="preserve"> %}X{% endif %}</w:t>
+              <w:t xml:space="preserve"> %}X{</w:t>
+            </w:r>
+            <w:proofErr w:type="gramEnd"/>
+            <w:r>
+              <w:rPr>
+                <w:lang w:val="en-US"/>
+              </w:rPr>
+              <w:t>% endif %}</w:t>
             </w:r>
           </w:p>
         </w:tc>
@@ -1701,7 +1844,11 @@
             </w:r>
             <w:proofErr w:type="spellStart"/>
             <w:r>
-              <w:t>name_name_of_dataverse</w:t>
+              <w:t>name_name_of_</w:t>
+            </w:r>
+            <w:proofErr w:type="gramStart"/>
+            <w:r>
+              <w:t>dataverse</w:t>
             </w:r>
             <w:proofErr w:type="spellEnd"/>
             <w:r>
@@ -1716,6 +1863,7 @@
               </w:rPr>
               <w:t>!</w:t>
             </w:r>
+            <w:proofErr w:type="gramEnd"/>
             <w:r>
               <w:rPr>
                 <w:lang w:val="en-US"/>
@@ -1734,6 +1882,7 @@
               </w:rPr>
               <w:t>University of Toronto Dataverse</w:t>
             </w:r>
+            <w:proofErr w:type="gramStart"/>
             <w:r>
               <w:rPr>
                 <w:lang w:val="en-US"/>
@@ -1744,7 +1893,14 @@
               <w:rPr>
                 <w:lang w:val="en-US"/>
               </w:rPr>
-              <w:t xml:space="preserve"> %}X{% endif %}</w:t>
+              <w:t xml:space="preserve"> %}</w:t>
+            </w:r>
+            <w:proofErr w:type="gramEnd"/>
+            <w:r>
+              <w:rPr>
+                <w:lang w:val="en-US"/>
+              </w:rPr>
+              <w:t>X{% endif %}</w:t>
             </w:r>
           </w:p>
         </w:tc>
@@ -1834,67 +1990,156 @@
               </w:rPr>
               <w:t xml:space="preserve">List the </w:t>
             </w:r>
+            <w:r>
+              <w:rPr>
+                <w:lang w:val="en-US"/>
+              </w:rPr>
+              <w:t xml:space="preserve">parent </w:t>
+            </w:r>
+            <w:r>
+              <w:rPr>
+                <w:lang w:val="en-US"/>
+              </w:rPr>
+              <w:t>D</w:t>
+            </w:r>
+            <w:r>
+              <w:rPr>
+                <w:rFonts w:hint="eastAsia"/>
+                <w:lang w:val="en-US"/>
+              </w:rPr>
+              <w:t xml:space="preserve">ataverse </w:t>
+            </w:r>
+            <w:r>
+              <w:rPr>
+                <w:lang w:val="en-US"/>
+              </w:rPr>
+              <w:t>collection</w:t>
+            </w:r>
+            <w:r>
+              <w:rPr>
+                <w:rFonts w:hint="eastAsia"/>
+                <w:lang w:val="en-US"/>
+              </w:rPr>
+              <w:t xml:space="preserve"> name:</w:t>
+            </w:r>
+            <w:r>
+              <w:rPr>
+                <w:lang w:val="en-US"/>
+              </w:rPr>
+              <w:br/>
+            </w:r>
+            <w:proofErr w:type="gramStart"/>
+            <w:r>
+              <w:rPr>
+                <w:rFonts w:hint="eastAsia"/>
+                <w:lang w:val="en-US"/>
+              </w:rPr>
+              <w:t xml:space="preserve">{{ </w:t>
+            </w:r>
             <w:proofErr w:type="spellStart"/>
             <w:r>
+              <w:t>template_dict</w:t>
+            </w:r>
+            <w:proofErr w:type="spellEnd"/>
+            <w:r>
               <w:rPr>
                 <w:rFonts w:hint="eastAsia"/>
-                <w:lang w:val="en-US"/>
-              </w:rPr>
-              <w:t>dataverse</w:t>
+              </w:rPr>
+              <w:t>.</w:t>
+            </w:r>
+            <w:proofErr w:type="spellStart"/>
+            <w:r>
+              <w:rPr>
+                <w:lang w:val="en-US"/>
+              </w:rPr>
+              <w:t>ds</w:t>
+            </w:r>
+            <w:proofErr w:type="gramEnd"/>
+            <w:r>
+              <w:rPr>
+                <w:lang w:val="en-US"/>
+              </w:rPr>
+              <w:t>_tree_info</w:t>
+            </w:r>
+            <w:r>
+              <w:rPr>
+                <w:lang w:val="en-US"/>
+              </w:rPr>
+              <w:t>.</w:t>
+            </w:r>
+            <w:r>
+              <w:rPr>
+                <w:lang w:val="en-US"/>
+              </w:rPr>
+              <w:t>parentDataverseName</w:t>
             </w:r>
             <w:proofErr w:type="spellEnd"/>
             <w:r>
               <w:rPr>
                 <w:rFonts w:hint="eastAsia"/>
-                <w:lang w:val="en-US"/>
-              </w:rPr>
-              <w:t xml:space="preserve"> </w:t>
-            </w:r>
-            <w:r>
-              <w:rPr>
-                <w:lang w:val="en-US"/>
-              </w:rPr>
-              <w:t>collection</w:t>
-            </w:r>
+              </w:rPr>
+              <w:t xml:space="preserve"> }}</w:t>
+            </w:r>
+          </w:p>
+          <w:p/>
+          <w:p>
+            <w:r>
+              <w:t xml:space="preserve">List the path of the </w:t>
+            </w:r>
+            <w:r>
+              <w:t>dataset in the Dataverse collection</w:t>
+            </w:r>
+            <w:r>
+              <w:t>:</w:t>
+            </w:r>
+            <w:r>
+              <w:br/>
+            </w:r>
+            <w:proofErr w:type="gramStart"/>
             <w:r>
               <w:rPr>
                 <w:rFonts w:hint="eastAsia"/>
                 <w:lang w:val="en-US"/>
               </w:rPr>
-              <w:t xml:space="preserve"> name:</w:t>
-            </w:r>
-            <w:r>
-              <w:rPr>
-                <w:lang w:val="en-US"/>
-              </w:rPr>
-              <w:br/>
-            </w:r>
+              <w:t xml:space="preserve">{{ </w:t>
+            </w:r>
+            <w:proofErr w:type="spellStart"/>
+            <w:r>
+              <w:t>template_dict</w:t>
+            </w:r>
+            <w:proofErr w:type="spellEnd"/>
             <w:r>
               <w:rPr>
                 <w:rFonts w:hint="eastAsia"/>
-                <w:lang w:val="en-US"/>
-              </w:rPr>
-              <w:t xml:space="preserve">{{ </w:t>
+              </w:rPr>
+              <w:t>.</w:t>
             </w:r>
             <w:proofErr w:type="spellStart"/>
             <w:r>
-              <w:t>template_dict</w:t>
-            </w:r>
+              <w:rPr>
+                <w:lang w:val="en-US"/>
+              </w:rPr>
+              <w:t>ds</w:t>
+            </w:r>
+            <w:proofErr w:type="gramEnd"/>
+            <w:r>
+              <w:rPr>
+                <w:lang w:val="en-US"/>
+              </w:rPr>
+              <w:t>_tree_info</w:t>
+            </w:r>
+            <w:r>
+              <w:rPr>
+                <w:lang w:val="en-US"/>
+              </w:rPr>
+              <w:t>.path</w:t>
+            </w:r>
+            <w:proofErr w:type="spellEnd"/>
             <w:r>
               <w:rPr>
                 <w:rFonts w:hint="eastAsia"/>
               </w:rPr>
-              <w:t>.</w:t>
-            </w:r>
-            <w:r>
-              <w:t>name_of_dataverse</w:t>
-            </w:r>
-            <w:proofErr w:type="spellEnd"/>
-            <w:r>
-              <w:rPr>
-                <w:rFonts w:hint="eastAsia"/>
-              </w:rPr>
-              <w:t xml:space="preserve"> }}</w:t>
+              <w:t>}}</w:t>
             </w:r>
           </w:p>
         </w:tc>
@@ -2071,7 +2316,15 @@
               </w:numPr>
             </w:pPr>
             <w:r>
-              <w:t>Confirm with the depositor that they actually require a datavers</w:t>
+              <w:t xml:space="preserve">Confirm with the depositor that they </w:t>
+            </w:r>
+            <w:proofErr w:type="gramStart"/>
+            <w:r>
+              <w:t>actually require</w:t>
+            </w:r>
+            <w:proofErr w:type="gramEnd"/>
+            <w:r>
+              <w:t xml:space="preserve"> a datavers</w:t>
             </w:r>
             <w:r>
               <w:lastRenderedPageBreak/>
@@ -2644,7 +2897,21 @@
               <w:rPr>
                 <w:lang w:val="en-US"/>
               </w:rPr>
-              <w:t>template_dict.file_ext.comments|length</w:t>
+              <w:t>template_</w:t>
+            </w:r>
+            <w:proofErr w:type="gramStart"/>
+            <w:r>
+              <w:rPr>
+                <w:lang w:val="en-US"/>
+              </w:rPr>
+              <w:t>dict.file</w:t>
+            </w:r>
+            <w:proofErr w:type="gramEnd"/>
+            <w:r>
+              <w:rPr>
+                <w:lang w:val="en-US"/>
+              </w:rPr>
+              <w:t>_ext.comments|length</w:t>
             </w:r>
             <w:proofErr w:type="spellEnd"/>
             <w:r>
@@ -2703,7 +2970,21 @@
               <w:rPr>
                 <w:lang w:val="en-US"/>
               </w:rPr>
-              <w:t>template_dict.file_ext.comments|length</w:t>
+              <w:t>template_</w:t>
+            </w:r>
+            <w:proofErr w:type="gramStart"/>
+            <w:r>
+              <w:rPr>
+                <w:lang w:val="en-US"/>
+              </w:rPr>
+              <w:t>dict.file</w:t>
+            </w:r>
+            <w:proofErr w:type="gramEnd"/>
+            <w:r>
+              <w:rPr>
+                <w:lang w:val="en-US"/>
+              </w:rPr>
+              <w:t>_ext.comments|length</w:t>
             </w:r>
             <w:proofErr w:type="spellEnd"/>
             <w:r>
@@ -2798,7 +3079,21 @@
               <w:rPr>
                 <w:lang w:val="en-US"/>
               </w:rPr>
-              <w:t>template_dict.file_open.comments</w:t>
+              <w:t>template_</w:t>
+            </w:r>
+            <w:proofErr w:type="gramStart"/>
+            <w:r>
+              <w:rPr>
+                <w:lang w:val="en-US"/>
+              </w:rPr>
+              <w:t>dict.file</w:t>
+            </w:r>
+            <w:proofErr w:type="gramEnd"/>
+            <w:r>
+              <w:rPr>
+                <w:lang w:val="en-US"/>
+              </w:rPr>
+              <w:t>_open.comments</w:t>
             </w:r>
             <w:proofErr w:type="spellEnd"/>
             <w:r>
@@ -2819,6 +3114,7 @@
                 <w:lang w:val="en-US"/>
               </w:rPr>
             </w:pPr>
+            <w:proofErr w:type="gramStart"/>
             <w:r>
               <w:rPr>
                 <w:lang w:val="en-US"/>
@@ -2830,7 +3126,14 @@
               <w:rPr>
                 <w:lang w:val="en-US"/>
               </w:rPr>
-              <w:t>item.file_name</w:t>
+              <w:t>item</w:t>
+            </w:r>
+            <w:proofErr w:type="gramEnd"/>
+            <w:r>
+              <w:rPr>
+                <w:lang w:val="en-US"/>
+              </w:rPr>
+              <w:t>.file_name</w:t>
             </w:r>
             <w:proofErr w:type="spellEnd"/>
             <w:r>
@@ -2840,6 +3143,7 @@
               <w:t xml:space="preserve"> }}{% </w:t>
             </w:r>
             <w:proofErr w:type="spellStart"/>
+            <w:proofErr w:type="gramStart"/>
             <w:r>
               <w:rPr>
                 <w:lang w:val="en-US"/>
@@ -2853,6 +3157,7 @@
               </w:rPr>
               <w:t xml:space="preserve"> %}</w:t>
             </w:r>
+            <w:proofErr w:type="gramEnd"/>
           </w:p>
           <w:p>
             <w:pPr>
@@ -2891,7 +3196,14 @@
               <w:rPr>
                 <w:lang w:val="en-US"/>
               </w:rPr>
-              <w:t>template_dict.file_open.not_checked</w:t>
+              <w:t>template_dict.file_open.not_</w:t>
+            </w:r>
+            <w:proofErr w:type="gramStart"/>
+            <w:r>
+              <w:rPr>
+                <w:lang w:val="en-US"/>
+              </w:rPr>
+              <w:t>checked</w:t>
             </w:r>
             <w:proofErr w:type="spellEnd"/>
             <w:r>
@@ -2900,6 +3212,7 @@
               </w:rPr>
               <w:t xml:space="preserve"> %}</w:t>
             </w:r>
+            <w:proofErr w:type="gramEnd"/>
           </w:p>
           <w:p>
             <w:pPr>
@@ -2912,6 +3225,7 @@
                 <w:lang w:val="en-US"/>
               </w:rPr>
             </w:pPr>
+            <w:proofErr w:type="gramStart"/>
             <w:r>
               <w:rPr>
                 <w:lang w:val="en-US"/>
@@ -2923,7 +3237,14 @@
               <w:rPr>
                 <w:lang w:val="en-US"/>
               </w:rPr>
-              <w:t>item.file_name</w:t>
+              <w:t>item</w:t>
+            </w:r>
+            <w:proofErr w:type="gramEnd"/>
+            <w:r>
+              <w:rPr>
+                <w:lang w:val="en-US"/>
+              </w:rPr>
+              <w:t>.file_name</w:t>
             </w:r>
             <w:proofErr w:type="spellEnd"/>
             <w:r>
@@ -2933,6 +3254,7 @@
               <w:t xml:space="preserve"> }}{% </w:t>
             </w:r>
             <w:proofErr w:type="spellStart"/>
+            <w:proofErr w:type="gramStart"/>
             <w:r>
               <w:rPr>
                 <w:lang w:val="en-US"/>
@@ -2946,6 +3268,7 @@
               </w:rPr>
               <w:t xml:space="preserve"> %}</w:t>
             </w:r>
+            <w:proofErr w:type="gramEnd"/>
           </w:p>
           <w:p/>
         </w:tc>
@@ -3068,14 +3391,24 @@
                 <w:bCs/>
                 <w:lang w:val="en-US"/>
               </w:rPr>
-              <w:t>&lt;&gt;:"/\|?*</w:t>
-            </w:r>
+              <w:t>&lt;&gt;:"/\</w:t>
+            </w:r>
+            <w:proofErr w:type="gramStart"/>
             <w:r>
               <w:rPr>
                 <w:b/>
                 <w:bCs/>
                 <w:lang w:val="en-US"/>
               </w:rPr>
+              <w:t>|?*</w:t>
+            </w:r>
+            <w:proofErr w:type="gramEnd"/>
+            <w:r>
+              <w:rPr>
+                <w:b/>
+                <w:bCs/>
+                <w:lang w:val="en-US"/>
+              </w:rPr>
               <w:t>,@$~)?</w:t>
             </w:r>
           </w:p>
@@ -3134,7 +3467,21 @@
               <w:rPr>
                 <w:lang w:val="en-US"/>
               </w:rPr>
-              <w:t>template_dict.special_characters.comments|length</w:t>
+              <w:t>template_</w:t>
+            </w:r>
+            <w:proofErr w:type="gramStart"/>
+            <w:r>
+              <w:rPr>
+                <w:lang w:val="en-US"/>
+              </w:rPr>
+              <w:t>dict.special</w:t>
+            </w:r>
+            <w:proofErr w:type="gramEnd"/>
+            <w:r>
+              <w:rPr>
+                <w:lang w:val="en-US"/>
+              </w:rPr>
+              <w:t>_characters.comments|length</w:t>
             </w:r>
             <w:proofErr w:type="spellEnd"/>
             <w:r>
@@ -3195,7 +3542,21 @@
               <w:rPr>
                 <w:lang w:val="en-US"/>
               </w:rPr>
-              <w:t>template_dict.special_characters.comments|length</w:t>
+              <w:t>template_</w:t>
+            </w:r>
+            <w:proofErr w:type="gramStart"/>
+            <w:r>
+              <w:rPr>
+                <w:lang w:val="en-US"/>
+              </w:rPr>
+              <w:t>dict.special</w:t>
+            </w:r>
+            <w:proofErr w:type="gramEnd"/>
+            <w:r>
+              <w:rPr>
+                <w:lang w:val="en-US"/>
+              </w:rPr>
+              <w:t>_characters.comments|length</w:t>
             </w:r>
             <w:proofErr w:type="spellEnd"/>
             <w:r>
@@ -3292,7 +3653,21 @@
               <w:rPr>
                 <w:lang w:val="en-US"/>
               </w:rPr>
-              <w:t>template_dict.special_characters.comments</w:t>
+              <w:t>template_</w:t>
+            </w:r>
+            <w:proofErr w:type="gramStart"/>
+            <w:r>
+              <w:rPr>
+                <w:lang w:val="en-US"/>
+              </w:rPr>
+              <w:t>dict.special</w:t>
+            </w:r>
+            <w:proofErr w:type="gramEnd"/>
+            <w:r>
+              <w:rPr>
+                <w:lang w:val="en-US"/>
+              </w:rPr>
+              <w:t>_characters.comments</w:t>
             </w:r>
             <w:proofErr w:type="spellEnd"/>
             <w:r>
@@ -3310,6 +3685,7 @@
                 <w:numId w:val="45"/>
               </w:numPr>
             </w:pPr>
+            <w:proofErr w:type="gramStart"/>
             <w:r>
               <w:rPr>
                 <w:lang w:val="en-US"/>
@@ -3321,7 +3697,14 @@
               <w:rPr>
                 <w:lang w:val="en-US"/>
               </w:rPr>
-              <w:t>item.file_name</w:t>
+              <w:t>item</w:t>
+            </w:r>
+            <w:proofErr w:type="gramEnd"/>
+            <w:r>
+              <w:rPr>
+                <w:lang w:val="en-US"/>
+              </w:rPr>
+              <w:t>.file_name</w:t>
             </w:r>
             <w:proofErr w:type="spellEnd"/>
             <w:r>
@@ -3506,7 +3889,21 @@
               <w:rPr>
                 <w:lang w:val="en-US"/>
               </w:rPr>
-              <w:t>template_dict.readme_file.comments|length</w:t>
+              <w:t>template_</w:t>
+            </w:r>
+            <w:proofErr w:type="gramStart"/>
+            <w:r>
+              <w:rPr>
+                <w:lang w:val="en-US"/>
+              </w:rPr>
+              <w:t>dict.readme</w:t>
+            </w:r>
+            <w:proofErr w:type="gramEnd"/>
+            <w:r>
+              <w:rPr>
+                <w:lang w:val="en-US"/>
+              </w:rPr>
+              <w:t>_file.comments|length</w:t>
             </w:r>
             <w:proofErr w:type="spellEnd"/>
             <w:r>
@@ -3580,7 +3977,21 @@
               <w:rPr>
                 <w:lang w:val="en-US"/>
               </w:rPr>
-              <w:t>template_dict.file_ext.comments|length</w:t>
+              <w:t>template_</w:t>
+            </w:r>
+            <w:proofErr w:type="gramStart"/>
+            <w:r>
+              <w:rPr>
+                <w:lang w:val="en-US"/>
+              </w:rPr>
+              <w:t>dict.file</w:t>
+            </w:r>
+            <w:proofErr w:type="gramEnd"/>
+            <w:r>
+              <w:rPr>
+                <w:lang w:val="en-US"/>
+              </w:rPr>
+              <w:t>_ext.comments|length</w:t>
             </w:r>
             <w:proofErr w:type="spellEnd"/>
             <w:r>
@@ -3673,7 +4084,21 @@
               <w:rPr>
                 <w:lang w:val="en-US"/>
               </w:rPr>
-              <w:t>template_dict.file_ext.comments</w:t>
+              <w:t>template_</w:t>
+            </w:r>
+            <w:proofErr w:type="gramStart"/>
+            <w:r>
+              <w:rPr>
+                <w:lang w:val="en-US"/>
+              </w:rPr>
+              <w:t>dict.file</w:t>
+            </w:r>
+            <w:proofErr w:type="gramEnd"/>
+            <w:r>
+              <w:rPr>
+                <w:lang w:val="en-US"/>
+              </w:rPr>
+              <w:t>_ext.comments</w:t>
             </w:r>
             <w:proofErr w:type="spellEnd"/>
             <w:r>
@@ -3692,6 +4117,7 @@
               </w:numPr>
               <w:spacing w:line="256" w:lineRule="auto"/>
             </w:pPr>
+            <w:proofErr w:type="gramStart"/>
             <w:r>
               <w:rPr>
                 <w:lang w:val="en-US"/>
@@ -3703,7 +4129,14 @@
               <w:rPr>
                 <w:lang w:val="en-US"/>
               </w:rPr>
-              <w:t>item.file_name</w:t>
+              <w:t>item</w:t>
+            </w:r>
+            <w:proofErr w:type="gramEnd"/>
+            <w:r>
+              <w:rPr>
+                <w:lang w:val="en-US"/>
+              </w:rPr>
+              <w:t>.file_name</w:t>
             </w:r>
             <w:proofErr w:type="spellEnd"/>
             <w:r>
@@ -3910,13 +4343,27 @@
               <w:rPr>
                 <w:lang w:val="en-US"/>
               </w:rPr>
-              <w:t>common_file_format</w:t>
-            </w:r>
-            <w:r>
-              <w:rPr>
-                <w:lang w:val="en-US"/>
-              </w:rPr>
-              <w:t>.comments|length</w:t>
+              <w:t>common_file_</w:t>
+            </w:r>
+            <w:proofErr w:type="gramStart"/>
+            <w:r>
+              <w:rPr>
+                <w:lang w:val="en-US"/>
+              </w:rPr>
+              <w:t>format</w:t>
+            </w:r>
+            <w:r>
+              <w:rPr>
+                <w:lang w:val="en-US"/>
+              </w:rPr>
+              <w:t>.comments</w:t>
+            </w:r>
+            <w:proofErr w:type="gramEnd"/>
+            <w:r>
+              <w:rPr>
+                <w:lang w:val="en-US"/>
+              </w:rPr>
+              <w:t>|length</w:t>
             </w:r>
             <w:proofErr w:type="spellEnd"/>
             <w:r>
@@ -4010,13 +4457,27 @@
               <w:rPr>
                 <w:lang w:val="en-US"/>
               </w:rPr>
-              <w:t>common_file_format</w:t>
-            </w:r>
-            <w:r>
-              <w:rPr>
-                <w:lang w:val="en-US"/>
-              </w:rPr>
-              <w:t>.comments|length</w:t>
+              <w:t>common_file_</w:t>
+            </w:r>
+            <w:proofErr w:type="gramStart"/>
+            <w:r>
+              <w:rPr>
+                <w:lang w:val="en-US"/>
+              </w:rPr>
+              <w:t>format</w:t>
+            </w:r>
+            <w:r>
+              <w:rPr>
+                <w:lang w:val="en-US"/>
+              </w:rPr>
+              <w:t>.comments</w:t>
+            </w:r>
+            <w:proofErr w:type="gramEnd"/>
+            <w:r>
+              <w:rPr>
+                <w:lang w:val="en-US"/>
+              </w:rPr>
+              <w:t>|length</w:t>
             </w:r>
             <w:proofErr w:type="spellEnd"/>
             <w:r>
@@ -4115,13 +4576,27 @@
               <w:rPr>
                 <w:lang w:val="en-US"/>
               </w:rPr>
-              <w:t>template_dict.</w:t>
-            </w:r>
-            <w:r>
-              <w:rPr>
-                <w:lang w:val="en-US"/>
-              </w:rPr>
-              <w:t>common_file_format</w:t>
+              <w:t>template_</w:t>
+            </w:r>
+            <w:proofErr w:type="gramStart"/>
+            <w:r>
+              <w:rPr>
+                <w:lang w:val="en-US"/>
+              </w:rPr>
+              <w:t>dict.</w:t>
+            </w:r>
+            <w:r>
+              <w:rPr>
+                <w:lang w:val="en-US"/>
+              </w:rPr>
+              <w:t>common</w:t>
+            </w:r>
+            <w:proofErr w:type="gramEnd"/>
+            <w:r>
+              <w:rPr>
+                <w:lang w:val="en-US"/>
+              </w:rPr>
+              <w:t>_file_format</w:t>
             </w:r>
             <w:r>
               <w:rPr>
@@ -4144,6 +4619,7 @@
                 <w:numId w:val="9"/>
               </w:numPr>
             </w:pPr>
+            <w:proofErr w:type="gramStart"/>
             <w:r>
               <w:rPr>
                 <w:lang w:val="en-US"/>
@@ -4155,7 +4631,14 @@
               <w:rPr>
                 <w:lang w:val="en-US"/>
               </w:rPr>
-              <w:t>item.file_name</w:t>
+              <w:t>item</w:t>
+            </w:r>
+            <w:proofErr w:type="gramEnd"/>
+            <w:r>
+              <w:rPr>
+                <w:lang w:val="en-US"/>
+              </w:rPr>
+              <w:t>.file_name</w:t>
             </w:r>
             <w:proofErr w:type="spellEnd"/>
             <w:r>
@@ -4902,7 +5385,21 @@
               <w:rPr>
                 <w:lang w:val="en-US"/>
               </w:rPr>
-              <w:t>template_dict.readme_file.comments|length</w:t>
+              <w:t>template_</w:t>
+            </w:r>
+            <w:proofErr w:type="gramStart"/>
+            <w:r>
+              <w:rPr>
+                <w:lang w:val="en-US"/>
+              </w:rPr>
+              <w:t>dict.readme</w:t>
+            </w:r>
+            <w:proofErr w:type="gramEnd"/>
+            <w:r>
+              <w:rPr>
+                <w:lang w:val="en-US"/>
+              </w:rPr>
+              <w:t>_file.comments|length</w:t>
             </w:r>
             <w:proofErr w:type="spellEnd"/>
             <w:r>
@@ -4948,7 +5445,21 @@
               <w:rPr>
                 <w:lang w:val="en-US"/>
               </w:rPr>
-              <w:t>template_dict.readme_file.comments|length</w:t>
+              <w:t>template_</w:t>
+            </w:r>
+            <w:proofErr w:type="gramStart"/>
+            <w:r>
+              <w:rPr>
+                <w:lang w:val="en-US"/>
+              </w:rPr>
+              <w:t>dict.readme</w:t>
+            </w:r>
+            <w:proofErr w:type="gramEnd"/>
+            <w:r>
+              <w:rPr>
+                <w:lang w:val="en-US"/>
+              </w:rPr>
+              <w:t>_file.comments|length</w:t>
             </w:r>
             <w:proofErr w:type="spellEnd"/>
             <w:r>
@@ -5062,7 +5573,21 @@
               <w:rPr>
                 <w:lang w:val="en-US"/>
               </w:rPr>
-              <w:t>template_dict.readme_file.comments</w:t>
+              <w:t>template_</w:t>
+            </w:r>
+            <w:proofErr w:type="gramStart"/>
+            <w:r>
+              <w:rPr>
+                <w:lang w:val="en-US"/>
+              </w:rPr>
+              <w:t>dict.readme</w:t>
+            </w:r>
+            <w:proofErr w:type="gramEnd"/>
+            <w:r>
+              <w:rPr>
+                <w:lang w:val="en-US"/>
+              </w:rPr>
+              <w:t>_file.comments</w:t>
             </w:r>
             <w:proofErr w:type="spellEnd"/>
             <w:r>
@@ -5083,14 +5608,28 @@
               <w:rPr>
                 <w:lang w:val="en-US"/>
               </w:rPr>
-              <w:t xml:space="preserve"> }}. {{ </w:t>
+              <w:t xml:space="preserve"> }}. </w:t>
+            </w:r>
+            <w:proofErr w:type="gramStart"/>
+            <w:r>
+              <w:rPr>
+                <w:lang w:val="en-US"/>
+              </w:rPr>
+              <w:t xml:space="preserve">{{ </w:t>
             </w:r>
             <w:proofErr w:type="spellStart"/>
             <w:r>
               <w:rPr>
                 <w:lang w:val="en-US"/>
               </w:rPr>
-              <w:t>item.file_name</w:t>
+              <w:t>item</w:t>
+            </w:r>
+            <w:proofErr w:type="gramEnd"/>
+            <w:r>
+              <w:rPr>
+                <w:lang w:val="en-US"/>
+              </w:rPr>
+              <w:t>.file_name</w:t>
             </w:r>
             <w:proofErr w:type="spellEnd"/>
             <w:r>
@@ -5107,6 +5646,7 @@
               <w:t xml:space="preserve">{% </w:t>
             </w:r>
             <w:proofErr w:type="spellStart"/>
+            <w:proofErr w:type="gramStart"/>
             <w:r>
               <w:rPr>
                 <w:lang w:val="en-US"/>
@@ -5120,6 +5660,7 @@
               </w:rPr>
               <w:t xml:space="preserve"> %}</w:t>
             </w:r>
+            <w:proofErr w:type="gramEnd"/>
           </w:p>
           <w:p/>
         </w:tc>
@@ -7472,7 +8013,28 @@
               <w:rPr>
                 <w:lang w:val="en-US"/>
               </w:rPr>
-              <w:t>template_dict.typo.comments</w:t>
+              <w:t>template_</w:t>
+            </w:r>
+            <w:proofErr w:type="gramStart"/>
+            <w:r>
+              <w:rPr>
+                <w:lang w:val="en-US"/>
+              </w:rPr>
+              <w:t>dict.typo</w:t>
+            </w:r>
+            <w:proofErr w:type="gramEnd"/>
+            <w:r>
+              <w:rPr>
+                <w:lang w:val="en-US"/>
+              </w:rPr>
+              <w:t>.</w:t>
+            </w:r>
+            <w:proofErr w:type="gramStart"/>
+            <w:r>
+              <w:rPr>
+                <w:lang w:val="en-US"/>
+              </w:rPr>
+              <w:t>comments</w:t>
             </w:r>
             <w:proofErr w:type="spellEnd"/>
             <w:r>
@@ -7481,6 +8043,7 @@
               </w:rPr>
               <w:t xml:space="preserve"> %}</w:t>
             </w:r>
+            <w:proofErr w:type="gramEnd"/>
           </w:p>
           <w:p>
             <w:pPr>
@@ -7490,11 +8053,19 @@
                 <w:numId w:val="46"/>
               </w:numPr>
             </w:pPr>
-            <w:r>
-              <w:rPr>
-                <w:lang w:val="en-US"/>
-              </w:rPr>
-              <w:t xml:space="preserve">{{ item }}{% </w:t>
+            <w:proofErr w:type="gramStart"/>
+            <w:r>
+              <w:rPr>
+                <w:lang w:val="en-US"/>
+              </w:rPr>
+              <w:t>{{ item</w:t>
+            </w:r>
+            <w:proofErr w:type="gramEnd"/>
+            <w:r>
+              <w:rPr>
+                <w:lang w:val="en-US"/>
+              </w:rPr>
+              <w:t xml:space="preserve"> }}{% </w:t>
             </w:r>
             <w:proofErr w:type="spellStart"/>
             <w:r>
@@ -7984,7 +8555,15 @@
             </w:r>
             <w:proofErr w:type="spellStart"/>
             <w:r>
-              <w:t>template_dict.none_author_affiliation</w:t>
+              <w:t>template_</w:t>
+            </w:r>
+            <w:proofErr w:type="gramStart"/>
+            <w:r>
+              <w:t>dict.none</w:t>
+            </w:r>
+            <w:proofErr w:type="gramEnd"/>
+            <w:r>
+              <w:t>_author_affiliation</w:t>
             </w:r>
             <w:proofErr w:type="spellEnd"/>
             <w:r>
@@ -8015,7 +8594,15 @@
             </w:r>
             <w:proofErr w:type="spellStart"/>
             <w:r>
-              <w:t>template_dict.none_author_affiliation</w:t>
+              <w:t>template_</w:t>
+            </w:r>
+            <w:proofErr w:type="gramStart"/>
+            <w:r>
+              <w:t>dict.none</w:t>
+            </w:r>
+            <w:proofErr w:type="gramEnd"/>
+            <w:r>
+              <w:t>_author_affiliation</w:t>
             </w:r>
             <w:proofErr w:type="spellEnd"/>
             <w:r>
@@ -11166,7 +11753,15 @@
             </w:r>
             <w:proofErr w:type="spellStart"/>
             <w:r>
-              <w:t>template_dict.restricted_files.comment</w:t>
+              <w:t>template_</w:t>
+            </w:r>
+            <w:proofErr w:type="gramStart"/>
+            <w:r>
+              <w:t>dict.restricted</w:t>
+            </w:r>
+            <w:proofErr w:type="gramEnd"/>
+            <w:r>
+              <w:t>_files.comment</w:t>
             </w:r>
             <w:r>
               <w:rPr>
@@ -11201,12 +11796,17 @@
                 <w:numId w:val="47"/>
               </w:numPr>
             </w:pPr>
+            <w:proofErr w:type="gramStart"/>
             <w:r>
               <w:t xml:space="preserve">{{ </w:t>
             </w:r>
             <w:proofErr w:type="spellStart"/>
             <w:r>
-              <w:t>item.file_name</w:t>
+              <w:t>item</w:t>
+            </w:r>
+            <w:proofErr w:type="gramEnd"/>
+            <w:r>
+              <w:t>.file_name</w:t>
             </w:r>
             <w:proofErr w:type="spellEnd"/>
             <w:r>
@@ -11223,7 +11823,15 @@
           </w:p>
           <w:p>
             <w:r>
-              <w:t>{% else %}(NONE){% endif %}</w:t>
+              <w:t xml:space="preserve">{% else </w:t>
+            </w:r>
+            <w:proofErr w:type="gramStart"/>
+            <w:r>
+              <w:t>%}(</w:t>
+            </w:r>
+            <w:proofErr w:type="gramEnd"/>
+            <w:r>
+              <w:t>NONE){% endif %}</w:t>
             </w:r>
           </w:p>
           <w:p>
@@ -11255,7 +11863,15 @@
             </w:r>
             <w:proofErr w:type="spellStart"/>
             <w:r>
-              <w:t>template_dict.terms_license.licenseName</w:t>
+              <w:t>template_</w:t>
+            </w:r>
+            <w:proofErr w:type="gramStart"/>
+            <w:r>
+              <w:t>dict.terms</w:t>
+            </w:r>
+            <w:proofErr w:type="gramEnd"/>
+            <w:r>
+              <w:t>_license.licenseName</w:t>
             </w:r>
             <w:proofErr w:type="spellEnd"/>
             <w:r>
@@ -11312,7 +11928,15 @@
                   </w:r>
                   <w:proofErr w:type="spellStart"/>
                   <w:r>
-                    <w:t>template_dict.terms_license.</w:t>
+                    <w:t>template_</w:t>
+                  </w:r>
+                  <w:proofErr w:type="gramStart"/>
+                  <w:r>
+                    <w:t>dict.terms</w:t>
+                  </w:r>
+                  <w:proofErr w:type="gramEnd"/>
+                  <w:r>
+                    <w:t>_license.</w:t>
                   </w:r>
                   <w:r>
                     <w:t>termsOfUse</w:t>
@@ -11546,7 +12170,11 @@
             </w:r>
             <w:proofErr w:type="spellStart"/>
             <w:r>
-              <w:t>restricted_files</w:t>
+              <w:t>restricted_</w:t>
+            </w:r>
+            <w:proofErr w:type="gramStart"/>
+            <w:r>
+              <w:t>files</w:t>
             </w:r>
             <w:proofErr w:type="spellEnd"/>
             <w:r>
@@ -11562,6 +12190,7 @@
               </w:rPr>
               <w:t>comments</w:t>
             </w:r>
+            <w:proofErr w:type="gramEnd"/>
             <w:r>
               <w:rPr>
                 <w:rFonts w:hint="eastAsia"/>
@@ -11663,7 +12292,11 @@
             </w:r>
             <w:proofErr w:type="spellStart"/>
             <w:r>
-              <w:t>restricted_files</w:t>
+              <w:t>restricted_</w:t>
+            </w:r>
+            <w:proofErr w:type="gramStart"/>
+            <w:r>
+              <w:t>files</w:t>
             </w:r>
             <w:proofErr w:type="spellEnd"/>
             <w:r>
@@ -11679,6 +12312,7 @@
               </w:rPr>
               <w:t>comments</w:t>
             </w:r>
+            <w:proofErr w:type="gramEnd"/>
             <w:r>
               <w:rPr>
                 <w:rFonts w:hint="eastAsia"/>
@@ -11816,7 +12450,11 @@
             </w:r>
             <w:proofErr w:type="spellStart"/>
             <w:r>
-              <w:t>restricted_files</w:t>
+              <w:t>restricted_</w:t>
+            </w:r>
+            <w:proofErr w:type="gramStart"/>
+            <w:r>
+              <w:t>files</w:t>
             </w:r>
             <w:proofErr w:type="spellEnd"/>
             <w:r>
@@ -11832,6 +12470,7 @@
               </w:rPr>
               <w:t>comments</w:t>
             </w:r>
+            <w:proofErr w:type="gramEnd"/>
             <w:r>
               <w:rPr>
                 <w:rFonts w:hint="eastAsia"/>
@@ -11923,7 +12562,15 @@
                   </w:r>
                   <w:proofErr w:type="spellStart"/>
                   <w:r>
-                    <w:t>template_dict.terms_license.</w:t>
+                    <w:t>template_</w:t>
+                  </w:r>
+                  <w:proofErr w:type="gramStart"/>
+                  <w:r>
+                    <w:t>dict.terms</w:t>
+                  </w:r>
+                  <w:proofErr w:type="gramEnd"/>
+                  <w:r>
+                    <w:t>_license.</w:t>
                   </w:r>
                   <w:r>
                     <w:t>termsOfAccess</w:t>

</xml_diff>

<commit_message>
Feture/35 get ds path (#69)
* 1. Added showing the absolute path of the dataset inside the dataverse repository.

* 1. Changed from staticmethod to classmethod for _get_ds_tree_info
</commit_message>
<xml_diff>
--- a/res/template_high.docx
+++ b/res/template_high.docx
@@ -72,7 +72,14 @@
         <w:rPr>
           <w:rFonts w:hint="eastAsia"/>
         </w:rPr>
-        <w:t>Ticket number: {</w:t>
+        <w:t xml:space="preserve">Ticket number: </w:t>
+      </w:r>
+      <w:proofErr w:type="gramStart"/>
+      <w:r>
+        <w:rPr>
+          <w:rFonts w:hint="eastAsia"/>
+        </w:rPr>
+        <w:t>{</w:t>
       </w:r>
       <w:r>
         <w:rPr>
@@ -88,7 +95,11 @@
       </w:r>
       <w:proofErr w:type="spellStart"/>
       <w:r>
-        <w:t>project_info</w:t>
+        <w:t>project</w:t>
+      </w:r>
+      <w:proofErr w:type="gramEnd"/>
+      <w:r>
+        <w:t>_info</w:t>
       </w:r>
       <w:r>
         <w:rPr>
@@ -130,11 +141,22 @@
         <w:rPr>
           <w:rFonts w:hint="eastAsia"/>
         </w:rPr>
-        <w:t xml:space="preserve"> {{ </w:t>
+        <w:t xml:space="preserve"> </w:t>
+      </w:r>
+      <w:proofErr w:type="gramStart"/>
+      <w:r>
+        <w:rPr>
+          <w:rFonts w:hint="eastAsia"/>
+        </w:rPr>
+        <w:t xml:space="preserve">{{ </w:t>
       </w:r>
       <w:proofErr w:type="spellStart"/>
       <w:r>
-        <w:t>project_info</w:t>
+        <w:t>project</w:t>
+      </w:r>
+      <w:proofErr w:type="gramEnd"/>
+      <w:r>
+        <w:t>_info</w:t>
       </w:r>
       <w:r>
         <w:rPr>
@@ -155,11 +177,22 @@
         <w:rPr>
           <w:rFonts w:hint="eastAsia"/>
         </w:rPr>
-        <w:t xml:space="preserve">Curator email: {{ </w:t>
+        <w:t xml:space="preserve">Curator email: </w:t>
+      </w:r>
+      <w:proofErr w:type="gramStart"/>
+      <w:r>
+        <w:rPr>
+          <w:rFonts w:hint="eastAsia"/>
+        </w:rPr>
+        <w:t xml:space="preserve">{{ </w:t>
       </w:r>
       <w:proofErr w:type="spellStart"/>
       <w:r>
-        <w:t>project_info</w:t>
+        <w:t>project</w:t>
+      </w:r>
+      <w:proofErr w:type="gramEnd"/>
+      <w:r>
+        <w:t>_info</w:t>
       </w:r>
       <w:r>
         <w:rPr>
@@ -185,6 +218,7 @@
         </w:rPr>
         <w:t xml:space="preserve">Dataset title: </w:t>
       </w:r>
+      <w:proofErr w:type="gramStart"/>
       <w:r>
         <w:rPr>
           <w:rFonts w:hint="eastAsia"/>
@@ -196,7 +230,14 @@
         <w:rPr>
           <w:rFonts w:hint="eastAsia"/>
         </w:rPr>
-        <w:t>dataset.</w:t>
+        <w:t>dataset</w:t>
+      </w:r>
+      <w:proofErr w:type="gramEnd"/>
+      <w:r>
+        <w:rPr>
+          <w:rFonts w:hint="eastAsia"/>
+        </w:rPr>
+        <w:t>.</w:t>
       </w:r>
       <w:r>
         <w:t>DatasetTitle</w:t>
@@ -235,7 +276,14 @@
         <w:rPr>
           <w:rFonts w:hint="eastAsia"/>
         </w:rPr>
-        <w:t>: {</w:t>
+        <w:t xml:space="preserve">: </w:t>
+      </w:r>
+      <w:proofErr w:type="gramStart"/>
+      <w:r>
+        <w:rPr>
+          <w:rFonts w:hint="eastAsia"/>
+        </w:rPr>
+        <w:t>{</w:t>
       </w:r>
       <w:r>
         <w:rPr>
@@ -254,7 +302,14 @@
         <w:rPr>
           <w:rFonts w:hint="eastAsia"/>
         </w:rPr>
-        <w:t>dataset.</w:t>
+        <w:t>dataset</w:t>
+      </w:r>
+      <w:proofErr w:type="gramEnd"/>
+      <w:r>
+        <w:rPr>
+          <w:rFonts w:hint="eastAsia"/>
+        </w:rPr>
+        <w:t>.</w:t>
       </w:r>
       <w:r>
         <w:t>DatasetPersistentId</w:t>
@@ -278,7 +333,21 @@
         <w:rPr>
           <w:rFonts w:hint="eastAsia"/>
         </w:rPr>
-        <w:t>Dataset ID (versioned): {{ dataset.ID  }}</w:t>
+        <w:t xml:space="preserve">Dataset ID (versioned): </w:t>
+      </w:r>
+      <w:proofErr w:type="gramStart"/>
+      <w:r>
+        <w:rPr>
+          <w:rFonts w:hint="eastAsia"/>
+        </w:rPr>
+        <w:t>{{ dataset.ID</w:t>
+      </w:r>
+      <w:proofErr w:type="gramEnd"/>
+      <w:r>
+        <w:rPr>
+          <w:rFonts w:hint="eastAsia"/>
+        </w:rPr>
+        <w:t xml:space="preserve">  }}</w:t>
       </w:r>
     </w:p>
     <w:p>
@@ -286,7 +355,14 @@
         <w:rPr>
           <w:rFonts w:hint="eastAsia"/>
         </w:rPr>
-        <w:t>Dataset access URL: {</w:t>
+        <w:t xml:space="preserve">Dataset access URL: </w:t>
+      </w:r>
+      <w:proofErr w:type="gramStart"/>
+      <w:r>
+        <w:rPr>
+          <w:rFonts w:hint="eastAsia"/>
+        </w:rPr>
+        <w:t>{</w:t>
       </w:r>
       <w:r>
         <w:rPr>
@@ -305,7 +381,14 @@
         <w:rPr>
           <w:rFonts w:hint="eastAsia"/>
         </w:rPr>
-        <w:t>dataset.</w:t>
+        <w:t>dataset</w:t>
+      </w:r>
+      <w:proofErr w:type="gramEnd"/>
+      <w:r>
+        <w:rPr>
+          <w:rFonts w:hint="eastAsia"/>
+        </w:rPr>
+        <w:t>.</w:t>
       </w:r>
       <w:r>
         <w:t>DatasetURL</w:t>
@@ -358,6 +441,7 @@
         </w:rPr>
         <w:t xml:space="preserve">date: </w:t>
       </w:r>
+      <w:proofErr w:type="gramStart"/>
       <w:r>
         <w:rPr>
           <w:rFonts w:hint="eastAsia"/>
@@ -382,6 +466,7 @@
         </w:rPr>
         <w:t>timestamp</w:t>
       </w:r>
+      <w:proofErr w:type="gramEnd"/>
       <w:r>
         <w:rPr>
           <w:rFonts w:hint="eastAsia"/>
@@ -1085,14 +1170,29 @@
               <w:rPr>
                 <w:lang w:val="en-US"/>
               </w:rPr>
-              <w:t>template_dict.</w:t>
+              <w:t>template_</w:t>
+            </w:r>
+            <w:proofErr w:type="gramStart"/>
+            <w:r>
+              <w:rPr>
+                <w:lang w:val="en-US"/>
+              </w:rPr>
+              <w:t>dict.</w:t>
             </w:r>
             <w:r>
               <w:rPr>
                 <w:rFonts w:hint="eastAsia"/>
                 <w:lang w:val="en-US"/>
               </w:rPr>
-              <w:t>dv_record</w:t>
+              <w:t>dv</w:t>
+            </w:r>
+            <w:proofErr w:type="gramEnd"/>
+            <w:r>
+              <w:rPr>
+                <w:rFonts w:hint="eastAsia"/>
+                <w:lang w:val="en-US"/>
+              </w:rPr>
+              <w:t>_record</w:t>
             </w:r>
             <w:r>
               <w:rPr>
@@ -1158,14 +1258,29 @@
               <w:rPr>
                 <w:lang w:val="en-US"/>
               </w:rPr>
-              <w:t>template_dict.</w:t>
+              <w:t>template_</w:t>
+            </w:r>
+            <w:proofErr w:type="gramStart"/>
+            <w:r>
+              <w:rPr>
+                <w:lang w:val="en-US"/>
+              </w:rPr>
+              <w:t>dict.</w:t>
             </w:r>
             <w:r>
               <w:rPr>
                 <w:rFonts w:hint="eastAsia"/>
                 <w:lang w:val="en-US"/>
               </w:rPr>
-              <w:t>dv_record</w:t>
+              <w:t>dv</w:t>
+            </w:r>
+            <w:proofErr w:type="gramEnd"/>
+            <w:r>
+              <w:rPr>
+                <w:rFonts w:hint="eastAsia"/>
+                <w:lang w:val="en-US"/>
+              </w:rPr>
+              <w:t>_record</w:t>
             </w:r>
             <w:r>
               <w:rPr>
@@ -1311,7 +1426,15 @@
             </w:r>
             <w:proofErr w:type="spellStart"/>
             <w:r>
-              <w:t>template_dict.dv_record.comments</w:t>
+              <w:t>template_</w:t>
+            </w:r>
+            <w:proofErr w:type="gramStart"/>
+            <w:r>
+              <w:t>dict.dv</w:t>
+            </w:r>
+            <w:proofErr w:type="gramEnd"/>
+            <w:r>
+              <w:t>_record.comments</w:t>
             </w:r>
             <w:proofErr w:type="spellEnd"/>
             <w:r>
@@ -1331,10 +1454,12 @@
               <w:t xml:space="preserve"> in </w:t>
             </w:r>
             <w:proofErr w:type="spellStart"/>
+            <w:proofErr w:type="gramStart"/>
             <w:r>
               <w:t>item.items</w:t>
             </w:r>
             <w:proofErr w:type="spellEnd"/>
+            <w:proofErr w:type="gramEnd"/>
             <w:r>
               <w:t>() %} {{ author }}</w:t>
             </w:r>
@@ -1357,12 +1482,17 @@
             <w:r>
               <w:t xml:space="preserve"> %} </w:t>
             </w:r>
+            <w:proofErr w:type="gramStart"/>
             <w:r>
               <w:t xml:space="preserve">{{ </w:t>
             </w:r>
             <w:proofErr w:type="spellStart"/>
             <w:r>
-              <w:t>loop.index</w:t>
+              <w:t>loop</w:t>
+            </w:r>
+            <w:proofErr w:type="gramEnd"/>
+            <w:r>
+              <w:t>.index</w:t>
             </w:r>
             <w:proofErr w:type="spellEnd"/>
             <w:r>
@@ -1374,8 +1504,13 @@
               </w:rPr>
               <w:t xml:space="preserve"> </w:t>
             </w:r>
-            <w:r>
-              <w:t>{{ dataverse }}</w:t>
+            <w:proofErr w:type="gramStart"/>
+            <w:r>
+              <w:t>{{ dataverse</w:t>
+            </w:r>
+            <w:proofErr w:type="gramEnd"/>
+            <w:r>
+              <w:t xml:space="preserve"> }}</w:t>
             </w:r>
             <w:r>
               <w:br/>
@@ -1635,6 +1770,7 @@
               </w:rPr>
               <w:t>University of Toronto Dataverse</w:t>
             </w:r>
+            <w:proofErr w:type="gramStart"/>
             <w:r>
               <w:rPr>
                 <w:lang w:val="en-US"/>
@@ -1645,7 +1781,14 @@
               <w:rPr>
                 <w:lang w:val="en-US"/>
               </w:rPr>
-              <w:t xml:space="preserve"> %}X{% endif %}</w:t>
+              <w:t xml:space="preserve"> %}X{</w:t>
+            </w:r>
+            <w:proofErr w:type="gramEnd"/>
+            <w:r>
+              <w:rPr>
+                <w:lang w:val="en-US"/>
+              </w:rPr>
+              <w:t>% endif %}</w:t>
             </w:r>
           </w:p>
         </w:tc>
@@ -1701,7 +1844,11 @@
             </w:r>
             <w:proofErr w:type="spellStart"/>
             <w:r>
-              <w:t>name_name_of_dataverse</w:t>
+              <w:t>name_name_of_</w:t>
+            </w:r>
+            <w:proofErr w:type="gramStart"/>
+            <w:r>
+              <w:t>dataverse</w:t>
             </w:r>
             <w:proofErr w:type="spellEnd"/>
             <w:r>
@@ -1716,6 +1863,7 @@
               </w:rPr>
               <w:t>!</w:t>
             </w:r>
+            <w:proofErr w:type="gramEnd"/>
             <w:r>
               <w:rPr>
                 <w:lang w:val="en-US"/>
@@ -1734,6 +1882,7 @@
               </w:rPr>
               <w:t>University of Toronto Dataverse</w:t>
             </w:r>
+            <w:proofErr w:type="gramStart"/>
             <w:r>
               <w:rPr>
                 <w:lang w:val="en-US"/>
@@ -1744,7 +1893,14 @@
               <w:rPr>
                 <w:lang w:val="en-US"/>
               </w:rPr>
-              <w:t xml:space="preserve"> %}X{% endif %}</w:t>
+              <w:t xml:space="preserve"> %}</w:t>
+            </w:r>
+            <w:proofErr w:type="gramEnd"/>
+            <w:r>
+              <w:rPr>
+                <w:lang w:val="en-US"/>
+              </w:rPr>
+              <w:t>X{% endif %}</w:t>
             </w:r>
           </w:p>
         </w:tc>
@@ -1834,67 +1990,156 @@
               </w:rPr>
               <w:t xml:space="preserve">List the </w:t>
             </w:r>
+            <w:r>
+              <w:rPr>
+                <w:lang w:val="en-US"/>
+              </w:rPr>
+              <w:t xml:space="preserve">parent </w:t>
+            </w:r>
+            <w:r>
+              <w:rPr>
+                <w:lang w:val="en-US"/>
+              </w:rPr>
+              <w:t>D</w:t>
+            </w:r>
+            <w:r>
+              <w:rPr>
+                <w:rFonts w:hint="eastAsia"/>
+                <w:lang w:val="en-US"/>
+              </w:rPr>
+              <w:t xml:space="preserve">ataverse </w:t>
+            </w:r>
+            <w:r>
+              <w:rPr>
+                <w:lang w:val="en-US"/>
+              </w:rPr>
+              <w:t>collection</w:t>
+            </w:r>
+            <w:r>
+              <w:rPr>
+                <w:rFonts w:hint="eastAsia"/>
+                <w:lang w:val="en-US"/>
+              </w:rPr>
+              <w:t xml:space="preserve"> name:</w:t>
+            </w:r>
+            <w:r>
+              <w:rPr>
+                <w:lang w:val="en-US"/>
+              </w:rPr>
+              <w:br/>
+            </w:r>
+            <w:proofErr w:type="gramStart"/>
+            <w:r>
+              <w:rPr>
+                <w:rFonts w:hint="eastAsia"/>
+                <w:lang w:val="en-US"/>
+              </w:rPr>
+              <w:t xml:space="preserve">{{ </w:t>
+            </w:r>
             <w:proofErr w:type="spellStart"/>
             <w:r>
+              <w:t>template_dict</w:t>
+            </w:r>
+            <w:proofErr w:type="spellEnd"/>
+            <w:r>
               <w:rPr>
                 <w:rFonts w:hint="eastAsia"/>
-                <w:lang w:val="en-US"/>
-              </w:rPr>
-              <w:t>dataverse</w:t>
+              </w:rPr>
+              <w:t>.</w:t>
+            </w:r>
+            <w:proofErr w:type="spellStart"/>
+            <w:r>
+              <w:rPr>
+                <w:lang w:val="en-US"/>
+              </w:rPr>
+              <w:t>ds</w:t>
+            </w:r>
+            <w:proofErr w:type="gramEnd"/>
+            <w:r>
+              <w:rPr>
+                <w:lang w:val="en-US"/>
+              </w:rPr>
+              <w:t>_tree_info</w:t>
+            </w:r>
+            <w:r>
+              <w:rPr>
+                <w:lang w:val="en-US"/>
+              </w:rPr>
+              <w:t>.</w:t>
+            </w:r>
+            <w:r>
+              <w:rPr>
+                <w:lang w:val="en-US"/>
+              </w:rPr>
+              <w:t>parentDataverseName</w:t>
             </w:r>
             <w:proofErr w:type="spellEnd"/>
             <w:r>
               <w:rPr>
                 <w:rFonts w:hint="eastAsia"/>
-                <w:lang w:val="en-US"/>
-              </w:rPr>
-              <w:t xml:space="preserve"> </w:t>
-            </w:r>
-            <w:r>
-              <w:rPr>
-                <w:lang w:val="en-US"/>
-              </w:rPr>
-              <w:t>collection</w:t>
-            </w:r>
+              </w:rPr>
+              <w:t xml:space="preserve"> }}</w:t>
+            </w:r>
+          </w:p>
+          <w:p/>
+          <w:p>
+            <w:r>
+              <w:t xml:space="preserve">List the path of the </w:t>
+            </w:r>
+            <w:r>
+              <w:t>dataset in the Dataverse collection</w:t>
+            </w:r>
+            <w:r>
+              <w:t>:</w:t>
+            </w:r>
+            <w:r>
+              <w:br/>
+            </w:r>
+            <w:proofErr w:type="gramStart"/>
             <w:r>
               <w:rPr>
                 <w:rFonts w:hint="eastAsia"/>
                 <w:lang w:val="en-US"/>
               </w:rPr>
-              <w:t xml:space="preserve"> name:</w:t>
-            </w:r>
-            <w:r>
-              <w:rPr>
-                <w:lang w:val="en-US"/>
-              </w:rPr>
-              <w:br/>
-            </w:r>
+              <w:t xml:space="preserve">{{ </w:t>
+            </w:r>
+            <w:proofErr w:type="spellStart"/>
+            <w:r>
+              <w:t>template_dict</w:t>
+            </w:r>
+            <w:proofErr w:type="spellEnd"/>
             <w:r>
               <w:rPr>
                 <w:rFonts w:hint="eastAsia"/>
-                <w:lang w:val="en-US"/>
-              </w:rPr>
-              <w:t xml:space="preserve">{{ </w:t>
+              </w:rPr>
+              <w:t>.</w:t>
             </w:r>
             <w:proofErr w:type="spellStart"/>
             <w:r>
-              <w:t>template_dict</w:t>
-            </w:r>
+              <w:rPr>
+                <w:lang w:val="en-US"/>
+              </w:rPr>
+              <w:t>ds</w:t>
+            </w:r>
+            <w:proofErr w:type="gramEnd"/>
+            <w:r>
+              <w:rPr>
+                <w:lang w:val="en-US"/>
+              </w:rPr>
+              <w:t>_tree_info</w:t>
+            </w:r>
+            <w:r>
+              <w:rPr>
+                <w:lang w:val="en-US"/>
+              </w:rPr>
+              <w:t>.path</w:t>
+            </w:r>
+            <w:proofErr w:type="spellEnd"/>
             <w:r>
               <w:rPr>
                 <w:rFonts w:hint="eastAsia"/>
               </w:rPr>
-              <w:t>.</w:t>
-            </w:r>
-            <w:r>
-              <w:t>name_of_dataverse</w:t>
-            </w:r>
-            <w:proofErr w:type="spellEnd"/>
-            <w:r>
-              <w:rPr>
-                <w:rFonts w:hint="eastAsia"/>
-              </w:rPr>
-              <w:t xml:space="preserve"> }}</w:t>
+              <w:t>}}</w:t>
             </w:r>
           </w:p>
         </w:tc>
@@ -2071,7 +2316,15 @@
               </w:numPr>
             </w:pPr>
             <w:r>
-              <w:t>Confirm with the depositor that they actually require a datavers</w:t>
+              <w:t xml:space="preserve">Confirm with the depositor that they </w:t>
+            </w:r>
+            <w:proofErr w:type="gramStart"/>
+            <w:r>
+              <w:t>actually require</w:t>
+            </w:r>
+            <w:proofErr w:type="gramEnd"/>
+            <w:r>
+              <w:t xml:space="preserve"> a datavers</w:t>
             </w:r>
             <w:r>
               <w:lastRenderedPageBreak/>
@@ -2644,7 +2897,21 @@
               <w:rPr>
                 <w:lang w:val="en-US"/>
               </w:rPr>
-              <w:t>template_dict.file_ext.comments|length</w:t>
+              <w:t>template_</w:t>
+            </w:r>
+            <w:proofErr w:type="gramStart"/>
+            <w:r>
+              <w:rPr>
+                <w:lang w:val="en-US"/>
+              </w:rPr>
+              <w:t>dict.file</w:t>
+            </w:r>
+            <w:proofErr w:type="gramEnd"/>
+            <w:r>
+              <w:rPr>
+                <w:lang w:val="en-US"/>
+              </w:rPr>
+              <w:t>_ext.comments|length</w:t>
             </w:r>
             <w:proofErr w:type="spellEnd"/>
             <w:r>
@@ -2703,7 +2970,21 @@
               <w:rPr>
                 <w:lang w:val="en-US"/>
               </w:rPr>
-              <w:t>template_dict.file_ext.comments|length</w:t>
+              <w:t>template_</w:t>
+            </w:r>
+            <w:proofErr w:type="gramStart"/>
+            <w:r>
+              <w:rPr>
+                <w:lang w:val="en-US"/>
+              </w:rPr>
+              <w:t>dict.file</w:t>
+            </w:r>
+            <w:proofErr w:type="gramEnd"/>
+            <w:r>
+              <w:rPr>
+                <w:lang w:val="en-US"/>
+              </w:rPr>
+              <w:t>_ext.comments|length</w:t>
             </w:r>
             <w:proofErr w:type="spellEnd"/>
             <w:r>
@@ -2798,7 +3079,21 @@
               <w:rPr>
                 <w:lang w:val="en-US"/>
               </w:rPr>
-              <w:t>template_dict.file_open.comments</w:t>
+              <w:t>template_</w:t>
+            </w:r>
+            <w:proofErr w:type="gramStart"/>
+            <w:r>
+              <w:rPr>
+                <w:lang w:val="en-US"/>
+              </w:rPr>
+              <w:t>dict.file</w:t>
+            </w:r>
+            <w:proofErr w:type="gramEnd"/>
+            <w:r>
+              <w:rPr>
+                <w:lang w:val="en-US"/>
+              </w:rPr>
+              <w:t>_open.comments</w:t>
             </w:r>
             <w:proofErr w:type="spellEnd"/>
             <w:r>
@@ -2819,6 +3114,7 @@
                 <w:lang w:val="en-US"/>
               </w:rPr>
             </w:pPr>
+            <w:proofErr w:type="gramStart"/>
             <w:r>
               <w:rPr>
                 <w:lang w:val="en-US"/>
@@ -2830,7 +3126,14 @@
               <w:rPr>
                 <w:lang w:val="en-US"/>
               </w:rPr>
-              <w:t>item.file_name</w:t>
+              <w:t>item</w:t>
+            </w:r>
+            <w:proofErr w:type="gramEnd"/>
+            <w:r>
+              <w:rPr>
+                <w:lang w:val="en-US"/>
+              </w:rPr>
+              <w:t>.file_name</w:t>
             </w:r>
             <w:proofErr w:type="spellEnd"/>
             <w:r>
@@ -2840,6 +3143,7 @@
               <w:t xml:space="preserve"> }}{% </w:t>
             </w:r>
             <w:proofErr w:type="spellStart"/>
+            <w:proofErr w:type="gramStart"/>
             <w:r>
               <w:rPr>
                 <w:lang w:val="en-US"/>
@@ -2853,6 +3157,7 @@
               </w:rPr>
               <w:t xml:space="preserve"> %}</w:t>
             </w:r>
+            <w:proofErr w:type="gramEnd"/>
           </w:p>
           <w:p>
             <w:pPr>
@@ -2891,7 +3196,14 @@
               <w:rPr>
                 <w:lang w:val="en-US"/>
               </w:rPr>
-              <w:t>template_dict.file_open.not_checked</w:t>
+              <w:t>template_dict.file_open.not_</w:t>
+            </w:r>
+            <w:proofErr w:type="gramStart"/>
+            <w:r>
+              <w:rPr>
+                <w:lang w:val="en-US"/>
+              </w:rPr>
+              <w:t>checked</w:t>
             </w:r>
             <w:proofErr w:type="spellEnd"/>
             <w:r>
@@ -2900,6 +3212,7 @@
               </w:rPr>
               <w:t xml:space="preserve"> %}</w:t>
             </w:r>
+            <w:proofErr w:type="gramEnd"/>
           </w:p>
           <w:p>
             <w:pPr>
@@ -2912,6 +3225,7 @@
                 <w:lang w:val="en-US"/>
               </w:rPr>
             </w:pPr>
+            <w:proofErr w:type="gramStart"/>
             <w:r>
               <w:rPr>
                 <w:lang w:val="en-US"/>
@@ -2923,7 +3237,14 @@
               <w:rPr>
                 <w:lang w:val="en-US"/>
               </w:rPr>
-              <w:t>item.file_name</w:t>
+              <w:t>item</w:t>
+            </w:r>
+            <w:proofErr w:type="gramEnd"/>
+            <w:r>
+              <w:rPr>
+                <w:lang w:val="en-US"/>
+              </w:rPr>
+              <w:t>.file_name</w:t>
             </w:r>
             <w:proofErr w:type="spellEnd"/>
             <w:r>
@@ -2933,6 +3254,7 @@
               <w:t xml:space="preserve"> }}{% </w:t>
             </w:r>
             <w:proofErr w:type="spellStart"/>
+            <w:proofErr w:type="gramStart"/>
             <w:r>
               <w:rPr>
                 <w:lang w:val="en-US"/>
@@ -2946,6 +3268,7 @@
               </w:rPr>
               <w:t xml:space="preserve"> %}</w:t>
             </w:r>
+            <w:proofErr w:type="gramEnd"/>
           </w:p>
           <w:p/>
         </w:tc>
@@ -3068,14 +3391,24 @@
                 <w:bCs/>
                 <w:lang w:val="en-US"/>
               </w:rPr>
-              <w:t>&lt;&gt;:"/\|?*</w:t>
-            </w:r>
+              <w:t>&lt;&gt;:"/\</w:t>
+            </w:r>
+            <w:proofErr w:type="gramStart"/>
             <w:r>
               <w:rPr>
                 <w:b/>
                 <w:bCs/>
                 <w:lang w:val="en-US"/>
               </w:rPr>
+              <w:t>|?*</w:t>
+            </w:r>
+            <w:proofErr w:type="gramEnd"/>
+            <w:r>
+              <w:rPr>
+                <w:b/>
+                <w:bCs/>
+                <w:lang w:val="en-US"/>
+              </w:rPr>
               <w:t>,@$~)?</w:t>
             </w:r>
           </w:p>
@@ -3134,7 +3467,21 @@
               <w:rPr>
                 <w:lang w:val="en-US"/>
               </w:rPr>
-              <w:t>template_dict.special_characters.comments|length</w:t>
+              <w:t>template_</w:t>
+            </w:r>
+            <w:proofErr w:type="gramStart"/>
+            <w:r>
+              <w:rPr>
+                <w:lang w:val="en-US"/>
+              </w:rPr>
+              <w:t>dict.special</w:t>
+            </w:r>
+            <w:proofErr w:type="gramEnd"/>
+            <w:r>
+              <w:rPr>
+                <w:lang w:val="en-US"/>
+              </w:rPr>
+              <w:t>_characters.comments|length</w:t>
             </w:r>
             <w:proofErr w:type="spellEnd"/>
             <w:r>
@@ -3195,7 +3542,21 @@
               <w:rPr>
                 <w:lang w:val="en-US"/>
               </w:rPr>
-              <w:t>template_dict.special_characters.comments|length</w:t>
+              <w:t>template_</w:t>
+            </w:r>
+            <w:proofErr w:type="gramStart"/>
+            <w:r>
+              <w:rPr>
+                <w:lang w:val="en-US"/>
+              </w:rPr>
+              <w:t>dict.special</w:t>
+            </w:r>
+            <w:proofErr w:type="gramEnd"/>
+            <w:r>
+              <w:rPr>
+                <w:lang w:val="en-US"/>
+              </w:rPr>
+              <w:t>_characters.comments|length</w:t>
             </w:r>
             <w:proofErr w:type="spellEnd"/>
             <w:r>
@@ -3292,7 +3653,21 @@
               <w:rPr>
                 <w:lang w:val="en-US"/>
               </w:rPr>
-              <w:t>template_dict.special_characters.comments</w:t>
+              <w:t>template_</w:t>
+            </w:r>
+            <w:proofErr w:type="gramStart"/>
+            <w:r>
+              <w:rPr>
+                <w:lang w:val="en-US"/>
+              </w:rPr>
+              <w:t>dict.special</w:t>
+            </w:r>
+            <w:proofErr w:type="gramEnd"/>
+            <w:r>
+              <w:rPr>
+                <w:lang w:val="en-US"/>
+              </w:rPr>
+              <w:t>_characters.comments</w:t>
             </w:r>
             <w:proofErr w:type="spellEnd"/>
             <w:r>
@@ -3310,6 +3685,7 @@
                 <w:numId w:val="45"/>
               </w:numPr>
             </w:pPr>
+            <w:proofErr w:type="gramStart"/>
             <w:r>
               <w:rPr>
                 <w:lang w:val="en-US"/>
@@ -3321,7 +3697,14 @@
               <w:rPr>
                 <w:lang w:val="en-US"/>
               </w:rPr>
-              <w:t>item.file_name</w:t>
+              <w:t>item</w:t>
+            </w:r>
+            <w:proofErr w:type="gramEnd"/>
+            <w:r>
+              <w:rPr>
+                <w:lang w:val="en-US"/>
+              </w:rPr>
+              <w:t>.file_name</w:t>
             </w:r>
             <w:proofErr w:type="spellEnd"/>
             <w:r>
@@ -3506,7 +3889,21 @@
               <w:rPr>
                 <w:lang w:val="en-US"/>
               </w:rPr>
-              <w:t>template_dict.readme_file.comments|length</w:t>
+              <w:t>template_</w:t>
+            </w:r>
+            <w:proofErr w:type="gramStart"/>
+            <w:r>
+              <w:rPr>
+                <w:lang w:val="en-US"/>
+              </w:rPr>
+              <w:t>dict.readme</w:t>
+            </w:r>
+            <w:proofErr w:type="gramEnd"/>
+            <w:r>
+              <w:rPr>
+                <w:lang w:val="en-US"/>
+              </w:rPr>
+              <w:t>_file.comments|length</w:t>
             </w:r>
             <w:proofErr w:type="spellEnd"/>
             <w:r>
@@ -3580,7 +3977,21 @@
               <w:rPr>
                 <w:lang w:val="en-US"/>
               </w:rPr>
-              <w:t>template_dict.file_ext.comments|length</w:t>
+              <w:t>template_</w:t>
+            </w:r>
+            <w:proofErr w:type="gramStart"/>
+            <w:r>
+              <w:rPr>
+                <w:lang w:val="en-US"/>
+              </w:rPr>
+              <w:t>dict.file</w:t>
+            </w:r>
+            <w:proofErr w:type="gramEnd"/>
+            <w:r>
+              <w:rPr>
+                <w:lang w:val="en-US"/>
+              </w:rPr>
+              <w:t>_ext.comments|length</w:t>
             </w:r>
             <w:proofErr w:type="spellEnd"/>
             <w:r>
@@ -3673,7 +4084,21 @@
               <w:rPr>
                 <w:lang w:val="en-US"/>
               </w:rPr>
-              <w:t>template_dict.file_ext.comments</w:t>
+              <w:t>template_</w:t>
+            </w:r>
+            <w:proofErr w:type="gramStart"/>
+            <w:r>
+              <w:rPr>
+                <w:lang w:val="en-US"/>
+              </w:rPr>
+              <w:t>dict.file</w:t>
+            </w:r>
+            <w:proofErr w:type="gramEnd"/>
+            <w:r>
+              <w:rPr>
+                <w:lang w:val="en-US"/>
+              </w:rPr>
+              <w:t>_ext.comments</w:t>
             </w:r>
             <w:proofErr w:type="spellEnd"/>
             <w:r>
@@ -3692,6 +4117,7 @@
               </w:numPr>
               <w:spacing w:line="256" w:lineRule="auto"/>
             </w:pPr>
+            <w:proofErr w:type="gramStart"/>
             <w:r>
               <w:rPr>
                 <w:lang w:val="en-US"/>
@@ -3703,7 +4129,14 @@
               <w:rPr>
                 <w:lang w:val="en-US"/>
               </w:rPr>
-              <w:t>item.file_name</w:t>
+              <w:t>item</w:t>
+            </w:r>
+            <w:proofErr w:type="gramEnd"/>
+            <w:r>
+              <w:rPr>
+                <w:lang w:val="en-US"/>
+              </w:rPr>
+              <w:t>.file_name</w:t>
             </w:r>
             <w:proofErr w:type="spellEnd"/>
             <w:r>
@@ -3910,13 +4343,27 @@
               <w:rPr>
                 <w:lang w:val="en-US"/>
               </w:rPr>
-              <w:t>common_file_format</w:t>
-            </w:r>
-            <w:r>
-              <w:rPr>
-                <w:lang w:val="en-US"/>
-              </w:rPr>
-              <w:t>.comments|length</w:t>
+              <w:t>common_file_</w:t>
+            </w:r>
+            <w:proofErr w:type="gramStart"/>
+            <w:r>
+              <w:rPr>
+                <w:lang w:val="en-US"/>
+              </w:rPr>
+              <w:t>format</w:t>
+            </w:r>
+            <w:r>
+              <w:rPr>
+                <w:lang w:val="en-US"/>
+              </w:rPr>
+              <w:t>.comments</w:t>
+            </w:r>
+            <w:proofErr w:type="gramEnd"/>
+            <w:r>
+              <w:rPr>
+                <w:lang w:val="en-US"/>
+              </w:rPr>
+              <w:t>|length</w:t>
             </w:r>
             <w:proofErr w:type="spellEnd"/>
             <w:r>
@@ -4010,13 +4457,27 @@
               <w:rPr>
                 <w:lang w:val="en-US"/>
               </w:rPr>
-              <w:t>common_file_format</w:t>
-            </w:r>
-            <w:r>
-              <w:rPr>
-                <w:lang w:val="en-US"/>
-              </w:rPr>
-              <w:t>.comments|length</w:t>
+              <w:t>common_file_</w:t>
+            </w:r>
+            <w:proofErr w:type="gramStart"/>
+            <w:r>
+              <w:rPr>
+                <w:lang w:val="en-US"/>
+              </w:rPr>
+              <w:t>format</w:t>
+            </w:r>
+            <w:r>
+              <w:rPr>
+                <w:lang w:val="en-US"/>
+              </w:rPr>
+              <w:t>.comments</w:t>
+            </w:r>
+            <w:proofErr w:type="gramEnd"/>
+            <w:r>
+              <w:rPr>
+                <w:lang w:val="en-US"/>
+              </w:rPr>
+              <w:t>|length</w:t>
             </w:r>
             <w:proofErr w:type="spellEnd"/>
             <w:r>
@@ -4115,13 +4576,27 @@
               <w:rPr>
                 <w:lang w:val="en-US"/>
               </w:rPr>
-              <w:t>template_dict.</w:t>
-            </w:r>
-            <w:r>
-              <w:rPr>
-                <w:lang w:val="en-US"/>
-              </w:rPr>
-              <w:t>common_file_format</w:t>
+              <w:t>template_</w:t>
+            </w:r>
+            <w:proofErr w:type="gramStart"/>
+            <w:r>
+              <w:rPr>
+                <w:lang w:val="en-US"/>
+              </w:rPr>
+              <w:t>dict.</w:t>
+            </w:r>
+            <w:r>
+              <w:rPr>
+                <w:lang w:val="en-US"/>
+              </w:rPr>
+              <w:t>common</w:t>
+            </w:r>
+            <w:proofErr w:type="gramEnd"/>
+            <w:r>
+              <w:rPr>
+                <w:lang w:val="en-US"/>
+              </w:rPr>
+              <w:t>_file_format</w:t>
             </w:r>
             <w:r>
               <w:rPr>
@@ -4144,6 +4619,7 @@
                 <w:numId w:val="9"/>
               </w:numPr>
             </w:pPr>
+            <w:proofErr w:type="gramStart"/>
             <w:r>
               <w:rPr>
                 <w:lang w:val="en-US"/>
@@ -4155,7 +4631,14 @@
               <w:rPr>
                 <w:lang w:val="en-US"/>
               </w:rPr>
-              <w:t>item.file_name</w:t>
+              <w:t>item</w:t>
+            </w:r>
+            <w:proofErr w:type="gramEnd"/>
+            <w:r>
+              <w:rPr>
+                <w:lang w:val="en-US"/>
+              </w:rPr>
+              <w:t>.file_name</w:t>
             </w:r>
             <w:proofErr w:type="spellEnd"/>
             <w:r>
@@ -4902,7 +5385,21 @@
               <w:rPr>
                 <w:lang w:val="en-US"/>
               </w:rPr>
-              <w:t>template_dict.readme_file.comments|length</w:t>
+              <w:t>template_</w:t>
+            </w:r>
+            <w:proofErr w:type="gramStart"/>
+            <w:r>
+              <w:rPr>
+                <w:lang w:val="en-US"/>
+              </w:rPr>
+              <w:t>dict.readme</w:t>
+            </w:r>
+            <w:proofErr w:type="gramEnd"/>
+            <w:r>
+              <w:rPr>
+                <w:lang w:val="en-US"/>
+              </w:rPr>
+              <w:t>_file.comments|length</w:t>
             </w:r>
             <w:proofErr w:type="spellEnd"/>
             <w:r>
@@ -4948,7 +5445,21 @@
               <w:rPr>
                 <w:lang w:val="en-US"/>
               </w:rPr>
-              <w:t>template_dict.readme_file.comments|length</w:t>
+              <w:t>template_</w:t>
+            </w:r>
+            <w:proofErr w:type="gramStart"/>
+            <w:r>
+              <w:rPr>
+                <w:lang w:val="en-US"/>
+              </w:rPr>
+              <w:t>dict.readme</w:t>
+            </w:r>
+            <w:proofErr w:type="gramEnd"/>
+            <w:r>
+              <w:rPr>
+                <w:lang w:val="en-US"/>
+              </w:rPr>
+              <w:t>_file.comments|length</w:t>
             </w:r>
             <w:proofErr w:type="spellEnd"/>
             <w:r>
@@ -5062,7 +5573,21 @@
               <w:rPr>
                 <w:lang w:val="en-US"/>
               </w:rPr>
-              <w:t>template_dict.readme_file.comments</w:t>
+              <w:t>template_</w:t>
+            </w:r>
+            <w:proofErr w:type="gramStart"/>
+            <w:r>
+              <w:rPr>
+                <w:lang w:val="en-US"/>
+              </w:rPr>
+              <w:t>dict.readme</w:t>
+            </w:r>
+            <w:proofErr w:type="gramEnd"/>
+            <w:r>
+              <w:rPr>
+                <w:lang w:val="en-US"/>
+              </w:rPr>
+              <w:t>_file.comments</w:t>
             </w:r>
             <w:proofErr w:type="spellEnd"/>
             <w:r>
@@ -5083,14 +5608,28 @@
               <w:rPr>
                 <w:lang w:val="en-US"/>
               </w:rPr>
-              <w:t xml:space="preserve"> }}. {{ </w:t>
+              <w:t xml:space="preserve"> }}. </w:t>
+            </w:r>
+            <w:proofErr w:type="gramStart"/>
+            <w:r>
+              <w:rPr>
+                <w:lang w:val="en-US"/>
+              </w:rPr>
+              <w:t xml:space="preserve">{{ </w:t>
             </w:r>
             <w:proofErr w:type="spellStart"/>
             <w:r>
               <w:rPr>
                 <w:lang w:val="en-US"/>
               </w:rPr>
-              <w:t>item.file_name</w:t>
+              <w:t>item</w:t>
+            </w:r>
+            <w:proofErr w:type="gramEnd"/>
+            <w:r>
+              <w:rPr>
+                <w:lang w:val="en-US"/>
+              </w:rPr>
+              <w:t>.file_name</w:t>
             </w:r>
             <w:proofErr w:type="spellEnd"/>
             <w:r>
@@ -5107,6 +5646,7 @@
               <w:t xml:space="preserve">{% </w:t>
             </w:r>
             <w:proofErr w:type="spellStart"/>
+            <w:proofErr w:type="gramStart"/>
             <w:r>
               <w:rPr>
                 <w:lang w:val="en-US"/>
@@ -5120,6 +5660,7 @@
               </w:rPr>
               <w:t xml:space="preserve"> %}</w:t>
             </w:r>
+            <w:proofErr w:type="gramEnd"/>
           </w:p>
           <w:p/>
         </w:tc>
@@ -7472,7 +8013,28 @@
               <w:rPr>
                 <w:lang w:val="en-US"/>
               </w:rPr>
-              <w:t>template_dict.typo.comments</w:t>
+              <w:t>template_</w:t>
+            </w:r>
+            <w:proofErr w:type="gramStart"/>
+            <w:r>
+              <w:rPr>
+                <w:lang w:val="en-US"/>
+              </w:rPr>
+              <w:t>dict.typo</w:t>
+            </w:r>
+            <w:proofErr w:type="gramEnd"/>
+            <w:r>
+              <w:rPr>
+                <w:lang w:val="en-US"/>
+              </w:rPr>
+              <w:t>.</w:t>
+            </w:r>
+            <w:proofErr w:type="gramStart"/>
+            <w:r>
+              <w:rPr>
+                <w:lang w:val="en-US"/>
+              </w:rPr>
+              <w:t>comments</w:t>
             </w:r>
             <w:proofErr w:type="spellEnd"/>
             <w:r>
@@ -7481,6 +8043,7 @@
               </w:rPr>
               <w:t xml:space="preserve"> %}</w:t>
             </w:r>
+            <w:proofErr w:type="gramEnd"/>
           </w:p>
           <w:p>
             <w:pPr>
@@ -7490,11 +8053,19 @@
                 <w:numId w:val="46"/>
               </w:numPr>
             </w:pPr>
-            <w:r>
-              <w:rPr>
-                <w:lang w:val="en-US"/>
-              </w:rPr>
-              <w:t xml:space="preserve">{{ item }}{% </w:t>
+            <w:proofErr w:type="gramStart"/>
+            <w:r>
+              <w:rPr>
+                <w:lang w:val="en-US"/>
+              </w:rPr>
+              <w:t>{{ item</w:t>
+            </w:r>
+            <w:proofErr w:type="gramEnd"/>
+            <w:r>
+              <w:rPr>
+                <w:lang w:val="en-US"/>
+              </w:rPr>
+              <w:t xml:space="preserve"> }}{% </w:t>
             </w:r>
             <w:proofErr w:type="spellStart"/>
             <w:r>
@@ -7984,7 +8555,15 @@
             </w:r>
             <w:proofErr w:type="spellStart"/>
             <w:r>
-              <w:t>template_dict.none_author_affiliation</w:t>
+              <w:t>template_</w:t>
+            </w:r>
+            <w:proofErr w:type="gramStart"/>
+            <w:r>
+              <w:t>dict.none</w:t>
+            </w:r>
+            <w:proofErr w:type="gramEnd"/>
+            <w:r>
+              <w:t>_author_affiliation</w:t>
             </w:r>
             <w:proofErr w:type="spellEnd"/>
             <w:r>
@@ -8015,7 +8594,15 @@
             </w:r>
             <w:proofErr w:type="spellStart"/>
             <w:r>
-              <w:t>template_dict.none_author_affiliation</w:t>
+              <w:t>template_</w:t>
+            </w:r>
+            <w:proofErr w:type="gramStart"/>
+            <w:r>
+              <w:t>dict.none</w:t>
+            </w:r>
+            <w:proofErr w:type="gramEnd"/>
+            <w:r>
+              <w:t>_author_affiliation</w:t>
             </w:r>
             <w:proofErr w:type="spellEnd"/>
             <w:r>
@@ -11166,7 +11753,15 @@
             </w:r>
             <w:proofErr w:type="spellStart"/>
             <w:r>
-              <w:t>template_dict.restricted_files.comment</w:t>
+              <w:t>template_</w:t>
+            </w:r>
+            <w:proofErr w:type="gramStart"/>
+            <w:r>
+              <w:t>dict.restricted</w:t>
+            </w:r>
+            <w:proofErr w:type="gramEnd"/>
+            <w:r>
+              <w:t>_files.comment</w:t>
             </w:r>
             <w:r>
               <w:rPr>
@@ -11201,12 +11796,17 @@
                 <w:numId w:val="47"/>
               </w:numPr>
             </w:pPr>
+            <w:proofErr w:type="gramStart"/>
             <w:r>
               <w:t xml:space="preserve">{{ </w:t>
             </w:r>
             <w:proofErr w:type="spellStart"/>
             <w:r>
-              <w:t>item.file_name</w:t>
+              <w:t>item</w:t>
+            </w:r>
+            <w:proofErr w:type="gramEnd"/>
+            <w:r>
+              <w:t>.file_name</w:t>
             </w:r>
             <w:proofErr w:type="spellEnd"/>
             <w:r>
@@ -11223,7 +11823,15 @@
           </w:p>
           <w:p>
             <w:r>
-              <w:t>{% else %}(NONE){% endif %}</w:t>
+              <w:t xml:space="preserve">{% else </w:t>
+            </w:r>
+            <w:proofErr w:type="gramStart"/>
+            <w:r>
+              <w:t>%}(</w:t>
+            </w:r>
+            <w:proofErr w:type="gramEnd"/>
+            <w:r>
+              <w:t>NONE){% endif %}</w:t>
             </w:r>
           </w:p>
           <w:p>
@@ -11255,7 +11863,15 @@
             </w:r>
             <w:proofErr w:type="spellStart"/>
             <w:r>
-              <w:t>template_dict.terms_license.licenseName</w:t>
+              <w:t>template_</w:t>
+            </w:r>
+            <w:proofErr w:type="gramStart"/>
+            <w:r>
+              <w:t>dict.terms</w:t>
+            </w:r>
+            <w:proofErr w:type="gramEnd"/>
+            <w:r>
+              <w:t>_license.licenseName</w:t>
             </w:r>
             <w:proofErr w:type="spellEnd"/>
             <w:r>
@@ -11312,7 +11928,15 @@
                   </w:r>
                   <w:proofErr w:type="spellStart"/>
                   <w:r>
-                    <w:t>template_dict.terms_license.</w:t>
+                    <w:t>template_</w:t>
+                  </w:r>
+                  <w:proofErr w:type="gramStart"/>
+                  <w:r>
+                    <w:t>dict.terms</w:t>
+                  </w:r>
+                  <w:proofErr w:type="gramEnd"/>
+                  <w:r>
+                    <w:t>_license.</w:t>
                   </w:r>
                   <w:r>
                     <w:t>termsOfUse</w:t>
@@ -11546,7 +12170,11 @@
             </w:r>
             <w:proofErr w:type="spellStart"/>
             <w:r>
-              <w:t>restricted_files</w:t>
+              <w:t>restricted_</w:t>
+            </w:r>
+            <w:proofErr w:type="gramStart"/>
+            <w:r>
+              <w:t>files</w:t>
             </w:r>
             <w:proofErr w:type="spellEnd"/>
             <w:r>
@@ -11562,6 +12190,7 @@
               </w:rPr>
               <w:t>comments</w:t>
             </w:r>
+            <w:proofErr w:type="gramEnd"/>
             <w:r>
               <w:rPr>
                 <w:rFonts w:hint="eastAsia"/>
@@ -11663,7 +12292,11 @@
             </w:r>
             <w:proofErr w:type="spellStart"/>
             <w:r>
-              <w:t>restricted_files</w:t>
+              <w:t>restricted_</w:t>
+            </w:r>
+            <w:proofErr w:type="gramStart"/>
+            <w:r>
+              <w:t>files</w:t>
             </w:r>
             <w:proofErr w:type="spellEnd"/>
             <w:r>
@@ -11679,6 +12312,7 @@
               </w:rPr>
               <w:t>comments</w:t>
             </w:r>
+            <w:proofErr w:type="gramEnd"/>
             <w:r>
               <w:rPr>
                 <w:rFonts w:hint="eastAsia"/>
@@ -11816,7 +12450,11 @@
             </w:r>
             <w:proofErr w:type="spellStart"/>
             <w:r>
-              <w:t>restricted_files</w:t>
+              <w:t>restricted_</w:t>
+            </w:r>
+            <w:proofErr w:type="gramStart"/>
+            <w:r>
+              <w:t>files</w:t>
             </w:r>
             <w:proofErr w:type="spellEnd"/>
             <w:r>
@@ -11832,6 +12470,7 @@
               </w:rPr>
               <w:t>comments</w:t>
             </w:r>
+            <w:proofErr w:type="gramEnd"/>
             <w:r>
               <w:rPr>
                 <w:rFonts w:hint="eastAsia"/>
@@ -11923,7 +12562,15 @@
                   </w:r>
                   <w:proofErr w:type="spellStart"/>
                   <w:r>
-                    <w:t>template_dict.terms_license.</w:t>
+                    <w:t>template_</w:t>
+                  </w:r>
+                  <w:proofErr w:type="gramStart"/>
+                  <w:r>
+                    <w:t>dict.terms</w:t>
+                  </w:r>
+                  <w:proofErr w:type="gramEnd"/>
+                  <w:r>
+                    <w:t>_license.</w:t>
                   </w:r>
                   <w:r>
                     <w:t>termsOfAccess</w:t>

</xml_diff>

<commit_message>
Removed 'Python scripted' in the column for both level's checklist
</commit_message>
<xml_diff>
--- a/res/template_high.docx
+++ b/res/template_high.docx
@@ -447,17 +447,17 @@
         <w:tblLook w:val="04A0" w:firstRow="1" w:lastRow="0" w:firstColumn="1" w:lastColumn="0" w:noHBand="0" w:noVBand="1"/>
       </w:tblPr>
       <w:tblGrid>
-        <w:gridCol w:w="488"/>
-        <w:gridCol w:w="1565"/>
-        <w:gridCol w:w="1825"/>
-        <w:gridCol w:w="3492"/>
-        <w:gridCol w:w="3035"/>
-        <w:gridCol w:w="3492"/>
-        <w:gridCol w:w="395"/>
-        <w:gridCol w:w="2306"/>
-        <w:gridCol w:w="4013"/>
-        <w:gridCol w:w="1018"/>
-        <w:gridCol w:w="722"/>
+        <w:gridCol w:w="491"/>
+        <w:gridCol w:w="1574"/>
+        <w:gridCol w:w="1836"/>
+        <w:gridCol w:w="3513"/>
+        <w:gridCol w:w="3053"/>
+        <w:gridCol w:w="3513"/>
+        <w:gridCol w:w="396"/>
+        <w:gridCol w:w="2319"/>
+        <w:gridCol w:w="4036"/>
+        <w:gridCol w:w="1023"/>
+        <w:gridCol w:w="597"/>
       </w:tblGrid>
       <w:tr>
         <w:trPr>
@@ -699,7 +699,22 @@
                 <w:b/>
                 <w:bCs/>
               </w:rPr>
-              <w:t>Time spent</w:t>
+              <w:t>Time</w:t>
+            </w:r>
+            <w:r>
+              <w:rPr>
+                <w:rFonts w:hint="eastAsia"/>
+                <w:b/>
+                <w:bCs/>
+              </w:rPr>
+              <w:t xml:space="preserve"> S</w:t>
+            </w:r>
+            <w:r>
+              <w:rPr>
+                <w:b/>
+                <w:bCs/>
+              </w:rPr>
+              <w:t>pent</w:t>
             </w:r>
           </w:p>
         </w:tc>
@@ -1380,11 +1395,7 @@
             </w:tcMar>
             <w:hideMark/>
           </w:tcPr>
-          <w:p>
-            <w:r>
-              <w:t>Python scripted</w:t>
-            </w:r>
-          </w:p>
+          <w:p/>
         </w:tc>
       </w:tr>
       <w:tr>
@@ -1476,11 +1487,11 @@
               </w:numPr>
             </w:pPr>
             <w:r>
-              <w:t xml:space="preserve">If the dataset is deposited in a sub-dataverse </w:t>
+              <w:t>If the dataset is deposited in a sub-datavers</w:t>
             </w:r>
             <w:r>
               <w:lastRenderedPageBreak/>
-              <w:t>collection, include the name of the collection. </w:t>
+              <w:t>e collection, include the name of the collection. </w:t>
             </w:r>
           </w:p>
         </w:tc>
@@ -1801,6 +1812,7 @@
           <w:p/>
           <w:p>
             <w:r>
+              <w:lastRenderedPageBreak/>
               <w:t>List the path of the dataset in the Dataverse collection:</w:t>
             </w:r>
             <w:r>
@@ -1862,6 +1874,7 @@
           </w:tcPr>
           <w:p>
             <w:r>
+              <w:lastRenderedPageBreak/>
               <w:t>Info</w:t>
             </w:r>
           </w:p>
@@ -1884,14 +1897,7 @@
             </w:tcMar>
             <w:hideMark/>
           </w:tcPr>
-          <w:p>
-            <w:r>
-              <w:t>Python script</w:t>
-            </w:r>
-            <w:r>
-              <w:t>ed</w:t>
-            </w:r>
-          </w:p>
+          <w:p/>
         </w:tc>
       </w:tr>
       <w:tr>
@@ -2015,11 +2021,11 @@
               </w:numPr>
             </w:pPr>
             <w:r>
-              <w:t xml:space="preserve">Confirm with the depositor that </w:t>
+              <w:t xml:space="preserve">Confirm with the </w:t>
             </w:r>
             <w:r>
               <w:lastRenderedPageBreak/>
-              <w:t>they actually require a dataverse (e.g., will there be future deposits?)</w:t>
+              <w:t>depositor that they actually require a dataverse (e.g., will there be future deposits?)</w:t>
             </w:r>
           </w:p>
         </w:tc>
@@ -2820,11 +2826,7 @@
             </w:tcMar>
             <w:hideMark/>
           </w:tcPr>
-          <w:p>
-            <w:r>
-              <w:t>Python scripted</w:t>
-            </w:r>
-          </w:p>
+          <w:p/>
         </w:tc>
       </w:tr>
       <w:tr>
@@ -3149,11 +3151,7 @@
             </w:tcMar>
             <w:hideMark/>
           </w:tcPr>
-          <w:p>
-            <w:r>
-              <w:t>Python scripted</w:t>
-            </w:r>
-          </w:p>
+          <w:p/>
         </w:tc>
       </w:tr>
       <w:tr>
@@ -3209,7 +3207,15 @@
                 <w:b/>
                 <w:bCs/>
               </w:rPr>
-              <w:t>Do all the files contain file extensions?</w:t>
+              <w:t xml:space="preserve">Do all the files contain </w:t>
+            </w:r>
+            <w:r>
+              <w:rPr>
+                <w:b/>
+                <w:bCs/>
+              </w:rPr>
+              <w:lastRenderedPageBreak/>
+              <w:t>file extensions?</w:t>
             </w:r>
           </w:p>
         </w:tc>
@@ -3233,6 +3239,7 @@
           </w:tcPr>
           <w:p>
             <w:r>
+              <w:lastRenderedPageBreak/>
               <w:t>Python scripted.</w:t>
             </w:r>
           </w:p>
@@ -3250,11 +3257,11 @@
               <w:t>all</w:t>
             </w:r>
             <w:r>
-              <w:t xml:space="preserve"> the files require a file </w:t>
+              <w:t xml:space="preserve"> the files </w:t>
             </w:r>
             <w:r>
               <w:lastRenderedPageBreak/>
-              <w:t>extension (e.g. a README file can either be ‘README’ or ‘README.md’). Curator needs to check on a case-by-case basis.</w:t>
+              <w:t>require a file extension (e.g. a README file can either be ‘README’ or ‘README.md’). Curator needs to check on a case-by-case basis.</w:t>
             </w:r>
           </w:p>
         </w:tc>
@@ -3421,6 +3428,12 @@
                 <w:lang w:val="en-US"/>
               </w:rPr>
               <w:br/>
+            </w:r>
+            <w:r>
+              <w:rPr>
+                <w:lang w:val="en-US"/>
+              </w:rPr>
+              <w:lastRenderedPageBreak/>
               <w:t>{% for item in template_dict.file_ext.comments %}</w:t>
             </w:r>
           </w:p>
@@ -3461,6 +3474,7 @@
           </w:tcPr>
           <w:p>
             <w:r>
+              <w:lastRenderedPageBreak/>
               <w:t>Require</w:t>
             </w:r>
           </w:p>
@@ -3483,11 +3497,7 @@
             </w:tcMar>
             <w:hideMark/>
           </w:tcPr>
-          <w:p>
-            <w:r>
-              <w:t>Python scripted</w:t>
-            </w:r>
-          </w:p>
+          <w:p/>
         </w:tc>
       </w:tr>
       <w:tr>
@@ -3836,11 +3846,7 @@
             </w:tcMar>
             <w:hideMark/>
           </w:tcPr>
-          <w:p>
-            <w:r>
-              <w:t>Python scripted</w:t>
-            </w:r>
-          </w:p>
+          <w:p/>
         </w:tc>
       </w:tr>
       <w:tr>
@@ -4155,6 +4161,7 @@
                 <w:b/>
                 <w:bCs/>
               </w:rPr>
+              <w:lastRenderedPageBreak/>
               <w:t>3.0</w:t>
             </w:r>
           </w:p>
@@ -4436,7 +4443,6 @@
                 <w:b/>
                 <w:bCs/>
               </w:rPr>
-              <w:lastRenderedPageBreak/>
               <w:t>3.1</w:t>
             </w:r>
           </w:p>
@@ -4702,11 +4708,7 @@
             </w:tcMar>
             <w:hideMark/>
           </w:tcPr>
-          <w:p>
-            <w:r>
-              <w:t>Python scripted</w:t>
-            </w:r>
-          </w:p>
+          <w:p/>
         </w:tc>
       </w:tr>
       <w:tr>
@@ -5959,11 +5961,11 @@
               </w:numPr>
             </w:pPr>
             <w:r>
-              <w:t xml:space="preserve">If the files are not listed in the README, we can generate a file tree structure &amp; pass it </w:t>
+              <w:t xml:space="preserve">If the files are not listed in the README, we can </w:t>
             </w:r>
             <w:r>
               <w:lastRenderedPageBreak/>
-              <w:t>to the depositors to include in their README, if applicable.</w:t>
+              <w:t>generate a file tree structure &amp; pass it to the depositors to include in their README, if applicable.</w:t>
             </w:r>
           </w:p>
         </w:tc>
@@ -6825,6 +6827,7 @@
               </w:numPr>
             </w:pPr>
             <w:r>
+              <w:lastRenderedPageBreak/>
               <w:t>Notes</w:t>
             </w:r>
           </w:p>
@@ -7044,11 +7047,7 @@
             </w:tcMar>
             <w:hideMark/>
           </w:tcPr>
-          <w:p>
-            <w:r>
-              <w:t>Python scripted</w:t>
-            </w:r>
-          </w:p>
+          <w:p/>
         </w:tc>
       </w:tr>
       <w:tr>
@@ -7079,7 +7078,6 @@
                 <w:b/>
                 <w:bCs/>
               </w:rPr>
-              <w:lastRenderedPageBreak/>
               <w:t>4.2</w:t>
             </w:r>
           </w:p>
@@ -7619,11 +7617,7 @@
             </w:tcMar>
             <w:hideMark/>
           </w:tcPr>
-          <w:p>
-            <w:r>
-              <w:t>Python scripted</w:t>
-            </w:r>
-          </w:p>
+          <w:p/>
         </w:tc>
       </w:tr>
       <w:tr>
@@ -7709,11 +7703,11 @@
               </w:numPr>
             </w:pPr>
             <w:r>
-              <w:t>Read the description and README file and check them against metadata fields. For example, if a geographical location or data collection date/range is mentioned in the descripti</w:t>
+              <w:t xml:space="preserve">Read the description and README file and check them against metadata fields. For example, if a geographical location or data collection date/range is </w:t>
             </w:r>
             <w:r>
               <w:lastRenderedPageBreak/>
-              <w:t>on, recommend filling in the relevant metadata fields</w:t>
+              <w:t>mentioned in the description, recommend filling in the relevant metadata fields</w:t>
             </w:r>
           </w:p>
         </w:tc>
@@ -8281,11 +8275,11 @@
               </w:numPr>
             </w:pPr>
             <w:r>
-              <w:t xml:space="preserve">Other dataset(s) used in creating </w:t>
+              <w:t xml:space="preserve">Other dataset(s) used in </w:t>
             </w:r>
             <w:r>
               <w:lastRenderedPageBreak/>
-              <w:t>the dataset </w:t>
+              <w:t>creating the dataset </w:t>
             </w:r>
           </w:p>
           <w:p>
@@ -8783,6 +8777,7 @@
                 <w:b/>
                 <w:bCs/>
               </w:rPr>
+              <w:lastRenderedPageBreak/>
               <w:t>4.8</w:t>
             </w:r>
           </w:p>
@@ -8810,15 +8805,7 @@
                 <w:b/>
                 <w:bCs/>
               </w:rPr>
-              <w:t xml:space="preserve">Does the dataset include a Researcher </w:t>
-            </w:r>
-            <w:r>
-              <w:rPr>
-                <w:b/>
-                <w:bCs/>
-              </w:rPr>
-              <w:lastRenderedPageBreak/>
-              <w:t>ID for each author?</w:t>
+              <w:t>Does the dataset include a Researcher ID for each author?</w:t>
             </w:r>
           </w:p>
         </w:tc>
@@ -8847,12 +8834,7 @@
               </w:numPr>
             </w:pPr>
             <w:r>
-              <w:lastRenderedPageBreak/>
-              <w:t xml:space="preserve">If no Researcher ID (such as </w:t>
-            </w:r>
-            <w:r>
-              <w:lastRenderedPageBreak/>
-              <w:t>ORCID, or other identifier) is listed, let them know they may want to include it</w:t>
+              <w:t>If no Researcher ID (such as ORCID, or other identifier) is listed, let them know they may want to include it</w:t>
             </w:r>
           </w:p>
         </w:tc>
@@ -9306,6 +9288,7 @@
                 <w:b/>
                 <w:bCs/>
               </w:rPr>
+              <w:lastRenderedPageBreak/>
               <w:t>4.10</w:t>
             </w:r>
           </w:p>
@@ -9333,15 +9316,7 @@
                 <w:b/>
                 <w:bCs/>
               </w:rPr>
-              <w:t xml:space="preserve">If there is a related dataset associated with the </w:t>
-            </w:r>
-            <w:r>
-              <w:rPr>
-                <w:b/>
-                <w:bCs/>
-              </w:rPr>
-              <w:lastRenderedPageBreak/>
-              <w:t>dataset, has a DOI or other identifier been included in the publication metadata?</w:t>
+              <w:t>If there is a related dataset associated with the dataset, has a DOI or other identifier been included in the publication metadata?</w:t>
             </w:r>
           </w:p>
         </w:tc>
@@ -9370,12 +9345,7 @@
               </w:numPr>
             </w:pPr>
             <w:r>
-              <w:lastRenderedPageBreak/>
-              <w:t xml:space="preserve">If there’s a related article, has the DOI or </w:t>
-            </w:r>
-            <w:r>
-              <w:lastRenderedPageBreak/>
-              <w:t>other identifier been included </w:t>
+              <w:t>If there’s a related article, has the DOI or other identifier been included </w:t>
             </w:r>
           </w:p>
         </w:tc>
@@ -9649,7 +9619,6 @@
           <w:p>
             <w:pPr>
               <w:rPr>
-                <w:rFonts w:hint="eastAsia"/>
                 <w:b/>
                 <w:bCs/>
               </w:rPr>
@@ -9934,7 +9903,11 @@
               </w:numPr>
             </w:pPr>
             <w:r>
-              <w:t>Review description, notes, and terms of access metadata fields.</w:t>
+              <w:t xml:space="preserve">Review description, notes, and </w:t>
+            </w:r>
+            <w:r>
+              <w:lastRenderedPageBreak/>
+              <w:t>terms of access metadata fields.</w:t>
             </w:r>
           </w:p>
         </w:tc>
@@ -10163,7 +10136,6 @@
                 <w:b/>
                 <w:bCs/>
               </w:rPr>
-              <w:lastRenderedPageBreak/>
               <w:t>5.2</w:t>
             </w:r>
           </w:p>
@@ -10493,7 +10465,11 @@
               </w:numPr>
             </w:pPr>
             <w:r>
-              <w:t>Check if the deposit includes restricted files (if yes, recommend they use custom terms)</w:t>
+              <w:t xml:space="preserve">Check if the deposit includes restricted files (if yes, recommend they use </w:t>
+            </w:r>
+            <w:r>
+              <w:lastRenderedPageBreak/>
+              <w:t>custom terms)</w:t>
             </w:r>
           </w:p>
         </w:tc>
@@ -10707,7 +10683,7 @@
               <w:tblLook w:val="04A0" w:firstRow="1" w:lastRow="0" w:firstColumn="1" w:lastColumn="0" w:noHBand="0" w:noVBand="1"/>
             </w:tblPr>
             <w:tblGrid>
-              <w:gridCol w:w="3697"/>
+              <w:gridCol w:w="3768"/>
             </w:tblGrid>
             <w:tr>
               <w:tc>
@@ -10721,6 +10697,7 @@
                     </w:rPr>
                   </w:pPr>
                   <w:r>
+                    <w:lastRenderedPageBreak/>
                     <w:t>{% if template_dict.terms_license.</w:t>
                   </w:r>
                   <w:r>
@@ -10761,6 +10738,7 @@
           </w:tcPr>
           <w:p>
             <w:r>
+              <w:lastRenderedPageBreak/>
               <w:t>Require</w:t>
             </w:r>
           </w:p>
@@ -10783,11 +10761,7 @@
             </w:tcMar>
             <w:hideMark/>
           </w:tcPr>
-          <w:p>
-            <w:r>
-              <w:t>Python scripted</w:t>
-            </w:r>
-          </w:p>
+          <w:p/>
         </w:tc>
       </w:tr>
       <w:tr>
@@ -10817,7 +10791,6 @@
                 <w:b/>
                 <w:bCs/>
               </w:rPr>
-              <w:lastRenderedPageBreak/>
               <w:t>5.4b</w:t>
             </w:r>
           </w:p>
@@ -11225,7 +11198,7 @@
               <w:tblLook w:val="04A0" w:firstRow="1" w:lastRow="0" w:firstColumn="1" w:lastColumn="0" w:noHBand="0" w:noVBand="1"/>
             </w:tblPr>
             <w:tblGrid>
-              <w:gridCol w:w="3697"/>
+              <w:gridCol w:w="3768"/>
             </w:tblGrid>
             <w:tr>
               <w:tc>
@@ -11299,11 +11272,7 @@
             </w:tcMar>
             <w:hideMark/>
           </w:tcPr>
-          <w:p>
-            <w:r>
-              <w:t>Python scripted</w:t>
-            </w:r>
-          </w:p>
+          <w:p/>
         </w:tc>
       </w:tr>
       <w:tr>
@@ -11389,7 +11358,11 @@
               </w:numPr>
             </w:pPr>
             <w:r>
-              <w:t>Review the description, documentation, and names of files to see if there are any that stand out as possible third-party data sources.</w:t>
+              <w:t xml:space="preserve">Review the description, documentation, and names of files to see if there are any that stand out as possible third-party </w:t>
+            </w:r>
+            <w:r>
+              <w:lastRenderedPageBreak/>
+              <w:t>data sources.</w:t>
             </w:r>
           </w:p>
         </w:tc>
@@ -18608,6 +18581,7 @@
   <w:style w:type="character" w:default="1" w:styleId="DefaultParagraphFont">
     <w:name w:val="Default Paragraph Font"/>
     <w:uiPriority w:val="1"/>
+    <w:semiHidden/>
     <w:unhideWhenUsed/>
   </w:style>
   <w:style w:type="table" w:default="1" w:styleId="TableNormal">

</xml_diff>

<commit_message>
Added (NONE) to the `Curator's Comments` column if the lists is empty with the automatic checks, in the high-level checklist.
</commit_message>
<xml_diff>
--- a/res/template_high.docx
+++ b/res/template_high.docx
@@ -1300,7 +1300,33 @@
               <w:rPr>
                 <w:lang w:val="en-US"/>
               </w:rPr>
-              <w:t>If relevant, list previously created dataverse:</w:t>
+              <w:t>If relevant, list previously created dataverse</w:t>
+            </w:r>
+            <w:r>
+              <w:rPr>
+                <w:rFonts w:hint="eastAsia"/>
+                <w:lang w:val="en-US"/>
+              </w:rPr>
+              <w:t xml:space="preserve"> with depositors</w:t>
+            </w:r>
+            <w:r>
+              <w:rPr>
+                <w:lang w:val="en-US"/>
+              </w:rPr>
+              <w:t>’</w:t>
+            </w:r>
+            <w:r>
+              <w:rPr>
+                <w:rFonts w:hint="eastAsia"/>
+                <w:lang w:val="en-US"/>
+              </w:rPr>
+              <w:t xml:space="preserve"> dataset inside</w:t>
+            </w:r>
+            <w:r>
+              <w:rPr>
+                <w:lang w:val="en-US"/>
+              </w:rPr>
+              <w:t>:</w:t>
             </w:r>
             <w:r>
               <w:rPr>
@@ -1729,50 +1755,56 @@
             <w:hideMark/>
           </w:tcPr>
           <w:p>
-            <w:r>
+            <w:pPr>
               <w:rPr>
                 <w:rFonts w:hint="eastAsia"/>
                 <w:lang w:val="en-US"/>
               </w:rPr>
-              <w:t xml:space="preserve">List the </w:t>
-            </w:r>
-            <w:r>
-              <w:rPr>
-                <w:lang w:val="en-US"/>
-              </w:rPr>
-              <w:t>parent D</w:t>
-            </w:r>
+            </w:pPr>
             <w:r>
               <w:rPr>
                 <w:rFonts w:hint="eastAsia"/>
                 <w:lang w:val="en-US"/>
               </w:rPr>
-              <w:t xml:space="preserve">ataverse </w:t>
+              <w:t xml:space="preserve">List the </w:t>
             </w:r>
             <w:r>
               <w:rPr>
                 <w:lang w:val="en-US"/>
               </w:rPr>
-              <w:t>collection</w:t>
+              <w:t>parent D</w:t>
             </w:r>
             <w:r>
               <w:rPr>
                 <w:rFonts w:hint="eastAsia"/>
                 <w:lang w:val="en-US"/>
               </w:rPr>
-              <w:t xml:space="preserve"> name:</w:t>
+              <w:t xml:space="preserve">ataverse </w:t>
             </w:r>
             <w:r>
               <w:rPr>
                 <w:lang w:val="en-US"/>
               </w:rPr>
-              <w:br/>
+              <w:t>collection</w:t>
             </w:r>
             <w:r>
               <w:rPr>
                 <w:rFonts w:hint="eastAsia"/>
                 <w:lang w:val="en-US"/>
               </w:rPr>
+              <w:t xml:space="preserve"> name:</w:t>
+            </w:r>
+            <w:r>
+              <w:rPr>
+                <w:lang w:val="en-US"/>
+              </w:rPr>
+              <w:br/>
+            </w:r>
+            <w:r>
+              <w:rPr>
+                <w:rFonts w:hint="eastAsia"/>
+                <w:lang w:val="en-US"/>
+              </w:rPr>
               <w:t xml:space="preserve">{{ </w:t>
             </w:r>
             <w:r>
@@ -1820,36 +1852,20 @@
             </w:r>
             <w:r>
               <w:rPr>
-                <w:rFonts w:hint="eastAsia"/>
                 <w:lang w:val="en-US"/>
               </w:rPr>
               <w:t xml:space="preserve">{{ </w:t>
             </w:r>
             <w:r>
-              <w:t>template_dict</w:t>
-            </w:r>
-            <w:r>
-              <w:rPr>
-                <w:rFonts w:hint="eastAsia"/>
-              </w:rPr>
-              <w:t>.</w:t>
+              <w:t>template_dict.</w:t>
             </w:r>
             <w:r>
               <w:rPr>
                 <w:lang w:val="en-US"/>
               </w:rPr>
-              <w:t>ds_tree_info</w:t>
-            </w:r>
-            <w:r>
-              <w:rPr>
-                <w:lang w:val="en-US"/>
-              </w:rPr>
-              <w:t>.path</w:t>
-            </w:r>
-            <w:r>
-              <w:rPr>
-                <w:rFonts w:hint="eastAsia"/>
-              </w:rPr>
+              <w:t>ds_tree_info.path</w:t>
+            </w:r>
+            <w:r>
               <w:t>}}</w:t>
             </w:r>
           </w:p>
@@ -2709,6 +2725,24 @@
               <w:br/>
             </w:r>
             <w:r>
+              <w:t xml:space="preserve">{% if </w:t>
+            </w:r>
+            <w:r>
+              <w:rPr>
+                <w:lang w:val="en-US"/>
+              </w:rPr>
+              <w:t>template_dict.file_open.comments</w:t>
+            </w:r>
+            <w:r>
+              <w:t xml:space="preserve"> </w:t>
+            </w:r>
+            <w:r>
+              <w:t>|length &gt; 0</w:t>
+            </w:r>
+            <w:r>
+              <w:t xml:space="preserve"> %}</w:t>
+            </w:r>
+            <w:r>
               <w:rPr>
                 <w:lang w:val="en-US"/>
               </w:rPr>
@@ -2735,11 +2769,13 @@
           </w:p>
           <w:p>
             <w:pPr>
-              <w:ind w:left="360"/>
               <w:rPr>
                 <w:lang w:val="en-US"/>
               </w:rPr>
             </w:pPr>
+            <w:r>
+              <w:t>{% else %}(NONE){% endif %}</w:t>
+            </w:r>
           </w:p>
           <w:p>
             <w:pPr>
@@ -2758,6 +2794,21 @@
                 <w:lang w:val="en-US"/>
               </w:rPr>
               <w:br/>
+            </w:r>
+            <w:r>
+              <w:t xml:space="preserve">{% if </w:t>
+            </w:r>
+            <w:r>
+              <w:rPr>
+                <w:lang w:val="en-US"/>
+              </w:rPr>
+              <w:t>template_dict.file_open.not_checked</w:t>
+            </w:r>
+            <w:r>
+              <w:t xml:space="preserve"> |length &gt; 0</w:t>
+            </w:r>
+            <w:r>
+              <w:t xml:space="preserve"> %}</w:t>
             </w:r>
             <w:r>
               <w:rPr>
@@ -2784,7 +2835,11 @@
               <w:t>{{ item.file_name }}{% endfor %}</w:t>
             </w:r>
           </w:p>
-          <w:p/>
+          <w:p>
+            <w:r>
+              <w:t>{% else %}(NONE){% endif %}</w:t>
+            </w:r>
+          </w:p>
         </w:tc>
         <w:tc>
           <w:tcPr>
@@ -3085,6 +3140,21 @@
                 <w:lang w:val="en-US"/>
               </w:rPr>
               <w:br/>
+            </w:r>
+            <w:r>
+              <w:t>{% if template_dict.restricted_files.comment</w:t>
+            </w:r>
+            <w:r>
+              <w:rPr>
+                <w:rFonts w:hint="eastAsia"/>
+              </w:rPr>
+              <w:t>s</w:t>
+            </w:r>
+            <w:r>
+              <w:t>|length &gt; 0</w:t>
+            </w:r>
+            <w:r>
+              <w:t xml:space="preserve"> %}</w:t>
             </w:r>
             <w:r>
               <w:rPr>
@@ -3108,6 +3178,11 @@
               <w:t>{{ item.file_name }}{% endfor %}</w:t>
             </w:r>
           </w:p>
+          <w:p>
+            <w:r>
+              <w:t>{% else %}(NONE){% endif %}</w:t>
+            </w:r>
+          </w:p>
         </w:tc>
         <w:tc>
           <w:tcPr>
@@ -3179,6 +3254,7 @@
                 <w:b/>
                 <w:bCs/>
               </w:rPr>
+              <w:lastRenderedPageBreak/>
               <w:t>2.3</w:t>
             </w:r>
           </w:p>
@@ -3207,15 +3283,7 @@
                 <w:b/>
                 <w:bCs/>
               </w:rPr>
-              <w:t xml:space="preserve">Do all the files contain </w:t>
-            </w:r>
-            <w:r>
-              <w:rPr>
-                <w:b/>
-                <w:bCs/>
-              </w:rPr>
-              <w:lastRenderedPageBreak/>
-              <w:t>file extensions?</w:t>
+              <w:t>Do all the files contain file extensions?</w:t>
             </w:r>
           </w:p>
         </w:tc>
@@ -3239,7 +3307,6 @@
           </w:tcPr>
           <w:p>
             <w:r>
-              <w:lastRenderedPageBreak/>
               <w:t>Python scripted.</w:t>
             </w:r>
           </w:p>
@@ -3257,11 +3324,7 @@
               <w:t>all</w:t>
             </w:r>
             <w:r>
-              <w:t xml:space="preserve"> the files </w:t>
-            </w:r>
-            <w:r>
-              <w:lastRenderedPageBreak/>
-              <w:t>require a file extension (e.g. a README file can either be ‘README’ or ‘README.md’). Curator needs to check on a case-by-case basis.</w:t>
+              <w:t xml:space="preserve"> the files require a file extension (e.g. a README file can either be ‘README’ or ‘README.md’). Curator needs to check on a case-by-case basis.</w:t>
             </w:r>
           </w:p>
         </w:tc>
@@ -3288,7 +3351,6 @@
               <w:rPr>
                 <w:lang w:val="en-US"/>
               </w:rPr>
-              <w:lastRenderedPageBreak/>
               <w:t xml:space="preserve">{% if template_dict.readme_file.comments|length </w:t>
             </w:r>
             <w:r>
@@ -3430,10 +3492,27 @@
               <w:br/>
             </w:r>
             <w:r>
+              <w:t xml:space="preserve">{% if </w:t>
+            </w:r>
+            <w:r>
               <w:rPr>
                 <w:lang w:val="en-US"/>
               </w:rPr>
-              <w:lastRenderedPageBreak/>
+              <w:t>template_dict.file_ext.comments</w:t>
+            </w:r>
+            <w:r>
+              <w:t xml:space="preserve"> </w:t>
+            </w:r>
+            <w:r>
+              <w:t>|length &gt; 0</w:t>
+            </w:r>
+            <w:r>
+              <w:t xml:space="preserve"> %}</w:t>
+            </w:r>
+            <w:r>
+              <w:rPr>
+                <w:lang w:val="en-US"/>
+              </w:rPr>
               <w:t>{% for item in template_dict.file_ext.comments %}</w:t>
             </w:r>
           </w:p>
@@ -3453,6 +3532,14 @@
               <w:t>{{ item.file_name }}{% endfor %}</w:t>
             </w:r>
           </w:p>
+          <w:p>
+            <w:pPr>
+              <w:spacing w:line="256" w:lineRule="auto"/>
+            </w:pPr>
+            <w:r>
+              <w:t>{% else %}(NONE){% endif %}</w:t>
+            </w:r>
+          </w:p>
         </w:tc>
         <w:tc>
           <w:tcPr>
@@ -3474,7 +3561,6 @@
           </w:tcPr>
           <w:p>
             <w:r>
-              <w:lastRenderedPageBreak/>
               <w:t>Require</w:t>
             </w:r>
           </w:p>
@@ -3763,13 +3849,39 @@
               </w:rPr>
               <w:t>List all files that do not appear on the common file format list:</w:t>
             </w:r>
-          </w:p>
-          <w:p>
-            <w:pPr>
+            <w:r>
               <w:rPr>
                 <w:lang w:val="en-US"/>
               </w:rPr>
-            </w:pPr>
+              <w:br/>
+            </w:r>
+            <w:r>
+              <w:t xml:space="preserve">{% if </w:t>
+            </w:r>
+            <w:r>
+              <w:rPr>
+                <w:lang w:val="en-US"/>
+              </w:rPr>
+              <w:t>template_dict.</w:t>
+            </w:r>
+            <w:r>
+              <w:rPr>
+                <w:lang w:val="en-US"/>
+              </w:rPr>
+              <w:t>common_file_format</w:t>
+            </w:r>
+            <w:r>
+              <w:rPr>
+                <w:lang w:val="en-US"/>
+              </w:rPr>
+              <w:t>.comments</w:t>
+            </w:r>
+            <w:r>
+              <w:t>|length &gt; 0</w:t>
+            </w:r>
+            <w:r>
+              <w:t xml:space="preserve"> %}</w:t>
+            </w:r>
             <w:r>
               <w:rPr>
                 <w:lang w:val="en-US"/>
@@ -3800,7 +3912,32 @@
               <w:rPr>
                 <w:lang w:val="en-US"/>
               </w:rPr>
-              <w:t>{{ item.file_name }}{% endfor %}</w:t>
+              <w:t>{{ item.file_name }}</w:t>
+            </w:r>
+            <w:r>
+              <w:rPr>
+                <w:rFonts w:hint="eastAsia"/>
+                <w:lang w:val="en-US"/>
+              </w:rPr>
+              <w:t>{</w:t>
+            </w:r>
+            <w:r>
+              <w:rPr>
+                <w:rFonts w:hint="eastAsia"/>
+                <w:lang w:val="en-US"/>
+              </w:rPr>
+              <w:t xml:space="preserve">% </w:t>
+            </w:r>
+            <w:r>
+              <w:rPr>
+                <w:lang w:val="en-US"/>
+              </w:rPr>
+              <w:t>endfor %}</w:t>
+            </w:r>
+          </w:p>
+          <w:p>
+            <w:r>
+              <w:t>{% else %}(NONE){% endif %}</w:t>
             </w:r>
           </w:p>
         </w:tc>
@@ -3932,7 +4069,11 @@
               </w:numPr>
             </w:pPr>
             <w:r>
-              <w:t>Review documentation files (e.g., README, other relevant files based on name) to determine if there is information about uncommon file types. </w:t>
+              <w:t xml:space="preserve">Review documentation files (e.g., README, other relevant files based on name) to determine if there is </w:t>
+            </w:r>
+            <w:r>
+              <w:lastRenderedPageBreak/>
+              <w:t>information about uncommon file types. </w:t>
             </w:r>
           </w:p>
         </w:tc>
@@ -4066,12 +4207,6 @@
                 <w:numId w:val="11"/>
               </w:numPr>
             </w:pPr>
-            <w:r>
-              <w:rPr>
-                <w:rFonts w:hint="eastAsia"/>
-              </w:rPr>
-              <w:t>2</w:t>
-            </w:r>
           </w:p>
           <w:p/>
           <w:p>
@@ -4161,7 +4296,6 @@
                 <w:b/>
                 <w:bCs/>
               </w:rPr>
-              <w:lastRenderedPageBreak/>
               <w:t>3.0</w:t>
             </w:r>
           </w:p>
@@ -4654,14 +4788,40 @@
                 <w:lang w:val="en-US"/>
               </w:rPr>
               <w:br/>
-              <w:t>{% for item in template_dict.readme_file.comments %}{{ loop.index }}. {{ item.file_name }}</w:t>
+            </w:r>
+            <w:r>
+              <w:t xml:space="preserve">{% if </w:t>
             </w:r>
             <w:r>
               <w:rPr>
                 <w:lang w:val="en-US"/>
               </w:rPr>
-              <w:br/>
-              <w:t>{% endfor %}</w:t>
+              <w:t>template_dict.readme_file.comments</w:t>
+            </w:r>
+            <w:r>
+              <w:t xml:space="preserve"> </w:t>
+            </w:r>
+            <w:r>
+              <w:t>|length &gt; 0</w:t>
+            </w:r>
+            <w:r>
+              <w:t xml:space="preserve"> %}</w:t>
+            </w:r>
+            <w:r>
+              <w:rPr>
+                <w:lang w:val="en-US"/>
+              </w:rPr>
+              <w:t>{% for item in template_dict.readme_file.comments %}{{ loop.index }}. {{ item.file_name }}{% endfor %}</w:t>
+            </w:r>
+          </w:p>
+          <w:p>
+            <w:pPr>
+              <w:rPr>
+                <w:lang w:val="en-US"/>
+              </w:rPr>
+            </w:pPr>
+            <w:r>
+              <w:t>{% else %}(NONE){% endif %}</w:t>
             </w:r>
           </w:p>
           <w:p/>
@@ -5921,7 +6081,15 @@
                 <w:b/>
                 <w:bCs/>
               </w:rPr>
-              <w:t>Does the README file contain correct and complete information about ‘Files and organization’ </w:t>
+              <w:t xml:space="preserve">Does the README file contain correct and complete information about ‘Files </w:t>
+            </w:r>
+            <w:r>
+              <w:rPr>
+                <w:b/>
+                <w:bCs/>
+              </w:rPr>
+              <w:lastRenderedPageBreak/>
+              <w:t>and organization’ </w:t>
             </w:r>
           </w:p>
         </w:tc>
@@ -5950,7 +6118,12 @@
               </w:numPr>
             </w:pPr>
             <w:r>
-              <w:t>Check whether the files listed in the README match the files listed in the deposit.</w:t>
+              <w:lastRenderedPageBreak/>
+              <w:t xml:space="preserve">Check whether the files listed in the README match </w:t>
+            </w:r>
+            <w:r>
+              <w:lastRenderedPageBreak/>
+              <w:t>the files listed in the deposit.</w:t>
             </w:r>
           </w:p>
           <w:p>
@@ -5961,11 +6134,7 @@
               </w:numPr>
             </w:pPr>
             <w:r>
-              <w:t xml:space="preserve">If the files are not listed in the README, we can </w:t>
-            </w:r>
-            <w:r>
-              <w:lastRenderedPageBreak/>
-              <w:t>generate a file tree structure &amp; pass it to the depositors to include in their README, if applicable.</w:t>
+              <w:t>If the files are not listed in the README, we can generate a file tree structure &amp; pass it to the depositors to include in their README, if applicable.</w:t>
             </w:r>
           </w:p>
         </w:tc>
@@ -6742,7 +6911,15 @@
                 <w:b/>
                 <w:bCs/>
               </w:rPr>
-              <w:t>Are all metadata fields free from typos?</w:t>
+              <w:t xml:space="preserve">Are all metadata </w:t>
+            </w:r>
+            <w:r>
+              <w:rPr>
+                <w:b/>
+                <w:bCs/>
+              </w:rPr>
+              <w:lastRenderedPageBreak/>
+              <w:t>fields free from typos?</w:t>
             </w:r>
           </w:p>
         </w:tc>
@@ -6766,12 +6943,14 @@
           </w:tcPr>
           <w:p>
             <w:r>
+              <w:lastRenderedPageBreak/>
               <w:t>Python scripted.</w:t>
             </w:r>
           </w:p>
           <w:p/>
           <w:p>
             <w:r>
+              <w:lastRenderedPageBreak/>
               <w:t>Only checking the following fields:</w:t>
             </w:r>
           </w:p>
@@ -6827,7 +7006,6 @@
               </w:numPr>
             </w:pPr>
             <w:r>
-              <w:lastRenderedPageBreak/>
               <w:t>Notes</w:t>
             </w:r>
           </w:p>
@@ -6981,6 +7159,25 @@
                 <w:lang w:val="en-US"/>
               </w:rPr>
               <w:br/>
+            </w:r>
+            <w:r>
+              <w:t xml:space="preserve">{% if </w:t>
+            </w:r>
+            <w:r>
+              <w:rPr>
+                <w:lang w:val="en-US"/>
+              </w:rPr>
+              <w:t>template_dict.typo.comments</w:t>
+            </w:r>
+            <w:r>
+              <w:t xml:space="preserve"> </w:t>
+            </w:r>
+            <w:r>
+              <w:lastRenderedPageBreak/>
+              <w:t>|length &gt; 0</w:t>
+            </w:r>
+            <w:r>
+              <w:t xml:space="preserve"> %}</w:t>
             </w:r>
             <w:r>
               <w:rPr>
@@ -7004,6 +7201,25 @@
               <w:t>{{ item }}{% endfor %}</w:t>
             </w:r>
           </w:p>
+          <w:p>
+            <w:pPr>
+              <w:rPr>
+                <w:rFonts w:hint="eastAsia"/>
+              </w:rPr>
+            </w:pPr>
+            <w:r>
+              <w:t>{% else %}(NONE</w:t>
+            </w:r>
+            <w:r>
+              <w:rPr>
+                <w:rFonts w:hint="eastAsia"/>
+              </w:rPr>
+              <w:t>)</w:t>
+            </w:r>
+            <w:r>
+              <w:t>{% endif %}</w:t>
+            </w:r>
+          </w:p>
         </w:tc>
         <w:tc>
           <w:tcPr>
@@ -7025,6 +7241,7 @@
           </w:tcPr>
           <w:p>
             <w:r>
+              <w:lastRenderedPageBreak/>
               <w:t>Require</w:t>
             </w:r>
           </w:p>
@@ -7703,11 +7920,11 @@
               </w:numPr>
             </w:pPr>
             <w:r>
-              <w:t xml:space="preserve">Read the description and README file and check them against metadata fields. For example, if a geographical location or data collection date/range is </w:t>
+              <w:t xml:space="preserve">Read the description and README file and check them against metadata fields. </w:t>
             </w:r>
             <w:r>
               <w:lastRenderedPageBreak/>
-              <w:t>mentioned in the description, recommend filling in the relevant metadata fields</w:t>
+              <w:t>For example, if a geographical location or data collection date/range is mentioned in the description, recommend filling in the relevant metadata fields</w:t>
             </w:r>
           </w:p>
         </w:tc>
@@ -8228,7 +8445,13 @@
               <w:t>Still need to discover/formulate the best practices for writing dataset descriptions.</w:t>
             </w:r>
           </w:p>
-          <w:p/>
+          <w:p>
+            <w:pPr>
+              <w:rPr>
+                <w:rFonts w:hint="eastAsia"/>
+              </w:rPr>
+            </w:pPr>
+          </w:p>
           <w:p>
             <w:r>
               <w:t>Some elements to look for may include:</w:t>
@@ -8242,6 +8465,7 @@
               </w:numPr>
             </w:pPr>
             <w:r>
+              <w:lastRenderedPageBreak/>
               <w:t>Dates of collection</w:t>
             </w:r>
           </w:p>
@@ -8275,11 +8499,7 @@
               </w:numPr>
             </w:pPr>
             <w:r>
-              <w:t xml:space="preserve">Other dataset(s) used in </w:t>
-            </w:r>
-            <w:r>
-              <w:lastRenderedPageBreak/>
-              <w:t>creating the dataset </w:t>
+              <w:t>Other dataset(s) used in creating the dataset </w:t>
             </w:r>
           </w:p>
           <w:p>
@@ -8566,11 +8786,6 @@
             </w:r>
           </w:p>
           <w:p>
-            <w:r>
-              <w:br/>
-            </w:r>
-          </w:p>
-          <w:p>
             <w:pPr>
               <w:numPr>
                 <w:ilvl w:val="0"/>
@@ -8589,7 +8804,11 @@
               </w:numPr>
             </w:pPr>
             <w:r>
-              <w:t>Can also provide information about controlled vocabulary (in that specific field) if none is filled out.</w:t>
+              <w:t>Can also provide information about controlle</w:t>
+            </w:r>
+            <w:r>
+              <w:lastRenderedPageBreak/>
+              <w:t>d vocabulary (in that specific field) if none is filled out.</w:t>
             </w:r>
           </w:p>
         </w:tc>
@@ -8777,7 +8996,6 @@
                 <w:b/>
                 <w:bCs/>
               </w:rPr>
-              <w:lastRenderedPageBreak/>
               <w:t>4.8</w:t>
             </w:r>
           </w:p>
@@ -9089,7 +9307,11 @@
               </w:numPr>
             </w:pPr>
             <w:r>
-              <w:t>If metadata indicates a related publication or project, suggest adding a corresponding suffix to the title.</w:t>
+              <w:t xml:space="preserve">If metadata indicates a related publication or project, </w:t>
+            </w:r>
+            <w:r>
+              <w:lastRenderedPageBreak/>
+              <w:t>suggest adding a corresponding suffix to the title.</w:t>
             </w:r>
           </w:p>
         </w:tc>
@@ -9288,7 +9510,6 @@
                 <w:b/>
                 <w:bCs/>
               </w:rPr>
-              <w:lastRenderedPageBreak/>
               <w:t>4.10</w:t>
             </w:r>
           </w:p>
@@ -9892,7 +10113,11 @@
               </w:numPr>
             </w:pPr>
             <w:r>
-              <w:t>Review documentation and file names and see if there are any that should be opened and reviewed (e.g. if a file is named “participant survey” - maybe open that one)</w:t>
+              <w:t xml:space="preserve">Review documentation and file names and see if there are any that should be opened and reviewed (e.g. if a file is named “participant survey” - maybe </w:t>
+            </w:r>
+            <w:r>
+              <w:lastRenderedPageBreak/>
+              <w:t>open that one)</w:t>
             </w:r>
           </w:p>
           <w:p>
@@ -9903,11 +10128,7 @@
               </w:numPr>
             </w:pPr>
             <w:r>
-              <w:t xml:space="preserve">Review description, notes, and </w:t>
-            </w:r>
-            <w:r>
-              <w:lastRenderedPageBreak/>
-              <w:t>terms of access metadata fields.</w:t>
+              <w:t>Review description, notes, and terms of access metadata fields.</w:t>
             </w:r>
           </w:p>
         </w:tc>
@@ -10465,11 +10686,11 @@
               </w:numPr>
             </w:pPr>
             <w:r>
-              <w:t xml:space="preserve">Check if the deposit includes restricted files (if yes, recommend they use </w:t>
+              <w:t xml:space="preserve">Check if the </w:t>
             </w:r>
             <w:r>
               <w:lastRenderedPageBreak/>
-              <w:t>custom terms)</w:t>
+              <w:t>deposit includes restricted files (if yes, recommend they use custom terms)</w:t>
             </w:r>
           </w:p>
         </w:tc>
@@ -10611,7 +10832,7 @@
               <w:t>|length &gt; 0</w:t>
             </w:r>
             <w:r>
-              <w:t xml:space="preserve"> %} {% for item in template_dict.restricted_files.comments %} </w:t>
+              <w:t xml:space="preserve"> %}{% for item in template_dict.restricted_files.comments %} </w:t>
             </w:r>
           </w:p>
           <w:p>
@@ -10656,6 +10877,7 @@
               </w:rPr>
             </w:pPr>
             <w:r>
+              <w:lastRenderedPageBreak/>
               <w:t>{% if template_dict.terms_license.licenseName is not none %}{{ template_dict.terms_license.licenseName }}{% else %}(NONE){% endif %}</w:t>
             </w:r>
           </w:p>
@@ -10683,7 +10905,7 @@
               <w:tblLook w:val="04A0" w:firstRow="1" w:lastRow="0" w:firstColumn="1" w:lastColumn="0" w:noHBand="0" w:noVBand="1"/>
             </w:tblPr>
             <w:tblGrid>
-              <w:gridCol w:w="3768"/>
+              <w:gridCol w:w="3826"/>
             </w:tblGrid>
             <w:tr>
               <w:tc>
@@ -10697,7 +10919,6 @@
                     </w:rPr>
                   </w:pPr>
                   <w:r>
-                    <w:lastRenderedPageBreak/>
                     <w:t>{% if template_dict.terms_license.</w:t>
                   </w:r>
                   <w:r>
@@ -11198,7 +11419,7 @@
               <w:tblLook w:val="04A0" w:firstRow="1" w:lastRow="0" w:firstColumn="1" w:lastColumn="0" w:noHBand="0" w:noVBand="1"/>
             </w:tblPr>
             <w:tblGrid>
-              <w:gridCol w:w="3768"/>
+              <w:gridCol w:w="3826"/>
             </w:tblGrid>
             <w:tr>
               <w:tc>
@@ -11358,11 +11579,11 @@
               </w:numPr>
             </w:pPr>
             <w:r>
-              <w:t xml:space="preserve">Review the description, documentation, and names of files to see if there are any that stand out as possible third-party </w:t>
+              <w:t xml:space="preserve">Review the description, documentation, and names of </w:t>
             </w:r>
             <w:r>
               <w:lastRenderedPageBreak/>
-              <w:t>data sources.</w:t>
+              <w:t>files to see if there are any that stand out as possible third-party data sources.</w:t>
             </w:r>
           </w:p>
         </w:tc>
@@ -18581,7 +18802,6 @@
   <w:style w:type="character" w:default="1" w:styleId="DefaultParagraphFont">
     <w:name w:val="Default Paragraph Font"/>
     <w:uiPriority w:val="1"/>
-    <w:semiHidden/>
     <w:unhideWhenUsed/>
   </w:style>
   <w:style w:type="table" w:default="1" w:styleId="TableNormal">

</xml_diff>

<commit_message>
Added (NONE) to the Curator's Comments column if the lists is empty with the automatic checks, in the medium-level checklist; Changed description in for the previous created dataverese question.
</commit_message>
<xml_diff>
--- a/res/template_high.docx
+++ b/res/template_high.docx
@@ -1300,27 +1300,7 @@
               <w:rPr>
                 <w:lang w:val="en-US"/>
               </w:rPr>
-              <w:t>If relevant, list previously created dataverse</w:t>
-            </w:r>
-            <w:r>
-              <w:rPr>
-                <w:rFonts w:hint="eastAsia"/>
-                <w:lang w:val="en-US"/>
-              </w:rPr>
-              <w:t xml:space="preserve"> with depositors</w:t>
-            </w:r>
-            <w:r>
-              <w:rPr>
-                <w:lang w:val="en-US"/>
-              </w:rPr>
-              <w:t>’</w:t>
-            </w:r>
-            <w:r>
-              <w:rPr>
-                <w:rFonts w:hint="eastAsia"/>
-                <w:lang w:val="en-US"/>
-              </w:rPr>
-              <w:t xml:space="preserve"> dataset inside</w:t>
+              <w:t>If applicable, list any previously created dataverse that contains the depositors' dataset</w:t>
             </w:r>
             <w:r>
               <w:rPr>
@@ -1772,39 +1752,46 @@
               <w:rPr>
                 <w:lang w:val="en-US"/>
               </w:rPr>
-              <w:t>parent D</w:t>
+              <w:t xml:space="preserve">parent </w:t>
             </w:r>
             <w:r>
               <w:rPr>
                 <w:rFonts w:hint="eastAsia"/>
                 <w:lang w:val="en-US"/>
               </w:rPr>
-              <w:t xml:space="preserve">ataverse </w:t>
-            </w:r>
-            <w:r>
-              <w:rPr>
-                <w:lang w:val="en-US"/>
-              </w:rPr>
-              <w:t>collection</w:t>
+              <w:t>d</w:t>
             </w:r>
             <w:r>
               <w:rPr>
                 <w:rFonts w:hint="eastAsia"/>
                 <w:lang w:val="en-US"/>
               </w:rPr>
-              <w:t xml:space="preserve"> name:</w:t>
+              <w:t xml:space="preserve">ataverse </w:t>
             </w:r>
             <w:r>
               <w:rPr>
                 <w:lang w:val="en-US"/>
               </w:rPr>
-              <w:br/>
+              <w:t>collection</w:t>
             </w:r>
             <w:r>
               <w:rPr>
                 <w:rFonts w:hint="eastAsia"/>
                 <w:lang w:val="en-US"/>
               </w:rPr>
+              <w:t xml:space="preserve"> name:</w:t>
+            </w:r>
+            <w:r>
+              <w:rPr>
+                <w:lang w:val="en-US"/>
+              </w:rPr>
+              <w:br/>
+            </w:r>
+            <w:r>
+              <w:rPr>
+                <w:rFonts w:hint="eastAsia"/>
+                <w:lang w:val="en-US"/>
+              </w:rPr>
               <w:t xml:space="preserve">{{ </w:t>
             </w:r>
             <w:r>
@@ -1841,11 +1828,9 @@
               <w:t xml:space="preserve"> }}</w:t>
             </w:r>
           </w:p>
-          <w:p/>
-          <w:p>
-            <w:r>
-              <w:lastRenderedPageBreak/>
-              <w:t>List the path of the dataset in the Dataverse collection:</w:t>
+          <w:p>
+            <w:r>
+              <w:t>List the dataset (full) path in the Dataverse repository</w:t>
             </w:r>
             <w:r>
               <w:br/>
@@ -1890,7 +1875,6 @@
           </w:tcPr>
           <w:p>
             <w:r>
-              <w:lastRenderedPageBreak/>
               <w:t>Info</w:t>
             </w:r>
           </w:p>

</xml_diff>

<commit_message>
Fixed item 4.7 in high-level checklist - checking keywords
</commit_message>
<xml_diff>
--- a/res/template_high.docx
+++ b/res/template_high.docx
@@ -98,25 +98,55 @@
               <w:rPr>
                 <w:rFonts w:hint="eastAsia"/>
               </w:rPr>
-              <w:t xml:space="preserve">Ticket number: {{ </w:t>
-            </w:r>
-            <w:r>
-              <w:t>project_info</w:t>
-            </w:r>
+              <w:t xml:space="preserve">Ticket number: </w:t>
+            </w:r>
+            <w:proofErr w:type="gramStart"/>
             <w:r>
               <w:rPr>
                 <w:rFonts w:hint="eastAsia"/>
               </w:rPr>
+              <w:t xml:space="preserve">{{ </w:t>
+            </w:r>
+            <w:r>
+              <w:t>project</w:t>
+            </w:r>
+            <w:proofErr w:type="gramEnd"/>
+            <w:r>
+              <w:t>_</w:t>
+            </w:r>
+            <w:proofErr w:type="gramStart"/>
+            <w:r>
+              <w:t>info</w:t>
+            </w:r>
+            <w:r>
+              <w:rPr>
+                <w:rFonts w:hint="eastAsia"/>
+              </w:rPr>
               <w:t>.</w:t>
             </w:r>
             <w:r>
-              <w:t>ticket_number</w:t>
+              <w:t>ticket</w:t>
+            </w:r>
+            <w:proofErr w:type="gramEnd"/>
+            <w:r>
+              <w:t>_</w:t>
+            </w:r>
+            <w:proofErr w:type="gramStart"/>
+            <w:r>
+              <w:t>number</w:t>
             </w:r>
             <w:r>
               <w:rPr>
                 <w:rFonts w:hint="eastAsia"/>
               </w:rPr>
-              <w:t xml:space="preserve"> }}</w:t>
+              <w:t xml:space="preserve"> }</w:t>
+            </w:r>
+            <w:proofErr w:type="gramEnd"/>
+            <w:r>
+              <w:rPr>
+                <w:rFonts w:hint="eastAsia"/>
+              </w:rPr>
+              <w:t>}</w:t>
             </w:r>
           </w:p>
           <w:p>
@@ -139,16 +169,52 @@
               <w:rPr>
                 <w:rFonts w:hint="eastAsia"/>
               </w:rPr>
-              <w:t xml:space="preserve"> {{ </w:t>
-            </w:r>
-            <w:r>
-              <w:t>project_info</w:t>
-            </w:r>
+              <w:t xml:space="preserve"> </w:t>
+            </w:r>
+            <w:proofErr w:type="gramStart"/>
             <w:r>
               <w:rPr>
                 <w:rFonts w:hint="eastAsia"/>
               </w:rPr>
-              <w:t>.curator_name }}</w:t>
+              <w:t xml:space="preserve">{{ </w:t>
+            </w:r>
+            <w:r>
+              <w:t>project</w:t>
+            </w:r>
+            <w:proofErr w:type="gramEnd"/>
+            <w:r>
+              <w:t>_</w:t>
+            </w:r>
+            <w:proofErr w:type="gramStart"/>
+            <w:r>
+              <w:t>info</w:t>
+            </w:r>
+            <w:r>
+              <w:rPr>
+                <w:rFonts w:hint="eastAsia"/>
+              </w:rPr>
+              <w:t>.curator</w:t>
+            </w:r>
+            <w:proofErr w:type="gramEnd"/>
+            <w:r>
+              <w:rPr>
+                <w:rFonts w:hint="eastAsia"/>
+              </w:rPr>
+              <w:t>_</w:t>
+            </w:r>
+            <w:proofErr w:type="gramStart"/>
+            <w:r>
+              <w:rPr>
+                <w:rFonts w:hint="eastAsia"/>
+              </w:rPr>
+              <w:t>name }</w:t>
+            </w:r>
+            <w:proofErr w:type="gramEnd"/>
+            <w:r>
+              <w:rPr>
+                <w:rFonts w:hint="eastAsia"/>
+              </w:rPr>
+              <w:t>}</w:t>
             </w:r>
           </w:p>
           <w:p>
@@ -159,25 +225,55 @@
               <w:rPr>
                 <w:rFonts w:hint="eastAsia"/>
               </w:rPr>
-              <w:t xml:space="preserve">Curator email: {{ </w:t>
-            </w:r>
-            <w:r>
-              <w:t>project_info</w:t>
-            </w:r>
+              <w:t xml:space="preserve">Curator email: </w:t>
+            </w:r>
+            <w:proofErr w:type="gramStart"/>
             <w:r>
               <w:rPr>
                 <w:rFonts w:hint="eastAsia"/>
               </w:rPr>
+              <w:t xml:space="preserve">{{ </w:t>
+            </w:r>
+            <w:r>
+              <w:t>project</w:t>
+            </w:r>
+            <w:proofErr w:type="gramEnd"/>
+            <w:r>
+              <w:t>_</w:t>
+            </w:r>
+            <w:proofErr w:type="gramStart"/>
+            <w:r>
+              <w:t>info</w:t>
+            </w:r>
+            <w:r>
+              <w:rPr>
+                <w:rFonts w:hint="eastAsia"/>
+              </w:rPr>
               <w:t>.</w:t>
             </w:r>
             <w:r>
-              <w:t>curator_email</w:t>
+              <w:t>curator</w:t>
+            </w:r>
+            <w:proofErr w:type="gramEnd"/>
+            <w:r>
+              <w:t>_</w:t>
+            </w:r>
+            <w:proofErr w:type="gramStart"/>
+            <w:r>
+              <w:t>email</w:t>
             </w:r>
             <w:r>
               <w:rPr>
                 <w:rFonts w:hint="eastAsia"/>
               </w:rPr>
-              <w:t xml:space="preserve"> }}</w:t>
+              <w:t xml:space="preserve"> }</w:t>
+            </w:r>
+            <w:proofErr w:type="gramEnd"/>
+            <w:r>
+              <w:rPr>
+                <w:rFonts w:hint="eastAsia"/>
+              </w:rPr>
+              <w:t>}</w:t>
             </w:r>
           </w:p>
           <w:p>
@@ -188,8 +284,23 @@
               <w:rPr>
                 <w:rFonts w:hint="eastAsia"/>
               </w:rPr>
-              <w:t>Dataset title: {{ dataset.</w:t>
-            </w:r>
+              <w:t xml:space="preserve">Dataset title: </w:t>
+            </w:r>
+            <w:proofErr w:type="gramStart"/>
+            <w:r>
+              <w:rPr>
+                <w:rFonts w:hint="eastAsia"/>
+              </w:rPr>
+              <w:t>{{ dataset</w:t>
+            </w:r>
+            <w:proofErr w:type="gramEnd"/>
+            <w:r>
+              <w:rPr>
+                <w:rFonts w:hint="eastAsia"/>
+              </w:rPr>
+              <w:t>.</w:t>
+            </w:r>
+            <w:proofErr w:type="gramStart"/>
             <w:r>
               <w:t>DatasetTitle</w:t>
             </w:r>
@@ -197,7 +308,14 @@
               <w:rPr>
                 <w:rFonts w:hint="eastAsia"/>
               </w:rPr>
-              <w:t xml:space="preserve"> }}</w:t>
+              <w:t xml:space="preserve"> }</w:t>
+            </w:r>
+            <w:proofErr w:type="gramEnd"/>
+            <w:r>
+              <w:rPr>
+                <w:rFonts w:hint="eastAsia"/>
+              </w:rPr>
+              <w:t>}</w:t>
             </w:r>
           </w:p>
           <w:p>
@@ -217,8 +335,23 @@
               <w:rPr>
                 <w:rFonts w:hint="eastAsia"/>
               </w:rPr>
-              <w:t xml:space="preserve"> identifier: {{ dataset.</w:t>
-            </w:r>
+              <w:t xml:space="preserve"> identifier: </w:t>
+            </w:r>
+            <w:proofErr w:type="gramStart"/>
+            <w:r>
+              <w:rPr>
+                <w:rFonts w:hint="eastAsia"/>
+              </w:rPr>
+              <w:t>{{ dataset</w:t>
+            </w:r>
+            <w:proofErr w:type="gramEnd"/>
+            <w:r>
+              <w:rPr>
+                <w:rFonts w:hint="eastAsia"/>
+              </w:rPr>
+              <w:t>.</w:t>
+            </w:r>
+            <w:proofErr w:type="gramStart"/>
             <w:r>
               <w:t>DatasetPersistentId</w:t>
             </w:r>
@@ -226,7 +359,14 @@
               <w:rPr>
                 <w:rFonts w:hint="eastAsia"/>
               </w:rPr>
-              <w:t xml:space="preserve">  }}</w:t>
+              <w:t xml:space="preserve">  }</w:t>
+            </w:r>
+            <w:proofErr w:type="gramEnd"/>
+            <w:r>
+              <w:rPr>
+                <w:rFonts w:hint="eastAsia"/>
+              </w:rPr>
+              <w:t>}</w:t>
             </w:r>
           </w:p>
           <w:p>
@@ -237,7 +377,21 @@
               <w:rPr>
                 <w:rFonts w:hint="eastAsia"/>
               </w:rPr>
-              <w:t>Dataset ID (versioned): {{ dataset.ID  }}</w:t>
+              <w:t xml:space="preserve">Dataset ID (versioned): </w:t>
+            </w:r>
+            <w:proofErr w:type="gramStart"/>
+            <w:r>
+              <w:rPr>
+                <w:rFonts w:hint="eastAsia"/>
+              </w:rPr>
+              <w:t>{{ dataset.ID  }</w:t>
+            </w:r>
+            <w:proofErr w:type="gramEnd"/>
+            <w:r>
+              <w:rPr>
+                <w:rFonts w:hint="eastAsia"/>
+              </w:rPr>
+              <w:t>}</w:t>
             </w:r>
           </w:p>
           <w:p>
@@ -248,8 +402,23 @@
               <w:rPr>
                 <w:rFonts w:hint="eastAsia"/>
               </w:rPr>
-              <w:t>Dataset access URL: {{ dataset.</w:t>
-            </w:r>
+              <w:t xml:space="preserve">Dataset access URL: </w:t>
+            </w:r>
+            <w:proofErr w:type="gramStart"/>
+            <w:r>
+              <w:rPr>
+                <w:rFonts w:hint="eastAsia"/>
+              </w:rPr>
+              <w:t>{{ dataset</w:t>
+            </w:r>
+            <w:proofErr w:type="gramEnd"/>
+            <w:r>
+              <w:rPr>
+                <w:rFonts w:hint="eastAsia"/>
+              </w:rPr>
+              <w:t>.</w:t>
+            </w:r>
+            <w:proofErr w:type="gramStart"/>
             <w:r>
               <w:t>DatasetURL</w:t>
             </w:r>
@@ -257,7 +426,14 @@
               <w:rPr>
                 <w:rFonts w:hint="eastAsia"/>
               </w:rPr>
-              <w:t xml:space="preserve"> }}</w:t>
+              <w:t xml:space="preserve"> }</w:t>
+            </w:r>
+            <w:proofErr w:type="gramEnd"/>
+            <w:r>
+              <w:rPr>
+                <w:rFonts w:hint="eastAsia"/>
+              </w:rPr>
+              <w:t>}</w:t>
             </w:r>
           </w:p>
           <w:p>
@@ -277,7 +453,21 @@
               <w:rPr>
                 <w:rFonts w:hint="eastAsia"/>
               </w:rPr>
-              <w:t xml:space="preserve"> generated date: {{ timestamp }}</w:t>
+              <w:t xml:space="preserve"> generated date: </w:t>
+            </w:r>
+            <w:proofErr w:type="gramStart"/>
+            <w:r>
+              <w:rPr>
+                <w:rFonts w:hint="eastAsia"/>
+              </w:rPr>
+              <w:t>{{ timestamp</w:t>
+            </w:r>
+            <w:proofErr w:type="gramEnd"/>
+            <w:r>
+              <w:rPr>
+                <w:rFonts w:hint="eastAsia"/>
+              </w:rPr>
+              <w:t xml:space="preserve"> }}</w:t>
             </w:r>
           </w:p>
           <w:p>
@@ -1315,12 +1505,36 @@
               <w:br/>
             </w:r>
             <w:r>
-              <w:t xml:space="preserve">{% for item in template_dict.dv_record.comments %} </w:t>
-            </w:r>
-          </w:p>
-          <w:p>
-            <w:r>
-              <w:t>{% for author, dataverses in item.items() %} {{ author }}</w:t>
+              <w:t>{% for item in template_dict.dv_record.</w:t>
+            </w:r>
+            <w:proofErr w:type="gramStart"/>
+            <w:r>
+              <w:t>comments %}</w:t>
+            </w:r>
+            <w:proofErr w:type="gramEnd"/>
+            <w:r>
+              <w:t xml:space="preserve"> </w:t>
+            </w:r>
+          </w:p>
+          <w:p>
+            <w:r>
+              <w:t xml:space="preserve">{% for author, dataverses in </w:t>
+            </w:r>
+            <w:proofErr w:type="gramStart"/>
+            <w:r>
+              <w:t>item.items</w:t>
+            </w:r>
+            <w:proofErr w:type="gramEnd"/>
+            <w:r>
+              <w:t xml:space="preserve">() %} </w:t>
+            </w:r>
+            <w:proofErr w:type="gramStart"/>
+            <w:r>
+              <w:t>{{ author</w:t>
+            </w:r>
+            <w:proofErr w:type="gramEnd"/>
+            <w:r>
+              <w:t xml:space="preserve"> }}</w:t>
             </w:r>
             <w:r>
               <w:rPr>
@@ -1333,8 +1547,21 @@
             <w:r>
               <w:t xml:space="preserve">{% for dataverse in dataverses %} </w:t>
             </w:r>
-            <w:r>
-              <w:t>{{ loop.index }}.</w:t>
+            <w:proofErr w:type="gramStart"/>
+            <w:r>
+              <w:t>{{ loop</w:t>
+            </w:r>
+            <w:proofErr w:type="gramEnd"/>
+            <w:r>
+              <w:t>.</w:t>
+            </w:r>
+            <w:proofErr w:type="gramStart"/>
+            <w:r>
+              <w:t>index }</w:t>
+            </w:r>
+            <w:proofErr w:type="gramEnd"/>
+            <w:r>
+              <w:t>}.</w:t>
             </w:r>
             <w:r>
               <w:rPr>
@@ -1342,8 +1569,13 @@
               </w:rPr>
               <w:t xml:space="preserve"> </w:t>
             </w:r>
-            <w:r>
-              <w:t>{{ dataverse }}</w:t>
+            <w:proofErr w:type="gramStart"/>
+            <w:r>
+              <w:t>{{ dataverse</w:t>
+            </w:r>
+            <w:proofErr w:type="gramEnd"/>
+            <w:r>
+              <w:t xml:space="preserve"> }}</w:t>
             </w:r>
             <w:r>
               <w:br/>
@@ -1559,6 +1791,7 @@
               </w:rPr>
               <w:t>University of Toronto Dataverse</w:t>
             </w:r>
+            <w:proofErr w:type="gramStart"/>
             <w:r>
               <w:rPr>
                 <w:lang w:val="en-US"/>
@@ -1569,7 +1802,14 @@
               <w:rPr>
                 <w:lang w:val="en-US"/>
               </w:rPr>
-              <w:t xml:space="preserve"> %}X{% endif %}</w:t>
+              <w:t xml:space="preserve"> %}X{%</w:t>
+            </w:r>
+            <w:proofErr w:type="gramEnd"/>
+            <w:r>
+              <w:rPr>
+                <w:lang w:val="en-US"/>
+              </w:rPr>
+              <w:t xml:space="preserve"> endif %}</w:t>
             </w:r>
           </w:p>
         </w:tc>
@@ -1662,6 +1902,7 @@
               </w:rPr>
               <w:t>University of Toronto Dataverse</w:t>
             </w:r>
+            <w:proofErr w:type="gramStart"/>
             <w:r>
               <w:rPr>
                 <w:lang w:val="en-US"/>
@@ -1672,7 +1913,14 @@
               <w:rPr>
                 <w:lang w:val="en-US"/>
               </w:rPr>
-              <w:t xml:space="preserve"> %}X{% endif %}</w:t>
+              <w:t xml:space="preserve"> %}X{%</w:t>
+            </w:r>
+            <w:proofErr w:type="gramEnd"/>
+            <w:r>
+              <w:rPr>
+                <w:lang w:val="en-US"/>
+              </w:rPr>
+              <w:t xml:space="preserve"> endif %}</w:t>
             </w:r>
           </w:p>
         </w:tc>
@@ -1835,6 +2083,7 @@
             <w:r>
               <w:br/>
             </w:r>
+            <w:proofErr w:type="gramStart"/>
             <w:r>
               <w:rPr>
                 <w:lang w:val="en-US"/>
@@ -1848,8 +2097,23 @@
               <w:rPr>
                 <w:lang w:val="en-US"/>
               </w:rPr>
-              <w:t>ds_tree_info.path</w:t>
-            </w:r>
+              <w:t>ds</w:t>
+            </w:r>
+            <w:proofErr w:type="gramEnd"/>
+            <w:r>
+              <w:rPr>
+                <w:lang w:val="en-US"/>
+              </w:rPr>
+              <w:t>_tree_</w:t>
+            </w:r>
+            <w:proofErr w:type="gramStart"/>
+            <w:r>
+              <w:rPr>
+                <w:lang w:val="en-US"/>
+              </w:rPr>
+              <w:t>info.path</w:t>
+            </w:r>
+            <w:proofErr w:type="gramEnd"/>
             <w:r>
               <w:t>}}</w:t>
             </w:r>
@@ -2025,7 +2289,15 @@
             </w:r>
             <w:r>
               <w:lastRenderedPageBreak/>
-              <w:t>depositor that they actually require a dataverse (e.g., will there be future deposits?)</w:t>
+              <w:t xml:space="preserve">depositor that they </w:t>
+            </w:r>
+            <w:proofErr w:type="gramStart"/>
+            <w:r>
+              <w:t>actually require</w:t>
+            </w:r>
+            <w:proofErr w:type="gramEnd"/>
+            <w:r>
+              <w:t xml:space="preserve"> a dataverse (e.g., will there be future deposits?)</w:t>
             </w:r>
           </w:p>
         </w:tc>
@@ -2721,7 +2993,11 @@
               <w:t xml:space="preserve"> </w:t>
             </w:r>
             <w:r>
-              <w:t>|length &gt; 0</w:t>
+              <w:t xml:space="preserve">|length &gt; </w:t>
+            </w:r>
+            <w:proofErr w:type="gramStart"/>
+            <w:r>
+              <w:t>0</w:t>
             </w:r>
             <w:r>
               <w:t xml:space="preserve"> %}</w:t>
@@ -2730,8 +3006,23 @@
               <w:rPr>
                 <w:lang w:val="en-US"/>
               </w:rPr>
-              <w:t>{% for item in template_dict.file_open.comments %}</w:t>
-            </w:r>
+              <w:t>{%</w:t>
+            </w:r>
+            <w:proofErr w:type="gramEnd"/>
+            <w:r>
+              <w:rPr>
+                <w:lang w:val="en-US"/>
+              </w:rPr>
+              <w:t xml:space="preserve"> for item in template_dict.file_open.</w:t>
+            </w:r>
+            <w:proofErr w:type="gramStart"/>
+            <w:r>
+              <w:rPr>
+                <w:lang w:val="en-US"/>
+              </w:rPr>
+              <w:t>comments %}</w:t>
+            </w:r>
+            <w:proofErr w:type="gramEnd"/>
           </w:p>
           <w:p>
             <w:pPr>
@@ -2748,8 +3039,30 @@
               <w:rPr>
                 <w:lang w:val="en-US"/>
               </w:rPr>
-              <w:t>{{ item.file_name }}{% endfor %}</w:t>
-            </w:r>
+              <w:t>{{ item.file_</w:t>
+            </w:r>
+            <w:proofErr w:type="gramStart"/>
+            <w:r>
+              <w:rPr>
+                <w:lang w:val="en-US"/>
+              </w:rPr>
+              <w:t>name }}{%</w:t>
+            </w:r>
+            <w:proofErr w:type="gramEnd"/>
+            <w:r>
+              <w:rPr>
+                <w:lang w:val="en-US"/>
+              </w:rPr>
+              <w:t xml:space="preserve"> </w:t>
+            </w:r>
+            <w:proofErr w:type="gramStart"/>
+            <w:r>
+              <w:rPr>
+                <w:lang w:val="en-US"/>
+              </w:rPr>
+              <w:t>endfor %}</w:t>
+            </w:r>
+            <w:proofErr w:type="gramEnd"/>
           </w:p>
           <w:p>
             <w:pPr>
@@ -2758,7 +3071,23 @@
               </w:rPr>
             </w:pPr>
             <w:r>
-              <w:t>{% else %}(NONE){% endif %}</w:t>
+              <w:t xml:space="preserve">{% else </w:t>
+            </w:r>
+            <w:proofErr w:type="gramStart"/>
+            <w:r>
+              <w:t>%}(</w:t>
+            </w:r>
+            <w:proofErr w:type="gramEnd"/>
+            <w:r>
+              <w:t>NONE</w:t>
+            </w:r>
+            <w:proofErr w:type="gramStart"/>
+            <w:r>
+              <w:t>){</w:t>
+            </w:r>
+            <w:proofErr w:type="gramEnd"/>
+            <w:r>
+              <w:t>% endif %}</w:t>
             </w:r>
           </w:p>
           <w:p>
@@ -2789,7 +3118,11 @@
               <w:t>template_dict.file_open.not_checked</w:t>
             </w:r>
             <w:r>
-              <w:t xml:space="preserve"> |length &gt; 0</w:t>
+              <w:t xml:space="preserve"> |length &gt; </w:t>
+            </w:r>
+            <w:proofErr w:type="gramStart"/>
+            <w:r>
+              <w:t>0</w:t>
             </w:r>
             <w:r>
               <w:t xml:space="preserve"> %}</w:t>
@@ -2798,8 +3131,23 @@
               <w:rPr>
                 <w:lang w:val="en-US"/>
               </w:rPr>
-              <w:t>{% for item in template_dict.file_open.not_checked %}</w:t>
-            </w:r>
+              <w:t>{%</w:t>
+            </w:r>
+            <w:proofErr w:type="gramEnd"/>
+            <w:r>
+              <w:rPr>
+                <w:lang w:val="en-US"/>
+              </w:rPr>
+              <w:t xml:space="preserve"> for item in template_dict.file_open.not_</w:t>
+            </w:r>
+            <w:proofErr w:type="gramStart"/>
+            <w:r>
+              <w:rPr>
+                <w:lang w:val="en-US"/>
+              </w:rPr>
+              <w:t>checked %}</w:t>
+            </w:r>
+            <w:proofErr w:type="gramEnd"/>
           </w:p>
           <w:p>
             <w:pPr>
@@ -2816,12 +3164,50 @@
               <w:rPr>
                 <w:lang w:val="en-US"/>
               </w:rPr>
-              <w:t>{{ item.file_name }}{% endfor %}</w:t>
-            </w:r>
-          </w:p>
-          <w:p>
-            <w:r>
-              <w:t>{% else %}(NONE){% endif %}</w:t>
+              <w:t>{{ item.file_</w:t>
+            </w:r>
+            <w:proofErr w:type="gramStart"/>
+            <w:r>
+              <w:rPr>
+                <w:lang w:val="en-US"/>
+              </w:rPr>
+              <w:t>name }}{%</w:t>
+            </w:r>
+            <w:proofErr w:type="gramEnd"/>
+            <w:r>
+              <w:rPr>
+                <w:lang w:val="en-US"/>
+              </w:rPr>
+              <w:t xml:space="preserve"> </w:t>
+            </w:r>
+            <w:proofErr w:type="gramStart"/>
+            <w:r>
+              <w:rPr>
+                <w:lang w:val="en-US"/>
+              </w:rPr>
+              <w:t>endfor %}</w:t>
+            </w:r>
+            <w:proofErr w:type="gramEnd"/>
+          </w:p>
+          <w:p>
+            <w:r>
+              <w:t xml:space="preserve">{% else </w:t>
+            </w:r>
+            <w:proofErr w:type="gramStart"/>
+            <w:r>
+              <w:t>%}(</w:t>
+            </w:r>
+            <w:proofErr w:type="gramEnd"/>
+            <w:r>
+              <w:t>NONE</w:t>
+            </w:r>
+            <w:proofErr w:type="gramStart"/>
+            <w:r>
+              <w:t>){</w:t>
+            </w:r>
+            <w:proofErr w:type="gramEnd"/>
+            <w:r>
+              <w:t>% endif %}</w:t>
             </w:r>
           </w:p>
         </w:tc>
@@ -2940,8 +3326,18 @@
                 <w:bCs/>
                 <w:lang w:val="en-US"/>
               </w:rPr>
-              <w:t>&lt;&gt;:"/\|?*</w:t>
-            </w:r>
+              <w:t>&lt;&gt;:"/\</w:t>
+            </w:r>
+            <w:proofErr w:type="gramStart"/>
+            <w:r>
+              <w:rPr>
+                <w:b/>
+                <w:bCs/>
+                <w:lang w:val="en-US"/>
+              </w:rPr>
+              <w:t>|?*</w:t>
+            </w:r>
+            <w:proofErr w:type="gramEnd"/>
             <w:r>
               <w:rPr>
                 <w:b/>
@@ -3159,12 +3555,50 @@
               <w:rPr>
                 <w:lang w:val="en-US"/>
               </w:rPr>
-              <w:t>{{ item.file_name }}{% endfor %}</w:t>
-            </w:r>
-          </w:p>
-          <w:p>
-            <w:r>
-              <w:t>{% else %}(NONE){% endif %}</w:t>
+              <w:t>{{ item.file_</w:t>
+            </w:r>
+            <w:proofErr w:type="gramStart"/>
+            <w:r>
+              <w:rPr>
+                <w:lang w:val="en-US"/>
+              </w:rPr>
+              <w:t>name }}{%</w:t>
+            </w:r>
+            <w:proofErr w:type="gramEnd"/>
+            <w:r>
+              <w:rPr>
+                <w:lang w:val="en-US"/>
+              </w:rPr>
+              <w:t xml:space="preserve"> </w:t>
+            </w:r>
+            <w:proofErr w:type="gramStart"/>
+            <w:r>
+              <w:rPr>
+                <w:lang w:val="en-US"/>
+              </w:rPr>
+              <w:t>endfor %}</w:t>
+            </w:r>
+            <w:proofErr w:type="gramEnd"/>
+          </w:p>
+          <w:p>
+            <w:r>
+              <w:t xml:space="preserve">{% else </w:t>
+            </w:r>
+            <w:proofErr w:type="gramStart"/>
+            <w:r>
+              <w:t>%}(</w:t>
+            </w:r>
+            <w:proofErr w:type="gramEnd"/>
+            <w:r>
+              <w:t>NONE</w:t>
+            </w:r>
+            <w:proofErr w:type="gramStart"/>
+            <w:r>
+              <w:t>){</w:t>
+            </w:r>
+            <w:proofErr w:type="gramEnd"/>
+            <w:r>
+              <w:t>% endif %}</w:t>
             </w:r>
           </w:p>
         </w:tc>
@@ -3501,7 +3935,11 @@
               <w:t xml:space="preserve"> </w:t>
             </w:r>
             <w:r>
-              <w:t>|length &gt; 0</w:t>
+              <w:t xml:space="preserve">|length &gt; </w:t>
+            </w:r>
+            <w:proofErr w:type="gramStart"/>
+            <w:r>
+              <w:t>0</w:t>
             </w:r>
             <w:r>
               <w:t xml:space="preserve"> %}</w:t>
@@ -3510,8 +3948,23 @@
               <w:rPr>
                 <w:lang w:val="en-US"/>
               </w:rPr>
-              <w:t>{% for item in template_dict.file_ext.comments %}</w:t>
-            </w:r>
+              <w:t>{%</w:t>
+            </w:r>
+            <w:proofErr w:type="gramEnd"/>
+            <w:r>
+              <w:rPr>
+                <w:lang w:val="en-US"/>
+              </w:rPr>
+              <w:t xml:space="preserve"> for item in template_dict.file_ext.</w:t>
+            </w:r>
+            <w:proofErr w:type="gramStart"/>
+            <w:r>
+              <w:rPr>
+                <w:lang w:val="en-US"/>
+              </w:rPr>
+              <w:t>comments %}</w:t>
+            </w:r>
+            <w:proofErr w:type="gramEnd"/>
           </w:p>
           <w:p>
             <w:pPr>
@@ -3526,15 +3979,53 @@
               <w:rPr>
                 <w:lang w:val="en-US"/>
               </w:rPr>
-              <w:t>{{ item.file_name }}{% endfor %}</w:t>
-            </w:r>
+              <w:t>{{ item.file_</w:t>
+            </w:r>
+            <w:proofErr w:type="gramStart"/>
+            <w:r>
+              <w:rPr>
+                <w:lang w:val="en-US"/>
+              </w:rPr>
+              <w:t>name }}{%</w:t>
+            </w:r>
+            <w:proofErr w:type="gramEnd"/>
+            <w:r>
+              <w:rPr>
+                <w:lang w:val="en-US"/>
+              </w:rPr>
+              <w:t xml:space="preserve"> </w:t>
+            </w:r>
+            <w:proofErr w:type="gramStart"/>
+            <w:r>
+              <w:rPr>
+                <w:lang w:val="en-US"/>
+              </w:rPr>
+              <w:t>endfor %}</w:t>
+            </w:r>
+            <w:proofErr w:type="gramEnd"/>
           </w:p>
           <w:p>
             <w:pPr>
               <w:spacing w:line="256" w:lineRule="auto"/>
             </w:pPr>
             <w:r>
-              <w:t>{% else %}(NONE){% endif %}</w:t>
+              <w:t xml:space="preserve">{% else </w:t>
+            </w:r>
+            <w:proofErr w:type="gramStart"/>
+            <w:r>
+              <w:t>%}(</w:t>
+            </w:r>
+            <w:proofErr w:type="gramEnd"/>
+            <w:r>
+              <w:t>NONE</w:t>
+            </w:r>
+            <w:proofErr w:type="gramStart"/>
+            <w:r>
+              <w:t>){</w:t>
+            </w:r>
+            <w:proofErr w:type="gramEnd"/>
+            <w:r>
+              <w:t>% endif %}</w:t>
             </w:r>
           </w:p>
         </w:tc>
@@ -3909,7 +4400,14 @@
               <w:rPr>
                 <w:lang w:val="en-US"/>
               </w:rPr>
-              <w:t>{{ item.file_name }}</w:t>
+              <w:t>{{ item.file_</w:t>
+            </w:r>
+            <w:proofErr w:type="gramStart"/>
+            <w:r>
+              <w:rPr>
+                <w:lang w:val="en-US"/>
+              </w:rPr>
+              <w:t>name }}</w:t>
             </w:r>
             <w:r>
               <w:rPr>
@@ -3923,18 +4421,44 @@
                 <w:rFonts w:hint="eastAsia"/>
                 <w:lang w:val="en-US"/>
               </w:rPr>
-              <w:t xml:space="preserve">% </w:t>
-            </w:r>
-            <w:r>
-              <w:rPr>
+              <w:t>%</w:t>
+            </w:r>
+            <w:proofErr w:type="gramEnd"/>
+            <w:r>
+              <w:rPr>
+                <w:rFonts w:hint="eastAsia"/>
                 <w:lang w:val="en-US"/>
               </w:rPr>
+              <w:t xml:space="preserve"> </w:t>
+            </w:r>
+            <w:proofErr w:type="gramStart"/>
+            <w:r>
+              <w:rPr>
+                <w:lang w:val="en-US"/>
+              </w:rPr>
               <w:t>endfor %}</w:t>
             </w:r>
-          </w:p>
-          <w:p>
-            <w:r>
-              <w:t>{% else %}(NONE){% endif %}</w:t>
+            <w:proofErr w:type="gramEnd"/>
+          </w:p>
+          <w:p>
+            <w:r>
+              <w:t xml:space="preserve">{% else </w:t>
+            </w:r>
+            <w:proofErr w:type="gramStart"/>
+            <w:r>
+              <w:t>%}(</w:t>
+            </w:r>
+            <w:proofErr w:type="gramEnd"/>
+            <w:r>
+              <w:t>NONE</w:t>
+            </w:r>
+            <w:proofErr w:type="gramStart"/>
+            <w:r>
+              <w:t>){</w:t>
+            </w:r>
+            <w:proofErr w:type="gramEnd"/>
+            <w:r>
+              <w:t>% endif %}</w:t>
             </w:r>
           </w:p>
         </w:tc>
@@ -4799,7 +5323,11 @@
               <w:t xml:space="preserve"> </w:t>
             </w:r>
             <w:r>
-              <w:t>|length &gt; 0</w:t>
+              <w:t xml:space="preserve">|length &gt; </w:t>
+            </w:r>
+            <w:proofErr w:type="gramStart"/>
+            <w:r>
+              <w:t>0</w:t>
             </w:r>
             <w:r>
               <w:t xml:space="preserve"> %}</w:t>
@@ -4808,8 +5336,65 @@
               <w:rPr>
                 <w:lang w:val="en-US"/>
               </w:rPr>
-              <w:t>{% for item in template_dict.readme_file.comments %}{{ loop.index }}. {{ item.file_name }}{% endfor %}</w:t>
-            </w:r>
+              <w:t>{%</w:t>
+            </w:r>
+            <w:proofErr w:type="gramEnd"/>
+            <w:r>
+              <w:rPr>
+                <w:lang w:val="en-US"/>
+              </w:rPr>
+              <w:t xml:space="preserve"> for item in template_dict.readme_file.</w:t>
+            </w:r>
+            <w:proofErr w:type="gramStart"/>
+            <w:r>
+              <w:rPr>
+                <w:lang w:val="en-US"/>
+              </w:rPr>
+              <w:t>comments %}{{</w:t>
+            </w:r>
+            <w:proofErr w:type="gramEnd"/>
+            <w:r>
+              <w:rPr>
+                <w:lang w:val="en-US"/>
+              </w:rPr>
+              <w:t xml:space="preserve"> loop.</w:t>
+            </w:r>
+            <w:proofErr w:type="gramStart"/>
+            <w:r>
+              <w:rPr>
+                <w:lang w:val="en-US"/>
+              </w:rPr>
+              <w:t>index }}.</w:t>
+            </w:r>
+            <w:proofErr w:type="gramEnd"/>
+            <w:r>
+              <w:rPr>
+                <w:lang w:val="en-US"/>
+              </w:rPr>
+              <w:t xml:space="preserve"> {{ item.file_</w:t>
+            </w:r>
+            <w:proofErr w:type="gramStart"/>
+            <w:r>
+              <w:rPr>
+                <w:lang w:val="en-US"/>
+              </w:rPr>
+              <w:t>name }}{%</w:t>
+            </w:r>
+            <w:proofErr w:type="gramEnd"/>
+            <w:r>
+              <w:rPr>
+                <w:lang w:val="en-US"/>
+              </w:rPr>
+              <w:t xml:space="preserve"> </w:t>
+            </w:r>
+            <w:proofErr w:type="gramStart"/>
+            <w:r>
+              <w:rPr>
+                <w:lang w:val="en-US"/>
+              </w:rPr>
+              <w:t>endfor %}</w:t>
+            </w:r>
+            <w:proofErr w:type="gramEnd"/>
           </w:p>
           <w:p>
             <w:pPr>
@@ -4818,7 +5403,23 @@
               </w:rPr>
             </w:pPr>
             <w:r>
-              <w:t>{% else %}(NONE){% endif %}</w:t>
+              <w:t xml:space="preserve">{% else </w:t>
+            </w:r>
+            <w:proofErr w:type="gramStart"/>
+            <w:r>
+              <w:t>%}(</w:t>
+            </w:r>
+            <w:proofErr w:type="gramEnd"/>
+            <w:r>
+              <w:t>NONE</w:t>
+            </w:r>
+            <w:proofErr w:type="gramStart"/>
+            <w:r>
+              <w:t>){</w:t>
+            </w:r>
+            <w:proofErr w:type="gramEnd"/>
+            <w:r>
+              <w:t>% endif %}</w:t>
             </w:r>
           </w:p>
           <w:p/>
@@ -7171,7 +7772,11 @@
             </w:r>
             <w:r>
               <w:lastRenderedPageBreak/>
-              <w:t>|length &gt; 0</w:t>
+              <w:t xml:space="preserve">|length &gt; </w:t>
+            </w:r>
+            <w:proofErr w:type="gramStart"/>
+            <w:r>
+              <w:t>0</w:t>
             </w:r>
             <w:r>
               <w:t xml:space="preserve"> %}</w:t>
@@ -7180,8 +7785,23 @@
               <w:rPr>
                 <w:lang w:val="en-US"/>
               </w:rPr>
-              <w:t>{% for item in template_dict.typo.comments %}</w:t>
-            </w:r>
+              <w:t>{%</w:t>
+            </w:r>
+            <w:proofErr w:type="gramEnd"/>
+            <w:r>
+              <w:rPr>
+                <w:lang w:val="en-US"/>
+              </w:rPr>
+              <w:t xml:space="preserve"> for item in template_dict.typo.</w:t>
+            </w:r>
+            <w:proofErr w:type="gramStart"/>
+            <w:r>
+              <w:rPr>
+                <w:lang w:val="en-US"/>
+              </w:rPr>
+              <w:t>comments %}</w:t>
+            </w:r>
+            <w:proofErr w:type="gramEnd"/>
           </w:p>
           <w:p>
             <w:pPr>
@@ -7191,12 +7811,28 @@
                 <w:numId w:val="46"/>
               </w:numPr>
             </w:pPr>
+            <w:proofErr w:type="gramStart"/>
             <w:r>
               <w:rPr>
                 <w:lang w:val="en-US"/>
               </w:rPr>
-              <w:t>{{ item }}{% endfor %}</w:t>
-            </w:r>
+              <w:t>{{ item }}{%</w:t>
+            </w:r>
+            <w:proofErr w:type="gramEnd"/>
+            <w:r>
+              <w:rPr>
+                <w:lang w:val="en-US"/>
+              </w:rPr>
+              <w:t xml:space="preserve"> </w:t>
+            </w:r>
+            <w:proofErr w:type="gramStart"/>
+            <w:r>
+              <w:rPr>
+                <w:lang w:val="en-US"/>
+              </w:rPr>
+              <w:t>endfor %}</w:t>
+            </w:r>
+            <w:proofErr w:type="gramEnd"/>
           </w:p>
           <w:p>
             <w:pPr>
@@ -7205,8 +7841,17 @@
               </w:rPr>
             </w:pPr>
             <w:r>
-              <w:t>{% else %}(NONE</w:t>
-            </w:r>
+              <w:t xml:space="preserve">{% else </w:t>
+            </w:r>
+            <w:proofErr w:type="gramStart"/>
+            <w:r>
+              <w:t>%}(</w:t>
+            </w:r>
+            <w:proofErr w:type="gramEnd"/>
+            <w:r>
+              <w:t>NONE</w:t>
+            </w:r>
+            <w:proofErr w:type="gramStart"/>
             <w:r>
               <w:rPr>
                 <w:rFonts w:hint="eastAsia"/>
@@ -7214,7 +7859,11 @@
               <w:t>)</w:t>
             </w:r>
             <w:r>
-              <w:t>{% endif %}</w:t>
+              <w:t>{</w:t>
+            </w:r>
+            <w:proofErr w:type="gramEnd"/>
+            <w:r>
+              <w:t>% endif %}</w:t>
             </w:r>
           </w:p>
         </w:tc>
@@ -7682,7 +8331,23 @@
           </w:tcPr>
           <w:p>
             <w:r>
-              <w:t>{% if not template_dict.none_author_affiliation %}X{% endif %}</w:t>
+              <w:t>{% if not template_</w:t>
+            </w:r>
+            <w:proofErr w:type="gramStart"/>
+            <w:r>
+              <w:t>dict.none</w:t>
+            </w:r>
+            <w:proofErr w:type="gramEnd"/>
+            <w:r>
+              <w:t>_author_affiliation %}</w:t>
+            </w:r>
+            <w:proofErr w:type="gramStart"/>
+            <w:r>
+              <w:t>X{</w:t>
+            </w:r>
+            <w:proofErr w:type="gramEnd"/>
+            <w:r>
+              <w:t>% endif %}</w:t>
             </w:r>
           </w:p>
         </w:tc>
@@ -7705,7 +8370,23 @@
           </w:tcPr>
           <w:p>
             <w:r>
-              <w:t>{% if template_dict.none_author_affiliation %}X{% endif %}</w:t>
+              <w:t>{% if template_</w:t>
+            </w:r>
+            <w:proofErr w:type="gramStart"/>
+            <w:r>
+              <w:t>dict.none</w:t>
+            </w:r>
+            <w:proofErr w:type="gramEnd"/>
+            <w:r>
+              <w:t>_author_affiliation %}</w:t>
+            </w:r>
+            <w:proofErr w:type="gramStart"/>
+            <w:r>
+              <w:t>X{</w:t>
+            </w:r>
+            <w:proofErr w:type="gramEnd"/>
+            <w:r>
+              <w:t>% endif %}</w:t>
             </w:r>
           </w:p>
         </w:tc>
@@ -8826,102 +9507,285 @@
             </w:tcMar>
             <w:hideMark/>
           </w:tcPr>
-          <w:p/>
-        </w:tc>
-        <w:tc>
-          <w:tcPr>
-            <w:tcW w:w="0" w:type="auto"/>
-            <w:tcBorders>
-              <w:top w:val="single" w:sz="8" w:space="0" w:color="000000"/>
-              <w:left w:val="single" w:sz="8" w:space="0" w:color="000000"/>
-              <w:bottom w:val="single" w:sz="8" w:space="0" w:color="000000"/>
-              <w:right w:val="single" w:sz="8" w:space="0" w:color="000000"/>
-            </w:tcBorders>
-            <w:tcMar>
-              <w:top w:w="100" w:type="dxa"/>
-              <w:left w:w="100" w:type="dxa"/>
-              <w:bottom w:w="100" w:type="dxa"/>
-              <w:right w:w="100" w:type="dxa"/>
-            </w:tcMar>
-            <w:hideMark/>
-          </w:tcPr>
-          <w:p/>
-        </w:tc>
-        <w:tc>
-          <w:tcPr>
-            <w:tcW w:w="0" w:type="auto"/>
-            <w:tcBorders>
-              <w:top w:val="single" w:sz="8" w:space="0" w:color="000000"/>
-              <w:left w:val="single" w:sz="8" w:space="0" w:color="000000"/>
-              <w:bottom w:val="single" w:sz="8" w:space="0" w:color="000000"/>
-              <w:right w:val="single" w:sz="8" w:space="0" w:color="000000"/>
-            </w:tcBorders>
-            <w:tcMar>
-              <w:top w:w="100" w:type="dxa"/>
-              <w:left w:w="100" w:type="dxa"/>
-              <w:bottom w:w="100" w:type="dxa"/>
-              <w:right w:w="100" w:type="dxa"/>
-            </w:tcMar>
-            <w:hideMark/>
-          </w:tcPr>
-          <w:p/>
-        </w:tc>
-        <w:tc>
-          <w:tcPr>
-            <w:tcW w:w="0" w:type="auto"/>
-            <w:tcBorders>
-              <w:top w:val="single" w:sz="8" w:space="0" w:color="000000"/>
-              <w:left w:val="single" w:sz="8" w:space="0" w:color="000000"/>
-              <w:bottom w:val="single" w:sz="8" w:space="0" w:color="000000"/>
-              <w:right w:val="single" w:sz="8" w:space="0" w:color="000000"/>
-            </w:tcBorders>
-            <w:tcMar>
-              <w:top w:w="100" w:type="dxa"/>
-              <w:left w:w="100" w:type="dxa"/>
-              <w:bottom w:w="100" w:type="dxa"/>
-              <w:right w:w="100" w:type="dxa"/>
-            </w:tcMar>
-            <w:hideMark/>
-          </w:tcPr>
-          <w:p/>
-        </w:tc>
-        <w:tc>
-          <w:tcPr>
-            <w:tcW w:w="0" w:type="auto"/>
-            <w:tcBorders>
-              <w:top w:val="single" w:sz="8" w:space="0" w:color="000000"/>
-              <w:left w:val="single" w:sz="8" w:space="0" w:color="000000"/>
-              <w:bottom w:val="single" w:sz="8" w:space="0" w:color="000000"/>
-              <w:right w:val="single" w:sz="8" w:space="0" w:color="000000"/>
-            </w:tcBorders>
-            <w:tcMar>
-              <w:top w:w="100" w:type="dxa"/>
-              <w:left w:w="100" w:type="dxa"/>
-              <w:bottom w:w="100" w:type="dxa"/>
-              <w:right w:w="100" w:type="dxa"/>
-            </w:tcMar>
-            <w:hideMark/>
-          </w:tcPr>
-          <w:p/>
-        </w:tc>
-        <w:tc>
-          <w:tcPr>
-            <w:tcW w:w="0" w:type="auto"/>
-            <w:tcBorders>
-              <w:top w:val="single" w:sz="8" w:space="0" w:color="000000"/>
-              <w:left w:val="single" w:sz="8" w:space="0" w:color="000000"/>
-              <w:bottom w:val="single" w:sz="8" w:space="0" w:color="000000"/>
-              <w:right w:val="single" w:sz="8" w:space="0" w:color="000000"/>
-            </w:tcBorders>
-            <w:tcMar>
-              <w:top w:w="100" w:type="dxa"/>
-              <w:left w:w="100" w:type="dxa"/>
-              <w:bottom w:w="100" w:type="dxa"/>
-              <w:right w:w="100" w:type="dxa"/>
-            </w:tcMar>
-            <w:hideMark/>
-          </w:tcPr>
-          <w:p/>
+          <w:p>
+            <w:r>
+              <w:rPr>
+                <w:lang w:val="en-US"/>
+              </w:rPr>
+              <w:lastRenderedPageBreak/>
+              <w:t>{% if template_dict.</w:t>
+            </w:r>
+            <w:r>
+              <w:rPr>
+                <w:rFonts w:hint="eastAsia"/>
+                <w:lang w:val="en-US"/>
+              </w:rPr>
+              <w:t>keywords</w:t>
+            </w:r>
+            <w:r>
+              <w:rPr>
+                <w:lang w:val="en-US"/>
+              </w:rPr>
+              <w:t>|length &gt; 0 %}X{% endif %}</w:t>
+            </w:r>
+          </w:p>
+        </w:tc>
+        <w:tc>
+          <w:tcPr>
+            <w:tcW w:w="0" w:type="auto"/>
+            <w:tcBorders>
+              <w:top w:val="single" w:sz="8" w:space="0" w:color="000000"/>
+              <w:left w:val="single" w:sz="8" w:space="0" w:color="000000"/>
+              <w:bottom w:val="single" w:sz="8" w:space="0" w:color="000000"/>
+              <w:right w:val="single" w:sz="8" w:space="0" w:color="000000"/>
+            </w:tcBorders>
+            <w:tcMar>
+              <w:top w:w="100" w:type="dxa"/>
+              <w:left w:w="100" w:type="dxa"/>
+              <w:bottom w:w="100" w:type="dxa"/>
+              <w:right w:w="100" w:type="dxa"/>
+            </w:tcMar>
+            <w:hideMark/>
+          </w:tcPr>
+          <w:p/>
+        </w:tc>
+        <w:tc>
+          <w:tcPr>
+            <w:tcW w:w="0" w:type="auto"/>
+            <w:tcBorders>
+              <w:top w:val="single" w:sz="8" w:space="0" w:color="000000"/>
+              <w:left w:val="single" w:sz="8" w:space="0" w:color="000000"/>
+              <w:bottom w:val="single" w:sz="8" w:space="0" w:color="000000"/>
+              <w:right w:val="single" w:sz="8" w:space="0" w:color="000000"/>
+            </w:tcBorders>
+            <w:tcMar>
+              <w:top w:w="100" w:type="dxa"/>
+              <w:left w:w="100" w:type="dxa"/>
+              <w:bottom w:w="100" w:type="dxa"/>
+              <w:right w:w="100" w:type="dxa"/>
+            </w:tcMar>
+            <w:hideMark/>
+          </w:tcPr>
+          <w:p>
+            <w:pPr>
+              <w:rPr>
+                <w:lang w:val="en-US"/>
+              </w:rPr>
+            </w:pPr>
+            <w:r>
+              <w:rPr>
+                <w:lang w:val="en-US"/>
+              </w:rPr>
+              <w:t>{% if template_dict.</w:t>
+            </w:r>
+            <w:r>
+              <w:rPr>
+                <w:rFonts w:hint="eastAsia"/>
+                <w:lang w:val="en-US"/>
+              </w:rPr>
+              <w:t>keywords</w:t>
+            </w:r>
+            <w:r>
+              <w:rPr>
+                <w:lang w:val="en-US"/>
+              </w:rPr>
+              <w:t>|length == 0 %}X{% endif %}</w:t>
+            </w:r>
+          </w:p>
+        </w:tc>
+        <w:tc>
+          <w:tcPr>
+            <w:tcW w:w="0" w:type="auto"/>
+            <w:tcBorders>
+              <w:top w:val="single" w:sz="8" w:space="0" w:color="000000"/>
+              <w:left w:val="single" w:sz="8" w:space="0" w:color="000000"/>
+              <w:bottom w:val="single" w:sz="8" w:space="0" w:color="000000"/>
+              <w:right w:val="single" w:sz="8" w:space="0" w:color="000000"/>
+            </w:tcBorders>
+            <w:tcMar>
+              <w:top w:w="100" w:type="dxa"/>
+              <w:left w:w="100" w:type="dxa"/>
+              <w:bottom w:w="100" w:type="dxa"/>
+              <w:right w:w="100" w:type="dxa"/>
+            </w:tcMar>
+            <w:hideMark/>
+          </w:tcPr>
+          <w:p/>
+        </w:tc>
+        <w:tc>
+          <w:tcPr>
+            <w:tcW w:w="0" w:type="auto"/>
+            <w:tcBorders>
+              <w:top w:val="single" w:sz="8" w:space="0" w:color="000000"/>
+              <w:left w:val="single" w:sz="8" w:space="0" w:color="000000"/>
+              <w:bottom w:val="single" w:sz="8" w:space="0" w:color="000000"/>
+              <w:right w:val="single" w:sz="8" w:space="0" w:color="000000"/>
+            </w:tcBorders>
+            <w:tcMar>
+              <w:top w:w="100" w:type="dxa"/>
+              <w:left w:w="100" w:type="dxa"/>
+              <w:bottom w:w="100" w:type="dxa"/>
+              <w:right w:w="100" w:type="dxa"/>
+            </w:tcMar>
+            <w:hideMark/>
+          </w:tcPr>
+          <w:p/>
+        </w:tc>
+        <w:tc>
+          <w:tcPr>
+            <w:tcW w:w="0" w:type="auto"/>
+            <w:tcBorders>
+              <w:top w:val="single" w:sz="8" w:space="0" w:color="000000"/>
+              <w:left w:val="single" w:sz="8" w:space="0" w:color="000000"/>
+              <w:bottom w:val="single" w:sz="8" w:space="0" w:color="000000"/>
+              <w:right w:val="single" w:sz="8" w:space="0" w:color="000000"/>
+            </w:tcBorders>
+            <w:tcMar>
+              <w:top w:w="100" w:type="dxa"/>
+              <w:left w:w="100" w:type="dxa"/>
+              <w:bottom w:w="100" w:type="dxa"/>
+              <w:right w:w="100" w:type="dxa"/>
+            </w:tcMar>
+            <w:hideMark/>
+          </w:tcPr>
+          <w:p>
+            <w:r>
+              <w:rPr>
+                <w:rFonts w:hint="eastAsia"/>
+              </w:rPr>
+              <w:t>List the keyword(s) in the metadata, if any:</w:t>
+            </w:r>
+            <w:r>
+              <w:br/>
+            </w:r>
+            <w:r>
+              <w:t xml:space="preserve">{% if </w:t>
+            </w:r>
+            <w:r>
+              <w:rPr>
+                <w:lang w:val="en-US"/>
+              </w:rPr>
+              <w:t>template_</w:t>
+            </w:r>
+            <w:proofErr w:type="gramStart"/>
+            <w:r>
+              <w:rPr>
+                <w:lang w:val="en-US"/>
+              </w:rPr>
+              <w:t>dict.</w:t>
+            </w:r>
+            <w:r>
+              <w:t>keywords</w:t>
+            </w:r>
+            <w:proofErr w:type="gramEnd"/>
+            <w:r>
+              <w:t>|length &gt; 0</w:t>
+            </w:r>
+            <w:r>
+              <w:t xml:space="preserve"> </w:t>
+            </w:r>
+            <w:proofErr w:type="gramStart"/>
+            <w:r>
+              <w:t>%}</w:t>
+            </w:r>
+            <w:r>
+              <w:rPr>
+                <w:lang w:val="en-US"/>
+              </w:rPr>
+              <w:t>{</w:t>
+            </w:r>
+            <w:proofErr w:type="gramEnd"/>
+            <w:r>
+              <w:rPr>
+                <w:lang w:val="en-US"/>
+              </w:rPr>
+              <w:t>% for item in template_</w:t>
+            </w:r>
+            <w:proofErr w:type="gramStart"/>
+            <w:r>
+              <w:rPr>
+                <w:lang w:val="en-US"/>
+              </w:rPr>
+              <w:t>dict.</w:t>
+            </w:r>
+            <w:r>
+              <w:rPr>
+                <w:rFonts w:hint="eastAsia"/>
+                <w:lang w:val="en-US"/>
+              </w:rPr>
+              <w:t>keywords</w:t>
+            </w:r>
+            <w:proofErr w:type="gramEnd"/>
+            <w:r>
+              <w:rPr>
+                <w:lang w:val="en-US"/>
+              </w:rPr>
+              <w:t xml:space="preserve"> %}</w:t>
+            </w:r>
+          </w:p>
+          <w:p>
+            <w:pPr>
+              <w:pStyle w:val="ListParagraph"/>
+              <w:numPr>
+                <w:ilvl w:val="0"/>
+                <w:numId w:val="51"/>
+              </w:numPr>
+            </w:pPr>
+            <w:proofErr w:type="gramStart"/>
+            <w:r>
+              <w:rPr>
+                <w:lang w:val="en-US"/>
+              </w:rPr>
+              <w:t>{{ item }}{%</w:t>
+            </w:r>
+            <w:proofErr w:type="gramEnd"/>
+            <w:r>
+              <w:rPr>
+                <w:lang w:val="en-US"/>
+              </w:rPr>
+              <w:t xml:space="preserve"> </w:t>
+            </w:r>
+            <w:proofErr w:type="gramStart"/>
+            <w:r>
+              <w:rPr>
+                <w:lang w:val="en-US"/>
+              </w:rPr>
+              <w:t>endfor %}</w:t>
+            </w:r>
+            <w:proofErr w:type="gramEnd"/>
+          </w:p>
+          <w:p>
+            <w:pPr>
+              <w:rPr>
+                <w:rFonts w:hint="eastAsia"/>
+              </w:rPr>
+            </w:pPr>
+            <w:r>
+              <w:t xml:space="preserve">{% else </w:t>
+            </w:r>
+            <w:proofErr w:type="gramStart"/>
+            <w:r>
+              <w:t>%}(</w:t>
+            </w:r>
+            <w:proofErr w:type="gramEnd"/>
+            <w:r>
+              <w:t>NONE</w:t>
+            </w:r>
+            <w:proofErr w:type="gramStart"/>
+            <w:r>
+              <w:rPr>
+                <w:rFonts w:hint="eastAsia"/>
+              </w:rPr>
+              <w:t>)</w:t>
+            </w:r>
+            <w:r>
+              <w:t>{</w:t>
+            </w:r>
+            <w:proofErr w:type="gramEnd"/>
+            <w:r>
+              <w:t>% endif %}</w:t>
+            </w:r>
+          </w:p>
         </w:tc>
         <w:tc>
           <w:tcPr>
@@ -10817,7 +11681,19 @@
               <w:br/>
             </w:r>
             <w:r>
-              <w:t>{% if template_dict.restricted_files.comment</w:t>
+              <w:t>{% if template_</w:t>
+            </w:r>
+            <w:proofErr w:type="gramStart"/>
+            <w:r>
+              <w:t>dict.restricted</w:t>
+            </w:r>
+            <w:proofErr w:type="gramEnd"/>
+            <w:r>
+              <w:t>_</w:t>
+            </w:r>
+            <w:proofErr w:type="gramStart"/>
+            <w:r>
+              <w:t>files.comment</w:t>
             </w:r>
             <w:r>
               <w:rPr>
@@ -10825,11 +11701,36 @@
               </w:rPr>
               <w:t>s</w:t>
             </w:r>
+            <w:proofErr w:type="gramEnd"/>
             <w:r>
               <w:t>|length &gt; 0</w:t>
             </w:r>
             <w:r>
-              <w:t xml:space="preserve"> %}{% for item in template_dict.restricted_files.comments %} </w:t>
+              <w:t xml:space="preserve"> </w:t>
+            </w:r>
+            <w:proofErr w:type="gramStart"/>
+            <w:r>
+              <w:t>%}{</w:t>
+            </w:r>
+            <w:proofErr w:type="gramEnd"/>
+            <w:r>
+              <w:t>% for item in template_</w:t>
+            </w:r>
+            <w:proofErr w:type="gramStart"/>
+            <w:r>
+              <w:t>dict.restricted</w:t>
+            </w:r>
+            <w:proofErr w:type="gramEnd"/>
+            <w:r>
+              <w:t>_</w:t>
+            </w:r>
+            <w:proofErr w:type="gramStart"/>
+            <w:r>
+              <w:t>files.comments</w:t>
+            </w:r>
+            <w:proofErr w:type="gramEnd"/>
+            <w:r>
+              <w:t xml:space="preserve"> %} </w:t>
             </w:r>
           </w:p>
           <w:p>
@@ -10840,13 +11741,42 @@
                 <w:numId w:val="47"/>
               </w:numPr>
             </w:pPr>
-            <w:r>
-              <w:t>{{ item.file_name }} {% endfor %}</w:t>
-            </w:r>
-          </w:p>
-          <w:p>
-            <w:r>
-              <w:t>{% else %}(NONE){% endif %}</w:t>
+            <w:proofErr w:type="gramStart"/>
+            <w:r>
+              <w:t>{{ item</w:t>
+            </w:r>
+            <w:proofErr w:type="gramEnd"/>
+            <w:r>
+              <w:t>.file_</w:t>
+            </w:r>
+            <w:proofErr w:type="gramStart"/>
+            <w:r>
+              <w:t>name }</w:t>
+            </w:r>
+            <w:proofErr w:type="gramEnd"/>
+            <w:r>
+              <w:t>} {% endfor %}</w:t>
+            </w:r>
+          </w:p>
+          <w:p>
+            <w:r>
+              <w:t xml:space="preserve">{% else </w:t>
+            </w:r>
+            <w:proofErr w:type="gramStart"/>
+            <w:r>
+              <w:t>%}(</w:t>
+            </w:r>
+            <w:proofErr w:type="gramEnd"/>
+            <w:r>
+              <w:t>NONE</w:t>
+            </w:r>
+            <w:proofErr w:type="gramStart"/>
+            <w:r>
+              <w:t>){</w:t>
+            </w:r>
+            <w:proofErr w:type="gramEnd"/>
+            <w:r>
+              <w:t>% endif %}</w:t>
             </w:r>
           </w:p>
           <w:p>
@@ -10875,7 +11805,71 @@
             </w:pPr>
             <w:r>
               <w:lastRenderedPageBreak/>
-              <w:t>{% if template_dict.terms_license.licenseName is not none %}{{ template_dict.terms_license.licenseName }}{% else %}(NONE){% endif %}</w:t>
+              <w:t>{% if template_</w:t>
+            </w:r>
+            <w:proofErr w:type="gramStart"/>
+            <w:r>
+              <w:t>dict.terms</w:t>
+            </w:r>
+            <w:proofErr w:type="gramEnd"/>
+            <w:r>
+              <w:t>_</w:t>
+            </w:r>
+            <w:proofErr w:type="gramStart"/>
+            <w:r>
+              <w:t>license.licenseName</w:t>
+            </w:r>
+            <w:proofErr w:type="gramEnd"/>
+            <w:r>
+              <w:t xml:space="preserve"> is not none </w:t>
+            </w:r>
+            <w:proofErr w:type="gramStart"/>
+            <w:r>
+              <w:t>%}{{ template</w:t>
+            </w:r>
+            <w:proofErr w:type="gramEnd"/>
+            <w:r>
+              <w:t>_</w:t>
+            </w:r>
+            <w:proofErr w:type="gramStart"/>
+            <w:r>
+              <w:t>dict.terms</w:t>
+            </w:r>
+            <w:proofErr w:type="gramEnd"/>
+            <w:r>
+              <w:t>_</w:t>
+            </w:r>
+            <w:proofErr w:type="gramStart"/>
+            <w:r>
+              <w:t>license.licenseName</w:t>
+            </w:r>
+            <w:proofErr w:type="gramEnd"/>
+            <w:r>
+              <w:t xml:space="preserve"> </w:t>
+            </w:r>
+            <w:proofErr w:type="gramStart"/>
+            <w:r>
+              <w:t>}}{</w:t>
+            </w:r>
+            <w:proofErr w:type="gramEnd"/>
+            <w:r>
+              <w:t xml:space="preserve">% else </w:t>
+            </w:r>
+            <w:proofErr w:type="gramStart"/>
+            <w:r>
+              <w:t>%}(</w:t>
+            </w:r>
+            <w:proofErr w:type="gramEnd"/>
+            <w:r>
+              <w:t>NONE</w:t>
+            </w:r>
+            <w:proofErr w:type="gramStart"/>
+            <w:r>
+              <w:t>){</w:t>
+            </w:r>
+            <w:proofErr w:type="gramEnd"/>
+            <w:r>
+              <w:t>% endif %}</w:t>
             </w:r>
           </w:p>
           <w:p>
@@ -10916,19 +11910,77 @@
                     </w:rPr>
                   </w:pPr>
                   <w:r>
-                    <w:t>{% if template_dict.terms_license.</w:t>
+                    <w:t>{% if template_</w:t>
+                  </w:r>
+                  <w:proofErr w:type="gramStart"/>
+                  <w:r>
+                    <w:t>dict.terms</w:t>
+                  </w:r>
+                  <w:proofErr w:type="gramEnd"/>
+                  <w:r>
+                    <w:t>_</w:t>
+                  </w:r>
+                  <w:proofErr w:type="gramStart"/>
+                  <w:r>
+                    <w:t>license.</w:t>
                   </w:r>
                   <w:r>
                     <w:t>termsOfUse</w:t>
                   </w:r>
+                  <w:proofErr w:type="gramEnd"/>
                   <w:r>
-                    <w:t xml:space="preserve"> is not none %}{{ template_dict.terms_license.</w:t>
+                    <w:t xml:space="preserve"> is not none </w:t>
+                  </w:r>
+                  <w:proofErr w:type="gramStart"/>
+                  <w:r>
+                    <w:t>%}{{ template</w:t>
+                  </w:r>
+                  <w:proofErr w:type="gramEnd"/>
+                  <w:r>
+                    <w:t>_</w:t>
+                  </w:r>
+                  <w:proofErr w:type="gramStart"/>
+                  <w:r>
+                    <w:t>dict.terms</w:t>
+                  </w:r>
+                  <w:proofErr w:type="gramEnd"/>
+                  <w:r>
+                    <w:t>_</w:t>
+                  </w:r>
+                  <w:proofErr w:type="gramStart"/>
+                  <w:r>
+                    <w:t>license.</w:t>
                   </w:r>
                   <w:r>
                     <w:t>termsOfUse</w:t>
                   </w:r>
+                  <w:proofErr w:type="gramEnd"/>
                   <w:r>
-                    <w:t xml:space="preserve"> }}{% else %}(NONE){% endif %}</w:t>
+                    <w:t xml:space="preserve"> </w:t>
+                  </w:r>
+                  <w:proofErr w:type="gramStart"/>
+                  <w:r>
+                    <w:t>}}{</w:t>
+                  </w:r>
+                  <w:proofErr w:type="gramEnd"/>
+                  <w:r>
+                    <w:t xml:space="preserve">% else </w:t>
+                  </w:r>
+                  <w:proofErr w:type="gramStart"/>
+                  <w:r>
+                    <w:t>%}(</w:t>
+                  </w:r>
+                  <w:proofErr w:type="gramEnd"/>
+                  <w:r>
+                    <w:t>NONE</w:t>
+                  </w:r>
+                  <w:proofErr w:type="gramStart"/>
+                  <w:r>
+                    <w:t>){</w:t>
+                  </w:r>
+                  <w:proofErr w:type="gramEnd"/>
+                  <w:r>
+                    <w:t>% endif %}</w:t>
                   </w:r>
                 </w:p>
               </w:tc>
@@ -11430,19 +12482,77 @@
                     </w:rPr>
                   </w:pPr>
                   <w:r>
-                    <w:t>{% if template_dict.terms_license.</w:t>
+                    <w:t>{% if template_</w:t>
+                  </w:r>
+                  <w:proofErr w:type="gramStart"/>
+                  <w:r>
+                    <w:t>dict.terms</w:t>
+                  </w:r>
+                  <w:proofErr w:type="gramEnd"/>
+                  <w:r>
+                    <w:t>_</w:t>
+                  </w:r>
+                  <w:proofErr w:type="gramStart"/>
+                  <w:r>
+                    <w:t>license.</w:t>
                   </w:r>
                   <w:r>
                     <w:t>termsOfAccess</w:t>
                   </w:r>
+                  <w:proofErr w:type="gramEnd"/>
                   <w:r>
-                    <w:t xml:space="preserve"> is not none %}{{ template_dict.terms_license.</w:t>
+                    <w:t xml:space="preserve"> is not none </w:t>
+                  </w:r>
+                  <w:proofErr w:type="gramStart"/>
+                  <w:r>
+                    <w:t>%}{{ template</w:t>
+                  </w:r>
+                  <w:proofErr w:type="gramEnd"/>
+                  <w:r>
+                    <w:t>_</w:t>
+                  </w:r>
+                  <w:proofErr w:type="gramStart"/>
+                  <w:r>
+                    <w:t>dict.terms</w:t>
+                  </w:r>
+                  <w:proofErr w:type="gramEnd"/>
+                  <w:r>
+                    <w:t>_</w:t>
+                  </w:r>
+                  <w:proofErr w:type="gramStart"/>
+                  <w:r>
+                    <w:t>license.</w:t>
                   </w:r>
                   <w:r>
                     <w:t>termsOfAccess</w:t>
                   </w:r>
+                  <w:proofErr w:type="gramEnd"/>
                   <w:r>
-                    <w:t xml:space="preserve"> }}{% else %}(NONE){% endif %}</w:t>
+                    <w:t xml:space="preserve"> </w:t>
+                  </w:r>
+                  <w:proofErr w:type="gramStart"/>
+                  <w:r>
+                    <w:t>}}{</w:t>
+                  </w:r>
+                  <w:proofErr w:type="gramEnd"/>
+                  <w:r>
+                    <w:t xml:space="preserve">% else </w:t>
+                  </w:r>
+                  <w:proofErr w:type="gramStart"/>
+                  <w:r>
+                    <w:t>%}(</w:t>
+                  </w:r>
+                  <w:proofErr w:type="gramEnd"/>
+                  <w:r>
+                    <w:t>NONE</w:t>
+                  </w:r>
+                  <w:proofErr w:type="gramStart"/>
+                  <w:r>
+                    <w:t>){</w:t>
+                  </w:r>
+                  <w:proofErr w:type="gramEnd"/>
+                  <w:r>
+                    <w:t>% endif %}</w:t>
                   </w:r>
                 </w:p>
               </w:tc>
@@ -17810,6 +18920,95 @@
     </w:lvl>
   </w:abstractNum>
   <w:abstractNum w:abstractNumId="48" w15:restartNumberingAfterBreak="0">
+    <w:nsid w:val="73D87B47"/>
+    <w:multiLevelType w:val="hybridMultilevel"/>
+    <w:tmpl w:val="4C4C890E"/>
+    <w:lvl w:ilvl="0" w:tplc="FFFFFFFF">
+      <w:start w:val="1"/>
+      <w:numFmt w:val="decimal"/>
+      <w:lvlText w:val="%1."/>
+      <w:lvlJc w:val="left"/>
+      <w:pPr>
+        <w:ind w:left="720" w:hanging="360"/>
+      </w:pPr>
+      <w:rPr>
+        <w:rFonts w:hint="default"/>
+      </w:rPr>
+    </w:lvl>
+    <w:lvl w:ilvl="1" w:tplc="FFFFFFFF" w:tentative="1">
+      <w:start w:val="1"/>
+      <w:numFmt w:val="lowerLetter"/>
+      <w:lvlText w:val="%2."/>
+      <w:lvlJc w:val="left"/>
+      <w:pPr>
+        <w:ind w:left="1440" w:hanging="360"/>
+      </w:pPr>
+    </w:lvl>
+    <w:lvl w:ilvl="2" w:tplc="FFFFFFFF" w:tentative="1">
+      <w:start w:val="1"/>
+      <w:numFmt w:val="lowerRoman"/>
+      <w:lvlText w:val="%3."/>
+      <w:lvlJc w:val="right"/>
+      <w:pPr>
+        <w:ind w:left="2160" w:hanging="180"/>
+      </w:pPr>
+    </w:lvl>
+    <w:lvl w:ilvl="3" w:tplc="FFFFFFFF" w:tentative="1">
+      <w:start w:val="1"/>
+      <w:numFmt w:val="decimal"/>
+      <w:lvlText w:val="%4."/>
+      <w:lvlJc w:val="left"/>
+      <w:pPr>
+        <w:ind w:left="2880" w:hanging="360"/>
+      </w:pPr>
+    </w:lvl>
+    <w:lvl w:ilvl="4" w:tplc="FFFFFFFF" w:tentative="1">
+      <w:start w:val="1"/>
+      <w:numFmt w:val="lowerLetter"/>
+      <w:lvlText w:val="%5."/>
+      <w:lvlJc w:val="left"/>
+      <w:pPr>
+        <w:ind w:left="3600" w:hanging="360"/>
+      </w:pPr>
+    </w:lvl>
+    <w:lvl w:ilvl="5" w:tplc="FFFFFFFF" w:tentative="1">
+      <w:start w:val="1"/>
+      <w:numFmt w:val="lowerRoman"/>
+      <w:lvlText w:val="%6."/>
+      <w:lvlJc w:val="right"/>
+      <w:pPr>
+        <w:ind w:left="4320" w:hanging="180"/>
+      </w:pPr>
+    </w:lvl>
+    <w:lvl w:ilvl="6" w:tplc="FFFFFFFF" w:tentative="1">
+      <w:start w:val="1"/>
+      <w:numFmt w:val="decimal"/>
+      <w:lvlText w:val="%7."/>
+      <w:lvlJc w:val="left"/>
+      <w:pPr>
+        <w:ind w:left="5040" w:hanging="360"/>
+      </w:pPr>
+    </w:lvl>
+    <w:lvl w:ilvl="7" w:tplc="FFFFFFFF" w:tentative="1">
+      <w:start w:val="1"/>
+      <w:numFmt w:val="lowerLetter"/>
+      <w:lvlText w:val="%8."/>
+      <w:lvlJc w:val="left"/>
+      <w:pPr>
+        <w:ind w:left="5760" w:hanging="360"/>
+      </w:pPr>
+    </w:lvl>
+    <w:lvl w:ilvl="8" w:tplc="FFFFFFFF" w:tentative="1">
+      <w:start w:val="1"/>
+      <w:numFmt w:val="lowerRoman"/>
+      <w:lvlText w:val="%9."/>
+      <w:lvlJc w:val="right"/>
+      <w:pPr>
+        <w:ind w:left="6480" w:hanging="180"/>
+      </w:pPr>
+    </w:lvl>
+  </w:abstractNum>
+  <w:abstractNum w:abstractNumId="49" w15:restartNumberingAfterBreak="0">
     <w:nsid w:val="7919052C"/>
     <w:multiLevelType w:val="hybridMultilevel"/>
     <w:tmpl w:val="CA523B24"/>
@@ -17898,7 +19097,7 @@
       </w:pPr>
     </w:lvl>
   </w:abstractNum>
-  <w:abstractNum w:abstractNumId="49" w15:restartNumberingAfterBreak="0">
+  <w:abstractNum w:abstractNumId="50" w15:restartNumberingAfterBreak="0">
     <w:nsid w:val="7CE22D75"/>
     <w:multiLevelType w:val="multilevel"/>
     <w:tmpl w:val="1F045AB8"/>
@@ -18045,7 +19244,7 @@
     <w:abstractNumId w:val="27"/>
   </w:num>
   <w:num w:numId="12" w16cid:durableId="1649240003">
-    <w:abstractNumId w:val="49"/>
+    <w:abstractNumId w:val="50"/>
   </w:num>
   <w:num w:numId="13" w16cid:durableId="1981767433">
     <w:abstractNumId w:val="45"/>
@@ -18144,7 +19343,7 @@
     <w:abstractNumId w:val="4"/>
   </w:num>
   <w:num w:numId="45" w16cid:durableId="176846594">
-    <w:abstractNumId w:val="48"/>
+    <w:abstractNumId w:val="49"/>
   </w:num>
   <w:num w:numId="46" w16cid:durableId="1202403600">
     <w:abstractNumId w:val="20"/>
@@ -18187,6 +19386,9 @@
   </w:num>
   <w:num w:numId="50" w16cid:durableId="806165786">
     <w:abstractNumId w:val="24"/>
+  </w:num>
+  <w:num w:numId="51" w16cid:durableId="791243524">
+    <w:abstractNumId w:val="48"/>
   </w:num>
   <w:numIdMacAtCleanup w:val="44"/>
 </w:numbering>
@@ -18592,7 +19794,7 @@
   <w:style w:type="paragraph" w:default="1" w:styleId="Normal">
     <w:name w:val="Normal"/>
     <w:qFormat/>
-    <w:rsid w:val="00F77164"/>
+    <w:rsid w:val="00947F09"/>
     <w:rPr>
       <w:lang w:val="en-CA"/>
     </w:rPr>

</xml_diff>

<commit_message>
Fixed item 3.2 item question
</commit_message>
<xml_diff>
--- a/res/template_high.docx
+++ b/res/template_high.docx
@@ -98,55 +98,25 @@
               <w:rPr>
                 <w:rFonts w:hint="eastAsia"/>
               </w:rPr>
-              <w:t xml:space="preserve">Ticket number: </w:t>
-            </w:r>
-            <w:proofErr w:type="gramStart"/>
+              <w:t xml:space="preserve">Ticket number: {{ </w:t>
+            </w:r>
+            <w:r>
+              <w:t>project_info</w:t>
+            </w:r>
             <w:r>
               <w:rPr>
                 <w:rFonts w:hint="eastAsia"/>
               </w:rPr>
-              <w:t xml:space="preserve">{{ </w:t>
-            </w:r>
-            <w:r>
-              <w:t>project</w:t>
-            </w:r>
-            <w:proofErr w:type="gramEnd"/>
-            <w:r>
-              <w:t>_</w:t>
-            </w:r>
-            <w:proofErr w:type="gramStart"/>
-            <w:r>
-              <w:t>info</w:t>
+              <w:t>.</w:t>
+            </w:r>
+            <w:r>
+              <w:t>ticket_number</w:t>
             </w:r>
             <w:r>
               <w:rPr>
                 <w:rFonts w:hint="eastAsia"/>
               </w:rPr>
-              <w:t>.</w:t>
-            </w:r>
-            <w:r>
-              <w:t>ticket</w:t>
-            </w:r>
-            <w:proofErr w:type="gramEnd"/>
-            <w:r>
-              <w:t>_</w:t>
-            </w:r>
-            <w:proofErr w:type="gramStart"/>
-            <w:r>
-              <w:t>number</w:t>
-            </w:r>
-            <w:r>
-              <w:rPr>
-                <w:rFonts w:hint="eastAsia"/>
-              </w:rPr>
-              <w:t xml:space="preserve"> }</w:t>
-            </w:r>
-            <w:proofErr w:type="gramEnd"/>
-            <w:r>
-              <w:rPr>
-                <w:rFonts w:hint="eastAsia"/>
-              </w:rPr>
-              <w:t>}</w:t>
+              <w:t xml:space="preserve"> }}</w:t>
             </w:r>
           </w:p>
           <w:p>
@@ -169,52 +139,16 @@
               <w:rPr>
                 <w:rFonts w:hint="eastAsia"/>
               </w:rPr>
-              <w:t xml:space="preserve"> </w:t>
-            </w:r>
-            <w:proofErr w:type="gramStart"/>
+              <w:t xml:space="preserve"> {{ </w:t>
+            </w:r>
+            <w:r>
+              <w:t>project_info</w:t>
+            </w:r>
             <w:r>
               <w:rPr>
                 <w:rFonts w:hint="eastAsia"/>
               </w:rPr>
-              <w:t xml:space="preserve">{{ </w:t>
-            </w:r>
-            <w:r>
-              <w:t>project</w:t>
-            </w:r>
-            <w:proofErr w:type="gramEnd"/>
-            <w:r>
-              <w:t>_</w:t>
-            </w:r>
-            <w:proofErr w:type="gramStart"/>
-            <w:r>
-              <w:t>info</w:t>
-            </w:r>
-            <w:r>
-              <w:rPr>
-                <w:rFonts w:hint="eastAsia"/>
-              </w:rPr>
-              <w:t>.curator</w:t>
-            </w:r>
-            <w:proofErr w:type="gramEnd"/>
-            <w:r>
-              <w:rPr>
-                <w:rFonts w:hint="eastAsia"/>
-              </w:rPr>
-              <w:t>_</w:t>
-            </w:r>
-            <w:proofErr w:type="gramStart"/>
-            <w:r>
-              <w:rPr>
-                <w:rFonts w:hint="eastAsia"/>
-              </w:rPr>
-              <w:t>name }</w:t>
-            </w:r>
-            <w:proofErr w:type="gramEnd"/>
-            <w:r>
-              <w:rPr>
-                <w:rFonts w:hint="eastAsia"/>
-              </w:rPr>
-              <w:t>}</w:t>
+              <w:t>.curator_name }}</w:t>
             </w:r>
           </w:p>
           <w:p>
@@ -225,55 +159,25 @@
               <w:rPr>
                 <w:rFonts w:hint="eastAsia"/>
               </w:rPr>
-              <w:t xml:space="preserve">Curator email: </w:t>
-            </w:r>
-            <w:proofErr w:type="gramStart"/>
+              <w:t xml:space="preserve">Curator email: {{ </w:t>
+            </w:r>
+            <w:r>
+              <w:t>project_info</w:t>
+            </w:r>
             <w:r>
               <w:rPr>
                 <w:rFonts w:hint="eastAsia"/>
               </w:rPr>
-              <w:t xml:space="preserve">{{ </w:t>
-            </w:r>
-            <w:r>
-              <w:t>project</w:t>
-            </w:r>
-            <w:proofErr w:type="gramEnd"/>
-            <w:r>
-              <w:t>_</w:t>
-            </w:r>
-            <w:proofErr w:type="gramStart"/>
-            <w:r>
-              <w:t>info</w:t>
+              <w:t>.</w:t>
+            </w:r>
+            <w:r>
+              <w:t>curator_email</w:t>
             </w:r>
             <w:r>
               <w:rPr>
                 <w:rFonts w:hint="eastAsia"/>
               </w:rPr>
-              <w:t>.</w:t>
-            </w:r>
-            <w:r>
-              <w:t>curator</w:t>
-            </w:r>
-            <w:proofErr w:type="gramEnd"/>
-            <w:r>
-              <w:t>_</w:t>
-            </w:r>
-            <w:proofErr w:type="gramStart"/>
-            <w:r>
-              <w:t>email</w:t>
-            </w:r>
-            <w:r>
-              <w:rPr>
-                <w:rFonts w:hint="eastAsia"/>
-              </w:rPr>
-              <w:t xml:space="preserve"> }</w:t>
-            </w:r>
-            <w:proofErr w:type="gramEnd"/>
-            <w:r>
-              <w:rPr>
-                <w:rFonts w:hint="eastAsia"/>
-              </w:rPr>
-              <w:t>}</w:t>
+              <w:t xml:space="preserve"> }}</w:t>
             </w:r>
           </w:p>
           <w:p>
@@ -284,38 +188,16 @@
               <w:rPr>
                 <w:rFonts w:hint="eastAsia"/>
               </w:rPr>
-              <w:t xml:space="preserve">Dataset title: </w:t>
-            </w:r>
-            <w:proofErr w:type="gramStart"/>
+              <w:t>Dataset title: {{ dataset.</w:t>
+            </w:r>
+            <w:r>
+              <w:t>DatasetTitle</w:t>
+            </w:r>
             <w:r>
               <w:rPr>
                 <w:rFonts w:hint="eastAsia"/>
               </w:rPr>
-              <w:t>{{ dataset</w:t>
-            </w:r>
-            <w:proofErr w:type="gramEnd"/>
-            <w:r>
-              <w:rPr>
-                <w:rFonts w:hint="eastAsia"/>
-              </w:rPr>
-              <w:t>.</w:t>
-            </w:r>
-            <w:proofErr w:type="gramStart"/>
-            <w:r>
-              <w:t>DatasetTitle</w:t>
-            </w:r>
-            <w:r>
-              <w:rPr>
-                <w:rFonts w:hint="eastAsia"/>
-              </w:rPr>
-              <w:t xml:space="preserve"> }</w:t>
-            </w:r>
-            <w:proofErr w:type="gramEnd"/>
-            <w:r>
-              <w:rPr>
-                <w:rFonts w:hint="eastAsia"/>
-              </w:rPr>
-              <w:t>}</w:t>
+              <w:t xml:space="preserve"> }}</w:t>
             </w:r>
           </w:p>
           <w:p>
@@ -335,38 +217,16 @@
               <w:rPr>
                 <w:rFonts w:hint="eastAsia"/>
               </w:rPr>
-              <w:t xml:space="preserve"> identifier: </w:t>
-            </w:r>
-            <w:proofErr w:type="gramStart"/>
+              <w:t xml:space="preserve"> identifier: {{ dataset.</w:t>
+            </w:r>
+            <w:r>
+              <w:t>DatasetPersistentId</w:t>
+            </w:r>
             <w:r>
               <w:rPr>
                 <w:rFonts w:hint="eastAsia"/>
               </w:rPr>
-              <w:t>{{ dataset</w:t>
-            </w:r>
-            <w:proofErr w:type="gramEnd"/>
-            <w:r>
-              <w:rPr>
-                <w:rFonts w:hint="eastAsia"/>
-              </w:rPr>
-              <w:t>.</w:t>
-            </w:r>
-            <w:proofErr w:type="gramStart"/>
-            <w:r>
-              <w:t>DatasetPersistentId</w:t>
-            </w:r>
-            <w:r>
-              <w:rPr>
-                <w:rFonts w:hint="eastAsia"/>
-              </w:rPr>
-              <w:t xml:space="preserve">  }</w:t>
-            </w:r>
-            <w:proofErr w:type="gramEnd"/>
-            <w:r>
-              <w:rPr>
-                <w:rFonts w:hint="eastAsia"/>
-              </w:rPr>
-              <w:t>}</w:t>
+              <w:t xml:space="preserve">  }}</w:t>
             </w:r>
           </w:p>
           <w:p>
@@ -377,21 +237,7 @@
               <w:rPr>
                 <w:rFonts w:hint="eastAsia"/>
               </w:rPr>
-              <w:t xml:space="preserve">Dataset ID (versioned): </w:t>
-            </w:r>
-            <w:proofErr w:type="gramStart"/>
-            <w:r>
-              <w:rPr>
-                <w:rFonts w:hint="eastAsia"/>
-              </w:rPr>
-              <w:t>{{ dataset.ID  }</w:t>
-            </w:r>
-            <w:proofErr w:type="gramEnd"/>
-            <w:r>
-              <w:rPr>
-                <w:rFonts w:hint="eastAsia"/>
-              </w:rPr>
-              <w:t>}</w:t>
+              <w:t>Dataset ID (versioned): {{ dataset.ID  }}</w:t>
             </w:r>
           </w:p>
           <w:p>
@@ -402,38 +248,16 @@
               <w:rPr>
                 <w:rFonts w:hint="eastAsia"/>
               </w:rPr>
-              <w:t xml:space="preserve">Dataset access URL: </w:t>
-            </w:r>
-            <w:proofErr w:type="gramStart"/>
+              <w:t>Dataset access URL: {{ dataset.</w:t>
+            </w:r>
+            <w:r>
+              <w:t>DatasetURL</w:t>
+            </w:r>
             <w:r>
               <w:rPr>
                 <w:rFonts w:hint="eastAsia"/>
               </w:rPr>
-              <w:t>{{ dataset</w:t>
-            </w:r>
-            <w:proofErr w:type="gramEnd"/>
-            <w:r>
-              <w:rPr>
-                <w:rFonts w:hint="eastAsia"/>
-              </w:rPr>
-              <w:t>.</w:t>
-            </w:r>
-            <w:proofErr w:type="gramStart"/>
-            <w:r>
-              <w:t>DatasetURL</w:t>
-            </w:r>
-            <w:r>
-              <w:rPr>
-                <w:rFonts w:hint="eastAsia"/>
-              </w:rPr>
-              <w:t xml:space="preserve"> }</w:t>
-            </w:r>
-            <w:proofErr w:type="gramEnd"/>
-            <w:r>
-              <w:rPr>
-                <w:rFonts w:hint="eastAsia"/>
-              </w:rPr>
-              <w:t>}</w:t>
+              <w:t xml:space="preserve"> }}</w:t>
             </w:r>
           </w:p>
           <w:p>
@@ -453,21 +277,7 @@
               <w:rPr>
                 <w:rFonts w:hint="eastAsia"/>
               </w:rPr>
-              <w:t xml:space="preserve"> generated date: </w:t>
-            </w:r>
-            <w:proofErr w:type="gramStart"/>
-            <w:r>
-              <w:rPr>
-                <w:rFonts w:hint="eastAsia"/>
-              </w:rPr>
-              <w:t>{{ timestamp</w:t>
-            </w:r>
-            <w:proofErr w:type="gramEnd"/>
-            <w:r>
-              <w:rPr>
-                <w:rFonts w:hint="eastAsia"/>
-              </w:rPr>
-              <w:t xml:space="preserve"> }}</w:t>
+              <w:t xml:space="preserve"> generated date: {{ timestamp }}</w:t>
             </w:r>
           </w:p>
           <w:p>
@@ -1505,77 +1315,35 @@
               <w:br/>
             </w:r>
             <w:r>
-              <w:t>{% for item in template_dict.dv_record.</w:t>
-            </w:r>
-            <w:proofErr w:type="gramStart"/>
-            <w:r>
-              <w:t>comments %}</w:t>
-            </w:r>
-            <w:proofErr w:type="gramEnd"/>
-            <w:r>
+              <w:t xml:space="preserve">{% for item in template_dict.dv_record.comments %} </w:t>
+            </w:r>
+          </w:p>
+          <w:p>
+            <w:r>
+              <w:t>{% for author, dataverses in item.items() %} {{ author }}</w:t>
+            </w:r>
+            <w:r>
+              <w:rPr>
+                <w:rFonts w:hint="eastAsia"/>
+              </w:rPr>
+              <w:t>:</w:t>
+            </w:r>
+          </w:p>
+          <w:p>
+            <w:r>
+              <w:t xml:space="preserve">{% for dataverse in dataverses %} </w:t>
+            </w:r>
+            <w:r>
+              <w:t>{{ loop.index }}.</w:t>
+            </w:r>
+            <w:r>
+              <w:rPr>
+                <w:rFonts w:hint="eastAsia"/>
+              </w:rPr>
               <w:t xml:space="preserve"> </w:t>
             </w:r>
-          </w:p>
-          <w:p>
-            <w:r>
-              <w:t xml:space="preserve">{% for author, dataverses in </w:t>
-            </w:r>
-            <w:proofErr w:type="gramStart"/>
-            <w:r>
-              <w:t>item.items</w:t>
-            </w:r>
-            <w:proofErr w:type="gramEnd"/>
-            <w:r>
-              <w:t xml:space="preserve">() %} </w:t>
-            </w:r>
-            <w:proofErr w:type="gramStart"/>
-            <w:r>
-              <w:t>{{ author</w:t>
-            </w:r>
-            <w:proofErr w:type="gramEnd"/>
-            <w:r>
-              <w:t xml:space="preserve"> }}</w:t>
-            </w:r>
-            <w:r>
-              <w:rPr>
-                <w:rFonts w:hint="eastAsia"/>
-              </w:rPr>
-              <w:t>:</w:t>
-            </w:r>
-          </w:p>
-          <w:p>
-            <w:r>
-              <w:t xml:space="preserve">{% for dataverse in dataverses %} </w:t>
-            </w:r>
-            <w:proofErr w:type="gramStart"/>
-            <w:r>
-              <w:t>{{ loop</w:t>
-            </w:r>
-            <w:proofErr w:type="gramEnd"/>
-            <w:r>
-              <w:t>.</w:t>
-            </w:r>
-            <w:proofErr w:type="gramStart"/>
-            <w:r>
-              <w:t>index }</w:t>
-            </w:r>
-            <w:proofErr w:type="gramEnd"/>
-            <w:r>
-              <w:t>}.</w:t>
-            </w:r>
-            <w:r>
-              <w:rPr>
-                <w:rFonts w:hint="eastAsia"/>
-              </w:rPr>
-              <w:t xml:space="preserve"> </w:t>
-            </w:r>
-            <w:proofErr w:type="gramStart"/>
-            <w:r>
-              <w:t>{{ dataverse</w:t>
-            </w:r>
-            <w:proofErr w:type="gramEnd"/>
-            <w:r>
-              <w:t xml:space="preserve"> }}</w:t>
+            <w:r>
+              <w:t>{{ dataverse }}</w:t>
             </w:r>
             <w:r>
               <w:br/>
@@ -1791,7 +1559,6 @@
               </w:rPr>
               <w:t>University of Toronto Dataverse</w:t>
             </w:r>
-            <w:proofErr w:type="gramStart"/>
             <w:r>
               <w:rPr>
                 <w:lang w:val="en-US"/>
@@ -1802,14 +1569,7 @@
               <w:rPr>
                 <w:lang w:val="en-US"/>
               </w:rPr>
-              <w:t xml:space="preserve"> %}X{%</w:t>
-            </w:r>
-            <w:proofErr w:type="gramEnd"/>
-            <w:r>
-              <w:rPr>
-                <w:lang w:val="en-US"/>
-              </w:rPr>
-              <w:t xml:space="preserve"> endif %}</w:t>
+              <w:t xml:space="preserve"> %}X{% endif %}</w:t>
             </w:r>
           </w:p>
         </w:tc>
@@ -1902,7 +1662,6 @@
               </w:rPr>
               <w:t>University of Toronto Dataverse</w:t>
             </w:r>
-            <w:proofErr w:type="gramStart"/>
             <w:r>
               <w:rPr>
                 <w:lang w:val="en-US"/>
@@ -1913,207 +1672,183 @@
               <w:rPr>
                 <w:lang w:val="en-US"/>
               </w:rPr>
-              <w:t xml:space="preserve"> %}X{%</w:t>
-            </w:r>
-            <w:proofErr w:type="gramEnd"/>
-            <w:r>
+              <w:t xml:space="preserve"> %}X{% endif %}</w:t>
+            </w:r>
+          </w:p>
+        </w:tc>
+        <w:tc>
+          <w:tcPr>
+            <w:tcW w:w="0" w:type="auto"/>
+            <w:tcBorders>
+              <w:top w:val="single" w:sz="8" w:space="0" w:color="000000"/>
+              <w:left w:val="single" w:sz="8" w:space="0" w:color="000000"/>
+              <w:bottom w:val="single" w:sz="8" w:space="0" w:color="000000"/>
+              <w:right w:val="single" w:sz="8" w:space="0" w:color="000000"/>
+            </w:tcBorders>
+            <w:shd w:val="clear" w:color="auto" w:fill="EFEFEF"/>
+            <w:tcMar>
+              <w:top w:w="100" w:type="dxa"/>
+              <w:left w:w="100" w:type="dxa"/>
+              <w:bottom w:w="100" w:type="dxa"/>
+              <w:right w:w="100" w:type="dxa"/>
+            </w:tcMar>
+            <w:hideMark/>
+          </w:tcPr>
+          <w:p/>
+        </w:tc>
+        <w:tc>
+          <w:tcPr>
+            <w:tcW w:w="0" w:type="auto"/>
+            <w:tcBorders>
+              <w:top w:val="single" w:sz="8" w:space="0" w:color="000000"/>
+              <w:left w:val="single" w:sz="8" w:space="0" w:color="000000"/>
+              <w:bottom w:val="single" w:sz="8" w:space="0" w:color="000000"/>
+              <w:right w:val="single" w:sz="8" w:space="0" w:color="000000"/>
+            </w:tcBorders>
+            <w:shd w:val="clear" w:color="auto" w:fill="EFEFEF"/>
+            <w:tcMar>
+              <w:top w:w="100" w:type="dxa"/>
+              <w:left w:w="100" w:type="dxa"/>
+              <w:bottom w:w="100" w:type="dxa"/>
+              <w:right w:w="100" w:type="dxa"/>
+            </w:tcMar>
+            <w:hideMark/>
+          </w:tcPr>
+          <w:p/>
+        </w:tc>
+        <w:tc>
+          <w:tcPr>
+            <w:tcW w:w="0" w:type="auto"/>
+            <w:tcBorders>
+              <w:top w:val="single" w:sz="8" w:space="0" w:color="000000"/>
+              <w:left w:val="single" w:sz="8" w:space="0" w:color="000000"/>
+              <w:bottom w:val="single" w:sz="8" w:space="0" w:color="000000"/>
+              <w:right w:val="single" w:sz="8" w:space="0" w:color="000000"/>
+            </w:tcBorders>
+            <w:shd w:val="clear" w:color="auto" w:fill="EFEFEF"/>
+            <w:tcMar>
+              <w:top w:w="100" w:type="dxa"/>
+              <w:left w:w="100" w:type="dxa"/>
+              <w:bottom w:w="100" w:type="dxa"/>
+              <w:right w:w="100" w:type="dxa"/>
+            </w:tcMar>
+            <w:hideMark/>
+          </w:tcPr>
+          <w:p>
+            <w:pPr>
               <w:rPr>
                 <w:lang w:val="en-US"/>
               </w:rPr>
-              <w:t xml:space="preserve"> endif %}</w:t>
-            </w:r>
-          </w:p>
-        </w:tc>
-        <w:tc>
-          <w:tcPr>
-            <w:tcW w:w="0" w:type="auto"/>
-            <w:tcBorders>
-              <w:top w:val="single" w:sz="8" w:space="0" w:color="000000"/>
-              <w:left w:val="single" w:sz="8" w:space="0" w:color="000000"/>
-              <w:bottom w:val="single" w:sz="8" w:space="0" w:color="000000"/>
-              <w:right w:val="single" w:sz="8" w:space="0" w:color="000000"/>
-            </w:tcBorders>
-            <w:shd w:val="clear" w:color="auto" w:fill="EFEFEF"/>
-            <w:tcMar>
-              <w:top w:w="100" w:type="dxa"/>
-              <w:left w:w="100" w:type="dxa"/>
-              <w:bottom w:w="100" w:type="dxa"/>
-              <w:right w:w="100" w:type="dxa"/>
-            </w:tcMar>
-            <w:hideMark/>
-          </w:tcPr>
-          <w:p/>
-        </w:tc>
-        <w:tc>
-          <w:tcPr>
-            <w:tcW w:w="0" w:type="auto"/>
-            <w:tcBorders>
-              <w:top w:val="single" w:sz="8" w:space="0" w:color="000000"/>
-              <w:left w:val="single" w:sz="8" w:space="0" w:color="000000"/>
-              <w:bottom w:val="single" w:sz="8" w:space="0" w:color="000000"/>
-              <w:right w:val="single" w:sz="8" w:space="0" w:color="000000"/>
-            </w:tcBorders>
-            <w:shd w:val="clear" w:color="auto" w:fill="EFEFEF"/>
-            <w:tcMar>
-              <w:top w:w="100" w:type="dxa"/>
-              <w:left w:w="100" w:type="dxa"/>
-              <w:bottom w:w="100" w:type="dxa"/>
-              <w:right w:w="100" w:type="dxa"/>
-            </w:tcMar>
-            <w:hideMark/>
-          </w:tcPr>
-          <w:p/>
-        </w:tc>
-        <w:tc>
-          <w:tcPr>
-            <w:tcW w:w="0" w:type="auto"/>
-            <w:tcBorders>
-              <w:top w:val="single" w:sz="8" w:space="0" w:color="000000"/>
-              <w:left w:val="single" w:sz="8" w:space="0" w:color="000000"/>
-              <w:bottom w:val="single" w:sz="8" w:space="0" w:color="000000"/>
-              <w:right w:val="single" w:sz="8" w:space="0" w:color="000000"/>
-            </w:tcBorders>
-            <w:shd w:val="clear" w:color="auto" w:fill="EFEFEF"/>
-            <w:tcMar>
-              <w:top w:w="100" w:type="dxa"/>
-              <w:left w:w="100" w:type="dxa"/>
-              <w:bottom w:w="100" w:type="dxa"/>
-              <w:right w:w="100" w:type="dxa"/>
-            </w:tcMar>
-            <w:hideMark/>
-          </w:tcPr>
-          <w:p>
-            <w:pPr>
+            </w:pPr>
+            <w:r>
               <w:rPr>
                 <w:rFonts w:hint="eastAsia"/>
                 <w:lang w:val="en-US"/>
               </w:rPr>
-            </w:pPr>
+              <w:t xml:space="preserve">List the </w:t>
+            </w:r>
+            <w:r>
+              <w:rPr>
+                <w:lang w:val="en-US"/>
+              </w:rPr>
+              <w:t xml:space="preserve">parent </w:t>
+            </w:r>
             <w:r>
               <w:rPr>
                 <w:rFonts w:hint="eastAsia"/>
                 <w:lang w:val="en-US"/>
               </w:rPr>
-              <w:t xml:space="preserve">List the </w:t>
-            </w:r>
-            <w:r>
-              <w:rPr>
-                <w:lang w:val="en-US"/>
-              </w:rPr>
-              <w:t xml:space="preserve">parent </w:t>
+              <w:t>d</w:t>
             </w:r>
             <w:r>
               <w:rPr>
                 <w:rFonts w:hint="eastAsia"/>
                 <w:lang w:val="en-US"/>
               </w:rPr>
-              <w:t>d</w:t>
+              <w:t xml:space="preserve">ataverse </w:t>
+            </w:r>
+            <w:r>
+              <w:rPr>
+                <w:lang w:val="en-US"/>
+              </w:rPr>
+              <w:t>collection</w:t>
             </w:r>
             <w:r>
               <w:rPr>
                 <w:rFonts w:hint="eastAsia"/>
                 <w:lang w:val="en-US"/>
               </w:rPr>
-              <w:t xml:space="preserve">ataverse </w:t>
+              <w:t xml:space="preserve"> name:</w:t>
             </w:r>
             <w:r>
               <w:rPr>
                 <w:lang w:val="en-US"/>
               </w:rPr>
-              <w:t>collection</w:t>
+              <w:br/>
             </w:r>
             <w:r>
               <w:rPr>
                 <w:rFonts w:hint="eastAsia"/>
                 <w:lang w:val="en-US"/>
               </w:rPr>
-              <w:t xml:space="preserve"> name:</w:t>
+              <w:t xml:space="preserve">{{ </w:t>
+            </w:r>
+            <w:r>
+              <w:t>template_dict</w:t>
+            </w:r>
+            <w:r>
+              <w:rPr>
+                <w:rFonts w:hint="eastAsia"/>
+              </w:rPr>
+              <w:t>.</w:t>
             </w:r>
             <w:r>
               <w:rPr>
                 <w:lang w:val="en-US"/>
               </w:rPr>
+              <w:t>ds_tree_info</w:t>
+            </w:r>
+            <w:r>
+              <w:rPr>
+                <w:lang w:val="en-US"/>
+              </w:rPr>
+              <w:t>.</w:t>
+            </w:r>
+            <w:r>
+              <w:rPr>
+                <w:lang w:val="en-US"/>
+              </w:rPr>
+              <w:t>parentDataverseName</w:t>
+            </w:r>
+            <w:r>
+              <w:rPr>
+                <w:rFonts w:hint="eastAsia"/>
+              </w:rPr>
+              <w:t xml:space="preserve"> }}</w:t>
+            </w:r>
+          </w:p>
+          <w:p>
+            <w:r>
+              <w:t>List the dataset (full) path in the Dataverse repository</w:t>
+            </w:r>
+            <w:r>
               <w:br/>
             </w:r>
             <w:r>
               <w:rPr>
-                <w:rFonts w:hint="eastAsia"/>
                 <w:lang w:val="en-US"/>
               </w:rPr>
               <w:t xml:space="preserve">{{ </w:t>
             </w:r>
             <w:r>
-              <w:t>template_dict</w:t>
-            </w:r>
-            <w:r>
-              <w:rPr>
-                <w:rFonts w:hint="eastAsia"/>
-              </w:rPr>
-              <w:t>.</w:t>
+              <w:t>template_dict.</w:t>
             </w:r>
             <w:r>
               <w:rPr>
                 <w:lang w:val="en-US"/>
               </w:rPr>
-              <w:t>ds_tree_info</w:t>
-            </w:r>
-            <w:r>
-              <w:rPr>
-                <w:lang w:val="en-US"/>
-              </w:rPr>
-              <w:t>.</w:t>
-            </w:r>
-            <w:r>
-              <w:rPr>
-                <w:lang w:val="en-US"/>
-              </w:rPr>
-              <w:t>parentDataverseName</w:t>
-            </w:r>
-            <w:r>
-              <w:rPr>
-                <w:rFonts w:hint="eastAsia"/>
-              </w:rPr>
-              <w:t xml:space="preserve"> }}</w:t>
-            </w:r>
-          </w:p>
-          <w:p>
-            <w:r>
-              <w:t>List the dataset (full) path in the Dataverse repository</w:t>
-            </w:r>
-            <w:r>
-              <w:br/>
-            </w:r>
-            <w:proofErr w:type="gramStart"/>
-            <w:r>
-              <w:rPr>
-                <w:lang w:val="en-US"/>
-              </w:rPr>
-              <w:t xml:space="preserve">{{ </w:t>
-            </w:r>
-            <w:r>
-              <w:t>template_dict.</w:t>
-            </w:r>
-            <w:r>
-              <w:rPr>
-                <w:lang w:val="en-US"/>
-              </w:rPr>
-              <w:t>ds</w:t>
-            </w:r>
-            <w:proofErr w:type="gramEnd"/>
-            <w:r>
-              <w:rPr>
-                <w:lang w:val="en-US"/>
-              </w:rPr>
-              <w:t>_tree_</w:t>
-            </w:r>
-            <w:proofErr w:type="gramStart"/>
-            <w:r>
-              <w:rPr>
-                <w:lang w:val="en-US"/>
-              </w:rPr>
-              <w:t>info.path</w:t>
-            </w:r>
-            <w:proofErr w:type="gramEnd"/>
+              <w:t>ds_tree_info.path</w:t>
+            </w:r>
             <w:r>
               <w:t>}}</w:t>
             </w:r>
@@ -2289,15 +2024,7 @@
             </w:r>
             <w:r>
               <w:lastRenderedPageBreak/>
-              <w:t xml:space="preserve">depositor that they </w:t>
-            </w:r>
-            <w:proofErr w:type="gramStart"/>
-            <w:r>
-              <w:t>actually require</w:t>
-            </w:r>
-            <w:proofErr w:type="gramEnd"/>
-            <w:r>
-              <w:t xml:space="preserve"> a dataverse (e.g., will there be future deposits?)</w:t>
+              <w:t>depositor that they actually require a dataverse (e.g., will there be future deposits?)</w:t>
             </w:r>
           </w:p>
         </w:tc>
@@ -2990,14 +2717,7 @@
               <w:t>template_dict.file_open.comments</w:t>
             </w:r>
             <w:r>
-              <w:t xml:space="preserve"> </w:t>
-            </w:r>
-            <w:r>
-              <w:t xml:space="preserve">|length &gt; </w:t>
-            </w:r>
-            <w:proofErr w:type="gramStart"/>
-            <w:r>
-              <w:t>0</w:t>
+              <w:t xml:space="preserve"> |length &gt; 0</w:t>
             </w:r>
             <w:r>
               <w:t xml:space="preserve"> %}</w:t>
@@ -3006,23 +2726,8 @@
               <w:rPr>
                 <w:lang w:val="en-US"/>
               </w:rPr>
-              <w:t>{%</w:t>
-            </w:r>
-            <w:proofErr w:type="gramEnd"/>
-            <w:r>
-              <w:rPr>
-                <w:lang w:val="en-US"/>
-              </w:rPr>
-              <w:t xml:space="preserve"> for item in template_dict.file_open.</w:t>
-            </w:r>
-            <w:proofErr w:type="gramStart"/>
-            <w:r>
-              <w:rPr>
-                <w:lang w:val="en-US"/>
-              </w:rPr>
-              <w:t>comments %}</w:t>
-            </w:r>
-            <w:proofErr w:type="gramEnd"/>
+              <w:t>{% for item in template_dict.file_open.comments %}</w:t>
+            </w:r>
           </w:p>
           <w:p>
             <w:pPr>
@@ -3039,115 +2744,58 @@
               <w:rPr>
                 <w:lang w:val="en-US"/>
               </w:rPr>
-              <w:t>{{ item.file_</w:t>
-            </w:r>
-            <w:proofErr w:type="gramStart"/>
-            <w:r>
+              <w:t>{{ item.file_name }}{% endfor %}</w:t>
+            </w:r>
+          </w:p>
+          <w:p>
+            <w:pPr>
               <w:rPr>
                 <w:lang w:val="en-US"/>
               </w:rPr>
-              <w:t>name }}{%</w:t>
-            </w:r>
-            <w:proofErr w:type="gramEnd"/>
-            <w:r>
+            </w:pPr>
+            <w:r>
+              <w:t>{% else %}(NONE){% endif %}</w:t>
+            </w:r>
+          </w:p>
+          <w:p>
+            <w:pPr>
               <w:rPr>
                 <w:lang w:val="en-US"/>
               </w:rPr>
-              <w:t xml:space="preserve"> </w:t>
-            </w:r>
-            <w:proofErr w:type="gramStart"/>
+            </w:pPr>
             <w:r>
               <w:rPr>
                 <w:lang w:val="en-US"/>
               </w:rPr>
-              <w:t>endfor %}</w:t>
-            </w:r>
-            <w:proofErr w:type="gramEnd"/>
-          </w:p>
-          <w:p>
-            <w:pPr>
+              <w:t>List all files that were not checked:</w:t>
+            </w:r>
+            <w:r>
               <w:rPr>
                 <w:lang w:val="en-US"/>
               </w:rPr>
-            </w:pPr>
-            <w:r>
-              <w:t xml:space="preserve">{% else </w:t>
-            </w:r>
-            <w:proofErr w:type="gramStart"/>
-            <w:r>
-              <w:t>%}(</w:t>
-            </w:r>
-            <w:proofErr w:type="gramEnd"/>
-            <w:r>
-              <w:t>NONE</w:t>
-            </w:r>
-            <w:proofErr w:type="gramStart"/>
-            <w:r>
-              <w:t>){</w:t>
-            </w:r>
-            <w:proofErr w:type="gramEnd"/>
-            <w:r>
-              <w:t>% endif %}</w:t>
-            </w:r>
-          </w:p>
-          <w:p>
-            <w:pPr>
+              <w:br/>
+            </w:r>
+            <w:r>
+              <w:t xml:space="preserve">{% if </w:t>
+            </w:r>
+            <w:r>
               <w:rPr>
                 <w:lang w:val="en-US"/>
               </w:rPr>
-            </w:pPr>
+              <w:t>template_dict.file_open.not_checked</w:t>
+            </w:r>
+            <w:r>
+              <w:t xml:space="preserve"> |length &gt; 0</w:t>
+            </w:r>
+            <w:r>
+              <w:t xml:space="preserve"> %}</w:t>
+            </w:r>
             <w:r>
               <w:rPr>
                 <w:lang w:val="en-US"/>
               </w:rPr>
-              <w:t>List all files that were not checked:</w:t>
-            </w:r>
-            <w:r>
-              <w:rPr>
-                <w:lang w:val="en-US"/>
-              </w:rPr>
-              <w:br/>
-            </w:r>
-            <w:r>
-              <w:t xml:space="preserve">{% if </w:t>
-            </w:r>
-            <w:r>
-              <w:rPr>
-                <w:lang w:val="en-US"/>
-              </w:rPr>
-              <w:t>template_dict.file_open.not_checked</w:t>
-            </w:r>
-            <w:r>
-              <w:t xml:space="preserve"> |length &gt; </w:t>
-            </w:r>
-            <w:proofErr w:type="gramStart"/>
-            <w:r>
-              <w:t>0</w:t>
-            </w:r>
-            <w:r>
-              <w:t xml:space="preserve"> %}</w:t>
-            </w:r>
-            <w:r>
-              <w:rPr>
-                <w:lang w:val="en-US"/>
-              </w:rPr>
-              <w:t>{%</w:t>
-            </w:r>
-            <w:proofErr w:type="gramEnd"/>
-            <w:r>
-              <w:rPr>
-                <w:lang w:val="en-US"/>
-              </w:rPr>
-              <w:t xml:space="preserve"> for item in template_dict.file_open.not_</w:t>
-            </w:r>
-            <w:proofErr w:type="gramStart"/>
-            <w:r>
-              <w:rPr>
-                <w:lang w:val="en-US"/>
-              </w:rPr>
-              <w:t>checked %}</w:t>
-            </w:r>
-            <w:proofErr w:type="gramEnd"/>
+              <w:t>{% for item in template_dict.file_open.not_checked %}</w:t>
+            </w:r>
           </w:p>
           <w:p>
             <w:pPr>
@@ -3164,50 +2812,12 @@
               <w:rPr>
                 <w:lang w:val="en-US"/>
               </w:rPr>
-              <w:t>{{ item.file_</w:t>
-            </w:r>
-            <w:proofErr w:type="gramStart"/>
-            <w:r>
-              <w:rPr>
-                <w:lang w:val="en-US"/>
-              </w:rPr>
-              <w:t>name }}{%</w:t>
-            </w:r>
-            <w:proofErr w:type="gramEnd"/>
-            <w:r>
-              <w:rPr>
-                <w:lang w:val="en-US"/>
-              </w:rPr>
-              <w:t xml:space="preserve"> </w:t>
-            </w:r>
-            <w:proofErr w:type="gramStart"/>
-            <w:r>
-              <w:rPr>
-                <w:lang w:val="en-US"/>
-              </w:rPr>
-              <w:t>endfor %}</w:t>
-            </w:r>
-            <w:proofErr w:type="gramEnd"/>
-          </w:p>
-          <w:p>
-            <w:r>
-              <w:t xml:space="preserve">{% else </w:t>
-            </w:r>
-            <w:proofErr w:type="gramStart"/>
-            <w:r>
-              <w:t>%}(</w:t>
-            </w:r>
-            <w:proofErr w:type="gramEnd"/>
-            <w:r>
-              <w:t>NONE</w:t>
-            </w:r>
-            <w:proofErr w:type="gramStart"/>
-            <w:r>
-              <w:t>){</w:t>
-            </w:r>
-            <w:proofErr w:type="gramEnd"/>
-            <w:r>
-              <w:t>% endif %}</w:t>
+              <w:t>{{ item.file_name }}{% endfor %}</w:t>
+            </w:r>
+          </w:p>
+          <w:p>
+            <w:r>
+              <w:t>{% else %}(NONE){% endif %}</w:t>
             </w:r>
           </w:p>
         </w:tc>
@@ -3326,18 +2936,8 @@
                 <w:bCs/>
                 <w:lang w:val="en-US"/>
               </w:rPr>
-              <w:t>&lt;&gt;:"/\</w:t>
-            </w:r>
-            <w:proofErr w:type="gramStart"/>
-            <w:r>
-              <w:rPr>
-                <w:b/>
-                <w:bCs/>
-                <w:lang w:val="en-US"/>
-              </w:rPr>
-              <w:t>|?*</w:t>
-            </w:r>
-            <w:proofErr w:type="gramEnd"/>
+              <w:t>&lt;&gt;:"/\|?*</w:t>
+            </w:r>
             <w:r>
               <w:rPr>
                 <w:b/>
@@ -3555,50 +3155,12 @@
               <w:rPr>
                 <w:lang w:val="en-US"/>
               </w:rPr>
-              <w:t>{{ item.file_</w:t>
-            </w:r>
-            <w:proofErr w:type="gramStart"/>
-            <w:r>
-              <w:rPr>
-                <w:lang w:val="en-US"/>
-              </w:rPr>
-              <w:t>name }}{%</w:t>
-            </w:r>
-            <w:proofErr w:type="gramEnd"/>
-            <w:r>
-              <w:rPr>
-                <w:lang w:val="en-US"/>
-              </w:rPr>
-              <w:t xml:space="preserve"> </w:t>
-            </w:r>
-            <w:proofErr w:type="gramStart"/>
-            <w:r>
-              <w:rPr>
-                <w:lang w:val="en-US"/>
-              </w:rPr>
-              <w:t>endfor %}</w:t>
-            </w:r>
-            <w:proofErr w:type="gramEnd"/>
-          </w:p>
-          <w:p>
-            <w:r>
-              <w:t xml:space="preserve">{% else </w:t>
-            </w:r>
-            <w:proofErr w:type="gramStart"/>
-            <w:r>
-              <w:t>%}(</w:t>
-            </w:r>
-            <w:proofErr w:type="gramEnd"/>
-            <w:r>
-              <w:t>NONE</w:t>
-            </w:r>
-            <w:proofErr w:type="gramStart"/>
-            <w:r>
-              <w:t>){</w:t>
-            </w:r>
-            <w:proofErr w:type="gramEnd"/>
-            <w:r>
-              <w:t>% endif %}</w:t>
+              <w:t>{{ item.file_name }}{% endfor %}</w:t>
+            </w:r>
+          </w:p>
+          <w:p>
+            <w:r>
+              <w:t>{% else %}(NONE){% endif %}</w:t>
             </w:r>
           </w:p>
         </w:tc>
@@ -3935,11 +3497,7 @@
               <w:t xml:space="preserve"> </w:t>
             </w:r>
             <w:r>
-              <w:t xml:space="preserve">|length &gt; </w:t>
-            </w:r>
-            <w:proofErr w:type="gramStart"/>
-            <w:r>
-              <w:t>0</w:t>
+              <w:t>|length &gt; 0</w:t>
             </w:r>
             <w:r>
               <w:t xml:space="preserve"> %}</w:t>
@@ -3948,23 +3506,8 @@
               <w:rPr>
                 <w:lang w:val="en-US"/>
               </w:rPr>
-              <w:t>{%</w:t>
-            </w:r>
-            <w:proofErr w:type="gramEnd"/>
-            <w:r>
-              <w:rPr>
-                <w:lang w:val="en-US"/>
-              </w:rPr>
-              <w:t xml:space="preserve"> for item in template_dict.file_ext.</w:t>
-            </w:r>
-            <w:proofErr w:type="gramStart"/>
-            <w:r>
-              <w:rPr>
-                <w:lang w:val="en-US"/>
-              </w:rPr>
-              <w:t>comments %}</w:t>
-            </w:r>
-            <w:proofErr w:type="gramEnd"/>
+              <w:t>{% for item in template_dict.file_ext.comments %}</w:t>
+            </w:r>
           </w:p>
           <w:p>
             <w:pPr>
@@ -3979,53 +3522,15 @@
               <w:rPr>
                 <w:lang w:val="en-US"/>
               </w:rPr>
-              <w:t>{{ item.file_</w:t>
-            </w:r>
-            <w:proofErr w:type="gramStart"/>
-            <w:r>
-              <w:rPr>
-                <w:lang w:val="en-US"/>
-              </w:rPr>
-              <w:t>name }}{%</w:t>
-            </w:r>
-            <w:proofErr w:type="gramEnd"/>
-            <w:r>
-              <w:rPr>
-                <w:lang w:val="en-US"/>
-              </w:rPr>
-              <w:t xml:space="preserve"> </w:t>
-            </w:r>
-            <w:proofErr w:type="gramStart"/>
-            <w:r>
-              <w:rPr>
-                <w:lang w:val="en-US"/>
-              </w:rPr>
-              <w:t>endfor %}</w:t>
-            </w:r>
-            <w:proofErr w:type="gramEnd"/>
+              <w:t>{{ item.file_name }}{% endfor %}</w:t>
+            </w:r>
           </w:p>
           <w:p>
             <w:pPr>
               <w:spacing w:line="256" w:lineRule="auto"/>
             </w:pPr>
             <w:r>
-              <w:t xml:space="preserve">{% else </w:t>
-            </w:r>
-            <w:proofErr w:type="gramStart"/>
-            <w:r>
-              <w:t>%}(</w:t>
-            </w:r>
-            <w:proofErr w:type="gramEnd"/>
-            <w:r>
-              <w:t>NONE</w:t>
-            </w:r>
-            <w:proofErr w:type="gramStart"/>
-            <w:r>
-              <w:t>){</w:t>
-            </w:r>
-            <w:proofErr w:type="gramEnd"/>
-            <w:r>
-              <w:t>% endif %}</w:t>
+              <w:t>{% else %}(NONE){% endif %}</w:t>
             </w:r>
           </w:p>
         </w:tc>
@@ -4400,14 +3905,7 @@
               <w:rPr>
                 <w:lang w:val="en-US"/>
               </w:rPr>
-              <w:t>{{ item.file_</w:t>
-            </w:r>
-            <w:proofErr w:type="gramStart"/>
-            <w:r>
-              <w:rPr>
-                <w:lang w:val="en-US"/>
-              </w:rPr>
-              <w:t>name }}</w:t>
+              <w:t>{{ item.file_name }}</w:t>
             </w:r>
             <w:r>
               <w:rPr>
@@ -4421,44 +3919,18 @@
                 <w:rFonts w:hint="eastAsia"/>
                 <w:lang w:val="en-US"/>
               </w:rPr>
-              <w:t>%</w:t>
-            </w:r>
-            <w:proofErr w:type="gramEnd"/>
-            <w:r>
-              <w:rPr>
-                <w:rFonts w:hint="eastAsia"/>
+              <w:t xml:space="preserve">% </w:t>
+            </w:r>
+            <w:r>
+              <w:rPr>
                 <w:lang w:val="en-US"/>
               </w:rPr>
-              <w:t xml:space="preserve"> </w:t>
-            </w:r>
-            <w:proofErr w:type="gramStart"/>
-            <w:r>
-              <w:rPr>
-                <w:lang w:val="en-US"/>
-              </w:rPr>
               <w:t>endfor %}</w:t>
             </w:r>
-            <w:proofErr w:type="gramEnd"/>
-          </w:p>
-          <w:p>
-            <w:r>
-              <w:t xml:space="preserve">{% else </w:t>
-            </w:r>
-            <w:proofErr w:type="gramStart"/>
-            <w:r>
-              <w:t>%}(</w:t>
-            </w:r>
-            <w:proofErr w:type="gramEnd"/>
-            <w:r>
-              <w:t>NONE</w:t>
-            </w:r>
-            <w:proofErr w:type="gramStart"/>
-            <w:r>
-              <w:t>){</w:t>
-            </w:r>
-            <w:proofErr w:type="gramEnd"/>
-            <w:r>
-              <w:t>% endif %}</w:t>
+          </w:p>
+          <w:p>
+            <w:r>
+              <w:t>{% else %}(NONE){% endif %}</w:t>
             </w:r>
           </w:p>
         </w:tc>
@@ -5320,14 +4792,7 @@
               <w:t>template_dict.readme_file.comments</w:t>
             </w:r>
             <w:r>
-              <w:t xml:space="preserve"> </w:t>
-            </w:r>
-            <w:r>
-              <w:t xml:space="preserve">|length &gt; </w:t>
-            </w:r>
-            <w:proofErr w:type="gramStart"/>
-            <w:r>
-              <w:t>0</w:t>
+              <w:t xml:space="preserve"> |length &gt; 0</w:t>
             </w:r>
             <w:r>
               <w:t xml:space="preserve"> %}</w:t>
@@ -5336,90 +4801,17 @@
               <w:rPr>
                 <w:lang w:val="en-US"/>
               </w:rPr>
-              <w:t>{%</w:t>
-            </w:r>
-            <w:proofErr w:type="gramEnd"/>
-            <w:r>
+              <w:t>{% for item in template_dict.readme_file.comments %}{{ loop.index }}. {{ item.file_name }}{% endfor %}</w:t>
+            </w:r>
+          </w:p>
+          <w:p>
+            <w:pPr>
               <w:rPr>
                 <w:lang w:val="en-US"/>
               </w:rPr>
-              <w:t xml:space="preserve"> for item in template_dict.readme_file.</w:t>
-            </w:r>
-            <w:proofErr w:type="gramStart"/>
-            <w:r>
-              <w:rPr>
-                <w:lang w:val="en-US"/>
-              </w:rPr>
-              <w:t>comments %}{{</w:t>
-            </w:r>
-            <w:proofErr w:type="gramEnd"/>
-            <w:r>
-              <w:rPr>
-                <w:lang w:val="en-US"/>
-              </w:rPr>
-              <w:t xml:space="preserve"> loop.</w:t>
-            </w:r>
-            <w:proofErr w:type="gramStart"/>
-            <w:r>
-              <w:rPr>
-                <w:lang w:val="en-US"/>
-              </w:rPr>
-              <w:t>index }}.</w:t>
-            </w:r>
-            <w:proofErr w:type="gramEnd"/>
-            <w:r>
-              <w:rPr>
-                <w:lang w:val="en-US"/>
-              </w:rPr>
-              <w:t xml:space="preserve"> {{ item.file_</w:t>
-            </w:r>
-            <w:proofErr w:type="gramStart"/>
-            <w:r>
-              <w:rPr>
-                <w:lang w:val="en-US"/>
-              </w:rPr>
-              <w:t>name }}{%</w:t>
-            </w:r>
-            <w:proofErr w:type="gramEnd"/>
-            <w:r>
-              <w:rPr>
-                <w:lang w:val="en-US"/>
-              </w:rPr>
-              <w:t xml:space="preserve"> </w:t>
-            </w:r>
-            <w:proofErr w:type="gramStart"/>
-            <w:r>
-              <w:rPr>
-                <w:lang w:val="en-US"/>
-              </w:rPr>
-              <w:t>endfor %}</w:t>
-            </w:r>
-            <w:proofErr w:type="gramEnd"/>
-          </w:p>
-          <w:p>
-            <w:pPr>
-              <w:rPr>
-                <w:lang w:val="en-US"/>
-              </w:rPr>
             </w:pPr>
             <w:r>
-              <w:t xml:space="preserve">{% else </w:t>
-            </w:r>
-            <w:proofErr w:type="gramStart"/>
-            <w:r>
-              <w:t>%}(</w:t>
-            </w:r>
-            <w:proofErr w:type="gramEnd"/>
-            <w:r>
-              <w:t>NONE</w:t>
-            </w:r>
-            <w:proofErr w:type="gramStart"/>
-            <w:r>
-              <w:t>){</w:t>
-            </w:r>
-            <w:proofErr w:type="gramEnd"/>
-            <w:r>
-              <w:t>% endif %}</w:t>
+              <w:t>{% else %}(NONE){% endif %}</w:t>
             </w:r>
           </w:p>
           <w:p/>
@@ -5525,7 +4917,7 @@
                 <w:b/>
                 <w:bCs/>
               </w:rPr>
-              <w:t>Does the README contain the following information, and does it match what the dataset’s metadata?</w:t>
+              <w:t>Does the README contain the following information, and does it match the dataset’s metadata?</w:t>
             </w:r>
           </w:p>
         </w:tc>
@@ -7772,11 +7164,7 @@
             </w:r>
             <w:r>
               <w:lastRenderedPageBreak/>
-              <w:t xml:space="preserve">|length &gt; </w:t>
-            </w:r>
-            <w:proofErr w:type="gramStart"/>
-            <w:r>
-              <w:t>0</w:t>
+              <w:t>|length &gt; 0</w:t>
             </w:r>
             <w:r>
               <w:t xml:space="preserve"> %}</w:t>
@@ -7785,23 +7173,8 @@
               <w:rPr>
                 <w:lang w:val="en-US"/>
               </w:rPr>
-              <w:t>{%</w:t>
-            </w:r>
-            <w:proofErr w:type="gramEnd"/>
-            <w:r>
-              <w:rPr>
-                <w:lang w:val="en-US"/>
-              </w:rPr>
-              <w:t xml:space="preserve"> for item in template_dict.typo.</w:t>
-            </w:r>
-            <w:proofErr w:type="gramStart"/>
-            <w:r>
-              <w:rPr>
-                <w:lang w:val="en-US"/>
-              </w:rPr>
-              <w:t>comments %}</w:t>
-            </w:r>
-            <w:proofErr w:type="gramEnd"/>
+              <w:t>{% for item in template_dict.typo.comments %}</w:t>
+            </w:r>
           </w:p>
           <w:p>
             <w:pPr>
@@ -7811,59 +7184,25 @@
                 <w:numId w:val="46"/>
               </w:numPr>
             </w:pPr>
-            <w:proofErr w:type="gramStart"/>
             <w:r>
               <w:rPr>
                 <w:lang w:val="en-US"/>
               </w:rPr>
-              <w:t>{{ item }}{%</w:t>
-            </w:r>
-            <w:proofErr w:type="gramEnd"/>
-            <w:r>
-              <w:rPr>
-                <w:lang w:val="en-US"/>
-              </w:rPr>
-              <w:t xml:space="preserve"> </w:t>
-            </w:r>
-            <w:proofErr w:type="gramStart"/>
-            <w:r>
-              <w:rPr>
-                <w:lang w:val="en-US"/>
-              </w:rPr>
-              <w:t>endfor %}</w:t>
-            </w:r>
-            <w:proofErr w:type="gramEnd"/>
-          </w:p>
-          <w:p>
-            <w:pPr>
+              <w:t>{{ item }}{% endfor %}</w:t>
+            </w:r>
+          </w:p>
+          <w:p>
+            <w:r>
+              <w:t>{% else %}(NONE</w:t>
+            </w:r>
+            <w:r>
               <w:rPr>
                 <w:rFonts w:hint="eastAsia"/>
               </w:rPr>
-            </w:pPr>
-            <w:r>
-              <w:t xml:space="preserve">{% else </w:t>
-            </w:r>
-            <w:proofErr w:type="gramStart"/>
-            <w:r>
-              <w:t>%}(</w:t>
-            </w:r>
-            <w:proofErr w:type="gramEnd"/>
-            <w:r>
-              <w:t>NONE</w:t>
-            </w:r>
-            <w:proofErr w:type="gramStart"/>
-            <w:r>
-              <w:rPr>
-                <w:rFonts w:hint="eastAsia"/>
-              </w:rPr>
               <w:t>)</w:t>
             </w:r>
             <w:r>
-              <w:t>{</w:t>
-            </w:r>
-            <w:proofErr w:type="gramEnd"/>
-            <w:r>
-              <w:t>% endif %}</w:t>
+              <w:t>{% endif %}</w:t>
             </w:r>
           </w:p>
         </w:tc>
@@ -8331,23 +7670,7 @@
           </w:tcPr>
           <w:p>
             <w:r>
-              <w:t>{% if not template_</w:t>
-            </w:r>
-            <w:proofErr w:type="gramStart"/>
-            <w:r>
-              <w:t>dict.none</w:t>
-            </w:r>
-            <w:proofErr w:type="gramEnd"/>
-            <w:r>
-              <w:t>_author_affiliation %}</w:t>
-            </w:r>
-            <w:proofErr w:type="gramStart"/>
-            <w:r>
-              <w:t>X{</w:t>
-            </w:r>
-            <w:proofErr w:type="gramEnd"/>
-            <w:r>
-              <w:t>% endif %}</w:t>
+              <w:t>{% if not template_dict.none_author_affiliation %}X{% endif %}</w:t>
             </w:r>
           </w:p>
         </w:tc>
@@ -8370,23 +7693,7 @@
           </w:tcPr>
           <w:p>
             <w:r>
-              <w:t>{% if template_</w:t>
-            </w:r>
-            <w:proofErr w:type="gramStart"/>
-            <w:r>
-              <w:t>dict.none</w:t>
-            </w:r>
-            <w:proofErr w:type="gramEnd"/>
-            <w:r>
-              <w:t>_author_affiliation %}</w:t>
-            </w:r>
-            <w:proofErr w:type="gramStart"/>
-            <w:r>
-              <w:t>X{</w:t>
-            </w:r>
-            <w:proofErr w:type="gramEnd"/>
-            <w:r>
-              <w:t>% endif %}</w:t>
+              <w:t>{% if template_dict.none_author_affiliation %}X{% endif %}</w:t>
             </w:r>
           </w:p>
         </w:tc>
@@ -9123,13 +8430,7 @@
               <w:t>Still need to discover/formulate the best practices for writing dataset descriptions.</w:t>
             </w:r>
           </w:p>
-          <w:p>
-            <w:pPr>
-              <w:rPr>
-                <w:rFonts w:hint="eastAsia"/>
-              </w:rPr>
-            </w:pPr>
-          </w:p>
+          <w:p/>
           <w:p>
             <w:r>
               <w:t>Some elements to look for may include:</w:t>
@@ -9665,48 +8966,22 @@
               <w:rPr>
                 <w:lang w:val="en-US"/>
               </w:rPr>
-              <w:t>template_</w:t>
-            </w:r>
-            <w:proofErr w:type="gramStart"/>
+              <w:t>template_dict.</w:t>
+            </w:r>
+            <w:r>
+              <w:t>keywords</w:t>
+            </w:r>
+            <w:r>
+              <w:t>|length &gt; 0</w:t>
+            </w:r>
+            <w:r>
+              <w:t xml:space="preserve"> %}</w:t>
+            </w:r>
             <w:r>
               <w:rPr>
                 <w:lang w:val="en-US"/>
               </w:rPr>
-              <w:t>dict.</w:t>
-            </w:r>
-            <w:r>
-              <w:t>keywords</w:t>
-            </w:r>
-            <w:proofErr w:type="gramEnd"/>
-            <w:r>
-              <w:t>|length &gt; 0</w:t>
-            </w:r>
-            <w:r>
-              <w:t xml:space="preserve"> </w:t>
-            </w:r>
-            <w:proofErr w:type="gramStart"/>
-            <w:r>
-              <w:t>%}</w:t>
-            </w:r>
-            <w:r>
-              <w:rPr>
-                <w:lang w:val="en-US"/>
-              </w:rPr>
-              <w:t>{</w:t>
-            </w:r>
-            <w:proofErr w:type="gramEnd"/>
-            <w:r>
-              <w:rPr>
-                <w:lang w:val="en-US"/>
-              </w:rPr>
-              <w:t>% for item in template_</w:t>
-            </w:r>
-            <w:proofErr w:type="gramStart"/>
-            <w:r>
-              <w:rPr>
-                <w:lang w:val="en-US"/>
-              </w:rPr>
-              <w:t>dict.</w:t>
+              <w:t>{% for item in template_dict.</w:t>
             </w:r>
             <w:r>
               <w:rPr>
@@ -9715,7 +8990,6 @@
               </w:rPr>
               <w:t>keywords</w:t>
             </w:r>
-            <w:proofErr w:type="gramEnd"/>
             <w:r>
               <w:rPr>
                 <w:lang w:val="en-US"/>
@@ -9731,59 +9005,25 @@
                 <w:numId w:val="51"/>
               </w:numPr>
             </w:pPr>
-            <w:proofErr w:type="gramStart"/>
             <w:r>
               <w:rPr>
                 <w:lang w:val="en-US"/>
               </w:rPr>
-              <w:t>{{ item }}{%</w:t>
-            </w:r>
-            <w:proofErr w:type="gramEnd"/>
-            <w:r>
-              <w:rPr>
-                <w:lang w:val="en-US"/>
-              </w:rPr>
-              <w:t xml:space="preserve"> </w:t>
-            </w:r>
-            <w:proofErr w:type="gramStart"/>
-            <w:r>
-              <w:rPr>
-                <w:lang w:val="en-US"/>
-              </w:rPr>
-              <w:t>endfor %}</w:t>
-            </w:r>
-            <w:proofErr w:type="gramEnd"/>
-          </w:p>
-          <w:p>
-            <w:pPr>
+              <w:t>{{ item }}{% endfor %}</w:t>
+            </w:r>
+          </w:p>
+          <w:p>
+            <w:r>
+              <w:t>{% else %}(NONE</w:t>
+            </w:r>
+            <w:r>
               <w:rPr>
                 <w:rFonts w:hint="eastAsia"/>
               </w:rPr>
-            </w:pPr>
-            <w:r>
-              <w:t xml:space="preserve">{% else </w:t>
-            </w:r>
-            <w:proofErr w:type="gramStart"/>
-            <w:r>
-              <w:t>%}(</w:t>
-            </w:r>
-            <w:proofErr w:type="gramEnd"/>
-            <w:r>
-              <w:t>NONE</w:t>
-            </w:r>
-            <w:proofErr w:type="gramStart"/>
-            <w:r>
-              <w:rPr>
-                <w:rFonts w:hint="eastAsia"/>
-              </w:rPr>
               <w:t>)</w:t>
             </w:r>
             <w:r>
-              <w:t>{</w:t>
-            </w:r>
-            <w:proofErr w:type="gramEnd"/>
-            <w:r>
-              <w:t>% endif %}</w:t>
+              <w:t>{% endif %}</w:t>
             </w:r>
           </w:p>
         </w:tc>
@@ -11681,19 +10921,7 @@
               <w:br/>
             </w:r>
             <w:r>
-              <w:t>{% if template_</w:t>
-            </w:r>
-            <w:proofErr w:type="gramStart"/>
-            <w:r>
-              <w:t>dict.restricted</w:t>
-            </w:r>
-            <w:proofErr w:type="gramEnd"/>
-            <w:r>
-              <w:t>_</w:t>
-            </w:r>
-            <w:proofErr w:type="gramStart"/>
-            <w:r>
-              <w:t>files.comment</w:t>
+              <w:t>{% if template_dict.restricted_files.comment</w:t>
             </w:r>
             <w:r>
               <w:rPr>
@@ -11701,36 +10929,11 @@
               </w:rPr>
               <w:t>s</w:t>
             </w:r>
-            <w:proofErr w:type="gramEnd"/>
             <w:r>
               <w:t>|length &gt; 0</w:t>
             </w:r>
             <w:r>
-              <w:t xml:space="preserve"> </w:t>
-            </w:r>
-            <w:proofErr w:type="gramStart"/>
-            <w:r>
-              <w:t>%}{</w:t>
-            </w:r>
-            <w:proofErr w:type="gramEnd"/>
-            <w:r>
-              <w:t>% for item in template_</w:t>
-            </w:r>
-            <w:proofErr w:type="gramStart"/>
-            <w:r>
-              <w:t>dict.restricted</w:t>
-            </w:r>
-            <w:proofErr w:type="gramEnd"/>
-            <w:r>
-              <w:t>_</w:t>
-            </w:r>
-            <w:proofErr w:type="gramStart"/>
-            <w:r>
-              <w:t>files.comments</w:t>
-            </w:r>
-            <w:proofErr w:type="gramEnd"/>
-            <w:r>
-              <w:t xml:space="preserve"> %} </w:t>
+              <w:t xml:space="preserve"> %}{% for item in template_dict.restricted_files.comments %} </w:t>
             </w:r>
           </w:p>
           <w:p>
@@ -11741,42 +10944,13 @@
                 <w:numId w:val="47"/>
               </w:numPr>
             </w:pPr>
-            <w:proofErr w:type="gramStart"/>
-            <w:r>
-              <w:t>{{ item</w:t>
-            </w:r>
-            <w:proofErr w:type="gramEnd"/>
-            <w:r>
-              <w:t>.file_</w:t>
-            </w:r>
-            <w:proofErr w:type="gramStart"/>
-            <w:r>
-              <w:t>name }</w:t>
-            </w:r>
-            <w:proofErr w:type="gramEnd"/>
-            <w:r>
-              <w:t>} {% endfor %}</w:t>
-            </w:r>
-          </w:p>
-          <w:p>
-            <w:r>
-              <w:t xml:space="preserve">{% else </w:t>
-            </w:r>
-            <w:proofErr w:type="gramStart"/>
-            <w:r>
-              <w:t>%}(</w:t>
-            </w:r>
-            <w:proofErr w:type="gramEnd"/>
-            <w:r>
-              <w:t>NONE</w:t>
-            </w:r>
-            <w:proofErr w:type="gramStart"/>
-            <w:r>
-              <w:t>){</w:t>
-            </w:r>
-            <w:proofErr w:type="gramEnd"/>
-            <w:r>
-              <w:t>% endif %}</w:t>
+            <w:r>
+              <w:t>{{ item.file_name }} {% endfor %}</w:t>
+            </w:r>
+          </w:p>
+          <w:p>
+            <w:r>
+              <w:t>{% else %}(NONE){% endif %}</w:t>
             </w:r>
           </w:p>
           <w:p>
@@ -11805,71 +10979,7 @@
             </w:pPr>
             <w:r>
               <w:lastRenderedPageBreak/>
-              <w:t>{% if template_</w:t>
-            </w:r>
-            <w:proofErr w:type="gramStart"/>
-            <w:r>
-              <w:t>dict.terms</w:t>
-            </w:r>
-            <w:proofErr w:type="gramEnd"/>
-            <w:r>
-              <w:t>_</w:t>
-            </w:r>
-            <w:proofErr w:type="gramStart"/>
-            <w:r>
-              <w:t>license.licenseName</w:t>
-            </w:r>
-            <w:proofErr w:type="gramEnd"/>
-            <w:r>
-              <w:t xml:space="preserve"> is not none </w:t>
-            </w:r>
-            <w:proofErr w:type="gramStart"/>
-            <w:r>
-              <w:t>%}{{ template</w:t>
-            </w:r>
-            <w:proofErr w:type="gramEnd"/>
-            <w:r>
-              <w:t>_</w:t>
-            </w:r>
-            <w:proofErr w:type="gramStart"/>
-            <w:r>
-              <w:t>dict.terms</w:t>
-            </w:r>
-            <w:proofErr w:type="gramEnd"/>
-            <w:r>
-              <w:t>_</w:t>
-            </w:r>
-            <w:proofErr w:type="gramStart"/>
-            <w:r>
-              <w:t>license.licenseName</w:t>
-            </w:r>
-            <w:proofErr w:type="gramEnd"/>
-            <w:r>
-              <w:t xml:space="preserve"> </w:t>
-            </w:r>
-            <w:proofErr w:type="gramStart"/>
-            <w:r>
-              <w:t>}}{</w:t>
-            </w:r>
-            <w:proofErr w:type="gramEnd"/>
-            <w:r>
-              <w:t xml:space="preserve">% else </w:t>
-            </w:r>
-            <w:proofErr w:type="gramStart"/>
-            <w:r>
-              <w:t>%}(</w:t>
-            </w:r>
-            <w:proofErr w:type="gramEnd"/>
-            <w:r>
-              <w:t>NONE</w:t>
-            </w:r>
-            <w:proofErr w:type="gramStart"/>
-            <w:r>
-              <w:t>){</w:t>
-            </w:r>
-            <w:proofErr w:type="gramEnd"/>
-            <w:r>
-              <w:t>% endif %}</w:t>
+              <w:t>{% if template_dict.terms_license.licenseName is not none %}{{ template_dict.terms_license.licenseName }}{% else %}(NONE){% endif %}</w:t>
             </w:r>
           </w:p>
           <w:p>
@@ -11910,77 +11020,19 @@
                     </w:rPr>
                   </w:pPr>
                   <w:r>
-                    <w:t>{% if template_</w:t>
-                  </w:r>
-                  <w:proofErr w:type="gramStart"/>
-                  <w:r>
-                    <w:t>dict.terms</w:t>
-                  </w:r>
-                  <w:proofErr w:type="gramEnd"/>
-                  <w:r>
-                    <w:t>_</w:t>
-                  </w:r>
-                  <w:proofErr w:type="gramStart"/>
-                  <w:r>
-                    <w:t>license.</w:t>
+                    <w:t>{% if template_dict.terms_license.</w:t>
                   </w:r>
                   <w:r>
                     <w:t>termsOfUse</w:t>
                   </w:r>
-                  <w:proofErr w:type="gramEnd"/>
                   <w:r>
-                    <w:t xml:space="preserve"> is not none </w:t>
-                  </w:r>
-                  <w:proofErr w:type="gramStart"/>
-                  <w:r>
-                    <w:t>%}{{ template</w:t>
-                  </w:r>
-                  <w:proofErr w:type="gramEnd"/>
-                  <w:r>
-                    <w:t>_</w:t>
-                  </w:r>
-                  <w:proofErr w:type="gramStart"/>
-                  <w:r>
-                    <w:t>dict.terms</w:t>
-                  </w:r>
-                  <w:proofErr w:type="gramEnd"/>
-                  <w:r>
-                    <w:t>_</w:t>
-                  </w:r>
-                  <w:proofErr w:type="gramStart"/>
-                  <w:r>
-                    <w:t>license.</w:t>
+                    <w:t xml:space="preserve"> is not none %}{{ template_dict.terms_license.</w:t>
                   </w:r>
                   <w:r>
                     <w:t>termsOfUse</w:t>
                   </w:r>
-                  <w:proofErr w:type="gramEnd"/>
                   <w:r>
-                    <w:t xml:space="preserve"> </w:t>
-                  </w:r>
-                  <w:proofErr w:type="gramStart"/>
-                  <w:r>
-                    <w:t>}}{</w:t>
-                  </w:r>
-                  <w:proofErr w:type="gramEnd"/>
-                  <w:r>
-                    <w:t xml:space="preserve">% else </w:t>
-                  </w:r>
-                  <w:proofErr w:type="gramStart"/>
-                  <w:r>
-                    <w:t>%}(</w:t>
-                  </w:r>
-                  <w:proofErr w:type="gramEnd"/>
-                  <w:r>
-                    <w:t>NONE</w:t>
-                  </w:r>
-                  <w:proofErr w:type="gramStart"/>
-                  <w:r>
-                    <w:t>){</w:t>
-                  </w:r>
-                  <w:proofErr w:type="gramEnd"/>
-                  <w:r>
-                    <w:t>% endif %}</w:t>
+                    <w:t xml:space="preserve"> }}{% else %}(NONE){% endif %}</w:t>
                   </w:r>
                 </w:p>
               </w:tc>
@@ -12482,77 +11534,19 @@
                     </w:rPr>
                   </w:pPr>
                   <w:r>
-                    <w:t>{% if template_</w:t>
-                  </w:r>
-                  <w:proofErr w:type="gramStart"/>
-                  <w:r>
-                    <w:t>dict.terms</w:t>
-                  </w:r>
-                  <w:proofErr w:type="gramEnd"/>
-                  <w:r>
-                    <w:t>_</w:t>
-                  </w:r>
-                  <w:proofErr w:type="gramStart"/>
-                  <w:r>
-                    <w:t>license.</w:t>
+                    <w:t>{% if template_dict.terms_license.</w:t>
                   </w:r>
                   <w:r>
                     <w:t>termsOfAccess</w:t>
                   </w:r>
-                  <w:proofErr w:type="gramEnd"/>
                   <w:r>
-                    <w:t xml:space="preserve"> is not none </w:t>
-                  </w:r>
-                  <w:proofErr w:type="gramStart"/>
-                  <w:r>
-                    <w:t>%}{{ template</w:t>
-                  </w:r>
-                  <w:proofErr w:type="gramEnd"/>
-                  <w:r>
-                    <w:t>_</w:t>
-                  </w:r>
-                  <w:proofErr w:type="gramStart"/>
-                  <w:r>
-                    <w:t>dict.terms</w:t>
-                  </w:r>
-                  <w:proofErr w:type="gramEnd"/>
-                  <w:r>
-                    <w:t>_</w:t>
-                  </w:r>
-                  <w:proofErr w:type="gramStart"/>
-                  <w:r>
-                    <w:t>license.</w:t>
+                    <w:t xml:space="preserve"> is not none %}{{ template_dict.terms_license.</w:t>
                   </w:r>
                   <w:r>
                     <w:t>termsOfAccess</w:t>
                   </w:r>
-                  <w:proofErr w:type="gramEnd"/>
                   <w:r>
-                    <w:t xml:space="preserve"> </w:t>
-                  </w:r>
-                  <w:proofErr w:type="gramStart"/>
-                  <w:r>
-                    <w:t>}}{</w:t>
-                  </w:r>
-                  <w:proofErr w:type="gramEnd"/>
-                  <w:r>
-                    <w:t xml:space="preserve">% else </w:t>
-                  </w:r>
-                  <w:proofErr w:type="gramStart"/>
-                  <w:r>
-                    <w:t>%}(</w:t>
-                  </w:r>
-                  <w:proofErr w:type="gramEnd"/>
-                  <w:r>
-                    <w:t>NONE</w:t>
-                  </w:r>
-                  <w:proofErr w:type="gramStart"/>
-                  <w:r>
-                    <w:t>){</w:t>
-                  </w:r>
-                  <w:proofErr w:type="gramEnd"/>
-                  <w:r>
-                    <w:t>% endif %}</w:t>
+                    <w:t xml:space="preserve"> }}{% else %}(NONE){% endif %}</w:t>
                   </w:r>
                 </w:p>
               </w:tc>
@@ -20001,6 +18995,7 @@
   <w:style w:type="character" w:default="1" w:styleId="DefaultParagraphFont">
     <w:name w:val="Default Paragraph Font"/>
     <w:uiPriority w:val="1"/>
+    <w:semiHidden/>
     <w:unhideWhenUsed/>
   </w:style>
   <w:style w:type="table" w:default="1" w:styleId="TableNormal">

</xml_diff>

<commit_message>
Updated checklist changes based on #90
</commit_message>
<xml_diff>
--- a/res/template_high.docx
+++ b/res/template_high.docx
@@ -100,6 +100,7 @@
               </w:rPr>
               <w:t xml:space="preserve">Ticket number: {{ </w:t>
             </w:r>
+            <w:proofErr w:type="spellStart"/>
             <w:r>
               <w:t>project_info</w:t>
             </w:r>
@@ -112,6 +113,7 @@
             <w:r>
               <w:t>ticket_number</w:t>
             </w:r>
+            <w:proofErr w:type="spellEnd"/>
             <w:r>
               <w:rPr>
                 <w:rFonts w:hint="eastAsia"/>
@@ -141,6 +143,7 @@
               </w:rPr>
               <w:t xml:space="preserve"> {{ </w:t>
             </w:r>
+            <w:proofErr w:type="spellStart"/>
             <w:r>
               <w:t>project_info</w:t>
             </w:r>
@@ -148,7 +151,14 @@
               <w:rPr>
                 <w:rFonts w:hint="eastAsia"/>
               </w:rPr>
-              <w:t>.curator_name }}</w:t>
+              <w:t>.curator_name</w:t>
+            </w:r>
+            <w:proofErr w:type="spellEnd"/>
+            <w:r>
+              <w:rPr>
+                <w:rFonts w:hint="eastAsia"/>
+              </w:rPr>
+              <w:t xml:space="preserve"> }}</w:t>
             </w:r>
           </w:p>
           <w:p>
@@ -161,6 +171,7 @@
               </w:rPr>
               <w:t xml:space="preserve">Curator email: {{ </w:t>
             </w:r>
+            <w:proofErr w:type="spellStart"/>
             <w:r>
               <w:t>project_info</w:t>
             </w:r>
@@ -173,6 +184,7 @@
             <w:r>
               <w:t>curator_email</w:t>
             </w:r>
+            <w:proofErr w:type="spellEnd"/>
             <w:r>
               <w:rPr>
                 <w:rFonts w:hint="eastAsia"/>
@@ -188,11 +200,19 @@
               <w:rPr>
                 <w:rFonts w:hint="eastAsia"/>
               </w:rPr>
-              <w:t>Dataset title: {{ dataset.</w:t>
+              <w:t xml:space="preserve">Dataset title: {{ </w:t>
+            </w:r>
+            <w:proofErr w:type="spellStart"/>
+            <w:r>
+              <w:rPr>
+                <w:rFonts w:hint="eastAsia"/>
+              </w:rPr>
+              <w:t>dataset.</w:t>
             </w:r>
             <w:r>
               <w:t>DatasetTitle</w:t>
             </w:r>
+            <w:proofErr w:type="spellEnd"/>
             <w:r>
               <w:rPr>
                 <w:rFonts w:hint="eastAsia"/>
@@ -217,11 +237,19 @@
               <w:rPr>
                 <w:rFonts w:hint="eastAsia"/>
               </w:rPr>
-              <w:t xml:space="preserve"> identifier: {{ dataset.</w:t>
+              <w:t xml:space="preserve"> identifier: {{ </w:t>
+            </w:r>
+            <w:proofErr w:type="spellStart"/>
+            <w:r>
+              <w:rPr>
+                <w:rFonts w:hint="eastAsia"/>
+              </w:rPr>
+              <w:t>dataset.</w:t>
             </w:r>
             <w:r>
               <w:t>DatasetPersistentId</w:t>
             </w:r>
+            <w:proofErr w:type="spellEnd"/>
             <w:r>
               <w:rPr>
                 <w:rFonts w:hint="eastAsia"/>
@@ -248,11 +276,19 @@
               <w:rPr>
                 <w:rFonts w:hint="eastAsia"/>
               </w:rPr>
-              <w:t>Dataset access URL: {{ dataset.</w:t>
+              <w:t xml:space="preserve">Dataset access URL: {{ </w:t>
+            </w:r>
+            <w:proofErr w:type="spellStart"/>
+            <w:r>
+              <w:rPr>
+                <w:rFonts w:hint="eastAsia"/>
+              </w:rPr>
+              <w:t>dataset.</w:t>
             </w:r>
             <w:r>
               <w:t>DatasetURL</w:t>
             </w:r>
+            <w:proofErr w:type="spellEnd"/>
             <w:r>
               <w:rPr>
                 <w:rFonts w:hint="eastAsia"/>
@@ -1107,255 +1143,266 @@
             </w:tcMar>
             <w:hideMark/>
           </w:tcPr>
+          <w:p/>
+        </w:tc>
+        <w:tc>
+          <w:tcPr>
+            <w:tcW w:w="0" w:type="auto"/>
+            <w:tcBorders>
+              <w:top w:val="single" w:sz="8" w:space="0" w:color="000000"/>
+              <w:left w:val="single" w:sz="8" w:space="0" w:color="000000"/>
+              <w:bottom w:val="single" w:sz="8" w:space="0" w:color="000000"/>
+              <w:right w:val="single" w:sz="8" w:space="0" w:color="000000"/>
+            </w:tcBorders>
+            <w:shd w:val="clear" w:color="auto" w:fill="EFEFEF"/>
+            <w:tcMar>
+              <w:top w:w="100" w:type="dxa"/>
+              <w:left w:w="100" w:type="dxa"/>
+              <w:bottom w:w="100" w:type="dxa"/>
+              <w:right w:w="100" w:type="dxa"/>
+            </w:tcMar>
+          </w:tcPr>
+          <w:p/>
+        </w:tc>
+        <w:tc>
+          <w:tcPr>
+            <w:tcW w:w="0" w:type="auto"/>
+            <w:tcBorders>
+              <w:top w:val="single" w:sz="8" w:space="0" w:color="000000"/>
+              <w:left w:val="single" w:sz="8" w:space="0" w:color="000000"/>
+              <w:bottom w:val="single" w:sz="8" w:space="0" w:color="000000"/>
+              <w:right w:val="single" w:sz="8" w:space="0" w:color="000000"/>
+            </w:tcBorders>
+            <w:shd w:val="clear" w:color="auto" w:fill="EFEFEF"/>
+            <w:tcMar>
+              <w:top w:w="100" w:type="dxa"/>
+              <w:left w:w="100" w:type="dxa"/>
+              <w:bottom w:w="100" w:type="dxa"/>
+              <w:right w:w="100" w:type="dxa"/>
+            </w:tcMar>
+            <w:hideMark/>
+          </w:tcPr>
           <w:p>
             <w:pPr>
               <w:rPr>
                 <w:lang w:val="en-US"/>
               </w:rPr>
             </w:pPr>
-            <w:r>
-              <w:rPr>
-                <w:lang w:val="en-US"/>
-              </w:rPr>
-              <w:t>{% if template_dict.</w:t>
+          </w:p>
+        </w:tc>
+        <w:tc>
+          <w:tcPr>
+            <w:tcW w:w="0" w:type="auto"/>
+            <w:tcBorders>
+              <w:top w:val="single" w:sz="8" w:space="0" w:color="000000"/>
+              <w:left w:val="single" w:sz="8" w:space="0" w:color="000000"/>
+              <w:bottom w:val="single" w:sz="8" w:space="0" w:color="000000"/>
+              <w:right w:val="single" w:sz="8" w:space="0" w:color="000000"/>
+            </w:tcBorders>
+            <w:shd w:val="clear" w:color="auto" w:fill="EFEFEF"/>
+            <w:tcMar>
+              <w:top w:w="100" w:type="dxa"/>
+              <w:left w:w="100" w:type="dxa"/>
+              <w:bottom w:w="100" w:type="dxa"/>
+              <w:right w:w="100" w:type="dxa"/>
+            </w:tcMar>
+            <w:hideMark/>
+          </w:tcPr>
+          <w:p/>
+        </w:tc>
+        <w:tc>
+          <w:tcPr>
+            <w:tcW w:w="0" w:type="auto"/>
+            <w:tcBorders>
+              <w:top w:val="single" w:sz="8" w:space="0" w:color="000000"/>
+              <w:left w:val="single" w:sz="8" w:space="0" w:color="000000"/>
+              <w:bottom w:val="single" w:sz="8" w:space="0" w:color="000000"/>
+              <w:right w:val="single" w:sz="8" w:space="0" w:color="000000"/>
+            </w:tcBorders>
+            <w:shd w:val="clear" w:color="auto" w:fill="EFEFEF"/>
+            <w:tcMar>
+              <w:top w:w="100" w:type="dxa"/>
+              <w:left w:w="100" w:type="dxa"/>
+              <w:bottom w:w="100" w:type="dxa"/>
+              <w:right w:w="100" w:type="dxa"/>
+            </w:tcMar>
+          </w:tcPr>
+          <w:p>
+            <w:pPr>
+              <w:rPr>
+                <w:lang w:val="en-US"/>
+              </w:rPr>
+            </w:pPr>
+            <w:r>
+              <w:rPr>
+                <w:lang w:val="en-US"/>
+              </w:rPr>
+              <w:t>X</w:t>
+            </w:r>
+          </w:p>
+        </w:tc>
+        <w:tc>
+          <w:tcPr>
+            <w:tcW w:w="0" w:type="auto"/>
+            <w:tcBorders>
+              <w:top w:val="single" w:sz="8" w:space="0" w:color="000000"/>
+              <w:left w:val="single" w:sz="8" w:space="0" w:color="000000"/>
+              <w:bottom w:val="single" w:sz="8" w:space="0" w:color="000000"/>
+              <w:right w:val="single" w:sz="8" w:space="0" w:color="000000"/>
+            </w:tcBorders>
+            <w:shd w:val="clear" w:color="auto" w:fill="EFEFEF"/>
+            <w:tcMar>
+              <w:top w:w="100" w:type="dxa"/>
+              <w:left w:w="100" w:type="dxa"/>
+              <w:bottom w:w="100" w:type="dxa"/>
+              <w:right w:w="100" w:type="dxa"/>
+            </w:tcMar>
+            <w:hideMark/>
+          </w:tcPr>
+          <w:p>
+            <w:pPr>
+              <w:rPr>
+                <w:lang w:val="en-US"/>
+              </w:rPr>
+            </w:pPr>
+            <w:r>
+              <w:rPr>
+                <w:lang w:val="en-US"/>
+              </w:rPr>
+              <w:t xml:space="preserve">If applicable, list any previously created </w:t>
+            </w:r>
+            <w:proofErr w:type="spellStart"/>
+            <w:r>
+              <w:rPr>
+                <w:lang w:val="en-US"/>
+              </w:rPr>
+              <w:t>dataverse</w:t>
+            </w:r>
+            <w:proofErr w:type="spellEnd"/>
+            <w:r>
+              <w:rPr>
+                <w:lang w:val="en-US"/>
+              </w:rPr>
+              <w:t xml:space="preserve"> that contains the depositors' dataset</w:t>
+            </w:r>
+            <w:r>
+              <w:rPr>
+                <w:lang w:val="en-US"/>
+              </w:rPr>
+              <w:t>:</w:t>
+            </w:r>
+            <w:r>
+              <w:rPr>
+                <w:lang w:val="en-US"/>
+              </w:rPr>
+              <w:br/>
+            </w:r>
+            <w:r>
+              <w:t xml:space="preserve">{% for item in </w:t>
+            </w:r>
+            <w:proofErr w:type="spellStart"/>
+            <w:r>
+              <w:t>template_dict.dv_record.comments</w:t>
+            </w:r>
+            <w:proofErr w:type="spellEnd"/>
+            <w:r>
+              <w:t xml:space="preserve"> %} </w:t>
+            </w:r>
+          </w:p>
+          <w:p>
+            <w:r>
+              <w:t xml:space="preserve">{% for author, </w:t>
+            </w:r>
+            <w:proofErr w:type="spellStart"/>
+            <w:r>
+              <w:t>dataverses</w:t>
+            </w:r>
+            <w:proofErr w:type="spellEnd"/>
+            <w:r>
+              <w:t xml:space="preserve"> in </w:t>
+            </w:r>
+            <w:proofErr w:type="spellStart"/>
+            <w:r>
+              <w:t>item.items</w:t>
+            </w:r>
+            <w:proofErr w:type="spellEnd"/>
+            <w:r>
+              <w:t>() %} {{ author }}</w:t>
             </w:r>
             <w:r>
               <w:rPr>
                 <w:rFonts w:hint="eastAsia"/>
-                <w:lang w:val="en-US"/>
-              </w:rPr>
-              <w:t>dv_record</w:t>
-            </w:r>
-            <w:r>
-              <w:rPr>
-                <w:lang w:val="en-US"/>
-              </w:rPr>
-              <w:t xml:space="preserve">.comments|length </w:t>
+              </w:rPr>
+              <w:t>:</w:t>
+            </w:r>
+          </w:p>
+          <w:p>
+            <w:r>
+              <w:t xml:space="preserve">{% for dataverse in </w:t>
+            </w:r>
+            <w:proofErr w:type="spellStart"/>
+            <w:r>
+              <w:t>dataverses</w:t>
+            </w:r>
+            <w:proofErr w:type="spellEnd"/>
+            <w:r>
+              <w:t xml:space="preserve"> %} </w:t>
+            </w:r>
+            <w:r>
+              <w:t xml:space="preserve">{{ </w:t>
+            </w:r>
+            <w:proofErr w:type="spellStart"/>
+            <w:r>
+              <w:t>loop.index</w:t>
+            </w:r>
+            <w:proofErr w:type="spellEnd"/>
+            <w:r>
+              <w:t xml:space="preserve"> }}.</w:t>
             </w:r>
             <w:r>
               <w:rPr>
                 <w:rFonts w:hint="eastAsia"/>
-                <w:lang w:val="en-US"/>
-              </w:rPr>
-              <w:t>&gt;</w:t>
-            </w:r>
-            <w:r>
-              <w:rPr>
-                <w:lang w:val="en-US"/>
-              </w:rPr>
-              <w:t xml:space="preserve"> 0 %}X{% endif %}</w:t>
-            </w:r>
-          </w:p>
-          <w:p/>
-        </w:tc>
-        <w:tc>
-          <w:tcPr>
-            <w:tcW w:w="0" w:type="auto"/>
-            <w:tcBorders>
-              <w:top w:val="single" w:sz="8" w:space="0" w:color="000000"/>
-              <w:left w:val="single" w:sz="8" w:space="0" w:color="000000"/>
-              <w:bottom w:val="single" w:sz="8" w:space="0" w:color="000000"/>
-              <w:right w:val="single" w:sz="8" w:space="0" w:color="000000"/>
-            </w:tcBorders>
-            <w:shd w:val="clear" w:color="auto" w:fill="EFEFEF"/>
-            <w:tcMar>
-              <w:top w:w="100" w:type="dxa"/>
-              <w:left w:w="100" w:type="dxa"/>
-              <w:bottom w:w="100" w:type="dxa"/>
-              <w:right w:w="100" w:type="dxa"/>
-            </w:tcMar>
-          </w:tcPr>
-          <w:p/>
-        </w:tc>
-        <w:tc>
-          <w:tcPr>
-            <w:tcW w:w="0" w:type="auto"/>
-            <w:tcBorders>
-              <w:top w:val="single" w:sz="8" w:space="0" w:color="000000"/>
-              <w:left w:val="single" w:sz="8" w:space="0" w:color="000000"/>
-              <w:bottom w:val="single" w:sz="8" w:space="0" w:color="000000"/>
-              <w:right w:val="single" w:sz="8" w:space="0" w:color="000000"/>
-            </w:tcBorders>
-            <w:shd w:val="clear" w:color="auto" w:fill="EFEFEF"/>
-            <w:tcMar>
-              <w:top w:w="100" w:type="dxa"/>
-              <w:left w:w="100" w:type="dxa"/>
-              <w:bottom w:w="100" w:type="dxa"/>
-              <w:right w:w="100" w:type="dxa"/>
-            </w:tcMar>
-            <w:hideMark/>
-          </w:tcPr>
-          <w:p>
-            <w:pPr>
-              <w:rPr>
-                <w:lang w:val="en-US"/>
-              </w:rPr>
-            </w:pPr>
-            <w:r>
-              <w:rPr>
-                <w:lang w:val="en-US"/>
-              </w:rPr>
-              <w:t>{% if template_dict.</w:t>
-            </w:r>
-            <w:r>
-              <w:rPr>
-                <w:rFonts w:hint="eastAsia"/>
-                <w:lang w:val="en-US"/>
-              </w:rPr>
-              <w:t>dv_record</w:t>
-            </w:r>
-            <w:r>
-              <w:rPr>
-                <w:lang w:val="en-US"/>
-              </w:rPr>
-              <w:t xml:space="preserve">.comments|length </w:t>
-            </w:r>
-            <w:r>
-              <w:rPr>
-                <w:rFonts w:hint="eastAsia"/>
-                <w:lang w:val="en-US"/>
-              </w:rPr>
-              <w:t>==</w:t>
-            </w:r>
-            <w:r>
-              <w:rPr>
-                <w:lang w:val="en-US"/>
-              </w:rPr>
-              <w:t xml:space="preserve"> 0 %}X{% endif %}</w:t>
-            </w:r>
-          </w:p>
-          <w:p>
-            <w:pPr>
-              <w:rPr>
-                <w:lang w:val="en-US"/>
-              </w:rPr>
-            </w:pPr>
-          </w:p>
-        </w:tc>
-        <w:tc>
-          <w:tcPr>
-            <w:tcW w:w="0" w:type="auto"/>
-            <w:tcBorders>
-              <w:top w:val="single" w:sz="8" w:space="0" w:color="000000"/>
-              <w:left w:val="single" w:sz="8" w:space="0" w:color="000000"/>
-              <w:bottom w:val="single" w:sz="8" w:space="0" w:color="000000"/>
-              <w:right w:val="single" w:sz="8" w:space="0" w:color="000000"/>
-            </w:tcBorders>
-            <w:shd w:val="clear" w:color="auto" w:fill="EFEFEF"/>
-            <w:tcMar>
-              <w:top w:w="100" w:type="dxa"/>
-              <w:left w:w="100" w:type="dxa"/>
-              <w:bottom w:w="100" w:type="dxa"/>
-              <w:right w:w="100" w:type="dxa"/>
-            </w:tcMar>
-            <w:hideMark/>
-          </w:tcPr>
-          <w:p/>
-        </w:tc>
-        <w:tc>
-          <w:tcPr>
-            <w:tcW w:w="0" w:type="auto"/>
-            <w:tcBorders>
-              <w:top w:val="single" w:sz="8" w:space="0" w:color="000000"/>
-              <w:left w:val="single" w:sz="8" w:space="0" w:color="000000"/>
-              <w:bottom w:val="single" w:sz="8" w:space="0" w:color="000000"/>
-              <w:right w:val="single" w:sz="8" w:space="0" w:color="000000"/>
-            </w:tcBorders>
-            <w:shd w:val="clear" w:color="auto" w:fill="EFEFEF"/>
-            <w:tcMar>
-              <w:top w:w="100" w:type="dxa"/>
-              <w:left w:w="100" w:type="dxa"/>
-              <w:bottom w:w="100" w:type="dxa"/>
-              <w:right w:w="100" w:type="dxa"/>
-            </w:tcMar>
-            <w:hideMark/>
-          </w:tcPr>
-          <w:p/>
-        </w:tc>
-        <w:tc>
-          <w:tcPr>
-            <w:tcW w:w="0" w:type="auto"/>
-            <w:tcBorders>
-              <w:top w:val="single" w:sz="8" w:space="0" w:color="000000"/>
-              <w:left w:val="single" w:sz="8" w:space="0" w:color="000000"/>
-              <w:bottom w:val="single" w:sz="8" w:space="0" w:color="000000"/>
-              <w:right w:val="single" w:sz="8" w:space="0" w:color="000000"/>
-            </w:tcBorders>
-            <w:shd w:val="clear" w:color="auto" w:fill="EFEFEF"/>
-            <w:tcMar>
-              <w:top w:w="100" w:type="dxa"/>
-              <w:left w:w="100" w:type="dxa"/>
-              <w:bottom w:w="100" w:type="dxa"/>
-              <w:right w:w="100" w:type="dxa"/>
-            </w:tcMar>
-            <w:hideMark/>
-          </w:tcPr>
-          <w:p>
-            <w:pPr>
-              <w:rPr>
-                <w:lang w:val="en-US"/>
-              </w:rPr>
-            </w:pPr>
-            <w:r>
-              <w:rPr>
-                <w:lang w:val="en-US"/>
-              </w:rPr>
-              <w:t>If applicable, list any previously created dataverse that contains the depositors' dataset</w:t>
-            </w:r>
-            <w:r>
-              <w:rPr>
-                <w:lang w:val="en-US"/>
-              </w:rPr>
-              <w:t>:</w:t>
-            </w:r>
-            <w:r>
-              <w:rPr>
-                <w:lang w:val="en-US"/>
-              </w:rPr>
+              </w:rPr>
+              <w:t xml:space="preserve"> </w:t>
+            </w:r>
+            <w:r>
+              <w:t>{{ dataverse }}</w:t>
+            </w:r>
+            <w:r>
               <w:br/>
             </w:r>
             <w:r>
-              <w:t xml:space="preserve">{% for item in template_dict.dv_record.comments %} </w:t>
-            </w:r>
-          </w:p>
-          <w:p>
-            <w:r>
-              <w:t>{% for author, dataverses in item.items() %} {{ author }}</w:t>
-            </w:r>
-            <w:r>
-              <w:rPr>
-                <w:rFonts w:hint="eastAsia"/>
-              </w:rPr>
-              <w:t>:</w:t>
-            </w:r>
-          </w:p>
-          <w:p>
-            <w:r>
-              <w:t xml:space="preserve">{% for dataverse in dataverses %} </w:t>
-            </w:r>
-            <w:r>
-              <w:t>{{ loop.index }}.</w:t>
-            </w:r>
-            <w:r>
-              <w:rPr>
-                <w:rFonts w:hint="eastAsia"/>
-              </w:rPr>
-              <w:t xml:space="preserve"> </w:t>
-            </w:r>
-            <w:r>
-              <w:t>{{ dataverse }}</w:t>
+              <w:t xml:space="preserve">{% </w:t>
+            </w:r>
+            <w:proofErr w:type="spellStart"/>
+            <w:r>
+              <w:t>endfor</w:t>
+            </w:r>
+            <w:proofErr w:type="spellEnd"/>
+            <w:r>
+              <w:t xml:space="preserve"> %} </w:t>
             </w:r>
             <w:r>
               <w:br/>
             </w:r>
             <w:r>
-              <w:t xml:space="preserve">{% endfor %} </w:t>
-            </w:r>
-            <w:r>
-              <w:br/>
-            </w:r>
-            <w:r>
-              <w:t>{% endfor %} {% endfor %}</w:t>
+              <w:t xml:space="preserve">{% </w:t>
+            </w:r>
+            <w:proofErr w:type="spellStart"/>
+            <w:r>
+              <w:t>endfor</w:t>
+            </w:r>
+            <w:proofErr w:type="spellEnd"/>
+            <w:r>
+              <w:t xml:space="preserve"> %} {% </w:t>
+            </w:r>
+            <w:proofErr w:type="spellStart"/>
+            <w:r>
+              <w:t>endfor</w:t>
+            </w:r>
+            <w:proofErr w:type="spellEnd"/>
+            <w:r>
+              <w:t xml:space="preserve"> %}</w:t>
             </w:r>
           </w:p>
         </w:tc>
@@ -1519,336 +1566,245 @@
             </w:tcMar>
             <w:hideMark/>
           </w:tcPr>
-          <w:p>
-            <w:r>
-              <w:rPr>
-                <w:lang w:val="en-US"/>
-              </w:rPr>
-              <w:lastRenderedPageBreak/>
-              <w:t>{% if template_dict.</w:t>
-            </w:r>
-            <w:r>
-              <w:rPr>
-                <w:rFonts w:ascii="Consolas" w:eastAsia="Times New Roman" w:hAnsi="Consolas" w:cs="Times New Roman"/>
-                <w:color w:val="9CDCFE"/>
-                <w:kern w:val="0"/>
-                <w:sz w:val="21"/>
-                <w:szCs w:val="21"/>
-                <w14:ligatures w14:val="none"/>
+          <w:p/>
+        </w:tc>
+        <w:tc>
+          <w:tcPr>
+            <w:tcW w:w="0" w:type="auto"/>
+            <w:tcBorders>
+              <w:top w:val="single" w:sz="8" w:space="0" w:color="000000"/>
+              <w:left w:val="single" w:sz="8" w:space="0" w:color="000000"/>
+              <w:bottom w:val="single" w:sz="8" w:space="0" w:color="000000"/>
+              <w:right w:val="single" w:sz="8" w:space="0" w:color="000000"/>
+            </w:tcBorders>
+            <w:shd w:val="clear" w:color="auto" w:fill="EFEFEF"/>
+            <w:tcMar>
+              <w:top w:w="100" w:type="dxa"/>
+              <w:left w:w="100" w:type="dxa"/>
+              <w:bottom w:w="100" w:type="dxa"/>
+              <w:right w:w="100" w:type="dxa"/>
+            </w:tcMar>
+            <w:hideMark/>
+          </w:tcPr>
+          <w:p/>
+        </w:tc>
+        <w:tc>
+          <w:tcPr>
+            <w:tcW w:w="0" w:type="auto"/>
+            <w:tcBorders>
+              <w:top w:val="single" w:sz="8" w:space="0" w:color="000000"/>
+              <w:left w:val="single" w:sz="8" w:space="0" w:color="000000"/>
+              <w:bottom w:val="single" w:sz="8" w:space="0" w:color="000000"/>
+              <w:right w:val="single" w:sz="8" w:space="0" w:color="000000"/>
+            </w:tcBorders>
+            <w:shd w:val="clear" w:color="auto" w:fill="EFEFEF"/>
+            <w:tcMar>
+              <w:top w:w="100" w:type="dxa"/>
+              <w:left w:w="100" w:type="dxa"/>
+              <w:bottom w:w="100" w:type="dxa"/>
+              <w:right w:w="100" w:type="dxa"/>
+            </w:tcMar>
+            <w:hideMark/>
+          </w:tcPr>
+          <w:p/>
+        </w:tc>
+        <w:tc>
+          <w:tcPr>
+            <w:tcW w:w="0" w:type="auto"/>
+            <w:tcBorders>
+              <w:top w:val="single" w:sz="8" w:space="0" w:color="000000"/>
+              <w:left w:val="single" w:sz="8" w:space="0" w:color="000000"/>
+              <w:bottom w:val="single" w:sz="8" w:space="0" w:color="000000"/>
+              <w:right w:val="single" w:sz="8" w:space="0" w:color="000000"/>
+            </w:tcBorders>
+            <w:shd w:val="clear" w:color="auto" w:fill="EFEFEF"/>
+            <w:tcMar>
+              <w:top w:w="100" w:type="dxa"/>
+              <w:left w:w="100" w:type="dxa"/>
+              <w:bottom w:w="100" w:type="dxa"/>
+              <w:right w:w="100" w:type="dxa"/>
+            </w:tcMar>
+            <w:hideMark/>
+          </w:tcPr>
+          <w:p/>
+        </w:tc>
+        <w:tc>
+          <w:tcPr>
+            <w:tcW w:w="0" w:type="auto"/>
+            <w:tcBorders>
+              <w:top w:val="single" w:sz="8" w:space="0" w:color="000000"/>
+              <w:left w:val="single" w:sz="8" w:space="0" w:color="000000"/>
+              <w:bottom w:val="single" w:sz="8" w:space="0" w:color="000000"/>
+              <w:right w:val="single" w:sz="8" w:space="0" w:color="000000"/>
+            </w:tcBorders>
+            <w:shd w:val="clear" w:color="auto" w:fill="EFEFEF"/>
+            <w:tcMar>
+              <w:top w:w="100" w:type="dxa"/>
+              <w:left w:w="100" w:type="dxa"/>
+              <w:bottom w:w="100" w:type="dxa"/>
+              <w:right w:w="100" w:type="dxa"/>
+            </w:tcMar>
+            <w:hideMark/>
+          </w:tcPr>
+          <w:p>
+            <w:r>
+              <w:t>X</w:t>
+            </w:r>
+          </w:p>
+        </w:tc>
+        <w:tc>
+          <w:tcPr>
+            <w:tcW w:w="0" w:type="auto"/>
+            <w:tcBorders>
+              <w:top w:val="single" w:sz="8" w:space="0" w:color="000000"/>
+              <w:left w:val="single" w:sz="8" w:space="0" w:color="000000"/>
+              <w:bottom w:val="single" w:sz="8" w:space="0" w:color="000000"/>
+              <w:right w:val="single" w:sz="8" w:space="0" w:color="000000"/>
+            </w:tcBorders>
+            <w:shd w:val="clear" w:color="auto" w:fill="EFEFEF"/>
+            <w:tcMar>
+              <w:top w:w="100" w:type="dxa"/>
+              <w:left w:w="100" w:type="dxa"/>
+              <w:bottom w:w="100" w:type="dxa"/>
+              <w:right w:w="100" w:type="dxa"/>
+            </w:tcMar>
+            <w:hideMark/>
+          </w:tcPr>
+          <w:p>
+            <w:pPr>
+              <w:rPr>
+                <w:lang w:val="en-US"/>
+              </w:rPr>
+            </w:pPr>
+            <w:r>
+              <w:rPr>
+                <w:rFonts w:hint="eastAsia"/>
+                <w:lang w:val="en-US"/>
+              </w:rPr>
+              <w:t xml:space="preserve">List the </w:t>
+            </w:r>
+            <w:r>
+              <w:rPr>
+                <w:lang w:val="en-US"/>
+              </w:rPr>
+              <w:t xml:space="preserve">parent </w:t>
+            </w:r>
+            <w:proofErr w:type="spellStart"/>
+            <w:r>
+              <w:rPr>
+                <w:rFonts w:hint="eastAsia"/>
+                <w:lang w:val="en-US"/>
+              </w:rPr>
+              <w:t>d</w:t>
+            </w:r>
+            <w:r>
+              <w:rPr>
+                <w:rFonts w:hint="eastAsia"/>
+                <w:lang w:val="en-US"/>
+              </w:rPr>
+              <w:t>ataverse</w:t>
+            </w:r>
+            <w:proofErr w:type="spellEnd"/>
+            <w:r>
+              <w:rPr>
+                <w:rFonts w:hint="eastAsia"/>
+                <w:lang w:val="en-US"/>
               </w:rPr>
               <w:t xml:space="preserve"> </w:t>
             </w:r>
             <w:r>
-              <w:t>name_name_of_dataverse</w:t>
-            </w:r>
-            <w:r>
-              <w:rPr>
-                <w:lang w:val="en-US"/>
-              </w:rPr>
-              <w:t xml:space="preserve"> == </w:t>
-            </w:r>
-            <w:r>
-              <w:rPr>
-                <w:lang w:val="en-US"/>
-              </w:rPr>
-              <w:t>‘</w:t>
-            </w:r>
-            <w:r>
-              <w:rPr>
-                <w:lang w:val="en-US"/>
-              </w:rPr>
-              <w:t>University of Toronto Dataverse</w:t>
-            </w:r>
-            <w:r>
-              <w:rPr>
-                <w:lang w:val="en-US"/>
-              </w:rPr>
-              <w:t>’</w:t>
-            </w:r>
-            <w:r>
-              <w:rPr>
-                <w:lang w:val="en-US"/>
-              </w:rPr>
-              <w:t xml:space="preserve"> %}X{% endif %}</w:t>
-            </w:r>
-          </w:p>
-        </w:tc>
-        <w:tc>
-          <w:tcPr>
-            <w:tcW w:w="0" w:type="auto"/>
-            <w:tcBorders>
-              <w:top w:val="single" w:sz="8" w:space="0" w:color="000000"/>
-              <w:left w:val="single" w:sz="8" w:space="0" w:color="000000"/>
-              <w:bottom w:val="single" w:sz="8" w:space="0" w:color="000000"/>
-              <w:right w:val="single" w:sz="8" w:space="0" w:color="000000"/>
-            </w:tcBorders>
-            <w:shd w:val="clear" w:color="auto" w:fill="EFEFEF"/>
-            <w:tcMar>
-              <w:top w:w="100" w:type="dxa"/>
-              <w:left w:w="100" w:type="dxa"/>
-              <w:bottom w:w="100" w:type="dxa"/>
-              <w:right w:w="100" w:type="dxa"/>
-            </w:tcMar>
-            <w:hideMark/>
-          </w:tcPr>
-          <w:p/>
-        </w:tc>
-        <w:tc>
-          <w:tcPr>
-            <w:tcW w:w="0" w:type="auto"/>
-            <w:tcBorders>
-              <w:top w:val="single" w:sz="8" w:space="0" w:color="000000"/>
-              <w:left w:val="single" w:sz="8" w:space="0" w:color="000000"/>
-              <w:bottom w:val="single" w:sz="8" w:space="0" w:color="000000"/>
-              <w:right w:val="single" w:sz="8" w:space="0" w:color="000000"/>
-            </w:tcBorders>
-            <w:shd w:val="clear" w:color="auto" w:fill="EFEFEF"/>
-            <w:tcMar>
-              <w:top w:w="100" w:type="dxa"/>
-              <w:left w:w="100" w:type="dxa"/>
-              <w:bottom w:w="100" w:type="dxa"/>
-              <w:right w:w="100" w:type="dxa"/>
-            </w:tcMar>
-            <w:hideMark/>
-          </w:tcPr>
-          <w:p>
-            <w:r>
-              <w:rPr>
-                <w:lang w:val="en-US"/>
-              </w:rPr>
-              <w:t>{% if template_dict.</w:t>
-            </w:r>
-            <w:r>
-              <w:rPr>
-                <w:rFonts w:ascii="Consolas" w:eastAsia="Times New Roman" w:hAnsi="Consolas" w:cs="Times New Roman"/>
-                <w:color w:val="9CDCFE"/>
-                <w:kern w:val="0"/>
-                <w:sz w:val="21"/>
-                <w:szCs w:val="21"/>
-                <w14:ligatures w14:val="none"/>
-              </w:rPr>
-              <w:t xml:space="preserve"> </w:t>
-            </w:r>
-            <w:r>
-              <w:t>name_name_of_dataverse</w:t>
-            </w:r>
-            <w:r>
-              <w:rPr>
-                <w:lang w:val="en-US"/>
-              </w:rPr>
-              <w:t xml:space="preserve"> </w:t>
-            </w:r>
-            <w:r>
-              <w:rPr>
-                <w:lang w:val="en-US"/>
-              </w:rPr>
-              <w:t>!</w:t>
-            </w:r>
-            <w:r>
-              <w:rPr>
-                <w:lang w:val="en-US"/>
-              </w:rPr>
-              <w:t xml:space="preserve">= </w:t>
-            </w:r>
-            <w:r>
-              <w:rPr>
-                <w:lang w:val="en-US"/>
-              </w:rPr>
-              <w:t>‘</w:t>
-            </w:r>
-            <w:r>
-              <w:rPr>
-                <w:lang w:val="en-US"/>
-              </w:rPr>
-              <w:t>University of Toronto Dataverse</w:t>
-            </w:r>
-            <w:r>
-              <w:rPr>
-                <w:lang w:val="en-US"/>
-              </w:rPr>
-              <w:t>’</w:t>
-            </w:r>
-            <w:r>
-              <w:rPr>
-                <w:lang w:val="en-US"/>
-              </w:rPr>
-              <w:t xml:space="preserve"> %}X{% endif %}</w:t>
-            </w:r>
-          </w:p>
-        </w:tc>
-        <w:tc>
-          <w:tcPr>
-            <w:tcW w:w="0" w:type="auto"/>
-            <w:tcBorders>
-              <w:top w:val="single" w:sz="8" w:space="0" w:color="000000"/>
-              <w:left w:val="single" w:sz="8" w:space="0" w:color="000000"/>
-              <w:bottom w:val="single" w:sz="8" w:space="0" w:color="000000"/>
-              <w:right w:val="single" w:sz="8" w:space="0" w:color="000000"/>
-            </w:tcBorders>
-            <w:shd w:val="clear" w:color="auto" w:fill="EFEFEF"/>
-            <w:tcMar>
-              <w:top w:w="100" w:type="dxa"/>
-              <w:left w:w="100" w:type="dxa"/>
-              <w:bottom w:w="100" w:type="dxa"/>
-              <w:right w:w="100" w:type="dxa"/>
-            </w:tcMar>
-            <w:hideMark/>
-          </w:tcPr>
-          <w:p/>
-        </w:tc>
-        <w:tc>
-          <w:tcPr>
-            <w:tcW w:w="0" w:type="auto"/>
-            <w:tcBorders>
-              <w:top w:val="single" w:sz="8" w:space="0" w:color="000000"/>
-              <w:left w:val="single" w:sz="8" w:space="0" w:color="000000"/>
-              <w:bottom w:val="single" w:sz="8" w:space="0" w:color="000000"/>
-              <w:right w:val="single" w:sz="8" w:space="0" w:color="000000"/>
-            </w:tcBorders>
-            <w:shd w:val="clear" w:color="auto" w:fill="EFEFEF"/>
-            <w:tcMar>
-              <w:top w:w="100" w:type="dxa"/>
-              <w:left w:w="100" w:type="dxa"/>
-              <w:bottom w:w="100" w:type="dxa"/>
-              <w:right w:w="100" w:type="dxa"/>
-            </w:tcMar>
-            <w:hideMark/>
-          </w:tcPr>
-          <w:p/>
-        </w:tc>
-        <w:tc>
-          <w:tcPr>
-            <w:tcW w:w="0" w:type="auto"/>
-            <w:tcBorders>
-              <w:top w:val="single" w:sz="8" w:space="0" w:color="000000"/>
-              <w:left w:val="single" w:sz="8" w:space="0" w:color="000000"/>
-              <w:bottom w:val="single" w:sz="8" w:space="0" w:color="000000"/>
-              <w:right w:val="single" w:sz="8" w:space="0" w:color="000000"/>
-            </w:tcBorders>
-            <w:shd w:val="clear" w:color="auto" w:fill="EFEFEF"/>
-            <w:tcMar>
-              <w:top w:w="100" w:type="dxa"/>
-              <w:left w:w="100" w:type="dxa"/>
-              <w:bottom w:w="100" w:type="dxa"/>
-              <w:right w:w="100" w:type="dxa"/>
-            </w:tcMar>
-            <w:hideMark/>
-          </w:tcPr>
-          <w:p>
-            <w:pPr>
-              <w:rPr>
-                <w:lang w:val="en-US"/>
-              </w:rPr>
-            </w:pPr>
+              <w:rPr>
+                <w:lang w:val="en-US"/>
+              </w:rPr>
+              <w:t>collection</w:t>
+            </w:r>
             <w:r>
               <w:rPr>
                 <w:rFonts w:hint="eastAsia"/>
                 <w:lang w:val="en-US"/>
               </w:rPr>
-              <w:t xml:space="preserve">List the </w:t>
-            </w:r>
-            <w:r>
-              <w:rPr>
-                <w:lang w:val="en-US"/>
-              </w:rPr>
-              <w:t xml:space="preserve">parent </w:t>
+              <w:t xml:space="preserve"> name:</w:t>
+            </w:r>
+            <w:r>
+              <w:rPr>
+                <w:lang w:val="en-US"/>
+              </w:rPr>
+              <w:br/>
             </w:r>
             <w:r>
               <w:rPr>
                 <w:rFonts w:hint="eastAsia"/>
                 <w:lang w:val="en-US"/>
               </w:rPr>
-              <w:t>d</w:t>
-            </w:r>
+              <w:t xml:space="preserve">{{ </w:t>
+            </w:r>
+            <w:proofErr w:type="spellStart"/>
+            <w:r>
+              <w:t>template_dict</w:t>
+            </w:r>
+            <w:proofErr w:type="spellEnd"/>
             <w:r>
               <w:rPr>
                 <w:rFonts w:hint="eastAsia"/>
-                <w:lang w:val="en-US"/>
-              </w:rPr>
-              <w:t xml:space="preserve">ataverse </w:t>
-            </w:r>
-            <w:r>
-              <w:rPr>
-                <w:lang w:val="en-US"/>
-              </w:rPr>
-              <w:t>collection</w:t>
-            </w:r>
+              </w:rPr>
+              <w:t>.</w:t>
+            </w:r>
+            <w:proofErr w:type="spellStart"/>
+            <w:r>
+              <w:rPr>
+                <w:lang w:val="en-US"/>
+              </w:rPr>
+              <w:t>ds_tree_info</w:t>
+            </w:r>
+            <w:r>
+              <w:rPr>
+                <w:lang w:val="en-US"/>
+              </w:rPr>
+              <w:t>.</w:t>
+            </w:r>
+            <w:r>
+              <w:rPr>
+                <w:lang w:val="en-US"/>
+              </w:rPr>
+              <w:t>parentDataverseName</w:t>
+            </w:r>
+            <w:proofErr w:type="spellEnd"/>
             <w:r>
               <w:rPr>
                 <w:rFonts w:hint="eastAsia"/>
-                <w:lang w:val="en-US"/>
-              </w:rPr>
-              <w:t xml:space="preserve"> name:</w:t>
-            </w:r>
-            <w:r>
-              <w:rPr>
-                <w:lang w:val="en-US"/>
-              </w:rPr>
+              </w:rPr>
+              <w:t xml:space="preserve"> }}</w:t>
+            </w:r>
+          </w:p>
+          <w:p>
+            <w:r>
+              <w:t>List the dataset (full) path in the Dataverse repository</w:t>
+            </w:r>
+            <w:r>
               <w:br/>
             </w:r>
             <w:r>
               <w:rPr>
-                <w:rFonts w:hint="eastAsia"/>
                 <w:lang w:val="en-US"/>
               </w:rPr>
               <w:t xml:space="preserve">{{ </w:t>
             </w:r>
+            <w:proofErr w:type="spellStart"/>
             <w:r>
               <w:t>template_dict</w:t>
             </w:r>
-            <w:r>
-              <w:rPr>
-                <w:rFonts w:hint="eastAsia"/>
-              </w:rPr>
+            <w:proofErr w:type="spellEnd"/>
+            <w:r>
               <w:t>.</w:t>
             </w:r>
-            <w:r>
-              <w:rPr>
-                <w:lang w:val="en-US"/>
-              </w:rPr>
-              <w:t>ds_tree_info</w:t>
-            </w:r>
-            <w:r>
-              <w:rPr>
-                <w:lang w:val="en-US"/>
-              </w:rPr>
-              <w:t>.</w:t>
-            </w:r>
-            <w:r>
-              <w:rPr>
-                <w:lang w:val="en-US"/>
-              </w:rPr>
-              <w:t>parentDataverseName</w:t>
-            </w:r>
-            <w:r>
-              <w:rPr>
-                <w:rFonts w:hint="eastAsia"/>
-              </w:rPr>
-              <w:t xml:space="preserve"> }}</w:t>
-            </w:r>
-          </w:p>
-          <w:p>
-            <w:r>
-              <w:t>List the dataset (full) path in the Dataverse repository</w:t>
-            </w:r>
-            <w:r>
-              <w:br/>
-            </w:r>
-            <w:r>
-              <w:rPr>
-                <w:lang w:val="en-US"/>
-              </w:rPr>
-              <w:t xml:space="preserve">{{ </w:t>
-            </w:r>
-            <w:r>
-              <w:t>template_dict.</w:t>
-            </w:r>
+            <w:proofErr w:type="spellStart"/>
             <w:r>
               <w:rPr>
                 <w:lang w:val="en-US"/>
               </w:rPr>
               <w:t>ds_tree_info.path</w:t>
             </w:r>
+            <w:proofErr w:type="spellEnd"/>
             <w:r>
               <w:t>}}</w:t>
             </w:r>
@@ -2586,33 +2542,61 @@
               <w:rPr>
                 <w:lang w:val="en-US"/>
               </w:rPr>
-              <w:t>{% if template_dict.file_ext.comments|length == 0 %}X{% endif %}</w:t>
-            </w:r>
-          </w:p>
-        </w:tc>
-        <w:tc>
-          <w:tcPr>
-            <w:tcW w:w="0" w:type="auto"/>
-            <w:tcBorders>
-              <w:top w:val="single" w:sz="8" w:space="0" w:color="000000"/>
-              <w:left w:val="single" w:sz="8" w:space="0" w:color="000000"/>
-              <w:bottom w:val="single" w:sz="8" w:space="0" w:color="000000"/>
-              <w:right w:val="single" w:sz="8" w:space="0" w:color="000000"/>
-            </w:tcBorders>
-            <w:tcMar>
-              <w:top w:w="100" w:type="dxa"/>
-              <w:left w:w="100" w:type="dxa"/>
-              <w:bottom w:w="100" w:type="dxa"/>
-              <w:right w:w="100" w:type="dxa"/>
-            </w:tcMar>
-            <w:hideMark/>
-          </w:tcPr>
-          <w:p>
-            <w:r>
-              <w:rPr>
-                <w:lang w:val="en-US"/>
-              </w:rPr>
-              <w:t>{% if template_dict.file_ext.comments|length &gt; 0 %}X{% endif %}</w:t>
+              <w:t xml:space="preserve">{% if </w:t>
+            </w:r>
+            <w:proofErr w:type="spellStart"/>
+            <w:r>
+              <w:rPr>
+                <w:lang w:val="en-US"/>
+              </w:rPr>
+              <w:t>template_dict.file_ext.comments|length</w:t>
+            </w:r>
+            <w:proofErr w:type="spellEnd"/>
+            <w:r>
+              <w:rPr>
+                <w:lang w:val="en-US"/>
+              </w:rPr>
+              <w:t xml:space="preserve"> == 0 %}X{% endif %}</w:t>
+            </w:r>
+          </w:p>
+        </w:tc>
+        <w:tc>
+          <w:tcPr>
+            <w:tcW w:w="0" w:type="auto"/>
+            <w:tcBorders>
+              <w:top w:val="single" w:sz="8" w:space="0" w:color="000000"/>
+              <w:left w:val="single" w:sz="8" w:space="0" w:color="000000"/>
+              <w:bottom w:val="single" w:sz="8" w:space="0" w:color="000000"/>
+              <w:right w:val="single" w:sz="8" w:space="0" w:color="000000"/>
+            </w:tcBorders>
+            <w:tcMar>
+              <w:top w:w="100" w:type="dxa"/>
+              <w:left w:w="100" w:type="dxa"/>
+              <w:bottom w:w="100" w:type="dxa"/>
+              <w:right w:w="100" w:type="dxa"/>
+            </w:tcMar>
+            <w:hideMark/>
+          </w:tcPr>
+          <w:p>
+            <w:r>
+              <w:rPr>
+                <w:lang w:val="en-US"/>
+              </w:rPr>
+              <w:t xml:space="preserve">{% if </w:t>
+            </w:r>
+            <w:proofErr w:type="spellStart"/>
+            <w:r>
+              <w:rPr>
+                <w:lang w:val="en-US"/>
+              </w:rPr>
+              <w:t>template_dict.file_ext.comments|length</w:t>
+            </w:r>
+            <w:proofErr w:type="spellEnd"/>
+            <w:r>
+              <w:rPr>
+                <w:lang w:val="en-US"/>
+              </w:rPr>
+              <w:t xml:space="preserve"> &gt; 0 %}X{% endif %}</w:t>
             </w:r>
           </w:p>
         </w:tc>
@@ -2710,12 +2694,14 @@
             <w:r>
               <w:t xml:space="preserve">{% if </w:t>
             </w:r>
+            <w:proofErr w:type="spellStart"/>
             <w:r>
               <w:rPr>
                 <w:lang w:val="en-US"/>
               </w:rPr>
               <w:t>template_dict.file_open.comments</w:t>
             </w:r>
+            <w:proofErr w:type="spellEnd"/>
             <w:r>
               <w:t xml:space="preserve"> |length &gt; 0</w:t>
             </w:r>
@@ -2726,7 +2712,21 @@
               <w:rPr>
                 <w:lang w:val="en-US"/>
               </w:rPr>
-              <w:t>{% for item in template_dict.file_open.comments %}</w:t>
+              <w:t xml:space="preserve">{% for item in </w:t>
+            </w:r>
+            <w:proofErr w:type="spellStart"/>
+            <w:r>
+              <w:rPr>
+                <w:lang w:val="en-US"/>
+              </w:rPr>
+              <w:t>template_dict.file_open.comments</w:t>
+            </w:r>
+            <w:proofErr w:type="spellEnd"/>
+            <w:r>
+              <w:rPr>
+                <w:lang w:val="en-US"/>
+              </w:rPr>
+              <w:t xml:space="preserve"> %}</w:t>
             </w:r>
           </w:p>
           <w:p>
@@ -2744,7 +2744,35 @@
               <w:rPr>
                 <w:lang w:val="en-US"/>
               </w:rPr>
-              <w:t>{{ item.file_name }}{% endfor %}</w:t>
+              <w:t xml:space="preserve">{{ </w:t>
+            </w:r>
+            <w:proofErr w:type="spellStart"/>
+            <w:r>
+              <w:rPr>
+                <w:lang w:val="en-US"/>
+              </w:rPr>
+              <w:t>item.file_name</w:t>
+            </w:r>
+            <w:proofErr w:type="spellEnd"/>
+            <w:r>
+              <w:rPr>
+                <w:lang w:val="en-US"/>
+              </w:rPr>
+              <w:t xml:space="preserve"> }}{% </w:t>
+            </w:r>
+            <w:proofErr w:type="spellStart"/>
+            <w:r>
+              <w:rPr>
+                <w:lang w:val="en-US"/>
+              </w:rPr>
+              <w:t>endfor</w:t>
+            </w:r>
+            <w:proofErr w:type="spellEnd"/>
+            <w:r>
+              <w:rPr>
+                <w:lang w:val="en-US"/>
+              </w:rPr>
+              <w:t xml:space="preserve"> %}</w:t>
             </w:r>
           </w:p>
           <w:p>
@@ -2778,12 +2806,14 @@
             <w:r>
               <w:t xml:space="preserve">{% if </w:t>
             </w:r>
+            <w:proofErr w:type="spellStart"/>
             <w:r>
               <w:rPr>
                 <w:lang w:val="en-US"/>
               </w:rPr>
               <w:t>template_dict.file_open.not_checked</w:t>
             </w:r>
+            <w:proofErr w:type="spellEnd"/>
             <w:r>
               <w:t xml:space="preserve"> |length &gt; 0</w:t>
             </w:r>
@@ -2794,7 +2824,21 @@
               <w:rPr>
                 <w:lang w:val="en-US"/>
               </w:rPr>
-              <w:t>{% for item in template_dict.file_open.not_checked %}</w:t>
+              <w:t xml:space="preserve">{% for item in </w:t>
+            </w:r>
+            <w:proofErr w:type="spellStart"/>
+            <w:r>
+              <w:rPr>
+                <w:lang w:val="en-US"/>
+              </w:rPr>
+              <w:t>template_dict.file_open.not_checked</w:t>
+            </w:r>
+            <w:proofErr w:type="spellEnd"/>
+            <w:r>
+              <w:rPr>
+                <w:lang w:val="en-US"/>
+              </w:rPr>
+              <w:t xml:space="preserve"> %}</w:t>
             </w:r>
           </w:p>
           <w:p>
@@ -2812,7 +2856,35 @@
               <w:rPr>
                 <w:lang w:val="en-US"/>
               </w:rPr>
-              <w:t>{{ item.file_name }}{% endfor %}</w:t>
+              <w:t xml:space="preserve">{{ </w:t>
+            </w:r>
+            <w:proofErr w:type="spellStart"/>
+            <w:r>
+              <w:rPr>
+                <w:lang w:val="en-US"/>
+              </w:rPr>
+              <w:t>item.file_name</w:t>
+            </w:r>
+            <w:proofErr w:type="spellEnd"/>
+            <w:r>
+              <w:rPr>
+                <w:lang w:val="en-US"/>
+              </w:rPr>
+              <w:t xml:space="preserve"> }}{% </w:t>
+            </w:r>
+            <w:proofErr w:type="spellStart"/>
+            <w:r>
+              <w:rPr>
+                <w:lang w:val="en-US"/>
+              </w:rPr>
+              <w:t>endfor</w:t>
+            </w:r>
+            <w:proofErr w:type="spellEnd"/>
+            <w:r>
+              <w:rPr>
+                <w:lang w:val="en-US"/>
+              </w:rPr>
+              <w:t xml:space="preserve"> %}</w:t>
             </w:r>
           </w:p>
           <w:p>
@@ -2995,7 +3067,21 @@
               <w:rPr>
                 <w:lang w:val="en-US"/>
               </w:rPr>
-              <w:t>{% if template_dict.special_characters.comments|length == 0 %}X{% endif %}</w:t>
+              <w:t xml:space="preserve">{% if </w:t>
+            </w:r>
+            <w:proofErr w:type="spellStart"/>
+            <w:r>
+              <w:rPr>
+                <w:lang w:val="en-US"/>
+              </w:rPr>
+              <w:t>template_dict.special_characters.comments|length</w:t>
+            </w:r>
+            <w:proofErr w:type="spellEnd"/>
+            <w:r>
+              <w:rPr>
+                <w:lang w:val="en-US"/>
+              </w:rPr>
+              <w:t xml:space="preserve"> == 0 %}X{% endif %}</w:t>
             </w:r>
           </w:p>
         </w:tc>
@@ -3042,7 +3128,21 @@
               <w:rPr>
                 <w:lang w:val="en-US"/>
               </w:rPr>
-              <w:t>{% if template_dict.special_characters.comments|length &gt; 0 %}X{% endif %}</w:t>
+              <w:t xml:space="preserve">{% if </w:t>
+            </w:r>
+            <w:proofErr w:type="spellStart"/>
+            <w:r>
+              <w:rPr>
+                <w:lang w:val="en-US"/>
+              </w:rPr>
+              <w:t>template_dict.special_characters.comments|length</w:t>
+            </w:r>
+            <w:proofErr w:type="spellEnd"/>
+            <w:r>
+              <w:rPr>
+                <w:lang w:val="en-US"/>
+              </w:rPr>
+              <w:t xml:space="preserve"> &gt; 0 %}X{% endif %}</w:t>
             </w:r>
           </w:p>
         </w:tc>
@@ -3122,7 +3222,11 @@
               <w:br/>
             </w:r>
             <w:r>
-              <w:t>{% if template_dict.restricted_files.comment</w:t>
+              <w:t xml:space="preserve">{% if </w:t>
+            </w:r>
+            <w:proofErr w:type="spellStart"/>
+            <w:r>
+              <w:t>template_dict.restricted_files.comment</w:t>
             </w:r>
             <w:r>
               <w:rPr>
@@ -3131,7 +3235,11 @@
               <w:t>s</w:t>
             </w:r>
             <w:r>
-              <w:t>|length &gt; 0</w:t>
+              <w:t>|length</w:t>
+            </w:r>
+            <w:proofErr w:type="spellEnd"/>
+            <w:r>
+              <w:t xml:space="preserve"> &gt; 0</w:t>
             </w:r>
             <w:r>
               <w:t xml:space="preserve"> %}</w:t>
@@ -3140,7 +3248,21 @@
               <w:rPr>
                 <w:lang w:val="en-US"/>
               </w:rPr>
-              <w:t>{% for item in template_dict.special_characters.comments %}</w:t>
+              <w:t xml:space="preserve">{% for item in </w:t>
+            </w:r>
+            <w:proofErr w:type="spellStart"/>
+            <w:r>
+              <w:rPr>
+                <w:lang w:val="en-US"/>
+              </w:rPr>
+              <w:t>template_dict.special_characters.comments</w:t>
+            </w:r>
+            <w:proofErr w:type="spellEnd"/>
+            <w:r>
+              <w:rPr>
+                <w:lang w:val="en-US"/>
+              </w:rPr>
+              <w:t xml:space="preserve"> %}</w:t>
             </w:r>
           </w:p>
           <w:p>
@@ -3155,7 +3277,35 @@
               <w:rPr>
                 <w:lang w:val="en-US"/>
               </w:rPr>
-              <w:t>{{ item.file_name }}{% endfor %}</w:t>
+              <w:t xml:space="preserve">{{ </w:t>
+            </w:r>
+            <w:proofErr w:type="spellStart"/>
+            <w:r>
+              <w:rPr>
+                <w:lang w:val="en-US"/>
+              </w:rPr>
+              <w:t>item.file_name</w:t>
+            </w:r>
+            <w:proofErr w:type="spellEnd"/>
+            <w:r>
+              <w:rPr>
+                <w:lang w:val="en-US"/>
+              </w:rPr>
+              <w:t xml:space="preserve"> }}{% </w:t>
+            </w:r>
+            <w:proofErr w:type="spellStart"/>
+            <w:r>
+              <w:rPr>
+                <w:lang w:val="en-US"/>
+              </w:rPr>
+              <w:t>endfor</w:t>
+            </w:r>
+            <w:proofErr w:type="spellEnd"/>
+            <w:r>
+              <w:rPr>
+                <w:lang w:val="en-US"/>
+              </w:rPr>
+              <w:t xml:space="preserve"> %}</w:t>
             </w:r>
           </w:p>
           <w:p>
@@ -3331,7 +3481,14 @@
               <w:rPr>
                 <w:lang w:val="en-US"/>
               </w:rPr>
-              <w:t>{% if template_dict.</w:t>
+              <w:t xml:space="preserve">{% if </w:t>
+            </w:r>
+            <w:proofErr w:type="spellStart"/>
+            <w:r>
+              <w:rPr>
+                <w:lang w:val="en-US"/>
+              </w:rPr>
+              <w:t>template_dict.</w:t>
             </w:r>
             <w:r>
               <w:rPr>
@@ -3344,7 +3501,14 @@
               <w:rPr>
                 <w:lang w:val="en-US"/>
               </w:rPr>
-              <w:t xml:space="preserve">.comments|length </w:t>
+              <w:t>.comments|length</w:t>
+            </w:r>
+            <w:proofErr w:type="spellEnd"/>
+            <w:r>
+              <w:rPr>
+                <w:lang w:val="en-US"/>
+              </w:rPr>
+              <w:t xml:space="preserve"> </w:t>
             </w:r>
             <w:r>
               <w:rPr>
@@ -3384,7 +3548,21 @@
               <w:rPr>
                 <w:lang w:val="en-US"/>
               </w:rPr>
-              <w:t>{% if template_dict.file_ext.comments|length &gt; 0 %}X{% endif %}</w:t>
+              <w:t xml:space="preserve">{% if </w:t>
+            </w:r>
+            <w:proofErr w:type="spellStart"/>
+            <w:r>
+              <w:rPr>
+                <w:lang w:val="en-US"/>
+              </w:rPr>
+              <w:t>template_dict.file_ext.comments|length</w:t>
+            </w:r>
+            <w:proofErr w:type="spellEnd"/>
+            <w:r>
+              <w:rPr>
+                <w:lang w:val="en-US"/>
+              </w:rPr>
+              <w:t xml:space="preserve"> &gt; 0 %}X{% endif %}</w:t>
             </w:r>
           </w:p>
         </w:tc>
@@ -3487,12 +3665,14 @@
             <w:r>
               <w:t xml:space="preserve">{% if </w:t>
             </w:r>
+            <w:proofErr w:type="spellStart"/>
             <w:r>
               <w:rPr>
                 <w:lang w:val="en-US"/>
               </w:rPr>
               <w:t>template_dict.file_ext.comments</w:t>
             </w:r>
+            <w:proofErr w:type="spellEnd"/>
             <w:r>
               <w:t xml:space="preserve"> </w:t>
             </w:r>
@@ -3506,7 +3686,21 @@
               <w:rPr>
                 <w:lang w:val="en-US"/>
               </w:rPr>
-              <w:t>{% for item in template_dict.file_ext.comments %}</w:t>
+              <w:t xml:space="preserve">{% for item in </w:t>
+            </w:r>
+            <w:proofErr w:type="spellStart"/>
+            <w:r>
+              <w:rPr>
+                <w:lang w:val="en-US"/>
+              </w:rPr>
+              <w:t>template_dict.file_ext.comments</w:t>
+            </w:r>
+            <w:proofErr w:type="spellEnd"/>
+            <w:r>
+              <w:rPr>
+                <w:lang w:val="en-US"/>
+              </w:rPr>
+              <w:t xml:space="preserve"> %}</w:t>
             </w:r>
           </w:p>
           <w:p>
@@ -3522,7 +3716,35 @@
               <w:rPr>
                 <w:lang w:val="en-US"/>
               </w:rPr>
-              <w:t>{{ item.file_name }}{% endfor %}</w:t>
+              <w:t xml:space="preserve">{{ </w:t>
+            </w:r>
+            <w:proofErr w:type="spellStart"/>
+            <w:r>
+              <w:rPr>
+                <w:lang w:val="en-US"/>
+              </w:rPr>
+              <w:t>item.file_name</w:t>
+            </w:r>
+            <w:proofErr w:type="spellEnd"/>
+            <w:r>
+              <w:rPr>
+                <w:lang w:val="en-US"/>
+              </w:rPr>
+              <w:t xml:space="preserve"> }}{% </w:t>
+            </w:r>
+            <w:proofErr w:type="spellStart"/>
+            <w:r>
+              <w:rPr>
+                <w:lang w:val="en-US"/>
+              </w:rPr>
+              <w:t>endfor</w:t>
+            </w:r>
+            <w:proofErr w:type="spellEnd"/>
+            <w:r>
+              <w:rPr>
+                <w:lang w:val="en-US"/>
+              </w:rPr>
+              <w:t xml:space="preserve"> %}</w:t>
             </w:r>
           </w:p>
           <w:p>
@@ -3679,39 +3901,7 @@
             </w:tcMar>
             <w:hideMark/>
           </w:tcPr>
-          <w:p>
-            <w:r>
-              <w:rPr>
-                <w:lang w:val="en-US"/>
-              </w:rPr>
-              <w:t>{% if template_dict.</w:t>
-            </w:r>
-            <w:r>
-              <w:rPr>
-                <w:lang w:val="en-US"/>
-              </w:rPr>
-              <w:t xml:space="preserve"> common_file_format</w:t>
-            </w:r>
-            <w:r>
-              <w:rPr>
-                <w:lang w:val="en-US"/>
-              </w:rPr>
-              <w:t xml:space="preserve">.comments|length </w:t>
-            </w:r>
-            <w:r>
-              <w:rPr>
-                <w:rFonts w:hint="eastAsia"/>
-                <w:lang w:val="en-US"/>
-              </w:rPr>
-              <w:t>==</w:t>
-            </w:r>
-            <w:r>
-              <w:rPr>
-                <w:lang w:val="en-US"/>
-              </w:rPr>
-              <w:t xml:space="preserve"> 0 %}X{% endif %}</w:t>
-            </w:r>
-          </w:p>
+          <w:p/>
         </w:tc>
         <w:tc>
           <w:tcPr>
@@ -3751,26 +3941,7 @@
             </w:tcMar>
             <w:hideMark/>
           </w:tcPr>
-          <w:p>
-            <w:r>
-              <w:rPr>
-                <w:lang w:val="en-US"/>
-              </w:rPr>
-              <w:t>{% if template_dict.</w:t>
-            </w:r>
-            <w:r>
-              <w:rPr>
-                <w:lang w:val="en-US"/>
-              </w:rPr>
-              <w:t xml:space="preserve"> common_file_format</w:t>
-            </w:r>
-            <w:r>
-              <w:rPr>
-                <w:lang w:val="en-US"/>
-              </w:rPr>
-              <w:t>.comments|length &gt; 0 %}X{% endif %}</w:t>
-            </w:r>
-          </w:p>
+          <w:p/>
         </w:tc>
         <w:tc>
           <w:tcPr>
@@ -3810,7 +3981,11 @@
             </w:tcMar>
             <w:hideMark/>
           </w:tcPr>
-          <w:p/>
+          <w:p>
+            <w:r>
+              <w:t>X</w:t>
+            </w:r>
+          </w:p>
         </w:tc>
         <w:tc>
           <w:tcPr>
@@ -3851,6 +4026,7 @@
             <w:r>
               <w:t xml:space="preserve">{% if </w:t>
             </w:r>
+            <w:proofErr w:type="spellStart"/>
             <w:r>
               <w:rPr>
                 <w:lang w:val="en-US"/>
@@ -3869,6 +4045,7 @@
               </w:rPr>
               <w:t>.comments</w:t>
             </w:r>
+            <w:proofErr w:type="spellEnd"/>
             <w:r>
               <w:t>|length &gt; 0</w:t>
             </w:r>
@@ -3879,7 +4056,14 @@
               <w:rPr>
                 <w:lang w:val="en-US"/>
               </w:rPr>
-              <w:t>{% for item in template_dict.</w:t>
+              <w:t xml:space="preserve">{% for item in </w:t>
+            </w:r>
+            <w:proofErr w:type="spellStart"/>
+            <w:r>
+              <w:rPr>
+                <w:lang w:val="en-US"/>
+              </w:rPr>
+              <w:t>template_dict.</w:t>
             </w:r>
             <w:r>
               <w:rPr>
@@ -3891,7 +4075,14 @@
               <w:rPr>
                 <w:lang w:val="en-US"/>
               </w:rPr>
-              <w:t>.comments %}</w:t>
+              <w:t>.comments</w:t>
+            </w:r>
+            <w:proofErr w:type="spellEnd"/>
+            <w:r>
+              <w:rPr>
+                <w:lang w:val="en-US"/>
+              </w:rPr>
+              <w:t xml:space="preserve"> %}</w:t>
             </w:r>
           </w:p>
           <w:p>
@@ -3905,7 +4096,21 @@
               <w:rPr>
                 <w:lang w:val="en-US"/>
               </w:rPr>
-              <w:t>{{ item.file_name }}</w:t>
+              <w:t xml:space="preserve">{{ </w:t>
+            </w:r>
+            <w:proofErr w:type="spellStart"/>
+            <w:r>
+              <w:rPr>
+                <w:lang w:val="en-US"/>
+              </w:rPr>
+              <w:t>item.file_name</w:t>
+            </w:r>
+            <w:proofErr w:type="spellEnd"/>
+            <w:r>
+              <w:rPr>
+                <w:lang w:val="en-US"/>
+              </w:rPr>
+              <w:t xml:space="preserve"> }}</w:t>
             </w:r>
             <w:r>
               <w:rPr>
@@ -3921,11 +4126,19 @@
               </w:rPr>
               <w:t xml:space="preserve">% </w:t>
             </w:r>
-            <w:r>
-              <w:rPr>
-                <w:lang w:val="en-US"/>
-              </w:rPr>
-              <w:t>endfor %}</w:t>
+            <w:proofErr w:type="spellStart"/>
+            <w:r>
+              <w:rPr>
+                <w:lang w:val="en-US"/>
+              </w:rPr>
+              <w:t>endfor</w:t>
+            </w:r>
+            <w:proofErr w:type="spellEnd"/>
+            <w:r>
+              <w:rPr>
+                <w:lang w:val="en-US"/>
+              </w:rPr>
+              <w:t xml:space="preserve"> %}</w:t>
             </w:r>
           </w:p>
           <w:p>
@@ -4649,7 +4862,21 @@
               <w:rPr>
                 <w:lang w:val="en-US"/>
               </w:rPr>
-              <w:t>{% if template_dict.readme_file.comments|length &gt; 0 %}X{% endif %}</w:t>
+              <w:t xml:space="preserve">{% if </w:t>
+            </w:r>
+            <w:proofErr w:type="spellStart"/>
+            <w:r>
+              <w:rPr>
+                <w:lang w:val="en-US"/>
+              </w:rPr>
+              <w:t>template_dict.readme_file.comments|length</w:t>
+            </w:r>
+            <w:proofErr w:type="spellEnd"/>
+            <w:r>
+              <w:rPr>
+                <w:lang w:val="en-US"/>
+              </w:rPr>
+              <w:t xml:space="preserve"> &gt; 0 %}X{% endif %}</w:t>
             </w:r>
           </w:p>
         </w:tc>
@@ -4681,7 +4908,21 @@
               <w:rPr>
                 <w:lang w:val="en-US"/>
               </w:rPr>
-              <w:t>{% if template_dict.readme_file.comments|length == 0 %}X{% endif %}</w:t>
+              <w:t xml:space="preserve">{% if </w:t>
+            </w:r>
+            <w:proofErr w:type="spellStart"/>
+            <w:r>
+              <w:rPr>
+                <w:lang w:val="en-US"/>
+              </w:rPr>
+              <w:t>template_dict.readme_file.comments|length</w:t>
+            </w:r>
+            <w:proofErr w:type="spellEnd"/>
+            <w:r>
+              <w:rPr>
+                <w:lang w:val="en-US"/>
+              </w:rPr>
+              <w:t xml:space="preserve"> == 0 %}X{% endif %}</w:t>
             </w:r>
           </w:p>
           <w:p/>
@@ -4785,12 +5026,14 @@
             <w:r>
               <w:t xml:space="preserve">{% if </w:t>
             </w:r>
+            <w:proofErr w:type="spellStart"/>
             <w:r>
               <w:rPr>
                 <w:lang w:val="en-US"/>
               </w:rPr>
               <w:t>template_dict.readme_file.comments</w:t>
             </w:r>
+            <w:proofErr w:type="spellEnd"/>
             <w:r>
               <w:t xml:space="preserve"> |length &gt; 0</w:t>
             </w:r>
@@ -4801,7 +5044,63 @@
               <w:rPr>
                 <w:lang w:val="en-US"/>
               </w:rPr>
-              <w:t>{% for item in template_dict.readme_file.comments %}{{ loop.index }}. {{ item.file_name }}{% endfor %}</w:t>
+              <w:t xml:space="preserve">{% for item in </w:t>
+            </w:r>
+            <w:proofErr w:type="spellStart"/>
+            <w:r>
+              <w:rPr>
+                <w:lang w:val="en-US"/>
+              </w:rPr>
+              <w:t>template_dict.readme_file.comments</w:t>
+            </w:r>
+            <w:proofErr w:type="spellEnd"/>
+            <w:r>
+              <w:rPr>
+                <w:lang w:val="en-US"/>
+              </w:rPr>
+              <w:t xml:space="preserve"> %}{{ </w:t>
+            </w:r>
+            <w:proofErr w:type="spellStart"/>
+            <w:r>
+              <w:rPr>
+                <w:lang w:val="en-US"/>
+              </w:rPr>
+              <w:t>loop.index</w:t>
+            </w:r>
+            <w:proofErr w:type="spellEnd"/>
+            <w:r>
+              <w:rPr>
+                <w:lang w:val="en-US"/>
+              </w:rPr>
+              <w:t xml:space="preserve"> }}. {{ </w:t>
+            </w:r>
+            <w:proofErr w:type="spellStart"/>
+            <w:r>
+              <w:rPr>
+                <w:lang w:val="en-US"/>
+              </w:rPr>
+              <w:t>item.file_name</w:t>
+            </w:r>
+            <w:proofErr w:type="spellEnd"/>
+            <w:r>
+              <w:rPr>
+                <w:lang w:val="en-US"/>
+              </w:rPr>
+              <w:t xml:space="preserve"> }}{% </w:t>
+            </w:r>
+            <w:proofErr w:type="spellStart"/>
+            <w:r>
+              <w:rPr>
+                <w:lang w:val="en-US"/>
+              </w:rPr>
+              <w:t>endfor</w:t>
+            </w:r>
+            <w:proofErr w:type="spellEnd"/>
+            <w:r>
+              <w:rPr>
+                <w:lang w:val="en-US"/>
+              </w:rPr>
+              <w:t xml:space="preserve"> %}</w:t>
             </w:r>
           </w:p>
           <w:p>
@@ -5165,8 +5464,13 @@
             <w:hideMark/>
           </w:tcPr>
           <w:p>
-            <w:r>
-              <w:t>DOI</w:t>
+            <w:pPr>
+              <w:rPr>
+                <w:rFonts w:hint="eastAsia"/>
+              </w:rPr>
+            </w:pPr>
+            <w:r>
+              <w:t>PID</w:t>
             </w:r>
           </w:p>
         </w:tc>
@@ -7153,12 +7457,14 @@
             <w:r>
               <w:t xml:space="preserve">{% if </w:t>
             </w:r>
+            <w:proofErr w:type="spellStart"/>
             <w:r>
               <w:rPr>
                 <w:lang w:val="en-US"/>
               </w:rPr>
               <w:t>template_dict.typo.comments</w:t>
             </w:r>
+            <w:proofErr w:type="spellEnd"/>
             <w:r>
               <w:t xml:space="preserve"> </w:t>
             </w:r>
@@ -7173,7 +7479,21 @@
               <w:rPr>
                 <w:lang w:val="en-US"/>
               </w:rPr>
-              <w:t>{% for item in template_dict.typo.comments %}</w:t>
+              <w:t xml:space="preserve">{% for item in </w:t>
+            </w:r>
+            <w:proofErr w:type="spellStart"/>
+            <w:r>
+              <w:rPr>
+                <w:lang w:val="en-US"/>
+              </w:rPr>
+              <w:t>template_dict.typo.comments</w:t>
+            </w:r>
+            <w:proofErr w:type="spellEnd"/>
+            <w:r>
+              <w:rPr>
+                <w:lang w:val="en-US"/>
+              </w:rPr>
+              <w:t xml:space="preserve"> %}</w:t>
             </w:r>
           </w:p>
           <w:p>
@@ -7188,7 +7508,21 @@
               <w:rPr>
                 <w:lang w:val="en-US"/>
               </w:rPr>
-              <w:t>{{ item }}{% endfor %}</w:t>
+              <w:t xml:space="preserve">{{ item }}{% </w:t>
+            </w:r>
+            <w:proofErr w:type="spellStart"/>
+            <w:r>
+              <w:rPr>
+                <w:lang w:val="en-US"/>
+              </w:rPr>
+              <w:t>endfor</w:t>
+            </w:r>
+            <w:proofErr w:type="spellEnd"/>
+            <w:r>
+              <w:rPr>
+                <w:lang w:val="en-US"/>
+              </w:rPr>
+              <w:t xml:space="preserve"> %}</w:t>
             </w:r>
           </w:p>
           <w:p>
@@ -7670,7 +8004,15 @@
           </w:tcPr>
           <w:p>
             <w:r>
-              <w:t>{% if not template_dict.none_author_affiliation %}X{% endif %}</w:t>
+              <w:t xml:space="preserve">{% if not </w:t>
+            </w:r>
+            <w:proofErr w:type="spellStart"/>
+            <w:r>
+              <w:t>template_dict.none_author_affiliation</w:t>
+            </w:r>
+            <w:proofErr w:type="spellEnd"/>
+            <w:r>
+              <w:t xml:space="preserve"> %}X{% endif %}</w:t>
             </w:r>
           </w:p>
         </w:tc>
@@ -7693,7 +8035,15 @@
           </w:tcPr>
           <w:p>
             <w:r>
-              <w:t>{% if template_dict.none_author_affiliation %}X{% endif %}</w:t>
+              <w:t xml:space="preserve">{% if </w:t>
+            </w:r>
+            <w:proofErr w:type="spellStart"/>
+            <w:r>
+              <w:t>template_dict.none_author_affiliation</w:t>
+            </w:r>
+            <w:proofErr w:type="spellEnd"/>
+            <w:r>
+              <w:t xml:space="preserve"> %}X{% endif %}</w:t>
             </w:r>
           </w:p>
         </w:tc>
@@ -7912,6 +8262,39 @@
               <w:t>For example, if a geographical location or data collection date/range is mentioned in the description, recommend filling in the relevant metadata fields</w:t>
             </w:r>
           </w:p>
+          <w:p>
+            <w:pPr>
+              <w:numPr>
+                <w:ilvl w:val="0"/>
+                <w:numId w:val="26"/>
+              </w:numPr>
+            </w:pPr>
+            <w:r>
+              <w:t xml:space="preserve">You may reference the </w:t>
+            </w:r>
+            <w:hyperlink r:id="rId5" w:history="1">
+              <w:r>
+                <w:rPr>
+                  <w:rStyle w:val="Hyperlink"/>
+                </w:rPr>
+                <w:t>Dataverse North Metadata Best Practices (pdf)</w:t>
+              </w:r>
+            </w:hyperlink>
+            <w:r>
+              <w:t xml:space="preserve"> or </w:t>
+            </w:r>
+            <w:hyperlink r:id="rId6" w:history="1">
+              <w:r>
+                <w:rPr>
+                  <w:rStyle w:val="Hyperlink"/>
+                </w:rPr>
+                <w:t>Borealis metadata template (xlsx)</w:t>
+              </w:r>
+            </w:hyperlink>
+            <w:r>
+              <w:t xml:space="preserve"> to view the available metadata blocks</w:t>
+            </w:r>
+          </w:p>
         </w:tc>
         <w:tc>
           <w:tcPr>
@@ -8167,7 +8550,11 @@
               </w:numPr>
             </w:pPr>
             <w:r>
-              <w:t>Review metadata and flag acronyms/terms that may need to be described.</w:t>
+              <w:t xml:space="preserve">Review metadata and flag acronyms/terms that may </w:t>
+            </w:r>
+            <w:r>
+              <w:lastRenderedPageBreak/>
+              <w:t>need to be described.</w:t>
             </w:r>
           </w:p>
         </w:tc>
@@ -8444,7 +8831,6 @@
               </w:numPr>
             </w:pPr>
             <w:r>
-              <w:lastRenderedPageBreak/>
               <w:t>Dates of collection</w:t>
             </w:r>
           </w:p>
@@ -8511,7 +8897,11 @@
               </w:numPr>
             </w:pPr>
             <w:r>
-              <w:t>Other relevant information</w:t>
+              <w:t xml:space="preserve">Other relevant </w:t>
+            </w:r>
+            <w:r>
+              <w:lastRenderedPageBreak/>
+              <w:t>information</w:t>
             </w:r>
           </w:p>
         </w:tc>
@@ -8783,38 +9173,40 @@
               </w:numPr>
             </w:pPr>
             <w:r>
-              <w:t>Can also provide information about controlle</w:t>
-            </w:r>
-            <w:r>
-              <w:lastRenderedPageBreak/>
-              <w:t>d vocabulary (in that specific field) if none is filled out.</w:t>
-            </w:r>
-          </w:p>
-        </w:tc>
-        <w:tc>
-          <w:tcPr>
-            <w:tcW w:w="0" w:type="auto"/>
-            <w:tcBorders>
-              <w:top w:val="single" w:sz="8" w:space="0" w:color="000000"/>
-              <w:left w:val="single" w:sz="8" w:space="0" w:color="000000"/>
-              <w:bottom w:val="single" w:sz="8" w:space="0" w:color="000000"/>
-              <w:right w:val="single" w:sz="8" w:space="0" w:color="000000"/>
-            </w:tcBorders>
-            <w:tcMar>
-              <w:top w:w="100" w:type="dxa"/>
-              <w:left w:w="100" w:type="dxa"/>
-              <w:bottom w:w="100" w:type="dxa"/>
-              <w:right w:w="100" w:type="dxa"/>
-            </w:tcMar>
-            <w:hideMark/>
-          </w:tcPr>
-          <w:p>
-            <w:r>
-              <w:rPr>
-                <w:lang w:val="en-US"/>
-              </w:rPr>
-              <w:lastRenderedPageBreak/>
-              <w:t>{% if template_dict.</w:t>
+              <w:t>Can also provide information about controlled vocabulary (in that specific field) if none is filled out.</w:t>
+            </w:r>
+          </w:p>
+        </w:tc>
+        <w:tc>
+          <w:tcPr>
+            <w:tcW w:w="0" w:type="auto"/>
+            <w:tcBorders>
+              <w:top w:val="single" w:sz="8" w:space="0" w:color="000000"/>
+              <w:left w:val="single" w:sz="8" w:space="0" w:color="000000"/>
+              <w:bottom w:val="single" w:sz="8" w:space="0" w:color="000000"/>
+              <w:right w:val="single" w:sz="8" w:space="0" w:color="000000"/>
+            </w:tcBorders>
+            <w:tcMar>
+              <w:top w:w="100" w:type="dxa"/>
+              <w:left w:w="100" w:type="dxa"/>
+              <w:bottom w:w="100" w:type="dxa"/>
+              <w:right w:w="100" w:type="dxa"/>
+            </w:tcMar>
+            <w:hideMark/>
+          </w:tcPr>
+          <w:p>
+            <w:r>
+              <w:rPr>
+                <w:lang w:val="en-US"/>
+              </w:rPr>
+              <w:t xml:space="preserve">{% if </w:t>
+            </w:r>
+            <w:proofErr w:type="spellStart"/>
+            <w:r>
+              <w:rPr>
+                <w:lang w:val="en-US"/>
+              </w:rPr>
+              <w:t>template_dict.</w:t>
             </w:r>
             <w:r>
               <w:rPr>
@@ -8827,7 +9219,14 @@
               <w:rPr>
                 <w:lang w:val="en-US"/>
               </w:rPr>
-              <w:t>|length &gt; 0 %}X{% endif %}</w:t>
+              <w:t>|length</w:t>
+            </w:r>
+            <w:proofErr w:type="spellEnd"/>
+            <w:r>
+              <w:rPr>
+                <w:lang w:val="en-US"/>
+              </w:rPr>
+              <w:t xml:space="preserve"> &gt; 0 %}X{% endif %}</w:t>
             </w:r>
           </w:p>
         </w:tc>
@@ -8877,7 +9276,14 @@
               <w:rPr>
                 <w:lang w:val="en-US"/>
               </w:rPr>
-              <w:t>{% if template_dict.</w:t>
+              <w:t xml:space="preserve">{% if </w:t>
+            </w:r>
+            <w:proofErr w:type="spellStart"/>
+            <w:r>
+              <w:rPr>
+                <w:lang w:val="en-US"/>
+              </w:rPr>
+              <w:t>template_dict.</w:t>
             </w:r>
             <w:r>
               <w:rPr>
@@ -8890,7 +9296,14 @@
               <w:rPr>
                 <w:lang w:val="en-US"/>
               </w:rPr>
-              <w:t>|length == 0 %}X{% endif %}</w:t>
+              <w:t>|length</w:t>
+            </w:r>
+            <w:proofErr w:type="spellEnd"/>
+            <w:r>
+              <w:rPr>
+                <w:lang w:val="en-US"/>
+              </w:rPr>
+              <w:t xml:space="preserve"> == 0 %}X{% endif %}</w:t>
             </w:r>
           </w:p>
         </w:tc>
@@ -8962,6 +9375,41 @@
             <w:r>
               <w:t xml:space="preserve">{% if </w:t>
             </w:r>
+            <w:proofErr w:type="spellStart"/>
+            <w:r>
+              <w:rPr>
+                <w:lang w:val="en-US"/>
+              </w:rPr>
+              <w:t>template_dict</w:t>
+            </w:r>
+            <w:proofErr w:type="spellEnd"/>
+            <w:r>
+              <w:rPr>
+                <w:lang w:val="en-US"/>
+              </w:rPr>
+              <w:t>.</w:t>
+            </w:r>
+            <w:proofErr w:type="spellStart"/>
+            <w:r>
+              <w:t>keywords</w:t>
+            </w:r>
+            <w:r>
+              <w:t>|length</w:t>
+            </w:r>
+            <w:proofErr w:type="spellEnd"/>
+            <w:r>
+              <w:t xml:space="preserve"> &gt; 0</w:t>
+            </w:r>
+            <w:r>
+              <w:t xml:space="preserve"> %}</w:t>
+            </w:r>
+            <w:r>
+              <w:rPr>
+                <w:lang w:val="en-US"/>
+              </w:rPr>
+              <w:t xml:space="preserve">{% for item in </w:t>
+            </w:r>
+            <w:proofErr w:type="spellStart"/>
             <w:r>
               <w:rPr>
                 <w:lang w:val="en-US"/>
@@ -8969,27 +9417,13 @@
               <w:t>template_dict.</w:t>
             </w:r>
             <w:r>
+              <w:rPr>
+                <w:rFonts w:hint="eastAsia"/>
+                <w:lang w:val="en-US"/>
+              </w:rPr>
               <w:t>keywords</w:t>
             </w:r>
-            <w:r>
-              <w:t>|length &gt; 0</w:t>
-            </w:r>
-            <w:r>
-              <w:t xml:space="preserve"> %}</w:t>
-            </w:r>
-            <w:r>
-              <w:rPr>
-                <w:lang w:val="en-US"/>
-              </w:rPr>
-              <w:t>{% for item in template_dict.</w:t>
-            </w:r>
-            <w:r>
-              <w:rPr>
-                <w:rFonts w:hint="eastAsia"/>
-                <w:lang w:val="en-US"/>
-              </w:rPr>
-              <w:t>keywords</w:t>
-            </w:r>
+            <w:proofErr w:type="spellEnd"/>
             <w:r>
               <w:rPr>
                 <w:lang w:val="en-US"/>
@@ -9009,7 +9443,21 @@
               <w:rPr>
                 <w:lang w:val="en-US"/>
               </w:rPr>
-              <w:t>{{ item }}{% endfor %}</w:t>
+              <w:t xml:space="preserve">{{ item }}{% </w:t>
+            </w:r>
+            <w:proofErr w:type="spellStart"/>
+            <w:r>
+              <w:rPr>
+                <w:lang w:val="en-US"/>
+              </w:rPr>
+              <w:t>endfor</w:t>
+            </w:r>
+            <w:proofErr w:type="spellEnd"/>
+            <w:r>
+              <w:rPr>
+                <w:lang w:val="en-US"/>
+              </w:rPr>
+              <w:t xml:space="preserve"> %}</w:t>
             </w:r>
           </w:p>
           <w:p>
@@ -9368,7 +9816,15 @@
                 <w:b/>
                 <w:bCs/>
               </w:rPr>
-              <w:t>Does the dataset serve as Replication, Background, or Supporting Data linked to a publication?</w:t>
+              <w:t xml:space="preserve">Does the dataset serve as Replication, Background, </w:t>
+            </w:r>
+            <w:r>
+              <w:rPr>
+                <w:b/>
+                <w:bCs/>
+              </w:rPr>
+              <w:lastRenderedPageBreak/>
+              <w:t>or Supporting Data linked to a publication?</w:t>
             </w:r>
           </w:p>
         </w:tc>
@@ -9397,7 +9853,12 @@
               </w:numPr>
             </w:pPr>
             <w:r>
-              <w:t>If a suffix is used or the title suggests a publication, check the metadata for an associated publication.</w:t>
+              <w:lastRenderedPageBreak/>
+              <w:t xml:space="preserve">If a suffix is used or the title suggests a </w:t>
+            </w:r>
+            <w:r>
+              <w:lastRenderedPageBreak/>
+              <w:t>publication, check the metadata for an associated publication.</w:t>
             </w:r>
           </w:p>
           <w:p>
@@ -9408,157 +9869,167 @@
               </w:numPr>
             </w:pPr>
             <w:r>
-              <w:t xml:space="preserve">If metadata indicates a related publication or project, </w:t>
-            </w:r>
+              <w:t>If metadata indicates a related publication or project, suggest adding a corresponding suffix to the title.</w:t>
+            </w:r>
+          </w:p>
+        </w:tc>
+        <w:tc>
+          <w:tcPr>
+            <w:tcW w:w="0" w:type="auto"/>
+            <w:tcBorders>
+              <w:top w:val="single" w:sz="8" w:space="0" w:color="000000"/>
+              <w:left w:val="single" w:sz="8" w:space="0" w:color="000000"/>
+              <w:bottom w:val="single" w:sz="8" w:space="0" w:color="000000"/>
+              <w:right w:val="single" w:sz="8" w:space="0" w:color="000000"/>
+            </w:tcBorders>
+            <w:tcMar>
+              <w:top w:w="100" w:type="dxa"/>
+              <w:left w:w="100" w:type="dxa"/>
+              <w:bottom w:w="100" w:type="dxa"/>
+              <w:right w:w="100" w:type="dxa"/>
+            </w:tcMar>
+            <w:hideMark/>
+          </w:tcPr>
+          <w:p/>
+        </w:tc>
+        <w:tc>
+          <w:tcPr>
+            <w:tcW w:w="0" w:type="auto"/>
+            <w:tcBorders>
+              <w:top w:val="single" w:sz="8" w:space="0" w:color="000000"/>
+              <w:left w:val="single" w:sz="8" w:space="0" w:color="000000"/>
+              <w:bottom w:val="single" w:sz="8" w:space="0" w:color="000000"/>
+              <w:right w:val="single" w:sz="8" w:space="0" w:color="000000"/>
+            </w:tcBorders>
+            <w:tcMar>
+              <w:top w:w="100" w:type="dxa"/>
+              <w:left w:w="100" w:type="dxa"/>
+              <w:bottom w:w="100" w:type="dxa"/>
+              <w:right w:w="100" w:type="dxa"/>
+            </w:tcMar>
+            <w:hideMark/>
+          </w:tcPr>
+          <w:p/>
+        </w:tc>
+        <w:tc>
+          <w:tcPr>
+            <w:tcW w:w="0" w:type="auto"/>
+            <w:tcBorders>
+              <w:top w:val="single" w:sz="8" w:space="0" w:color="000000"/>
+              <w:left w:val="single" w:sz="8" w:space="0" w:color="000000"/>
+              <w:bottom w:val="single" w:sz="8" w:space="0" w:color="000000"/>
+              <w:right w:val="single" w:sz="8" w:space="0" w:color="000000"/>
+            </w:tcBorders>
+            <w:tcMar>
+              <w:top w:w="100" w:type="dxa"/>
+              <w:left w:w="100" w:type="dxa"/>
+              <w:bottom w:w="100" w:type="dxa"/>
+              <w:right w:w="100" w:type="dxa"/>
+            </w:tcMar>
+            <w:hideMark/>
+          </w:tcPr>
+          <w:p/>
+        </w:tc>
+        <w:tc>
+          <w:tcPr>
+            <w:tcW w:w="0" w:type="auto"/>
+            <w:tcBorders>
+              <w:top w:val="single" w:sz="8" w:space="0" w:color="000000"/>
+              <w:left w:val="single" w:sz="8" w:space="0" w:color="000000"/>
+              <w:bottom w:val="single" w:sz="8" w:space="0" w:color="000000"/>
+              <w:right w:val="single" w:sz="8" w:space="0" w:color="000000"/>
+            </w:tcBorders>
+            <w:tcMar>
+              <w:top w:w="100" w:type="dxa"/>
+              <w:left w:w="100" w:type="dxa"/>
+              <w:bottom w:w="100" w:type="dxa"/>
+              <w:right w:w="100" w:type="dxa"/>
+            </w:tcMar>
+            <w:hideMark/>
+          </w:tcPr>
+          <w:p/>
+        </w:tc>
+        <w:tc>
+          <w:tcPr>
+            <w:tcW w:w="0" w:type="auto"/>
+            <w:tcBorders>
+              <w:top w:val="single" w:sz="8" w:space="0" w:color="000000"/>
+              <w:left w:val="single" w:sz="8" w:space="0" w:color="000000"/>
+              <w:bottom w:val="single" w:sz="8" w:space="0" w:color="000000"/>
+              <w:right w:val="single" w:sz="8" w:space="0" w:color="000000"/>
+            </w:tcBorders>
+            <w:tcMar>
+              <w:top w:w="100" w:type="dxa"/>
+              <w:left w:w="100" w:type="dxa"/>
+              <w:bottom w:w="100" w:type="dxa"/>
+              <w:right w:w="100" w:type="dxa"/>
+            </w:tcMar>
+            <w:hideMark/>
+          </w:tcPr>
+          <w:p/>
+        </w:tc>
+        <w:tc>
+          <w:tcPr>
+            <w:tcW w:w="0" w:type="auto"/>
+            <w:tcBorders>
+              <w:top w:val="single" w:sz="8" w:space="0" w:color="000000"/>
+              <w:left w:val="single" w:sz="8" w:space="0" w:color="000000"/>
+              <w:bottom w:val="single" w:sz="8" w:space="0" w:color="000000"/>
+              <w:right w:val="single" w:sz="8" w:space="0" w:color="000000"/>
+            </w:tcBorders>
+            <w:tcMar>
+              <w:top w:w="100" w:type="dxa"/>
+              <w:left w:w="100" w:type="dxa"/>
+              <w:bottom w:w="100" w:type="dxa"/>
+              <w:right w:w="100" w:type="dxa"/>
+            </w:tcMar>
+            <w:hideMark/>
+          </w:tcPr>
+          <w:p>
+            <w:r>
+              <w:t>If there is a suffix, is there a corresponding related publication in the metadata? Y/N</w:t>
+            </w:r>
+            <w:r>
+              <w:t>/</w:t>
+            </w:r>
+            <w:r>
+              <w:t>NA</w:t>
+            </w:r>
+          </w:p>
+          <w:p/>
+          <w:p>
             <w:r>
               <w:lastRenderedPageBreak/>
-              <w:t>suggest adding a corresponding suffix to the title.</w:t>
-            </w:r>
-          </w:p>
-        </w:tc>
-        <w:tc>
-          <w:tcPr>
-            <w:tcW w:w="0" w:type="auto"/>
-            <w:tcBorders>
-              <w:top w:val="single" w:sz="8" w:space="0" w:color="000000"/>
-              <w:left w:val="single" w:sz="8" w:space="0" w:color="000000"/>
-              <w:bottom w:val="single" w:sz="8" w:space="0" w:color="000000"/>
-              <w:right w:val="single" w:sz="8" w:space="0" w:color="000000"/>
-            </w:tcBorders>
-            <w:tcMar>
-              <w:top w:w="100" w:type="dxa"/>
-              <w:left w:w="100" w:type="dxa"/>
-              <w:bottom w:w="100" w:type="dxa"/>
-              <w:right w:w="100" w:type="dxa"/>
-            </w:tcMar>
-            <w:hideMark/>
-          </w:tcPr>
-          <w:p/>
-        </w:tc>
-        <w:tc>
-          <w:tcPr>
-            <w:tcW w:w="0" w:type="auto"/>
-            <w:tcBorders>
-              <w:top w:val="single" w:sz="8" w:space="0" w:color="000000"/>
-              <w:left w:val="single" w:sz="8" w:space="0" w:color="000000"/>
-              <w:bottom w:val="single" w:sz="8" w:space="0" w:color="000000"/>
-              <w:right w:val="single" w:sz="8" w:space="0" w:color="000000"/>
-            </w:tcBorders>
-            <w:tcMar>
-              <w:top w:w="100" w:type="dxa"/>
-              <w:left w:w="100" w:type="dxa"/>
-              <w:bottom w:w="100" w:type="dxa"/>
-              <w:right w:w="100" w:type="dxa"/>
-            </w:tcMar>
-            <w:hideMark/>
-          </w:tcPr>
-          <w:p/>
-        </w:tc>
-        <w:tc>
-          <w:tcPr>
-            <w:tcW w:w="0" w:type="auto"/>
-            <w:tcBorders>
-              <w:top w:val="single" w:sz="8" w:space="0" w:color="000000"/>
-              <w:left w:val="single" w:sz="8" w:space="0" w:color="000000"/>
-              <w:bottom w:val="single" w:sz="8" w:space="0" w:color="000000"/>
-              <w:right w:val="single" w:sz="8" w:space="0" w:color="000000"/>
-            </w:tcBorders>
-            <w:tcMar>
-              <w:top w:w="100" w:type="dxa"/>
-              <w:left w:w="100" w:type="dxa"/>
-              <w:bottom w:w="100" w:type="dxa"/>
-              <w:right w:w="100" w:type="dxa"/>
-            </w:tcMar>
-            <w:hideMark/>
-          </w:tcPr>
-          <w:p/>
-        </w:tc>
-        <w:tc>
-          <w:tcPr>
-            <w:tcW w:w="0" w:type="auto"/>
-            <w:tcBorders>
-              <w:top w:val="single" w:sz="8" w:space="0" w:color="000000"/>
-              <w:left w:val="single" w:sz="8" w:space="0" w:color="000000"/>
-              <w:bottom w:val="single" w:sz="8" w:space="0" w:color="000000"/>
-              <w:right w:val="single" w:sz="8" w:space="0" w:color="000000"/>
-            </w:tcBorders>
-            <w:tcMar>
-              <w:top w:w="100" w:type="dxa"/>
-              <w:left w:w="100" w:type="dxa"/>
-              <w:bottom w:w="100" w:type="dxa"/>
-              <w:right w:w="100" w:type="dxa"/>
-            </w:tcMar>
-            <w:hideMark/>
-          </w:tcPr>
-          <w:p/>
-        </w:tc>
-        <w:tc>
-          <w:tcPr>
-            <w:tcW w:w="0" w:type="auto"/>
-            <w:tcBorders>
-              <w:top w:val="single" w:sz="8" w:space="0" w:color="000000"/>
-              <w:left w:val="single" w:sz="8" w:space="0" w:color="000000"/>
-              <w:bottom w:val="single" w:sz="8" w:space="0" w:color="000000"/>
-              <w:right w:val="single" w:sz="8" w:space="0" w:color="000000"/>
-            </w:tcBorders>
-            <w:tcMar>
-              <w:top w:w="100" w:type="dxa"/>
-              <w:left w:w="100" w:type="dxa"/>
-              <w:bottom w:w="100" w:type="dxa"/>
-              <w:right w:w="100" w:type="dxa"/>
-            </w:tcMar>
-            <w:hideMark/>
-          </w:tcPr>
-          <w:p/>
-        </w:tc>
-        <w:tc>
-          <w:tcPr>
-            <w:tcW w:w="0" w:type="auto"/>
-            <w:tcBorders>
-              <w:top w:val="single" w:sz="8" w:space="0" w:color="000000"/>
-              <w:left w:val="single" w:sz="8" w:space="0" w:color="000000"/>
-              <w:bottom w:val="single" w:sz="8" w:space="0" w:color="000000"/>
-              <w:right w:val="single" w:sz="8" w:space="0" w:color="000000"/>
-            </w:tcBorders>
-            <w:tcMar>
-              <w:top w:w="100" w:type="dxa"/>
-              <w:left w:w="100" w:type="dxa"/>
-              <w:bottom w:w="100" w:type="dxa"/>
-              <w:right w:w="100" w:type="dxa"/>
-            </w:tcMar>
-            <w:hideMark/>
-          </w:tcPr>
-          <w:p>
-            <w:r>
-              <w:t>If there is a suffix, is there a corresponding related publication in the metadata? Y/N</w:t>
-            </w:r>
-          </w:p>
-          <w:p/>
-          <w:p>
-            <w:r>
               <w:t>If there is no suffix, is there a related publication in the metadata that implies one of these suffixes should be used? Y/N</w:t>
             </w:r>
-          </w:p>
-        </w:tc>
-        <w:tc>
-          <w:tcPr>
-            <w:tcW w:w="0" w:type="auto"/>
-            <w:tcBorders>
-              <w:top w:val="single" w:sz="8" w:space="0" w:color="000000"/>
-              <w:left w:val="single" w:sz="8" w:space="0" w:color="000000"/>
-              <w:bottom w:val="single" w:sz="8" w:space="0" w:color="000000"/>
-              <w:right w:val="single" w:sz="8" w:space="0" w:color="000000"/>
-            </w:tcBorders>
-            <w:tcMar>
-              <w:top w:w="100" w:type="dxa"/>
-              <w:left w:w="100" w:type="dxa"/>
-              <w:bottom w:w="100" w:type="dxa"/>
-              <w:right w:w="100" w:type="dxa"/>
-            </w:tcMar>
-            <w:hideMark/>
-          </w:tcPr>
-          <w:p>
-            <w:r>
+            <w:r>
+              <w:t>/</w:t>
+            </w:r>
+            <w:r>
+              <w:t>NA</w:t>
+            </w:r>
+          </w:p>
+        </w:tc>
+        <w:tc>
+          <w:tcPr>
+            <w:tcW w:w="0" w:type="auto"/>
+            <w:tcBorders>
+              <w:top w:val="single" w:sz="8" w:space="0" w:color="000000"/>
+              <w:left w:val="single" w:sz="8" w:space="0" w:color="000000"/>
+              <w:bottom w:val="single" w:sz="8" w:space="0" w:color="000000"/>
+              <w:right w:val="single" w:sz="8" w:space="0" w:color="000000"/>
+            </w:tcBorders>
+            <w:tcMar>
+              <w:top w:w="100" w:type="dxa"/>
+              <w:left w:w="100" w:type="dxa"/>
+              <w:bottom w:w="100" w:type="dxa"/>
+              <w:right w:w="100" w:type="dxa"/>
+            </w:tcMar>
+            <w:hideMark/>
+          </w:tcPr>
+          <w:p>
+            <w:r>
+              <w:lastRenderedPageBreak/>
               <w:t>Recommend</w:t>
             </w:r>
           </w:p>
@@ -9785,7 +10256,19 @@
           </w:tcPr>
           <w:p>
             <w:r>
-              <w:t>If not, provide the citation and the doi of the publication(s) below, with the format ‘publication: doi’:</w:t>
+              <w:t xml:space="preserve">If not, provide the citation and the </w:t>
+            </w:r>
+            <w:r>
+              <w:t>PID</w:t>
+            </w:r>
+            <w:r>
+              <w:t xml:space="preserve"> of the publication(s) below, with the format ‘publication: </w:t>
+            </w:r>
+            <w:r>
+              <w:t>PID</w:t>
+            </w:r>
+            <w:r>
+              <w:t>’:</w:t>
             </w:r>
           </w:p>
           <w:p>
@@ -10156,6 +10639,7 @@
                 <w:b/>
                 <w:bCs/>
               </w:rPr>
+              <w:lastRenderedPageBreak/>
               <w:t>5.1</w:t>
             </w:r>
           </w:p>
@@ -10184,7 +10668,7 @@
                 <w:b/>
                 <w:bCs/>
               </w:rPr>
-              <w:t>Is the dataset free of obvious sensitivity issues (e.g., direct identifiers)?</w:t>
+              <w:t>Does the dataset contain any obvious sensitivity issues, such as direct identifiers?</w:t>
             </w:r>
           </w:p>
         </w:tc>
@@ -10214,11 +10698,7 @@
               </w:numPr>
             </w:pPr>
             <w:r>
-              <w:t xml:space="preserve">Review documentation and file names and see if there are any that should be opened and reviewed (e.g. if a file is named “participant survey” - maybe </w:t>
-            </w:r>
-            <w:r>
-              <w:lastRenderedPageBreak/>
-              <w:t>open that one)</w:t>
+              <w:t>Review documentation and file names and see if there are any that should be opened and reviewed (e.g. if a file is named “participant survey” - maybe open that one)</w:t>
             </w:r>
           </w:p>
           <w:p>
@@ -10251,7 +10731,13 @@
             </w:tcMar>
             <w:hideMark/>
           </w:tcPr>
-          <w:p/>
+          <w:p>
+            <w:pPr>
+              <w:rPr>
+                <w:rFonts w:hint="eastAsia"/>
+              </w:rPr>
+            </w:pPr>
+          </w:p>
         </w:tc>
         <w:tc>
           <w:tcPr>
@@ -10516,7 +11002,11 @@
               </w:numPr>
             </w:pPr>
             <w:r>
-              <w:t>If something is flagged in the sensitive data review (see question above), check the intake form to confirm information about their REB status.</w:t>
+              <w:t xml:space="preserve">If something is flagged in the sensitive data review (see question above), check the intake </w:t>
+            </w:r>
+            <w:r>
+              <w:lastRenderedPageBreak/>
+              <w:t>form to confirm information about their REB status.</w:t>
             </w:r>
           </w:p>
         </w:tc>
@@ -10787,11 +11277,7 @@
               </w:numPr>
             </w:pPr>
             <w:r>
-              <w:t xml:space="preserve">Check if the </w:t>
-            </w:r>
-            <w:r>
-              <w:lastRenderedPageBreak/>
-              <w:t>deposit includes restricted files (if yes, recommend they use custom terms)</w:t>
+              <w:t>Check if the deposit includes restricted files (if yes, recommend they use custom terms)</w:t>
             </w:r>
           </w:p>
         </w:tc>
@@ -10921,7 +11407,11 @@
               <w:br/>
             </w:r>
             <w:r>
-              <w:t>{% if template_dict.restricted_files.comment</w:t>
+              <w:t xml:space="preserve">{% if </w:t>
+            </w:r>
+            <w:proofErr w:type="spellStart"/>
+            <w:r>
+              <w:t>template_dict.restricted_files.comment</w:t>
             </w:r>
             <w:r>
               <w:rPr>
@@ -10930,10 +11420,22 @@
               <w:t>s</w:t>
             </w:r>
             <w:r>
-              <w:t>|length &gt; 0</w:t>
-            </w:r>
-            <w:r>
-              <w:t xml:space="preserve"> %}{% for item in template_dict.restricted_files.comments %} </w:t>
+              <w:t>|length</w:t>
+            </w:r>
+            <w:proofErr w:type="spellEnd"/>
+            <w:r>
+              <w:t xml:space="preserve"> &gt; 0</w:t>
+            </w:r>
+            <w:r>
+              <w:t xml:space="preserve"> %}{% for item in </w:t>
+            </w:r>
+            <w:proofErr w:type="spellStart"/>
+            <w:r>
+              <w:t>template_dict.restricted_files.comments</w:t>
+            </w:r>
+            <w:proofErr w:type="spellEnd"/>
+            <w:r>
+              <w:t xml:space="preserve"> %} </w:t>
             </w:r>
           </w:p>
           <w:p>
@@ -10945,7 +11447,23 @@
               </w:numPr>
             </w:pPr>
             <w:r>
-              <w:t>{{ item.file_name }} {% endfor %}</w:t>
+              <w:t xml:space="preserve">{{ </w:t>
+            </w:r>
+            <w:proofErr w:type="spellStart"/>
+            <w:r>
+              <w:t>item.file_name</w:t>
+            </w:r>
+            <w:proofErr w:type="spellEnd"/>
+            <w:r>
+              <w:t xml:space="preserve"> }} {% </w:t>
+            </w:r>
+            <w:proofErr w:type="spellStart"/>
+            <w:r>
+              <w:t>endfor</w:t>
+            </w:r>
+            <w:proofErr w:type="spellEnd"/>
+            <w:r>
+              <w:t xml:space="preserve"> %}</w:t>
             </w:r>
           </w:p>
           <w:p>
@@ -10978,8 +11496,23 @@
               </w:rPr>
             </w:pPr>
             <w:r>
-              <w:lastRenderedPageBreak/>
-              <w:t>{% if template_dict.terms_license.licenseName is not none %}{{ template_dict.terms_license.licenseName }}{% else %}(NONE){% endif %}</w:t>
+              <w:t xml:space="preserve">{% if </w:t>
+            </w:r>
+            <w:proofErr w:type="spellStart"/>
+            <w:r>
+              <w:t>template_dict.terms_license.licenseName</w:t>
+            </w:r>
+            <w:proofErr w:type="spellEnd"/>
+            <w:r>
+              <w:t xml:space="preserve"> is not none %}{{ </w:t>
+            </w:r>
+            <w:proofErr w:type="spellStart"/>
+            <w:r>
+              <w:t>template_dict.terms_license.licenseName</w:t>
+            </w:r>
+            <w:proofErr w:type="spellEnd"/>
+            <w:r>
+              <w:t xml:space="preserve"> }}{% else %}(NONE){% endif %}</w:t>
             </w:r>
           </w:p>
           <w:p>
@@ -11006,7 +11539,7 @@
               <w:tblLook w:val="04A0" w:firstRow="1" w:lastRow="0" w:firstColumn="1" w:lastColumn="0" w:noHBand="0" w:noVBand="1"/>
             </w:tblPr>
             <w:tblGrid>
-              <w:gridCol w:w="3826"/>
+              <w:gridCol w:w="3719"/>
             </w:tblGrid>
             <w:tr>
               <w:tc>
@@ -11020,17 +11553,27 @@
                     </w:rPr>
                   </w:pPr>
                   <w:r>
-                    <w:t>{% if template_dict.terms_license.</w:t>
+                    <w:t xml:space="preserve">{% if </w:t>
+                  </w:r>
+                  <w:proofErr w:type="spellStart"/>
+                  <w:r>
+                    <w:t>template_dict.terms_license.</w:t>
                   </w:r>
                   <w:r>
                     <w:t>termsOfUse</w:t>
                   </w:r>
+                  <w:proofErr w:type="spellEnd"/>
                   <w:r>
-                    <w:t xml:space="preserve"> is not none %}{{ template_dict.terms_license.</w:t>
+                    <w:t xml:space="preserve"> is not none %}{{ </w:t>
+                  </w:r>
+                  <w:proofErr w:type="spellStart"/>
+                  <w:r>
+                    <w:t>template_dict.terms_license.</w:t>
                   </w:r>
                   <w:r>
                     <w:t>termsOfUse</w:t>
                   </w:r>
+                  <w:proofErr w:type="spellEnd"/>
                   <w:r>
                     <w:t xml:space="preserve"> }}{% else %}(NONE){% endif %}</w:t>
                   </w:r>
@@ -11060,7 +11603,6 @@
           </w:tcPr>
           <w:p>
             <w:r>
-              <w:lastRenderedPageBreak/>
               <w:t>Require</w:t>
             </w:r>
           </w:p>
@@ -11174,7 +11716,11 @@
               </w:numPr>
             </w:pPr>
             <w:r>
-              <w:t>If there are restricted files and no Terms of Access, recommend including terms of access.</w:t>
+              <w:t xml:space="preserve">If there are restricted files and no Terms of Access, recommend including </w:t>
+            </w:r>
+            <w:r>
+              <w:lastRenderedPageBreak/>
+              <w:t>terms of access.</w:t>
             </w:r>
           </w:p>
           <w:p>
@@ -11211,13 +11757,22 @@
                 <w:rFonts w:hint="eastAsia"/>
                 <w:lang w:val="en-US"/>
               </w:rPr>
+              <w:lastRenderedPageBreak/>
               <w:t xml:space="preserve">{% if </w:t>
             </w:r>
-            <w:r>
-              <w:rPr>
-                <w:lang w:val="en-US"/>
-              </w:rPr>
-              <w:t>template_dict.</w:t>
+            <w:proofErr w:type="spellStart"/>
+            <w:r>
+              <w:rPr>
+                <w:lang w:val="en-US"/>
+              </w:rPr>
+              <w:t>template_dict</w:t>
+            </w:r>
+            <w:proofErr w:type="spellEnd"/>
+            <w:r>
+              <w:rPr>
+                <w:lang w:val="en-US"/>
+              </w:rPr>
+              <w:t>.</w:t>
             </w:r>
             <w:r>
               <w:rPr>
@@ -11230,21 +11785,38 @@
               </w:rPr>
               <w:t xml:space="preserve"> </w:t>
             </w:r>
+            <w:proofErr w:type="spellStart"/>
             <w:r>
               <w:t>restricted_files</w:t>
             </w:r>
-            <w:r>
-              <w:rPr>
-                <w:lang w:val="en-US"/>
-              </w:rPr>
-              <w:t>.comments</w:t>
+            <w:proofErr w:type="spellEnd"/>
+            <w:r>
+              <w:rPr>
+                <w:lang w:val="en-US"/>
+              </w:rPr>
+              <w:t>.</w:t>
+            </w:r>
+            <w:proofErr w:type="spellStart"/>
+            <w:r>
+              <w:rPr>
+                <w:lang w:val="en-US"/>
+              </w:rPr>
+              <w:t>comments</w:t>
             </w:r>
             <w:r>
               <w:rPr>
                 <w:rFonts w:hint="eastAsia"/>
                 <w:lang w:val="en-US"/>
               </w:rPr>
-              <w:t>|length &gt;</w:t>
+              <w:t>|length</w:t>
+            </w:r>
+            <w:proofErr w:type="spellEnd"/>
+            <w:r>
+              <w:rPr>
+                <w:rFonts w:hint="eastAsia"/>
+                <w:lang w:val="en-US"/>
+              </w:rPr>
+              <w:t xml:space="preserve"> &gt;</w:t>
             </w:r>
             <w:r>
               <w:rPr>
@@ -11259,12 +11831,14 @@
               </w:rPr>
               <w:t xml:space="preserve">and </w:t>
             </w:r>
+            <w:proofErr w:type="spellStart"/>
             <w:r>
               <w:t>template_dict.terms_license.</w:t>
             </w:r>
             <w:r>
               <w:t>termsOfAccess</w:t>
             </w:r>
+            <w:proofErr w:type="spellEnd"/>
             <w:r>
               <w:t xml:space="preserve"> is not none</w:t>
             </w:r>
@@ -11303,11 +11877,19 @@
               </w:rPr>
               <w:t xml:space="preserve">{% if </w:t>
             </w:r>
-            <w:r>
-              <w:rPr>
-                <w:lang w:val="en-US"/>
-              </w:rPr>
-              <w:t>template_dict.</w:t>
+            <w:proofErr w:type="spellStart"/>
+            <w:r>
+              <w:rPr>
+                <w:lang w:val="en-US"/>
+              </w:rPr>
+              <w:t>template_dict</w:t>
+            </w:r>
+            <w:proofErr w:type="spellEnd"/>
+            <w:r>
+              <w:rPr>
+                <w:lang w:val="en-US"/>
+              </w:rPr>
+              <w:t>.</w:t>
             </w:r>
             <w:r>
               <w:rPr>
@@ -11320,21 +11902,38 @@
               </w:rPr>
               <w:t xml:space="preserve"> </w:t>
             </w:r>
+            <w:proofErr w:type="spellStart"/>
             <w:r>
               <w:t>restricted_files</w:t>
             </w:r>
-            <w:r>
-              <w:rPr>
-                <w:lang w:val="en-US"/>
-              </w:rPr>
-              <w:t>.comments</w:t>
+            <w:proofErr w:type="spellEnd"/>
+            <w:r>
+              <w:rPr>
+                <w:lang w:val="en-US"/>
+              </w:rPr>
+              <w:t>.</w:t>
+            </w:r>
+            <w:proofErr w:type="spellStart"/>
+            <w:r>
+              <w:rPr>
+                <w:lang w:val="en-US"/>
+              </w:rPr>
+              <w:t>comments</w:t>
             </w:r>
             <w:r>
               <w:rPr>
                 <w:rFonts w:hint="eastAsia"/>
                 <w:lang w:val="en-US"/>
               </w:rPr>
-              <w:t>|length &gt;</w:t>
+              <w:t>|length</w:t>
+            </w:r>
+            <w:proofErr w:type="spellEnd"/>
+            <w:r>
+              <w:rPr>
+                <w:rFonts w:hint="eastAsia"/>
+                <w:lang w:val="en-US"/>
+              </w:rPr>
+              <w:t xml:space="preserve"> &gt;</w:t>
             </w:r>
             <w:r>
               <w:rPr>
@@ -11349,12 +11948,14 @@
               </w:rPr>
               <w:t xml:space="preserve">and </w:t>
             </w:r>
+            <w:proofErr w:type="spellStart"/>
             <w:r>
               <w:t>template_dict.terms_license.</w:t>
             </w:r>
             <w:r>
               <w:t>termsOfAccess</w:t>
             </w:r>
+            <w:proofErr w:type="spellEnd"/>
             <w:r>
               <w:t xml:space="preserve"> is none</w:t>
             </w:r>
@@ -11429,11 +12030,19 @@
               </w:rPr>
               <w:t xml:space="preserve">{% if </w:t>
             </w:r>
-            <w:r>
-              <w:rPr>
-                <w:lang w:val="en-US"/>
-              </w:rPr>
-              <w:t>template_dict.</w:t>
+            <w:proofErr w:type="spellStart"/>
+            <w:r>
+              <w:rPr>
+                <w:lang w:val="en-US"/>
+              </w:rPr>
+              <w:t>template_dict</w:t>
+            </w:r>
+            <w:proofErr w:type="spellEnd"/>
+            <w:r>
+              <w:rPr>
+                <w:lang w:val="en-US"/>
+              </w:rPr>
+              <w:t>.</w:t>
             </w:r>
             <w:r>
               <w:rPr>
@@ -11446,21 +12055,38 @@
               </w:rPr>
               <w:t xml:space="preserve"> </w:t>
             </w:r>
+            <w:proofErr w:type="spellStart"/>
             <w:r>
               <w:t>restricted_files</w:t>
             </w:r>
-            <w:r>
-              <w:rPr>
-                <w:lang w:val="en-US"/>
-              </w:rPr>
-              <w:t>.comments</w:t>
+            <w:proofErr w:type="spellEnd"/>
+            <w:r>
+              <w:rPr>
+                <w:lang w:val="en-US"/>
+              </w:rPr>
+              <w:t>.</w:t>
+            </w:r>
+            <w:proofErr w:type="spellStart"/>
+            <w:r>
+              <w:rPr>
+                <w:lang w:val="en-US"/>
+              </w:rPr>
+              <w:t>comments</w:t>
             </w:r>
             <w:r>
               <w:rPr>
                 <w:rFonts w:hint="eastAsia"/>
                 <w:lang w:val="en-US"/>
               </w:rPr>
-              <w:t>|length ==</w:t>
+              <w:t>|length</w:t>
+            </w:r>
+            <w:proofErr w:type="spellEnd"/>
+            <w:r>
+              <w:rPr>
+                <w:rFonts w:hint="eastAsia"/>
+                <w:lang w:val="en-US"/>
+              </w:rPr>
+              <w:t xml:space="preserve"> ==</w:t>
             </w:r>
             <w:r>
               <w:rPr>
@@ -11520,7 +12146,7 @@
               <w:tblLook w:val="04A0" w:firstRow="1" w:lastRow="0" w:firstColumn="1" w:lastColumn="0" w:noHBand="0" w:noVBand="1"/>
             </w:tblPr>
             <w:tblGrid>
-              <w:gridCol w:w="3826"/>
+              <w:gridCol w:w="3719"/>
             </w:tblGrid>
             <w:tr>
               <w:tc>
@@ -11534,17 +12160,27 @@
                     </w:rPr>
                   </w:pPr>
                   <w:r>
-                    <w:t>{% if template_dict.terms_license.</w:t>
+                    <w:t xml:space="preserve">{% if </w:t>
+                  </w:r>
+                  <w:proofErr w:type="spellStart"/>
+                  <w:r>
+                    <w:t>template_dict.terms_license.</w:t>
                   </w:r>
                   <w:r>
                     <w:t>termsOfAccess</w:t>
                   </w:r>
+                  <w:proofErr w:type="spellEnd"/>
                   <w:r>
-                    <w:t xml:space="preserve"> is not none %}{{ template_dict.terms_license.</w:t>
+                    <w:t xml:space="preserve"> is not none %}{{ </w:t>
+                  </w:r>
+                  <w:proofErr w:type="spellStart"/>
+                  <w:r>
+                    <w:t>template_dict.terms_license.</w:t>
                   </w:r>
                   <w:r>
                     <w:t>termsOfAccess</w:t>
                   </w:r>
+                  <w:proofErr w:type="spellEnd"/>
                   <w:r>
                     <w:t xml:space="preserve"> }}{% else %}(NONE){% endif %}</w:t>
                   </w:r>
@@ -11680,11 +12316,7 @@
               </w:numPr>
             </w:pPr>
             <w:r>
-              <w:t xml:space="preserve">Review the description, documentation, and names of </w:t>
-            </w:r>
-            <w:r>
-              <w:lastRenderedPageBreak/>
-              <w:t>files to see if there are any that stand out as possible third-party data sources.</w:t>
+              <w:t>Review the description, documentation, and names of files to see if there are any that stand out as possible third-party data sources.</w:t>
             </w:r>
           </w:p>
         </w:tc>
@@ -19341,6 +19973,29 @@
       </w:tblBorders>
     </w:tblPr>
   </w:style>
+  <w:style w:type="character" w:styleId="Hyperlink">
+    <w:name w:val="Hyperlink"/>
+    <w:basedOn w:val="DefaultParagraphFont"/>
+    <w:uiPriority w:val="99"/>
+    <w:unhideWhenUsed/>
+    <w:rsid w:val="00E5575D"/>
+    <w:rPr>
+      <w:color w:val="467886" w:themeColor="hyperlink"/>
+      <w:u w:val="single"/>
+    </w:rPr>
+  </w:style>
+  <w:style w:type="character" w:styleId="UnresolvedMention">
+    <w:name w:val="Unresolved Mention"/>
+    <w:basedOn w:val="DefaultParagraphFont"/>
+    <w:uiPriority w:val="99"/>
+    <w:semiHidden/>
+    <w:unhideWhenUsed/>
+    <w:rsid w:val="00E5575D"/>
+    <w:rPr>
+      <w:color w:val="605E5C"/>
+      <w:shd w:val="clear" w:color="auto" w:fill="E1DFDD"/>
+    </w:rPr>
+  </w:style>
 </w:styles>
 </file>
 

</xml_diff>

<commit_message>
Added support for checking whether any any authors contain University of Toronto (non-case sensitive) in the affiliation name (including `uoft`, `u of t`, and `university of toronto`) #90
</commit_message>
<xml_diff>
--- a/res/template_high.docx
+++ b/res/template_high.docx
@@ -100,7 +100,6 @@
               </w:rPr>
               <w:t xml:space="preserve">Ticket number: {{ </w:t>
             </w:r>
-            <w:proofErr w:type="spellStart"/>
             <w:r>
               <w:t>project_info</w:t>
             </w:r>
@@ -113,7 +112,6 @@
             <w:r>
               <w:t>ticket_number</w:t>
             </w:r>
-            <w:proofErr w:type="spellEnd"/>
             <w:r>
               <w:rPr>
                 <w:rFonts w:hint="eastAsia"/>
@@ -143,7 +141,6 @@
               </w:rPr>
               <w:t xml:space="preserve"> {{ </w:t>
             </w:r>
-            <w:proofErr w:type="spellStart"/>
             <w:r>
               <w:t>project_info</w:t>
             </w:r>
@@ -151,14 +148,7 @@
               <w:rPr>
                 <w:rFonts w:hint="eastAsia"/>
               </w:rPr>
-              <w:t>.curator_name</w:t>
-            </w:r>
-            <w:proofErr w:type="spellEnd"/>
-            <w:r>
-              <w:rPr>
-                <w:rFonts w:hint="eastAsia"/>
-              </w:rPr>
-              <w:t xml:space="preserve"> }}</w:t>
+              <w:t>.curator_name }}</w:t>
             </w:r>
           </w:p>
           <w:p>
@@ -171,7 +161,6 @@
               </w:rPr>
               <w:t xml:space="preserve">Curator email: {{ </w:t>
             </w:r>
-            <w:proofErr w:type="spellStart"/>
             <w:r>
               <w:t>project_info</w:t>
             </w:r>
@@ -184,7 +173,6 @@
             <w:r>
               <w:t>curator_email</w:t>
             </w:r>
-            <w:proofErr w:type="spellEnd"/>
             <w:r>
               <w:rPr>
                 <w:rFonts w:hint="eastAsia"/>
@@ -200,19 +188,11 @@
               <w:rPr>
                 <w:rFonts w:hint="eastAsia"/>
               </w:rPr>
-              <w:t xml:space="preserve">Dataset title: {{ </w:t>
-            </w:r>
-            <w:proofErr w:type="spellStart"/>
-            <w:r>
-              <w:rPr>
-                <w:rFonts w:hint="eastAsia"/>
-              </w:rPr>
-              <w:t>dataset.</w:t>
+              <w:t>Dataset title: {{ dataset.</w:t>
             </w:r>
             <w:r>
               <w:t>DatasetTitle</w:t>
             </w:r>
-            <w:proofErr w:type="spellEnd"/>
             <w:r>
               <w:rPr>
                 <w:rFonts w:hint="eastAsia"/>
@@ -237,19 +217,11 @@
               <w:rPr>
                 <w:rFonts w:hint="eastAsia"/>
               </w:rPr>
-              <w:t xml:space="preserve"> identifier: {{ </w:t>
-            </w:r>
-            <w:proofErr w:type="spellStart"/>
-            <w:r>
-              <w:rPr>
-                <w:rFonts w:hint="eastAsia"/>
-              </w:rPr>
-              <w:t>dataset.</w:t>
+              <w:t xml:space="preserve"> identifier: {{ dataset.</w:t>
             </w:r>
             <w:r>
               <w:t>DatasetPersistentId</w:t>
             </w:r>
-            <w:proofErr w:type="spellEnd"/>
             <w:r>
               <w:rPr>
                 <w:rFonts w:hint="eastAsia"/>
@@ -276,19 +248,11 @@
               <w:rPr>
                 <w:rFonts w:hint="eastAsia"/>
               </w:rPr>
-              <w:t xml:space="preserve">Dataset access URL: {{ </w:t>
-            </w:r>
-            <w:proofErr w:type="spellStart"/>
-            <w:r>
-              <w:rPr>
-                <w:rFonts w:hint="eastAsia"/>
-              </w:rPr>
-              <w:t>dataset.</w:t>
+              <w:t>Dataset access URL: {{ dataset.</w:t>
             </w:r>
             <w:r>
               <w:t>DatasetURL</w:t>
             </w:r>
-            <w:proofErr w:type="spellEnd"/>
             <w:r>
               <w:rPr>
                 <w:rFonts w:hint="eastAsia"/>
@@ -1269,140 +1233,62 @@
               <w:rPr>
                 <w:lang w:val="en-US"/>
               </w:rPr>
-              <w:t xml:space="preserve">If applicable, list any previously created </w:t>
-            </w:r>
-            <w:proofErr w:type="spellStart"/>
+              <w:t>If applicable, list any previously created dataverse that contains the depositors' dataset</w:t>
+            </w:r>
             <w:r>
               <w:rPr>
                 <w:lang w:val="en-US"/>
               </w:rPr>
-              <w:t>dataverse</w:t>
-            </w:r>
-            <w:proofErr w:type="spellEnd"/>
+              <w:t>:</w:t>
+            </w:r>
             <w:r>
               <w:rPr>
                 <w:lang w:val="en-US"/>
               </w:rPr>
-              <w:t xml:space="preserve"> that contains the depositors' dataset</w:t>
-            </w:r>
-            <w:r>
-              <w:rPr>
-                <w:lang w:val="en-US"/>
+              <w:br/>
+            </w:r>
+            <w:r>
+              <w:t xml:space="preserve">{% for item in template_dict.dv_record.comments %} </w:t>
+            </w:r>
+          </w:p>
+          <w:p>
+            <w:r>
+              <w:t>{% for author, dataverses in item.items() %} {{ author }}</w:t>
+            </w:r>
+            <w:r>
+              <w:rPr>
+                <w:rFonts w:hint="eastAsia"/>
               </w:rPr>
               <w:t>:</w:t>
             </w:r>
-            <w:r>
-              <w:rPr>
-                <w:lang w:val="en-US"/>
-              </w:rPr>
+          </w:p>
+          <w:p>
+            <w:r>
+              <w:t xml:space="preserve">{% for dataverse in dataverses %} </w:t>
+            </w:r>
+            <w:r>
+              <w:t>{{ loop.index }}.</w:t>
+            </w:r>
+            <w:r>
+              <w:rPr>
+                <w:rFonts w:hint="eastAsia"/>
+              </w:rPr>
+              <w:t xml:space="preserve"> </w:t>
+            </w:r>
+            <w:r>
+              <w:t>{{ dataverse }}</w:t>
+            </w:r>
+            <w:r>
               <w:br/>
             </w:r>
             <w:r>
-              <w:t xml:space="preserve">{% for item in </w:t>
-            </w:r>
-            <w:proofErr w:type="spellStart"/>
-            <w:r>
-              <w:t>template_dict.dv_record.comments</w:t>
-            </w:r>
-            <w:proofErr w:type="spellEnd"/>
-            <w:r>
-              <w:t xml:space="preserve"> %} </w:t>
-            </w:r>
-          </w:p>
-          <w:p>
-            <w:r>
-              <w:t xml:space="preserve">{% for author, </w:t>
-            </w:r>
-            <w:proofErr w:type="spellStart"/>
-            <w:r>
-              <w:t>dataverses</w:t>
-            </w:r>
-            <w:proofErr w:type="spellEnd"/>
-            <w:r>
-              <w:t xml:space="preserve"> in </w:t>
-            </w:r>
-            <w:proofErr w:type="spellStart"/>
-            <w:r>
-              <w:t>item.items</w:t>
-            </w:r>
-            <w:proofErr w:type="spellEnd"/>
-            <w:r>
-              <w:t>() %} {{ author }}</w:t>
-            </w:r>
-            <w:r>
-              <w:rPr>
-                <w:rFonts w:hint="eastAsia"/>
-              </w:rPr>
-              <w:t>:</w:t>
-            </w:r>
-          </w:p>
-          <w:p>
-            <w:r>
-              <w:t xml:space="preserve">{% for dataverse in </w:t>
-            </w:r>
-            <w:proofErr w:type="spellStart"/>
-            <w:r>
-              <w:t>dataverses</w:t>
-            </w:r>
-            <w:proofErr w:type="spellEnd"/>
-            <w:r>
-              <w:t xml:space="preserve"> %} </w:t>
-            </w:r>
-            <w:r>
-              <w:t xml:space="preserve">{{ </w:t>
-            </w:r>
-            <w:proofErr w:type="spellStart"/>
-            <w:r>
-              <w:t>loop.index</w:t>
-            </w:r>
-            <w:proofErr w:type="spellEnd"/>
-            <w:r>
-              <w:t xml:space="preserve"> }}.</w:t>
-            </w:r>
-            <w:r>
-              <w:rPr>
-                <w:rFonts w:hint="eastAsia"/>
-              </w:rPr>
-              <w:t xml:space="preserve"> </w:t>
-            </w:r>
-            <w:r>
-              <w:t>{{ dataverse }}</w:t>
+              <w:t xml:space="preserve">{% endfor %} </w:t>
             </w:r>
             <w:r>
               <w:br/>
             </w:r>
             <w:r>
-              <w:t xml:space="preserve">{% </w:t>
-            </w:r>
-            <w:proofErr w:type="spellStart"/>
-            <w:r>
-              <w:t>endfor</w:t>
-            </w:r>
-            <w:proofErr w:type="spellEnd"/>
-            <w:r>
-              <w:t xml:space="preserve"> %} </w:t>
-            </w:r>
-            <w:r>
-              <w:br/>
-            </w:r>
-            <w:r>
-              <w:t xml:space="preserve">{% </w:t>
-            </w:r>
-            <w:proofErr w:type="spellStart"/>
-            <w:r>
-              <w:t>endfor</w:t>
-            </w:r>
-            <w:proofErr w:type="spellEnd"/>
-            <w:r>
-              <w:t xml:space="preserve"> %} {% </w:t>
-            </w:r>
-            <w:proofErr w:type="spellStart"/>
-            <w:r>
-              <w:t>endfor</w:t>
-            </w:r>
-            <w:proofErr w:type="spellEnd"/>
-            <w:r>
-              <w:t xml:space="preserve"> %}</w:t>
+              <w:t>{% endfor %} {% endfor %}</w:t>
             </w:r>
           </w:p>
         </w:tc>
@@ -1689,7 +1575,6 @@
               </w:rPr>
               <w:t xml:space="preserve">parent </w:t>
             </w:r>
-            <w:proofErr w:type="spellStart"/>
             <w:r>
               <w:rPr>
                 <w:rFonts w:hint="eastAsia"/>
@@ -1702,109 +1587,90 @@
                 <w:rFonts w:hint="eastAsia"/>
                 <w:lang w:val="en-US"/>
               </w:rPr>
-              <w:t>ataverse</w:t>
-            </w:r>
-            <w:proofErr w:type="spellEnd"/>
+              <w:t xml:space="preserve">ataverse </w:t>
+            </w:r>
+            <w:r>
+              <w:rPr>
+                <w:lang w:val="en-US"/>
+              </w:rPr>
+              <w:t>collection</w:t>
+            </w:r>
             <w:r>
               <w:rPr>
                 <w:rFonts w:hint="eastAsia"/>
                 <w:lang w:val="en-US"/>
               </w:rPr>
-              <w:t xml:space="preserve"> </w:t>
+              <w:t xml:space="preserve"> name:</w:t>
             </w:r>
             <w:r>
               <w:rPr>
                 <w:lang w:val="en-US"/>
               </w:rPr>
-              <w:t>collection</w:t>
+              <w:br/>
             </w:r>
             <w:r>
               <w:rPr>
                 <w:rFonts w:hint="eastAsia"/>
                 <w:lang w:val="en-US"/>
               </w:rPr>
-              <w:t xml:space="preserve"> name:</w:t>
+              <w:t xml:space="preserve">{{ </w:t>
+            </w:r>
+            <w:r>
+              <w:t>template_dict</w:t>
+            </w:r>
+            <w:r>
+              <w:rPr>
+                <w:rFonts w:hint="eastAsia"/>
+              </w:rPr>
+              <w:t>.</w:t>
             </w:r>
             <w:r>
               <w:rPr>
                 <w:lang w:val="en-US"/>
               </w:rPr>
+              <w:t>ds_tree_info</w:t>
+            </w:r>
+            <w:r>
+              <w:rPr>
+                <w:lang w:val="en-US"/>
+              </w:rPr>
+              <w:t>.</w:t>
+            </w:r>
+            <w:r>
+              <w:rPr>
+                <w:lang w:val="en-US"/>
+              </w:rPr>
+              <w:t>parentDataverseName</w:t>
+            </w:r>
+            <w:r>
+              <w:rPr>
+                <w:rFonts w:hint="eastAsia"/>
+              </w:rPr>
+              <w:t xml:space="preserve"> }}</w:t>
+            </w:r>
+          </w:p>
+          <w:p>
+            <w:r>
+              <w:t>List the dataset (full) path in the Dataverse repository</w:t>
+            </w:r>
+            <w:r>
               <w:br/>
             </w:r>
             <w:r>
               <w:rPr>
-                <w:rFonts w:hint="eastAsia"/>
                 <w:lang w:val="en-US"/>
               </w:rPr>
               <w:t xml:space="preserve">{{ </w:t>
             </w:r>
-            <w:proofErr w:type="spellStart"/>
-            <w:r>
-              <w:t>template_dict</w:t>
-            </w:r>
-            <w:proofErr w:type="spellEnd"/>
-            <w:r>
-              <w:rPr>
-                <w:rFonts w:hint="eastAsia"/>
-              </w:rPr>
-              <w:t>.</w:t>
-            </w:r>
-            <w:proofErr w:type="spellStart"/>
+            <w:r>
+              <w:t>template_dict.</w:t>
+            </w:r>
             <w:r>
               <w:rPr>
                 <w:lang w:val="en-US"/>
               </w:rPr>
-              <w:t>ds_tree_info</w:t>
-            </w:r>
-            <w:r>
-              <w:rPr>
-                <w:lang w:val="en-US"/>
-              </w:rPr>
-              <w:t>.</w:t>
-            </w:r>
-            <w:r>
-              <w:rPr>
-                <w:lang w:val="en-US"/>
-              </w:rPr>
-              <w:t>parentDataverseName</w:t>
-            </w:r>
-            <w:proofErr w:type="spellEnd"/>
-            <w:r>
-              <w:rPr>
-                <w:rFonts w:hint="eastAsia"/>
-              </w:rPr>
-              <w:t xml:space="preserve"> }}</w:t>
-            </w:r>
-          </w:p>
-          <w:p>
-            <w:r>
-              <w:t>List the dataset (full) path in the Dataverse repository</w:t>
-            </w:r>
-            <w:r>
-              <w:br/>
-            </w:r>
-            <w:r>
-              <w:rPr>
-                <w:lang w:val="en-US"/>
-              </w:rPr>
-              <w:t xml:space="preserve">{{ </w:t>
-            </w:r>
-            <w:proofErr w:type="spellStart"/>
-            <w:r>
-              <w:t>template_dict</w:t>
-            </w:r>
-            <w:proofErr w:type="spellEnd"/>
-            <w:r>
-              <w:t>.</w:t>
-            </w:r>
-            <w:proofErr w:type="spellStart"/>
-            <w:r>
-              <w:rPr>
-                <w:lang w:val="en-US"/>
-              </w:rPr>
               <w:t>ds_tree_info.path</w:t>
             </w:r>
-            <w:proofErr w:type="spellEnd"/>
             <w:r>
               <w:t>}}</w:t>
             </w:r>
@@ -2542,191 +2408,147 @@
               <w:rPr>
                 <w:lang w:val="en-US"/>
               </w:rPr>
+              <w:t>{% if template_dict.file_ext.comments|length == 0 %}X{% endif %}</w:t>
+            </w:r>
+          </w:p>
+        </w:tc>
+        <w:tc>
+          <w:tcPr>
+            <w:tcW w:w="0" w:type="auto"/>
+            <w:tcBorders>
+              <w:top w:val="single" w:sz="8" w:space="0" w:color="000000"/>
+              <w:left w:val="single" w:sz="8" w:space="0" w:color="000000"/>
+              <w:bottom w:val="single" w:sz="8" w:space="0" w:color="000000"/>
+              <w:right w:val="single" w:sz="8" w:space="0" w:color="000000"/>
+            </w:tcBorders>
+            <w:tcMar>
+              <w:top w:w="100" w:type="dxa"/>
+              <w:left w:w="100" w:type="dxa"/>
+              <w:bottom w:w="100" w:type="dxa"/>
+              <w:right w:w="100" w:type="dxa"/>
+            </w:tcMar>
+            <w:hideMark/>
+          </w:tcPr>
+          <w:p>
+            <w:r>
+              <w:rPr>
+                <w:lang w:val="en-US"/>
+              </w:rPr>
+              <w:t>{% if template_dict.file_ext.comments|length &gt; 0 %}X{% endif %}</w:t>
+            </w:r>
+          </w:p>
+        </w:tc>
+        <w:tc>
+          <w:tcPr>
+            <w:tcW w:w="0" w:type="auto"/>
+            <w:tcBorders>
+              <w:top w:val="single" w:sz="8" w:space="0" w:color="000000"/>
+              <w:left w:val="single" w:sz="8" w:space="0" w:color="000000"/>
+              <w:bottom w:val="single" w:sz="8" w:space="0" w:color="000000"/>
+              <w:right w:val="single" w:sz="8" w:space="0" w:color="000000"/>
+            </w:tcBorders>
+            <w:tcMar>
+              <w:top w:w="100" w:type="dxa"/>
+              <w:left w:w="100" w:type="dxa"/>
+              <w:bottom w:w="100" w:type="dxa"/>
+              <w:right w:w="100" w:type="dxa"/>
+            </w:tcMar>
+          </w:tcPr>
+          <w:p/>
+        </w:tc>
+        <w:tc>
+          <w:tcPr>
+            <w:tcW w:w="0" w:type="auto"/>
+            <w:tcBorders>
+              <w:top w:val="single" w:sz="8" w:space="0" w:color="000000"/>
+              <w:left w:val="single" w:sz="8" w:space="0" w:color="000000"/>
+              <w:bottom w:val="single" w:sz="8" w:space="0" w:color="000000"/>
+              <w:right w:val="single" w:sz="8" w:space="0" w:color="000000"/>
+            </w:tcBorders>
+            <w:tcMar>
+              <w:top w:w="100" w:type="dxa"/>
+              <w:left w:w="100" w:type="dxa"/>
+              <w:bottom w:w="100" w:type="dxa"/>
+              <w:right w:w="100" w:type="dxa"/>
+            </w:tcMar>
+            <w:hideMark/>
+          </w:tcPr>
+          <w:p/>
+        </w:tc>
+        <w:tc>
+          <w:tcPr>
+            <w:tcW w:w="0" w:type="auto"/>
+            <w:tcBorders>
+              <w:top w:val="single" w:sz="8" w:space="0" w:color="000000"/>
+              <w:left w:val="single" w:sz="8" w:space="0" w:color="000000"/>
+              <w:bottom w:val="single" w:sz="8" w:space="0" w:color="000000"/>
+              <w:right w:val="single" w:sz="8" w:space="0" w:color="000000"/>
+            </w:tcBorders>
+            <w:tcMar>
+              <w:top w:w="100" w:type="dxa"/>
+              <w:left w:w="100" w:type="dxa"/>
+              <w:bottom w:w="100" w:type="dxa"/>
+              <w:right w:w="100" w:type="dxa"/>
+            </w:tcMar>
+            <w:hideMark/>
+          </w:tcPr>
+          <w:p/>
+        </w:tc>
+        <w:tc>
+          <w:tcPr>
+            <w:tcW w:w="0" w:type="auto"/>
+            <w:tcBorders>
+              <w:top w:val="single" w:sz="8" w:space="0" w:color="000000"/>
+              <w:left w:val="single" w:sz="8" w:space="0" w:color="000000"/>
+              <w:bottom w:val="single" w:sz="8" w:space="0" w:color="000000"/>
+              <w:right w:val="single" w:sz="8" w:space="0" w:color="000000"/>
+            </w:tcBorders>
+            <w:tcMar>
+              <w:top w:w="100" w:type="dxa"/>
+              <w:left w:w="100" w:type="dxa"/>
+              <w:bottom w:w="100" w:type="dxa"/>
+              <w:right w:w="100" w:type="dxa"/>
+            </w:tcMar>
+            <w:hideMark/>
+          </w:tcPr>
+          <w:p>
+            <w:pPr>
+              <w:rPr>
+                <w:lang w:val="en-US"/>
+              </w:rPr>
+            </w:pPr>
+            <w:r>
+              <w:rPr>
+                <w:lang w:val="en-US"/>
+              </w:rPr>
+              <w:t>List all files that did not open correctly:</w:t>
+            </w:r>
+            <w:r>
+              <w:rPr>
+                <w:lang w:val="en-US"/>
+              </w:rPr>
+              <w:br/>
+            </w:r>
+            <w:r>
               <w:t xml:space="preserve">{% if </w:t>
             </w:r>
-            <w:proofErr w:type="spellStart"/>
             <w:r>
               <w:rPr>
                 <w:lang w:val="en-US"/>
               </w:rPr>
-              <w:t>template_dict.file_ext.comments|length</w:t>
-            </w:r>
-            <w:proofErr w:type="spellEnd"/>
+              <w:t>template_dict.file_open.comments</w:t>
+            </w:r>
+            <w:r>
+              <w:t xml:space="preserve"> |length &gt; 0</w:t>
+            </w:r>
+            <w:r>
+              <w:t xml:space="preserve"> %}</w:t>
+            </w:r>
             <w:r>
               <w:rPr>
                 <w:lang w:val="en-US"/>
               </w:rPr>
-              <w:t xml:space="preserve"> == 0 %}X{% endif %}</w:t>
-            </w:r>
-          </w:p>
-        </w:tc>
-        <w:tc>
-          <w:tcPr>
-            <w:tcW w:w="0" w:type="auto"/>
-            <w:tcBorders>
-              <w:top w:val="single" w:sz="8" w:space="0" w:color="000000"/>
-              <w:left w:val="single" w:sz="8" w:space="0" w:color="000000"/>
-              <w:bottom w:val="single" w:sz="8" w:space="0" w:color="000000"/>
-              <w:right w:val="single" w:sz="8" w:space="0" w:color="000000"/>
-            </w:tcBorders>
-            <w:tcMar>
-              <w:top w:w="100" w:type="dxa"/>
-              <w:left w:w="100" w:type="dxa"/>
-              <w:bottom w:w="100" w:type="dxa"/>
-              <w:right w:w="100" w:type="dxa"/>
-            </w:tcMar>
-            <w:hideMark/>
-          </w:tcPr>
-          <w:p>
-            <w:r>
-              <w:rPr>
-                <w:lang w:val="en-US"/>
-              </w:rPr>
-              <w:t xml:space="preserve">{% if </w:t>
-            </w:r>
-            <w:proofErr w:type="spellStart"/>
-            <w:r>
-              <w:rPr>
-                <w:lang w:val="en-US"/>
-              </w:rPr>
-              <w:t>template_dict.file_ext.comments|length</w:t>
-            </w:r>
-            <w:proofErr w:type="spellEnd"/>
-            <w:r>
-              <w:rPr>
-                <w:lang w:val="en-US"/>
-              </w:rPr>
-              <w:t xml:space="preserve"> &gt; 0 %}X{% endif %}</w:t>
-            </w:r>
-          </w:p>
-        </w:tc>
-        <w:tc>
-          <w:tcPr>
-            <w:tcW w:w="0" w:type="auto"/>
-            <w:tcBorders>
-              <w:top w:val="single" w:sz="8" w:space="0" w:color="000000"/>
-              <w:left w:val="single" w:sz="8" w:space="0" w:color="000000"/>
-              <w:bottom w:val="single" w:sz="8" w:space="0" w:color="000000"/>
-              <w:right w:val="single" w:sz="8" w:space="0" w:color="000000"/>
-            </w:tcBorders>
-            <w:tcMar>
-              <w:top w:w="100" w:type="dxa"/>
-              <w:left w:w="100" w:type="dxa"/>
-              <w:bottom w:w="100" w:type="dxa"/>
-              <w:right w:w="100" w:type="dxa"/>
-            </w:tcMar>
-          </w:tcPr>
-          <w:p/>
-        </w:tc>
-        <w:tc>
-          <w:tcPr>
-            <w:tcW w:w="0" w:type="auto"/>
-            <w:tcBorders>
-              <w:top w:val="single" w:sz="8" w:space="0" w:color="000000"/>
-              <w:left w:val="single" w:sz="8" w:space="0" w:color="000000"/>
-              <w:bottom w:val="single" w:sz="8" w:space="0" w:color="000000"/>
-              <w:right w:val="single" w:sz="8" w:space="0" w:color="000000"/>
-            </w:tcBorders>
-            <w:tcMar>
-              <w:top w:w="100" w:type="dxa"/>
-              <w:left w:w="100" w:type="dxa"/>
-              <w:bottom w:w="100" w:type="dxa"/>
-              <w:right w:w="100" w:type="dxa"/>
-            </w:tcMar>
-            <w:hideMark/>
-          </w:tcPr>
-          <w:p/>
-        </w:tc>
-        <w:tc>
-          <w:tcPr>
-            <w:tcW w:w="0" w:type="auto"/>
-            <w:tcBorders>
-              <w:top w:val="single" w:sz="8" w:space="0" w:color="000000"/>
-              <w:left w:val="single" w:sz="8" w:space="0" w:color="000000"/>
-              <w:bottom w:val="single" w:sz="8" w:space="0" w:color="000000"/>
-              <w:right w:val="single" w:sz="8" w:space="0" w:color="000000"/>
-            </w:tcBorders>
-            <w:tcMar>
-              <w:top w:w="100" w:type="dxa"/>
-              <w:left w:w="100" w:type="dxa"/>
-              <w:bottom w:w="100" w:type="dxa"/>
-              <w:right w:w="100" w:type="dxa"/>
-            </w:tcMar>
-            <w:hideMark/>
-          </w:tcPr>
-          <w:p/>
-        </w:tc>
-        <w:tc>
-          <w:tcPr>
-            <w:tcW w:w="0" w:type="auto"/>
-            <w:tcBorders>
-              <w:top w:val="single" w:sz="8" w:space="0" w:color="000000"/>
-              <w:left w:val="single" w:sz="8" w:space="0" w:color="000000"/>
-              <w:bottom w:val="single" w:sz="8" w:space="0" w:color="000000"/>
-              <w:right w:val="single" w:sz="8" w:space="0" w:color="000000"/>
-            </w:tcBorders>
-            <w:tcMar>
-              <w:top w:w="100" w:type="dxa"/>
-              <w:left w:w="100" w:type="dxa"/>
-              <w:bottom w:w="100" w:type="dxa"/>
-              <w:right w:w="100" w:type="dxa"/>
-            </w:tcMar>
-            <w:hideMark/>
-          </w:tcPr>
-          <w:p>
-            <w:pPr>
-              <w:rPr>
-                <w:lang w:val="en-US"/>
-              </w:rPr>
-            </w:pPr>
-            <w:r>
-              <w:rPr>
-                <w:lang w:val="en-US"/>
-              </w:rPr>
-              <w:t>List all files that did not open correctly:</w:t>
-            </w:r>
-            <w:r>
-              <w:rPr>
-                <w:lang w:val="en-US"/>
-              </w:rPr>
-              <w:br/>
-            </w:r>
-            <w:r>
-              <w:t xml:space="preserve">{% if </w:t>
-            </w:r>
-            <w:proofErr w:type="spellStart"/>
-            <w:r>
-              <w:rPr>
-                <w:lang w:val="en-US"/>
-              </w:rPr>
-              <w:t>template_dict.file_open.comments</w:t>
-            </w:r>
-            <w:proofErr w:type="spellEnd"/>
-            <w:r>
-              <w:t xml:space="preserve"> |length &gt; 0</w:t>
-            </w:r>
-            <w:r>
-              <w:t xml:space="preserve"> %}</w:t>
-            </w:r>
-            <w:r>
-              <w:rPr>
-                <w:lang w:val="en-US"/>
-              </w:rPr>
-              <w:t xml:space="preserve">{% for item in </w:t>
-            </w:r>
-            <w:proofErr w:type="spellStart"/>
-            <w:r>
-              <w:rPr>
-                <w:lang w:val="en-US"/>
-              </w:rPr>
-              <w:t>template_dict.file_open.comments</w:t>
-            </w:r>
-            <w:proofErr w:type="spellEnd"/>
-            <w:r>
-              <w:rPr>
-                <w:lang w:val="en-US"/>
-              </w:rPr>
-              <w:t xml:space="preserve"> %}</w:t>
+              <w:t>{% for item in template_dict.file_open.comments %}</w:t>
             </w:r>
           </w:p>
           <w:p>
@@ -2744,101 +2566,57 @@
               <w:rPr>
                 <w:lang w:val="en-US"/>
               </w:rPr>
-              <w:t xml:space="preserve">{{ </w:t>
-            </w:r>
-            <w:proofErr w:type="spellStart"/>
-            <w:r>
+              <w:t>{{ item.file_name }}{% endfor %}</w:t>
+            </w:r>
+          </w:p>
+          <w:p>
+            <w:pPr>
               <w:rPr>
                 <w:lang w:val="en-US"/>
               </w:rPr>
-              <w:t>item.file_name</w:t>
-            </w:r>
-            <w:proofErr w:type="spellEnd"/>
-            <w:r>
+            </w:pPr>
+            <w:r>
+              <w:t>{% else %}(NONE){% endif %}</w:t>
+            </w:r>
+          </w:p>
+          <w:p>
+            <w:pPr>
               <w:rPr>
                 <w:lang w:val="en-US"/>
               </w:rPr>
-              <w:t xml:space="preserve"> }}{% </w:t>
-            </w:r>
-            <w:proofErr w:type="spellStart"/>
+            </w:pPr>
             <w:r>
               <w:rPr>
                 <w:lang w:val="en-US"/>
               </w:rPr>
-              <w:t>endfor</w:t>
-            </w:r>
-            <w:proofErr w:type="spellEnd"/>
+              <w:t>List all files that were not checked:</w:t>
+            </w:r>
             <w:r>
               <w:rPr>
                 <w:lang w:val="en-US"/>
               </w:rPr>
+              <w:br/>
+            </w:r>
+            <w:r>
+              <w:t xml:space="preserve">{% if </w:t>
+            </w:r>
+            <w:r>
+              <w:rPr>
+                <w:lang w:val="en-US"/>
+              </w:rPr>
+              <w:t>template_dict.file_open.not_checked</w:t>
+            </w:r>
+            <w:r>
+              <w:t xml:space="preserve"> |length &gt; 0</w:t>
+            </w:r>
+            <w:r>
               <w:t xml:space="preserve"> %}</w:t>
             </w:r>
-          </w:p>
-          <w:p>
-            <w:pPr>
+            <w:r>
               <w:rPr>
                 <w:lang w:val="en-US"/>
               </w:rPr>
-            </w:pPr>
-            <w:r>
-              <w:t>{% else %}(NONE){% endif %}</w:t>
-            </w:r>
-          </w:p>
-          <w:p>
-            <w:pPr>
-              <w:rPr>
-                <w:lang w:val="en-US"/>
-              </w:rPr>
-            </w:pPr>
-            <w:r>
-              <w:rPr>
-                <w:lang w:val="en-US"/>
-              </w:rPr>
-              <w:t>List all files that were not checked:</w:t>
-            </w:r>
-            <w:r>
-              <w:rPr>
-                <w:lang w:val="en-US"/>
-              </w:rPr>
-              <w:br/>
-            </w:r>
-            <w:r>
-              <w:t xml:space="preserve">{% if </w:t>
-            </w:r>
-            <w:proofErr w:type="spellStart"/>
-            <w:r>
-              <w:rPr>
-                <w:lang w:val="en-US"/>
-              </w:rPr>
-              <w:t>template_dict.file_open.not_checked</w:t>
-            </w:r>
-            <w:proofErr w:type="spellEnd"/>
-            <w:r>
-              <w:t xml:space="preserve"> |length &gt; 0</w:t>
-            </w:r>
-            <w:r>
-              <w:t xml:space="preserve"> %}</w:t>
-            </w:r>
-            <w:r>
-              <w:rPr>
-                <w:lang w:val="en-US"/>
-              </w:rPr>
-              <w:t xml:space="preserve">{% for item in </w:t>
-            </w:r>
-            <w:proofErr w:type="spellStart"/>
-            <w:r>
-              <w:rPr>
-                <w:lang w:val="en-US"/>
-              </w:rPr>
-              <w:t>template_dict.file_open.not_checked</w:t>
-            </w:r>
-            <w:proofErr w:type="spellEnd"/>
-            <w:r>
-              <w:rPr>
-                <w:lang w:val="en-US"/>
-              </w:rPr>
-              <w:t xml:space="preserve"> %}</w:t>
+              <w:t>{% for item in template_dict.file_open.not_checked %}</w:t>
             </w:r>
           </w:p>
           <w:p>
@@ -2856,35 +2634,7 @@
               <w:rPr>
                 <w:lang w:val="en-US"/>
               </w:rPr>
-              <w:t xml:space="preserve">{{ </w:t>
-            </w:r>
-            <w:proofErr w:type="spellStart"/>
-            <w:r>
-              <w:rPr>
-                <w:lang w:val="en-US"/>
-              </w:rPr>
-              <w:t>item.file_name</w:t>
-            </w:r>
-            <w:proofErr w:type="spellEnd"/>
-            <w:r>
-              <w:rPr>
-                <w:lang w:val="en-US"/>
-              </w:rPr>
-              <w:t xml:space="preserve"> }}{% </w:t>
-            </w:r>
-            <w:proofErr w:type="spellStart"/>
-            <w:r>
-              <w:rPr>
-                <w:lang w:val="en-US"/>
-              </w:rPr>
-              <w:t>endfor</w:t>
-            </w:r>
-            <w:proofErr w:type="spellEnd"/>
-            <w:r>
-              <w:rPr>
-                <w:lang w:val="en-US"/>
-              </w:rPr>
-              <w:t xml:space="preserve"> %}</w:t>
+              <w:t>{{ item.file_name }}{% endfor %}</w:t>
             </w:r>
           </w:p>
           <w:p>
@@ -3067,202 +2817,152 @@
               <w:rPr>
                 <w:lang w:val="en-US"/>
               </w:rPr>
-              <w:t xml:space="preserve">{% if </w:t>
-            </w:r>
-            <w:proofErr w:type="spellStart"/>
+              <w:t>{% if template_dict.special_characters.comments|length == 0 %}X{% endif %}</w:t>
+            </w:r>
+          </w:p>
+        </w:tc>
+        <w:tc>
+          <w:tcPr>
+            <w:tcW w:w="0" w:type="auto"/>
+            <w:tcBorders>
+              <w:top w:val="single" w:sz="8" w:space="0" w:color="000000"/>
+              <w:left w:val="single" w:sz="8" w:space="0" w:color="000000"/>
+              <w:bottom w:val="single" w:sz="8" w:space="0" w:color="000000"/>
+              <w:right w:val="single" w:sz="8" w:space="0" w:color="000000"/>
+            </w:tcBorders>
+            <w:shd w:val="clear" w:color="auto" w:fill="EFEFEF"/>
+            <w:tcMar>
+              <w:top w:w="100" w:type="dxa"/>
+              <w:left w:w="100" w:type="dxa"/>
+              <w:bottom w:w="100" w:type="dxa"/>
+              <w:right w:w="100" w:type="dxa"/>
+            </w:tcMar>
+            <w:hideMark/>
+          </w:tcPr>
+          <w:p/>
+        </w:tc>
+        <w:tc>
+          <w:tcPr>
+            <w:tcW w:w="0" w:type="auto"/>
+            <w:tcBorders>
+              <w:top w:val="single" w:sz="8" w:space="0" w:color="000000"/>
+              <w:left w:val="single" w:sz="8" w:space="0" w:color="000000"/>
+              <w:bottom w:val="single" w:sz="8" w:space="0" w:color="000000"/>
+              <w:right w:val="single" w:sz="8" w:space="0" w:color="000000"/>
+            </w:tcBorders>
+            <w:shd w:val="clear" w:color="auto" w:fill="EFEFEF"/>
+            <w:tcMar>
+              <w:top w:w="100" w:type="dxa"/>
+              <w:left w:w="100" w:type="dxa"/>
+              <w:bottom w:w="100" w:type="dxa"/>
+              <w:right w:w="100" w:type="dxa"/>
+            </w:tcMar>
+            <w:hideMark/>
+          </w:tcPr>
+          <w:p>
             <w:r>
               <w:rPr>
                 <w:lang w:val="en-US"/>
               </w:rPr>
-              <w:t>template_dict.special_characters.comments|length</w:t>
-            </w:r>
-            <w:proofErr w:type="spellEnd"/>
-            <w:r>
+              <w:t>{% if template_dict.special_characters.comments|length &gt; 0 %}X{% endif %}</w:t>
+            </w:r>
+          </w:p>
+        </w:tc>
+        <w:tc>
+          <w:tcPr>
+            <w:tcW w:w="0" w:type="auto"/>
+            <w:tcBorders>
+              <w:top w:val="single" w:sz="8" w:space="0" w:color="000000"/>
+              <w:left w:val="single" w:sz="8" w:space="0" w:color="000000"/>
+              <w:bottom w:val="single" w:sz="8" w:space="0" w:color="000000"/>
+              <w:right w:val="single" w:sz="8" w:space="0" w:color="000000"/>
+            </w:tcBorders>
+            <w:shd w:val="clear" w:color="auto" w:fill="EFEFEF"/>
+            <w:tcMar>
+              <w:top w:w="100" w:type="dxa"/>
+              <w:left w:w="100" w:type="dxa"/>
+              <w:bottom w:w="100" w:type="dxa"/>
+              <w:right w:w="100" w:type="dxa"/>
+            </w:tcMar>
+            <w:hideMark/>
+          </w:tcPr>
+          <w:p/>
+        </w:tc>
+        <w:tc>
+          <w:tcPr>
+            <w:tcW w:w="0" w:type="auto"/>
+            <w:tcBorders>
+              <w:top w:val="single" w:sz="8" w:space="0" w:color="000000"/>
+              <w:left w:val="single" w:sz="8" w:space="0" w:color="000000"/>
+              <w:bottom w:val="single" w:sz="8" w:space="0" w:color="000000"/>
+              <w:right w:val="single" w:sz="8" w:space="0" w:color="000000"/>
+            </w:tcBorders>
+            <w:shd w:val="clear" w:color="auto" w:fill="EFEFEF"/>
+            <w:tcMar>
+              <w:top w:w="100" w:type="dxa"/>
+              <w:left w:w="100" w:type="dxa"/>
+              <w:bottom w:w="100" w:type="dxa"/>
+              <w:right w:w="100" w:type="dxa"/>
+            </w:tcMar>
+            <w:hideMark/>
+          </w:tcPr>
+          <w:p/>
+        </w:tc>
+        <w:tc>
+          <w:tcPr>
+            <w:tcW w:w="0" w:type="auto"/>
+            <w:tcBorders>
+              <w:top w:val="single" w:sz="8" w:space="0" w:color="000000"/>
+              <w:left w:val="single" w:sz="8" w:space="0" w:color="000000"/>
+              <w:bottom w:val="single" w:sz="8" w:space="0" w:color="000000"/>
+              <w:right w:val="single" w:sz="8" w:space="0" w:color="000000"/>
+            </w:tcBorders>
+            <w:shd w:val="clear" w:color="auto" w:fill="EFEFEF"/>
+            <w:tcMar>
+              <w:top w:w="100" w:type="dxa"/>
+              <w:left w:w="100" w:type="dxa"/>
+              <w:bottom w:w="100" w:type="dxa"/>
+              <w:right w:w="100" w:type="dxa"/>
+            </w:tcMar>
+          </w:tcPr>
+          <w:p>
+            <w:pPr>
               <w:rPr>
                 <w:lang w:val="en-US"/>
               </w:rPr>
-              <w:t xml:space="preserve"> == 0 %}X{% endif %}</w:t>
-            </w:r>
-          </w:p>
-        </w:tc>
-        <w:tc>
-          <w:tcPr>
-            <w:tcW w:w="0" w:type="auto"/>
-            <w:tcBorders>
-              <w:top w:val="single" w:sz="8" w:space="0" w:color="000000"/>
-              <w:left w:val="single" w:sz="8" w:space="0" w:color="000000"/>
-              <w:bottom w:val="single" w:sz="8" w:space="0" w:color="000000"/>
-              <w:right w:val="single" w:sz="8" w:space="0" w:color="000000"/>
-            </w:tcBorders>
-            <w:shd w:val="clear" w:color="auto" w:fill="EFEFEF"/>
-            <w:tcMar>
-              <w:top w:w="100" w:type="dxa"/>
-              <w:left w:w="100" w:type="dxa"/>
-              <w:bottom w:w="100" w:type="dxa"/>
-              <w:right w:w="100" w:type="dxa"/>
-            </w:tcMar>
-            <w:hideMark/>
-          </w:tcPr>
-          <w:p/>
-        </w:tc>
-        <w:tc>
-          <w:tcPr>
-            <w:tcW w:w="0" w:type="auto"/>
-            <w:tcBorders>
-              <w:top w:val="single" w:sz="8" w:space="0" w:color="000000"/>
-              <w:left w:val="single" w:sz="8" w:space="0" w:color="000000"/>
-              <w:bottom w:val="single" w:sz="8" w:space="0" w:color="000000"/>
-              <w:right w:val="single" w:sz="8" w:space="0" w:color="000000"/>
-            </w:tcBorders>
-            <w:shd w:val="clear" w:color="auto" w:fill="EFEFEF"/>
-            <w:tcMar>
-              <w:top w:w="100" w:type="dxa"/>
-              <w:left w:w="100" w:type="dxa"/>
-              <w:bottom w:w="100" w:type="dxa"/>
-              <w:right w:w="100" w:type="dxa"/>
-            </w:tcMar>
-            <w:hideMark/>
-          </w:tcPr>
-          <w:p>
+            </w:pPr>
             <w:r>
               <w:rPr>
                 <w:lang w:val="en-US"/>
               </w:rPr>
-              <w:t xml:space="preserve">{% if </w:t>
-            </w:r>
-            <w:proofErr w:type="spellStart"/>
+              <w:t>List all files that contain special characters:</w:t>
+            </w:r>
             <w:r>
               <w:rPr>
                 <w:lang w:val="en-US"/>
               </w:rPr>
-              <w:t>template_dict.special_characters.comments|length</w:t>
-            </w:r>
-            <w:proofErr w:type="spellEnd"/>
+              <w:br/>
+            </w:r>
+            <w:r>
+              <w:t>{% if template_dict.restricted_files.comment</w:t>
+            </w:r>
+            <w:r>
+              <w:rPr>
+                <w:rFonts w:hint="eastAsia"/>
+              </w:rPr>
+              <w:t>s</w:t>
+            </w:r>
+            <w:r>
+              <w:t>|length &gt; 0</w:t>
+            </w:r>
+            <w:r>
+              <w:t xml:space="preserve"> %}</w:t>
+            </w:r>
             <w:r>
               <w:rPr>
                 <w:lang w:val="en-US"/>
               </w:rPr>
-              <w:t xml:space="preserve"> &gt; 0 %}X{% endif %}</w:t>
-            </w:r>
-          </w:p>
-        </w:tc>
-        <w:tc>
-          <w:tcPr>
-            <w:tcW w:w="0" w:type="auto"/>
-            <w:tcBorders>
-              <w:top w:val="single" w:sz="8" w:space="0" w:color="000000"/>
-              <w:left w:val="single" w:sz="8" w:space="0" w:color="000000"/>
-              <w:bottom w:val="single" w:sz="8" w:space="0" w:color="000000"/>
-              <w:right w:val="single" w:sz="8" w:space="0" w:color="000000"/>
-            </w:tcBorders>
-            <w:shd w:val="clear" w:color="auto" w:fill="EFEFEF"/>
-            <w:tcMar>
-              <w:top w:w="100" w:type="dxa"/>
-              <w:left w:w="100" w:type="dxa"/>
-              <w:bottom w:w="100" w:type="dxa"/>
-              <w:right w:w="100" w:type="dxa"/>
-            </w:tcMar>
-            <w:hideMark/>
-          </w:tcPr>
-          <w:p/>
-        </w:tc>
-        <w:tc>
-          <w:tcPr>
-            <w:tcW w:w="0" w:type="auto"/>
-            <w:tcBorders>
-              <w:top w:val="single" w:sz="8" w:space="0" w:color="000000"/>
-              <w:left w:val="single" w:sz="8" w:space="0" w:color="000000"/>
-              <w:bottom w:val="single" w:sz="8" w:space="0" w:color="000000"/>
-              <w:right w:val="single" w:sz="8" w:space="0" w:color="000000"/>
-            </w:tcBorders>
-            <w:shd w:val="clear" w:color="auto" w:fill="EFEFEF"/>
-            <w:tcMar>
-              <w:top w:w="100" w:type="dxa"/>
-              <w:left w:w="100" w:type="dxa"/>
-              <w:bottom w:w="100" w:type="dxa"/>
-              <w:right w:w="100" w:type="dxa"/>
-            </w:tcMar>
-            <w:hideMark/>
-          </w:tcPr>
-          <w:p/>
-        </w:tc>
-        <w:tc>
-          <w:tcPr>
-            <w:tcW w:w="0" w:type="auto"/>
-            <w:tcBorders>
-              <w:top w:val="single" w:sz="8" w:space="0" w:color="000000"/>
-              <w:left w:val="single" w:sz="8" w:space="0" w:color="000000"/>
-              <w:bottom w:val="single" w:sz="8" w:space="0" w:color="000000"/>
-              <w:right w:val="single" w:sz="8" w:space="0" w:color="000000"/>
-            </w:tcBorders>
-            <w:shd w:val="clear" w:color="auto" w:fill="EFEFEF"/>
-            <w:tcMar>
-              <w:top w:w="100" w:type="dxa"/>
-              <w:left w:w="100" w:type="dxa"/>
-              <w:bottom w:w="100" w:type="dxa"/>
-              <w:right w:w="100" w:type="dxa"/>
-            </w:tcMar>
-          </w:tcPr>
-          <w:p>
-            <w:pPr>
-              <w:rPr>
-                <w:lang w:val="en-US"/>
-              </w:rPr>
-            </w:pPr>
-            <w:r>
-              <w:rPr>
-                <w:lang w:val="en-US"/>
-              </w:rPr>
-              <w:t>List all files that contain special characters:</w:t>
-            </w:r>
-            <w:r>
-              <w:rPr>
-                <w:lang w:val="en-US"/>
-              </w:rPr>
-              <w:br/>
-            </w:r>
-            <w:r>
-              <w:t xml:space="preserve">{% if </w:t>
-            </w:r>
-            <w:proofErr w:type="spellStart"/>
-            <w:r>
-              <w:t>template_dict.restricted_files.comment</w:t>
-            </w:r>
-            <w:r>
-              <w:rPr>
-                <w:rFonts w:hint="eastAsia"/>
-              </w:rPr>
-              <w:t>s</w:t>
-            </w:r>
-            <w:r>
-              <w:t>|length</w:t>
-            </w:r>
-            <w:proofErr w:type="spellEnd"/>
-            <w:r>
-              <w:t xml:space="preserve"> &gt; 0</w:t>
-            </w:r>
-            <w:r>
-              <w:t xml:space="preserve"> %}</w:t>
-            </w:r>
-            <w:r>
-              <w:rPr>
-                <w:lang w:val="en-US"/>
-              </w:rPr>
-              <w:t xml:space="preserve">{% for item in </w:t>
-            </w:r>
-            <w:proofErr w:type="spellStart"/>
-            <w:r>
-              <w:rPr>
-                <w:lang w:val="en-US"/>
-              </w:rPr>
-              <w:t>template_dict.special_characters.comments</w:t>
-            </w:r>
-            <w:proofErr w:type="spellEnd"/>
-            <w:r>
-              <w:rPr>
-                <w:lang w:val="en-US"/>
-              </w:rPr>
-              <w:t xml:space="preserve"> %}</w:t>
+              <w:t>{% for item in template_dict.special_characters.comments %}</w:t>
             </w:r>
           </w:p>
           <w:p>
@@ -3277,35 +2977,7 @@
               <w:rPr>
                 <w:lang w:val="en-US"/>
               </w:rPr>
-              <w:t xml:space="preserve">{{ </w:t>
-            </w:r>
-            <w:proofErr w:type="spellStart"/>
-            <w:r>
-              <w:rPr>
-                <w:lang w:val="en-US"/>
-              </w:rPr>
-              <w:t>item.file_name</w:t>
-            </w:r>
-            <w:proofErr w:type="spellEnd"/>
-            <w:r>
-              <w:rPr>
-                <w:lang w:val="en-US"/>
-              </w:rPr>
-              <w:t xml:space="preserve"> }}{% </w:t>
-            </w:r>
-            <w:proofErr w:type="spellStart"/>
-            <w:r>
-              <w:rPr>
-                <w:lang w:val="en-US"/>
-              </w:rPr>
-              <w:t>endfor</w:t>
-            </w:r>
-            <w:proofErr w:type="spellEnd"/>
-            <w:r>
-              <w:rPr>
-                <w:lang w:val="en-US"/>
-              </w:rPr>
-              <w:t xml:space="preserve"> %}</w:t>
+              <w:t>{{ item.file_name }}{% endfor %}</w:t>
             </w:r>
           </w:p>
           <w:p>
@@ -3481,14 +3153,7 @@
               <w:rPr>
                 <w:lang w:val="en-US"/>
               </w:rPr>
-              <w:t xml:space="preserve">{% if </w:t>
-            </w:r>
-            <w:proofErr w:type="spellStart"/>
-            <w:r>
-              <w:rPr>
-                <w:lang w:val="en-US"/>
-              </w:rPr>
-              <w:t>template_dict.</w:t>
+              <w:t>{% if template_dict.</w:t>
             </w:r>
             <w:r>
               <w:rPr>
@@ -3501,14 +3166,7 @@
               <w:rPr>
                 <w:lang w:val="en-US"/>
               </w:rPr>
-              <w:t>.comments|length</w:t>
-            </w:r>
-            <w:proofErr w:type="spellEnd"/>
-            <w:r>
-              <w:rPr>
-                <w:lang w:val="en-US"/>
-              </w:rPr>
-              <w:t xml:space="preserve"> </w:t>
+              <w:t xml:space="preserve">.comments|length </w:t>
             </w:r>
             <w:r>
               <w:rPr>
@@ -3548,159 +3206,129 @@
               <w:rPr>
                 <w:lang w:val="en-US"/>
               </w:rPr>
+              <w:t>{% if template_dict.file_ext.comments|length &gt; 0 %}X{% endif %}</w:t>
+            </w:r>
+          </w:p>
+        </w:tc>
+        <w:tc>
+          <w:tcPr>
+            <w:tcW w:w="0" w:type="auto"/>
+            <w:tcBorders>
+              <w:top w:val="single" w:sz="8" w:space="0" w:color="000000"/>
+              <w:left w:val="single" w:sz="8" w:space="0" w:color="000000"/>
+              <w:bottom w:val="single" w:sz="8" w:space="0" w:color="000000"/>
+              <w:right w:val="single" w:sz="8" w:space="0" w:color="000000"/>
+            </w:tcBorders>
+            <w:shd w:val="clear" w:color="auto" w:fill="EFEFEF"/>
+            <w:tcMar>
+              <w:top w:w="100" w:type="dxa"/>
+              <w:left w:w="100" w:type="dxa"/>
+              <w:bottom w:w="100" w:type="dxa"/>
+              <w:right w:w="100" w:type="dxa"/>
+            </w:tcMar>
+            <w:hideMark/>
+          </w:tcPr>
+          <w:p/>
+        </w:tc>
+        <w:tc>
+          <w:tcPr>
+            <w:tcW w:w="0" w:type="auto"/>
+            <w:tcBorders>
+              <w:top w:val="single" w:sz="8" w:space="0" w:color="000000"/>
+              <w:left w:val="single" w:sz="8" w:space="0" w:color="000000"/>
+              <w:bottom w:val="single" w:sz="8" w:space="0" w:color="000000"/>
+              <w:right w:val="single" w:sz="8" w:space="0" w:color="000000"/>
+            </w:tcBorders>
+            <w:shd w:val="clear" w:color="auto" w:fill="EFEFEF"/>
+            <w:tcMar>
+              <w:top w:w="100" w:type="dxa"/>
+              <w:left w:w="100" w:type="dxa"/>
+              <w:bottom w:w="100" w:type="dxa"/>
+              <w:right w:w="100" w:type="dxa"/>
+            </w:tcMar>
+            <w:hideMark/>
+          </w:tcPr>
+          <w:p/>
+        </w:tc>
+        <w:tc>
+          <w:tcPr>
+            <w:tcW w:w="0" w:type="auto"/>
+            <w:tcBorders>
+              <w:top w:val="single" w:sz="8" w:space="0" w:color="000000"/>
+              <w:left w:val="single" w:sz="8" w:space="0" w:color="000000"/>
+              <w:bottom w:val="single" w:sz="8" w:space="0" w:color="000000"/>
+              <w:right w:val="single" w:sz="8" w:space="0" w:color="000000"/>
+            </w:tcBorders>
+            <w:shd w:val="clear" w:color="auto" w:fill="EFEFEF"/>
+            <w:tcMar>
+              <w:top w:w="100" w:type="dxa"/>
+              <w:left w:w="100" w:type="dxa"/>
+              <w:bottom w:w="100" w:type="dxa"/>
+              <w:right w:w="100" w:type="dxa"/>
+            </w:tcMar>
+            <w:hideMark/>
+          </w:tcPr>
+          <w:p/>
+        </w:tc>
+        <w:tc>
+          <w:tcPr>
+            <w:tcW w:w="0" w:type="auto"/>
+            <w:tcBorders>
+              <w:top w:val="single" w:sz="8" w:space="0" w:color="000000"/>
+              <w:left w:val="single" w:sz="8" w:space="0" w:color="000000"/>
+              <w:bottom w:val="single" w:sz="8" w:space="0" w:color="000000"/>
+              <w:right w:val="single" w:sz="8" w:space="0" w:color="000000"/>
+            </w:tcBorders>
+            <w:shd w:val="clear" w:color="auto" w:fill="EFEFEF"/>
+            <w:tcMar>
+              <w:top w:w="100" w:type="dxa"/>
+              <w:left w:w="100" w:type="dxa"/>
+              <w:bottom w:w="100" w:type="dxa"/>
+              <w:right w:w="100" w:type="dxa"/>
+            </w:tcMar>
+            <w:hideMark/>
+          </w:tcPr>
+          <w:p>
+            <w:pPr>
+              <w:rPr>
+                <w:lang w:val="en-US"/>
+              </w:rPr>
+            </w:pPr>
+            <w:r>
+              <w:rPr>
+                <w:lang w:val="en-US"/>
+              </w:rPr>
+              <w:t>List all files that do not contain file extensions:</w:t>
+            </w:r>
+            <w:r>
+              <w:rPr>
+                <w:lang w:val="en-US"/>
+              </w:rPr>
+              <w:br/>
+            </w:r>
+            <w:r>
               <w:t xml:space="preserve">{% if </w:t>
             </w:r>
-            <w:proofErr w:type="spellStart"/>
             <w:r>
               <w:rPr>
                 <w:lang w:val="en-US"/>
               </w:rPr>
-              <w:t>template_dict.file_ext.comments|length</w:t>
-            </w:r>
-            <w:proofErr w:type="spellEnd"/>
+              <w:t>template_dict.file_ext.comments</w:t>
+            </w:r>
+            <w:r>
+              <w:t xml:space="preserve"> </w:t>
+            </w:r>
+            <w:r>
+              <w:t>|length &gt; 0</w:t>
+            </w:r>
+            <w:r>
+              <w:t xml:space="preserve"> %}</w:t>
+            </w:r>
             <w:r>
               <w:rPr>
                 <w:lang w:val="en-US"/>
               </w:rPr>
-              <w:t xml:space="preserve"> &gt; 0 %}X{% endif %}</w:t>
-            </w:r>
-          </w:p>
-        </w:tc>
-        <w:tc>
-          <w:tcPr>
-            <w:tcW w:w="0" w:type="auto"/>
-            <w:tcBorders>
-              <w:top w:val="single" w:sz="8" w:space="0" w:color="000000"/>
-              <w:left w:val="single" w:sz="8" w:space="0" w:color="000000"/>
-              <w:bottom w:val="single" w:sz="8" w:space="0" w:color="000000"/>
-              <w:right w:val="single" w:sz="8" w:space="0" w:color="000000"/>
-            </w:tcBorders>
-            <w:shd w:val="clear" w:color="auto" w:fill="EFEFEF"/>
-            <w:tcMar>
-              <w:top w:w="100" w:type="dxa"/>
-              <w:left w:w="100" w:type="dxa"/>
-              <w:bottom w:w="100" w:type="dxa"/>
-              <w:right w:w="100" w:type="dxa"/>
-            </w:tcMar>
-            <w:hideMark/>
-          </w:tcPr>
-          <w:p/>
-        </w:tc>
-        <w:tc>
-          <w:tcPr>
-            <w:tcW w:w="0" w:type="auto"/>
-            <w:tcBorders>
-              <w:top w:val="single" w:sz="8" w:space="0" w:color="000000"/>
-              <w:left w:val="single" w:sz="8" w:space="0" w:color="000000"/>
-              <w:bottom w:val="single" w:sz="8" w:space="0" w:color="000000"/>
-              <w:right w:val="single" w:sz="8" w:space="0" w:color="000000"/>
-            </w:tcBorders>
-            <w:shd w:val="clear" w:color="auto" w:fill="EFEFEF"/>
-            <w:tcMar>
-              <w:top w:w="100" w:type="dxa"/>
-              <w:left w:w="100" w:type="dxa"/>
-              <w:bottom w:w="100" w:type="dxa"/>
-              <w:right w:w="100" w:type="dxa"/>
-            </w:tcMar>
-            <w:hideMark/>
-          </w:tcPr>
-          <w:p/>
-        </w:tc>
-        <w:tc>
-          <w:tcPr>
-            <w:tcW w:w="0" w:type="auto"/>
-            <w:tcBorders>
-              <w:top w:val="single" w:sz="8" w:space="0" w:color="000000"/>
-              <w:left w:val="single" w:sz="8" w:space="0" w:color="000000"/>
-              <w:bottom w:val="single" w:sz="8" w:space="0" w:color="000000"/>
-              <w:right w:val="single" w:sz="8" w:space="0" w:color="000000"/>
-            </w:tcBorders>
-            <w:shd w:val="clear" w:color="auto" w:fill="EFEFEF"/>
-            <w:tcMar>
-              <w:top w:w="100" w:type="dxa"/>
-              <w:left w:w="100" w:type="dxa"/>
-              <w:bottom w:w="100" w:type="dxa"/>
-              <w:right w:w="100" w:type="dxa"/>
-            </w:tcMar>
-            <w:hideMark/>
-          </w:tcPr>
-          <w:p/>
-        </w:tc>
-        <w:tc>
-          <w:tcPr>
-            <w:tcW w:w="0" w:type="auto"/>
-            <w:tcBorders>
-              <w:top w:val="single" w:sz="8" w:space="0" w:color="000000"/>
-              <w:left w:val="single" w:sz="8" w:space="0" w:color="000000"/>
-              <w:bottom w:val="single" w:sz="8" w:space="0" w:color="000000"/>
-              <w:right w:val="single" w:sz="8" w:space="0" w:color="000000"/>
-            </w:tcBorders>
-            <w:shd w:val="clear" w:color="auto" w:fill="EFEFEF"/>
-            <w:tcMar>
-              <w:top w:w="100" w:type="dxa"/>
-              <w:left w:w="100" w:type="dxa"/>
-              <w:bottom w:w="100" w:type="dxa"/>
-              <w:right w:w="100" w:type="dxa"/>
-            </w:tcMar>
-            <w:hideMark/>
-          </w:tcPr>
-          <w:p>
-            <w:pPr>
-              <w:rPr>
-                <w:lang w:val="en-US"/>
-              </w:rPr>
-            </w:pPr>
-            <w:r>
-              <w:rPr>
-                <w:lang w:val="en-US"/>
-              </w:rPr>
-              <w:t>List all files that do not contain file extensions:</w:t>
-            </w:r>
-            <w:r>
-              <w:rPr>
-                <w:lang w:val="en-US"/>
-              </w:rPr>
-              <w:br/>
-            </w:r>
-            <w:r>
-              <w:t xml:space="preserve">{% if </w:t>
-            </w:r>
-            <w:proofErr w:type="spellStart"/>
-            <w:r>
-              <w:rPr>
-                <w:lang w:val="en-US"/>
-              </w:rPr>
-              <w:t>template_dict.file_ext.comments</w:t>
-            </w:r>
-            <w:proofErr w:type="spellEnd"/>
-            <w:r>
-              <w:t xml:space="preserve"> </w:t>
-            </w:r>
-            <w:r>
-              <w:t>|length &gt; 0</w:t>
-            </w:r>
-            <w:r>
-              <w:t xml:space="preserve"> %}</w:t>
-            </w:r>
-            <w:r>
-              <w:rPr>
-                <w:lang w:val="en-US"/>
-              </w:rPr>
-              <w:t xml:space="preserve">{% for item in </w:t>
-            </w:r>
-            <w:proofErr w:type="spellStart"/>
-            <w:r>
-              <w:rPr>
-                <w:lang w:val="en-US"/>
-              </w:rPr>
-              <w:t>template_dict.file_ext.comments</w:t>
-            </w:r>
-            <w:proofErr w:type="spellEnd"/>
-            <w:r>
-              <w:rPr>
-                <w:lang w:val="en-US"/>
-              </w:rPr>
-              <w:t xml:space="preserve"> %}</w:t>
+              <w:t>{% for item in template_dict.file_ext.comments %}</w:t>
             </w:r>
           </w:p>
           <w:p>
@@ -3716,35 +3344,7 @@
               <w:rPr>
                 <w:lang w:val="en-US"/>
               </w:rPr>
-              <w:t xml:space="preserve">{{ </w:t>
-            </w:r>
-            <w:proofErr w:type="spellStart"/>
-            <w:r>
-              <w:rPr>
-                <w:lang w:val="en-US"/>
-              </w:rPr>
-              <w:t>item.file_name</w:t>
-            </w:r>
-            <w:proofErr w:type="spellEnd"/>
-            <w:r>
-              <w:rPr>
-                <w:lang w:val="en-US"/>
-              </w:rPr>
-              <w:t xml:space="preserve"> }}{% </w:t>
-            </w:r>
-            <w:proofErr w:type="spellStart"/>
-            <w:r>
-              <w:rPr>
-                <w:lang w:val="en-US"/>
-              </w:rPr>
-              <w:t>endfor</w:t>
-            </w:r>
-            <w:proofErr w:type="spellEnd"/>
-            <w:r>
-              <w:rPr>
-                <w:lang w:val="en-US"/>
-              </w:rPr>
-              <w:t xml:space="preserve"> %}</w:t>
+              <w:t>{{ item.file_name }}{% endfor %}</w:t>
             </w:r>
           </w:p>
           <w:p>
@@ -4026,7 +3626,6 @@
             <w:r>
               <w:t xml:space="preserve">{% if </w:t>
             </w:r>
-            <w:proofErr w:type="spellStart"/>
             <w:r>
               <w:rPr>
                 <w:lang w:val="en-US"/>
@@ -4045,7 +3644,6 @@
               </w:rPr>
               <w:t>.comments</w:t>
             </w:r>
-            <w:proofErr w:type="spellEnd"/>
             <w:r>
               <w:t>|length &gt; 0</w:t>
             </w:r>
@@ -4056,33 +3654,19 @@
               <w:rPr>
                 <w:lang w:val="en-US"/>
               </w:rPr>
-              <w:t xml:space="preserve">{% for item in </w:t>
-            </w:r>
-            <w:proofErr w:type="spellStart"/>
+              <w:t>{% for item in template_dict.</w:t>
+            </w:r>
             <w:r>
               <w:rPr>
                 <w:lang w:val="en-US"/>
               </w:rPr>
-              <w:t>template_dict.</w:t>
+              <w:t>common_file_format</w:t>
             </w:r>
             <w:r>
               <w:rPr>
                 <w:lang w:val="en-US"/>
               </w:rPr>
-              <w:t>common_file_format</w:t>
-            </w:r>
-            <w:r>
-              <w:rPr>
-                <w:lang w:val="en-US"/>
-              </w:rPr>
-              <w:t>.comments</w:t>
-            </w:r>
-            <w:proofErr w:type="spellEnd"/>
-            <w:r>
-              <w:rPr>
-                <w:lang w:val="en-US"/>
-              </w:rPr>
-              <w:t xml:space="preserve"> %}</w:t>
+              <w:t>.comments %}</w:t>
             </w:r>
           </w:p>
           <w:p>
@@ -4096,21 +3680,7 @@
               <w:rPr>
                 <w:lang w:val="en-US"/>
               </w:rPr>
-              <w:t xml:space="preserve">{{ </w:t>
-            </w:r>
-            <w:proofErr w:type="spellStart"/>
-            <w:r>
-              <w:rPr>
-                <w:lang w:val="en-US"/>
-              </w:rPr>
-              <w:t>item.file_name</w:t>
-            </w:r>
-            <w:proofErr w:type="spellEnd"/>
-            <w:r>
-              <w:rPr>
-                <w:lang w:val="en-US"/>
-              </w:rPr>
-              <w:t xml:space="preserve"> }}</w:t>
+              <w:t>{{ item.file_name }}</w:t>
             </w:r>
             <w:r>
               <w:rPr>
@@ -4126,19 +3696,11 @@
               </w:rPr>
               <w:t xml:space="preserve">% </w:t>
             </w:r>
-            <w:proofErr w:type="spellStart"/>
             <w:r>
               <w:rPr>
                 <w:lang w:val="en-US"/>
               </w:rPr>
-              <w:t>endfor</w:t>
-            </w:r>
-            <w:proofErr w:type="spellEnd"/>
-            <w:r>
-              <w:rPr>
-                <w:lang w:val="en-US"/>
-              </w:rPr>
-              <w:t xml:space="preserve"> %}</w:t>
+              <w:t>endfor %}</w:t>
             </w:r>
           </w:p>
           <w:p>
@@ -4862,245 +4424,159 @@
               <w:rPr>
                 <w:lang w:val="en-US"/>
               </w:rPr>
+              <w:t>{% if template_dict.readme_file.comments|length &gt; 0 %}X{% endif %}</w:t>
+            </w:r>
+          </w:p>
+        </w:tc>
+        <w:tc>
+          <w:tcPr>
+            <w:tcW w:w="0" w:type="auto"/>
+            <w:tcBorders>
+              <w:top w:val="single" w:sz="8" w:space="0" w:color="000000"/>
+              <w:left w:val="single" w:sz="8" w:space="0" w:color="000000"/>
+              <w:bottom w:val="single" w:sz="8" w:space="0" w:color="000000"/>
+              <w:right w:val="single" w:sz="8" w:space="0" w:color="000000"/>
+            </w:tcBorders>
+            <w:shd w:val="clear" w:color="auto" w:fill="EFEFEF"/>
+            <w:tcMar>
+              <w:top w:w="100" w:type="dxa"/>
+              <w:left w:w="100" w:type="dxa"/>
+              <w:bottom w:w="100" w:type="dxa"/>
+              <w:right w:w="100" w:type="dxa"/>
+            </w:tcMar>
+            <w:hideMark/>
+          </w:tcPr>
+          <w:p>
+            <w:pPr>
+              <w:rPr>
+                <w:lang w:val="en-US"/>
+              </w:rPr>
+            </w:pPr>
+            <w:r>
+              <w:rPr>
+                <w:lang w:val="en-US"/>
+              </w:rPr>
+              <w:t>{% if template_dict.readme_file.comments|length == 0 %}X{% endif %}</w:t>
+            </w:r>
+          </w:p>
+          <w:p/>
+        </w:tc>
+        <w:tc>
+          <w:tcPr>
+            <w:tcW w:w="0" w:type="auto"/>
+            <w:tcBorders>
+              <w:top w:val="single" w:sz="8" w:space="0" w:color="000000"/>
+              <w:left w:val="single" w:sz="8" w:space="0" w:color="000000"/>
+              <w:bottom w:val="single" w:sz="8" w:space="0" w:color="000000"/>
+              <w:right w:val="single" w:sz="8" w:space="0" w:color="000000"/>
+            </w:tcBorders>
+            <w:shd w:val="clear" w:color="auto" w:fill="EFEFEF"/>
+            <w:tcMar>
+              <w:top w:w="100" w:type="dxa"/>
+              <w:left w:w="100" w:type="dxa"/>
+              <w:bottom w:w="100" w:type="dxa"/>
+              <w:right w:w="100" w:type="dxa"/>
+            </w:tcMar>
+            <w:hideMark/>
+          </w:tcPr>
+          <w:p/>
+        </w:tc>
+        <w:tc>
+          <w:tcPr>
+            <w:tcW w:w="0" w:type="auto"/>
+            <w:tcBorders>
+              <w:top w:val="single" w:sz="8" w:space="0" w:color="000000"/>
+              <w:left w:val="single" w:sz="8" w:space="0" w:color="000000"/>
+              <w:bottom w:val="single" w:sz="8" w:space="0" w:color="000000"/>
+              <w:right w:val="single" w:sz="8" w:space="0" w:color="000000"/>
+            </w:tcBorders>
+            <w:shd w:val="clear" w:color="auto" w:fill="EFEFEF"/>
+            <w:tcMar>
+              <w:top w:w="100" w:type="dxa"/>
+              <w:left w:w="100" w:type="dxa"/>
+              <w:bottom w:w="100" w:type="dxa"/>
+              <w:right w:w="100" w:type="dxa"/>
+            </w:tcMar>
+            <w:hideMark/>
+          </w:tcPr>
+          <w:p/>
+        </w:tc>
+        <w:tc>
+          <w:tcPr>
+            <w:tcW w:w="0" w:type="auto"/>
+            <w:tcBorders>
+              <w:top w:val="single" w:sz="8" w:space="0" w:color="000000"/>
+              <w:left w:val="single" w:sz="8" w:space="0" w:color="000000"/>
+              <w:bottom w:val="single" w:sz="8" w:space="0" w:color="000000"/>
+              <w:right w:val="single" w:sz="8" w:space="0" w:color="000000"/>
+            </w:tcBorders>
+            <w:shd w:val="clear" w:color="auto" w:fill="EFEFEF"/>
+            <w:tcMar>
+              <w:top w:w="100" w:type="dxa"/>
+              <w:left w:w="100" w:type="dxa"/>
+              <w:bottom w:w="100" w:type="dxa"/>
+              <w:right w:w="100" w:type="dxa"/>
+            </w:tcMar>
+            <w:hideMark/>
+          </w:tcPr>
+          <w:p/>
+        </w:tc>
+        <w:tc>
+          <w:tcPr>
+            <w:tcW w:w="0" w:type="auto"/>
+            <w:tcBorders>
+              <w:top w:val="single" w:sz="8" w:space="0" w:color="000000"/>
+              <w:left w:val="single" w:sz="8" w:space="0" w:color="000000"/>
+              <w:bottom w:val="single" w:sz="8" w:space="0" w:color="000000"/>
+              <w:right w:val="single" w:sz="8" w:space="0" w:color="000000"/>
+            </w:tcBorders>
+            <w:shd w:val="clear" w:color="auto" w:fill="EFEFEF"/>
+            <w:tcMar>
+              <w:top w:w="100" w:type="dxa"/>
+              <w:left w:w="100" w:type="dxa"/>
+              <w:bottom w:w="100" w:type="dxa"/>
+              <w:right w:w="100" w:type="dxa"/>
+            </w:tcMar>
+            <w:hideMark/>
+          </w:tcPr>
+          <w:p>
+            <w:pPr>
+              <w:rPr>
+                <w:lang w:val="en-US"/>
+              </w:rPr>
+            </w:pPr>
+            <w:r>
+              <w:rPr>
+                <w:lang w:val="en-US"/>
+              </w:rPr>
+              <w:t>List the README file below:</w:t>
+            </w:r>
+            <w:r>
+              <w:rPr>
+                <w:lang w:val="en-US"/>
+              </w:rPr>
+              <w:br/>
+            </w:r>
+            <w:r>
               <w:t xml:space="preserve">{% if </w:t>
             </w:r>
-            <w:proofErr w:type="spellStart"/>
             <w:r>
               <w:rPr>
                 <w:lang w:val="en-US"/>
               </w:rPr>
-              <w:t>template_dict.readme_file.comments|length</w:t>
-            </w:r>
-            <w:proofErr w:type="spellEnd"/>
+              <w:t>template_dict.readme_file.comments</w:t>
+            </w:r>
+            <w:r>
+              <w:t xml:space="preserve"> |length &gt; 0</w:t>
+            </w:r>
+            <w:r>
+              <w:t xml:space="preserve"> %}</w:t>
+            </w:r>
             <w:r>
               <w:rPr>
                 <w:lang w:val="en-US"/>
               </w:rPr>
-              <w:t xml:space="preserve"> &gt; 0 %}X{% endif %}</w:t>
-            </w:r>
-          </w:p>
-        </w:tc>
-        <w:tc>
-          <w:tcPr>
-            <w:tcW w:w="0" w:type="auto"/>
-            <w:tcBorders>
-              <w:top w:val="single" w:sz="8" w:space="0" w:color="000000"/>
-              <w:left w:val="single" w:sz="8" w:space="0" w:color="000000"/>
-              <w:bottom w:val="single" w:sz="8" w:space="0" w:color="000000"/>
-              <w:right w:val="single" w:sz="8" w:space="0" w:color="000000"/>
-            </w:tcBorders>
-            <w:shd w:val="clear" w:color="auto" w:fill="EFEFEF"/>
-            <w:tcMar>
-              <w:top w:w="100" w:type="dxa"/>
-              <w:left w:w="100" w:type="dxa"/>
-              <w:bottom w:w="100" w:type="dxa"/>
-              <w:right w:w="100" w:type="dxa"/>
-            </w:tcMar>
-            <w:hideMark/>
-          </w:tcPr>
-          <w:p>
-            <w:pPr>
-              <w:rPr>
-                <w:lang w:val="en-US"/>
-              </w:rPr>
-            </w:pPr>
-            <w:r>
-              <w:rPr>
-                <w:lang w:val="en-US"/>
-              </w:rPr>
-              <w:t xml:space="preserve">{% if </w:t>
-            </w:r>
-            <w:proofErr w:type="spellStart"/>
-            <w:r>
-              <w:rPr>
-                <w:lang w:val="en-US"/>
-              </w:rPr>
-              <w:t>template_dict.readme_file.comments|length</w:t>
-            </w:r>
-            <w:proofErr w:type="spellEnd"/>
-            <w:r>
-              <w:rPr>
-                <w:lang w:val="en-US"/>
-              </w:rPr>
-              <w:t xml:space="preserve"> == 0 %}X{% endif %}</w:t>
-            </w:r>
-          </w:p>
-          <w:p/>
-        </w:tc>
-        <w:tc>
-          <w:tcPr>
-            <w:tcW w:w="0" w:type="auto"/>
-            <w:tcBorders>
-              <w:top w:val="single" w:sz="8" w:space="0" w:color="000000"/>
-              <w:left w:val="single" w:sz="8" w:space="0" w:color="000000"/>
-              <w:bottom w:val="single" w:sz="8" w:space="0" w:color="000000"/>
-              <w:right w:val="single" w:sz="8" w:space="0" w:color="000000"/>
-            </w:tcBorders>
-            <w:shd w:val="clear" w:color="auto" w:fill="EFEFEF"/>
-            <w:tcMar>
-              <w:top w:w="100" w:type="dxa"/>
-              <w:left w:w="100" w:type="dxa"/>
-              <w:bottom w:w="100" w:type="dxa"/>
-              <w:right w:w="100" w:type="dxa"/>
-            </w:tcMar>
-            <w:hideMark/>
-          </w:tcPr>
-          <w:p/>
-        </w:tc>
-        <w:tc>
-          <w:tcPr>
-            <w:tcW w:w="0" w:type="auto"/>
-            <w:tcBorders>
-              <w:top w:val="single" w:sz="8" w:space="0" w:color="000000"/>
-              <w:left w:val="single" w:sz="8" w:space="0" w:color="000000"/>
-              <w:bottom w:val="single" w:sz="8" w:space="0" w:color="000000"/>
-              <w:right w:val="single" w:sz="8" w:space="0" w:color="000000"/>
-            </w:tcBorders>
-            <w:shd w:val="clear" w:color="auto" w:fill="EFEFEF"/>
-            <w:tcMar>
-              <w:top w:w="100" w:type="dxa"/>
-              <w:left w:w="100" w:type="dxa"/>
-              <w:bottom w:w="100" w:type="dxa"/>
-              <w:right w:w="100" w:type="dxa"/>
-            </w:tcMar>
-            <w:hideMark/>
-          </w:tcPr>
-          <w:p/>
-        </w:tc>
-        <w:tc>
-          <w:tcPr>
-            <w:tcW w:w="0" w:type="auto"/>
-            <w:tcBorders>
-              <w:top w:val="single" w:sz="8" w:space="0" w:color="000000"/>
-              <w:left w:val="single" w:sz="8" w:space="0" w:color="000000"/>
-              <w:bottom w:val="single" w:sz="8" w:space="0" w:color="000000"/>
-              <w:right w:val="single" w:sz="8" w:space="0" w:color="000000"/>
-            </w:tcBorders>
-            <w:shd w:val="clear" w:color="auto" w:fill="EFEFEF"/>
-            <w:tcMar>
-              <w:top w:w="100" w:type="dxa"/>
-              <w:left w:w="100" w:type="dxa"/>
-              <w:bottom w:w="100" w:type="dxa"/>
-              <w:right w:w="100" w:type="dxa"/>
-            </w:tcMar>
-            <w:hideMark/>
-          </w:tcPr>
-          <w:p/>
-        </w:tc>
-        <w:tc>
-          <w:tcPr>
-            <w:tcW w:w="0" w:type="auto"/>
-            <w:tcBorders>
-              <w:top w:val="single" w:sz="8" w:space="0" w:color="000000"/>
-              <w:left w:val="single" w:sz="8" w:space="0" w:color="000000"/>
-              <w:bottom w:val="single" w:sz="8" w:space="0" w:color="000000"/>
-              <w:right w:val="single" w:sz="8" w:space="0" w:color="000000"/>
-            </w:tcBorders>
-            <w:shd w:val="clear" w:color="auto" w:fill="EFEFEF"/>
-            <w:tcMar>
-              <w:top w:w="100" w:type="dxa"/>
-              <w:left w:w="100" w:type="dxa"/>
-              <w:bottom w:w="100" w:type="dxa"/>
-              <w:right w:w="100" w:type="dxa"/>
-            </w:tcMar>
-            <w:hideMark/>
-          </w:tcPr>
-          <w:p>
-            <w:pPr>
-              <w:rPr>
-                <w:lang w:val="en-US"/>
-              </w:rPr>
-            </w:pPr>
-            <w:r>
-              <w:rPr>
-                <w:lang w:val="en-US"/>
-              </w:rPr>
-              <w:t>List the README file below:</w:t>
-            </w:r>
-            <w:r>
-              <w:rPr>
-                <w:lang w:val="en-US"/>
-              </w:rPr>
-              <w:br/>
-            </w:r>
-            <w:r>
-              <w:t xml:space="preserve">{% if </w:t>
-            </w:r>
-            <w:proofErr w:type="spellStart"/>
-            <w:r>
-              <w:rPr>
-                <w:lang w:val="en-US"/>
-              </w:rPr>
-              <w:t>template_dict.readme_file.comments</w:t>
-            </w:r>
-            <w:proofErr w:type="spellEnd"/>
-            <w:r>
-              <w:t xml:space="preserve"> |length &gt; 0</w:t>
-            </w:r>
-            <w:r>
-              <w:t xml:space="preserve"> %}</w:t>
-            </w:r>
-            <w:r>
-              <w:rPr>
-                <w:lang w:val="en-US"/>
-              </w:rPr>
-              <w:t xml:space="preserve">{% for item in </w:t>
-            </w:r>
-            <w:proofErr w:type="spellStart"/>
-            <w:r>
-              <w:rPr>
-                <w:lang w:val="en-US"/>
-              </w:rPr>
-              <w:t>template_dict.readme_file.comments</w:t>
-            </w:r>
-            <w:proofErr w:type="spellEnd"/>
-            <w:r>
-              <w:rPr>
-                <w:lang w:val="en-US"/>
-              </w:rPr>
-              <w:t xml:space="preserve"> %}{{ </w:t>
-            </w:r>
-            <w:proofErr w:type="spellStart"/>
-            <w:r>
-              <w:rPr>
-                <w:lang w:val="en-US"/>
-              </w:rPr>
-              <w:t>loop.index</w:t>
-            </w:r>
-            <w:proofErr w:type="spellEnd"/>
-            <w:r>
-              <w:rPr>
-                <w:lang w:val="en-US"/>
-              </w:rPr>
-              <w:t xml:space="preserve"> }}. {{ </w:t>
-            </w:r>
-            <w:proofErr w:type="spellStart"/>
-            <w:r>
-              <w:rPr>
-                <w:lang w:val="en-US"/>
-              </w:rPr>
-              <w:t>item.file_name</w:t>
-            </w:r>
-            <w:proofErr w:type="spellEnd"/>
-            <w:r>
-              <w:rPr>
-                <w:lang w:val="en-US"/>
-              </w:rPr>
-              <w:t xml:space="preserve"> }}{% </w:t>
-            </w:r>
-            <w:proofErr w:type="spellStart"/>
-            <w:r>
-              <w:rPr>
-                <w:lang w:val="en-US"/>
-              </w:rPr>
-              <w:t>endfor</w:t>
-            </w:r>
-            <w:proofErr w:type="spellEnd"/>
-            <w:r>
-              <w:rPr>
-                <w:lang w:val="en-US"/>
-              </w:rPr>
-              <w:t xml:space="preserve"> %}</w:t>
+              <w:t>{% for item in template_dict.readme_file.comments %}{{ loop.index }}. {{ item.file_name }}{% endfor %}</w:t>
             </w:r>
           </w:p>
           <w:p>
@@ -7457,14 +6933,12 @@
             <w:r>
               <w:t xml:space="preserve">{% if </w:t>
             </w:r>
-            <w:proofErr w:type="spellStart"/>
             <w:r>
               <w:rPr>
                 <w:lang w:val="en-US"/>
               </w:rPr>
               <w:t>template_dict.typo.comments</w:t>
             </w:r>
-            <w:proofErr w:type="spellEnd"/>
             <w:r>
               <w:t xml:space="preserve"> </w:t>
             </w:r>
@@ -7479,21 +6953,7 @@
               <w:rPr>
                 <w:lang w:val="en-US"/>
               </w:rPr>
-              <w:t xml:space="preserve">{% for item in </w:t>
-            </w:r>
-            <w:proofErr w:type="spellStart"/>
-            <w:r>
-              <w:rPr>
-                <w:lang w:val="en-US"/>
-              </w:rPr>
-              <w:t>template_dict.typo.comments</w:t>
-            </w:r>
-            <w:proofErr w:type="spellEnd"/>
-            <w:r>
-              <w:rPr>
-                <w:lang w:val="en-US"/>
-              </w:rPr>
-              <w:t xml:space="preserve"> %}</w:t>
+              <w:t>{% for item in template_dict.typo.comments %}</w:t>
             </w:r>
           </w:p>
           <w:p>
@@ -7508,21 +6968,7 @@
               <w:rPr>
                 <w:lang w:val="en-US"/>
               </w:rPr>
-              <w:t xml:space="preserve">{{ item }}{% </w:t>
-            </w:r>
-            <w:proofErr w:type="spellStart"/>
-            <w:r>
-              <w:rPr>
-                <w:lang w:val="en-US"/>
-              </w:rPr>
-              <w:t>endfor</w:t>
-            </w:r>
-            <w:proofErr w:type="spellEnd"/>
-            <w:r>
-              <w:rPr>
-                <w:lang w:val="en-US"/>
-              </w:rPr>
-              <w:t xml:space="preserve"> %}</w:t>
+              <w:t>{{ item }}{% endfor %}</w:t>
             </w:r>
           </w:p>
           <w:p>
@@ -7931,32 +7377,39 @@
               </w:rPr>
               <w:t>4.3</w:t>
             </w:r>
-          </w:p>
-        </w:tc>
-        <w:tc>
-          <w:tcPr>
-            <w:tcW w:w="0" w:type="auto"/>
-            <w:tcBorders>
-              <w:top w:val="single" w:sz="8" w:space="0" w:color="000000"/>
-              <w:left w:val="single" w:sz="8" w:space="0" w:color="000000"/>
-              <w:bottom w:val="single" w:sz="8" w:space="0" w:color="000000"/>
-              <w:right w:val="single" w:sz="8" w:space="0" w:color="000000"/>
-            </w:tcBorders>
-            <w:shd w:val="clear" w:color="auto" w:fill="EFEFEF"/>
-            <w:tcMar>
-              <w:top w:w="100" w:type="dxa"/>
-              <w:left w:w="100" w:type="dxa"/>
-              <w:bottom w:w="100" w:type="dxa"/>
-              <w:right w:w="100" w:type="dxa"/>
-            </w:tcMar>
-            <w:hideMark/>
-          </w:tcPr>
-          <w:p>
             <w:r>
               <w:rPr>
                 <w:b/>
                 <w:bCs/>
               </w:rPr>
+              <w:t>a</w:t>
+            </w:r>
+          </w:p>
+        </w:tc>
+        <w:tc>
+          <w:tcPr>
+            <w:tcW w:w="0" w:type="auto"/>
+            <w:tcBorders>
+              <w:top w:val="single" w:sz="8" w:space="0" w:color="000000"/>
+              <w:left w:val="single" w:sz="8" w:space="0" w:color="000000"/>
+              <w:bottom w:val="single" w:sz="8" w:space="0" w:color="000000"/>
+              <w:right w:val="single" w:sz="8" w:space="0" w:color="000000"/>
+            </w:tcBorders>
+            <w:shd w:val="clear" w:color="auto" w:fill="EFEFEF"/>
+            <w:tcMar>
+              <w:top w:w="100" w:type="dxa"/>
+              <w:left w:w="100" w:type="dxa"/>
+              <w:bottom w:w="100" w:type="dxa"/>
+              <w:right w:w="100" w:type="dxa"/>
+            </w:tcMar>
+            <w:hideMark/>
+          </w:tcPr>
+          <w:p>
+            <w:r>
+              <w:rPr>
+                <w:b/>
+                <w:bCs/>
+              </w:rPr>
               <w:t>Does at least one author have an institutional affiliation listed?</w:t>
             </w:r>
           </w:p>
@@ -8004,13 +7457,394 @@
           </w:tcPr>
           <w:p>
             <w:r>
-              <w:t xml:space="preserve">{% if not </w:t>
-            </w:r>
-            <w:proofErr w:type="spellStart"/>
-            <w:r>
-              <w:t>template_dict.none_author_affiliation</w:t>
-            </w:r>
-            <w:proofErr w:type="spellEnd"/>
+              <w:t>{% if not template_dict.none_author_affiliation %}X{% endif %}</w:t>
+            </w:r>
+          </w:p>
+        </w:tc>
+        <w:tc>
+          <w:tcPr>
+            <w:tcW w:w="0" w:type="auto"/>
+            <w:tcBorders>
+              <w:top w:val="single" w:sz="8" w:space="0" w:color="000000"/>
+              <w:left w:val="single" w:sz="8" w:space="0" w:color="000000"/>
+              <w:bottom w:val="single" w:sz="8" w:space="0" w:color="000000"/>
+              <w:right w:val="single" w:sz="8" w:space="0" w:color="000000"/>
+            </w:tcBorders>
+            <w:shd w:val="clear" w:color="auto" w:fill="EFEFEF"/>
+            <w:tcMar>
+              <w:top w:w="100" w:type="dxa"/>
+              <w:left w:w="100" w:type="dxa"/>
+              <w:bottom w:w="100" w:type="dxa"/>
+              <w:right w:w="100" w:type="dxa"/>
+            </w:tcMar>
+          </w:tcPr>
+          <w:p>
+            <w:r>
+              <w:t>{% if template_dict.none_author_affiliation %}X{% endif %}</w:t>
+            </w:r>
+          </w:p>
+        </w:tc>
+        <w:tc>
+          <w:tcPr>
+            <w:tcW w:w="0" w:type="auto"/>
+            <w:tcBorders>
+              <w:top w:val="single" w:sz="8" w:space="0" w:color="000000"/>
+              <w:left w:val="single" w:sz="8" w:space="0" w:color="000000"/>
+              <w:bottom w:val="single" w:sz="8" w:space="0" w:color="000000"/>
+              <w:right w:val="single" w:sz="8" w:space="0" w:color="000000"/>
+            </w:tcBorders>
+            <w:shd w:val="clear" w:color="auto" w:fill="EFEFEF"/>
+            <w:tcMar>
+              <w:top w:w="100" w:type="dxa"/>
+              <w:left w:w="100" w:type="dxa"/>
+              <w:bottom w:w="100" w:type="dxa"/>
+              <w:right w:w="100" w:type="dxa"/>
+            </w:tcMar>
+            <w:hideMark/>
+          </w:tcPr>
+          <w:p/>
+        </w:tc>
+        <w:tc>
+          <w:tcPr>
+            <w:tcW w:w="0" w:type="auto"/>
+            <w:tcBorders>
+              <w:top w:val="single" w:sz="8" w:space="0" w:color="000000"/>
+              <w:left w:val="single" w:sz="8" w:space="0" w:color="000000"/>
+              <w:bottom w:val="single" w:sz="8" w:space="0" w:color="000000"/>
+              <w:right w:val="single" w:sz="8" w:space="0" w:color="000000"/>
+            </w:tcBorders>
+            <w:shd w:val="clear" w:color="auto" w:fill="EFEFEF"/>
+            <w:tcMar>
+              <w:top w:w="100" w:type="dxa"/>
+              <w:left w:w="100" w:type="dxa"/>
+              <w:bottom w:w="100" w:type="dxa"/>
+              <w:right w:w="100" w:type="dxa"/>
+            </w:tcMar>
+            <w:hideMark/>
+          </w:tcPr>
+          <w:p/>
+        </w:tc>
+        <w:tc>
+          <w:tcPr>
+            <w:tcW w:w="0" w:type="auto"/>
+            <w:tcBorders>
+              <w:top w:val="single" w:sz="8" w:space="0" w:color="000000"/>
+              <w:left w:val="single" w:sz="8" w:space="0" w:color="000000"/>
+              <w:bottom w:val="single" w:sz="8" w:space="0" w:color="000000"/>
+              <w:right w:val="single" w:sz="8" w:space="0" w:color="000000"/>
+            </w:tcBorders>
+            <w:shd w:val="clear" w:color="auto" w:fill="EFEFEF"/>
+            <w:tcMar>
+              <w:top w:w="100" w:type="dxa"/>
+              <w:left w:w="100" w:type="dxa"/>
+              <w:bottom w:w="100" w:type="dxa"/>
+              <w:right w:w="100" w:type="dxa"/>
+            </w:tcMar>
+            <w:hideMark/>
+          </w:tcPr>
+          <w:p/>
+        </w:tc>
+        <w:tc>
+          <w:tcPr>
+            <w:tcW w:w="0" w:type="auto"/>
+            <w:tcBorders>
+              <w:top w:val="single" w:sz="8" w:space="0" w:color="000000"/>
+              <w:left w:val="single" w:sz="8" w:space="0" w:color="000000"/>
+              <w:bottom w:val="single" w:sz="8" w:space="0" w:color="000000"/>
+              <w:right w:val="single" w:sz="8" w:space="0" w:color="000000"/>
+            </w:tcBorders>
+            <w:shd w:val="clear" w:color="auto" w:fill="EFEFEF"/>
+            <w:tcMar>
+              <w:top w:w="100" w:type="dxa"/>
+              <w:left w:w="100" w:type="dxa"/>
+              <w:bottom w:w="100" w:type="dxa"/>
+              <w:right w:w="100" w:type="dxa"/>
+            </w:tcMar>
+            <w:hideMark/>
+          </w:tcPr>
+          <w:p/>
+        </w:tc>
+        <w:tc>
+          <w:tcPr>
+            <w:tcW w:w="0" w:type="auto"/>
+            <w:tcBorders>
+              <w:top w:val="single" w:sz="8" w:space="0" w:color="000000"/>
+              <w:left w:val="single" w:sz="8" w:space="0" w:color="000000"/>
+              <w:bottom w:val="single" w:sz="8" w:space="0" w:color="000000"/>
+              <w:right w:val="single" w:sz="8" w:space="0" w:color="000000"/>
+            </w:tcBorders>
+            <w:shd w:val="clear" w:color="auto" w:fill="EFEFEF"/>
+            <w:tcMar>
+              <w:top w:w="100" w:type="dxa"/>
+              <w:left w:w="100" w:type="dxa"/>
+              <w:bottom w:w="100" w:type="dxa"/>
+              <w:right w:w="100" w:type="dxa"/>
+            </w:tcMar>
+            <w:hideMark/>
+          </w:tcPr>
+          <w:p>
+            <w:r>
+              <w:t>Require</w:t>
+            </w:r>
+          </w:p>
+        </w:tc>
+        <w:tc>
+          <w:tcPr>
+            <w:tcW w:w="0" w:type="auto"/>
+            <w:tcBorders>
+              <w:top w:val="single" w:sz="8" w:space="0" w:color="000000"/>
+              <w:left w:val="single" w:sz="8" w:space="0" w:color="000000"/>
+              <w:bottom w:val="single" w:sz="8" w:space="0" w:color="000000"/>
+              <w:right w:val="single" w:sz="8" w:space="0" w:color="000000"/>
+            </w:tcBorders>
+            <w:shd w:val="clear" w:color="auto" w:fill="EFEFEF"/>
+            <w:tcMar>
+              <w:top w:w="100" w:type="dxa"/>
+              <w:left w:w="100" w:type="dxa"/>
+              <w:bottom w:w="100" w:type="dxa"/>
+              <w:right w:w="100" w:type="dxa"/>
+            </w:tcMar>
+            <w:hideMark/>
+          </w:tcPr>
+          <w:p/>
+        </w:tc>
+      </w:tr>
+      <w:tr>
+        <w:trPr>
+          <w:trHeight w:val="480"/>
+        </w:trPr>
+        <w:tc>
+          <w:tcPr>
+            <w:tcW w:w="0" w:type="auto"/>
+            <w:tcBorders>
+              <w:top w:val="single" w:sz="8" w:space="0" w:color="000000"/>
+              <w:left w:val="single" w:sz="8" w:space="0" w:color="000000"/>
+              <w:bottom w:val="single" w:sz="8" w:space="0" w:color="000000"/>
+              <w:right w:val="single" w:sz="8" w:space="0" w:color="000000"/>
+            </w:tcBorders>
+            <w:shd w:val="clear" w:color="auto" w:fill="EFEFEF"/>
+            <w:tcMar>
+              <w:top w:w="100" w:type="dxa"/>
+              <w:left w:w="100" w:type="dxa"/>
+              <w:bottom w:w="100" w:type="dxa"/>
+              <w:right w:w="100" w:type="dxa"/>
+            </w:tcMar>
+          </w:tcPr>
+          <w:p>
+            <w:pPr>
+              <w:rPr>
+                <w:b/>
+                <w:bCs/>
+              </w:rPr>
+            </w:pPr>
+            <w:r>
+              <w:rPr>
+                <w:b/>
+                <w:bCs/>
+              </w:rPr>
+              <w:t>4.3b</w:t>
+            </w:r>
+          </w:p>
+        </w:tc>
+        <w:tc>
+          <w:tcPr>
+            <w:tcW w:w="0" w:type="auto"/>
+            <w:tcBorders>
+              <w:top w:val="single" w:sz="8" w:space="0" w:color="000000"/>
+              <w:left w:val="single" w:sz="8" w:space="0" w:color="000000"/>
+              <w:bottom w:val="single" w:sz="8" w:space="0" w:color="000000"/>
+              <w:right w:val="single" w:sz="8" w:space="0" w:color="000000"/>
+            </w:tcBorders>
+            <w:shd w:val="clear" w:color="auto" w:fill="EFEFEF"/>
+            <w:tcMar>
+              <w:top w:w="100" w:type="dxa"/>
+              <w:left w:w="100" w:type="dxa"/>
+              <w:bottom w:w="100" w:type="dxa"/>
+              <w:right w:w="100" w:type="dxa"/>
+            </w:tcMar>
+          </w:tcPr>
+          <w:p>
+            <w:pPr>
+              <w:rPr>
+                <w:b/>
+                <w:bCs/>
+              </w:rPr>
+            </w:pPr>
+            <w:r>
+              <w:rPr>
+                <w:b/>
+                <w:bCs/>
+              </w:rPr>
+              <w:t xml:space="preserve">Is at least one author </w:t>
+            </w:r>
+            <w:r>
+              <w:rPr>
+                <w:b/>
+                <w:bCs/>
+              </w:rPr>
+              <w:t xml:space="preserve">listed </w:t>
+            </w:r>
+            <w:r>
+              <w:rPr>
+                <w:b/>
+                <w:bCs/>
+              </w:rPr>
+              <w:t>affiliation</w:t>
+            </w:r>
+            <w:r>
+              <w:rPr>
+                <w:b/>
+                <w:bCs/>
+              </w:rPr>
+              <w:t xml:space="preserve"> </w:t>
+            </w:r>
+            <w:r>
+              <w:rPr>
+                <w:b/>
+                <w:bCs/>
+              </w:rPr>
+              <w:t>University of Toronto?</w:t>
+            </w:r>
+          </w:p>
+        </w:tc>
+        <w:tc>
+          <w:tcPr>
+            <w:tcW w:w="0" w:type="auto"/>
+            <w:tcBorders>
+              <w:top w:val="single" w:sz="8" w:space="0" w:color="000000"/>
+              <w:left w:val="single" w:sz="8" w:space="0" w:color="000000"/>
+              <w:bottom w:val="single" w:sz="8" w:space="0" w:color="000000"/>
+              <w:right w:val="single" w:sz="8" w:space="0" w:color="000000"/>
+            </w:tcBorders>
+            <w:shd w:val="clear" w:color="auto" w:fill="EFEFEF"/>
+            <w:tcMar>
+              <w:top w:w="100" w:type="dxa"/>
+              <w:left w:w="100" w:type="dxa"/>
+              <w:bottom w:w="100" w:type="dxa"/>
+              <w:right w:w="100" w:type="dxa"/>
+            </w:tcMar>
+          </w:tcPr>
+          <w:p>
+            <w:r>
+              <w:t>Python scripted.</w:t>
+            </w:r>
+          </w:p>
+          <w:p>
+            <w:pPr>
+              <w:numPr>
+                <w:ilvl w:val="0"/>
+                <w:numId w:val="20"/>
+              </w:numPr>
+              <w:rPr>
+                <w:lang w:val="en-US"/>
+              </w:rPr>
+            </w:pPr>
+            <w:r>
+              <w:t>This will check</w:t>
+            </w:r>
+            <w:r>
+              <w:t xml:space="preserve"> either ‘uoft’, ‘u of t’ or ‘</w:t>
+            </w:r>
+            <w:r>
+              <w:t>university of toronto</w:t>
+            </w:r>
+            <w:r>
+              <w:t xml:space="preserve">’ </w:t>
+            </w:r>
+            <w:r>
+              <w:lastRenderedPageBreak/>
+              <w:t xml:space="preserve">is filled for the </w:t>
+            </w:r>
+            <w:r>
+              <w:t>author</w:t>
+            </w:r>
+            <w:r>
+              <w:t xml:space="preserve"> </w:t>
+            </w:r>
+            <w:r>
+              <w:rPr>
+                <w:lang w:val="en-US"/>
+              </w:rPr>
+              <w:t>affiliation</w:t>
+            </w:r>
+            <w:r>
+              <w:rPr>
+                <w:lang w:val="en-US"/>
+              </w:rPr>
+              <w:t xml:space="preserve"> (non-case sensitive)</w:t>
+            </w:r>
+          </w:p>
+        </w:tc>
+        <w:tc>
+          <w:tcPr>
+            <w:tcW w:w="0" w:type="auto"/>
+            <w:tcBorders>
+              <w:top w:val="single" w:sz="8" w:space="0" w:color="000000"/>
+              <w:left w:val="single" w:sz="8" w:space="0" w:color="000000"/>
+              <w:bottom w:val="single" w:sz="8" w:space="0" w:color="000000"/>
+              <w:right w:val="single" w:sz="8" w:space="0" w:color="000000"/>
+            </w:tcBorders>
+            <w:shd w:val="clear" w:color="auto" w:fill="EFEFEF"/>
+            <w:tcMar>
+              <w:top w:w="100" w:type="dxa"/>
+              <w:left w:w="100" w:type="dxa"/>
+              <w:bottom w:w="100" w:type="dxa"/>
+              <w:right w:w="100" w:type="dxa"/>
+            </w:tcMar>
+          </w:tcPr>
+          <w:p>
+            <w:pPr>
+              <w:rPr>
+                <w:lang w:val="en-US"/>
+              </w:rPr>
+            </w:pPr>
+            <w:r>
+              <w:lastRenderedPageBreak/>
+              <w:t>{% if not template_dict.</w:t>
+            </w:r>
+            <w:r>
+              <w:rPr>
+                <w:lang w:val="en-US"/>
+              </w:rPr>
+              <w:t>none_author_affiliation_UT</w:t>
+            </w:r>
+            <w:r>
+              <w:t>%}X{% endif %}</w:t>
+            </w:r>
+          </w:p>
+        </w:tc>
+        <w:tc>
+          <w:tcPr>
+            <w:tcW w:w="0" w:type="auto"/>
+            <w:tcBorders>
+              <w:top w:val="single" w:sz="8" w:space="0" w:color="000000"/>
+              <w:left w:val="single" w:sz="8" w:space="0" w:color="000000"/>
+              <w:bottom w:val="single" w:sz="8" w:space="0" w:color="000000"/>
+              <w:right w:val="single" w:sz="8" w:space="0" w:color="000000"/>
+            </w:tcBorders>
+            <w:shd w:val="clear" w:color="auto" w:fill="EFEFEF"/>
+            <w:tcMar>
+              <w:top w:w="100" w:type="dxa"/>
+              <w:left w:w="100" w:type="dxa"/>
+              <w:bottom w:w="100" w:type="dxa"/>
+              <w:right w:w="100" w:type="dxa"/>
+            </w:tcMar>
+          </w:tcPr>
+          <w:p>
+            <w:pPr>
+              <w:rPr>
+                <w:lang w:val="en-US"/>
+              </w:rPr>
+            </w:pPr>
+            <w:r>
+              <w:t>{% if template_dict.</w:t>
+            </w:r>
+            <w:r>
+              <w:rPr>
+                <w:lang w:val="en-US"/>
+              </w:rPr>
+              <w:t>none_author_affiliation_UT</w:t>
+            </w:r>
             <w:r>
               <w:t xml:space="preserve"> %}X{% endif %}</w:t>
             </w:r>
@@ -8033,19 +7867,7 @@
               <w:right w:w="100" w:type="dxa"/>
             </w:tcMar>
           </w:tcPr>
-          <w:p>
-            <w:r>
-              <w:t xml:space="preserve">{% if </w:t>
-            </w:r>
-            <w:proofErr w:type="spellStart"/>
-            <w:r>
-              <w:t>template_dict.none_author_affiliation</w:t>
-            </w:r>
-            <w:proofErr w:type="spellEnd"/>
-            <w:r>
-              <w:t xml:space="preserve"> %}X{% endif %}</w:t>
-            </w:r>
-          </w:p>
+          <w:p/>
         </w:tc>
         <w:tc>
           <w:tcPr>
@@ -8063,7 +7885,6 @@
               <w:bottom w:w="100" w:type="dxa"/>
               <w:right w:w="100" w:type="dxa"/>
             </w:tcMar>
-            <w:hideMark/>
           </w:tcPr>
           <w:p/>
         </w:tc>
@@ -8083,7 +7904,6 @@
               <w:bottom w:w="100" w:type="dxa"/>
               <w:right w:w="100" w:type="dxa"/>
             </w:tcMar>
-            <w:hideMark/>
           </w:tcPr>
           <w:p/>
         </w:tc>
@@ -8103,7 +7923,6 @@
               <w:bottom w:w="100" w:type="dxa"/>
               <w:right w:w="100" w:type="dxa"/>
             </w:tcMar>
-            <w:hideMark/>
           </w:tcPr>
           <w:p/>
         </w:tc>
@@ -8123,9 +7942,12 @@
               <w:bottom w:w="100" w:type="dxa"/>
               <w:right w:w="100" w:type="dxa"/>
             </w:tcMar>
-            <w:hideMark/>
-          </w:tcPr>
-          <w:p/>
+          </w:tcPr>
+          <w:p>
+            <w:r>
+              <w:t>Require</w:t>
+            </w:r>
+          </w:p>
         </w:tc>
         <w:tc>
           <w:tcPr>
@@ -8143,31 +7965,6 @@
               <w:bottom w:w="100" w:type="dxa"/>
               <w:right w:w="100" w:type="dxa"/>
             </w:tcMar>
-            <w:hideMark/>
-          </w:tcPr>
-          <w:p>
-            <w:r>
-              <w:t>Require</w:t>
-            </w:r>
-          </w:p>
-        </w:tc>
-        <w:tc>
-          <w:tcPr>
-            <w:tcW w:w="0" w:type="auto"/>
-            <w:tcBorders>
-              <w:top w:val="single" w:sz="8" w:space="0" w:color="000000"/>
-              <w:left w:val="single" w:sz="8" w:space="0" w:color="000000"/>
-              <w:bottom w:val="single" w:sz="8" w:space="0" w:color="000000"/>
-              <w:right w:val="single" w:sz="8" w:space="0" w:color="000000"/>
-            </w:tcBorders>
-            <w:shd w:val="clear" w:color="auto" w:fill="EFEFEF"/>
-            <w:tcMar>
-              <w:top w:w="100" w:type="dxa"/>
-              <w:left w:w="100" w:type="dxa"/>
-              <w:bottom w:w="100" w:type="dxa"/>
-              <w:right w:w="100" w:type="dxa"/>
-            </w:tcMar>
-            <w:hideMark/>
           </w:tcPr>
           <w:p/>
         </w:tc>
@@ -8255,11 +8052,7 @@
               </w:numPr>
             </w:pPr>
             <w:r>
-              <w:t xml:space="preserve">Read the description and README file and check them against metadata fields. </w:t>
-            </w:r>
-            <w:r>
-              <w:lastRenderedPageBreak/>
-              <w:t>For example, if a geographical location or data collection date/range is mentioned in the description, recommend filling in the relevant metadata fields</w:t>
+              <w:t>Read the description and README file and check them against metadata fields. For example, if a geographical location or data collection date/range is mentioned in the description, recommend filling in the relevant metadata fields</w:t>
             </w:r>
           </w:p>
           <w:p>
@@ -8277,7 +8070,14 @@
                 <w:rPr>
                   <w:rStyle w:val="Hyperlink"/>
                 </w:rPr>
-                <w:t>Dataverse North Metadata Best Practices (pdf)</w:t>
+                <w:t xml:space="preserve">Dataverse North Metadata Best </w:t>
+              </w:r>
+              <w:r>
+                <w:rPr>
+                  <w:rStyle w:val="Hyperlink"/>
+                </w:rPr>
+                <w:lastRenderedPageBreak/>
+                <w:t>Practices (pdf)</w:t>
               </w:r>
             </w:hyperlink>
             <w:r>
@@ -8550,11 +8350,7 @@
               </w:numPr>
             </w:pPr>
             <w:r>
-              <w:t xml:space="preserve">Review metadata and flag acronyms/terms that may </w:t>
-            </w:r>
-            <w:r>
-              <w:lastRenderedPageBreak/>
-              <w:t>need to be described.</w:t>
+              <w:t>Review metadata and flag acronyms/terms that may need to be described.</w:t>
             </w:r>
           </w:p>
         </w:tc>
@@ -8864,7 +8660,11 @@
               </w:numPr>
             </w:pPr>
             <w:r>
-              <w:t>Other dataset(s) used in creating the dataset </w:t>
+              <w:t>Other dataset(s</w:t>
+            </w:r>
+            <w:r>
+              <w:lastRenderedPageBreak/>
+              <w:t>) used in creating the dataset </w:t>
             </w:r>
           </w:p>
           <w:p>
@@ -8897,11 +8697,7 @@
               </w:numPr>
             </w:pPr>
             <w:r>
-              <w:t xml:space="preserve">Other relevant </w:t>
-            </w:r>
-            <w:r>
-              <w:lastRenderedPageBreak/>
-              <w:t>information</w:t>
+              <w:t>Other relevant information</w:t>
             </w:r>
           </w:p>
         </w:tc>
@@ -9199,14 +8995,7 @@
               <w:rPr>
                 <w:lang w:val="en-US"/>
               </w:rPr>
-              <w:t xml:space="preserve">{% if </w:t>
-            </w:r>
-            <w:proofErr w:type="spellStart"/>
-            <w:r>
-              <w:rPr>
-                <w:lang w:val="en-US"/>
-              </w:rPr>
-              <w:t>template_dict.</w:t>
+              <w:t>{% if template_dict.</w:t>
             </w:r>
             <w:r>
               <w:rPr>
@@ -9219,71 +9008,57 @@
               <w:rPr>
                 <w:lang w:val="en-US"/>
               </w:rPr>
-              <w:t>|length</w:t>
-            </w:r>
-            <w:proofErr w:type="spellEnd"/>
-            <w:r>
+              <w:t>|length &gt; 0 %}X{% endif %}</w:t>
+            </w:r>
+          </w:p>
+        </w:tc>
+        <w:tc>
+          <w:tcPr>
+            <w:tcW w:w="0" w:type="auto"/>
+            <w:tcBorders>
+              <w:top w:val="single" w:sz="8" w:space="0" w:color="000000"/>
+              <w:left w:val="single" w:sz="8" w:space="0" w:color="000000"/>
+              <w:bottom w:val="single" w:sz="8" w:space="0" w:color="000000"/>
+              <w:right w:val="single" w:sz="8" w:space="0" w:color="000000"/>
+            </w:tcBorders>
+            <w:tcMar>
+              <w:top w:w="100" w:type="dxa"/>
+              <w:left w:w="100" w:type="dxa"/>
+              <w:bottom w:w="100" w:type="dxa"/>
+              <w:right w:w="100" w:type="dxa"/>
+            </w:tcMar>
+            <w:hideMark/>
+          </w:tcPr>
+          <w:p/>
+        </w:tc>
+        <w:tc>
+          <w:tcPr>
+            <w:tcW w:w="0" w:type="auto"/>
+            <w:tcBorders>
+              <w:top w:val="single" w:sz="8" w:space="0" w:color="000000"/>
+              <w:left w:val="single" w:sz="8" w:space="0" w:color="000000"/>
+              <w:bottom w:val="single" w:sz="8" w:space="0" w:color="000000"/>
+              <w:right w:val="single" w:sz="8" w:space="0" w:color="000000"/>
+            </w:tcBorders>
+            <w:tcMar>
+              <w:top w:w="100" w:type="dxa"/>
+              <w:left w:w="100" w:type="dxa"/>
+              <w:bottom w:w="100" w:type="dxa"/>
+              <w:right w:w="100" w:type="dxa"/>
+            </w:tcMar>
+            <w:hideMark/>
+          </w:tcPr>
+          <w:p>
+            <w:pPr>
               <w:rPr>
                 <w:lang w:val="en-US"/>
               </w:rPr>
-              <w:t xml:space="preserve"> &gt; 0 %}X{% endif %}</w:t>
-            </w:r>
-          </w:p>
-        </w:tc>
-        <w:tc>
-          <w:tcPr>
-            <w:tcW w:w="0" w:type="auto"/>
-            <w:tcBorders>
-              <w:top w:val="single" w:sz="8" w:space="0" w:color="000000"/>
-              <w:left w:val="single" w:sz="8" w:space="0" w:color="000000"/>
-              <w:bottom w:val="single" w:sz="8" w:space="0" w:color="000000"/>
-              <w:right w:val="single" w:sz="8" w:space="0" w:color="000000"/>
-            </w:tcBorders>
-            <w:tcMar>
-              <w:top w:w="100" w:type="dxa"/>
-              <w:left w:w="100" w:type="dxa"/>
-              <w:bottom w:w="100" w:type="dxa"/>
-              <w:right w:w="100" w:type="dxa"/>
-            </w:tcMar>
-            <w:hideMark/>
-          </w:tcPr>
-          <w:p/>
-        </w:tc>
-        <w:tc>
-          <w:tcPr>
-            <w:tcW w:w="0" w:type="auto"/>
-            <w:tcBorders>
-              <w:top w:val="single" w:sz="8" w:space="0" w:color="000000"/>
-              <w:left w:val="single" w:sz="8" w:space="0" w:color="000000"/>
-              <w:bottom w:val="single" w:sz="8" w:space="0" w:color="000000"/>
-              <w:right w:val="single" w:sz="8" w:space="0" w:color="000000"/>
-            </w:tcBorders>
-            <w:tcMar>
-              <w:top w:w="100" w:type="dxa"/>
-              <w:left w:w="100" w:type="dxa"/>
-              <w:bottom w:w="100" w:type="dxa"/>
-              <w:right w:w="100" w:type="dxa"/>
-            </w:tcMar>
-            <w:hideMark/>
-          </w:tcPr>
-          <w:p>
-            <w:pPr>
+            </w:pPr>
+            <w:r>
               <w:rPr>
                 <w:lang w:val="en-US"/>
               </w:rPr>
-            </w:pPr>
-            <w:r>
-              <w:rPr>
-                <w:lang w:val="en-US"/>
-              </w:rPr>
-              <w:t xml:space="preserve">{% if </w:t>
-            </w:r>
-            <w:proofErr w:type="spellStart"/>
-            <w:r>
-              <w:rPr>
-                <w:lang w:val="en-US"/>
-              </w:rPr>
-              <w:t>template_dict.</w:t>
+              <w:t>{% if template_dict.</w:t>
             </w:r>
             <w:r>
               <w:rPr>
@@ -9296,125 +9071,98 @@
               <w:rPr>
                 <w:lang w:val="en-US"/>
               </w:rPr>
-              <w:t>|length</w:t>
-            </w:r>
-            <w:proofErr w:type="spellEnd"/>
+              <w:t>|length == 0 %}X{% endif %}</w:t>
+            </w:r>
+          </w:p>
+        </w:tc>
+        <w:tc>
+          <w:tcPr>
+            <w:tcW w:w="0" w:type="auto"/>
+            <w:tcBorders>
+              <w:top w:val="single" w:sz="8" w:space="0" w:color="000000"/>
+              <w:left w:val="single" w:sz="8" w:space="0" w:color="000000"/>
+              <w:bottom w:val="single" w:sz="8" w:space="0" w:color="000000"/>
+              <w:right w:val="single" w:sz="8" w:space="0" w:color="000000"/>
+            </w:tcBorders>
+            <w:tcMar>
+              <w:top w:w="100" w:type="dxa"/>
+              <w:left w:w="100" w:type="dxa"/>
+              <w:bottom w:w="100" w:type="dxa"/>
+              <w:right w:w="100" w:type="dxa"/>
+            </w:tcMar>
+            <w:hideMark/>
+          </w:tcPr>
+          <w:p/>
+        </w:tc>
+        <w:tc>
+          <w:tcPr>
+            <w:tcW w:w="0" w:type="auto"/>
+            <w:tcBorders>
+              <w:top w:val="single" w:sz="8" w:space="0" w:color="000000"/>
+              <w:left w:val="single" w:sz="8" w:space="0" w:color="000000"/>
+              <w:bottom w:val="single" w:sz="8" w:space="0" w:color="000000"/>
+              <w:right w:val="single" w:sz="8" w:space="0" w:color="000000"/>
+            </w:tcBorders>
+            <w:tcMar>
+              <w:top w:w="100" w:type="dxa"/>
+              <w:left w:w="100" w:type="dxa"/>
+              <w:bottom w:w="100" w:type="dxa"/>
+              <w:right w:w="100" w:type="dxa"/>
+            </w:tcMar>
+            <w:hideMark/>
+          </w:tcPr>
+          <w:p/>
+        </w:tc>
+        <w:tc>
+          <w:tcPr>
+            <w:tcW w:w="0" w:type="auto"/>
+            <w:tcBorders>
+              <w:top w:val="single" w:sz="8" w:space="0" w:color="000000"/>
+              <w:left w:val="single" w:sz="8" w:space="0" w:color="000000"/>
+              <w:bottom w:val="single" w:sz="8" w:space="0" w:color="000000"/>
+              <w:right w:val="single" w:sz="8" w:space="0" w:color="000000"/>
+            </w:tcBorders>
+            <w:tcMar>
+              <w:top w:w="100" w:type="dxa"/>
+              <w:left w:w="100" w:type="dxa"/>
+              <w:bottom w:w="100" w:type="dxa"/>
+              <w:right w:w="100" w:type="dxa"/>
+            </w:tcMar>
+            <w:hideMark/>
+          </w:tcPr>
+          <w:p>
+            <w:r>
+              <w:rPr>
+                <w:rFonts w:hint="eastAsia"/>
+              </w:rPr>
+              <w:t>List the keyword(s) in the metadata, if any:</w:t>
+            </w:r>
+            <w:r>
+              <w:br/>
+            </w:r>
+            <w:r>
+              <w:t xml:space="preserve">{% if </w:t>
+            </w:r>
             <w:r>
               <w:rPr>
                 <w:lang w:val="en-US"/>
               </w:rPr>
-              <w:t xml:space="preserve"> == 0 %}X{% endif %}</w:t>
-            </w:r>
-          </w:p>
-        </w:tc>
-        <w:tc>
-          <w:tcPr>
-            <w:tcW w:w="0" w:type="auto"/>
-            <w:tcBorders>
-              <w:top w:val="single" w:sz="8" w:space="0" w:color="000000"/>
-              <w:left w:val="single" w:sz="8" w:space="0" w:color="000000"/>
-              <w:bottom w:val="single" w:sz="8" w:space="0" w:color="000000"/>
-              <w:right w:val="single" w:sz="8" w:space="0" w:color="000000"/>
-            </w:tcBorders>
-            <w:tcMar>
-              <w:top w:w="100" w:type="dxa"/>
-              <w:left w:w="100" w:type="dxa"/>
-              <w:bottom w:w="100" w:type="dxa"/>
-              <w:right w:w="100" w:type="dxa"/>
-            </w:tcMar>
-            <w:hideMark/>
-          </w:tcPr>
-          <w:p/>
-        </w:tc>
-        <w:tc>
-          <w:tcPr>
-            <w:tcW w:w="0" w:type="auto"/>
-            <w:tcBorders>
-              <w:top w:val="single" w:sz="8" w:space="0" w:color="000000"/>
-              <w:left w:val="single" w:sz="8" w:space="0" w:color="000000"/>
-              <w:bottom w:val="single" w:sz="8" w:space="0" w:color="000000"/>
-              <w:right w:val="single" w:sz="8" w:space="0" w:color="000000"/>
-            </w:tcBorders>
-            <w:tcMar>
-              <w:top w:w="100" w:type="dxa"/>
-              <w:left w:w="100" w:type="dxa"/>
-              <w:bottom w:w="100" w:type="dxa"/>
-              <w:right w:w="100" w:type="dxa"/>
-            </w:tcMar>
-            <w:hideMark/>
-          </w:tcPr>
-          <w:p/>
-        </w:tc>
-        <w:tc>
-          <w:tcPr>
-            <w:tcW w:w="0" w:type="auto"/>
-            <w:tcBorders>
-              <w:top w:val="single" w:sz="8" w:space="0" w:color="000000"/>
-              <w:left w:val="single" w:sz="8" w:space="0" w:color="000000"/>
-              <w:bottom w:val="single" w:sz="8" w:space="0" w:color="000000"/>
-              <w:right w:val="single" w:sz="8" w:space="0" w:color="000000"/>
-            </w:tcBorders>
-            <w:tcMar>
-              <w:top w:w="100" w:type="dxa"/>
-              <w:left w:w="100" w:type="dxa"/>
-              <w:bottom w:w="100" w:type="dxa"/>
-              <w:right w:w="100" w:type="dxa"/>
-            </w:tcMar>
-            <w:hideMark/>
-          </w:tcPr>
-          <w:p>
-            <w:r>
-              <w:rPr>
-                <w:rFonts w:hint="eastAsia"/>
-              </w:rPr>
-              <w:t>List the keyword(s) in the metadata, if any:</w:t>
-            </w:r>
-            <w:r>
-              <w:br/>
-            </w:r>
-            <w:r>
-              <w:t xml:space="preserve">{% if </w:t>
-            </w:r>
-            <w:proofErr w:type="spellStart"/>
+              <w:t>template_dict.</w:t>
+            </w:r>
+            <w:r>
+              <w:t>keywords</w:t>
+            </w:r>
+            <w:r>
+              <w:t>|length &gt; 0</w:t>
+            </w:r>
+            <w:r>
+              <w:t xml:space="preserve"> %}</w:t>
+            </w:r>
             <w:r>
               <w:rPr>
                 <w:lang w:val="en-US"/>
               </w:rPr>
-              <w:t>template_dict</w:t>
-            </w:r>
-            <w:proofErr w:type="spellEnd"/>
-            <w:r>
-              <w:rPr>
-                <w:lang w:val="en-US"/>
-              </w:rPr>
-              <w:t>.</w:t>
-            </w:r>
-            <w:proofErr w:type="spellStart"/>
-            <w:r>
-              <w:t>keywords</w:t>
-            </w:r>
-            <w:r>
-              <w:t>|length</w:t>
-            </w:r>
-            <w:proofErr w:type="spellEnd"/>
-            <w:r>
-              <w:t xml:space="preserve"> &gt; 0</w:t>
-            </w:r>
-            <w:r>
-              <w:t xml:space="preserve"> %}</w:t>
-            </w:r>
-            <w:r>
-              <w:rPr>
-                <w:lang w:val="en-US"/>
-              </w:rPr>
-              <w:t xml:space="preserve">{% for item in </w:t>
-            </w:r>
-            <w:proofErr w:type="spellStart"/>
-            <w:r>
-              <w:rPr>
-                <w:lang w:val="en-US"/>
-              </w:rPr>
-              <w:t>template_dict.</w:t>
+              <w:t>{% for item in template_dict.</w:t>
             </w:r>
             <w:r>
               <w:rPr>
@@ -9423,7 +9171,6 @@
               </w:rPr>
               <w:t>keywords</w:t>
             </w:r>
-            <w:proofErr w:type="spellEnd"/>
             <w:r>
               <w:rPr>
                 <w:lang w:val="en-US"/>
@@ -9443,21 +9190,7 @@
               <w:rPr>
                 <w:lang w:val="en-US"/>
               </w:rPr>
-              <w:t xml:space="preserve">{{ item }}{% </w:t>
-            </w:r>
-            <w:proofErr w:type="spellStart"/>
-            <w:r>
-              <w:rPr>
-                <w:lang w:val="en-US"/>
-              </w:rPr>
-              <w:t>endfor</w:t>
-            </w:r>
-            <w:proofErr w:type="spellEnd"/>
-            <w:r>
-              <w:rPr>
-                <w:lang w:val="en-US"/>
-              </w:rPr>
-              <w:t xml:space="preserve"> %}</w:t>
+              <w:t>{{ item }}{% endfor %}</w:t>
             </w:r>
           </w:p>
           <w:p>
@@ -9572,7 +9305,15 @@
                 <w:b/>
                 <w:bCs/>
               </w:rPr>
-              <w:t>Does the dataset include a Researcher ID for each author?</w:t>
+              <w:t xml:space="preserve">Does the dataset include a </w:t>
+            </w:r>
+            <w:r>
+              <w:rPr>
+                <w:b/>
+                <w:bCs/>
+              </w:rPr>
+              <w:lastRenderedPageBreak/>
+              <w:t>Researcher ID for each author?</w:t>
             </w:r>
           </w:p>
         </w:tc>
@@ -9601,7 +9342,12 @@
               </w:numPr>
             </w:pPr>
             <w:r>
-              <w:t>If no Researcher ID (such as ORCID, or other identifier) is listed, let them know they may want to include it</w:t>
+              <w:lastRenderedPageBreak/>
+              <w:t xml:space="preserve">If no Researcher ID </w:t>
+            </w:r>
+            <w:r>
+              <w:lastRenderedPageBreak/>
+              <w:t>(such as ORCID, or other identifier) is listed, let them know they may want to include it</w:t>
             </w:r>
           </w:p>
         </w:tc>
@@ -9816,15 +9562,7 @@
                 <w:b/>
                 <w:bCs/>
               </w:rPr>
-              <w:t xml:space="preserve">Does the dataset serve as Replication, Background, </w:t>
-            </w:r>
-            <w:r>
-              <w:rPr>
-                <w:b/>
-                <w:bCs/>
-              </w:rPr>
-              <w:lastRenderedPageBreak/>
-              <w:t>or Supporting Data linked to a publication?</w:t>
+              <w:t>Does the dataset serve as Replication, Background, or Supporting Data linked to a publication?</w:t>
             </w:r>
           </w:p>
         </w:tc>
@@ -9853,12 +9591,7 @@
               </w:numPr>
             </w:pPr>
             <w:r>
-              <w:lastRenderedPageBreak/>
-              <w:t xml:space="preserve">If a suffix is used or the title suggests a </w:t>
-            </w:r>
-            <w:r>
-              <w:lastRenderedPageBreak/>
-              <w:t>publication, check the metadata for an associated publication.</w:t>
+              <w:t>If a suffix is used or the title suggests a publication, check the metadata for an associated publication.</w:t>
             </w:r>
           </w:p>
           <w:p>
@@ -9999,7 +9732,6 @@
           <w:p/>
           <w:p>
             <w:r>
-              <w:lastRenderedPageBreak/>
               <w:t>If there is no suffix, is there a related publication in the metadata that implies one of these suffixes should be used? Y/N</w:t>
             </w:r>
             <w:r>
@@ -10029,7 +9761,6 @@
           </w:tcPr>
           <w:p>
             <w:r>
-              <w:lastRenderedPageBreak/>
               <w:t>Recommend</w:t>
             </w:r>
           </w:p>
@@ -10109,7 +9840,15 @@
                 <w:b/>
                 <w:bCs/>
               </w:rPr>
-              <w:t>If there is a related dataset associated with the dataset, has a DOI or other identifier been included in the publication metadata?</w:t>
+              <w:t xml:space="preserve">If there is a related dataset associated </w:t>
+            </w:r>
+            <w:r>
+              <w:rPr>
+                <w:b/>
+                <w:bCs/>
+              </w:rPr>
+              <w:lastRenderedPageBreak/>
+              <w:t>with the dataset, has a DOI or other identifier been included in the publication metadata?</w:t>
             </w:r>
           </w:p>
         </w:tc>
@@ -10138,7 +9877,12 @@
               </w:numPr>
             </w:pPr>
             <w:r>
-              <w:t>If there’s a related article, has the DOI or other identifier been included </w:t>
+              <w:lastRenderedPageBreak/>
+              <w:t xml:space="preserve">If there’s a related article, has the </w:t>
+            </w:r>
+            <w:r>
+              <w:lastRenderedPageBreak/>
+              <w:t>DOI or other identifier been included </w:t>
             </w:r>
           </w:p>
         </w:tc>
@@ -10299,6 +10043,7 @@
           </w:tcPr>
           <w:p>
             <w:r>
+              <w:lastRenderedPageBreak/>
               <w:t>Require</w:t>
             </w:r>
           </w:p>
@@ -10639,7 +10384,6 @@
                 <w:b/>
                 <w:bCs/>
               </w:rPr>
-              <w:lastRenderedPageBreak/>
               <w:t>5.1</w:t>
             </w:r>
           </w:p>
@@ -10944,6 +10688,7 @@
                 <w:b/>
                 <w:bCs/>
               </w:rPr>
+              <w:lastRenderedPageBreak/>
               <w:t>5.2</w:t>
             </w:r>
           </w:p>
@@ -11002,11 +10747,7 @@
               </w:numPr>
             </w:pPr>
             <w:r>
-              <w:t xml:space="preserve">If something is flagged in the sensitive data review (see question above), check the intake </w:t>
-            </w:r>
-            <w:r>
-              <w:lastRenderedPageBreak/>
-              <w:t>form to confirm information about their REB status.</w:t>
+              <w:t>If something is flagged in the sensitive data review (see question above), check the intake form to confirm information about their REB status.</w:t>
             </w:r>
           </w:p>
         </w:tc>
@@ -11407,11 +11148,7 @@
               <w:br/>
             </w:r>
             <w:r>
-              <w:t xml:space="preserve">{% if </w:t>
-            </w:r>
-            <w:proofErr w:type="spellStart"/>
-            <w:r>
-              <w:t>template_dict.restricted_files.comment</w:t>
+              <w:t>{% if template_dict.restricted_files.comment</w:t>
             </w:r>
             <w:r>
               <w:rPr>
@@ -11420,22 +11157,10 @@
               <w:t>s</w:t>
             </w:r>
             <w:r>
-              <w:t>|length</w:t>
-            </w:r>
-            <w:proofErr w:type="spellEnd"/>
-            <w:r>
-              <w:t xml:space="preserve"> &gt; 0</w:t>
-            </w:r>
-            <w:r>
-              <w:t xml:space="preserve"> %}{% for item in </w:t>
-            </w:r>
-            <w:proofErr w:type="spellStart"/>
-            <w:r>
-              <w:t>template_dict.restricted_files.comments</w:t>
-            </w:r>
-            <w:proofErr w:type="spellEnd"/>
-            <w:r>
-              <w:t xml:space="preserve"> %} </w:t>
+              <w:t>|length &gt; 0</w:t>
+            </w:r>
+            <w:r>
+              <w:t xml:space="preserve"> %}{% for item in template_dict.restricted_files.comments %} </w:t>
             </w:r>
           </w:p>
           <w:p>
@@ -11447,23 +11172,7 @@
               </w:numPr>
             </w:pPr>
             <w:r>
-              <w:t xml:space="preserve">{{ </w:t>
-            </w:r>
-            <w:proofErr w:type="spellStart"/>
-            <w:r>
-              <w:t>item.file_name</w:t>
-            </w:r>
-            <w:proofErr w:type="spellEnd"/>
-            <w:r>
-              <w:t xml:space="preserve"> }} {% </w:t>
-            </w:r>
-            <w:proofErr w:type="spellStart"/>
-            <w:r>
-              <w:t>endfor</w:t>
-            </w:r>
-            <w:proofErr w:type="spellEnd"/>
-            <w:r>
-              <w:t xml:space="preserve"> %}</w:t>
+              <w:t>{{ item.file_name }} {% endfor %}</w:t>
             </w:r>
           </w:p>
           <w:p>
@@ -11496,23 +11205,7 @@
               </w:rPr>
             </w:pPr>
             <w:r>
-              <w:t xml:space="preserve">{% if </w:t>
-            </w:r>
-            <w:proofErr w:type="spellStart"/>
-            <w:r>
-              <w:t>template_dict.terms_license.licenseName</w:t>
-            </w:r>
-            <w:proofErr w:type="spellEnd"/>
-            <w:r>
-              <w:t xml:space="preserve"> is not none %}{{ </w:t>
-            </w:r>
-            <w:proofErr w:type="spellStart"/>
-            <w:r>
-              <w:t>template_dict.terms_license.licenseName</w:t>
-            </w:r>
-            <w:proofErr w:type="spellEnd"/>
-            <w:r>
-              <w:t xml:space="preserve"> }}{% else %}(NONE){% endif %}</w:t>
+              <w:t>{% if template_dict.terms_license.licenseName is not none %}{{ template_dict.terms_license.licenseName }}{% else %}(NONE){% endif %}</w:t>
             </w:r>
           </w:p>
           <w:p>
@@ -11539,7 +11232,7 @@
               <w:tblLook w:val="04A0" w:firstRow="1" w:lastRow="0" w:firstColumn="1" w:lastColumn="0" w:noHBand="0" w:noVBand="1"/>
             </w:tblPr>
             <w:tblGrid>
-              <w:gridCol w:w="3719"/>
+              <w:gridCol w:w="3826"/>
             </w:tblGrid>
             <w:tr>
               <w:tc>
@@ -11553,27 +11246,21 @@
                     </w:rPr>
                   </w:pPr>
                   <w:r>
-                    <w:t xml:space="preserve">{% if </w:t>
-                  </w:r>
-                  <w:proofErr w:type="spellStart"/>
-                  <w:r>
-                    <w:t>template_dict.terms_license.</w:t>
+                    <w:t>{% if template_dict.terms_license.</w:t>
                   </w:r>
                   <w:r>
                     <w:t>termsOfUse</w:t>
                   </w:r>
-                  <w:proofErr w:type="spellEnd"/>
                   <w:r>
-                    <w:t xml:space="preserve"> is not none %}{{ </w:t>
-                  </w:r>
-                  <w:proofErr w:type="spellStart"/>
-                  <w:r>
-                    <w:t>template_dict.terms_license.</w:t>
+                    <w:t xml:space="preserve"> is not none %}{{ template_dict.terms_license.</w:t>
                   </w:r>
                   <w:r>
-                    <w:t>termsOfUse</w:t>
+                    <w:t>ter</w:t>
                   </w:r>
-                  <w:proofErr w:type="spellEnd"/>
+                  <w:r>
+                    <w:lastRenderedPageBreak/>
+                    <w:t>msOfUse</w:t>
+                  </w:r>
                   <w:r>
                     <w:t xml:space="preserve"> }}{% else %}(NONE){% endif %}</w:t>
                   </w:r>
@@ -11603,6 +11290,7 @@
           </w:tcPr>
           <w:p>
             <w:r>
+              <w:lastRenderedPageBreak/>
               <w:t>Require</w:t>
             </w:r>
           </w:p>
@@ -11716,11 +11404,7 @@
               </w:numPr>
             </w:pPr>
             <w:r>
-              <w:t xml:space="preserve">If there are restricted files and no Terms of Access, recommend including </w:t>
-            </w:r>
-            <w:r>
-              <w:lastRenderedPageBreak/>
-              <w:t>terms of access.</w:t>
+              <w:t>If there are restricted files and no Terms of Access, recommend including terms of access.</w:t>
             </w:r>
           </w:p>
           <w:p>
@@ -11757,22 +11441,13 @@
                 <w:rFonts w:hint="eastAsia"/>
                 <w:lang w:val="en-US"/>
               </w:rPr>
-              <w:lastRenderedPageBreak/>
               <w:t xml:space="preserve">{% if </w:t>
             </w:r>
-            <w:proofErr w:type="spellStart"/>
             <w:r>
               <w:rPr>
                 <w:lang w:val="en-US"/>
               </w:rPr>
-              <w:t>template_dict</w:t>
-            </w:r>
-            <w:proofErr w:type="spellEnd"/>
-            <w:r>
-              <w:rPr>
-                <w:lang w:val="en-US"/>
-              </w:rPr>
-              <w:t>.</w:t>
+              <w:t>template_dict.</w:t>
             </w:r>
             <w:r>
               <w:rPr>
@@ -11785,111 +11460,84 @@
               </w:rPr>
               <w:t xml:space="preserve"> </w:t>
             </w:r>
-            <w:proofErr w:type="spellStart"/>
             <w:r>
               <w:t>restricted_files</w:t>
             </w:r>
-            <w:proofErr w:type="spellEnd"/>
             <w:r>
               <w:rPr>
                 <w:lang w:val="en-US"/>
               </w:rPr>
-              <w:t>.</w:t>
-            </w:r>
-            <w:proofErr w:type="spellStart"/>
-            <w:r>
-              <w:rPr>
-                <w:lang w:val="en-US"/>
-              </w:rPr>
-              <w:t>comments</w:t>
+              <w:t>.comments</w:t>
             </w:r>
             <w:r>
               <w:rPr>
                 <w:rFonts w:hint="eastAsia"/>
                 <w:lang w:val="en-US"/>
               </w:rPr>
-              <w:t>|length</w:t>
-            </w:r>
-            <w:proofErr w:type="spellEnd"/>
+              <w:t>|length &gt;</w:t>
+            </w:r>
+            <w:r>
+              <w:rPr>
+                <w:lang w:val="en-US"/>
+              </w:rPr>
+              <w:t xml:space="preserve"> 0 </w:t>
+            </w:r>
             <w:r>
               <w:rPr>
                 <w:rFonts w:hint="eastAsia"/>
                 <w:lang w:val="en-US"/>
               </w:rPr>
-              <w:t xml:space="preserve"> &gt;</w:t>
+              <w:t xml:space="preserve">and </w:t>
+            </w:r>
+            <w:r>
+              <w:t>template_dict.terms_license.</w:t>
+            </w:r>
+            <w:r>
+              <w:t>termsOfAccess</w:t>
+            </w:r>
+            <w:r>
+              <w:t xml:space="preserve"> is not none</w:t>
             </w:r>
             <w:r>
               <w:rPr>
                 <w:lang w:val="en-US"/>
               </w:rPr>
-              <w:t xml:space="preserve"> 0 </w:t>
-            </w:r>
+              <w:t xml:space="preserve"> %}</w:t>
+            </w:r>
+            <w:r>
+              <w:t>X{% endif %}</w:t>
+            </w:r>
+          </w:p>
+        </w:tc>
+        <w:tc>
+          <w:tcPr>
+            <w:tcW w:w="0" w:type="auto"/>
+            <w:tcBorders>
+              <w:top w:val="single" w:sz="8" w:space="0" w:color="000000"/>
+              <w:left w:val="single" w:sz="8" w:space="0" w:color="000000"/>
+              <w:bottom w:val="single" w:sz="8" w:space="0" w:color="000000"/>
+              <w:right w:val="single" w:sz="8" w:space="0" w:color="000000"/>
+            </w:tcBorders>
+            <w:tcMar>
+              <w:top w:w="100" w:type="dxa"/>
+              <w:left w:w="100" w:type="dxa"/>
+              <w:bottom w:w="100" w:type="dxa"/>
+              <w:right w:w="100" w:type="dxa"/>
+            </w:tcMar>
+          </w:tcPr>
+          <w:p>
             <w:r>
               <w:rPr>
                 <w:rFonts w:hint="eastAsia"/>
                 <w:lang w:val="en-US"/>
               </w:rPr>
-              <w:t xml:space="preserve">and </w:t>
-            </w:r>
-            <w:proofErr w:type="spellStart"/>
-            <w:r>
-              <w:t>template_dict.terms_license.</w:t>
-            </w:r>
-            <w:r>
-              <w:t>termsOfAccess</w:t>
-            </w:r>
-            <w:proofErr w:type="spellEnd"/>
-            <w:r>
-              <w:t xml:space="preserve"> is not none</w:t>
+              <w:t xml:space="preserve">{% if </w:t>
             </w:r>
             <w:r>
               <w:rPr>
                 <w:lang w:val="en-US"/>
               </w:rPr>
-              <w:t xml:space="preserve"> %}</w:t>
-            </w:r>
-            <w:r>
-              <w:t>X{% endif %}</w:t>
-            </w:r>
-          </w:p>
-        </w:tc>
-        <w:tc>
-          <w:tcPr>
-            <w:tcW w:w="0" w:type="auto"/>
-            <w:tcBorders>
-              <w:top w:val="single" w:sz="8" w:space="0" w:color="000000"/>
-              <w:left w:val="single" w:sz="8" w:space="0" w:color="000000"/>
-              <w:bottom w:val="single" w:sz="8" w:space="0" w:color="000000"/>
-              <w:right w:val="single" w:sz="8" w:space="0" w:color="000000"/>
-            </w:tcBorders>
-            <w:tcMar>
-              <w:top w:w="100" w:type="dxa"/>
-              <w:left w:w="100" w:type="dxa"/>
-              <w:bottom w:w="100" w:type="dxa"/>
-              <w:right w:w="100" w:type="dxa"/>
-            </w:tcMar>
-          </w:tcPr>
-          <w:p>
-            <w:r>
-              <w:rPr>
-                <w:rFonts w:hint="eastAsia"/>
-                <w:lang w:val="en-US"/>
-              </w:rPr>
-              <w:t xml:space="preserve">{% if </w:t>
-            </w:r>
-            <w:proofErr w:type="spellStart"/>
-            <w:r>
-              <w:rPr>
-                <w:lang w:val="en-US"/>
-              </w:rPr>
-              <w:t>template_dict</w:t>
-            </w:r>
-            <w:proofErr w:type="spellEnd"/>
-            <w:r>
-              <w:rPr>
-                <w:lang w:val="en-US"/>
-              </w:rPr>
-              <w:t>.</w:t>
+              <w:t>template_dict.</w:t>
             </w:r>
             <w:r>
               <w:rPr>
@@ -11902,147 +11550,120 @@
               </w:rPr>
               <w:t xml:space="preserve"> </w:t>
             </w:r>
-            <w:proofErr w:type="spellStart"/>
             <w:r>
               <w:t>restricted_files</w:t>
             </w:r>
-            <w:proofErr w:type="spellEnd"/>
             <w:r>
               <w:rPr>
                 <w:lang w:val="en-US"/>
               </w:rPr>
-              <w:t>.</w:t>
-            </w:r>
-            <w:proofErr w:type="spellStart"/>
-            <w:r>
-              <w:rPr>
-                <w:lang w:val="en-US"/>
-              </w:rPr>
-              <w:t>comments</w:t>
+              <w:t>.comments</w:t>
             </w:r>
             <w:r>
               <w:rPr>
                 <w:rFonts w:hint="eastAsia"/>
                 <w:lang w:val="en-US"/>
               </w:rPr>
-              <w:t>|length</w:t>
-            </w:r>
-            <w:proofErr w:type="spellEnd"/>
+              <w:t>|length &gt;</w:t>
+            </w:r>
+            <w:r>
+              <w:rPr>
+                <w:lang w:val="en-US"/>
+              </w:rPr>
+              <w:t xml:space="preserve"> 0 </w:t>
+            </w:r>
             <w:r>
               <w:rPr>
                 <w:rFonts w:hint="eastAsia"/>
                 <w:lang w:val="en-US"/>
               </w:rPr>
-              <w:t xml:space="preserve"> &gt;</w:t>
+              <w:t xml:space="preserve">and </w:t>
+            </w:r>
+            <w:r>
+              <w:t>template_dict.terms_license.</w:t>
+            </w:r>
+            <w:r>
+              <w:t>termsOfAccess</w:t>
+            </w:r>
+            <w:r>
+              <w:t xml:space="preserve"> is none</w:t>
             </w:r>
             <w:r>
               <w:rPr>
                 <w:lang w:val="en-US"/>
               </w:rPr>
-              <w:t xml:space="preserve"> 0 </w:t>
-            </w:r>
+              <w:t xml:space="preserve"> %}</w:t>
+            </w:r>
+            <w:r>
+              <w:t>X{% endif %}</w:t>
+            </w:r>
+          </w:p>
+        </w:tc>
+        <w:tc>
+          <w:tcPr>
+            <w:tcW w:w="0" w:type="auto"/>
+            <w:tcBorders>
+              <w:top w:val="single" w:sz="8" w:space="0" w:color="000000"/>
+              <w:left w:val="single" w:sz="8" w:space="0" w:color="000000"/>
+              <w:bottom w:val="single" w:sz="8" w:space="0" w:color="000000"/>
+              <w:right w:val="single" w:sz="8" w:space="0" w:color="000000"/>
+            </w:tcBorders>
+            <w:tcMar>
+              <w:top w:w="100" w:type="dxa"/>
+              <w:left w:w="100" w:type="dxa"/>
+              <w:bottom w:w="100" w:type="dxa"/>
+              <w:right w:w="100" w:type="dxa"/>
+            </w:tcMar>
+          </w:tcPr>
+          <w:p/>
+        </w:tc>
+        <w:tc>
+          <w:tcPr>
+            <w:tcW w:w="0" w:type="auto"/>
+            <w:tcBorders>
+              <w:top w:val="single" w:sz="8" w:space="0" w:color="000000"/>
+              <w:left w:val="single" w:sz="8" w:space="0" w:color="000000"/>
+              <w:bottom w:val="single" w:sz="8" w:space="0" w:color="000000"/>
+              <w:right w:val="single" w:sz="8" w:space="0" w:color="000000"/>
+            </w:tcBorders>
+            <w:tcMar>
+              <w:top w:w="100" w:type="dxa"/>
+              <w:left w:w="100" w:type="dxa"/>
+              <w:bottom w:w="100" w:type="dxa"/>
+              <w:right w:w="100" w:type="dxa"/>
+            </w:tcMar>
+          </w:tcPr>
+          <w:p/>
+        </w:tc>
+        <w:tc>
+          <w:tcPr>
+            <w:tcW w:w="0" w:type="auto"/>
+            <w:tcBorders>
+              <w:top w:val="single" w:sz="8" w:space="0" w:color="000000"/>
+              <w:left w:val="single" w:sz="8" w:space="0" w:color="000000"/>
+              <w:bottom w:val="single" w:sz="8" w:space="0" w:color="000000"/>
+              <w:right w:val="single" w:sz="8" w:space="0" w:color="000000"/>
+            </w:tcBorders>
+            <w:tcMar>
+              <w:top w:w="100" w:type="dxa"/>
+              <w:left w:w="100" w:type="dxa"/>
+              <w:bottom w:w="100" w:type="dxa"/>
+              <w:right w:w="100" w:type="dxa"/>
+            </w:tcMar>
+          </w:tcPr>
+          <w:p>
             <w:r>
               <w:rPr>
                 <w:rFonts w:hint="eastAsia"/>
                 <w:lang w:val="en-US"/>
               </w:rPr>
-              <w:t xml:space="preserve">and </w:t>
-            </w:r>
-            <w:proofErr w:type="spellStart"/>
-            <w:r>
-              <w:t>template_dict.terms_license.</w:t>
-            </w:r>
-            <w:r>
-              <w:t>termsOfAccess</w:t>
-            </w:r>
-            <w:proofErr w:type="spellEnd"/>
-            <w:r>
-              <w:t xml:space="preserve"> is none</w:t>
+              <w:t xml:space="preserve">{% if </w:t>
             </w:r>
             <w:r>
               <w:rPr>
                 <w:lang w:val="en-US"/>
               </w:rPr>
-              <w:t xml:space="preserve"> %}</w:t>
-            </w:r>
-            <w:r>
-              <w:t>X{% endif %}</w:t>
-            </w:r>
-          </w:p>
-        </w:tc>
-        <w:tc>
-          <w:tcPr>
-            <w:tcW w:w="0" w:type="auto"/>
-            <w:tcBorders>
-              <w:top w:val="single" w:sz="8" w:space="0" w:color="000000"/>
-              <w:left w:val="single" w:sz="8" w:space="0" w:color="000000"/>
-              <w:bottom w:val="single" w:sz="8" w:space="0" w:color="000000"/>
-              <w:right w:val="single" w:sz="8" w:space="0" w:color="000000"/>
-            </w:tcBorders>
-            <w:tcMar>
-              <w:top w:w="100" w:type="dxa"/>
-              <w:left w:w="100" w:type="dxa"/>
-              <w:bottom w:w="100" w:type="dxa"/>
-              <w:right w:w="100" w:type="dxa"/>
-            </w:tcMar>
-          </w:tcPr>
-          <w:p/>
-        </w:tc>
-        <w:tc>
-          <w:tcPr>
-            <w:tcW w:w="0" w:type="auto"/>
-            <w:tcBorders>
-              <w:top w:val="single" w:sz="8" w:space="0" w:color="000000"/>
-              <w:left w:val="single" w:sz="8" w:space="0" w:color="000000"/>
-              <w:bottom w:val="single" w:sz="8" w:space="0" w:color="000000"/>
-              <w:right w:val="single" w:sz="8" w:space="0" w:color="000000"/>
-            </w:tcBorders>
-            <w:tcMar>
-              <w:top w:w="100" w:type="dxa"/>
-              <w:left w:w="100" w:type="dxa"/>
-              <w:bottom w:w="100" w:type="dxa"/>
-              <w:right w:w="100" w:type="dxa"/>
-            </w:tcMar>
-          </w:tcPr>
-          <w:p/>
-        </w:tc>
-        <w:tc>
-          <w:tcPr>
-            <w:tcW w:w="0" w:type="auto"/>
-            <w:tcBorders>
-              <w:top w:val="single" w:sz="8" w:space="0" w:color="000000"/>
-              <w:left w:val="single" w:sz="8" w:space="0" w:color="000000"/>
-              <w:bottom w:val="single" w:sz="8" w:space="0" w:color="000000"/>
-              <w:right w:val="single" w:sz="8" w:space="0" w:color="000000"/>
-            </w:tcBorders>
-            <w:tcMar>
-              <w:top w:w="100" w:type="dxa"/>
-              <w:left w:w="100" w:type="dxa"/>
-              <w:bottom w:w="100" w:type="dxa"/>
-              <w:right w:w="100" w:type="dxa"/>
-            </w:tcMar>
-          </w:tcPr>
-          <w:p>
-            <w:r>
-              <w:rPr>
-                <w:rFonts w:hint="eastAsia"/>
-                <w:lang w:val="en-US"/>
-              </w:rPr>
-              <w:t xml:space="preserve">{% if </w:t>
-            </w:r>
-            <w:proofErr w:type="spellStart"/>
-            <w:r>
-              <w:rPr>
-                <w:lang w:val="en-US"/>
-              </w:rPr>
-              <w:t>template_dict</w:t>
-            </w:r>
-            <w:proofErr w:type="spellEnd"/>
-            <w:r>
-              <w:rPr>
-                <w:lang w:val="en-US"/>
-              </w:rPr>
-              <w:t>.</w:t>
+              <w:t>template_dict.</w:t>
             </w:r>
             <w:r>
               <w:rPr>
@@ -12055,38 +11676,21 @@
               </w:rPr>
               <w:t xml:space="preserve"> </w:t>
             </w:r>
-            <w:proofErr w:type="spellStart"/>
             <w:r>
               <w:t>restricted_files</w:t>
             </w:r>
-            <w:proofErr w:type="spellEnd"/>
             <w:r>
               <w:rPr>
                 <w:lang w:val="en-US"/>
               </w:rPr>
-              <w:t>.</w:t>
-            </w:r>
-            <w:proofErr w:type="spellStart"/>
-            <w:r>
-              <w:rPr>
-                <w:lang w:val="en-US"/>
-              </w:rPr>
-              <w:t>comments</w:t>
+              <w:t>.comments</w:t>
             </w:r>
             <w:r>
               <w:rPr>
                 <w:rFonts w:hint="eastAsia"/>
                 <w:lang w:val="en-US"/>
               </w:rPr>
-              <w:t>|length</w:t>
-            </w:r>
-            <w:proofErr w:type="spellEnd"/>
-            <w:r>
-              <w:rPr>
-                <w:rFonts w:hint="eastAsia"/>
-                <w:lang w:val="en-US"/>
-              </w:rPr>
-              <w:t xml:space="preserve"> ==</w:t>
+              <w:t>|length ==</w:t>
             </w:r>
             <w:r>
               <w:rPr>
@@ -12146,7 +11750,7 @@
               <w:tblLook w:val="04A0" w:firstRow="1" w:lastRow="0" w:firstColumn="1" w:lastColumn="0" w:noHBand="0" w:noVBand="1"/>
             </w:tblPr>
             <w:tblGrid>
-              <w:gridCol w:w="3719"/>
+              <w:gridCol w:w="3826"/>
             </w:tblGrid>
             <w:tr>
               <w:tc>
@@ -12160,27 +11764,17 @@
                     </w:rPr>
                   </w:pPr>
                   <w:r>
-                    <w:t xml:space="preserve">{% if </w:t>
-                  </w:r>
-                  <w:proofErr w:type="spellStart"/>
-                  <w:r>
-                    <w:t>template_dict.terms_license.</w:t>
+                    <w:t>{% if template_dict.terms_license.</w:t>
                   </w:r>
                   <w:r>
                     <w:t>termsOfAccess</w:t>
                   </w:r>
-                  <w:proofErr w:type="spellEnd"/>
                   <w:r>
-                    <w:t xml:space="preserve"> is not none %}{{ </w:t>
-                  </w:r>
-                  <w:proofErr w:type="spellStart"/>
-                  <w:r>
-                    <w:t>template_dict.terms_license.</w:t>
+                    <w:t xml:space="preserve"> is not none %}{{ template_dict.terms_license.</w:t>
                   </w:r>
                   <w:r>
                     <w:t>termsOfAccess</w:t>
                   </w:r>
-                  <w:proofErr w:type="spellEnd"/>
                   <w:r>
                     <w:t xml:space="preserve"> }}{% else %}(NONE){% endif %}</w:t>
                   </w:r>
@@ -19627,7 +19221,6 @@
   <w:style w:type="character" w:default="1" w:styleId="DefaultParagraphFont">
     <w:name w:val="Default Paragraph Font"/>
     <w:uiPriority w:val="1"/>
-    <w:semiHidden/>
     <w:unhideWhenUsed/>
   </w:style>
   <w:style w:type="table" w:default="1" w:styleId="TableNormal">
@@ -19996,6 +19589,18 @@
       <w:shd w:val="clear" w:color="auto" w:fill="E1DFDD"/>
     </w:rPr>
   </w:style>
+  <w:style w:type="character" w:styleId="FollowedHyperlink">
+    <w:name w:val="FollowedHyperlink"/>
+    <w:basedOn w:val="DefaultParagraphFont"/>
+    <w:uiPriority w:val="99"/>
+    <w:semiHidden/>
+    <w:unhideWhenUsed/>
+    <w:rsid w:val="004D2E7A"/>
+    <w:rPr>
+      <w:color w:val="96607D" w:themeColor="followedHyperlink"/>
+      <w:u w:val="single"/>
+    </w:rPr>
+  </w:style>
 </w:styles>
 </file>
 

</xml_diff>

<commit_message>
Underlining the headers in each Curator’s Comments boxes  of medium and high-level list
</commit_message>
<xml_diff>
--- a/res/template_high.docx
+++ b/res/template_high.docx
@@ -100,6 +100,7 @@
               </w:rPr>
               <w:t xml:space="preserve">Ticket number: {{ </w:t>
             </w:r>
+            <w:proofErr w:type="spellStart"/>
             <w:r>
               <w:t>project_info</w:t>
             </w:r>
@@ -112,6 +113,7 @@
             <w:r>
               <w:t>ticket_number</w:t>
             </w:r>
+            <w:proofErr w:type="spellEnd"/>
             <w:r>
               <w:rPr>
                 <w:rFonts w:hint="eastAsia"/>
@@ -141,6 +143,7 @@
               </w:rPr>
               <w:t xml:space="preserve"> {{ </w:t>
             </w:r>
+            <w:proofErr w:type="spellStart"/>
             <w:r>
               <w:t>project_info</w:t>
             </w:r>
@@ -148,7 +151,14 @@
               <w:rPr>
                 <w:rFonts w:hint="eastAsia"/>
               </w:rPr>
-              <w:t>.curator_name }}</w:t>
+              <w:t>.curator_name</w:t>
+            </w:r>
+            <w:proofErr w:type="spellEnd"/>
+            <w:r>
+              <w:rPr>
+                <w:rFonts w:hint="eastAsia"/>
+              </w:rPr>
+              <w:t xml:space="preserve"> }}</w:t>
             </w:r>
           </w:p>
           <w:p>
@@ -161,6 +171,7 @@
               </w:rPr>
               <w:t xml:space="preserve">Curator email: {{ </w:t>
             </w:r>
+            <w:proofErr w:type="spellStart"/>
             <w:r>
               <w:t>project_info</w:t>
             </w:r>
@@ -173,6 +184,7 @@
             <w:r>
               <w:t>curator_email</w:t>
             </w:r>
+            <w:proofErr w:type="spellEnd"/>
             <w:r>
               <w:rPr>
                 <w:rFonts w:hint="eastAsia"/>
@@ -188,11 +200,19 @@
               <w:rPr>
                 <w:rFonts w:hint="eastAsia"/>
               </w:rPr>
-              <w:t>Dataset title: {{ dataset.</w:t>
+              <w:t xml:space="preserve">Dataset title: {{ </w:t>
+            </w:r>
+            <w:proofErr w:type="spellStart"/>
+            <w:r>
+              <w:rPr>
+                <w:rFonts w:hint="eastAsia"/>
+              </w:rPr>
+              <w:t>dataset.</w:t>
             </w:r>
             <w:r>
               <w:t>DatasetTitle</w:t>
             </w:r>
+            <w:proofErr w:type="spellEnd"/>
             <w:r>
               <w:rPr>
                 <w:rFonts w:hint="eastAsia"/>
@@ -217,11 +237,19 @@
               <w:rPr>
                 <w:rFonts w:hint="eastAsia"/>
               </w:rPr>
-              <w:t xml:space="preserve"> identifier: {{ dataset.</w:t>
+              <w:t xml:space="preserve"> identifier: {{ </w:t>
+            </w:r>
+            <w:proofErr w:type="spellStart"/>
+            <w:r>
+              <w:rPr>
+                <w:rFonts w:hint="eastAsia"/>
+              </w:rPr>
+              <w:t>dataset.</w:t>
             </w:r>
             <w:r>
               <w:t>DatasetPersistentId</w:t>
             </w:r>
+            <w:proofErr w:type="spellEnd"/>
             <w:r>
               <w:rPr>
                 <w:rFonts w:hint="eastAsia"/>
@@ -248,11 +276,19 @@
               <w:rPr>
                 <w:rFonts w:hint="eastAsia"/>
               </w:rPr>
-              <w:t>Dataset access URL: {{ dataset.</w:t>
+              <w:t xml:space="preserve">Dataset access URL: {{ </w:t>
+            </w:r>
+            <w:proofErr w:type="spellStart"/>
+            <w:r>
+              <w:rPr>
+                <w:rFonts w:hint="eastAsia"/>
+              </w:rPr>
+              <w:t>dataset.</w:t>
             </w:r>
             <w:r>
               <w:t>DatasetURL</w:t>
             </w:r>
+            <w:proofErr w:type="spellEnd"/>
             <w:r>
               <w:rPr>
                 <w:rFonts w:hint="eastAsia"/>
@@ -1146,12 +1182,57 @@
             </w:tcMar>
             <w:hideMark/>
           </w:tcPr>
+          <w:p/>
+        </w:tc>
+        <w:tc>
+          <w:tcPr>
+            <w:tcW w:w="0" w:type="auto"/>
+            <w:tcBorders>
+              <w:top w:val="single" w:sz="8" w:space="0" w:color="000000"/>
+              <w:left w:val="single" w:sz="8" w:space="0" w:color="000000"/>
+              <w:bottom w:val="single" w:sz="8" w:space="0" w:color="000000"/>
+              <w:right w:val="single" w:sz="8" w:space="0" w:color="000000"/>
+            </w:tcBorders>
+            <w:shd w:val="clear" w:color="auto" w:fill="EFEFEF"/>
+            <w:tcMar>
+              <w:top w:w="100" w:type="dxa"/>
+              <w:left w:w="100" w:type="dxa"/>
+              <w:bottom w:w="100" w:type="dxa"/>
+              <w:right w:w="100" w:type="dxa"/>
+            </w:tcMar>
+            <w:hideMark/>
+          </w:tcPr>
+          <w:p/>
+        </w:tc>
+        <w:tc>
+          <w:tcPr>
+            <w:tcW w:w="0" w:type="auto"/>
+            <w:tcBorders>
+              <w:top w:val="single" w:sz="8" w:space="0" w:color="000000"/>
+              <w:left w:val="single" w:sz="8" w:space="0" w:color="000000"/>
+              <w:bottom w:val="single" w:sz="8" w:space="0" w:color="000000"/>
+              <w:right w:val="single" w:sz="8" w:space="0" w:color="000000"/>
+            </w:tcBorders>
+            <w:shd w:val="clear" w:color="auto" w:fill="EFEFEF"/>
+            <w:tcMar>
+              <w:top w:w="100" w:type="dxa"/>
+              <w:left w:w="100" w:type="dxa"/>
+              <w:bottom w:w="100" w:type="dxa"/>
+              <w:right w:w="100" w:type="dxa"/>
+            </w:tcMar>
+          </w:tcPr>
           <w:p>
             <w:pPr>
               <w:rPr>
                 <w:lang w:val="en-US"/>
               </w:rPr>
             </w:pPr>
+            <w:r>
+              <w:rPr>
+                <w:lang w:val="en-US"/>
+              </w:rPr>
+              <w:t>X</w:t>
+            </w:r>
           </w:p>
         </w:tc>
         <w:tc>
@@ -1172,25 +1253,6 @@
             </w:tcMar>
             <w:hideMark/>
           </w:tcPr>
-          <w:p/>
-        </w:tc>
-        <w:tc>
-          <w:tcPr>
-            <w:tcW w:w="0" w:type="auto"/>
-            <w:tcBorders>
-              <w:top w:val="single" w:sz="8" w:space="0" w:color="000000"/>
-              <w:left w:val="single" w:sz="8" w:space="0" w:color="000000"/>
-              <w:bottom w:val="single" w:sz="8" w:space="0" w:color="000000"/>
-              <w:right w:val="single" w:sz="8" w:space="0" w:color="000000"/>
-            </w:tcBorders>
-            <w:shd w:val="clear" w:color="auto" w:fill="EFEFEF"/>
-            <w:tcMar>
-              <w:top w:w="100" w:type="dxa"/>
-              <w:left w:w="100" w:type="dxa"/>
-              <w:bottom w:w="100" w:type="dxa"/>
-              <w:right w:w="100" w:type="dxa"/>
-            </w:tcMar>
-          </w:tcPr>
           <w:p>
             <w:pPr>
               <w:rPr>
@@ -1199,44 +1261,44 @@
             </w:pPr>
             <w:r>
               <w:rPr>
-                <w:lang w:val="en-US"/>
-              </w:rPr>
-              <w:t>X</w:t>
-            </w:r>
-          </w:p>
-        </w:tc>
-        <w:tc>
-          <w:tcPr>
-            <w:tcW w:w="0" w:type="auto"/>
-            <w:tcBorders>
-              <w:top w:val="single" w:sz="8" w:space="0" w:color="000000"/>
-              <w:left w:val="single" w:sz="8" w:space="0" w:color="000000"/>
-              <w:bottom w:val="single" w:sz="8" w:space="0" w:color="000000"/>
-              <w:right w:val="single" w:sz="8" w:space="0" w:color="000000"/>
-            </w:tcBorders>
-            <w:shd w:val="clear" w:color="auto" w:fill="EFEFEF"/>
-            <w:tcMar>
-              <w:top w:w="100" w:type="dxa"/>
-              <w:left w:w="100" w:type="dxa"/>
-              <w:bottom w:w="100" w:type="dxa"/>
-              <w:right w:w="100" w:type="dxa"/>
-            </w:tcMar>
-            <w:hideMark/>
-          </w:tcPr>
-          <w:p>
-            <w:pPr>
-              <w:rPr>
-                <w:lang w:val="en-US"/>
-              </w:rPr>
-            </w:pPr>
-            <w:r>
-              <w:rPr>
-                <w:lang w:val="en-US"/>
-              </w:rPr>
-              <w:t>If applicable, list any previously created dataverse that contains the depositors' dataset</w:t>
-            </w:r>
-            <w:r>
-              <w:rPr>
+                <w:u w:val="single"/>
+                <w:lang w:val="en-US"/>
+              </w:rPr>
+              <w:t xml:space="preserve">If applicable, list any previously created </w:t>
+            </w:r>
+            <w:proofErr w:type="spellStart"/>
+            <w:r>
+              <w:rPr>
+                <w:u w:val="single"/>
+                <w:lang w:val="en-US"/>
+              </w:rPr>
+              <w:t>dataverse</w:t>
+            </w:r>
+            <w:proofErr w:type="spellEnd"/>
+            <w:r>
+              <w:rPr>
+                <w:u w:val="single"/>
+                <w:lang w:val="en-US"/>
+              </w:rPr>
+              <w:t xml:space="preserve"> that </w:t>
+            </w:r>
+            <w:r>
+              <w:rPr>
+                <w:u w:val="single"/>
+                <w:lang w:val="en-US"/>
+              </w:rPr>
+              <w:t>contain</w:t>
+            </w:r>
+            <w:r>
+              <w:rPr>
+                <w:u w:val="single"/>
+                <w:lang w:val="en-US"/>
+              </w:rPr>
+              <w:t xml:space="preserve"> the depositors' dataset</w:t>
+            </w:r>
+            <w:r>
+              <w:rPr>
+                <w:u w:val="single"/>
                 <w:lang w:val="en-US"/>
               </w:rPr>
               <w:t>:</w:t>
@@ -1248,12 +1310,36 @@
               <w:br/>
             </w:r>
             <w:r>
-              <w:t xml:space="preserve">{% for item in template_dict.dv_record.comments %} </w:t>
-            </w:r>
-          </w:p>
-          <w:p>
-            <w:r>
-              <w:t>{% for author, dataverses in item.items() %} {{ author }}</w:t>
+              <w:t xml:space="preserve">{% for item in </w:t>
+            </w:r>
+            <w:proofErr w:type="spellStart"/>
+            <w:r>
+              <w:t>template_dict.dv_record.comments</w:t>
+            </w:r>
+            <w:proofErr w:type="spellEnd"/>
+            <w:r>
+              <w:t xml:space="preserve"> %} </w:t>
+            </w:r>
+          </w:p>
+          <w:p>
+            <w:r>
+              <w:t xml:space="preserve">{% for author, </w:t>
+            </w:r>
+            <w:proofErr w:type="spellStart"/>
+            <w:r>
+              <w:t>dataverses</w:t>
+            </w:r>
+            <w:proofErr w:type="spellEnd"/>
+            <w:r>
+              <w:t xml:space="preserve"> in </w:t>
+            </w:r>
+            <w:proofErr w:type="spellStart"/>
+            <w:r>
+              <w:t>item.items</w:t>
+            </w:r>
+            <w:proofErr w:type="spellEnd"/>
+            <w:r>
+              <w:t>() %} {{ author }}</w:t>
             </w:r>
             <w:r>
               <w:rPr>
@@ -1264,10 +1350,26 @@
           </w:p>
           <w:p>
             <w:r>
-              <w:t xml:space="preserve">{% for dataverse in dataverses %} </w:t>
-            </w:r>
-            <w:r>
-              <w:t>{{ loop.index }}.</w:t>
+              <w:t xml:space="preserve">{% for dataverse in </w:t>
+            </w:r>
+            <w:proofErr w:type="spellStart"/>
+            <w:r>
+              <w:t>dataverses</w:t>
+            </w:r>
+            <w:proofErr w:type="spellEnd"/>
+            <w:r>
+              <w:t xml:space="preserve"> %} </w:t>
+            </w:r>
+            <w:r>
+              <w:t xml:space="preserve">{{ </w:t>
+            </w:r>
+            <w:proofErr w:type="spellStart"/>
+            <w:r>
+              <w:t>loop.index</w:t>
+            </w:r>
+            <w:proofErr w:type="spellEnd"/>
+            <w:r>
+              <w:t xml:space="preserve"> }}.</w:t>
             </w:r>
             <w:r>
               <w:rPr>
@@ -1282,13 +1384,37 @@
               <w:br/>
             </w:r>
             <w:r>
-              <w:t xml:space="preserve">{% endfor %} </w:t>
+              <w:t xml:space="preserve">{% </w:t>
+            </w:r>
+            <w:proofErr w:type="spellStart"/>
+            <w:r>
+              <w:t>endfor</w:t>
+            </w:r>
+            <w:proofErr w:type="spellEnd"/>
+            <w:r>
+              <w:t xml:space="preserve"> %} </w:t>
             </w:r>
             <w:r>
               <w:br/>
             </w:r>
             <w:r>
-              <w:t>{% endfor %} {% endfor %}</w:t>
+              <w:t xml:space="preserve">{% </w:t>
+            </w:r>
+            <w:proofErr w:type="spellStart"/>
+            <w:r>
+              <w:t>endfor</w:t>
+            </w:r>
+            <w:proofErr w:type="spellEnd"/>
+            <w:r>
+              <w:t xml:space="preserve"> %} {% </w:t>
+            </w:r>
+            <w:proofErr w:type="spellStart"/>
+            <w:r>
+              <w:t>endfor</w:t>
+            </w:r>
+            <w:proofErr w:type="spellEnd"/>
+            <w:r>
+              <w:t xml:space="preserve"> %}</w:t>
             </w:r>
           </w:p>
         </w:tc>
@@ -1565,19 +1691,23 @@
             <w:r>
               <w:rPr>
                 <w:rFonts w:hint="eastAsia"/>
+                <w:u w:val="single"/>
                 <w:lang w:val="en-US"/>
               </w:rPr>
               <w:t xml:space="preserve">List the </w:t>
             </w:r>
             <w:r>
               <w:rPr>
+                <w:u w:val="single"/>
                 <w:lang w:val="en-US"/>
               </w:rPr>
               <w:t xml:space="preserve">parent </w:t>
             </w:r>
+            <w:proofErr w:type="spellStart"/>
             <w:r>
               <w:rPr>
                 <w:rFonts w:hint="eastAsia"/>
+                <w:u w:val="single"/>
                 <w:lang w:val="en-US"/>
               </w:rPr>
               <w:t>d</w:t>
@@ -1585,12 +1715,23 @@
             <w:r>
               <w:rPr>
                 <w:rFonts w:hint="eastAsia"/>
-                <w:lang w:val="en-US"/>
-              </w:rPr>
-              <w:t xml:space="preserve">ataverse </w:t>
-            </w:r>
-            <w:r>
-              <w:rPr>
+                <w:u w:val="single"/>
+                <w:lang w:val="en-US"/>
+              </w:rPr>
+              <w:t>ataverse</w:t>
+            </w:r>
+            <w:proofErr w:type="spellEnd"/>
+            <w:r>
+              <w:rPr>
+                <w:rFonts w:hint="eastAsia"/>
+                <w:u w:val="single"/>
+                <w:lang w:val="en-US"/>
+              </w:rPr>
+              <w:t xml:space="preserve"> </w:t>
+            </w:r>
+            <w:r>
+              <w:rPr>
+                <w:u w:val="single"/>
                 <w:lang w:val="en-US"/>
               </w:rPr>
               <w:t>collection</w:t>
@@ -1598,6 +1739,7 @@
             <w:r>
               <w:rPr>
                 <w:rFonts w:hint="eastAsia"/>
+                <w:u w:val="single"/>
                 <w:lang w:val="en-US"/>
               </w:rPr>
               <w:t xml:space="preserve"> name:</w:t>
@@ -1615,15 +1757,18 @@
               </w:rPr>
               <w:t xml:space="preserve">{{ </w:t>
             </w:r>
+            <w:proofErr w:type="spellStart"/>
             <w:r>
               <w:t>template_dict</w:t>
             </w:r>
+            <w:proofErr w:type="spellEnd"/>
             <w:r>
               <w:rPr>
                 <w:rFonts w:hint="eastAsia"/>
               </w:rPr>
               <w:t>.</w:t>
             </w:r>
+            <w:proofErr w:type="spellStart"/>
             <w:r>
               <w:rPr>
                 <w:lang w:val="en-US"/>
@@ -1642,6 +1787,7 @@
               </w:rPr>
               <w:t>parentDataverseName</w:t>
             </w:r>
+            <w:proofErr w:type="spellEnd"/>
             <w:r>
               <w:rPr>
                 <w:rFonts w:hint="eastAsia"/>
@@ -1651,9 +1797,18 @@
           </w:p>
           <w:p>
             <w:r>
+              <w:rPr>
+                <w:u w:val="single"/>
+              </w:rPr>
               <w:t>List the dataset (full) path in the Dataverse repository</w:t>
             </w:r>
             <w:r>
+              <w:rPr>
+                <w:u w:val="single"/>
+              </w:rPr>
+              <w:t>:</w:t>
+            </w:r>
+            <w:r>
               <w:br/>
             </w:r>
             <w:r>
@@ -1662,15 +1817,22 @@
               </w:rPr>
               <w:t xml:space="preserve">{{ </w:t>
             </w:r>
-            <w:r>
-              <w:t>template_dict.</w:t>
-            </w:r>
+            <w:proofErr w:type="spellStart"/>
+            <w:r>
+              <w:t>template_dict</w:t>
+            </w:r>
+            <w:proofErr w:type="spellEnd"/>
+            <w:r>
+              <w:t>.</w:t>
+            </w:r>
+            <w:proofErr w:type="spellStart"/>
             <w:r>
               <w:rPr>
                 <w:lang w:val="en-US"/>
               </w:rPr>
               <w:t>ds_tree_info.path</w:t>
             </w:r>
+            <w:proofErr w:type="spellEnd"/>
             <w:r>
               <w:t>}}</w:t>
             </w:r>
@@ -1969,7 +2131,15 @@
             <w:hideMark/>
           </w:tcPr>
           <w:p>
-            <w:r>
+            <w:pPr>
+              <w:rPr>
+                <w:u w:val="single"/>
+              </w:rPr>
+            </w:pPr>
+            <w:r>
+              <w:rPr>
+                <w:u w:val="single"/>
+              </w:rPr>
               <w:t>Curator’s comments:</w:t>
             </w:r>
           </w:p>
@@ -2408,33 +2578,61 @@
               <w:rPr>
                 <w:lang w:val="en-US"/>
               </w:rPr>
-              <w:t>{% if template_dict.file_ext.comments|length == 0 %}X{% endif %}</w:t>
-            </w:r>
-          </w:p>
-        </w:tc>
-        <w:tc>
-          <w:tcPr>
-            <w:tcW w:w="0" w:type="auto"/>
-            <w:tcBorders>
-              <w:top w:val="single" w:sz="8" w:space="0" w:color="000000"/>
-              <w:left w:val="single" w:sz="8" w:space="0" w:color="000000"/>
-              <w:bottom w:val="single" w:sz="8" w:space="0" w:color="000000"/>
-              <w:right w:val="single" w:sz="8" w:space="0" w:color="000000"/>
-            </w:tcBorders>
-            <w:tcMar>
-              <w:top w:w="100" w:type="dxa"/>
-              <w:left w:w="100" w:type="dxa"/>
-              <w:bottom w:w="100" w:type="dxa"/>
-              <w:right w:w="100" w:type="dxa"/>
-            </w:tcMar>
-            <w:hideMark/>
-          </w:tcPr>
-          <w:p>
-            <w:r>
-              <w:rPr>
-                <w:lang w:val="en-US"/>
-              </w:rPr>
-              <w:t>{% if template_dict.file_ext.comments|length &gt; 0 %}X{% endif %}</w:t>
+              <w:t xml:space="preserve">{% if </w:t>
+            </w:r>
+            <w:proofErr w:type="spellStart"/>
+            <w:r>
+              <w:rPr>
+                <w:lang w:val="en-US"/>
+              </w:rPr>
+              <w:t>template_dict.file_ext.comments|length</w:t>
+            </w:r>
+            <w:proofErr w:type="spellEnd"/>
+            <w:r>
+              <w:rPr>
+                <w:lang w:val="en-US"/>
+              </w:rPr>
+              <w:t xml:space="preserve"> == 0 %}X{% endif %}</w:t>
+            </w:r>
+          </w:p>
+        </w:tc>
+        <w:tc>
+          <w:tcPr>
+            <w:tcW w:w="0" w:type="auto"/>
+            <w:tcBorders>
+              <w:top w:val="single" w:sz="8" w:space="0" w:color="000000"/>
+              <w:left w:val="single" w:sz="8" w:space="0" w:color="000000"/>
+              <w:bottom w:val="single" w:sz="8" w:space="0" w:color="000000"/>
+              <w:right w:val="single" w:sz="8" w:space="0" w:color="000000"/>
+            </w:tcBorders>
+            <w:tcMar>
+              <w:top w:w="100" w:type="dxa"/>
+              <w:left w:w="100" w:type="dxa"/>
+              <w:bottom w:w="100" w:type="dxa"/>
+              <w:right w:w="100" w:type="dxa"/>
+            </w:tcMar>
+            <w:hideMark/>
+          </w:tcPr>
+          <w:p>
+            <w:r>
+              <w:rPr>
+                <w:lang w:val="en-US"/>
+              </w:rPr>
+              <w:t xml:space="preserve">{% if </w:t>
+            </w:r>
+            <w:proofErr w:type="spellStart"/>
+            <w:r>
+              <w:rPr>
+                <w:lang w:val="en-US"/>
+              </w:rPr>
+              <w:t>template_dict.file_ext.comments|length</w:t>
+            </w:r>
+            <w:proofErr w:type="spellEnd"/>
+            <w:r>
+              <w:rPr>
+                <w:lang w:val="en-US"/>
+              </w:rPr>
+              <w:t xml:space="preserve"> &gt; 0 %}X{% endif %}</w:t>
             </w:r>
           </w:p>
         </w:tc>
@@ -2519,6 +2717,7 @@
             </w:pPr>
             <w:r>
               <w:rPr>
+                <w:u w:val="single"/>
                 <w:lang w:val="en-US"/>
               </w:rPr>
               <w:t>List all files that did not open correctly:</w:t>
@@ -2532,12 +2731,14 @@
             <w:r>
               <w:t xml:space="preserve">{% if </w:t>
             </w:r>
+            <w:proofErr w:type="spellStart"/>
             <w:r>
               <w:rPr>
                 <w:lang w:val="en-US"/>
               </w:rPr>
               <w:t>template_dict.file_open.comments</w:t>
             </w:r>
+            <w:proofErr w:type="spellEnd"/>
             <w:r>
               <w:t xml:space="preserve"> |length &gt; 0</w:t>
             </w:r>
@@ -2548,7 +2749,21 @@
               <w:rPr>
                 <w:lang w:val="en-US"/>
               </w:rPr>
-              <w:t>{% for item in template_dict.file_open.comments %}</w:t>
+              <w:t xml:space="preserve">{% for item in </w:t>
+            </w:r>
+            <w:proofErr w:type="spellStart"/>
+            <w:r>
+              <w:rPr>
+                <w:lang w:val="en-US"/>
+              </w:rPr>
+              <w:t>template_dict.file_open.comments</w:t>
+            </w:r>
+            <w:proofErr w:type="spellEnd"/>
+            <w:r>
+              <w:rPr>
+                <w:lang w:val="en-US"/>
+              </w:rPr>
+              <w:t xml:space="preserve"> %}</w:t>
             </w:r>
           </w:p>
           <w:p>
@@ -2566,7 +2781,35 @@
               <w:rPr>
                 <w:lang w:val="en-US"/>
               </w:rPr>
-              <w:t>{{ item.file_name }}{% endfor %}</w:t>
+              <w:t xml:space="preserve">{{ </w:t>
+            </w:r>
+            <w:proofErr w:type="spellStart"/>
+            <w:r>
+              <w:rPr>
+                <w:lang w:val="en-US"/>
+              </w:rPr>
+              <w:t>item.file_name</w:t>
+            </w:r>
+            <w:proofErr w:type="spellEnd"/>
+            <w:r>
+              <w:rPr>
+                <w:lang w:val="en-US"/>
+              </w:rPr>
+              <w:t xml:space="preserve"> }}{% </w:t>
+            </w:r>
+            <w:proofErr w:type="spellStart"/>
+            <w:r>
+              <w:rPr>
+                <w:lang w:val="en-US"/>
+              </w:rPr>
+              <w:t>endfor</w:t>
+            </w:r>
+            <w:proofErr w:type="spellEnd"/>
+            <w:r>
+              <w:rPr>
+                <w:lang w:val="en-US"/>
+              </w:rPr>
+              <w:t xml:space="preserve"> %}</w:t>
             </w:r>
           </w:p>
           <w:p>
@@ -2587,6 +2830,7 @@
             </w:pPr>
             <w:r>
               <w:rPr>
+                <w:u w:val="single"/>
                 <w:lang w:val="en-US"/>
               </w:rPr>
               <w:t>List all files that were not checked:</w:t>
@@ -2600,12 +2844,14 @@
             <w:r>
               <w:t xml:space="preserve">{% if </w:t>
             </w:r>
+            <w:proofErr w:type="spellStart"/>
             <w:r>
               <w:rPr>
                 <w:lang w:val="en-US"/>
               </w:rPr>
               <w:t>template_dict.file_open.not_checked</w:t>
             </w:r>
+            <w:proofErr w:type="spellEnd"/>
             <w:r>
               <w:t xml:space="preserve"> |length &gt; 0</w:t>
             </w:r>
@@ -2616,7 +2862,21 @@
               <w:rPr>
                 <w:lang w:val="en-US"/>
               </w:rPr>
-              <w:t>{% for item in template_dict.file_open.not_checked %}</w:t>
+              <w:t xml:space="preserve">{% for item in </w:t>
+            </w:r>
+            <w:proofErr w:type="spellStart"/>
+            <w:r>
+              <w:rPr>
+                <w:lang w:val="en-US"/>
+              </w:rPr>
+              <w:t>template_dict.file_open.not_checked</w:t>
+            </w:r>
+            <w:proofErr w:type="spellEnd"/>
+            <w:r>
+              <w:rPr>
+                <w:lang w:val="en-US"/>
+              </w:rPr>
+              <w:t xml:space="preserve"> %}</w:t>
             </w:r>
           </w:p>
           <w:p>
@@ -2634,7 +2894,35 @@
               <w:rPr>
                 <w:lang w:val="en-US"/>
               </w:rPr>
-              <w:t>{{ item.file_name }}{% endfor %}</w:t>
+              <w:t xml:space="preserve">{{ </w:t>
+            </w:r>
+            <w:proofErr w:type="spellStart"/>
+            <w:r>
+              <w:rPr>
+                <w:lang w:val="en-US"/>
+              </w:rPr>
+              <w:t>item.file_name</w:t>
+            </w:r>
+            <w:proofErr w:type="spellEnd"/>
+            <w:r>
+              <w:rPr>
+                <w:lang w:val="en-US"/>
+              </w:rPr>
+              <w:t xml:space="preserve"> }}{% </w:t>
+            </w:r>
+            <w:proofErr w:type="spellStart"/>
+            <w:r>
+              <w:rPr>
+                <w:lang w:val="en-US"/>
+              </w:rPr>
+              <w:t>endfor</w:t>
+            </w:r>
+            <w:proofErr w:type="spellEnd"/>
+            <w:r>
+              <w:rPr>
+                <w:lang w:val="en-US"/>
+              </w:rPr>
+              <w:t xml:space="preserve"> %}</w:t>
             </w:r>
           </w:p>
           <w:p>
@@ -2817,7 +3105,21 @@
               <w:rPr>
                 <w:lang w:val="en-US"/>
               </w:rPr>
-              <w:t>{% if template_dict.special_characters.comments|length == 0 %}X{% endif %}</w:t>
+              <w:t xml:space="preserve">{% if </w:t>
+            </w:r>
+            <w:proofErr w:type="spellStart"/>
+            <w:r>
+              <w:rPr>
+                <w:lang w:val="en-US"/>
+              </w:rPr>
+              <w:t>template_dict.special_characters.comments|length</w:t>
+            </w:r>
+            <w:proofErr w:type="spellEnd"/>
+            <w:r>
+              <w:rPr>
+                <w:lang w:val="en-US"/>
+              </w:rPr>
+              <w:t xml:space="preserve"> == 0 %}X{% endif %}</w:t>
             </w:r>
           </w:p>
         </w:tc>
@@ -2864,7 +3166,21 @@
               <w:rPr>
                 <w:lang w:val="en-US"/>
               </w:rPr>
-              <w:t>{% if template_dict.special_characters.comments|length &gt; 0 %}X{% endif %}</w:t>
+              <w:t xml:space="preserve">{% if </w:t>
+            </w:r>
+            <w:proofErr w:type="spellStart"/>
+            <w:r>
+              <w:rPr>
+                <w:lang w:val="en-US"/>
+              </w:rPr>
+              <w:t>template_dict.special_characters.comments|length</w:t>
+            </w:r>
+            <w:proofErr w:type="spellEnd"/>
+            <w:r>
+              <w:rPr>
+                <w:lang w:val="en-US"/>
+              </w:rPr>
+              <w:t xml:space="preserve"> &gt; 0 %}X{% endif %}</w:t>
             </w:r>
           </w:p>
         </w:tc>
@@ -2933,6 +3249,7 @@
             </w:pPr>
             <w:r>
               <w:rPr>
+                <w:u w:val="single"/>
                 <w:lang w:val="en-US"/>
               </w:rPr>
               <w:t>List all files that contain special characters:</w:t>
@@ -2944,7 +3261,11 @@
               <w:br/>
             </w:r>
             <w:r>
-              <w:t>{% if template_dict.restricted_files.comment</w:t>
+              <w:t xml:space="preserve">{% if </w:t>
+            </w:r>
+            <w:proofErr w:type="spellStart"/>
+            <w:r>
+              <w:t>template_dict.restricted_files.comment</w:t>
             </w:r>
             <w:r>
               <w:rPr>
@@ -2953,7 +3274,11 @@
               <w:t>s</w:t>
             </w:r>
             <w:r>
-              <w:t>|length &gt; 0</w:t>
+              <w:t>|length</w:t>
+            </w:r>
+            <w:proofErr w:type="spellEnd"/>
+            <w:r>
+              <w:t xml:space="preserve"> &gt; 0</w:t>
             </w:r>
             <w:r>
               <w:t xml:space="preserve"> %}</w:t>
@@ -2962,7 +3287,21 @@
               <w:rPr>
                 <w:lang w:val="en-US"/>
               </w:rPr>
-              <w:t>{% for item in template_dict.special_characters.comments %}</w:t>
+              <w:t xml:space="preserve">{% for item in </w:t>
+            </w:r>
+            <w:proofErr w:type="spellStart"/>
+            <w:r>
+              <w:rPr>
+                <w:lang w:val="en-US"/>
+              </w:rPr>
+              <w:t>template_dict.special_characters.comments</w:t>
+            </w:r>
+            <w:proofErr w:type="spellEnd"/>
+            <w:r>
+              <w:rPr>
+                <w:lang w:val="en-US"/>
+              </w:rPr>
+              <w:t xml:space="preserve"> %}</w:t>
             </w:r>
           </w:p>
           <w:p>
@@ -2977,7 +3316,35 @@
               <w:rPr>
                 <w:lang w:val="en-US"/>
               </w:rPr>
-              <w:t>{{ item.file_name }}{% endfor %}</w:t>
+              <w:t xml:space="preserve">{{ </w:t>
+            </w:r>
+            <w:proofErr w:type="spellStart"/>
+            <w:r>
+              <w:rPr>
+                <w:lang w:val="en-US"/>
+              </w:rPr>
+              <w:t>item.file_name</w:t>
+            </w:r>
+            <w:proofErr w:type="spellEnd"/>
+            <w:r>
+              <w:rPr>
+                <w:lang w:val="en-US"/>
+              </w:rPr>
+              <w:t xml:space="preserve"> }}{% </w:t>
+            </w:r>
+            <w:proofErr w:type="spellStart"/>
+            <w:r>
+              <w:rPr>
+                <w:lang w:val="en-US"/>
+              </w:rPr>
+              <w:t>endfor</w:t>
+            </w:r>
+            <w:proofErr w:type="spellEnd"/>
+            <w:r>
+              <w:rPr>
+                <w:lang w:val="en-US"/>
+              </w:rPr>
+              <w:t xml:space="preserve"> %}</w:t>
             </w:r>
           </w:p>
           <w:p>
@@ -3153,7 +3520,14 @@
               <w:rPr>
                 <w:lang w:val="en-US"/>
               </w:rPr>
-              <w:t>{% if template_dict.</w:t>
+              <w:t xml:space="preserve">{% if </w:t>
+            </w:r>
+            <w:proofErr w:type="spellStart"/>
+            <w:r>
+              <w:rPr>
+                <w:lang w:val="en-US"/>
+              </w:rPr>
+              <w:t>template_dict.</w:t>
             </w:r>
             <w:r>
               <w:rPr>
@@ -3166,7 +3540,14 @@
               <w:rPr>
                 <w:lang w:val="en-US"/>
               </w:rPr>
-              <w:t xml:space="preserve">.comments|length </w:t>
+              <w:t>.comments|length</w:t>
+            </w:r>
+            <w:proofErr w:type="spellEnd"/>
+            <w:r>
+              <w:rPr>
+                <w:lang w:val="en-US"/>
+              </w:rPr>
+              <w:t xml:space="preserve"> </w:t>
             </w:r>
             <w:r>
               <w:rPr>
@@ -3206,7 +3587,21 @@
               <w:rPr>
                 <w:lang w:val="en-US"/>
               </w:rPr>
-              <w:t>{% if template_dict.file_ext.comments|length &gt; 0 %}X{% endif %}</w:t>
+              <w:t xml:space="preserve">{% if </w:t>
+            </w:r>
+            <w:proofErr w:type="spellStart"/>
+            <w:r>
+              <w:rPr>
+                <w:lang w:val="en-US"/>
+              </w:rPr>
+              <w:t>template_dict.file_ext.comments|length</w:t>
+            </w:r>
+            <w:proofErr w:type="spellEnd"/>
+            <w:r>
+              <w:rPr>
+                <w:lang w:val="en-US"/>
+              </w:rPr>
+              <w:t xml:space="preserve"> &gt; 0 %}X{% endif %}</w:t>
             </w:r>
           </w:p>
         </w:tc>
@@ -3296,6 +3691,7 @@
             </w:pPr>
             <w:r>
               <w:rPr>
+                <w:u w:val="single"/>
                 <w:lang w:val="en-US"/>
               </w:rPr>
               <w:t>List all files that do not contain file extensions:</w:t>
@@ -3309,12 +3705,14 @@
             <w:r>
               <w:t xml:space="preserve">{% if </w:t>
             </w:r>
+            <w:proofErr w:type="spellStart"/>
             <w:r>
               <w:rPr>
                 <w:lang w:val="en-US"/>
               </w:rPr>
               <w:t>template_dict.file_ext.comments</w:t>
             </w:r>
+            <w:proofErr w:type="spellEnd"/>
             <w:r>
               <w:t xml:space="preserve"> </w:t>
             </w:r>
@@ -3328,7 +3726,21 @@
               <w:rPr>
                 <w:lang w:val="en-US"/>
               </w:rPr>
-              <w:t>{% for item in template_dict.file_ext.comments %}</w:t>
+              <w:t xml:space="preserve">{% for item in </w:t>
+            </w:r>
+            <w:proofErr w:type="spellStart"/>
+            <w:r>
+              <w:rPr>
+                <w:lang w:val="en-US"/>
+              </w:rPr>
+              <w:t>template_dict.file_ext.comments</w:t>
+            </w:r>
+            <w:proofErr w:type="spellEnd"/>
+            <w:r>
+              <w:rPr>
+                <w:lang w:val="en-US"/>
+              </w:rPr>
+              <w:t xml:space="preserve"> %}</w:t>
             </w:r>
           </w:p>
           <w:p>
@@ -3344,7 +3756,35 @@
               <w:rPr>
                 <w:lang w:val="en-US"/>
               </w:rPr>
-              <w:t>{{ item.file_name }}{% endfor %}</w:t>
+              <w:t xml:space="preserve">{{ </w:t>
+            </w:r>
+            <w:proofErr w:type="spellStart"/>
+            <w:r>
+              <w:rPr>
+                <w:lang w:val="en-US"/>
+              </w:rPr>
+              <w:t>item.file_name</w:t>
+            </w:r>
+            <w:proofErr w:type="spellEnd"/>
+            <w:r>
+              <w:rPr>
+                <w:lang w:val="en-US"/>
+              </w:rPr>
+              <w:t xml:space="preserve"> }}{% </w:t>
+            </w:r>
+            <w:proofErr w:type="spellStart"/>
+            <w:r>
+              <w:rPr>
+                <w:lang w:val="en-US"/>
+              </w:rPr>
+              <w:t>endfor</w:t>
+            </w:r>
+            <w:proofErr w:type="spellEnd"/>
+            <w:r>
+              <w:rPr>
+                <w:lang w:val="en-US"/>
+              </w:rPr>
+              <w:t xml:space="preserve"> %}</w:t>
             </w:r>
           </w:p>
           <w:p>
@@ -3613,6 +4053,7 @@
             </w:pPr>
             <w:r>
               <w:rPr>
+                <w:u w:val="single"/>
                 <w:lang w:val="en-US"/>
               </w:rPr>
               <w:t>List all files that do not appear on the common file format list:</w:t>
@@ -3626,6 +4067,7 @@
             <w:r>
               <w:t xml:space="preserve">{% if </w:t>
             </w:r>
+            <w:proofErr w:type="spellStart"/>
             <w:r>
               <w:rPr>
                 <w:lang w:val="en-US"/>
@@ -3644,6 +4086,7 @@
               </w:rPr>
               <w:t>.comments</w:t>
             </w:r>
+            <w:proofErr w:type="spellEnd"/>
             <w:r>
               <w:t>|length &gt; 0</w:t>
             </w:r>
@@ -3654,7 +4097,14 @@
               <w:rPr>
                 <w:lang w:val="en-US"/>
               </w:rPr>
-              <w:t>{% for item in template_dict.</w:t>
+              <w:t xml:space="preserve">{% for item in </w:t>
+            </w:r>
+            <w:proofErr w:type="spellStart"/>
+            <w:r>
+              <w:rPr>
+                <w:lang w:val="en-US"/>
+              </w:rPr>
+              <w:t>template_dict.</w:t>
             </w:r>
             <w:r>
               <w:rPr>
@@ -3666,7 +4116,14 @@
               <w:rPr>
                 <w:lang w:val="en-US"/>
               </w:rPr>
-              <w:t>.comments %}</w:t>
+              <w:t>.comments</w:t>
+            </w:r>
+            <w:proofErr w:type="spellEnd"/>
+            <w:r>
+              <w:rPr>
+                <w:lang w:val="en-US"/>
+              </w:rPr>
+              <w:t xml:space="preserve"> %}</w:t>
             </w:r>
           </w:p>
           <w:p>
@@ -3680,7 +4137,21 @@
               <w:rPr>
                 <w:lang w:val="en-US"/>
               </w:rPr>
-              <w:t>{{ item.file_name }}</w:t>
+              <w:t xml:space="preserve">{{ </w:t>
+            </w:r>
+            <w:proofErr w:type="spellStart"/>
+            <w:r>
+              <w:rPr>
+                <w:lang w:val="en-US"/>
+              </w:rPr>
+              <w:t>item.file_name</w:t>
+            </w:r>
+            <w:proofErr w:type="spellEnd"/>
+            <w:r>
+              <w:rPr>
+                <w:lang w:val="en-US"/>
+              </w:rPr>
+              <w:t xml:space="preserve"> }}</w:t>
             </w:r>
             <w:r>
               <w:rPr>
@@ -3696,11 +4167,19 @@
               </w:rPr>
               <w:t xml:space="preserve">% </w:t>
             </w:r>
-            <w:r>
-              <w:rPr>
-                <w:lang w:val="en-US"/>
-              </w:rPr>
-              <w:t>endfor %}</w:t>
+            <w:proofErr w:type="spellStart"/>
+            <w:r>
+              <w:rPr>
+                <w:lang w:val="en-US"/>
+              </w:rPr>
+              <w:t>endfor</w:t>
+            </w:r>
+            <w:proofErr w:type="spellEnd"/>
+            <w:r>
+              <w:rPr>
+                <w:lang w:val="en-US"/>
+              </w:rPr>
+              <w:t xml:space="preserve"> %}</w:t>
             </w:r>
           </w:p>
           <w:p>
@@ -3964,7 +4443,15 @@
             <w:hideMark/>
           </w:tcPr>
           <w:p>
-            <w:r>
+            <w:pPr>
+              <w:rPr>
+                <w:u w:val="single"/>
+              </w:rPr>
+            </w:pPr>
+            <w:r>
+              <w:rPr>
+                <w:u w:val="single"/>
+              </w:rPr>
               <w:t>List the uncommon file format that has additional documentation:</w:t>
             </w:r>
           </w:p>
@@ -3978,7 +4465,15 @@
           </w:p>
           <w:p/>
           <w:p>
-            <w:r>
+            <w:pPr>
+              <w:rPr>
+                <w:u w:val="single"/>
+              </w:rPr>
+            </w:pPr>
+            <w:r>
+              <w:rPr>
+                <w:u w:val="single"/>
+              </w:rPr>
               <w:t>List the uncommon file format that does NOT have additional documentation:</w:t>
             </w:r>
           </w:p>
@@ -4424,7 +4919,21 @@
               <w:rPr>
                 <w:lang w:val="en-US"/>
               </w:rPr>
-              <w:t>{% if template_dict.readme_file.comments|length &gt; 0 %}X{% endif %}</w:t>
+              <w:t xml:space="preserve">{% if </w:t>
+            </w:r>
+            <w:proofErr w:type="spellStart"/>
+            <w:r>
+              <w:rPr>
+                <w:lang w:val="en-US"/>
+              </w:rPr>
+              <w:t>template_dict.readme_file.comments|length</w:t>
+            </w:r>
+            <w:proofErr w:type="spellEnd"/>
+            <w:r>
+              <w:rPr>
+                <w:lang w:val="en-US"/>
+              </w:rPr>
+              <w:t xml:space="preserve"> &gt; 0 %}X{% endif %}</w:t>
             </w:r>
           </w:p>
         </w:tc>
@@ -4456,7 +4965,21 @@
               <w:rPr>
                 <w:lang w:val="en-US"/>
               </w:rPr>
-              <w:t>{% if template_dict.readme_file.comments|length == 0 %}X{% endif %}</w:t>
+              <w:t xml:space="preserve">{% if </w:t>
+            </w:r>
+            <w:proofErr w:type="spellStart"/>
+            <w:r>
+              <w:rPr>
+                <w:lang w:val="en-US"/>
+              </w:rPr>
+              <w:t>template_dict.readme_file.comments|length</w:t>
+            </w:r>
+            <w:proofErr w:type="spellEnd"/>
+            <w:r>
+              <w:rPr>
+                <w:lang w:val="en-US"/>
+              </w:rPr>
+              <w:t xml:space="preserve"> == 0 %}X{% endif %}</w:t>
             </w:r>
           </w:p>
           <w:p/>
@@ -4547,6 +5070,7 @@
             </w:pPr>
             <w:r>
               <w:rPr>
+                <w:u w:val="single"/>
                 <w:lang w:val="en-US"/>
               </w:rPr>
               <w:t>List the README file below:</w:t>
@@ -4560,12 +5084,14 @@
             <w:r>
               <w:t xml:space="preserve">{% if </w:t>
             </w:r>
+            <w:proofErr w:type="spellStart"/>
             <w:r>
               <w:rPr>
                 <w:lang w:val="en-US"/>
               </w:rPr>
               <w:t>template_dict.readme_file.comments</w:t>
             </w:r>
+            <w:proofErr w:type="spellEnd"/>
             <w:r>
               <w:t xml:space="preserve"> |length &gt; 0</w:t>
             </w:r>
@@ -4576,7 +5102,63 @@
               <w:rPr>
                 <w:lang w:val="en-US"/>
               </w:rPr>
-              <w:t>{% for item in template_dict.readme_file.comments %}{{ loop.index }}. {{ item.file_name }}{% endfor %}</w:t>
+              <w:t xml:space="preserve">{% for item in </w:t>
+            </w:r>
+            <w:proofErr w:type="spellStart"/>
+            <w:r>
+              <w:rPr>
+                <w:lang w:val="en-US"/>
+              </w:rPr>
+              <w:t>template_dict.readme_file.comments</w:t>
+            </w:r>
+            <w:proofErr w:type="spellEnd"/>
+            <w:r>
+              <w:rPr>
+                <w:lang w:val="en-US"/>
+              </w:rPr>
+              <w:t xml:space="preserve"> %}{{ </w:t>
+            </w:r>
+            <w:proofErr w:type="spellStart"/>
+            <w:r>
+              <w:rPr>
+                <w:lang w:val="en-US"/>
+              </w:rPr>
+              <w:t>loop.index</w:t>
+            </w:r>
+            <w:proofErr w:type="spellEnd"/>
+            <w:r>
+              <w:rPr>
+                <w:lang w:val="en-US"/>
+              </w:rPr>
+              <w:t xml:space="preserve"> }}. {{ </w:t>
+            </w:r>
+            <w:proofErr w:type="spellStart"/>
+            <w:r>
+              <w:rPr>
+                <w:lang w:val="en-US"/>
+              </w:rPr>
+              <w:t>item.file_name</w:t>
+            </w:r>
+            <w:proofErr w:type="spellEnd"/>
+            <w:r>
+              <w:rPr>
+                <w:lang w:val="en-US"/>
+              </w:rPr>
+              <w:t xml:space="preserve"> }}{% </w:t>
+            </w:r>
+            <w:proofErr w:type="spellStart"/>
+            <w:r>
+              <w:rPr>
+                <w:lang w:val="en-US"/>
+              </w:rPr>
+              <w:t>endfor</w:t>
+            </w:r>
+            <w:proofErr w:type="spellEnd"/>
+            <w:r>
+              <w:rPr>
+                <w:lang w:val="en-US"/>
+              </w:rPr>
+              <w:t xml:space="preserve"> %}</w:t>
             </w:r>
           </w:p>
           <w:p>
@@ -4832,7 +5414,15 @@
             <w:hideMark/>
           </w:tcPr>
           <w:p>
-            <w:r>
+            <w:pPr>
+              <w:rPr>
+                <w:u w:val="single"/>
+              </w:rPr>
+            </w:pPr>
+            <w:r>
+              <w:rPr>
+                <w:u w:val="single"/>
+              </w:rPr>
               <w:t>List any issues below:</w:t>
             </w:r>
           </w:p>
@@ -4940,130 +5530,133 @@
             <w:hideMark/>
           </w:tcPr>
           <w:p>
+            <w:r>
+              <w:t>PID</w:t>
+            </w:r>
+          </w:p>
+        </w:tc>
+        <w:tc>
+          <w:tcPr>
+            <w:tcW w:w="0" w:type="auto"/>
+            <w:tcBorders>
+              <w:top w:val="single" w:sz="8" w:space="0" w:color="000000"/>
+              <w:left w:val="single" w:sz="8" w:space="0" w:color="000000"/>
+              <w:bottom w:val="single" w:sz="8" w:space="0" w:color="000000"/>
+              <w:right w:val="single" w:sz="8" w:space="0" w:color="000000"/>
+            </w:tcBorders>
+            <w:tcMar>
+              <w:top w:w="100" w:type="dxa"/>
+              <w:left w:w="100" w:type="dxa"/>
+              <w:bottom w:w="100" w:type="dxa"/>
+              <w:right w:w="100" w:type="dxa"/>
+            </w:tcMar>
+            <w:hideMark/>
+          </w:tcPr>
+          <w:p/>
+        </w:tc>
+        <w:tc>
+          <w:tcPr>
+            <w:tcW w:w="0" w:type="auto"/>
+            <w:tcBorders>
+              <w:top w:val="single" w:sz="8" w:space="0" w:color="000000"/>
+              <w:left w:val="single" w:sz="8" w:space="0" w:color="000000"/>
+              <w:bottom w:val="single" w:sz="8" w:space="0" w:color="000000"/>
+              <w:right w:val="single" w:sz="8" w:space="0" w:color="000000"/>
+            </w:tcBorders>
+            <w:tcMar>
+              <w:top w:w="100" w:type="dxa"/>
+              <w:left w:w="100" w:type="dxa"/>
+              <w:bottom w:w="100" w:type="dxa"/>
+              <w:right w:w="100" w:type="dxa"/>
+            </w:tcMar>
+            <w:hideMark/>
+          </w:tcPr>
+          <w:p/>
+        </w:tc>
+        <w:tc>
+          <w:tcPr>
+            <w:tcW w:w="0" w:type="auto"/>
+            <w:tcBorders>
+              <w:top w:val="single" w:sz="8" w:space="0" w:color="000000"/>
+              <w:left w:val="single" w:sz="8" w:space="0" w:color="000000"/>
+              <w:bottom w:val="single" w:sz="8" w:space="0" w:color="000000"/>
+              <w:right w:val="single" w:sz="8" w:space="0" w:color="000000"/>
+            </w:tcBorders>
+            <w:tcMar>
+              <w:top w:w="100" w:type="dxa"/>
+              <w:left w:w="100" w:type="dxa"/>
+              <w:bottom w:w="100" w:type="dxa"/>
+              <w:right w:w="100" w:type="dxa"/>
+            </w:tcMar>
+            <w:hideMark/>
+          </w:tcPr>
+          <w:p/>
+        </w:tc>
+        <w:tc>
+          <w:tcPr>
+            <w:tcW w:w="0" w:type="auto"/>
+            <w:tcBorders>
+              <w:top w:val="single" w:sz="8" w:space="0" w:color="000000"/>
+              <w:left w:val="single" w:sz="8" w:space="0" w:color="000000"/>
+              <w:bottom w:val="single" w:sz="8" w:space="0" w:color="000000"/>
+              <w:right w:val="single" w:sz="8" w:space="0" w:color="000000"/>
+            </w:tcBorders>
+            <w:tcMar>
+              <w:top w:w="100" w:type="dxa"/>
+              <w:left w:w="100" w:type="dxa"/>
+              <w:bottom w:w="100" w:type="dxa"/>
+              <w:right w:w="100" w:type="dxa"/>
+            </w:tcMar>
+            <w:hideMark/>
+          </w:tcPr>
+          <w:p/>
+        </w:tc>
+        <w:tc>
+          <w:tcPr>
+            <w:tcW w:w="0" w:type="auto"/>
+            <w:tcBorders>
+              <w:top w:val="single" w:sz="8" w:space="0" w:color="000000"/>
+              <w:left w:val="single" w:sz="8" w:space="0" w:color="000000"/>
+              <w:bottom w:val="single" w:sz="8" w:space="0" w:color="000000"/>
+              <w:right w:val="single" w:sz="8" w:space="0" w:color="000000"/>
+            </w:tcBorders>
+            <w:tcMar>
+              <w:top w:w="100" w:type="dxa"/>
+              <w:left w:w="100" w:type="dxa"/>
+              <w:bottom w:w="100" w:type="dxa"/>
+              <w:right w:w="100" w:type="dxa"/>
+            </w:tcMar>
+            <w:hideMark/>
+          </w:tcPr>
+          <w:p/>
+        </w:tc>
+        <w:tc>
+          <w:tcPr>
+            <w:tcW w:w="0" w:type="auto"/>
+            <w:tcBorders>
+              <w:top w:val="single" w:sz="8" w:space="0" w:color="000000"/>
+              <w:left w:val="single" w:sz="8" w:space="0" w:color="000000"/>
+              <w:bottom w:val="single" w:sz="8" w:space="0" w:color="000000"/>
+              <w:right w:val="single" w:sz="8" w:space="0" w:color="000000"/>
+            </w:tcBorders>
+            <w:tcMar>
+              <w:top w:w="100" w:type="dxa"/>
+              <w:left w:w="100" w:type="dxa"/>
+              <w:bottom w:w="100" w:type="dxa"/>
+              <w:right w:w="100" w:type="dxa"/>
+            </w:tcMar>
+            <w:hideMark/>
+          </w:tcPr>
+          <w:p>
             <w:pPr>
               <w:rPr>
-                <w:rFonts w:hint="eastAsia"/>
+                <w:u w:val="single"/>
               </w:rPr>
             </w:pPr>
             <w:r>
-              <w:t>PID</w:t>
-            </w:r>
-          </w:p>
-        </w:tc>
-        <w:tc>
-          <w:tcPr>
-            <w:tcW w:w="0" w:type="auto"/>
-            <w:tcBorders>
-              <w:top w:val="single" w:sz="8" w:space="0" w:color="000000"/>
-              <w:left w:val="single" w:sz="8" w:space="0" w:color="000000"/>
-              <w:bottom w:val="single" w:sz="8" w:space="0" w:color="000000"/>
-              <w:right w:val="single" w:sz="8" w:space="0" w:color="000000"/>
-            </w:tcBorders>
-            <w:tcMar>
-              <w:top w:w="100" w:type="dxa"/>
-              <w:left w:w="100" w:type="dxa"/>
-              <w:bottom w:w="100" w:type="dxa"/>
-              <w:right w:w="100" w:type="dxa"/>
-            </w:tcMar>
-            <w:hideMark/>
-          </w:tcPr>
-          <w:p/>
-        </w:tc>
-        <w:tc>
-          <w:tcPr>
-            <w:tcW w:w="0" w:type="auto"/>
-            <w:tcBorders>
-              <w:top w:val="single" w:sz="8" w:space="0" w:color="000000"/>
-              <w:left w:val="single" w:sz="8" w:space="0" w:color="000000"/>
-              <w:bottom w:val="single" w:sz="8" w:space="0" w:color="000000"/>
-              <w:right w:val="single" w:sz="8" w:space="0" w:color="000000"/>
-            </w:tcBorders>
-            <w:tcMar>
-              <w:top w:w="100" w:type="dxa"/>
-              <w:left w:w="100" w:type="dxa"/>
-              <w:bottom w:w="100" w:type="dxa"/>
-              <w:right w:w="100" w:type="dxa"/>
-            </w:tcMar>
-            <w:hideMark/>
-          </w:tcPr>
-          <w:p/>
-        </w:tc>
-        <w:tc>
-          <w:tcPr>
-            <w:tcW w:w="0" w:type="auto"/>
-            <w:tcBorders>
-              <w:top w:val="single" w:sz="8" w:space="0" w:color="000000"/>
-              <w:left w:val="single" w:sz="8" w:space="0" w:color="000000"/>
-              <w:bottom w:val="single" w:sz="8" w:space="0" w:color="000000"/>
-              <w:right w:val="single" w:sz="8" w:space="0" w:color="000000"/>
-            </w:tcBorders>
-            <w:tcMar>
-              <w:top w:w="100" w:type="dxa"/>
-              <w:left w:w="100" w:type="dxa"/>
-              <w:bottom w:w="100" w:type="dxa"/>
-              <w:right w:w="100" w:type="dxa"/>
-            </w:tcMar>
-            <w:hideMark/>
-          </w:tcPr>
-          <w:p/>
-        </w:tc>
-        <w:tc>
-          <w:tcPr>
-            <w:tcW w:w="0" w:type="auto"/>
-            <w:tcBorders>
-              <w:top w:val="single" w:sz="8" w:space="0" w:color="000000"/>
-              <w:left w:val="single" w:sz="8" w:space="0" w:color="000000"/>
-              <w:bottom w:val="single" w:sz="8" w:space="0" w:color="000000"/>
-              <w:right w:val="single" w:sz="8" w:space="0" w:color="000000"/>
-            </w:tcBorders>
-            <w:tcMar>
-              <w:top w:w="100" w:type="dxa"/>
-              <w:left w:w="100" w:type="dxa"/>
-              <w:bottom w:w="100" w:type="dxa"/>
-              <w:right w:w="100" w:type="dxa"/>
-            </w:tcMar>
-            <w:hideMark/>
-          </w:tcPr>
-          <w:p/>
-        </w:tc>
-        <w:tc>
-          <w:tcPr>
-            <w:tcW w:w="0" w:type="auto"/>
-            <w:tcBorders>
-              <w:top w:val="single" w:sz="8" w:space="0" w:color="000000"/>
-              <w:left w:val="single" w:sz="8" w:space="0" w:color="000000"/>
-              <w:bottom w:val="single" w:sz="8" w:space="0" w:color="000000"/>
-              <w:right w:val="single" w:sz="8" w:space="0" w:color="000000"/>
-            </w:tcBorders>
-            <w:tcMar>
-              <w:top w:w="100" w:type="dxa"/>
-              <w:left w:w="100" w:type="dxa"/>
-              <w:bottom w:w="100" w:type="dxa"/>
-              <w:right w:w="100" w:type="dxa"/>
-            </w:tcMar>
-            <w:hideMark/>
-          </w:tcPr>
-          <w:p/>
-        </w:tc>
-        <w:tc>
-          <w:tcPr>
-            <w:tcW w:w="0" w:type="auto"/>
-            <w:tcBorders>
-              <w:top w:val="single" w:sz="8" w:space="0" w:color="000000"/>
-              <w:left w:val="single" w:sz="8" w:space="0" w:color="000000"/>
-              <w:bottom w:val="single" w:sz="8" w:space="0" w:color="000000"/>
-              <w:right w:val="single" w:sz="8" w:space="0" w:color="000000"/>
-            </w:tcBorders>
-            <w:tcMar>
-              <w:top w:w="100" w:type="dxa"/>
-              <w:left w:w="100" w:type="dxa"/>
-              <w:bottom w:w="100" w:type="dxa"/>
-              <w:right w:w="100" w:type="dxa"/>
-            </w:tcMar>
-            <w:hideMark/>
-          </w:tcPr>
-          <w:p>
-            <w:r>
+              <w:rPr>
+                <w:u w:val="single"/>
+              </w:rPr>
               <w:t>List any issues below:</w:t>
             </w:r>
           </w:p>
@@ -5289,7 +5882,15 @@
             <w:hideMark/>
           </w:tcPr>
           <w:p>
-            <w:r>
+            <w:pPr>
+              <w:rPr>
+                <w:u w:val="single"/>
+              </w:rPr>
+            </w:pPr>
+            <w:r>
+              <w:rPr>
+                <w:u w:val="single"/>
+              </w:rPr>
               <w:t>List any issues below:</w:t>
             </w:r>
           </w:p>
@@ -5515,7 +6116,15 @@
             <w:hideMark/>
           </w:tcPr>
           <w:p>
-            <w:r>
+            <w:pPr>
+              <w:rPr>
+                <w:u w:val="single"/>
+              </w:rPr>
+            </w:pPr>
+            <w:r>
+              <w:rPr>
+                <w:u w:val="single"/>
+              </w:rPr>
               <w:t>List any issues below:</w:t>
             </w:r>
           </w:p>
@@ -5741,7 +6350,15 @@
             <w:hideMark/>
           </w:tcPr>
           <w:p>
-            <w:r>
+            <w:pPr>
+              <w:rPr>
+                <w:u w:val="single"/>
+              </w:rPr>
+            </w:pPr>
+            <w:r>
+              <w:rPr>
+                <w:u w:val="single"/>
+              </w:rPr>
               <w:t>List any issues below:</w:t>
             </w:r>
           </w:p>
@@ -6021,17 +6638,29 @@
             <w:hideMark/>
           </w:tcPr>
           <w:p>
-            <w:r>
+            <w:pPr>
+              <w:rPr>
+                <w:u w:val="single"/>
+              </w:rPr>
+            </w:pPr>
+            <w:r>
+              <w:rPr>
+                <w:u w:val="single"/>
+              </w:rPr>
               <w:t xml:space="preserve">List any issues below in with the format </w:t>
             </w:r>
             <w:r>
               <w:rPr>
                 <w:i/>
                 <w:iCs/>
+                <w:u w:val="single"/>
               </w:rPr>
               <w:t>‘file name: issue/comment</w:t>
             </w:r>
             <w:r>
+              <w:rPr>
+                <w:u w:val="single"/>
+              </w:rPr>
               <w:t>’:</w:t>
             </w:r>
           </w:p>
@@ -6287,7 +6916,15 @@
             <w:hideMark/>
           </w:tcPr>
           <w:p>
-            <w:r>
+            <w:pPr>
+              <w:rPr>
+                <w:u w:val="single"/>
+              </w:rPr>
+            </w:pPr>
+            <w:r>
+              <w:rPr>
+                <w:u w:val="single"/>
+              </w:rPr>
               <w:t>List the files that do not have documentation below:</w:t>
             </w:r>
           </w:p>
@@ -6906,6 +7543,7 @@
             </w:pPr>
             <w:r>
               <w:rPr>
+                <w:u w:val="single"/>
                 <w:lang w:val="en-US"/>
               </w:rPr>
               <w:t>List typos below with the format ‘</w:t>
@@ -6914,12 +7552,14 @@
               <w:rPr>
                 <w:i/>
                 <w:iCs/>
+                <w:u w:val="single"/>
                 <w:lang w:val="en-US"/>
               </w:rPr>
               <w:t>field: typo</w:t>
             </w:r>
             <w:r>
               <w:rPr>
+                <w:u w:val="single"/>
                 <w:lang w:val="en-US"/>
               </w:rPr>
               <w:t>’:</w:t>
@@ -6933,12 +7573,14 @@
             <w:r>
               <w:t xml:space="preserve">{% if </w:t>
             </w:r>
+            <w:proofErr w:type="spellStart"/>
             <w:r>
               <w:rPr>
                 <w:lang w:val="en-US"/>
               </w:rPr>
               <w:t>template_dict.typo.comments</w:t>
             </w:r>
+            <w:proofErr w:type="spellEnd"/>
             <w:r>
               <w:t xml:space="preserve"> </w:t>
             </w:r>
@@ -6953,7 +7595,21 @@
               <w:rPr>
                 <w:lang w:val="en-US"/>
               </w:rPr>
-              <w:t>{% for item in template_dict.typo.comments %}</w:t>
+              <w:t xml:space="preserve">{% for item in </w:t>
+            </w:r>
+            <w:proofErr w:type="spellStart"/>
+            <w:r>
+              <w:rPr>
+                <w:lang w:val="en-US"/>
+              </w:rPr>
+              <w:t>template_dict.typo.comments</w:t>
+            </w:r>
+            <w:proofErr w:type="spellEnd"/>
+            <w:r>
+              <w:rPr>
+                <w:lang w:val="en-US"/>
+              </w:rPr>
+              <w:t xml:space="preserve"> %}</w:t>
             </w:r>
           </w:p>
           <w:p>
@@ -6968,7 +7624,21 @@
               <w:rPr>
                 <w:lang w:val="en-US"/>
               </w:rPr>
-              <w:t>{{ item }}{% endfor %}</w:t>
+              <w:t xml:space="preserve">{{ item }}{% </w:t>
+            </w:r>
+            <w:proofErr w:type="spellStart"/>
+            <w:r>
+              <w:rPr>
+                <w:lang w:val="en-US"/>
+              </w:rPr>
+              <w:t>endfor</w:t>
+            </w:r>
+            <w:proofErr w:type="spellEnd"/>
+            <w:r>
+              <w:rPr>
+                <w:lang w:val="en-US"/>
+              </w:rPr>
+              <w:t xml:space="preserve"> %}</w:t>
             </w:r>
           </w:p>
           <w:p>
@@ -7279,17 +7949,29 @@
             <w:hideMark/>
           </w:tcPr>
           <w:p>
-            <w:r>
+            <w:pPr>
+              <w:rPr>
+                <w:u w:val="single"/>
+              </w:rPr>
+            </w:pPr>
+            <w:r>
+              <w:rPr>
+                <w:u w:val="single"/>
+              </w:rPr>
               <w:t xml:space="preserve">List any issues below with the format </w:t>
             </w:r>
             <w:r>
               <w:rPr>
                 <w:i/>
                 <w:iCs/>
+                <w:u w:val="single"/>
               </w:rPr>
               <w:t>‘field: issue’</w:t>
             </w:r>
             <w:r>
+              <w:rPr>
+                <w:u w:val="single"/>
+              </w:rPr>
               <w:t>:</w:t>
             </w:r>
           </w:p>
@@ -7457,7 +8139,15 @@
           </w:tcPr>
           <w:p>
             <w:r>
-              <w:t>{% if not template_dict.none_author_affiliation %}X{% endif %}</w:t>
+              <w:t xml:space="preserve">{% if not </w:t>
+            </w:r>
+            <w:proofErr w:type="spellStart"/>
+            <w:r>
+              <w:t>template_dict.none_author_affiliation</w:t>
+            </w:r>
+            <w:proofErr w:type="spellEnd"/>
+            <w:r>
+              <w:t xml:space="preserve"> %}X{% endif %}</w:t>
             </w:r>
           </w:p>
         </w:tc>
@@ -7480,7 +8170,15 @@
           </w:tcPr>
           <w:p>
             <w:r>
-              <w:t>{% if template_dict.none_author_affiliation %}X{% endif %}</w:t>
+              <w:t xml:space="preserve">{% if </w:t>
+            </w:r>
+            <w:proofErr w:type="spellStart"/>
+            <w:r>
+              <w:t>template_dict.none_author_affiliation</w:t>
+            </w:r>
+            <w:proofErr w:type="spellEnd"/>
+            <w:r>
+              <w:t xml:space="preserve"> %}X{% endif %}</w:t>
             </w:r>
           </w:p>
         </w:tc>
@@ -7743,11 +8441,24 @@
               <w:t>This will check</w:t>
             </w:r>
             <w:r>
-              <w:t xml:space="preserve"> either ‘uoft’, ‘u of t’ or ‘</w:t>
-            </w:r>
-            <w:r>
-              <w:t>university of toronto</w:t>
-            </w:r>
+              <w:t xml:space="preserve"> either ‘</w:t>
+            </w:r>
+            <w:proofErr w:type="spellStart"/>
+            <w:r>
+              <w:t>uoft</w:t>
+            </w:r>
+            <w:proofErr w:type="spellEnd"/>
+            <w:r>
+              <w:t>’, ‘u of t’ or ‘</w:t>
+            </w:r>
+            <w:r>
+              <w:t xml:space="preserve">university of </w:t>
+            </w:r>
+            <w:proofErr w:type="spellStart"/>
+            <w:r>
+              <w:t>toronto</w:t>
+            </w:r>
+            <w:proofErr w:type="spellEnd"/>
             <w:r>
               <w:t xml:space="preserve">’ </w:t>
             </w:r>
@@ -7800,14 +8511,24 @@
             </w:pPr>
             <w:r>
               <w:lastRenderedPageBreak/>
-              <w:t>{% if not template_dict.</w:t>
-            </w:r>
+              <w:t xml:space="preserve">{% if not </w:t>
+            </w:r>
+            <w:proofErr w:type="spellStart"/>
+            <w:r>
+              <w:t>template_dict</w:t>
+            </w:r>
+            <w:proofErr w:type="spellEnd"/>
+            <w:r>
+              <w:t>.</w:t>
+            </w:r>
+            <w:proofErr w:type="spellStart"/>
             <w:r>
               <w:rPr>
                 <w:lang w:val="en-US"/>
               </w:rPr>
               <w:t>none_author_affiliation_UT</w:t>
             </w:r>
+            <w:proofErr w:type="spellEnd"/>
             <w:r>
               <w:t>%}X{% endif %}</w:t>
             </w:r>
@@ -7837,14 +8558,24 @@
               </w:rPr>
             </w:pPr>
             <w:r>
-              <w:t>{% if template_dict.</w:t>
-            </w:r>
+              <w:t xml:space="preserve">{% if </w:t>
+            </w:r>
+            <w:proofErr w:type="spellStart"/>
+            <w:r>
+              <w:t>template_dict</w:t>
+            </w:r>
+            <w:proofErr w:type="spellEnd"/>
+            <w:r>
+              <w:t>.</w:t>
+            </w:r>
+            <w:proofErr w:type="spellStart"/>
             <w:r>
               <w:rPr>
                 <w:lang w:val="en-US"/>
               </w:rPr>
               <w:t>none_author_affiliation_UT</w:t>
             </w:r>
+            <w:proofErr w:type="spellEnd"/>
             <w:r>
               <w:t xml:space="preserve"> %}X{% endif %}</w:t>
             </w:r>
@@ -8209,17 +8940,29 @@
             <w:hideMark/>
           </w:tcPr>
           <w:p>
-            <w:r>
+            <w:pPr>
+              <w:rPr>
+                <w:u w:val="single"/>
+              </w:rPr>
+            </w:pPr>
+            <w:r>
+              <w:rPr>
+                <w:u w:val="single"/>
+              </w:rPr>
               <w:t>Quote the relevant content and suggest the corresponding metadata field below, with the format ‘</w:t>
             </w:r>
             <w:r>
               <w:rPr>
                 <w:i/>
                 <w:iCs/>
+                <w:u w:val="single"/>
               </w:rPr>
               <w:t>field: comment’</w:t>
             </w:r>
             <w:r>
+              <w:rPr>
+                <w:u w:val="single"/>
+              </w:rPr>
               <w:t>:</w:t>
             </w:r>
           </w:p>
@@ -8467,17 +9210,29 @@
             <w:hideMark/>
           </w:tcPr>
           <w:p>
-            <w:r>
+            <w:pPr>
+              <w:rPr>
+                <w:u w:val="single"/>
+              </w:rPr>
+            </w:pPr>
+            <w:r>
+              <w:rPr>
+                <w:u w:val="single"/>
+              </w:rPr>
               <w:t>Quote the relevant content and suggest the relevant metadata fields, with the format ‘</w:t>
             </w:r>
             <w:r>
               <w:rPr>
                 <w:i/>
                 <w:iCs/>
+                <w:u w:val="single"/>
               </w:rPr>
               <w:t>field: comment’</w:t>
             </w:r>
             <w:r>
+              <w:rPr>
+                <w:u w:val="single"/>
+              </w:rPr>
               <w:t>:</w:t>
             </w:r>
           </w:p>
@@ -8814,7 +9569,15 @@
             <w:hideMark/>
           </w:tcPr>
           <w:p>
-            <w:r>
+            <w:pPr>
+              <w:rPr>
+                <w:u w:val="single"/>
+              </w:rPr>
+            </w:pPr>
+            <w:r>
+              <w:rPr>
+                <w:u w:val="single"/>
+              </w:rPr>
               <w:t>List the recommendations below for the improvements to the description:</w:t>
             </w:r>
           </w:p>
@@ -8995,7 +9758,14 @@
               <w:rPr>
                 <w:lang w:val="en-US"/>
               </w:rPr>
-              <w:t>{% if template_dict.</w:t>
+              <w:t xml:space="preserve">{% if </w:t>
+            </w:r>
+            <w:proofErr w:type="spellStart"/>
+            <w:r>
+              <w:rPr>
+                <w:lang w:val="en-US"/>
+              </w:rPr>
+              <w:t>template_dict.</w:t>
             </w:r>
             <w:r>
               <w:rPr>
@@ -9008,7 +9778,14 @@
               <w:rPr>
                 <w:lang w:val="en-US"/>
               </w:rPr>
-              <w:t>|length &gt; 0 %}X{% endif %}</w:t>
+              <w:t>|length</w:t>
+            </w:r>
+            <w:proofErr w:type="spellEnd"/>
+            <w:r>
+              <w:rPr>
+                <w:lang w:val="en-US"/>
+              </w:rPr>
+              <w:t xml:space="preserve"> &gt; 0 %}X{% endif %}</w:t>
             </w:r>
           </w:p>
         </w:tc>
@@ -9058,7 +9835,14 @@
               <w:rPr>
                 <w:lang w:val="en-US"/>
               </w:rPr>
-              <w:t>{% if template_dict.</w:t>
+              <w:t xml:space="preserve">{% if </w:t>
+            </w:r>
+            <w:proofErr w:type="spellStart"/>
+            <w:r>
+              <w:rPr>
+                <w:lang w:val="en-US"/>
+              </w:rPr>
+              <w:t>template_dict.</w:t>
             </w:r>
             <w:r>
               <w:rPr>
@@ -9071,7 +9855,14 @@
               <w:rPr>
                 <w:lang w:val="en-US"/>
               </w:rPr>
-              <w:t>|length == 0 %}X{% endif %}</w:t>
+              <w:t>|length</w:t>
+            </w:r>
+            <w:proofErr w:type="spellEnd"/>
+            <w:r>
+              <w:rPr>
+                <w:lang w:val="en-US"/>
+              </w:rPr>
+              <w:t xml:space="preserve"> == 0 %}X{% endif %}</w:t>
             </w:r>
           </w:p>
         </w:tc>
@@ -9134,6 +9925,7 @@
             <w:r>
               <w:rPr>
                 <w:rFonts w:hint="eastAsia"/>
+                <w:u w:val="single"/>
               </w:rPr>
               <w:t>List the keyword(s) in the metadata, if any:</w:t>
             </w:r>
@@ -9143,6 +9935,41 @@
             <w:r>
               <w:t xml:space="preserve">{% if </w:t>
             </w:r>
+            <w:proofErr w:type="spellStart"/>
+            <w:r>
+              <w:rPr>
+                <w:lang w:val="en-US"/>
+              </w:rPr>
+              <w:t>template_dict</w:t>
+            </w:r>
+            <w:proofErr w:type="spellEnd"/>
+            <w:r>
+              <w:rPr>
+                <w:lang w:val="en-US"/>
+              </w:rPr>
+              <w:t>.</w:t>
+            </w:r>
+            <w:proofErr w:type="spellStart"/>
+            <w:r>
+              <w:t>keywords</w:t>
+            </w:r>
+            <w:r>
+              <w:t>|length</w:t>
+            </w:r>
+            <w:proofErr w:type="spellEnd"/>
+            <w:r>
+              <w:t xml:space="preserve"> &gt; 0</w:t>
+            </w:r>
+            <w:r>
+              <w:t xml:space="preserve"> %}</w:t>
+            </w:r>
+            <w:r>
+              <w:rPr>
+                <w:lang w:val="en-US"/>
+              </w:rPr>
+              <w:t xml:space="preserve">{% for item in </w:t>
+            </w:r>
+            <w:proofErr w:type="spellStart"/>
             <w:r>
               <w:rPr>
                 <w:lang w:val="en-US"/>
@@ -9150,27 +9977,13 @@
               <w:t>template_dict.</w:t>
             </w:r>
             <w:r>
+              <w:rPr>
+                <w:rFonts w:hint="eastAsia"/>
+                <w:lang w:val="en-US"/>
+              </w:rPr>
               <w:t>keywords</w:t>
             </w:r>
-            <w:r>
-              <w:t>|length &gt; 0</w:t>
-            </w:r>
-            <w:r>
-              <w:t xml:space="preserve"> %}</w:t>
-            </w:r>
-            <w:r>
-              <w:rPr>
-                <w:lang w:val="en-US"/>
-              </w:rPr>
-              <w:t>{% for item in template_dict.</w:t>
-            </w:r>
-            <w:r>
-              <w:rPr>
-                <w:rFonts w:hint="eastAsia"/>
-                <w:lang w:val="en-US"/>
-              </w:rPr>
-              <w:t>keywords</w:t>
-            </w:r>
+            <w:proofErr w:type="spellEnd"/>
             <w:r>
               <w:rPr>
                 <w:lang w:val="en-US"/>
@@ -9190,7 +10003,21 @@
               <w:rPr>
                 <w:lang w:val="en-US"/>
               </w:rPr>
-              <w:t>{{ item }}{% endfor %}</w:t>
+              <w:t xml:space="preserve">{{ item }}{% </w:t>
+            </w:r>
+            <w:proofErr w:type="spellStart"/>
+            <w:r>
+              <w:rPr>
+                <w:lang w:val="en-US"/>
+              </w:rPr>
+              <w:t>endfor</w:t>
+            </w:r>
+            <w:proofErr w:type="spellEnd"/>
+            <w:r>
+              <w:rPr>
+                <w:lang w:val="en-US"/>
+              </w:rPr>
+              <w:t xml:space="preserve"> %}</w:t>
             </w:r>
           </w:p>
           <w:p>
@@ -9720,7 +10547,18 @@
           </w:tcPr>
           <w:p>
             <w:r>
-              <w:t>If there is a suffix, is there a corresponding related publication in the metadata? Y/N</w:t>
+              <w:rPr>
+                <w:u w:val="single"/>
+              </w:rPr>
+              <w:t>If there is a suffix, is there a corresponding related publication in the metadata?</w:t>
+            </w:r>
+            <w:r>
+              <w:t xml:space="preserve"> </w:t>
+            </w:r>
+          </w:p>
+          <w:p>
+            <w:r>
+              <w:t>Y/N</w:t>
             </w:r>
             <w:r>
               <w:t>/</w:t>
@@ -9731,8 +10569,21 @@
           </w:p>
           <w:p/>
           <w:p>
-            <w:r>
-              <w:t>If there is no suffix, is there a related publication in the metadata that implies one of these suffixes should be used? Y/N</w:t>
+            <w:pPr>
+              <w:rPr>
+                <w:u w:val="single"/>
+              </w:rPr>
+            </w:pPr>
+            <w:r>
+              <w:rPr>
+                <w:u w:val="single"/>
+              </w:rPr>
+              <w:t>If there is no suffix, is there a related publication in the metadata that implies one of these suffixes should be used?</w:t>
+            </w:r>
+          </w:p>
+          <w:p>
+            <w:r>
+              <w:t>Y/N</w:t>
             </w:r>
             <w:r>
               <w:t>/</w:t>
@@ -9882,136 +10733,165 @@
             </w:r>
             <w:r>
               <w:lastRenderedPageBreak/>
-              <w:t>DOI or other identifier been included </w:t>
-            </w:r>
-          </w:p>
-        </w:tc>
-        <w:tc>
-          <w:tcPr>
-            <w:tcW w:w="0" w:type="auto"/>
-            <w:tcBorders>
-              <w:top w:val="single" w:sz="8" w:space="0" w:color="000000"/>
-              <w:left w:val="single" w:sz="8" w:space="0" w:color="000000"/>
-              <w:bottom w:val="single" w:sz="8" w:space="0" w:color="000000"/>
-              <w:right w:val="single" w:sz="8" w:space="0" w:color="000000"/>
-            </w:tcBorders>
-            <w:tcMar>
-              <w:top w:w="100" w:type="dxa"/>
-              <w:left w:w="100" w:type="dxa"/>
-              <w:bottom w:w="100" w:type="dxa"/>
-              <w:right w:w="100" w:type="dxa"/>
-            </w:tcMar>
-            <w:hideMark/>
-          </w:tcPr>
-          <w:p/>
-        </w:tc>
-        <w:tc>
-          <w:tcPr>
-            <w:tcW w:w="0" w:type="auto"/>
-            <w:tcBorders>
-              <w:top w:val="single" w:sz="8" w:space="0" w:color="000000"/>
-              <w:left w:val="single" w:sz="8" w:space="0" w:color="000000"/>
-              <w:bottom w:val="single" w:sz="8" w:space="0" w:color="000000"/>
-              <w:right w:val="single" w:sz="8" w:space="0" w:color="000000"/>
-            </w:tcBorders>
-            <w:tcMar>
-              <w:top w:w="100" w:type="dxa"/>
-              <w:left w:w="100" w:type="dxa"/>
-              <w:bottom w:w="100" w:type="dxa"/>
-              <w:right w:w="100" w:type="dxa"/>
-            </w:tcMar>
-            <w:hideMark/>
-          </w:tcPr>
-          <w:p/>
-        </w:tc>
-        <w:tc>
-          <w:tcPr>
-            <w:tcW w:w="0" w:type="auto"/>
-            <w:tcBorders>
-              <w:top w:val="single" w:sz="8" w:space="0" w:color="000000"/>
-              <w:left w:val="single" w:sz="8" w:space="0" w:color="000000"/>
-              <w:bottom w:val="single" w:sz="8" w:space="0" w:color="000000"/>
-              <w:right w:val="single" w:sz="8" w:space="0" w:color="000000"/>
-            </w:tcBorders>
-            <w:tcMar>
-              <w:top w:w="100" w:type="dxa"/>
-              <w:left w:w="100" w:type="dxa"/>
-              <w:bottom w:w="100" w:type="dxa"/>
-              <w:right w:w="100" w:type="dxa"/>
-            </w:tcMar>
-            <w:hideMark/>
-          </w:tcPr>
-          <w:p/>
-        </w:tc>
-        <w:tc>
-          <w:tcPr>
-            <w:tcW w:w="0" w:type="auto"/>
-            <w:tcBorders>
-              <w:top w:val="single" w:sz="8" w:space="0" w:color="000000"/>
-              <w:left w:val="single" w:sz="8" w:space="0" w:color="000000"/>
-              <w:bottom w:val="single" w:sz="8" w:space="0" w:color="000000"/>
-              <w:right w:val="single" w:sz="8" w:space="0" w:color="000000"/>
-            </w:tcBorders>
-            <w:tcMar>
-              <w:top w:w="100" w:type="dxa"/>
-              <w:left w:w="100" w:type="dxa"/>
-              <w:bottom w:w="100" w:type="dxa"/>
-              <w:right w:w="100" w:type="dxa"/>
-            </w:tcMar>
-            <w:hideMark/>
-          </w:tcPr>
-          <w:p/>
-        </w:tc>
-        <w:tc>
-          <w:tcPr>
-            <w:tcW w:w="0" w:type="auto"/>
-            <w:tcBorders>
-              <w:top w:val="single" w:sz="8" w:space="0" w:color="000000"/>
-              <w:left w:val="single" w:sz="8" w:space="0" w:color="000000"/>
-              <w:bottom w:val="single" w:sz="8" w:space="0" w:color="000000"/>
-              <w:right w:val="single" w:sz="8" w:space="0" w:color="000000"/>
-            </w:tcBorders>
-            <w:tcMar>
-              <w:top w:w="100" w:type="dxa"/>
-              <w:left w:w="100" w:type="dxa"/>
-              <w:bottom w:w="100" w:type="dxa"/>
-              <w:right w:w="100" w:type="dxa"/>
-            </w:tcMar>
-            <w:hideMark/>
-          </w:tcPr>
-          <w:p/>
-        </w:tc>
-        <w:tc>
-          <w:tcPr>
-            <w:tcW w:w="0" w:type="auto"/>
-            <w:tcBorders>
-              <w:top w:val="single" w:sz="8" w:space="0" w:color="000000"/>
-              <w:left w:val="single" w:sz="8" w:space="0" w:color="000000"/>
-              <w:bottom w:val="single" w:sz="8" w:space="0" w:color="000000"/>
-              <w:right w:val="single" w:sz="8" w:space="0" w:color="000000"/>
-            </w:tcBorders>
-            <w:tcMar>
-              <w:top w:w="100" w:type="dxa"/>
-              <w:left w:w="100" w:type="dxa"/>
-              <w:bottom w:w="100" w:type="dxa"/>
-              <w:right w:w="100" w:type="dxa"/>
-            </w:tcMar>
-            <w:hideMark/>
-          </w:tcPr>
-          <w:p>
-            <w:r>
+              <w:t xml:space="preserve">DOI or other </w:t>
+            </w:r>
+            <w:r>
+              <w:t>persistent</w:t>
+            </w:r>
+            <w:r>
+              <w:t xml:space="preserve"> </w:t>
+            </w:r>
+            <w:r>
+              <w:t>identifier been included </w:t>
+            </w:r>
+          </w:p>
+        </w:tc>
+        <w:tc>
+          <w:tcPr>
+            <w:tcW w:w="0" w:type="auto"/>
+            <w:tcBorders>
+              <w:top w:val="single" w:sz="8" w:space="0" w:color="000000"/>
+              <w:left w:val="single" w:sz="8" w:space="0" w:color="000000"/>
+              <w:bottom w:val="single" w:sz="8" w:space="0" w:color="000000"/>
+              <w:right w:val="single" w:sz="8" w:space="0" w:color="000000"/>
+            </w:tcBorders>
+            <w:tcMar>
+              <w:top w:w="100" w:type="dxa"/>
+              <w:left w:w="100" w:type="dxa"/>
+              <w:bottom w:w="100" w:type="dxa"/>
+              <w:right w:w="100" w:type="dxa"/>
+            </w:tcMar>
+            <w:hideMark/>
+          </w:tcPr>
+          <w:p/>
+        </w:tc>
+        <w:tc>
+          <w:tcPr>
+            <w:tcW w:w="0" w:type="auto"/>
+            <w:tcBorders>
+              <w:top w:val="single" w:sz="8" w:space="0" w:color="000000"/>
+              <w:left w:val="single" w:sz="8" w:space="0" w:color="000000"/>
+              <w:bottom w:val="single" w:sz="8" w:space="0" w:color="000000"/>
+              <w:right w:val="single" w:sz="8" w:space="0" w:color="000000"/>
+            </w:tcBorders>
+            <w:tcMar>
+              <w:top w:w="100" w:type="dxa"/>
+              <w:left w:w="100" w:type="dxa"/>
+              <w:bottom w:w="100" w:type="dxa"/>
+              <w:right w:w="100" w:type="dxa"/>
+            </w:tcMar>
+            <w:hideMark/>
+          </w:tcPr>
+          <w:p/>
+        </w:tc>
+        <w:tc>
+          <w:tcPr>
+            <w:tcW w:w="0" w:type="auto"/>
+            <w:tcBorders>
+              <w:top w:val="single" w:sz="8" w:space="0" w:color="000000"/>
+              <w:left w:val="single" w:sz="8" w:space="0" w:color="000000"/>
+              <w:bottom w:val="single" w:sz="8" w:space="0" w:color="000000"/>
+              <w:right w:val="single" w:sz="8" w:space="0" w:color="000000"/>
+            </w:tcBorders>
+            <w:tcMar>
+              <w:top w:w="100" w:type="dxa"/>
+              <w:left w:w="100" w:type="dxa"/>
+              <w:bottom w:w="100" w:type="dxa"/>
+              <w:right w:w="100" w:type="dxa"/>
+            </w:tcMar>
+            <w:hideMark/>
+          </w:tcPr>
+          <w:p/>
+        </w:tc>
+        <w:tc>
+          <w:tcPr>
+            <w:tcW w:w="0" w:type="auto"/>
+            <w:tcBorders>
+              <w:top w:val="single" w:sz="8" w:space="0" w:color="000000"/>
+              <w:left w:val="single" w:sz="8" w:space="0" w:color="000000"/>
+              <w:bottom w:val="single" w:sz="8" w:space="0" w:color="000000"/>
+              <w:right w:val="single" w:sz="8" w:space="0" w:color="000000"/>
+            </w:tcBorders>
+            <w:tcMar>
+              <w:top w:w="100" w:type="dxa"/>
+              <w:left w:w="100" w:type="dxa"/>
+              <w:bottom w:w="100" w:type="dxa"/>
+              <w:right w:w="100" w:type="dxa"/>
+            </w:tcMar>
+            <w:hideMark/>
+          </w:tcPr>
+          <w:p/>
+        </w:tc>
+        <w:tc>
+          <w:tcPr>
+            <w:tcW w:w="0" w:type="auto"/>
+            <w:tcBorders>
+              <w:top w:val="single" w:sz="8" w:space="0" w:color="000000"/>
+              <w:left w:val="single" w:sz="8" w:space="0" w:color="000000"/>
+              <w:bottom w:val="single" w:sz="8" w:space="0" w:color="000000"/>
+              <w:right w:val="single" w:sz="8" w:space="0" w:color="000000"/>
+            </w:tcBorders>
+            <w:tcMar>
+              <w:top w:w="100" w:type="dxa"/>
+              <w:left w:w="100" w:type="dxa"/>
+              <w:bottom w:w="100" w:type="dxa"/>
+              <w:right w:w="100" w:type="dxa"/>
+            </w:tcMar>
+            <w:hideMark/>
+          </w:tcPr>
+          <w:p/>
+        </w:tc>
+        <w:tc>
+          <w:tcPr>
+            <w:tcW w:w="0" w:type="auto"/>
+            <w:tcBorders>
+              <w:top w:val="single" w:sz="8" w:space="0" w:color="000000"/>
+              <w:left w:val="single" w:sz="8" w:space="0" w:color="000000"/>
+              <w:bottom w:val="single" w:sz="8" w:space="0" w:color="000000"/>
+              <w:right w:val="single" w:sz="8" w:space="0" w:color="000000"/>
+            </w:tcBorders>
+            <w:tcMar>
+              <w:top w:w="100" w:type="dxa"/>
+              <w:left w:w="100" w:type="dxa"/>
+              <w:bottom w:w="100" w:type="dxa"/>
+              <w:right w:w="100" w:type="dxa"/>
+            </w:tcMar>
+            <w:hideMark/>
+          </w:tcPr>
+          <w:p>
+            <w:pPr>
+              <w:rPr>
+                <w:u w:val="single"/>
+              </w:rPr>
+            </w:pPr>
+            <w:r>
+              <w:rPr>
+                <w:u w:val="single"/>
+              </w:rPr>
               <w:t xml:space="preserve">If not, provide the citation and the </w:t>
             </w:r>
             <w:r>
+              <w:rPr>
+                <w:u w:val="single"/>
+              </w:rPr>
               <w:t>PID</w:t>
             </w:r>
             <w:r>
+              <w:rPr>
+                <w:u w:val="single"/>
+              </w:rPr>
               <w:t xml:space="preserve"> of the publication(s) below, with the format ‘publication: </w:t>
             </w:r>
             <w:r>
+              <w:rPr>
+                <w:u w:val="single"/>
+              </w:rPr>
               <w:t>PID</w:t>
             </w:r>
             <w:r>
+              <w:rPr>
+                <w:u w:val="single"/>
+              </w:rPr>
               <w:t>’:</w:t>
             </w:r>
           </w:p>
@@ -10475,134 +11355,144 @@
             </w:tcMar>
             <w:hideMark/>
           </w:tcPr>
+          <w:p/>
+        </w:tc>
+        <w:tc>
+          <w:tcPr>
+            <w:tcW w:w="0" w:type="auto"/>
+            <w:tcBorders>
+              <w:top w:val="single" w:sz="8" w:space="0" w:color="000000"/>
+              <w:left w:val="single" w:sz="8" w:space="0" w:color="000000"/>
+              <w:bottom w:val="single" w:sz="8" w:space="0" w:color="000000"/>
+              <w:right w:val="single" w:sz="8" w:space="0" w:color="000000"/>
+            </w:tcBorders>
+            <w:shd w:val="clear" w:color="auto" w:fill="EFEFEF"/>
+            <w:tcMar>
+              <w:top w:w="100" w:type="dxa"/>
+              <w:left w:w="100" w:type="dxa"/>
+              <w:bottom w:w="100" w:type="dxa"/>
+              <w:right w:w="100" w:type="dxa"/>
+            </w:tcMar>
+            <w:hideMark/>
+          </w:tcPr>
+          <w:p/>
+        </w:tc>
+        <w:tc>
+          <w:tcPr>
+            <w:tcW w:w="0" w:type="auto"/>
+            <w:tcBorders>
+              <w:top w:val="single" w:sz="8" w:space="0" w:color="000000"/>
+              <w:left w:val="single" w:sz="8" w:space="0" w:color="000000"/>
+              <w:bottom w:val="single" w:sz="8" w:space="0" w:color="000000"/>
+              <w:right w:val="single" w:sz="8" w:space="0" w:color="000000"/>
+            </w:tcBorders>
+            <w:shd w:val="clear" w:color="auto" w:fill="EFEFEF"/>
+            <w:tcMar>
+              <w:top w:w="100" w:type="dxa"/>
+              <w:left w:w="100" w:type="dxa"/>
+              <w:bottom w:w="100" w:type="dxa"/>
+              <w:right w:w="100" w:type="dxa"/>
+            </w:tcMar>
+            <w:hideMark/>
+          </w:tcPr>
+          <w:p/>
+        </w:tc>
+        <w:tc>
+          <w:tcPr>
+            <w:tcW w:w="0" w:type="auto"/>
+            <w:tcBorders>
+              <w:top w:val="single" w:sz="8" w:space="0" w:color="000000"/>
+              <w:left w:val="single" w:sz="8" w:space="0" w:color="000000"/>
+              <w:bottom w:val="single" w:sz="8" w:space="0" w:color="000000"/>
+              <w:right w:val="single" w:sz="8" w:space="0" w:color="000000"/>
+            </w:tcBorders>
+            <w:shd w:val="clear" w:color="auto" w:fill="EFEFEF"/>
+            <w:tcMar>
+              <w:top w:w="100" w:type="dxa"/>
+              <w:left w:w="100" w:type="dxa"/>
+              <w:bottom w:w="100" w:type="dxa"/>
+              <w:right w:w="100" w:type="dxa"/>
+            </w:tcMar>
+            <w:hideMark/>
+          </w:tcPr>
+          <w:p/>
+        </w:tc>
+        <w:tc>
+          <w:tcPr>
+            <w:tcW w:w="0" w:type="auto"/>
+            <w:tcBorders>
+              <w:top w:val="single" w:sz="8" w:space="0" w:color="000000"/>
+              <w:left w:val="single" w:sz="8" w:space="0" w:color="000000"/>
+              <w:bottom w:val="single" w:sz="8" w:space="0" w:color="000000"/>
+              <w:right w:val="single" w:sz="8" w:space="0" w:color="000000"/>
+            </w:tcBorders>
+            <w:shd w:val="clear" w:color="auto" w:fill="EFEFEF"/>
+            <w:tcMar>
+              <w:top w:w="100" w:type="dxa"/>
+              <w:left w:w="100" w:type="dxa"/>
+              <w:bottom w:w="100" w:type="dxa"/>
+              <w:right w:w="100" w:type="dxa"/>
+            </w:tcMar>
+            <w:hideMark/>
+          </w:tcPr>
+          <w:p/>
+        </w:tc>
+        <w:tc>
+          <w:tcPr>
+            <w:tcW w:w="0" w:type="auto"/>
+            <w:tcBorders>
+              <w:top w:val="single" w:sz="8" w:space="0" w:color="000000"/>
+              <w:left w:val="single" w:sz="8" w:space="0" w:color="000000"/>
+              <w:bottom w:val="single" w:sz="8" w:space="0" w:color="000000"/>
+              <w:right w:val="single" w:sz="8" w:space="0" w:color="000000"/>
+            </w:tcBorders>
+            <w:shd w:val="clear" w:color="auto" w:fill="EFEFEF"/>
+            <w:tcMar>
+              <w:top w:w="100" w:type="dxa"/>
+              <w:left w:w="100" w:type="dxa"/>
+              <w:bottom w:w="100" w:type="dxa"/>
+              <w:right w:w="100" w:type="dxa"/>
+            </w:tcMar>
+            <w:hideMark/>
+          </w:tcPr>
           <w:p>
             <w:pPr>
               <w:rPr>
-                <w:rFonts w:hint="eastAsia"/>
+                <w:u w:val="single"/>
               </w:rPr>
             </w:pPr>
-          </w:p>
-        </w:tc>
-        <w:tc>
-          <w:tcPr>
-            <w:tcW w:w="0" w:type="auto"/>
-            <w:tcBorders>
-              <w:top w:val="single" w:sz="8" w:space="0" w:color="000000"/>
-              <w:left w:val="single" w:sz="8" w:space="0" w:color="000000"/>
-              <w:bottom w:val="single" w:sz="8" w:space="0" w:color="000000"/>
-              <w:right w:val="single" w:sz="8" w:space="0" w:color="000000"/>
-            </w:tcBorders>
-            <w:shd w:val="clear" w:color="auto" w:fill="EFEFEF"/>
-            <w:tcMar>
-              <w:top w:w="100" w:type="dxa"/>
-              <w:left w:w="100" w:type="dxa"/>
-              <w:bottom w:w="100" w:type="dxa"/>
-              <w:right w:w="100" w:type="dxa"/>
-            </w:tcMar>
-            <w:hideMark/>
-          </w:tcPr>
-          <w:p/>
-        </w:tc>
-        <w:tc>
-          <w:tcPr>
-            <w:tcW w:w="0" w:type="auto"/>
-            <w:tcBorders>
-              <w:top w:val="single" w:sz="8" w:space="0" w:color="000000"/>
-              <w:left w:val="single" w:sz="8" w:space="0" w:color="000000"/>
-              <w:bottom w:val="single" w:sz="8" w:space="0" w:color="000000"/>
-              <w:right w:val="single" w:sz="8" w:space="0" w:color="000000"/>
-            </w:tcBorders>
-            <w:shd w:val="clear" w:color="auto" w:fill="EFEFEF"/>
-            <w:tcMar>
-              <w:top w:w="100" w:type="dxa"/>
-              <w:left w:w="100" w:type="dxa"/>
-              <w:bottom w:w="100" w:type="dxa"/>
-              <w:right w:w="100" w:type="dxa"/>
-            </w:tcMar>
-            <w:hideMark/>
-          </w:tcPr>
-          <w:p/>
-        </w:tc>
-        <w:tc>
-          <w:tcPr>
-            <w:tcW w:w="0" w:type="auto"/>
-            <w:tcBorders>
-              <w:top w:val="single" w:sz="8" w:space="0" w:color="000000"/>
-              <w:left w:val="single" w:sz="8" w:space="0" w:color="000000"/>
-              <w:bottom w:val="single" w:sz="8" w:space="0" w:color="000000"/>
-              <w:right w:val="single" w:sz="8" w:space="0" w:color="000000"/>
-            </w:tcBorders>
-            <w:shd w:val="clear" w:color="auto" w:fill="EFEFEF"/>
-            <w:tcMar>
-              <w:top w:w="100" w:type="dxa"/>
-              <w:left w:w="100" w:type="dxa"/>
-              <w:bottom w:w="100" w:type="dxa"/>
-              <w:right w:w="100" w:type="dxa"/>
-            </w:tcMar>
-            <w:hideMark/>
-          </w:tcPr>
-          <w:p/>
-        </w:tc>
-        <w:tc>
-          <w:tcPr>
-            <w:tcW w:w="0" w:type="auto"/>
-            <w:tcBorders>
-              <w:top w:val="single" w:sz="8" w:space="0" w:color="000000"/>
-              <w:left w:val="single" w:sz="8" w:space="0" w:color="000000"/>
-              <w:bottom w:val="single" w:sz="8" w:space="0" w:color="000000"/>
-              <w:right w:val="single" w:sz="8" w:space="0" w:color="000000"/>
-            </w:tcBorders>
-            <w:shd w:val="clear" w:color="auto" w:fill="EFEFEF"/>
-            <w:tcMar>
-              <w:top w:w="100" w:type="dxa"/>
-              <w:left w:w="100" w:type="dxa"/>
-              <w:bottom w:w="100" w:type="dxa"/>
-              <w:right w:w="100" w:type="dxa"/>
-            </w:tcMar>
-            <w:hideMark/>
-          </w:tcPr>
-          <w:p/>
-        </w:tc>
-        <w:tc>
-          <w:tcPr>
-            <w:tcW w:w="0" w:type="auto"/>
-            <w:tcBorders>
-              <w:top w:val="single" w:sz="8" w:space="0" w:color="000000"/>
-              <w:left w:val="single" w:sz="8" w:space="0" w:color="000000"/>
-              <w:bottom w:val="single" w:sz="8" w:space="0" w:color="000000"/>
-              <w:right w:val="single" w:sz="8" w:space="0" w:color="000000"/>
-            </w:tcBorders>
-            <w:shd w:val="clear" w:color="auto" w:fill="EFEFEF"/>
-            <w:tcMar>
-              <w:top w:w="100" w:type="dxa"/>
-              <w:left w:w="100" w:type="dxa"/>
-              <w:bottom w:w="100" w:type="dxa"/>
-              <w:right w:w="100" w:type="dxa"/>
-            </w:tcMar>
-            <w:hideMark/>
-          </w:tcPr>
-          <w:p>
-            <w:r>
+            <w:r>
+              <w:rPr>
+                <w:u w:val="single"/>
+              </w:rPr>
               <w:t>List fields/files below with the format ‘</w:t>
             </w:r>
             <w:r>
               <w:rPr>
                 <w:i/>
                 <w:iCs/>
+                <w:u w:val="single"/>
               </w:rPr>
               <w:t>field</w:t>
             </w:r>
             <w:r>
+              <w:rPr>
+                <w:u w:val="single"/>
+              </w:rPr>
               <w:t>/</w:t>
             </w:r>
             <w:r>
               <w:rPr>
                 <w:i/>
                 <w:iCs/>
+                <w:u w:val="single"/>
               </w:rPr>
               <w:t>file: issue and comments</w:t>
             </w:r>
             <w:r>
+              <w:rPr>
+                <w:u w:val="single"/>
+              </w:rPr>
               <w:t>’:</w:t>
             </w:r>
           </w:p>
@@ -11142,13 +12032,20 @@
           </w:tcPr>
           <w:p>
             <w:r>
+              <w:rPr>
+                <w:u w:val="single"/>
+              </w:rPr>
               <w:t>List any restricted files in this dataset:</w:t>
             </w:r>
             <w:r>
               <w:br/>
             </w:r>
             <w:r>
-              <w:t>{% if template_dict.restricted_files.comment</w:t>
+              <w:t xml:space="preserve">{% if </w:t>
+            </w:r>
+            <w:proofErr w:type="spellStart"/>
+            <w:r>
+              <w:t>template_dict.restricted_files.comment</w:t>
             </w:r>
             <w:r>
               <w:rPr>
@@ -11157,10 +12054,22 @@
               <w:t>s</w:t>
             </w:r>
             <w:r>
-              <w:t>|length &gt; 0</w:t>
-            </w:r>
-            <w:r>
-              <w:t xml:space="preserve"> %}{% for item in template_dict.restricted_files.comments %} </w:t>
+              <w:t>|length</w:t>
+            </w:r>
+            <w:proofErr w:type="spellEnd"/>
+            <w:r>
+              <w:t xml:space="preserve"> &gt; 0</w:t>
+            </w:r>
+            <w:r>
+              <w:t xml:space="preserve"> %}{% for item in </w:t>
+            </w:r>
+            <w:proofErr w:type="spellStart"/>
+            <w:r>
+              <w:t>template_dict.restricted_files.comments</w:t>
+            </w:r>
+            <w:proofErr w:type="spellEnd"/>
+            <w:r>
+              <w:t xml:space="preserve"> %} </w:t>
             </w:r>
           </w:p>
           <w:p>
@@ -11172,7 +12081,23 @@
               </w:numPr>
             </w:pPr>
             <w:r>
-              <w:t>{{ item.file_name }} {% endfor %}</w:t>
+              <w:t xml:space="preserve">{{ </w:t>
+            </w:r>
+            <w:proofErr w:type="spellStart"/>
+            <w:r>
+              <w:t>item.file_name</w:t>
+            </w:r>
+            <w:proofErr w:type="spellEnd"/>
+            <w:r>
+              <w:t xml:space="preserve"> }} {% </w:t>
+            </w:r>
+            <w:proofErr w:type="spellStart"/>
+            <w:r>
+              <w:t>endfor</w:t>
+            </w:r>
+            <w:proofErr w:type="spellEnd"/>
+            <w:r>
+              <w:t xml:space="preserve"> %}</w:t>
             </w:r>
           </w:p>
           <w:p>
@@ -11183,14 +12108,30 @@
           <w:p>
             <w:pPr>
               <w:rPr>
+                <w:u w:val="single"/>
                 <w:lang w:val="en-US"/>
               </w:rPr>
             </w:pPr>
             <w:r>
               <w:rPr>
-                <w:lang w:val="en-US"/>
-              </w:rPr>
-              <w:t>License applied to dataset:</w:t>
+                <w:u w:val="single"/>
+                <w:lang w:val="en-US"/>
+              </w:rPr>
+              <w:t xml:space="preserve">License applied to </w:t>
+            </w:r>
+            <w:r>
+              <w:rPr>
+                <w:u w:val="single"/>
+                <w:lang w:val="en-US"/>
+              </w:rPr>
+              <w:t xml:space="preserve">the </w:t>
+            </w:r>
+            <w:r>
+              <w:rPr>
+                <w:u w:val="single"/>
+                <w:lang w:val="en-US"/>
+              </w:rPr>
+              <w:t>dataset:</w:t>
             </w:r>
           </w:p>
           <w:p>
@@ -11205,12 +12146,29 @@
               </w:rPr>
             </w:pPr>
             <w:r>
-              <w:t>{% if template_dict.terms_license.licenseName is not none %}{{ template_dict.terms_license.licenseName }}{% else %}(NONE){% endif %}</w:t>
+              <w:t xml:space="preserve">{% if </w:t>
+            </w:r>
+            <w:proofErr w:type="spellStart"/>
+            <w:r>
+              <w:t>template_dict.terms_license.licenseName</w:t>
+            </w:r>
+            <w:proofErr w:type="spellEnd"/>
+            <w:r>
+              <w:t xml:space="preserve"> is not none %}{{ </w:t>
+            </w:r>
+            <w:proofErr w:type="spellStart"/>
+            <w:r>
+              <w:t>template_dict.terms_license.licenseName</w:t>
+            </w:r>
+            <w:proofErr w:type="spellEnd"/>
+            <w:r>
+              <w:t xml:space="preserve"> }}{% else %}(NONE){% endif %}</w:t>
             </w:r>
           </w:p>
           <w:p>
             <w:pPr>
               <w:rPr>
+                <w:u w:val="single"/>
                 <w:lang w:val="en-US"/>
               </w:rPr>
             </w:pPr>
@@ -11220,9 +12178,25 @@
             <w:r>
               <w:rPr>
                 <w:rFonts w:hint="eastAsia"/>
-                <w:lang w:val="en-US"/>
-              </w:rPr>
-              <w:t>Terms of Use applied to dataset:</w:t>
+                <w:u w:val="single"/>
+                <w:lang w:val="en-US"/>
+              </w:rPr>
+              <w:t>Terms of Use applied to</w:t>
+            </w:r>
+            <w:r>
+              <w:rPr>
+                <w:u w:val="single"/>
+                <w:lang w:val="en-US"/>
+              </w:rPr>
+              <w:t xml:space="preserve"> the</w:t>
+            </w:r>
+            <w:r>
+              <w:rPr>
+                <w:rFonts w:hint="eastAsia"/>
+                <w:u w:val="single"/>
+                <w:lang w:val="en-US"/>
+              </w:rPr>
+              <w:t xml:space="preserve"> dataset:</w:t>
             </w:r>
           </w:p>
           <w:tbl>
@@ -11232,7 +12206,7 @@
               <w:tblLook w:val="04A0" w:firstRow="1" w:lastRow="0" w:firstColumn="1" w:lastColumn="0" w:noHBand="0" w:noVBand="1"/>
             </w:tblPr>
             <w:tblGrid>
-              <w:gridCol w:w="3826"/>
+              <w:gridCol w:w="3795"/>
             </w:tblGrid>
             <w:tr>
               <w:tc>
@@ -11246,13 +12220,22 @@
                     </w:rPr>
                   </w:pPr>
                   <w:r>
-                    <w:t>{% if template_dict.terms_license.</w:t>
+                    <w:t xml:space="preserve">{% if </w:t>
+                  </w:r>
+                  <w:proofErr w:type="spellStart"/>
+                  <w:r>
+                    <w:t>template_dict.terms_license.</w:t>
                   </w:r>
                   <w:r>
                     <w:t>termsOfUse</w:t>
                   </w:r>
+                  <w:proofErr w:type="spellEnd"/>
                   <w:r>
-                    <w:t xml:space="preserve"> is not none %}{{ template_dict.terms_license.</w:t>
+                    <w:t xml:space="preserve"> is not none %}{{ </w:t>
+                  </w:r>
+                  <w:proofErr w:type="spellStart"/>
+                  <w:r>
+                    <w:t>template_dict.terms_license.</w:t>
                   </w:r>
                   <w:r>
                     <w:t>ter</w:t>
@@ -11261,6 +12244,7 @@
                     <w:lastRenderedPageBreak/>
                     <w:t>msOfUse</w:t>
                   </w:r>
+                  <w:proofErr w:type="spellEnd"/>
                   <w:r>
                     <w:t xml:space="preserve"> }}{% else %}(NONE){% endif %}</w:t>
                   </w:r>
@@ -11443,11 +12427,19 @@
               </w:rPr>
               <w:t xml:space="preserve">{% if </w:t>
             </w:r>
-            <w:r>
-              <w:rPr>
-                <w:lang w:val="en-US"/>
-              </w:rPr>
-              <w:t>template_dict.</w:t>
+            <w:proofErr w:type="spellStart"/>
+            <w:r>
+              <w:rPr>
+                <w:lang w:val="en-US"/>
+              </w:rPr>
+              <w:t>template_dict</w:t>
+            </w:r>
+            <w:proofErr w:type="spellEnd"/>
+            <w:r>
+              <w:rPr>
+                <w:lang w:val="en-US"/>
+              </w:rPr>
+              <w:t>.</w:t>
             </w:r>
             <w:r>
               <w:rPr>
@@ -11460,21 +12452,38 @@
               </w:rPr>
               <w:t xml:space="preserve"> </w:t>
             </w:r>
+            <w:proofErr w:type="spellStart"/>
             <w:r>
               <w:t>restricted_files</w:t>
             </w:r>
-            <w:r>
-              <w:rPr>
-                <w:lang w:val="en-US"/>
-              </w:rPr>
-              <w:t>.comments</w:t>
+            <w:proofErr w:type="spellEnd"/>
+            <w:r>
+              <w:rPr>
+                <w:lang w:val="en-US"/>
+              </w:rPr>
+              <w:t>.</w:t>
+            </w:r>
+            <w:proofErr w:type="spellStart"/>
+            <w:r>
+              <w:rPr>
+                <w:lang w:val="en-US"/>
+              </w:rPr>
+              <w:t>comments</w:t>
             </w:r>
             <w:r>
               <w:rPr>
                 <w:rFonts w:hint="eastAsia"/>
                 <w:lang w:val="en-US"/>
               </w:rPr>
-              <w:t>|length &gt;</w:t>
+              <w:t>|length</w:t>
+            </w:r>
+            <w:proofErr w:type="spellEnd"/>
+            <w:r>
+              <w:rPr>
+                <w:rFonts w:hint="eastAsia"/>
+                <w:lang w:val="en-US"/>
+              </w:rPr>
+              <w:t xml:space="preserve"> &gt;</w:t>
             </w:r>
             <w:r>
               <w:rPr>
@@ -11489,12 +12498,14 @@
               </w:rPr>
               <w:t xml:space="preserve">and </w:t>
             </w:r>
+            <w:proofErr w:type="spellStart"/>
             <w:r>
               <w:t>template_dict.terms_license.</w:t>
             </w:r>
             <w:r>
               <w:t>termsOfAccess</w:t>
             </w:r>
+            <w:proofErr w:type="spellEnd"/>
             <w:r>
               <w:t xml:space="preserve"> is not none</w:t>
             </w:r>
@@ -11533,11 +12544,19 @@
               </w:rPr>
               <w:t xml:space="preserve">{% if </w:t>
             </w:r>
-            <w:r>
-              <w:rPr>
-                <w:lang w:val="en-US"/>
-              </w:rPr>
-              <w:t>template_dict.</w:t>
+            <w:proofErr w:type="spellStart"/>
+            <w:r>
+              <w:rPr>
+                <w:lang w:val="en-US"/>
+              </w:rPr>
+              <w:t>template_dict</w:t>
+            </w:r>
+            <w:proofErr w:type="spellEnd"/>
+            <w:r>
+              <w:rPr>
+                <w:lang w:val="en-US"/>
+              </w:rPr>
+              <w:t>.</w:t>
             </w:r>
             <w:r>
               <w:rPr>
@@ -11550,21 +12569,38 @@
               </w:rPr>
               <w:t xml:space="preserve"> </w:t>
             </w:r>
+            <w:proofErr w:type="spellStart"/>
             <w:r>
               <w:t>restricted_files</w:t>
             </w:r>
-            <w:r>
-              <w:rPr>
-                <w:lang w:val="en-US"/>
-              </w:rPr>
-              <w:t>.comments</w:t>
+            <w:proofErr w:type="spellEnd"/>
+            <w:r>
+              <w:rPr>
+                <w:lang w:val="en-US"/>
+              </w:rPr>
+              <w:t>.</w:t>
+            </w:r>
+            <w:proofErr w:type="spellStart"/>
+            <w:r>
+              <w:rPr>
+                <w:lang w:val="en-US"/>
+              </w:rPr>
+              <w:t>comments</w:t>
             </w:r>
             <w:r>
               <w:rPr>
                 <w:rFonts w:hint="eastAsia"/>
                 <w:lang w:val="en-US"/>
               </w:rPr>
-              <w:t>|length &gt;</w:t>
+              <w:t>|length</w:t>
+            </w:r>
+            <w:proofErr w:type="spellEnd"/>
+            <w:r>
+              <w:rPr>
+                <w:rFonts w:hint="eastAsia"/>
+                <w:lang w:val="en-US"/>
+              </w:rPr>
+              <w:t xml:space="preserve"> &gt;</w:t>
             </w:r>
             <w:r>
               <w:rPr>
@@ -11579,12 +12615,14 @@
               </w:rPr>
               <w:t xml:space="preserve">and </w:t>
             </w:r>
+            <w:proofErr w:type="spellStart"/>
             <w:r>
               <w:t>template_dict.terms_license.</w:t>
             </w:r>
             <w:r>
               <w:t>termsOfAccess</w:t>
             </w:r>
+            <w:proofErr w:type="spellEnd"/>
             <w:r>
               <w:t xml:space="preserve"> is none</w:t>
             </w:r>
@@ -11659,11 +12697,19 @@
               </w:rPr>
               <w:t xml:space="preserve">{% if </w:t>
             </w:r>
-            <w:r>
-              <w:rPr>
-                <w:lang w:val="en-US"/>
-              </w:rPr>
-              <w:t>template_dict.</w:t>
+            <w:proofErr w:type="spellStart"/>
+            <w:r>
+              <w:rPr>
+                <w:lang w:val="en-US"/>
+              </w:rPr>
+              <w:t>template_dict</w:t>
+            </w:r>
+            <w:proofErr w:type="spellEnd"/>
+            <w:r>
+              <w:rPr>
+                <w:lang w:val="en-US"/>
+              </w:rPr>
+              <w:t>.</w:t>
             </w:r>
             <w:r>
               <w:rPr>
@@ -11676,21 +12722,38 @@
               </w:rPr>
               <w:t xml:space="preserve"> </w:t>
             </w:r>
+            <w:proofErr w:type="spellStart"/>
             <w:r>
               <w:t>restricted_files</w:t>
             </w:r>
-            <w:r>
-              <w:rPr>
-                <w:lang w:val="en-US"/>
-              </w:rPr>
-              <w:t>.comments</w:t>
+            <w:proofErr w:type="spellEnd"/>
+            <w:r>
+              <w:rPr>
+                <w:lang w:val="en-US"/>
+              </w:rPr>
+              <w:t>.</w:t>
+            </w:r>
+            <w:proofErr w:type="spellStart"/>
+            <w:r>
+              <w:rPr>
+                <w:lang w:val="en-US"/>
+              </w:rPr>
+              <w:t>comments</w:t>
             </w:r>
             <w:r>
               <w:rPr>
                 <w:rFonts w:hint="eastAsia"/>
                 <w:lang w:val="en-US"/>
               </w:rPr>
-              <w:t>|length ==</w:t>
+              <w:t>|length</w:t>
+            </w:r>
+            <w:proofErr w:type="spellEnd"/>
+            <w:r>
+              <w:rPr>
+                <w:rFonts w:hint="eastAsia"/>
+                <w:lang w:val="en-US"/>
+              </w:rPr>
+              <w:t xml:space="preserve"> ==</w:t>
             </w:r>
             <w:r>
               <w:rPr>
@@ -11732,15 +12795,32 @@
           <w:p>
             <w:pPr>
               <w:rPr>
+                <w:u w:val="single"/>
                 <w:lang w:val="en-US"/>
               </w:rPr>
             </w:pPr>
             <w:r>
               <w:rPr>
                 <w:rFonts w:hint="eastAsia"/>
-                <w:lang w:val="en-US"/>
-              </w:rPr>
-              <w:t>Terms of Access applied to dataset:</w:t>
+                <w:u w:val="single"/>
+                <w:lang w:val="en-US"/>
+              </w:rPr>
+              <w:t xml:space="preserve">Terms of Access applied to </w:t>
+            </w:r>
+            <w:r>
+              <w:rPr>
+                <w:u w:val="single"/>
+                <w:lang w:val="en-US"/>
+              </w:rPr>
+              <w:t xml:space="preserve">the </w:t>
+            </w:r>
+            <w:r>
+              <w:rPr>
+                <w:rFonts w:hint="eastAsia"/>
+                <w:u w:val="single"/>
+                <w:lang w:val="en-US"/>
+              </w:rPr>
+              <w:t>dataset:</w:t>
             </w:r>
           </w:p>
           <w:tbl>
@@ -11750,7 +12830,7 @@
               <w:tblLook w:val="04A0" w:firstRow="1" w:lastRow="0" w:firstColumn="1" w:lastColumn="0" w:noHBand="0" w:noVBand="1"/>
             </w:tblPr>
             <w:tblGrid>
-              <w:gridCol w:w="3826"/>
+              <w:gridCol w:w="3795"/>
             </w:tblGrid>
             <w:tr>
               <w:tc>
@@ -11764,17 +12844,27 @@
                     </w:rPr>
                   </w:pPr>
                   <w:r>
-                    <w:t>{% if template_dict.terms_license.</w:t>
+                    <w:t xml:space="preserve">{% if </w:t>
+                  </w:r>
+                  <w:proofErr w:type="spellStart"/>
+                  <w:r>
+                    <w:t>template_dict.terms_license.</w:t>
                   </w:r>
                   <w:r>
                     <w:t>termsOfAccess</w:t>
                   </w:r>
+                  <w:proofErr w:type="spellEnd"/>
                   <w:r>
-                    <w:t xml:space="preserve"> is not none %}{{ template_dict.terms_license.</w:t>
+                    <w:t xml:space="preserve"> is not none %}{{ </w:t>
+                  </w:r>
+                  <w:proofErr w:type="spellStart"/>
+                  <w:r>
+                    <w:t>template_dict.terms_license.</w:t>
                   </w:r>
                   <w:r>
                     <w:t>termsOfAccess</w:t>
                   </w:r>
+                  <w:proofErr w:type="spellEnd"/>
                   <w:r>
                     <w:t xml:space="preserve"> }}{% else %}(NONE){% endif %}</w:t>
                   </w:r>
@@ -12027,7 +13117,15 @@
             <w:hideMark/>
           </w:tcPr>
           <w:p>
-            <w:r>
+            <w:pPr>
+              <w:rPr>
+                <w:u w:val="single"/>
+              </w:rPr>
+            </w:pPr>
+            <w:r>
+              <w:rPr>
+                <w:u w:val="single"/>
+              </w:rPr>
               <w:t>List files that have been flagged as potential third-party datasets:</w:t>
             </w:r>
           </w:p>
@@ -19221,6 +20319,7 @@
   <w:style w:type="character" w:default="1" w:styleId="DefaultParagraphFont">
     <w:name w:val="Default Paragraph Font"/>
     <w:uiPriority w:val="1"/>
+    <w:semiHidden/>
     <w:unhideWhenUsed/>
   </w:style>
   <w:style w:type="table" w:default="1" w:styleId="TableNormal">

</xml_diff>

<commit_message>
Update common file formats; Synced the checklists with the google doc version.
</commit_message>
<xml_diff>
--- a/res/template_high.docx
+++ b/res/template_high.docx
@@ -98,11 +98,26 @@
               <w:rPr>
                 <w:rFonts w:hint="eastAsia"/>
               </w:rPr>
-              <w:t xml:space="preserve">Ticket number: {{ </w:t>
+              <w:t xml:space="preserve">Ticket number: </w:t>
+            </w:r>
+            <w:proofErr w:type="gramStart"/>
+            <w:r>
+              <w:rPr>
+                <w:rFonts w:hint="eastAsia"/>
+              </w:rPr>
+              <w:t xml:space="preserve">{{ </w:t>
             </w:r>
             <w:proofErr w:type="spellStart"/>
             <w:r>
-              <w:t>project_info</w:t>
+              <w:t>project</w:t>
+            </w:r>
+            <w:proofErr w:type="gramEnd"/>
+            <w:r>
+              <w:t>_</w:t>
+            </w:r>
+            <w:proofErr w:type="gramStart"/>
+            <w:r>
+              <w:t>info</w:t>
             </w:r>
             <w:r>
               <w:rPr>
@@ -111,14 +126,29 @@
               <w:t>.</w:t>
             </w:r>
             <w:r>
-              <w:t>ticket_number</w:t>
+              <w:t>ticket</w:t>
+            </w:r>
+            <w:proofErr w:type="gramEnd"/>
+            <w:r>
+              <w:t>_</w:t>
+            </w:r>
+            <w:proofErr w:type="gramStart"/>
+            <w:r>
+              <w:t>number</w:t>
             </w:r>
             <w:proofErr w:type="spellEnd"/>
             <w:r>
               <w:rPr>
                 <w:rFonts w:hint="eastAsia"/>
               </w:rPr>
-              <w:t xml:space="preserve"> }}</w:t>
+              <w:t xml:space="preserve"> }</w:t>
+            </w:r>
+            <w:proofErr w:type="gramEnd"/>
+            <w:r>
+              <w:rPr>
+                <w:rFonts w:hint="eastAsia"/>
+              </w:rPr>
+              <w:t>}</w:t>
             </w:r>
           </w:p>
           <w:p>
@@ -141,24 +171,60 @@
               <w:rPr>
                 <w:rFonts w:hint="eastAsia"/>
               </w:rPr>
-              <w:t xml:space="preserve"> {{ </w:t>
+              <w:t xml:space="preserve"> </w:t>
+            </w:r>
+            <w:proofErr w:type="gramStart"/>
+            <w:r>
+              <w:rPr>
+                <w:rFonts w:hint="eastAsia"/>
+              </w:rPr>
+              <w:t xml:space="preserve">{{ </w:t>
             </w:r>
             <w:proofErr w:type="spellStart"/>
             <w:r>
-              <w:t>project_info</w:t>
+              <w:t>project</w:t>
+            </w:r>
+            <w:proofErr w:type="gramEnd"/>
+            <w:r>
+              <w:t>_</w:t>
+            </w:r>
+            <w:proofErr w:type="gramStart"/>
+            <w:r>
+              <w:t>info</w:t>
             </w:r>
             <w:r>
               <w:rPr>
                 <w:rFonts w:hint="eastAsia"/>
               </w:rPr>
-              <w:t>.curator_name</w:t>
+              <w:t>.curator</w:t>
+            </w:r>
+            <w:proofErr w:type="gramEnd"/>
+            <w:r>
+              <w:rPr>
+                <w:rFonts w:hint="eastAsia"/>
+              </w:rPr>
+              <w:t>_</w:t>
+            </w:r>
+            <w:proofErr w:type="gramStart"/>
+            <w:r>
+              <w:rPr>
+                <w:rFonts w:hint="eastAsia"/>
+              </w:rPr>
+              <w:t>name</w:t>
             </w:r>
             <w:proofErr w:type="spellEnd"/>
             <w:r>
               <w:rPr>
                 <w:rFonts w:hint="eastAsia"/>
               </w:rPr>
-              <w:t xml:space="preserve"> }}</w:t>
+              <w:t xml:space="preserve"> }</w:t>
+            </w:r>
+            <w:proofErr w:type="gramEnd"/>
+            <w:r>
+              <w:rPr>
+                <w:rFonts w:hint="eastAsia"/>
+              </w:rPr>
+              <w:t>}</w:t>
             </w:r>
           </w:p>
           <w:p>
@@ -169,11 +235,26 @@
               <w:rPr>
                 <w:rFonts w:hint="eastAsia"/>
               </w:rPr>
-              <w:t xml:space="preserve">Curator email: {{ </w:t>
+              <w:t xml:space="preserve">Curator email: </w:t>
+            </w:r>
+            <w:proofErr w:type="gramStart"/>
+            <w:r>
+              <w:rPr>
+                <w:rFonts w:hint="eastAsia"/>
+              </w:rPr>
+              <w:t xml:space="preserve">{{ </w:t>
             </w:r>
             <w:proofErr w:type="spellStart"/>
             <w:r>
-              <w:t>project_info</w:t>
+              <w:t>project</w:t>
+            </w:r>
+            <w:proofErr w:type="gramEnd"/>
+            <w:r>
+              <w:t>_</w:t>
+            </w:r>
+            <w:proofErr w:type="gramStart"/>
+            <w:r>
+              <w:t>info</w:t>
             </w:r>
             <w:r>
               <w:rPr>
@@ -182,14 +263,29 @@
               <w:t>.</w:t>
             </w:r>
             <w:r>
-              <w:t>curator_email</w:t>
+              <w:t>curator</w:t>
+            </w:r>
+            <w:proofErr w:type="gramEnd"/>
+            <w:r>
+              <w:t>_</w:t>
+            </w:r>
+            <w:proofErr w:type="gramStart"/>
+            <w:r>
+              <w:t>email</w:t>
             </w:r>
             <w:proofErr w:type="spellEnd"/>
             <w:r>
               <w:rPr>
                 <w:rFonts w:hint="eastAsia"/>
               </w:rPr>
-              <w:t xml:space="preserve"> }}</w:t>
+              <w:t xml:space="preserve"> }</w:t>
+            </w:r>
+            <w:proofErr w:type="gramEnd"/>
+            <w:r>
+              <w:rPr>
+                <w:rFonts w:hint="eastAsia"/>
+              </w:rPr>
+              <w:t>}</w:t>
             </w:r>
           </w:p>
           <w:p>
@@ -200,15 +296,30 @@
               <w:rPr>
                 <w:rFonts w:hint="eastAsia"/>
               </w:rPr>
-              <w:t xml:space="preserve">Dataset title: {{ </w:t>
+              <w:t xml:space="preserve">Dataset title: </w:t>
+            </w:r>
+            <w:proofErr w:type="gramStart"/>
+            <w:r>
+              <w:rPr>
+                <w:rFonts w:hint="eastAsia"/>
+              </w:rPr>
+              <w:t xml:space="preserve">{{ </w:t>
             </w:r>
             <w:proofErr w:type="spellStart"/>
             <w:r>
               <w:rPr>
                 <w:rFonts w:hint="eastAsia"/>
               </w:rPr>
-              <w:t>dataset.</w:t>
-            </w:r>
+              <w:t>dataset</w:t>
+            </w:r>
+            <w:proofErr w:type="gramEnd"/>
+            <w:r>
+              <w:rPr>
+                <w:rFonts w:hint="eastAsia"/>
+              </w:rPr>
+              <w:t>.</w:t>
+            </w:r>
+            <w:proofErr w:type="gramStart"/>
             <w:r>
               <w:t>DatasetTitle</w:t>
             </w:r>
@@ -217,7 +328,14 @@
               <w:rPr>
                 <w:rFonts w:hint="eastAsia"/>
               </w:rPr>
-              <w:t xml:space="preserve"> }}</w:t>
+              <w:t xml:space="preserve"> }</w:t>
+            </w:r>
+            <w:proofErr w:type="gramEnd"/>
+            <w:r>
+              <w:rPr>
+                <w:rFonts w:hint="eastAsia"/>
+              </w:rPr>
+              <w:t>}</w:t>
             </w:r>
           </w:p>
           <w:p>
@@ -237,15 +355,30 @@
               <w:rPr>
                 <w:rFonts w:hint="eastAsia"/>
               </w:rPr>
-              <w:t xml:space="preserve"> identifier: {{ </w:t>
+              <w:t xml:space="preserve"> identifier: </w:t>
+            </w:r>
+            <w:proofErr w:type="gramStart"/>
+            <w:r>
+              <w:rPr>
+                <w:rFonts w:hint="eastAsia"/>
+              </w:rPr>
+              <w:t xml:space="preserve">{{ </w:t>
             </w:r>
             <w:proofErr w:type="spellStart"/>
             <w:r>
               <w:rPr>
                 <w:rFonts w:hint="eastAsia"/>
               </w:rPr>
-              <w:t>dataset.</w:t>
-            </w:r>
+              <w:t>dataset</w:t>
+            </w:r>
+            <w:proofErr w:type="gramEnd"/>
+            <w:r>
+              <w:rPr>
+                <w:rFonts w:hint="eastAsia"/>
+              </w:rPr>
+              <w:t>.</w:t>
+            </w:r>
+            <w:proofErr w:type="gramStart"/>
             <w:r>
               <w:t>DatasetPersistentId</w:t>
             </w:r>
@@ -254,7 +387,14 @@
               <w:rPr>
                 <w:rFonts w:hint="eastAsia"/>
               </w:rPr>
-              <w:t xml:space="preserve">  }}</w:t>
+              <w:t xml:space="preserve">  }</w:t>
+            </w:r>
+            <w:proofErr w:type="gramEnd"/>
+            <w:r>
+              <w:rPr>
+                <w:rFonts w:hint="eastAsia"/>
+              </w:rPr>
+              <w:t>}</w:t>
             </w:r>
           </w:p>
           <w:p>
@@ -265,7 +405,21 @@
               <w:rPr>
                 <w:rFonts w:hint="eastAsia"/>
               </w:rPr>
-              <w:t>Dataset ID (versioned): {{ dataset.ID  }}</w:t>
+              <w:t xml:space="preserve">Dataset ID (versioned): </w:t>
+            </w:r>
+            <w:proofErr w:type="gramStart"/>
+            <w:r>
+              <w:rPr>
+                <w:rFonts w:hint="eastAsia"/>
+              </w:rPr>
+              <w:t>{{ dataset.ID  }</w:t>
+            </w:r>
+            <w:proofErr w:type="gramEnd"/>
+            <w:r>
+              <w:rPr>
+                <w:rFonts w:hint="eastAsia"/>
+              </w:rPr>
+              <w:t>}</w:t>
             </w:r>
           </w:p>
           <w:p>
@@ -276,15 +430,30 @@
               <w:rPr>
                 <w:rFonts w:hint="eastAsia"/>
               </w:rPr>
-              <w:t xml:space="preserve">Dataset access URL: {{ </w:t>
+              <w:t xml:space="preserve">Dataset access URL: </w:t>
+            </w:r>
+            <w:proofErr w:type="gramStart"/>
+            <w:r>
+              <w:rPr>
+                <w:rFonts w:hint="eastAsia"/>
+              </w:rPr>
+              <w:t xml:space="preserve">{{ </w:t>
             </w:r>
             <w:proofErr w:type="spellStart"/>
             <w:r>
               <w:rPr>
                 <w:rFonts w:hint="eastAsia"/>
               </w:rPr>
-              <w:t>dataset.</w:t>
-            </w:r>
+              <w:t>dataset</w:t>
+            </w:r>
+            <w:proofErr w:type="gramEnd"/>
+            <w:r>
+              <w:rPr>
+                <w:rFonts w:hint="eastAsia"/>
+              </w:rPr>
+              <w:t>.</w:t>
+            </w:r>
+            <w:proofErr w:type="gramStart"/>
             <w:r>
               <w:t>DatasetURL</w:t>
             </w:r>
@@ -293,7 +462,14 @@
               <w:rPr>
                 <w:rFonts w:hint="eastAsia"/>
               </w:rPr>
-              <w:t xml:space="preserve"> }}</w:t>
+              <w:t xml:space="preserve"> }</w:t>
+            </w:r>
+            <w:proofErr w:type="gramEnd"/>
+            <w:r>
+              <w:rPr>
+                <w:rFonts w:hint="eastAsia"/>
+              </w:rPr>
+              <w:t>}</w:t>
             </w:r>
           </w:p>
           <w:p>
@@ -313,7 +489,21 @@
               <w:rPr>
                 <w:rFonts w:hint="eastAsia"/>
               </w:rPr>
-              <w:t xml:space="preserve"> generated date: {{ timestamp }}</w:t>
+              <w:t xml:space="preserve"> generated date: </w:t>
+            </w:r>
+            <w:proofErr w:type="gramStart"/>
+            <w:r>
+              <w:rPr>
+                <w:rFonts w:hint="eastAsia"/>
+              </w:rPr>
+              <w:t>{{ timestamp</w:t>
+            </w:r>
+            <w:proofErr w:type="gramEnd"/>
+            <w:r>
+              <w:rPr>
+                <w:rFonts w:hint="eastAsia"/>
+              </w:rPr>
+              <w:t xml:space="preserve"> }}</w:t>
             </w:r>
           </w:p>
           <w:p>
@@ -1086,7 +1276,21 @@
                 <w:b/>
                 <w:bCs/>
               </w:rPr>
-              <w:t>Has the depositor (or their research group) previously created or submitted to a dataverse?</w:t>
+              <w:t>Has the depositor (or their research group) previously created or submitted to a dataverse</w:t>
+            </w:r>
+            <w:r>
+              <w:rPr>
+                <w:b/>
+                <w:bCs/>
+              </w:rPr>
+              <w:t xml:space="preserve"> collection</w:t>
+            </w:r>
+            <w:r>
+              <w:rPr>
+                <w:b/>
+                <w:bCs/>
+              </w:rPr>
+              <w:t>?</w:t>
             </w:r>
           </w:p>
         </w:tc>
@@ -1264,7 +1468,21 @@
                 <w:u w:val="single"/>
                 <w:lang w:val="en-US"/>
               </w:rPr>
-              <w:t xml:space="preserve">If applicable, list any previously created </w:t>
+              <w:t>L</w:t>
+            </w:r>
+            <w:r>
+              <w:rPr>
+                <w:u w:val="single"/>
+                <w:lang w:val="en-US"/>
+              </w:rPr>
+              <w:t xml:space="preserve">ist </w:t>
+            </w:r>
+            <w:r>
+              <w:rPr>
+                <w:u w:val="single"/>
+                <w:lang w:val="en-US"/>
+              </w:rPr>
+              <w:t xml:space="preserve">all </w:t>
             </w:r>
             <w:proofErr w:type="spellStart"/>
             <w:r>
@@ -1314,9 +1532,22 @@
             </w:r>
             <w:proofErr w:type="spellStart"/>
             <w:r>
-              <w:t>template_dict.dv_record.comments</w:t>
+              <w:t>template_</w:t>
+            </w:r>
+            <w:proofErr w:type="gramStart"/>
+            <w:r>
+              <w:t>dict.dv</w:t>
+            </w:r>
+            <w:proofErr w:type="gramEnd"/>
+            <w:r>
+              <w:t>_</w:t>
+            </w:r>
+            <w:proofErr w:type="gramStart"/>
+            <w:r>
+              <w:t>record.comments</w:t>
             </w:r>
             <w:proofErr w:type="spellEnd"/>
+            <w:proofErr w:type="gramEnd"/>
             <w:r>
               <w:t xml:space="preserve"> %} </w:t>
             </w:r>
@@ -1334,12 +1565,22 @@
               <w:t xml:space="preserve"> in </w:t>
             </w:r>
             <w:proofErr w:type="spellStart"/>
+            <w:proofErr w:type="gramStart"/>
             <w:r>
               <w:t>item.items</w:t>
             </w:r>
             <w:proofErr w:type="spellEnd"/>
-            <w:r>
-              <w:t>() %} {{ author }}</w:t>
+            <w:proofErr w:type="gramEnd"/>
+            <w:r>
+              <w:t xml:space="preserve">() %} </w:t>
+            </w:r>
+            <w:proofErr w:type="gramStart"/>
+            <w:r>
+              <w:t>{{ author</w:t>
+            </w:r>
+            <w:proofErr w:type="gramEnd"/>
+            <w:r>
+              <w:t xml:space="preserve"> }}</w:t>
             </w:r>
             <w:r>
               <w:rPr>
@@ -1360,16 +1601,29 @@
             <w:r>
               <w:t xml:space="preserve"> %} </w:t>
             </w:r>
+            <w:proofErr w:type="gramStart"/>
             <w:r>
               <w:t xml:space="preserve">{{ </w:t>
             </w:r>
             <w:proofErr w:type="spellStart"/>
             <w:r>
-              <w:t>loop.index</w:t>
+              <w:t>loop</w:t>
+            </w:r>
+            <w:proofErr w:type="gramEnd"/>
+            <w:r>
+              <w:t>.</w:t>
+            </w:r>
+            <w:proofErr w:type="gramStart"/>
+            <w:r>
+              <w:t>index</w:t>
             </w:r>
             <w:proofErr w:type="spellEnd"/>
             <w:r>
-              <w:t xml:space="preserve"> }}.</w:t>
+              <w:t xml:space="preserve"> }</w:t>
+            </w:r>
+            <w:proofErr w:type="gramEnd"/>
+            <w:r>
+              <w:t>}.</w:t>
             </w:r>
             <w:r>
               <w:rPr>
@@ -1377,8 +1631,13 @@
               </w:rPr>
               <w:t xml:space="preserve"> </w:t>
             </w:r>
-            <w:r>
-              <w:t>{{ dataverse }}</w:t>
+            <w:proofErr w:type="gramStart"/>
+            <w:r>
+              <w:t>{{ dataverse</w:t>
+            </w:r>
+            <w:proofErr w:type="gramEnd"/>
+            <w:r>
+              <w:t xml:space="preserve"> }}</w:t>
             </w:r>
             <w:r>
               <w:br/>
@@ -1750,6 +2009,7 @@
               </w:rPr>
               <w:br/>
             </w:r>
+            <w:proofErr w:type="gramStart"/>
             <w:r>
               <w:rPr>
                 <w:rFonts w:hint="eastAsia"/>
@@ -1773,7 +2033,21 @@
               <w:rPr>
                 <w:lang w:val="en-US"/>
               </w:rPr>
-              <w:t>ds_tree_info</w:t>
+              <w:t>ds</w:t>
+            </w:r>
+            <w:proofErr w:type="gramEnd"/>
+            <w:r>
+              <w:rPr>
+                <w:lang w:val="en-US"/>
+              </w:rPr>
+              <w:t>_tree_</w:t>
+            </w:r>
+            <w:proofErr w:type="gramStart"/>
+            <w:r>
+              <w:rPr>
+                <w:lang w:val="en-US"/>
+              </w:rPr>
+              <w:t>info</w:t>
             </w:r>
             <w:r>
               <w:rPr>
@@ -1788,6 +2062,7 @@
               <w:t>parentDataverseName</w:t>
             </w:r>
             <w:proofErr w:type="spellEnd"/>
+            <w:proofErr w:type="gramEnd"/>
             <w:r>
               <w:rPr>
                 <w:rFonts w:hint="eastAsia"/>
@@ -1811,6 +2086,7 @@
             <w:r>
               <w:br/>
             </w:r>
+            <w:proofErr w:type="gramStart"/>
             <w:r>
               <w:rPr>
                 <w:lang w:val="en-US"/>
@@ -1830,9 +2106,24 @@
               <w:rPr>
                 <w:lang w:val="en-US"/>
               </w:rPr>
-              <w:t>ds_tree_info.path</w:t>
+              <w:t>ds</w:t>
+            </w:r>
+            <w:proofErr w:type="gramEnd"/>
+            <w:r>
+              <w:rPr>
+                <w:lang w:val="en-US"/>
+              </w:rPr>
+              <w:t>_tree_</w:t>
+            </w:r>
+            <w:proofErr w:type="gramStart"/>
+            <w:r>
+              <w:rPr>
+                <w:lang w:val="en-US"/>
+              </w:rPr>
+              <w:t>info.path</w:t>
             </w:r>
             <w:proofErr w:type="spellEnd"/>
+            <w:proofErr w:type="gramEnd"/>
             <w:r>
               <w:t>}}</w:t>
             </w:r>
@@ -2008,7 +2299,15 @@
             </w:r>
             <w:r>
               <w:lastRenderedPageBreak/>
-              <w:t>depositor that they actually require a dataverse (e.g., will there be future deposits?)</w:t>
+              <w:t xml:space="preserve">depositor that they </w:t>
+            </w:r>
+            <w:proofErr w:type="gramStart"/>
+            <w:r>
+              <w:t>actually require</w:t>
+            </w:r>
+            <w:proofErr w:type="gramEnd"/>
+            <w:r>
+              <w:t xml:space="preserve"> a dataverse (e.g., will there be future deposits?)</w:t>
             </w:r>
           </w:p>
         </w:tc>
@@ -2585,14 +2884,56 @@
               <w:rPr>
                 <w:lang w:val="en-US"/>
               </w:rPr>
-              <w:t>template_dict.file_ext.comments|length</w:t>
+              <w:t>template_</w:t>
+            </w:r>
+            <w:proofErr w:type="gramStart"/>
+            <w:r>
+              <w:rPr>
+                <w:lang w:val="en-US"/>
+              </w:rPr>
+              <w:t>dict.file</w:t>
+            </w:r>
+            <w:proofErr w:type="gramEnd"/>
+            <w:r>
+              <w:rPr>
+                <w:lang w:val="en-US"/>
+              </w:rPr>
+              <w:t>_</w:t>
+            </w:r>
+            <w:proofErr w:type="gramStart"/>
+            <w:r>
+              <w:rPr>
+                <w:lang w:val="en-US"/>
+              </w:rPr>
+              <w:t>ext.comments</w:t>
+            </w:r>
+            <w:proofErr w:type="gramEnd"/>
+            <w:r>
+              <w:rPr>
+                <w:lang w:val="en-US"/>
+              </w:rPr>
+              <w:t>|length</w:t>
             </w:r>
             <w:proofErr w:type="spellEnd"/>
             <w:r>
               <w:rPr>
                 <w:lang w:val="en-US"/>
               </w:rPr>
-              <w:t xml:space="preserve"> == 0 %}X{% endif %}</w:t>
+              <w:t xml:space="preserve"> == 0 %}</w:t>
+            </w:r>
+            <w:proofErr w:type="gramStart"/>
+            <w:r>
+              <w:rPr>
+                <w:lang w:val="en-US"/>
+              </w:rPr>
+              <w:t>X{</w:t>
+            </w:r>
+            <w:proofErr w:type="gramEnd"/>
+            <w:r>
+              <w:rPr>
+                <w:lang w:val="en-US"/>
+              </w:rPr>
+              <w:t>% endif %}</w:t>
             </w:r>
           </w:p>
         </w:tc>
@@ -2625,14 +2966,56 @@
               <w:rPr>
                 <w:lang w:val="en-US"/>
               </w:rPr>
-              <w:t>template_dict.file_ext.comments|length</w:t>
+              <w:t>template_</w:t>
+            </w:r>
+            <w:proofErr w:type="gramStart"/>
+            <w:r>
+              <w:rPr>
+                <w:lang w:val="en-US"/>
+              </w:rPr>
+              <w:t>dict.file</w:t>
+            </w:r>
+            <w:proofErr w:type="gramEnd"/>
+            <w:r>
+              <w:rPr>
+                <w:lang w:val="en-US"/>
+              </w:rPr>
+              <w:t>_</w:t>
+            </w:r>
+            <w:proofErr w:type="gramStart"/>
+            <w:r>
+              <w:rPr>
+                <w:lang w:val="en-US"/>
+              </w:rPr>
+              <w:t>ext.comments</w:t>
+            </w:r>
+            <w:proofErr w:type="gramEnd"/>
+            <w:r>
+              <w:rPr>
+                <w:lang w:val="en-US"/>
+              </w:rPr>
+              <w:t>|length</w:t>
             </w:r>
             <w:proofErr w:type="spellEnd"/>
             <w:r>
               <w:rPr>
                 <w:lang w:val="en-US"/>
               </w:rPr>
-              <w:t xml:space="preserve"> &gt; 0 %}X{% endif %}</w:t>
+              <w:t xml:space="preserve"> &gt; 0 %}</w:t>
+            </w:r>
+            <w:proofErr w:type="gramStart"/>
+            <w:r>
+              <w:rPr>
+                <w:lang w:val="en-US"/>
+              </w:rPr>
+              <w:t>X{</w:t>
+            </w:r>
+            <w:proofErr w:type="gramEnd"/>
+            <w:r>
+              <w:rPr>
+                <w:lang w:val="en-US"/>
+              </w:rPr>
+              <w:t>% endif %}</w:t>
             </w:r>
           </w:p>
         </w:tc>
@@ -2736,29 +3119,84 @@
               <w:rPr>
                 <w:lang w:val="en-US"/>
               </w:rPr>
-              <w:t>template_dict.file_open.comments</w:t>
+              <w:t>template_</w:t>
+            </w:r>
+            <w:proofErr w:type="gramStart"/>
+            <w:r>
+              <w:rPr>
+                <w:lang w:val="en-US"/>
+              </w:rPr>
+              <w:t>dict.file</w:t>
+            </w:r>
+            <w:proofErr w:type="gramEnd"/>
+            <w:r>
+              <w:rPr>
+                <w:lang w:val="en-US"/>
+              </w:rPr>
+              <w:t>_</w:t>
+            </w:r>
+            <w:proofErr w:type="gramStart"/>
+            <w:r>
+              <w:rPr>
+                <w:lang w:val="en-US"/>
+              </w:rPr>
+              <w:t>open.comments</w:t>
             </w:r>
             <w:proofErr w:type="spellEnd"/>
+            <w:proofErr w:type="gramEnd"/>
             <w:r>
               <w:t xml:space="preserve"> |length &gt; 0</w:t>
             </w:r>
             <w:r>
-              <w:t xml:space="preserve"> %}</w:t>
-            </w:r>
-            <w:r>
-              <w:rPr>
-                <w:lang w:val="en-US"/>
-              </w:rPr>
-              <w:t xml:space="preserve">{% for item in </w:t>
+              <w:t xml:space="preserve"> </w:t>
+            </w:r>
+            <w:proofErr w:type="gramStart"/>
+            <w:r>
+              <w:t>%}</w:t>
+            </w:r>
+            <w:r>
+              <w:rPr>
+                <w:lang w:val="en-US"/>
+              </w:rPr>
+              <w:t>{</w:t>
+            </w:r>
+            <w:proofErr w:type="gramEnd"/>
+            <w:r>
+              <w:rPr>
+                <w:lang w:val="en-US"/>
+              </w:rPr>
+              <w:t xml:space="preserve">% for item in </w:t>
             </w:r>
             <w:proofErr w:type="spellStart"/>
             <w:r>
               <w:rPr>
                 <w:lang w:val="en-US"/>
               </w:rPr>
-              <w:t>template_dict.file_open.comments</w:t>
+              <w:t>template_</w:t>
+            </w:r>
+            <w:proofErr w:type="gramStart"/>
+            <w:r>
+              <w:rPr>
+                <w:lang w:val="en-US"/>
+              </w:rPr>
+              <w:t>dict.file</w:t>
+            </w:r>
+            <w:proofErr w:type="gramEnd"/>
+            <w:r>
+              <w:rPr>
+                <w:lang w:val="en-US"/>
+              </w:rPr>
+              <w:t>_</w:t>
+            </w:r>
+            <w:proofErr w:type="gramStart"/>
+            <w:r>
+              <w:rPr>
+                <w:lang w:val="en-US"/>
+              </w:rPr>
+              <w:t>open.comments</w:t>
             </w:r>
             <w:proofErr w:type="spellEnd"/>
+            <w:proofErr w:type="gramEnd"/>
             <w:r>
               <w:rPr>
                 <w:lang w:val="en-US"/>
@@ -2777,6 +3215,7 @@
                 <w:lang w:val="en-US"/>
               </w:rPr>
             </w:pPr>
+            <w:proofErr w:type="gramStart"/>
             <w:r>
               <w:rPr>
                 <w:lang w:val="en-US"/>
@@ -2788,16 +3227,38 @@
               <w:rPr>
                 <w:lang w:val="en-US"/>
               </w:rPr>
-              <w:t>item.file_name</w:t>
+              <w:t>item</w:t>
+            </w:r>
+            <w:proofErr w:type="gramEnd"/>
+            <w:r>
+              <w:rPr>
+                <w:lang w:val="en-US"/>
+              </w:rPr>
+              <w:t>.file_</w:t>
+            </w:r>
+            <w:proofErr w:type="gramStart"/>
+            <w:r>
+              <w:rPr>
+                <w:lang w:val="en-US"/>
+              </w:rPr>
+              <w:t>name</w:t>
             </w:r>
             <w:proofErr w:type="spellEnd"/>
             <w:r>
               <w:rPr>
                 <w:lang w:val="en-US"/>
               </w:rPr>
-              <w:t xml:space="preserve"> }}{% </w:t>
+              <w:t xml:space="preserve"> }}{</w:t>
+            </w:r>
+            <w:proofErr w:type="gramEnd"/>
+            <w:r>
+              <w:rPr>
+                <w:lang w:val="en-US"/>
+              </w:rPr>
+              <w:t xml:space="preserve">% </w:t>
             </w:r>
             <w:proofErr w:type="spellStart"/>
+            <w:proofErr w:type="gramStart"/>
             <w:r>
               <w:rPr>
                 <w:lang w:val="en-US"/>
@@ -2811,6 +3272,7 @@
               </w:rPr>
               <w:t xml:space="preserve"> %}</w:t>
             </w:r>
+            <w:proofErr w:type="gramEnd"/>
           </w:p>
           <w:p>
             <w:pPr>
@@ -2819,7 +3281,23 @@
               </w:rPr>
             </w:pPr>
             <w:r>
-              <w:t>{% else %}(NONE){% endif %}</w:t>
+              <w:t xml:space="preserve">{% else </w:t>
+            </w:r>
+            <w:proofErr w:type="gramStart"/>
+            <w:r>
+              <w:t>%}(</w:t>
+            </w:r>
+            <w:proofErr w:type="gramEnd"/>
+            <w:r>
+              <w:t>NONE</w:t>
+            </w:r>
+            <w:proofErr w:type="gramStart"/>
+            <w:r>
+              <w:t>){</w:t>
+            </w:r>
+            <w:proofErr w:type="gramEnd"/>
+            <w:r>
+              <w:t>% endif %}</w:t>
             </w:r>
           </w:p>
           <w:p>
@@ -2856,28 +3334,47 @@
               <w:t xml:space="preserve"> |length &gt; 0</w:t>
             </w:r>
             <w:r>
+              <w:t xml:space="preserve"> </w:t>
+            </w:r>
+            <w:proofErr w:type="gramStart"/>
+            <w:r>
+              <w:t>%}</w:t>
+            </w:r>
+            <w:r>
+              <w:rPr>
+                <w:lang w:val="en-US"/>
+              </w:rPr>
+              <w:t>{</w:t>
+            </w:r>
+            <w:proofErr w:type="gramEnd"/>
+            <w:r>
+              <w:rPr>
+                <w:lang w:val="en-US"/>
+              </w:rPr>
+              <w:t xml:space="preserve">% for item in </w:t>
+            </w:r>
+            <w:proofErr w:type="spellStart"/>
+            <w:r>
+              <w:rPr>
+                <w:lang w:val="en-US"/>
+              </w:rPr>
+              <w:t>template_dict.file_open.not_</w:t>
+            </w:r>
+            <w:proofErr w:type="gramStart"/>
+            <w:r>
+              <w:rPr>
+                <w:lang w:val="en-US"/>
+              </w:rPr>
+              <w:t>checked</w:t>
+            </w:r>
+            <w:proofErr w:type="spellEnd"/>
+            <w:r>
+              <w:rPr>
+                <w:lang w:val="en-US"/>
+              </w:rPr>
               <w:t xml:space="preserve"> %}</w:t>
             </w:r>
-            <w:r>
-              <w:rPr>
-                <w:lang w:val="en-US"/>
-              </w:rPr>
-              <w:t xml:space="preserve">{% for item in </w:t>
-            </w:r>
-            <w:proofErr w:type="spellStart"/>
-            <w:r>
-              <w:rPr>
-                <w:lang w:val="en-US"/>
-              </w:rPr>
-              <w:t>template_dict.file_open.not_checked</w:t>
-            </w:r>
-            <w:proofErr w:type="spellEnd"/>
-            <w:r>
-              <w:rPr>
-                <w:lang w:val="en-US"/>
-              </w:rPr>
-              <w:t xml:space="preserve"> %}</w:t>
-            </w:r>
+            <w:proofErr w:type="gramEnd"/>
           </w:p>
           <w:p>
             <w:pPr>
@@ -2890,6 +3387,7 @@
                 <w:lang w:val="en-US"/>
               </w:rPr>
             </w:pPr>
+            <w:proofErr w:type="gramStart"/>
             <w:r>
               <w:rPr>
                 <w:lang w:val="en-US"/>
@@ -2901,16 +3399,38 @@
               <w:rPr>
                 <w:lang w:val="en-US"/>
               </w:rPr>
-              <w:t>item.file_name</w:t>
+              <w:t>item</w:t>
+            </w:r>
+            <w:proofErr w:type="gramEnd"/>
+            <w:r>
+              <w:rPr>
+                <w:lang w:val="en-US"/>
+              </w:rPr>
+              <w:t>.file_</w:t>
+            </w:r>
+            <w:proofErr w:type="gramStart"/>
+            <w:r>
+              <w:rPr>
+                <w:lang w:val="en-US"/>
+              </w:rPr>
+              <w:t>name</w:t>
             </w:r>
             <w:proofErr w:type="spellEnd"/>
             <w:r>
               <w:rPr>
                 <w:lang w:val="en-US"/>
               </w:rPr>
-              <w:t xml:space="preserve"> }}{% </w:t>
+              <w:t xml:space="preserve"> }}{</w:t>
+            </w:r>
+            <w:proofErr w:type="gramEnd"/>
+            <w:r>
+              <w:rPr>
+                <w:lang w:val="en-US"/>
+              </w:rPr>
+              <w:t xml:space="preserve">% </w:t>
             </w:r>
             <w:proofErr w:type="spellStart"/>
+            <w:proofErr w:type="gramStart"/>
             <w:r>
               <w:rPr>
                 <w:lang w:val="en-US"/>
@@ -2924,10 +3444,27 @@
               </w:rPr>
               <w:t xml:space="preserve"> %}</w:t>
             </w:r>
-          </w:p>
-          <w:p>
-            <w:r>
-              <w:t>{% else %}(NONE){% endif %}</w:t>
+            <w:proofErr w:type="gramEnd"/>
+          </w:p>
+          <w:p>
+            <w:r>
+              <w:t xml:space="preserve">{% else </w:t>
+            </w:r>
+            <w:proofErr w:type="gramStart"/>
+            <w:r>
+              <w:t>%}(</w:t>
+            </w:r>
+            <w:proofErr w:type="gramEnd"/>
+            <w:r>
+              <w:t>NONE</w:t>
+            </w:r>
+            <w:proofErr w:type="gramStart"/>
+            <w:r>
+              <w:t>){</w:t>
+            </w:r>
+            <w:proofErr w:type="gramEnd"/>
+            <w:r>
+              <w:t>% endif %}</w:t>
             </w:r>
           </w:p>
         </w:tc>
@@ -3046,14 +3583,24 @@
                 <w:bCs/>
                 <w:lang w:val="en-US"/>
               </w:rPr>
-              <w:t>&lt;&gt;:"/\|?*</w:t>
-            </w:r>
+              <w:t>&lt;&gt;:"/\</w:t>
+            </w:r>
+            <w:proofErr w:type="gramStart"/>
             <w:r>
               <w:rPr>
                 <w:b/>
                 <w:bCs/>
                 <w:lang w:val="en-US"/>
               </w:rPr>
+              <w:t>|?*</w:t>
+            </w:r>
+            <w:proofErr w:type="gramEnd"/>
+            <w:r>
+              <w:rPr>
+                <w:b/>
+                <w:bCs/>
+                <w:lang w:val="en-US"/>
+              </w:rPr>
               <w:t>,@$~)?</w:t>
             </w:r>
           </w:p>
@@ -3112,14 +3659,56 @@
               <w:rPr>
                 <w:lang w:val="en-US"/>
               </w:rPr>
-              <w:t>template_dict.special_characters.comments|length</w:t>
+              <w:t>template_</w:t>
+            </w:r>
+            <w:proofErr w:type="gramStart"/>
+            <w:r>
+              <w:rPr>
+                <w:lang w:val="en-US"/>
+              </w:rPr>
+              <w:t>dict.special</w:t>
+            </w:r>
+            <w:proofErr w:type="gramEnd"/>
+            <w:r>
+              <w:rPr>
+                <w:lang w:val="en-US"/>
+              </w:rPr>
+              <w:t>_</w:t>
+            </w:r>
+            <w:proofErr w:type="gramStart"/>
+            <w:r>
+              <w:rPr>
+                <w:lang w:val="en-US"/>
+              </w:rPr>
+              <w:t>characters.comments</w:t>
+            </w:r>
+            <w:proofErr w:type="gramEnd"/>
+            <w:r>
+              <w:rPr>
+                <w:lang w:val="en-US"/>
+              </w:rPr>
+              <w:t>|length</w:t>
             </w:r>
             <w:proofErr w:type="spellEnd"/>
             <w:r>
               <w:rPr>
                 <w:lang w:val="en-US"/>
               </w:rPr>
-              <w:t xml:space="preserve"> == 0 %}X{% endif %}</w:t>
+              <w:t xml:space="preserve"> == 0 %}</w:t>
+            </w:r>
+            <w:proofErr w:type="gramStart"/>
+            <w:r>
+              <w:rPr>
+                <w:lang w:val="en-US"/>
+              </w:rPr>
+              <w:t>X{</w:t>
+            </w:r>
+            <w:proofErr w:type="gramEnd"/>
+            <w:r>
+              <w:rPr>
+                <w:lang w:val="en-US"/>
+              </w:rPr>
+              <w:t>% endif %}</w:t>
             </w:r>
           </w:p>
         </w:tc>
@@ -3173,14 +3762,56 @@
               <w:rPr>
                 <w:lang w:val="en-US"/>
               </w:rPr>
-              <w:t>template_dict.special_characters.comments|length</w:t>
+              <w:t>template_</w:t>
+            </w:r>
+            <w:proofErr w:type="gramStart"/>
+            <w:r>
+              <w:rPr>
+                <w:lang w:val="en-US"/>
+              </w:rPr>
+              <w:t>dict.special</w:t>
+            </w:r>
+            <w:proofErr w:type="gramEnd"/>
+            <w:r>
+              <w:rPr>
+                <w:lang w:val="en-US"/>
+              </w:rPr>
+              <w:t>_</w:t>
+            </w:r>
+            <w:proofErr w:type="gramStart"/>
+            <w:r>
+              <w:rPr>
+                <w:lang w:val="en-US"/>
+              </w:rPr>
+              <w:t>characters.comments</w:t>
+            </w:r>
+            <w:proofErr w:type="gramEnd"/>
+            <w:r>
+              <w:rPr>
+                <w:lang w:val="en-US"/>
+              </w:rPr>
+              <w:t>|length</w:t>
             </w:r>
             <w:proofErr w:type="spellEnd"/>
             <w:r>
               <w:rPr>
                 <w:lang w:val="en-US"/>
               </w:rPr>
-              <w:t xml:space="preserve"> &gt; 0 %}X{% endif %}</w:t>
+              <w:t xml:space="preserve"> &gt; 0 %}</w:t>
+            </w:r>
+            <w:proofErr w:type="gramStart"/>
+            <w:r>
+              <w:rPr>
+                <w:lang w:val="en-US"/>
+              </w:rPr>
+              <w:t>X{</w:t>
+            </w:r>
+            <w:proofErr w:type="gramEnd"/>
+            <w:r>
+              <w:rPr>
+                <w:lang w:val="en-US"/>
+              </w:rPr>
+              <w:t>% endif %}</w:t>
             </w:r>
           </w:p>
         </w:tc>
@@ -3265,7 +3896,19 @@
             </w:r>
             <w:proofErr w:type="spellStart"/>
             <w:r>
-              <w:t>template_dict.restricted_files.comment</w:t>
+              <w:t>template_</w:t>
+            </w:r>
+            <w:proofErr w:type="gramStart"/>
+            <w:r>
+              <w:t>dict.restricted</w:t>
+            </w:r>
+            <w:proofErr w:type="gramEnd"/>
+            <w:r>
+              <w:t>_</w:t>
+            </w:r>
+            <w:proofErr w:type="gramStart"/>
+            <w:r>
+              <w:t>files.comment</w:t>
             </w:r>
             <w:r>
               <w:rPr>
@@ -3273,6 +3916,7 @@
               </w:rPr>
               <w:t>s</w:t>
             </w:r>
+            <w:proofErr w:type="gramEnd"/>
             <w:r>
               <w:t>|length</w:t>
             </w:r>
@@ -3281,22 +3925,55 @@
               <w:t xml:space="preserve"> &gt; 0</w:t>
             </w:r>
             <w:r>
-              <w:t xml:space="preserve"> %}</w:t>
-            </w:r>
-            <w:r>
-              <w:rPr>
-                <w:lang w:val="en-US"/>
-              </w:rPr>
-              <w:t xml:space="preserve">{% for item in </w:t>
+              <w:t xml:space="preserve"> </w:t>
+            </w:r>
+            <w:proofErr w:type="gramStart"/>
+            <w:r>
+              <w:t>%}</w:t>
+            </w:r>
+            <w:r>
+              <w:rPr>
+                <w:lang w:val="en-US"/>
+              </w:rPr>
+              <w:t>{</w:t>
+            </w:r>
+            <w:proofErr w:type="gramEnd"/>
+            <w:r>
+              <w:rPr>
+                <w:lang w:val="en-US"/>
+              </w:rPr>
+              <w:t xml:space="preserve">% for item in </w:t>
             </w:r>
             <w:proofErr w:type="spellStart"/>
             <w:r>
               <w:rPr>
                 <w:lang w:val="en-US"/>
               </w:rPr>
-              <w:t>template_dict.special_characters.comments</w:t>
+              <w:t>template_</w:t>
+            </w:r>
+            <w:proofErr w:type="gramStart"/>
+            <w:r>
+              <w:rPr>
+                <w:lang w:val="en-US"/>
+              </w:rPr>
+              <w:t>dict.special</w:t>
+            </w:r>
+            <w:proofErr w:type="gramEnd"/>
+            <w:r>
+              <w:rPr>
+                <w:lang w:val="en-US"/>
+              </w:rPr>
+              <w:t>_</w:t>
+            </w:r>
+            <w:proofErr w:type="gramStart"/>
+            <w:r>
+              <w:rPr>
+                <w:lang w:val="en-US"/>
+              </w:rPr>
+              <w:t>characters.comments</w:t>
             </w:r>
             <w:proofErr w:type="spellEnd"/>
+            <w:proofErr w:type="gramEnd"/>
             <w:r>
               <w:rPr>
                 <w:lang w:val="en-US"/>
@@ -3312,6 +3989,7 @@
                 <w:numId w:val="45"/>
               </w:numPr>
             </w:pPr>
+            <w:proofErr w:type="gramStart"/>
             <w:r>
               <w:rPr>
                 <w:lang w:val="en-US"/>
@@ -3323,16 +4001,38 @@
               <w:rPr>
                 <w:lang w:val="en-US"/>
               </w:rPr>
-              <w:t>item.file_name</w:t>
+              <w:t>item</w:t>
+            </w:r>
+            <w:proofErr w:type="gramEnd"/>
+            <w:r>
+              <w:rPr>
+                <w:lang w:val="en-US"/>
+              </w:rPr>
+              <w:t>.file_</w:t>
+            </w:r>
+            <w:proofErr w:type="gramStart"/>
+            <w:r>
+              <w:rPr>
+                <w:lang w:val="en-US"/>
+              </w:rPr>
+              <w:t>name</w:t>
             </w:r>
             <w:proofErr w:type="spellEnd"/>
             <w:r>
               <w:rPr>
                 <w:lang w:val="en-US"/>
               </w:rPr>
-              <w:t xml:space="preserve"> }}{% </w:t>
+              <w:t xml:space="preserve"> }}{</w:t>
+            </w:r>
+            <w:proofErr w:type="gramEnd"/>
+            <w:r>
+              <w:rPr>
+                <w:lang w:val="en-US"/>
+              </w:rPr>
+              <w:t xml:space="preserve">% </w:t>
             </w:r>
             <w:proofErr w:type="spellStart"/>
+            <w:proofErr w:type="gramStart"/>
             <w:r>
               <w:rPr>
                 <w:lang w:val="en-US"/>
@@ -3346,10 +4046,27 @@
               </w:rPr>
               <w:t xml:space="preserve"> %}</w:t>
             </w:r>
-          </w:p>
-          <w:p>
-            <w:r>
-              <w:t>{% else %}(NONE){% endif %}</w:t>
+            <w:proofErr w:type="gramEnd"/>
+          </w:p>
+          <w:p>
+            <w:r>
+              <w:t xml:space="preserve">{% else </w:t>
+            </w:r>
+            <w:proofErr w:type="gramStart"/>
+            <w:r>
+              <w:t>%}(</w:t>
+            </w:r>
+            <w:proofErr w:type="gramEnd"/>
+            <w:r>
+              <w:t>NONE</w:t>
+            </w:r>
+            <w:proofErr w:type="gramStart"/>
+            <w:r>
+              <w:t>){</w:t>
+            </w:r>
+            <w:proofErr w:type="gramEnd"/>
+            <w:r>
+              <w:t>% endif %}</w:t>
             </w:r>
           </w:p>
         </w:tc>
@@ -3527,20 +4244,50 @@
               <w:rPr>
                 <w:lang w:val="en-US"/>
               </w:rPr>
-              <w:t>template_dict.</w:t>
+              <w:t>template_</w:t>
+            </w:r>
+            <w:proofErr w:type="gramStart"/>
+            <w:r>
+              <w:rPr>
+                <w:lang w:val="en-US"/>
+              </w:rPr>
+              <w:t>dict.</w:t>
             </w:r>
             <w:r>
               <w:rPr>
                 <w:rFonts w:hint="eastAsia"/>
                 <w:lang w:val="en-US"/>
               </w:rPr>
-              <w:t>file_ext</w:t>
-            </w:r>
-            <w:r>
-              <w:rPr>
-                <w:lang w:val="en-US"/>
-              </w:rPr>
-              <w:t>.comments|length</w:t>
+              <w:t>file</w:t>
+            </w:r>
+            <w:proofErr w:type="gramEnd"/>
+            <w:r>
+              <w:rPr>
+                <w:rFonts w:hint="eastAsia"/>
+                <w:lang w:val="en-US"/>
+              </w:rPr>
+              <w:t>_</w:t>
+            </w:r>
+            <w:proofErr w:type="gramStart"/>
+            <w:r>
+              <w:rPr>
+                <w:rFonts w:hint="eastAsia"/>
+                <w:lang w:val="en-US"/>
+              </w:rPr>
+              <w:t>ext</w:t>
+            </w:r>
+            <w:r>
+              <w:rPr>
+                <w:lang w:val="en-US"/>
+              </w:rPr>
+              <w:t>.comments</w:t>
+            </w:r>
+            <w:proofErr w:type="gramEnd"/>
+            <w:r>
+              <w:rPr>
+                <w:lang w:val="en-US"/>
+              </w:rPr>
+              <w:t>|length</w:t>
             </w:r>
             <w:proofErr w:type="spellEnd"/>
             <w:r>
@@ -3560,7 +4307,21 @@
               <w:rPr>
                 <w:lang w:val="en-US"/>
               </w:rPr>
-              <w:t xml:space="preserve"> 0 %}X{% endif %}</w:t>
+              <w:t xml:space="preserve"> 0 %}</w:t>
+            </w:r>
+            <w:proofErr w:type="gramStart"/>
+            <w:r>
+              <w:rPr>
+                <w:lang w:val="en-US"/>
+              </w:rPr>
+              <w:t>X{</w:t>
+            </w:r>
+            <w:proofErr w:type="gramEnd"/>
+            <w:r>
+              <w:rPr>
+                <w:lang w:val="en-US"/>
+              </w:rPr>
+              <w:t>% endif %}</w:t>
             </w:r>
           </w:p>
         </w:tc>
@@ -3594,14 +4355,56 @@
               <w:rPr>
                 <w:lang w:val="en-US"/>
               </w:rPr>
-              <w:t>template_dict.file_ext.comments|length</w:t>
+              <w:t>template_</w:t>
+            </w:r>
+            <w:proofErr w:type="gramStart"/>
+            <w:r>
+              <w:rPr>
+                <w:lang w:val="en-US"/>
+              </w:rPr>
+              <w:t>dict.file</w:t>
+            </w:r>
+            <w:proofErr w:type="gramEnd"/>
+            <w:r>
+              <w:rPr>
+                <w:lang w:val="en-US"/>
+              </w:rPr>
+              <w:t>_</w:t>
+            </w:r>
+            <w:proofErr w:type="gramStart"/>
+            <w:r>
+              <w:rPr>
+                <w:lang w:val="en-US"/>
+              </w:rPr>
+              <w:t>ext.comments</w:t>
+            </w:r>
+            <w:proofErr w:type="gramEnd"/>
+            <w:r>
+              <w:rPr>
+                <w:lang w:val="en-US"/>
+              </w:rPr>
+              <w:t>|length</w:t>
             </w:r>
             <w:proofErr w:type="spellEnd"/>
             <w:r>
               <w:rPr>
                 <w:lang w:val="en-US"/>
               </w:rPr>
-              <w:t xml:space="preserve"> &gt; 0 %}X{% endif %}</w:t>
+              <w:t xml:space="preserve"> &gt; 0 %}</w:t>
+            </w:r>
+            <w:proofErr w:type="gramStart"/>
+            <w:r>
+              <w:rPr>
+                <w:lang w:val="en-US"/>
+              </w:rPr>
+              <w:t>X{</w:t>
+            </w:r>
+            <w:proofErr w:type="gramEnd"/>
+            <w:r>
+              <w:rPr>
+                <w:lang w:val="en-US"/>
+              </w:rPr>
+              <w:t>% endif %}</w:t>
             </w:r>
           </w:p>
         </w:tc>
@@ -3710,9 +4513,31 @@
               <w:rPr>
                 <w:lang w:val="en-US"/>
               </w:rPr>
-              <w:t>template_dict.file_ext.comments</w:t>
+              <w:t>template_</w:t>
+            </w:r>
+            <w:proofErr w:type="gramStart"/>
+            <w:r>
+              <w:rPr>
+                <w:lang w:val="en-US"/>
+              </w:rPr>
+              <w:t>dict.file</w:t>
+            </w:r>
+            <w:proofErr w:type="gramEnd"/>
+            <w:r>
+              <w:rPr>
+                <w:lang w:val="en-US"/>
+              </w:rPr>
+              <w:t>_</w:t>
+            </w:r>
+            <w:proofErr w:type="gramStart"/>
+            <w:r>
+              <w:rPr>
+                <w:lang w:val="en-US"/>
+              </w:rPr>
+              <w:t>ext.comments</w:t>
             </w:r>
             <w:proofErr w:type="spellEnd"/>
+            <w:proofErr w:type="gramEnd"/>
             <w:r>
               <w:t xml:space="preserve"> </w:t>
             </w:r>
@@ -3720,22 +4545,55 @@
               <w:t>|length &gt; 0</w:t>
             </w:r>
             <w:r>
-              <w:t xml:space="preserve"> %}</w:t>
-            </w:r>
-            <w:r>
-              <w:rPr>
-                <w:lang w:val="en-US"/>
-              </w:rPr>
-              <w:t xml:space="preserve">{% for item in </w:t>
+              <w:t xml:space="preserve"> </w:t>
+            </w:r>
+            <w:proofErr w:type="gramStart"/>
+            <w:r>
+              <w:t>%}</w:t>
+            </w:r>
+            <w:r>
+              <w:rPr>
+                <w:lang w:val="en-US"/>
+              </w:rPr>
+              <w:t>{</w:t>
+            </w:r>
+            <w:proofErr w:type="gramEnd"/>
+            <w:r>
+              <w:rPr>
+                <w:lang w:val="en-US"/>
+              </w:rPr>
+              <w:t xml:space="preserve">% for item in </w:t>
             </w:r>
             <w:proofErr w:type="spellStart"/>
             <w:r>
               <w:rPr>
                 <w:lang w:val="en-US"/>
               </w:rPr>
-              <w:t>template_dict.file_ext.comments</w:t>
+              <w:t>template_</w:t>
+            </w:r>
+            <w:proofErr w:type="gramStart"/>
+            <w:r>
+              <w:rPr>
+                <w:lang w:val="en-US"/>
+              </w:rPr>
+              <w:t>dict.file</w:t>
+            </w:r>
+            <w:proofErr w:type="gramEnd"/>
+            <w:r>
+              <w:rPr>
+                <w:lang w:val="en-US"/>
+              </w:rPr>
+              <w:t>_</w:t>
+            </w:r>
+            <w:proofErr w:type="gramStart"/>
+            <w:r>
+              <w:rPr>
+                <w:lang w:val="en-US"/>
+              </w:rPr>
+              <w:t>ext.comments</w:t>
             </w:r>
             <w:proofErr w:type="spellEnd"/>
+            <w:proofErr w:type="gramEnd"/>
             <w:r>
               <w:rPr>
                 <w:lang w:val="en-US"/>
@@ -3752,6 +4610,7 @@
               </w:numPr>
               <w:spacing w:line="256" w:lineRule="auto"/>
             </w:pPr>
+            <w:proofErr w:type="gramStart"/>
             <w:r>
               <w:rPr>
                 <w:lang w:val="en-US"/>
@@ -3763,16 +4622,38 @@
               <w:rPr>
                 <w:lang w:val="en-US"/>
               </w:rPr>
-              <w:t>item.file_name</w:t>
+              <w:t>item</w:t>
+            </w:r>
+            <w:proofErr w:type="gramEnd"/>
+            <w:r>
+              <w:rPr>
+                <w:lang w:val="en-US"/>
+              </w:rPr>
+              <w:t>.file_</w:t>
+            </w:r>
+            <w:proofErr w:type="gramStart"/>
+            <w:r>
+              <w:rPr>
+                <w:lang w:val="en-US"/>
+              </w:rPr>
+              <w:t>name</w:t>
             </w:r>
             <w:proofErr w:type="spellEnd"/>
             <w:r>
               <w:rPr>
                 <w:lang w:val="en-US"/>
               </w:rPr>
-              <w:t xml:space="preserve"> }}{% </w:t>
+              <w:t xml:space="preserve"> }}{</w:t>
+            </w:r>
+            <w:proofErr w:type="gramEnd"/>
+            <w:r>
+              <w:rPr>
+                <w:lang w:val="en-US"/>
+              </w:rPr>
+              <w:t xml:space="preserve">% </w:t>
             </w:r>
             <w:proofErr w:type="spellStart"/>
+            <w:proofErr w:type="gramStart"/>
             <w:r>
               <w:rPr>
                 <w:lang w:val="en-US"/>
@@ -3786,13 +4667,30 @@
               </w:rPr>
               <w:t xml:space="preserve"> %}</w:t>
             </w:r>
+            <w:proofErr w:type="gramEnd"/>
           </w:p>
           <w:p>
             <w:pPr>
               <w:spacing w:line="256" w:lineRule="auto"/>
             </w:pPr>
             <w:r>
-              <w:t>{% else %}(NONE){% endif %}</w:t>
+              <w:t xml:space="preserve">{% else </w:t>
+            </w:r>
+            <w:proofErr w:type="gramStart"/>
+            <w:r>
+              <w:t>%}(</w:t>
+            </w:r>
+            <w:proofErr w:type="gramEnd"/>
+            <w:r>
+              <w:t>NONE</w:t>
+            </w:r>
+            <w:proofErr w:type="gramStart"/>
+            <w:r>
+              <w:t>){</w:t>
+            </w:r>
+            <w:proofErr w:type="gramEnd"/>
+            <w:r>
+              <w:t>% endif %}</w:t>
             </w:r>
           </w:p>
         </w:tc>
@@ -3895,7 +4793,7 @@
                 <w:b/>
                 <w:bCs/>
               </w:rPr>
-              <w:t>Are there any files that do not appear on the common file format list?</w:t>
+              <w:t>Do all files appear on the common file format list?</w:t>
             </w:r>
           </w:p>
         </w:tc>
@@ -4072,13 +4970,34 @@
               <w:rPr>
                 <w:lang w:val="en-US"/>
               </w:rPr>
-              <w:t>template_dict.</w:t>
-            </w:r>
-            <w:r>
-              <w:rPr>
-                <w:lang w:val="en-US"/>
-              </w:rPr>
-              <w:t>common_file_format</w:t>
+              <w:t>template_</w:t>
+            </w:r>
+            <w:proofErr w:type="gramStart"/>
+            <w:r>
+              <w:rPr>
+                <w:lang w:val="en-US"/>
+              </w:rPr>
+              <w:t>dict.</w:t>
+            </w:r>
+            <w:r>
+              <w:rPr>
+                <w:lang w:val="en-US"/>
+              </w:rPr>
+              <w:t>common</w:t>
+            </w:r>
+            <w:proofErr w:type="gramEnd"/>
+            <w:r>
+              <w:rPr>
+                <w:lang w:val="en-US"/>
+              </w:rPr>
+              <w:t>_file_</w:t>
+            </w:r>
+            <w:proofErr w:type="gramStart"/>
+            <w:r>
+              <w:rPr>
+                <w:lang w:val="en-US"/>
+              </w:rPr>
+              <w:t>format</w:t>
             </w:r>
             <w:r>
               <w:rPr>
@@ -4087,30 +5006,63 @@
               <w:t>.comments</w:t>
             </w:r>
             <w:proofErr w:type="spellEnd"/>
+            <w:proofErr w:type="gramEnd"/>
             <w:r>
               <w:t>|length &gt; 0</w:t>
             </w:r>
             <w:r>
-              <w:t xml:space="preserve"> %}</w:t>
-            </w:r>
-            <w:r>
-              <w:rPr>
-                <w:lang w:val="en-US"/>
-              </w:rPr>
-              <w:t xml:space="preserve">{% for item in </w:t>
+              <w:t xml:space="preserve"> </w:t>
+            </w:r>
+            <w:proofErr w:type="gramStart"/>
+            <w:r>
+              <w:t>%}</w:t>
+            </w:r>
+            <w:r>
+              <w:rPr>
+                <w:lang w:val="en-US"/>
+              </w:rPr>
+              <w:t>{</w:t>
+            </w:r>
+            <w:proofErr w:type="gramEnd"/>
+            <w:r>
+              <w:rPr>
+                <w:lang w:val="en-US"/>
+              </w:rPr>
+              <w:t xml:space="preserve">% for item in </w:t>
             </w:r>
             <w:proofErr w:type="spellStart"/>
             <w:r>
               <w:rPr>
                 <w:lang w:val="en-US"/>
               </w:rPr>
-              <w:t>template_dict.</w:t>
-            </w:r>
-            <w:r>
-              <w:rPr>
-                <w:lang w:val="en-US"/>
-              </w:rPr>
-              <w:t>common_file_format</w:t>
+              <w:t>template_</w:t>
+            </w:r>
+            <w:proofErr w:type="gramStart"/>
+            <w:r>
+              <w:rPr>
+                <w:lang w:val="en-US"/>
+              </w:rPr>
+              <w:t>dict.</w:t>
+            </w:r>
+            <w:r>
+              <w:rPr>
+                <w:lang w:val="en-US"/>
+              </w:rPr>
+              <w:t>common</w:t>
+            </w:r>
+            <w:proofErr w:type="gramEnd"/>
+            <w:r>
+              <w:rPr>
+                <w:lang w:val="en-US"/>
+              </w:rPr>
+              <w:t>_file_</w:t>
+            </w:r>
+            <w:proofErr w:type="gramStart"/>
+            <w:r>
+              <w:rPr>
+                <w:lang w:val="en-US"/>
+              </w:rPr>
+              <w:t>format</w:t>
             </w:r>
             <w:r>
               <w:rPr>
@@ -4119,6 +5071,7 @@
               <w:t>.comments</w:t>
             </w:r>
             <w:proofErr w:type="spellEnd"/>
+            <w:proofErr w:type="gramEnd"/>
             <w:r>
               <w:rPr>
                 <w:lang w:val="en-US"/>
@@ -4133,6 +5086,7 @@
                 <w:numId w:val="9"/>
               </w:numPr>
             </w:pPr>
+            <w:proofErr w:type="gramStart"/>
             <w:r>
               <w:rPr>
                 <w:lang w:val="en-US"/>
@@ -4144,7 +5098,21 @@
               <w:rPr>
                 <w:lang w:val="en-US"/>
               </w:rPr>
-              <w:t>item.file_name</w:t>
+              <w:t>item</w:t>
+            </w:r>
+            <w:proofErr w:type="gramEnd"/>
+            <w:r>
+              <w:rPr>
+                <w:lang w:val="en-US"/>
+              </w:rPr>
+              <w:t>.file_</w:t>
+            </w:r>
+            <w:proofErr w:type="gramStart"/>
+            <w:r>
+              <w:rPr>
+                <w:lang w:val="en-US"/>
+              </w:rPr>
+              <w:t>name</w:t>
             </w:r>
             <w:proofErr w:type="spellEnd"/>
             <w:r>
@@ -4160,6 +5128,7 @@
               </w:rPr>
               <w:t>{</w:t>
             </w:r>
+            <w:proofErr w:type="gramEnd"/>
             <w:r>
               <w:rPr>
                 <w:rFonts w:hint="eastAsia"/>
@@ -4168,6 +5137,7 @@
               <w:t xml:space="preserve">% </w:t>
             </w:r>
             <w:proofErr w:type="spellStart"/>
+            <w:proofErr w:type="gramStart"/>
             <w:r>
               <w:rPr>
                 <w:lang w:val="en-US"/>
@@ -4181,10 +5151,27 @@
               </w:rPr>
               <w:t xml:space="preserve"> %}</w:t>
             </w:r>
-          </w:p>
-          <w:p>
-            <w:r>
-              <w:t>{% else %}(NONE){% endif %}</w:t>
+            <w:proofErr w:type="gramEnd"/>
+          </w:p>
+          <w:p>
+            <w:r>
+              <w:t xml:space="preserve">{% else </w:t>
+            </w:r>
+            <w:proofErr w:type="gramStart"/>
+            <w:r>
+              <w:t>%}(</w:t>
+            </w:r>
+            <w:proofErr w:type="gramEnd"/>
+            <w:r>
+              <w:t>NONE</w:t>
+            </w:r>
+            <w:proofErr w:type="gramStart"/>
+            <w:r>
+              <w:t>){</w:t>
+            </w:r>
+            <w:proofErr w:type="gramEnd"/>
+            <w:r>
+              <w:t>% endif %}</w:t>
             </w:r>
           </w:p>
         </w:tc>
@@ -4926,14 +5913,56 @@
               <w:rPr>
                 <w:lang w:val="en-US"/>
               </w:rPr>
-              <w:t>template_dict.readme_file.comments|length</w:t>
+              <w:t>template_</w:t>
+            </w:r>
+            <w:proofErr w:type="gramStart"/>
+            <w:r>
+              <w:rPr>
+                <w:lang w:val="en-US"/>
+              </w:rPr>
+              <w:t>dict.readme</w:t>
+            </w:r>
+            <w:proofErr w:type="gramEnd"/>
+            <w:r>
+              <w:rPr>
+                <w:lang w:val="en-US"/>
+              </w:rPr>
+              <w:t>_</w:t>
+            </w:r>
+            <w:proofErr w:type="gramStart"/>
+            <w:r>
+              <w:rPr>
+                <w:lang w:val="en-US"/>
+              </w:rPr>
+              <w:t>file.comments</w:t>
+            </w:r>
+            <w:proofErr w:type="gramEnd"/>
+            <w:r>
+              <w:rPr>
+                <w:lang w:val="en-US"/>
+              </w:rPr>
+              <w:t>|length</w:t>
             </w:r>
             <w:proofErr w:type="spellEnd"/>
             <w:r>
               <w:rPr>
                 <w:lang w:val="en-US"/>
               </w:rPr>
-              <w:t xml:space="preserve"> &gt; 0 %}X{% endif %}</w:t>
+              <w:t xml:space="preserve"> &gt; 0 %}</w:t>
+            </w:r>
+            <w:proofErr w:type="gramStart"/>
+            <w:r>
+              <w:rPr>
+                <w:lang w:val="en-US"/>
+              </w:rPr>
+              <w:t>X{</w:t>
+            </w:r>
+            <w:proofErr w:type="gramEnd"/>
+            <w:r>
+              <w:rPr>
+                <w:lang w:val="en-US"/>
+              </w:rPr>
+              <w:t>% endif %}</w:t>
             </w:r>
           </w:p>
         </w:tc>
@@ -4972,14 +6001,56 @@
               <w:rPr>
                 <w:lang w:val="en-US"/>
               </w:rPr>
-              <w:t>template_dict.readme_file.comments|length</w:t>
+              <w:t>template_</w:t>
+            </w:r>
+            <w:proofErr w:type="gramStart"/>
+            <w:r>
+              <w:rPr>
+                <w:lang w:val="en-US"/>
+              </w:rPr>
+              <w:t>dict.readme</w:t>
+            </w:r>
+            <w:proofErr w:type="gramEnd"/>
+            <w:r>
+              <w:rPr>
+                <w:lang w:val="en-US"/>
+              </w:rPr>
+              <w:t>_</w:t>
+            </w:r>
+            <w:proofErr w:type="gramStart"/>
+            <w:r>
+              <w:rPr>
+                <w:lang w:val="en-US"/>
+              </w:rPr>
+              <w:t>file.comments</w:t>
+            </w:r>
+            <w:proofErr w:type="gramEnd"/>
+            <w:r>
+              <w:rPr>
+                <w:lang w:val="en-US"/>
+              </w:rPr>
+              <w:t>|length</w:t>
             </w:r>
             <w:proofErr w:type="spellEnd"/>
             <w:r>
               <w:rPr>
                 <w:lang w:val="en-US"/>
               </w:rPr>
-              <w:t xml:space="preserve"> == 0 %}X{% endif %}</w:t>
+              <w:t xml:space="preserve"> == 0 %}</w:t>
+            </w:r>
+            <w:proofErr w:type="gramStart"/>
+            <w:r>
+              <w:rPr>
+                <w:lang w:val="en-US"/>
+              </w:rPr>
+              <w:t>X{</w:t>
+            </w:r>
+            <w:proofErr w:type="gramEnd"/>
+            <w:r>
+              <w:rPr>
+                <w:lang w:val="en-US"/>
+              </w:rPr>
+              <w:t>% endif %}</w:t>
             </w:r>
           </w:p>
           <w:p/>
@@ -5089,77 +6160,190 @@
               <w:rPr>
                 <w:lang w:val="en-US"/>
               </w:rPr>
-              <w:t>template_dict.readme_file.comments</w:t>
+              <w:t>template_</w:t>
+            </w:r>
+            <w:proofErr w:type="gramStart"/>
+            <w:r>
+              <w:rPr>
+                <w:lang w:val="en-US"/>
+              </w:rPr>
+              <w:t>dict.readme</w:t>
+            </w:r>
+            <w:proofErr w:type="gramEnd"/>
+            <w:r>
+              <w:rPr>
+                <w:lang w:val="en-US"/>
+              </w:rPr>
+              <w:t>_</w:t>
+            </w:r>
+            <w:proofErr w:type="gramStart"/>
+            <w:r>
+              <w:rPr>
+                <w:lang w:val="en-US"/>
+              </w:rPr>
+              <w:t>file.comments</w:t>
             </w:r>
             <w:proofErr w:type="spellEnd"/>
+            <w:proofErr w:type="gramEnd"/>
             <w:r>
               <w:t xml:space="preserve"> |length &gt; 0</w:t>
             </w:r>
             <w:r>
+              <w:t xml:space="preserve"> </w:t>
+            </w:r>
+            <w:proofErr w:type="gramStart"/>
+            <w:r>
+              <w:t>%}</w:t>
+            </w:r>
+            <w:r>
+              <w:rPr>
+                <w:lang w:val="en-US"/>
+              </w:rPr>
+              <w:t>{</w:t>
+            </w:r>
+            <w:proofErr w:type="gramEnd"/>
+            <w:r>
+              <w:rPr>
+                <w:lang w:val="en-US"/>
+              </w:rPr>
+              <w:t xml:space="preserve">% for item in </w:t>
+            </w:r>
+            <w:proofErr w:type="spellStart"/>
+            <w:r>
+              <w:rPr>
+                <w:lang w:val="en-US"/>
+              </w:rPr>
+              <w:t>template_</w:t>
+            </w:r>
+            <w:proofErr w:type="gramStart"/>
+            <w:r>
+              <w:rPr>
+                <w:lang w:val="en-US"/>
+              </w:rPr>
+              <w:t>dict.readme</w:t>
+            </w:r>
+            <w:proofErr w:type="gramEnd"/>
+            <w:r>
+              <w:rPr>
+                <w:lang w:val="en-US"/>
+              </w:rPr>
+              <w:t>_</w:t>
+            </w:r>
+            <w:proofErr w:type="gramStart"/>
+            <w:r>
+              <w:rPr>
+                <w:lang w:val="en-US"/>
+              </w:rPr>
+              <w:t>file.comments</w:t>
+            </w:r>
+            <w:proofErr w:type="spellEnd"/>
+            <w:proofErr w:type="gramEnd"/>
+            <w:r>
+              <w:rPr>
+                <w:lang w:val="en-US"/>
+              </w:rPr>
+              <w:t xml:space="preserve"> </w:t>
+            </w:r>
+            <w:proofErr w:type="gramStart"/>
+            <w:r>
+              <w:rPr>
+                <w:lang w:val="en-US"/>
+              </w:rPr>
+              <w:t xml:space="preserve">%}{{ </w:t>
+            </w:r>
+            <w:proofErr w:type="spellStart"/>
+            <w:r>
+              <w:rPr>
+                <w:lang w:val="en-US"/>
+              </w:rPr>
+              <w:t>loop</w:t>
+            </w:r>
+            <w:proofErr w:type="gramEnd"/>
+            <w:r>
+              <w:rPr>
+                <w:lang w:val="en-US"/>
+              </w:rPr>
+              <w:t>.</w:t>
+            </w:r>
+            <w:proofErr w:type="gramStart"/>
+            <w:r>
+              <w:rPr>
+                <w:lang w:val="en-US"/>
+              </w:rPr>
+              <w:t>index</w:t>
+            </w:r>
+            <w:proofErr w:type="spellEnd"/>
+            <w:r>
+              <w:rPr>
+                <w:lang w:val="en-US"/>
+              </w:rPr>
+              <w:t xml:space="preserve"> }</w:t>
+            </w:r>
+            <w:proofErr w:type="gramEnd"/>
+            <w:r>
+              <w:rPr>
+                <w:lang w:val="en-US"/>
+              </w:rPr>
+              <w:t xml:space="preserve">}. </w:t>
+            </w:r>
+            <w:proofErr w:type="gramStart"/>
+            <w:r>
+              <w:rPr>
+                <w:lang w:val="en-US"/>
+              </w:rPr>
+              <w:t xml:space="preserve">{{ </w:t>
+            </w:r>
+            <w:proofErr w:type="spellStart"/>
+            <w:r>
+              <w:rPr>
+                <w:lang w:val="en-US"/>
+              </w:rPr>
+              <w:t>item</w:t>
+            </w:r>
+            <w:proofErr w:type="gramEnd"/>
+            <w:r>
+              <w:rPr>
+                <w:lang w:val="en-US"/>
+              </w:rPr>
+              <w:t>.file_</w:t>
+            </w:r>
+            <w:proofErr w:type="gramStart"/>
+            <w:r>
+              <w:rPr>
+                <w:lang w:val="en-US"/>
+              </w:rPr>
+              <w:t>name</w:t>
+            </w:r>
+            <w:proofErr w:type="spellEnd"/>
+            <w:r>
+              <w:rPr>
+                <w:lang w:val="en-US"/>
+              </w:rPr>
+              <w:t xml:space="preserve"> }}{</w:t>
+            </w:r>
+            <w:proofErr w:type="gramEnd"/>
+            <w:r>
+              <w:rPr>
+                <w:lang w:val="en-US"/>
+              </w:rPr>
+              <w:t xml:space="preserve">% </w:t>
+            </w:r>
+            <w:proofErr w:type="spellStart"/>
+            <w:proofErr w:type="gramStart"/>
+            <w:r>
+              <w:rPr>
+                <w:lang w:val="en-US"/>
+              </w:rPr>
+              <w:t>endfor</w:t>
+            </w:r>
+            <w:proofErr w:type="spellEnd"/>
+            <w:r>
+              <w:rPr>
+                <w:lang w:val="en-US"/>
+              </w:rPr>
               <w:t xml:space="preserve"> %}</w:t>
             </w:r>
-            <w:r>
-              <w:rPr>
-                <w:lang w:val="en-US"/>
-              </w:rPr>
-              <w:t xml:space="preserve">{% for item in </w:t>
-            </w:r>
-            <w:proofErr w:type="spellStart"/>
-            <w:r>
-              <w:rPr>
-                <w:lang w:val="en-US"/>
-              </w:rPr>
-              <w:t>template_dict.readme_file.comments</w:t>
-            </w:r>
-            <w:proofErr w:type="spellEnd"/>
-            <w:r>
-              <w:rPr>
-                <w:lang w:val="en-US"/>
-              </w:rPr>
-              <w:t xml:space="preserve"> %}{{ </w:t>
-            </w:r>
-            <w:proofErr w:type="spellStart"/>
-            <w:r>
-              <w:rPr>
-                <w:lang w:val="en-US"/>
-              </w:rPr>
-              <w:t>loop.index</w:t>
-            </w:r>
-            <w:proofErr w:type="spellEnd"/>
-            <w:r>
-              <w:rPr>
-                <w:lang w:val="en-US"/>
-              </w:rPr>
-              <w:t xml:space="preserve"> }}. {{ </w:t>
-            </w:r>
-            <w:proofErr w:type="spellStart"/>
-            <w:r>
-              <w:rPr>
-                <w:lang w:val="en-US"/>
-              </w:rPr>
-              <w:t>item.file_name</w:t>
-            </w:r>
-            <w:proofErr w:type="spellEnd"/>
-            <w:r>
-              <w:rPr>
-                <w:lang w:val="en-US"/>
-              </w:rPr>
-              <w:t xml:space="preserve"> }}{% </w:t>
-            </w:r>
-            <w:proofErr w:type="spellStart"/>
-            <w:r>
-              <w:rPr>
-                <w:lang w:val="en-US"/>
-              </w:rPr>
-              <w:t>endfor</w:t>
-            </w:r>
-            <w:proofErr w:type="spellEnd"/>
-            <w:r>
-              <w:rPr>
-                <w:lang w:val="en-US"/>
-              </w:rPr>
-              <w:t xml:space="preserve"> %}</w:t>
-            </w:r>
+            <w:proofErr w:type="gramEnd"/>
           </w:p>
           <w:p>
             <w:pPr>
@@ -5168,7 +6352,23 @@
               </w:rPr>
             </w:pPr>
             <w:r>
-              <w:t>{% else %}(NONE){% endif %}</w:t>
+              <w:t xml:space="preserve">{% else </w:t>
+            </w:r>
+            <w:proofErr w:type="gramStart"/>
+            <w:r>
+              <w:t>%}(</w:t>
+            </w:r>
+            <w:proofErr w:type="gramEnd"/>
+            <w:r>
+              <w:t>NONE</w:t>
+            </w:r>
+            <w:proofErr w:type="gramStart"/>
+            <w:r>
+              <w:t>){</w:t>
+            </w:r>
+            <w:proofErr w:type="gramEnd"/>
+            <w:r>
+              <w:t>% endif %}</w:t>
             </w:r>
           </w:p>
           <w:p/>
@@ -7318,7 +8518,7 @@
                 <w:b/>
                 <w:bCs/>
               </w:rPr>
-              <w:t xml:space="preserve">Are all metadata </w:t>
+              <w:t xml:space="preserve">Are there any typos in </w:t>
             </w:r>
             <w:r>
               <w:rPr>
@@ -7326,7 +8526,7 @@
                 <w:bCs/>
               </w:rPr>
               <w:lastRenderedPageBreak/>
-              <w:t>fields free from typos?</w:t>
+              <w:t>metadata fields?</w:t>
             </w:r>
           </w:p>
         </w:tc>
@@ -7416,6 +8616,14 @@
               <w:t>Notes</w:t>
             </w:r>
           </w:p>
+          <w:p>
+            <w:r>
+              <w:rPr>
+                <w:lang w:val="en-US"/>
+              </w:rPr>
+              <w:t>Note that the automated process might flag wrongly (such as acronyms/specialized terms. Delete the items from the list accordingly.</w:t>
+            </w:r>
+          </w:p>
         </w:tc>
         <w:tc>
           <w:tcPr>
@@ -7433,7 +8641,6 @@
               <w:bottom w:w="100" w:type="dxa"/>
               <w:right w:w="100" w:type="dxa"/>
             </w:tcMar>
-            <w:hideMark/>
           </w:tcPr>
           <w:p/>
         </w:tc>
@@ -7453,7 +8660,6 @@
               <w:bottom w:w="100" w:type="dxa"/>
               <w:right w:w="100" w:type="dxa"/>
             </w:tcMar>
-            <w:hideMark/>
           </w:tcPr>
           <w:p/>
         </w:tc>
@@ -7578,7 +8784,28 @@
               <w:rPr>
                 <w:lang w:val="en-US"/>
               </w:rPr>
-              <w:t>template_dict.typo.comments</w:t>
+              <w:t>template_</w:t>
+            </w:r>
+            <w:proofErr w:type="gramStart"/>
+            <w:r>
+              <w:rPr>
+                <w:lang w:val="en-US"/>
+              </w:rPr>
+              <w:t>dict.typo</w:t>
+            </w:r>
+            <w:proofErr w:type="gramEnd"/>
+            <w:r>
+              <w:rPr>
+                <w:lang w:val="en-US"/>
+              </w:rPr>
+              <w:t>.</w:t>
+            </w:r>
+            <w:proofErr w:type="gramStart"/>
+            <w:r>
+              <w:rPr>
+                <w:lang w:val="en-US"/>
+              </w:rPr>
+              <w:t>comments</w:t>
             </w:r>
             <w:proofErr w:type="spellEnd"/>
             <w:r>
@@ -7586,31 +8813,68 @@
             </w:r>
             <w:r>
               <w:lastRenderedPageBreak/>
-              <w:t>|length &gt; 0</w:t>
-            </w:r>
-            <w:r>
+              <w:t>|length</w:t>
+            </w:r>
+            <w:proofErr w:type="gramEnd"/>
+            <w:r>
+              <w:t xml:space="preserve"> &gt; 0</w:t>
+            </w:r>
+            <w:r>
+              <w:t xml:space="preserve"> </w:t>
+            </w:r>
+            <w:proofErr w:type="gramStart"/>
+            <w:r>
+              <w:t>%}</w:t>
+            </w:r>
+            <w:r>
+              <w:rPr>
+                <w:lang w:val="en-US"/>
+              </w:rPr>
+              <w:t>{</w:t>
+            </w:r>
+            <w:proofErr w:type="gramEnd"/>
+            <w:r>
+              <w:rPr>
+                <w:lang w:val="en-US"/>
+              </w:rPr>
+              <w:t xml:space="preserve">% for item in </w:t>
+            </w:r>
+            <w:proofErr w:type="spellStart"/>
+            <w:r>
+              <w:rPr>
+                <w:lang w:val="en-US"/>
+              </w:rPr>
+              <w:t>template_</w:t>
+            </w:r>
+            <w:proofErr w:type="gramStart"/>
+            <w:r>
+              <w:rPr>
+                <w:lang w:val="en-US"/>
+              </w:rPr>
+              <w:t>dict.typo</w:t>
+            </w:r>
+            <w:proofErr w:type="gramEnd"/>
+            <w:r>
+              <w:rPr>
+                <w:lang w:val="en-US"/>
+              </w:rPr>
+              <w:t>.</w:t>
+            </w:r>
+            <w:proofErr w:type="gramStart"/>
+            <w:r>
+              <w:rPr>
+                <w:lang w:val="en-US"/>
+              </w:rPr>
+              <w:t>comments</w:t>
+            </w:r>
+            <w:proofErr w:type="spellEnd"/>
+            <w:r>
+              <w:rPr>
+                <w:lang w:val="en-US"/>
+              </w:rPr>
               <w:t xml:space="preserve"> %}</w:t>
             </w:r>
-            <w:r>
-              <w:rPr>
-                <w:lang w:val="en-US"/>
-              </w:rPr>
-              <w:t xml:space="preserve">{% for item in </w:t>
-            </w:r>
-            <w:proofErr w:type="spellStart"/>
-            <w:r>
-              <w:rPr>
-                <w:lang w:val="en-US"/>
-              </w:rPr>
-              <w:t>template_dict.typo.comments</w:t>
-            </w:r>
-            <w:proofErr w:type="spellEnd"/>
-            <w:r>
-              <w:rPr>
-                <w:lang w:val="en-US"/>
-              </w:rPr>
-              <w:t xml:space="preserve"> %}</w:t>
-            </w:r>
+            <w:proofErr w:type="gramEnd"/>
           </w:p>
           <w:p>
             <w:pPr>
@@ -7620,13 +8884,36 @@
                 <w:numId w:val="46"/>
               </w:numPr>
             </w:pPr>
-            <w:r>
-              <w:rPr>
-                <w:lang w:val="en-US"/>
-              </w:rPr>
-              <w:t xml:space="preserve">{{ item }}{% </w:t>
+            <w:proofErr w:type="gramStart"/>
+            <w:r>
+              <w:rPr>
+                <w:lang w:val="en-US"/>
+              </w:rPr>
+              <w:t>{{ item</w:t>
+            </w:r>
+            <w:proofErr w:type="gramEnd"/>
+            <w:r>
+              <w:rPr>
+                <w:lang w:val="en-US"/>
+              </w:rPr>
+              <w:t xml:space="preserve"> </w:t>
+            </w:r>
+            <w:proofErr w:type="gramStart"/>
+            <w:r>
+              <w:rPr>
+                <w:lang w:val="en-US"/>
+              </w:rPr>
+              <w:t>}}{</w:t>
+            </w:r>
+            <w:proofErr w:type="gramEnd"/>
+            <w:r>
+              <w:rPr>
+                <w:lang w:val="en-US"/>
+              </w:rPr>
+              <w:t xml:space="preserve">% </w:t>
             </w:r>
             <w:proofErr w:type="spellStart"/>
+            <w:proofErr w:type="gramStart"/>
             <w:r>
               <w:rPr>
                 <w:lang w:val="en-US"/>
@@ -7640,11 +8927,21 @@
               </w:rPr>
               <w:t xml:space="preserve"> %}</w:t>
             </w:r>
-          </w:p>
-          <w:p>
-            <w:r>
-              <w:t>{% else %}(NONE</w:t>
-            </w:r>
+            <w:proofErr w:type="gramEnd"/>
+          </w:p>
+          <w:p>
+            <w:r>
+              <w:t xml:space="preserve">{% else </w:t>
+            </w:r>
+            <w:proofErr w:type="gramStart"/>
+            <w:r>
+              <w:t>%}(</w:t>
+            </w:r>
+            <w:proofErr w:type="gramEnd"/>
+            <w:r>
+              <w:t>NONE</w:t>
+            </w:r>
+            <w:proofErr w:type="gramStart"/>
             <w:r>
               <w:rPr>
                 <w:rFonts w:hint="eastAsia"/>
@@ -7652,7 +8949,11 @@
               <w:t>)</w:t>
             </w:r>
             <w:r>
-              <w:t>{% endif %}</w:t>
+              <w:t>{</w:t>
+            </w:r>
+            <w:proofErr w:type="gramEnd"/>
+            <w:r>
+              <w:t>% endif %}</w:t>
             </w:r>
           </w:p>
         </w:tc>
@@ -8143,11 +9444,27 @@
             </w:r>
             <w:proofErr w:type="spellStart"/>
             <w:r>
-              <w:t>template_dict.none_author_affiliation</w:t>
+              <w:t>template_</w:t>
+            </w:r>
+            <w:proofErr w:type="gramStart"/>
+            <w:r>
+              <w:t>dict.none</w:t>
+            </w:r>
+            <w:proofErr w:type="gramEnd"/>
+            <w:r>
+              <w:t>_author_affiliation</w:t>
             </w:r>
             <w:proofErr w:type="spellEnd"/>
             <w:r>
-              <w:t xml:space="preserve"> %}X{% endif %}</w:t>
+              <w:t xml:space="preserve"> %}</w:t>
+            </w:r>
+            <w:proofErr w:type="gramStart"/>
+            <w:r>
+              <w:t>X{</w:t>
+            </w:r>
+            <w:proofErr w:type="gramEnd"/>
+            <w:r>
+              <w:t>% endif %}</w:t>
             </w:r>
           </w:p>
         </w:tc>
@@ -8174,11 +9491,27 @@
             </w:r>
             <w:proofErr w:type="spellStart"/>
             <w:r>
-              <w:t>template_dict.none_author_affiliation</w:t>
+              <w:t>template_</w:t>
+            </w:r>
+            <w:proofErr w:type="gramStart"/>
+            <w:r>
+              <w:t>dict.none</w:t>
+            </w:r>
+            <w:proofErr w:type="gramEnd"/>
+            <w:r>
+              <w:t>_author_affiliation</w:t>
             </w:r>
             <w:proofErr w:type="spellEnd"/>
             <w:r>
-              <w:t xml:space="preserve"> %}X{% endif %}</w:t>
+              <w:t xml:space="preserve"> %}</w:t>
+            </w:r>
+            <w:proofErr w:type="gramStart"/>
+            <w:r>
+              <w:t>X{</w:t>
+            </w:r>
+            <w:proofErr w:type="gramEnd"/>
+            <w:r>
+              <w:t>% endif %}</w:t>
             </w:r>
           </w:p>
         </w:tc>
@@ -8340,6 +9673,7 @@
                 <w:b/>
                 <w:bCs/>
               </w:rPr>
+              <w:lastRenderedPageBreak/>
               <w:t>4.3b</w:t>
             </w:r>
           </w:p>
@@ -8438,10 +9772,7 @@
               </w:rPr>
             </w:pPr>
             <w:r>
-              <w:t>This will check</w:t>
-            </w:r>
-            <w:r>
-              <w:t xml:space="preserve"> either ‘</w:t>
+              <w:t>This will check either ‘</w:t>
             </w:r>
             <w:proofErr w:type="spellStart"/>
             <w:r>
@@ -8460,11 +9791,7 @@
             </w:r>
             <w:proofErr w:type="spellEnd"/>
             <w:r>
-              <w:t xml:space="preserve">’ </w:t>
-            </w:r>
-            <w:r>
-              <w:lastRenderedPageBreak/>
-              <w:t xml:space="preserve">is filled for the </w:t>
+              <w:t xml:space="preserve">’ is filled for the </w:t>
             </w:r>
             <w:r>
               <w:t>author</w:t>
@@ -8510,12 +9837,15 @@
               </w:rPr>
             </w:pPr>
             <w:r>
-              <w:lastRenderedPageBreak/>
               <w:t xml:space="preserve">{% if not </w:t>
             </w:r>
             <w:proofErr w:type="spellStart"/>
             <w:r>
-              <w:t>template_dict</w:t>
+              <w:t>template_</w:t>
+            </w:r>
+            <w:proofErr w:type="gramStart"/>
+            <w:r>
+              <w:t>dict</w:t>
             </w:r>
             <w:proofErr w:type="spellEnd"/>
             <w:r>
@@ -8526,11 +9856,26 @@
               <w:rPr>
                 <w:lang w:val="en-US"/>
               </w:rPr>
-              <w:t>none_author_affiliation_UT</w:t>
+              <w:t>none</w:t>
+            </w:r>
+            <w:proofErr w:type="gramEnd"/>
+            <w:r>
+              <w:rPr>
+                <w:lang w:val="en-US"/>
+              </w:rPr>
+              <w:t>_author_affiliation_UT</w:t>
             </w:r>
             <w:proofErr w:type="spellEnd"/>
             <w:r>
-              <w:t>%}X{% endif %}</w:t>
+              <w:t>%}</w:t>
+            </w:r>
+            <w:proofErr w:type="gramStart"/>
+            <w:r>
+              <w:t>X{</w:t>
+            </w:r>
+            <w:proofErr w:type="gramEnd"/>
+            <w:r>
+              <w:t>% endif %}</w:t>
             </w:r>
           </w:p>
         </w:tc>
@@ -8562,7 +9907,11 @@
             </w:r>
             <w:proofErr w:type="spellStart"/>
             <w:r>
-              <w:t>template_dict</w:t>
+              <w:t>template_</w:t>
+            </w:r>
+            <w:proofErr w:type="gramStart"/>
+            <w:r>
+              <w:t>dict</w:t>
             </w:r>
             <w:proofErr w:type="spellEnd"/>
             <w:r>
@@ -8573,11 +9922,26 @@
               <w:rPr>
                 <w:lang w:val="en-US"/>
               </w:rPr>
-              <w:t>none_author_affiliation_UT</w:t>
+              <w:t>none</w:t>
+            </w:r>
+            <w:proofErr w:type="gramEnd"/>
+            <w:r>
+              <w:rPr>
+                <w:lang w:val="en-US"/>
+              </w:rPr>
+              <w:t>_author_affiliation_UT</w:t>
             </w:r>
             <w:proofErr w:type="spellEnd"/>
             <w:r>
-              <w:t xml:space="preserve"> %}X{% endif %}</w:t>
+              <w:t xml:space="preserve"> %}</w:t>
+            </w:r>
+            <w:proofErr w:type="gramStart"/>
+            <w:r>
+              <w:t>X{</w:t>
+            </w:r>
+            <w:proofErr w:type="gramEnd"/>
+            <w:r>
+              <w:t>% endif %}</w:t>
             </w:r>
           </w:p>
         </w:tc>
@@ -8783,7 +10147,11 @@
               </w:numPr>
             </w:pPr>
             <w:r>
-              <w:t>Read the description and README file and check them against metadata fields. For example, if a geographical location or data collection date/range is mentioned in the description, recommend filling in the relevant metadata fields</w:t>
+              <w:t xml:space="preserve">Read the description and README file and check them against metadata fields. For example, if a geographical location or data collection date/range is mentioned in the description, recommend filling in the relevant </w:t>
+            </w:r>
+            <w:r>
+              <w:lastRenderedPageBreak/>
+              <w:t>metadata fields</w:t>
             </w:r>
           </w:p>
           <w:p>
@@ -8801,14 +10169,7 @@
                 <w:rPr>
                   <w:rStyle w:val="Hyperlink"/>
                 </w:rPr>
-                <w:t xml:space="preserve">Dataverse North Metadata Best </w:t>
-              </w:r>
-              <w:r>
-                <w:rPr>
-                  <w:rStyle w:val="Hyperlink"/>
-                </w:rPr>
-                <w:lastRenderedPageBreak/>
-                <w:t>Practices (pdf)</w:t>
+                <w:t>Dataverse North Metadata Best Practices (pdf)</w:t>
               </w:r>
             </w:hyperlink>
             <w:r>
@@ -9382,6 +10743,7 @@
               </w:numPr>
             </w:pPr>
             <w:r>
+              <w:lastRenderedPageBreak/>
               <w:t>Dates of collection</w:t>
             </w:r>
           </w:p>
@@ -9415,11 +10777,7 @@
               </w:numPr>
             </w:pPr>
             <w:r>
-              <w:t>Other dataset(s</w:t>
-            </w:r>
-            <w:r>
-              <w:lastRenderedPageBreak/>
-              <w:t>) used in creating the dataset </w:t>
+              <w:t>Other dataset(s) used in creating the dataset </w:t>
             </w:r>
           </w:p>
           <w:p>
@@ -9732,32 +11090,37 @@
               </w:numPr>
             </w:pPr>
             <w:r>
-              <w:t>Can also provide information about controlled vocabulary (in that specific field) if none is filled out.</w:t>
-            </w:r>
-          </w:p>
-        </w:tc>
-        <w:tc>
-          <w:tcPr>
-            <w:tcW w:w="0" w:type="auto"/>
-            <w:tcBorders>
-              <w:top w:val="single" w:sz="8" w:space="0" w:color="000000"/>
-              <w:left w:val="single" w:sz="8" w:space="0" w:color="000000"/>
-              <w:bottom w:val="single" w:sz="8" w:space="0" w:color="000000"/>
-              <w:right w:val="single" w:sz="8" w:space="0" w:color="000000"/>
-            </w:tcBorders>
-            <w:tcMar>
-              <w:top w:w="100" w:type="dxa"/>
-              <w:left w:w="100" w:type="dxa"/>
-              <w:bottom w:w="100" w:type="dxa"/>
-              <w:right w:w="100" w:type="dxa"/>
-            </w:tcMar>
-            <w:hideMark/>
-          </w:tcPr>
-          <w:p>
-            <w:r>
-              <w:rPr>
-                <w:lang w:val="en-US"/>
-              </w:rPr>
+              <w:t>Can also provide information about controlle</w:t>
+            </w:r>
+            <w:r>
+              <w:lastRenderedPageBreak/>
+              <w:t>d vocabulary (in that specific field) if none is filled out.</w:t>
+            </w:r>
+          </w:p>
+        </w:tc>
+        <w:tc>
+          <w:tcPr>
+            <w:tcW w:w="0" w:type="auto"/>
+            <w:tcBorders>
+              <w:top w:val="single" w:sz="8" w:space="0" w:color="000000"/>
+              <w:left w:val="single" w:sz="8" w:space="0" w:color="000000"/>
+              <w:bottom w:val="single" w:sz="8" w:space="0" w:color="000000"/>
+              <w:right w:val="single" w:sz="8" w:space="0" w:color="000000"/>
+            </w:tcBorders>
+            <w:tcMar>
+              <w:top w:w="100" w:type="dxa"/>
+              <w:left w:w="100" w:type="dxa"/>
+              <w:bottom w:w="100" w:type="dxa"/>
+              <w:right w:w="100" w:type="dxa"/>
+            </w:tcMar>
+            <w:hideMark/>
+          </w:tcPr>
+          <w:p>
+            <w:r>
+              <w:rPr>
+                <w:lang w:val="en-US"/>
+              </w:rPr>
+              <w:lastRenderedPageBreak/>
               <w:t xml:space="preserve">{% if </w:t>
             </w:r>
             <w:proofErr w:type="spellStart"/>
@@ -9765,7 +11128,14 @@
               <w:rPr>
                 <w:lang w:val="en-US"/>
               </w:rPr>
-              <w:t>template_dict.</w:t>
+              <w:t>template_</w:t>
+            </w:r>
+            <w:proofErr w:type="gramStart"/>
+            <w:r>
+              <w:rPr>
+                <w:lang w:val="en-US"/>
+              </w:rPr>
+              <w:t>dict.</w:t>
             </w:r>
             <w:r>
               <w:rPr>
@@ -9774,6 +11144,7 @@
               </w:rPr>
               <w:t>keywords</w:t>
             </w:r>
+            <w:proofErr w:type="gramEnd"/>
             <w:r>
               <w:rPr>
                 <w:lang w:val="en-US"/>
@@ -9785,7 +11156,21 @@
               <w:rPr>
                 <w:lang w:val="en-US"/>
               </w:rPr>
-              <w:t xml:space="preserve"> &gt; 0 %}X{% endif %}</w:t>
+              <w:t xml:space="preserve"> &gt; </w:t>
+            </w:r>
+            <w:proofErr w:type="gramStart"/>
+            <w:r>
+              <w:rPr>
+                <w:lang w:val="en-US"/>
+              </w:rPr>
+              <w:t>0 %}X{</w:t>
+            </w:r>
+            <w:proofErr w:type="gramEnd"/>
+            <w:r>
+              <w:rPr>
+                <w:lang w:val="en-US"/>
+              </w:rPr>
+              <w:t>% endif %}</w:t>
             </w:r>
           </w:p>
         </w:tc>
@@ -9842,7 +11227,14 @@
               <w:rPr>
                 <w:lang w:val="en-US"/>
               </w:rPr>
-              <w:t>template_dict.</w:t>
+              <w:t>template_</w:t>
+            </w:r>
+            <w:proofErr w:type="gramStart"/>
+            <w:r>
+              <w:rPr>
+                <w:lang w:val="en-US"/>
+              </w:rPr>
+              <w:t>dict.</w:t>
             </w:r>
             <w:r>
               <w:rPr>
@@ -9851,6 +11243,7 @@
               </w:rPr>
               <w:t>keywords</w:t>
             </w:r>
+            <w:proofErr w:type="gramEnd"/>
             <w:r>
               <w:rPr>
                 <w:lang w:val="en-US"/>
@@ -9862,7 +11255,21 @@
               <w:rPr>
                 <w:lang w:val="en-US"/>
               </w:rPr>
-              <w:t xml:space="preserve"> == 0 %}X{% endif %}</w:t>
+              <w:t xml:space="preserve"> == 0 %}</w:t>
+            </w:r>
+            <w:proofErr w:type="gramStart"/>
+            <w:r>
+              <w:rPr>
+                <w:lang w:val="en-US"/>
+              </w:rPr>
+              <w:t>X{</w:t>
+            </w:r>
+            <w:proofErr w:type="gramEnd"/>
+            <w:r>
+              <w:rPr>
+                <w:lang w:val="en-US"/>
+              </w:rPr>
+              <w:t>% endif %}</w:t>
             </w:r>
           </w:p>
         </w:tc>
@@ -9940,7 +11347,14 @@
               <w:rPr>
                 <w:lang w:val="en-US"/>
               </w:rPr>
-              <w:t>template_dict</w:t>
+              <w:t>template_</w:t>
+            </w:r>
+            <w:proofErr w:type="gramStart"/>
+            <w:r>
+              <w:rPr>
+                <w:lang w:val="en-US"/>
+              </w:rPr>
+              <w:t>dict</w:t>
             </w:r>
             <w:proofErr w:type="spellEnd"/>
             <w:r>
@@ -9953,6 +11367,7 @@
             <w:r>
               <w:t>keywords</w:t>
             </w:r>
+            <w:proofErr w:type="gramEnd"/>
             <w:r>
               <w:t>|length</w:t>
             </w:r>
@@ -9961,20 +11376,38 @@
               <w:t xml:space="preserve"> &gt; 0</w:t>
             </w:r>
             <w:r>
-              <w:t xml:space="preserve"> %}</w:t>
-            </w:r>
-            <w:r>
-              <w:rPr>
-                <w:lang w:val="en-US"/>
-              </w:rPr>
-              <w:t xml:space="preserve">{% for item in </w:t>
+              <w:t xml:space="preserve"> </w:t>
+            </w:r>
+            <w:proofErr w:type="gramStart"/>
+            <w:r>
+              <w:t>%}</w:t>
+            </w:r>
+            <w:r>
+              <w:rPr>
+                <w:lang w:val="en-US"/>
+              </w:rPr>
+              <w:t>{</w:t>
+            </w:r>
+            <w:proofErr w:type="gramEnd"/>
+            <w:r>
+              <w:rPr>
+                <w:lang w:val="en-US"/>
+              </w:rPr>
+              <w:t xml:space="preserve">% for item in </w:t>
             </w:r>
             <w:proofErr w:type="spellStart"/>
             <w:r>
               <w:rPr>
                 <w:lang w:val="en-US"/>
               </w:rPr>
-              <w:t>template_dict.</w:t>
+              <w:t>template_</w:t>
+            </w:r>
+            <w:proofErr w:type="gramStart"/>
+            <w:r>
+              <w:rPr>
+                <w:lang w:val="en-US"/>
+              </w:rPr>
+              <w:t>dict.</w:t>
             </w:r>
             <w:r>
               <w:rPr>
@@ -9984,6 +11417,7 @@
               <w:t>keywords</w:t>
             </w:r>
             <w:proofErr w:type="spellEnd"/>
+            <w:proofErr w:type="gramEnd"/>
             <w:r>
               <w:rPr>
                 <w:lang w:val="en-US"/>
@@ -9999,13 +11433,36 @@
                 <w:numId w:val="51"/>
               </w:numPr>
             </w:pPr>
-            <w:r>
-              <w:rPr>
-                <w:lang w:val="en-US"/>
-              </w:rPr>
-              <w:t xml:space="preserve">{{ item }}{% </w:t>
+            <w:proofErr w:type="gramStart"/>
+            <w:r>
+              <w:rPr>
+                <w:lang w:val="en-US"/>
+              </w:rPr>
+              <w:t>{{ item</w:t>
+            </w:r>
+            <w:proofErr w:type="gramEnd"/>
+            <w:r>
+              <w:rPr>
+                <w:lang w:val="en-US"/>
+              </w:rPr>
+              <w:t xml:space="preserve"> </w:t>
+            </w:r>
+            <w:proofErr w:type="gramStart"/>
+            <w:r>
+              <w:rPr>
+                <w:lang w:val="en-US"/>
+              </w:rPr>
+              <w:t>}}{</w:t>
+            </w:r>
+            <w:proofErr w:type="gramEnd"/>
+            <w:r>
+              <w:rPr>
+                <w:lang w:val="en-US"/>
+              </w:rPr>
+              <w:t xml:space="preserve">% </w:t>
             </w:r>
             <w:proofErr w:type="spellStart"/>
+            <w:proofErr w:type="gramStart"/>
             <w:r>
               <w:rPr>
                 <w:lang w:val="en-US"/>
@@ -10019,11 +11476,21 @@
               </w:rPr>
               <w:t xml:space="preserve"> %}</w:t>
             </w:r>
-          </w:p>
-          <w:p>
-            <w:r>
-              <w:t>{% else %}(NONE</w:t>
-            </w:r>
+            <w:proofErr w:type="gramEnd"/>
+          </w:p>
+          <w:p>
+            <w:r>
+              <w:t xml:space="preserve">{% else </w:t>
+            </w:r>
+            <w:proofErr w:type="gramStart"/>
+            <w:r>
+              <w:t>%}(</w:t>
+            </w:r>
+            <w:proofErr w:type="gramEnd"/>
+            <w:r>
+              <w:t>NONE</w:t>
+            </w:r>
+            <w:proofErr w:type="gramStart"/>
             <w:r>
               <w:rPr>
                 <w:rFonts w:hint="eastAsia"/>
@@ -10031,7 +11498,11 @@
               <w:t>)</w:t>
             </w:r>
             <w:r>
-              <w:t>{% endif %}</w:t>
+              <w:t>{</w:t>
+            </w:r>
+            <w:proofErr w:type="gramEnd"/>
+            <w:r>
+              <w:t>% endif %}</w:t>
             </w:r>
           </w:p>
         </w:tc>
@@ -10132,15 +11603,7 @@
                 <w:b/>
                 <w:bCs/>
               </w:rPr>
-              <w:t xml:space="preserve">Does the dataset include a </w:t>
-            </w:r>
-            <w:r>
-              <w:rPr>
-                <w:b/>
-                <w:bCs/>
-              </w:rPr>
-              <w:lastRenderedPageBreak/>
-              <w:t>Researcher ID for each author?</w:t>
+              <w:t>Does the dataset include a Researcher ID for each author?</w:t>
             </w:r>
           </w:p>
         </w:tc>
@@ -10169,12 +11632,7 @@
               </w:numPr>
             </w:pPr>
             <w:r>
-              <w:lastRenderedPageBreak/>
-              <w:t xml:space="preserve">If no Researcher ID </w:t>
-            </w:r>
-            <w:r>
-              <w:lastRenderedPageBreak/>
-              <w:t>(such as ORCID, or other identifier) is listed, let them know they may want to include it</w:t>
+              <w:t>If no Researcher ID (such as ORCID, or other identifier) is listed, let them know they may want to include it</w:t>
             </w:r>
           </w:p>
         </w:tc>
@@ -10429,7 +11887,11 @@
               </w:numPr>
             </w:pPr>
             <w:r>
-              <w:t>If metadata indicates a related publication or project, suggest adding a corresponding suffix to the title.</w:t>
+              <w:t xml:space="preserve">If metadata indicates a related publication or project, </w:t>
+            </w:r>
+            <w:r>
+              <w:lastRenderedPageBreak/>
+              <w:t>suggest adding a corresponding suffix to the title.</w:t>
             </w:r>
           </w:p>
         </w:tc>
@@ -10691,15 +12153,7 @@
                 <w:b/>
                 <w:bCs/>
               </w:rPr>
-              <w:t xml:space="preserve">If there is a related dataset associated </w:t>
-            </w:r>
-            <w:r>
-              <w:rPr>
-                <w:b/>
-                <w:bCs/>
-              </w:rPr>
-              <w:lastRenderedPageBreak/>
-              <w:t>with the dataset, has a DOI or other identifier been included in the publication metadata?</w:t>
+              <w:t>If there is a related dataset associated with the dataset, has a DOI or other identifier been included in the publication metadata?</w:t>
             </w:r>
           </w:p>
         </w:tc>
@@ -10728,18 +12182,10 @@
               </w:numPr>
             </w:pPr>
             <w:r>
-              <w:lastRenderedPageBreak/>
-              <w:t xml:space="preserve">If there’s a related article, has the </w:t>
-            </w:r>
-            <w:r>
-              <w:lastRenderedPageBreak/>
-              <w:t xml:space="preserve">DOI or other </w:t>
-            </w:r>
-            <w:r>
-              <w:t>persistent</w:t>
-            </w:r>
-            <w:r>
-              <w:t xml:space="preserve"> </w:t>
+              <w:t xml:space="preserve">If there’s a related article, has the DOI or other </w:t>
+            </w:r>
+            <w:r>
+              <w:t xml:space="preserve">persistent </w:t>
             </w:r>
             <w:r>
               <w:t>identifier been included </w:t>
@@ -10868,31 +12314,21 @@
               <w:rPr>
                 <w:u w:val="single"/>
               </w:rPr>
-              <w:t xml:space="preserve">If not, provide the citation and the </w:t>
-            </w:r>
-            <w:r>
-              <w:rPr>
+              <w:t>If not, provide the citation and the PID of the publication(s) below, with the format ‘</w:t>
+            </w:r>
+            <w:r>
+              <w:rPr>
+                <w:i/>
+                <w:iCs/>
                 <w:u w:val="single"/>
               </w:rPr>
-              <w:t>PID</w:t>
+              <w:t>publication: PID’</w:t>
             </w:r>
             <w:r>
               <w:rPr>
                 <w:u w:val="single"/>
               </w:rPr>
-              <w:t xml:space="preserve"> of the publication(s) below, with the format ‘publication: </w:t>
-            </w:r>
-            <w:r>
-              <w:rPr>
-                <w:u w:val="single"/>
-              </w:rPr>
-              <w:t>PID</w:t>
-            </w:r>
-            <w:r>
-              <w:rPr>
-                <w:u w:val="single"/>
-              </w:rPr>
-              <w:t>’:</w:t>
+              <w:t>:</w:t>
             </w:r>
           </w:p>
           <w:p>
@@ -10923,7 +12359,6 @@
           </w:tcPr>
           <w:p>
             <w:r>
-              <w:lastRenderedPageBreak/>
               <w:t>Require</w:t>
             </w:r>
           </w:p>
@@ -11322,7 +12757,11 @@
               </w:numPr>
             </w:pPr>
             <w:r>
-              <w:t>Review documentation and file names and see if there are any that should be opened and reviewed (e.g. if a file is named “participant survey” - maybe open that one)</w:t>
+              <w:t xml:space="preserve">Review documentation and file names and see if there are any that should be opened and reviewed (e.g. if a file is named “participant survey” - maybe </w:t>
+            </w:r>
+            <w:r>
+              <w:lastRenderedPageBreak/>
+              <w:t>open that one)</w:t>
             </w:r>
           </w:p>
           <w:p>
@@ -11336,6 +12775,99 @@
               <w:t>Review description, notes, and terms of access metadata fields.</w:t>
             </w:r>
           </w:p>
+          <w:p>
+            <w:pPr>
+              <w:numPr>
+                <w:ilvl w:val="0"/>
+                <w:numId w:val="36"/>
+              </w:numPr>
+            </w:pPr>
+            <w:r>
+              <w:t xml:space="preserve">Examples of </w:t>
+            </w:r>
+            <w:r>
+              <w:t xml:space="preserve">direct </w:t>
+            </w:r>
+            <w:r>
+              <w:t>identifier include:</w:t>
+            </w:r>
+          </w:p>
+          <w:p>
+            <w:pPr>
+              <w:numPr>
+                <w:ilvl w:val="1"/>
+                <w:numId w:val="36"/>
+              </w:numPr>
+            </w:pPr>
+            <w:r>
+              <w:t>Social Security Numbers (SSNs)</w:t>
+            </w:r>
+          </w:p>
+          <w:p>
+            <w:pPr>
+              <w:numPr>
+                <w:ilvl w:val="1"/>
+                <w:numId w:val="36"/>
+              </w:numPr>
+            </w:pPr>
+            <w:r>
+              <w:t>Canadian S</w:t>
+            </w:r>
+            <w:r>
+              <w:lastRenderedPageBreak/>
+              <w:t>ocial Insurance Number (SINs)</w:t>
+            </w:r>
+          </w:p>
+          <w:p>
+            <w:pPr>
+              <w:numPr>
+                <w:ilvl w:val="1"/>
+                <w:numId w:val="36"/>
+              </w:numPr>
+            </w:pPr>
+            <w:r>
+              <w:t>Credit card numbers</w:t>
+            </w:r>
+          </w:p>
+          <w:p>
+            <w:pPr>
+              <w:numPr>
+                <w:ilvl w:val="1"/>
+                <w:numId w:val="36"/>
+              </w:numPr>
+            </w:pPr>
+            <w:r>
+              <w:t>Email addresses</w:t>
+            </w:r>
+          </w:p>
+          <w:p>
+            <w:pPr>
+              <w:numPr>
+                <w:ilvl w:val="1"/>
+                <w:numId w:val="36"/>
+              </w:numPr>
+            </w:pPr>
+            <w:r>
+              <w:lastRenderedPageBreak/>
+              <w:t>Phone numbers</w:t>
+            </w:r>
+          </w:p>
+          <w:p>
+            <w:pPr>
+              <w:numPr>
+                <w:ilvl w:val="1"/>
+                <w:numId w:val="36"/>
+              </w:numPr>
+            </w:pPr>
+            <w:proofErr w:type="spellStart"/>
+            <w:r>
+              <w:t>vCards</w:t>
+            </w:r>
+            <w:proofErr w:type="spellEnd"/>
+            <w:r>
+              <w:t xml:space="preserve"> (Virtual Contact Files)</w:t>
+            </w:r>
+          </w:p>
         </w:tc>
         <w:tc>
           <w:tcPr>
@@ -11637,7 +13169,11 @@
               </w:numPr>
             </w:pPr>
             <w:r>
-              <w:t>If something is flagged in the sensitive data review (see question above), check the intake form to confirm information about their REB status.</w:t>
+              <w:t xml:space="preserve">If something is flagged in the sensitive data review (see question above), check the intake form to confirm </w:t>
+            </w:r>
+            <w:r>
+              <w:lastRenderedPageBreak/>
+              <w:t>information about their REB status.</w:t>
             </w:r>
           </w:p>
         </w:tc>
@@ -12035,7 +13571,19 @@
               <w:rPr>
                 <w:u w:val="single"/>
               </w:rPr>
-              <w:t>List any restricted files in this dataset:</w:t>
+              <w:t xml:space="preserve">List any restricted files in </w:t>
+            </w:r>
+            <w:r>
+              <w:rPr>
+                <w:u w:val="single"/>
+              </w:rPr>
+              <w:t xml:space="preserve">the </w:t>
+            </w:r>
+            <w:r>
+              <w:rPr>
+                <w:u w:val="single"/>
+              </w:rPr>
+              <w:t>dataset:</w:t>
             </w:r>
             <w:r>
               <w:br/>
@@ -12045,7 +13593,19 @@
             </w:r>
             <w:proofErr w:type="spellStart"/>
             <w:r>
-              <w:t>template_dict.restricted_files.comment</w:t>
+              <w:t>template_</w:t>
+            </w:r>
+            <w:proofErr w:type="gramStart"/>
+            <w:r>
+              <w:t>dict.restricted</w:t>
+            </w:r>
+            <w:proofErr w:type="gramEnd"/>
+            <w:r>
+              <w:t>_</w:t>
+            </w:r>
+            <w:proofErr w:type="gramStart"/>
+            <w:r>
+              <w:t>files.comment</w:t>
             </w:r>
             <w:r>
               <w:rPr>
@@ -12053,6 +13613,7 @@
               </w:rPr>
               <w:t>s</w:t>
             </w:r>
+            <w:proofErr w:type="gramEnd"/>
             <w:r>
               <w:t>|length</w:t>
             </w:r>
@@ -12061,13 +13622,34 @@
               <w:t xml:space="preserve"> &gt; 0</w:t>
             </w:r>
             <w:r>
-              <w:t xml:space="preserve"> %}{% for item in </w:t>
+              <w:t xml:space="preserve"> </w:t>
+            </w:r>
+            <w:proofErr w:type="gramStart"/>
+            <w:r>
+              <w:t>%}{</w:t>
+            </w:r>
+            <w:proofErr w:type="gramEnd"/>
+            <w:r>
+              <w:t xml:space="preserve">% for item in </w:t>
             </w:r>
             <w:proofErr w:type="spellStart"/>
             <w:r>
-              <w:t>template_dict.restricted_files.comments</w:t>
+              <w:t>template_</w:t>
+            </w:r>
+            <w:proofErr w:type="gramStart"/>
+            <w:r>
+              <w:t>dict.restricted</w:t>
+            </w:r>
+            <w:proofErr w:type="gramEnd"/>
+            <w:r>
+              <w:t>_</w:t>
+            </w:r>
+            <w:proofErr w:type="gramStart"/>
+            <w:r>
+              <w:t>files.comments</w:t>
             </w:r>
             <w:proofErr w:type="spellEnd"/>
+            <w:proofErr w:type="gramEnd"/>
             <w:r>
               <w:t xml:space="preserve"> %} </w:t>
             </w:r>
@@ -12080,16 +13662,29 @@
                 <w:numId w:val="47"/>
               </w:numPr>
             </w:pPr>
+            <w:proofErr w:type="gramStart"/>
             <w:r>
               <w:t xml:space="preserve">{{ </w:t>
             </w:r>
             <w:proofErr w:type="spellStart"/>
             <w:r>
-              <w:t>item.file_name</w:t>
+              <w:t>item</w:t>
+            </w:r>
+            <w:proofErr w:type="gramEnd"/>
+            <w:r>
+              <w:t>.file_</w:t>
+            </w:r>
+            <w:proofErr w:type="gramStart"/>
+            <w:r>
+              <w:t>name</w:t>
             </w:r>
             <w:proofErr w:type="spellEnd"/>
             <w:r>
-              <w:t xml:space="preserve"> }} {% </w:t>
+              <w:t xml:space="preserve"> }</w:t>
+            </w:r>
+            <w:proofErr w:type="gramEnd"/>
+            <w:r>
+              <w:t xml:space="preserve">} {% </w:t>
             </w:r>
             <w:proofErr w:type="spellStart"/>
             <w:r>
@@ -12102,7 +13697,23 @@
           </w:p>
           <w:p>
             <w:r>
-              <w:t>{% else %}(NONE){% endif %}</w:t>
+              <w:t xml:space="preserve">{% else </w:t>
+            </w:r>
+            <w:proofErr w:type="gramStart"/>
+            <w:r>
+              <w:t>%}(</w:t>
+            </w:r>
+            <w:proofErr w:type="gramEnd"/>
+            <w:r>
+              <w:t>NONE</w:t>
+            </w:r>
+            <w:proofErr w:type="gramStart"/>
+            <w:r>
+              <w:t>){</w:t>
+            </w:r>
+            <w:proofErr w:type="gramEnd"/>
+            <w:r>
+              <w:t>% endif %}</w:t>
             </w:r>
           </w:p>
           <w:p>
@@ -12150,19 +13761,77 @@
             </w:r>
             <w:proofErr w:type="spellStart"/>
             <w:r>
-              <w:t>template_dict.terms_license.licenseName</w:t>
+              <w:t>template_</w:t>
+            </w:r>
+            <w:proofErr w:type="gramStart"/>
+            <w:r>
+              <w:t>dict.terms</w:t>
+            </w:r>
+            <w:proofErr w:type="gramEnd"/>
+            <w:r>
+              <w:t>_</w:t>
+            </w:r>
+            <w:proofErr w:type="gramStart"/>
+            <w:r>
+              <w:t>license.licenseName</w:t>
             </w:r>
             <w:proofErr w:type="spellEnd"/>
-            <w:r>
-              <w:t xml:space="preserve"> is not none %}{{ </w:t>
+            <w:proofErr w:type="gramEnd"/>
+            <w:r>
+              <w:t xml:space="preserve"> is not none </w:t>
+            </w:r>
+            <w:proofErr w:type="gramStart"/>
+            <w:r>
+              <w:t xml:space="preserve">%}{{ </w:t>
             </w:r>
             <w:proofErr w:type="spellStart"/>
             <w:r>
-              <w:t>template_dict.terms_license.licenseName</w:t>
+              <w:t>template</w:t>
+            </w:r>
+            <w:proofErr w:type="gramEnd"/>
+            <w:r>
+              <w:t>_</w:t>
+            </w:r>
+            <w:proofErr w:type="gramStart"/>
+            <w:r>
+              <w:t>dict.terms</w:t>
+            </w:r>
+            <w:proofErr w:type="gramEnd"/>
+            <w:r>
+              <w:t>_</w:t>
+            </w:r>
+            <w:proofErr w:type="gramStart"/>
+            <w:r>
+              <w:t>license.licenseName</w:t>
             </w:r>
             <w:proofErr w:type="spellEnd"/>
-            <w:r>
-              <w:t xml:space="preserve"> }}{% else %}(NONE){% endif %}</w:t>
+            <w:proofErr w:type="gramEnd"/>
+            <w:r>
+              <w:t xml:space="preserve"> </w:t>
+            </w:r>
+            <w:proofErr w:type="gramStart"/>
+            <w:r>
+              <w:t>}}{</w:t>
+            </w:r>
+            <w:proofErr w:type="gramEnd"/>
+            <w:r>
+              <w:t xml:space="preserve">% else </w:t>
+            </w:r>
+            <w:proofErr w:type="gramStart"/>
+            <w:r>
+              <w:t>%}(</w:t>
+            </w:r>
+            <w:proofErr w:type="gramEnd"/>
+            <w:r>
+              <w:t>NONE</w:t>
+            </w:r>
+            <w:proofErr w:type="gramStart"/>
+            <w:r>
+              <w:t>){</w:t>
+            </w:r>
+            <w:proofErr w:type="gramEnd"/>
+            <w:r>
+              <w:t>% endif %}</w:t>
             </w:r>
           </w:p>
           <w:p>
@@ -12206,7 +13875,7 @@
               <w:tblLook w:val="04A0" w:firstRow="1" w:lastRow="0" w:firstColumn="1" w:lastColumn="0" w:noHBand="0" w:noVBand="1"/>
             </w:tblPr>
             <w:tblGrid>
-              <w:gridCol w:w="3795"/>
+              <w:gridCol w:w="3826"/>
             </w:tblGrid>
             <w:tr>
               <w:tc>
@@ -12224,29 +13893,83 @@
                   </w:r>
                   <w:proofErr w:type="spellStart"/>
                   <w:r>
-                    <w:t>template_dict.terms_license.</w:t>
+                    <w:t>template_</w:t>
+                  </w:r>
+                  <w:proofErr w:type="gramStart"/>
+                  <w:r>
+                    <w:t>dict.terms</w:t>
+                  </w:r>
+                  <w:proofErr w:type="gramEnd"/>
+                  <w:r>
+                    <w:t>_</w:t>
+                  </w:r>
+                  <w:proofErr w:type="gramStart"/>
+                  <w:r>
+                    <w:t>license.</w:t>
                   </w:r>
                   <w:r>
                     <w:t>termsOfUse</w:t>
                   </w:r>
                   <w:proofErr w:type="spellEnd"/>
+                  <w:proofErr w:type="gramEnd"/>
                   <w:r>
-                    <w:t xml:space="preserve"> is not none %}{{ </w:t>
+                    <w:t xml:space="preserve"> is not none </w:t>
+                  </w:r>
+                  <w:proofErr w:type="gramStart"/>
+                  <w:r>
+                    <w:t xml:space="preserve">%}{{ </w:t>
                   </w:r>
                   <w:proofErr w:type="spellStart"/>
                   <w:r>
-                    <w:t>template_dict.terms_license.</w:t>
+                    <w:t>template</w:t>
+                  </w:r>
+                  <w:proofErr w:type="gramEnd"/>
+                  <w:r>
+                    <w:t>_</w:t>
+                  </w:r>
+                  <w:proofErr w:type="gramStart"/>
+                  <w:r>
+                    <w:t>dict.terms</w:t>
+                  </w:r>
+                  <w:proofErr w:type="gramEnd"/>
+                  <w:r>
+                    <w:t>_</w:t>
+                  </w:r>
+                  <w:proofErr w:type="gramStart"/>
+                  <w:r>
+                    <w:t>license.</w:t>
                   </w:r>
                   <w:r>
-                    <w:t>ter</w:t>
-                  </w:r>
-                  <w:r>
-                    <w:lastRenderedPageBreak/>
-                    <w:t>msOfUse</w:t>
+                    <w:t>termsOfUse</w:t>
                   </w:r>
                   <w:proofErr w:type="spellEnd"/>
+                  <w:proofErr w:type="gramEnd"/>
                   <w:r>
-                    <w:t xml:space="preserve"> }}{% else %}(NONE){% endif %}</w:t>
+                    <w:t xml:space="preserve"> </w:t>
+                  </w:r>
+                  <w:proofErr w:type="gramStart"/>
+                  <w:r>
+                    <w:t>}}{</w:t>
+                  </w:r>
+                  <w:proofErr w:type="gramEnd"/>
+                  <w:r>
+                    <w:t xml:space="preserve">% else </w:t>
+                  </w:r>
+                  <w:proofErr w:type="gramStart"/>
+                  <w:r>
+                    <w:t>%}(</w:t>
+                  </w:r>
+                  <w:proofErr w:type="gramEnd"/>
+                  <w:r>
+                    <w:t>NONE</w:t>
+                  </w:r>
+                  <w:proofErr w:type="gramStart"/>
+                  <w:r>
+                    <w:t>){</w:t>
+                  </w:r>
+                  <w:proofErr w:type="gramEnd"/>
+                  <w:r>
+                    <w:t>% endif %}</w:t>
                   </w:r>
                 </w:p>
               </w:tc>
@@ -12274,7 +13997,6 @@
           </w:tcPr>
           <w:p>
             <w:r>
-              <w:lastRenderedPageBreak/>
               <w:t>Require</w:t>
             </w:r>
           </w:p>
@@ -12354,7 +14076,7 @@
                 <w:b/>
                 <w:bCs/>
               </w:rPr>
-              <w:t>If there are restricted files in the dataset, is the Terms of Access field complete?</w:t>
+              <w:t>Is the Terms of Access field complete if there are restricted files in the dataset?</w:t>
             </w:r>
           </w:p>
         </w:tc>
@@ -12399,6 +14121,7 @@
               </w:numPr>
             </w:pPr>
             <w:r>
+              <w:lastRenderedPageBreak/>
               <w:t>If there are Terms of Access, review to ensure they are clear.</w:t>
             </w:r>
           </w:p>
@@ -12425,6 +14148,7 @@
                 <w:rFonts w:hint="eastAsia"/>
                 <w:lang w:val="en-US"/>
               </w:rPr>
+              <w:lastRenderedPageBreak/>
               <w:t xml:space="preserve">{% if </w:t>
             </w:r>
             <w:proofErr w:type="spellStart"/>
@@ -12454,7 +14178,11 @@
             </w:r>
             <w:proofErr w:type="spellStart"/>
             <w:r>
-              <w:t>restricted_files</w:t>
+              <w:t>restricted_</w:t>
+            </w:r>
+            <w:proofErr w:type="gramStart"/>
+            <w:r>
+              <w:t>files</w:t>
             </w:r>
             <w:proofErr w:type="spellEnd"/>
             <w:r>
@@ -12470,6 +14198,7 @@
               </w:rPr>
               <w:t>comments</w:t>
             </w:r>
+            <w:proofErr w:type="gramEnd"/>
             <w:r>
               <w:rPr>
                 <w:rFonts w:hint="eastAsia"/>
@@ -12500,12 +14229,25 @@
             </w:r>
             <w:proofErr w:type="spellStart"/>
             <w:r>
-              <w:t>template_dict.terms_license.</w:t>
+              <w:t>template_</w:t>
+            </w:r>
+            <w:proofErr w:type="gramStart"/>
+            <w:r>
+              <w:t>dict.terms</w:t>
+            </w:r>
+            <w:proofErr w:type="gramEnd"/>
+            <w:r>
+              <w:t>_</w:t>
+            </w:r>
+            <w:proofErr w:type="gramStart"/>
+            <w:r>
+              <w:t>license.</w:t>
             </w:r>
             <w:r>
               <w:t>termsOfAccess</w:t>
             </w:r>
             <w:proofErr w:type="spellEnd"/>
+            <w:proofErr w:type="gramEnd"/>
             <w:r>
               <w:t xml:space="preserve"> is not none</w:t>
             </w:r>
@@ -12515,8 +14257,13 @@
               </w:rPr>
               <w:t xml:space="preserve"> %}</w:t>
             </w:r>
-            <w:r>
-              <w:t>X{% endif %}</w:t>
+            <w:proofErr w:type="gramStart"/>
+            <w:r>
+              <w:t>X{</w:t>
+            </w:r>
+            <w:proofErr w:type="gramEnd"/>
+            <w:r>
+              <w:t>% endif %}</w:t>
             </w:r>
           </w:p>
         </w:tc>
@@ -12571,7 +14318,11 @@
             </w:r>
             <w:proofErr w:type="spellStart"/>
             <w:r>
-              <w:t>restricted_files</w:t>
+              <w:t>restricted_</w:t>
+            </w:r>
+            <w:proofErr w:type="gramStart"/>
+            <w:r>
+              <w:t>files</w:t>
             </w:r>
             <w:proofErr w:type="spellEnd"/>
             <w:r>
@@ -12587,6 +14338,7 @@
               </w:rPr>
               <w:t>comments</w:t>
             </w:r>
+            <w:proofErr w:type="gramEnd"/>
             <w:r>
               <w:rPr>
                 <w:rFonts w:hint="eastAsia"/>
@@ -12617,12 +14369,25 @@
             </w:r>
             <w:proofErr w:type="spellStart"/>
             <w:r>
-              <w:t>template_dict.terms_license.</w:t>
+              <w:t>template_</w:t>
+            </w:r>
+            <w:proofErr w:type="gramStart"/>
+            <w:r>
+              <w:t>dict.terms</w:t>
+            </w:r>
+            <w:proofErr w:type="gramEnd"/>
+            <w:r>
+              <w:t>_</w:t>
+            </w:r>
+            <w:proofErr w:type="gramStart"/>
+            <w:r>
+              <w:t>license.</w:t>
             </w:r>
             <w:r>
               <w:t>termsOfAccess</w:t>
             </w:r>
             <w:proofErr w:type="spellEnd"/>
+            <w:proofErr w:type="gramEnd"/>
             <w:r>
               <w:t xml:space="preserve"> is none</w:t>
             </w:r>
@@ -12632,8 +14397,13 @@
               </w:rPr>
               <w:t xml:space="preserve"> %}</w:t>
             </w:r>
-            <w:r>
-              <w:t>X{% endif %}</w:t>
+            <w:proofErr w:type="gramStart"/>
+            <w:r>
+              <w:t>X{</w:t>
+            </w:r>
+            <w:proofErr w:type="gramEnd"/>
+            <w:r>
+              <w:t>% endif %}</w:t>
             </w:r>
           </w:p>
         </w:tc>
@@ -12724,7 +14494,11 @@
             </w:r>
             <w:proofErr w:type="spellStart"/>
             <w:r>
-              <w:t>restricted_files</w:t>
+              <w:t>restricted_</w:t>
+            </w:r>
+            <w:proofErr w:type="gramStart"/>
+            <w:r>
+              <w:t>files</w:t>
             </w:r>
             <w:proofErr w:type="spellEnd"/>
             <w:r>
@@ -12740,6 +14514,7 @@
               </w:rPr>
               <w:t>comments</w:t>
             </w:r>
+            <w:proofErr w:type="gramEnd"/>
             <w:r>
               <w:rPr>
                 <w:rFonts w:hint="eastAsia"/>
@@ -12766,13 +14541,28 @@
                 <w:rFonts w:hint="eastAsia"/>
                 <w:lang w:val="en-US"/>
               </w:rPr>
-              <w:t xml:space="preserve"> %}X</w:t>
-            </w:r>
-            <w:r>
-              <w:rPr>
-                <w:lang w:val="en-US"/>
-              </w:rPr>
-              <w:t>{% endif %}</w:t>
+              <w:t xml:space="preserve"> %}</w:t>
+            </w:r>
+            <w:proofErr w:type="gramStart"/>
+            <w:r>
+              <w:rPr>
+                <w:rFonts w:hint="eastAsia"/>
+                <w:lang w:val="en-US"/>
+              </w:rPr>
+              <w:t>X</w:t>
+            </w:r>
+            <w:r>
+              <w:rPr>
+                <w:lang w:val="en-US"/>
+              </w:rPr>
+              <w:t>{</w:t>
+            </w:r>
+            <w:proofErr w:type="gramEnd"/>
+            <w:r>
+              <w:rPr>
+                <w:lang w:val="en-US"/>
+              </w:rPr>
+              <w:t>% endif %}</w:t>
             </w:r>
           </w:p>
         </w:tc>
@@ -12830,7 +14620,7 @@
               <w:tblLook w:val="04A0" w:firstRow="1" w:lastRow="0" w:firstColumn="1" w:lastColumn="0" w:noHBand="0" w:noVBand="1"/>
             </w:tblPr>
             <w:tblGrid>
-              <w:gridCol w:w="3795"/>
+              <w:gridCol w:w="3826"/>
             </w:tblGrid>
             <w:tr>
               <w:tc>
@@ -12848,25 +14638,83 @@
                   </w:r>
                   <w:proofErr w:type="spellStart"/>
                   <w:r>
-                    <w:t>template_dict.terms_license.</w:t>
+                    <w:t>template_</w:t>
+                  </w:r>
+                  <w:proofErr w:type="gramStart"/>
+                  <w:r>
+                    <w:t>dict.terms</w:t>
+                  </w:r>
+                  <w:proofErr w:type="gramEnd"/>
+                  <w:r>
+                    <w:t>_</w:t>
+                  </w:r>
+                  <w:proofErr w:type="gramStart"/>
+                  <w:r>
+                    <w:t>license.</w:t>
                   </w:r>
                   <w:r>
                     <w:t>termsOfAccess</w:t>
                   </w:r>
                   <w:proofErr w:type="spellEnd"/>
+                  <w:proofErr w:type="gramEnd"/>
                   <w:r>
-                    <w:t xml:space="preserve"> is not none %}{{ </w:t>
+                    <w:t xml:space="preserve"> is not none </w:t>
+                  </w:r>
+                  <w:proofErr w:type="gramStart"/>
+                  <w:r>
+                    <w:t xml:space="preserve">%}{{ </w:t>
                   </w:r>
                   <w:proofErr w:type="spellStart"/>
                   <w:r>
-                    <w:t>template_dict.terms_license.</w:t>
+                    <w:t>template</w:t>
+                  </w:r>
+                  <w:proofErr w:type="gramEnd"/>
+                  <w:r>
+                    <w:t>_</w:t>
+                  </w:r>
+                  <w:proofErr w:type="gramStart"/>
+                  <w:r>
+                    <w:t>dict.terms</w:t>
+                  </w:r>
+                  <w:proofErr w:type="gramEnd"/>
+                  <w:r>
+                    <w:t>_</w:t>
+                  </w:r>
+                  <w:proofErr w:type="gramStart"/>
+                  <w:r>
+                    <w:t>license.</w:t>
                   </w:r>
                   <w:r>
                     <w:t>termsOfAccess</w:t>
                   </w:r>
                   <w:proofErr w:type="spellEnd"/>
+                  <w:proofErr w:type="gramEnd"/>
                   <w:r>
-                    <w:t xml:space="preserve"> }}{% else %}(NONE){% endif %}</w:t>
+                    <w:t xml:space="preserve"> </w:t>
+                  </w:r>
+                  <w:proofErr w:type="gramStart"/>
+                  <w:r>
+                    <w:t>}}{</w:t>
+                  </w:r>
+                  <w:proofErr w:type="gramEnd"/>
+                  <w:r>
+                    <w:t xml:space="preserve">% else </w:t>
+                  </w:r>
+                  <w:proofErr w:type="gramStart"/>
+                  <w:r>
+                    <w:t>%}(</w:t>
+                  </w:r>
+                  <w:proofErr w:type="gramEnd"/>
+                  <w:r>
+                    <w:t>NONE</w:t>
+                  </w:r>
+                  <w:proofErr w:type="gramStart"/>
+                  <w:r>
+                    <w:t>){</w:t>
+                  </w:r>
+                  <w:proofErr w:type="gramEnd"/>
+                  <w:r>
+                    <w:t>% endif %}</w:t>
                   </w:r>
                 </w:p>
               </w:tc>
@@ -14114,7 +15962,7 @@
         <w:sz w:val="20"/>
       </w:rPr>
     </w:lvl>
-    <w:lvl w:ilvl="1" w:tentative="1">
+    <w:lvl w:ilvl="1">
       <w:start w:val="1"/>
       <w:numFmt w:val="bullet"/>
       <w:lvlText w:val="o"/>
@@ -20319,7 +22167,6 @@
   <w:style w:type="character" w:default="1" w:styleId="DefaultParagraphFont">
     <w:name w:val="Default Paragraph Font"/>
     <w:uiPriority w:val="1"/>
-    <w:semiHidden/>
     <w:unhideWhenUsed/>
   </w:style>
   <w:style w:type="table" w:default="1" w:styleId="TableNormal">

</xml_diff>

<commit_message>
Added fixes suggested in the first calibration meeting in the checklists.
</commit_message>
<xml_diff>
--- a/res/template_high.docx
+++ b/res/template_high.docx
@@ -100,7 +100,6 @@
               </w:rPr>
               <w:t xml:space="preserve">Ticket number: {{ </w:t>
             </w:r>
-            <w:proofErr w:type="spellStart"/>
             <w:r>
               <w:t>project_info</w:t>
             </w:r>
@@ -113,7 +112,6 @@
             <w:r>
               <w:t>ticket_number</w:t>
             </w:r>
-            <w:proofErr w:type="spellEnd"/>
             <w:r>
               <w:rPr>
                 <w:rFonts w:hint="eastAsia"/>
@@ -143,7 +141,6 @@
               </w:rPr>
               <w:t xml:space="preserve"> {{ </w:t>
             </w:r>
-            <w:proofErr w:type="spellStart"/>
             <w:r>
               <w:t>project_info</w:t>
             </w:r>
@@ -151,14 +148,7 @@
               <w:rPr>
                 <w:rFonts w:hint="eastAsia"/>
               </w:rPr>
-              <w:t>.curator_name</w:t>
-            </w:r>
-            <w:proofErr w:type="spellEnd"/>
-            <w:r>
-              <w:rPr>
-                <w:rFonts w:hint="eastAsia"/>
-              </w:rPr>
-              <w:t xml:space="preserve"> }}</w:t>
+              <w:t>.curator_name }}</w:t>
             </w:r>
           </w:p>
           <w:p>
@@ -171,7 +161,6 @@
               </w:rPr>
               <w:t xml:space="preserve">Curator email: {{ </w:t>
             </w:r>
-            <w:proofErr w:type="spellStart"/>
             <w:r>
               <w:t>project_info</w:t>
             </w:r>
@@ -184,7 +173,6 @@
             <w:r>
               <w:t>curator_email</w:t>
             </w:r>
-            <w:proofErr w:type="spellEnd"/>
             <w:r>
               <w:rPr>
                 <w:rFonts w:hint="eastAsia"/>
@@ -200,19 +188,11 @@
               <w:rPr>
                 <w:rFonts w:hint="eastAsia"/>
               </w:rPr>
-              <w:t xml:space="preserve">Dataset title: {{ </w:t>
-            </w:r>
-            <w:proofErr w:type="spellStart"/>
-            <w:r>
-              <w:rPr>
-                <w:rFonts w:hint="eastAsia"/>
-              </w:rPr>
-              <w:t>dataset.</w:t>
+              <w:t>Dataset title: {{ dataset.</w:t>
             </w:r>
             <w:r>
               <w:t>DatasetTitle</w:t>
             </w:r>
-            <w:proofErr w:type="spellEnd"/>
             <w:r>
               <w:rPr>
                 <w:rFonts w:hint="eastAsia"/>
@@ -237,19 +217,11 @@
               <w:rPr>
                 <w:rFonts w:hint="eastAsia"/>
               </w:rPr>
-              <w:t xml:space="preserve"> identifier: {{ </w:t>
-            </w:r>
-            <w:proofErr w:type="spellStart"/>
-            <w:r>
-              <w:rPr>
-                <w:rFonts w:hint="eastAsia"/>
-              </w:rPr>
-              <w:t>dataset.</w:t>
+              <w:t xml:space="preserve"> identifier: {{ dataset.</w:t>
             </w:r>
             <w:r>
               <w:t>DatasetPersistentId</w:t>
             </w:r>
-            <w:proofErr w:type="spellEnd"/>
             <w:r>
               <w:rPr>
                 <w:rFonts w:hint="eastAsia"/>
@@ -276,19 +248,11 @@
               <w:rPr>
                 <w:rFonts w:hint="eastAsia"/>
               </w:rPr>
-              <w:t xml:space="preserve">Dataset access URL: {{ </w:t>
-            </w:r>
-            <w:proofErr w:type="spellStart"/>
-            <w:r>
-              <w:rPr>
-                <w:rFonts w:hint="eastAsia"/>
-              </w:rPr>
-              <w:t>dataset.</w:t>
+              <w:t>Dataset access URL: {{ dataset.</w:t>
             </w:r>
             <w:r>
               <w:t>DatasetURL</w:t>
             </w:r>
-            <w:proofErr w:type="spellEnd"/>
             <w:r>
               <w:rPr>
                 <w:rFonts w:hint="eastAsia"/>
@@ -1052,11 +1016,6 @@
             </w:tcMar>
           </w:tcPr>
           <w:p>
-            <w:pPr>
-              <w:rPr>
-                <w:rFonts w:hint="eastAsia"/>
-              </w:rPr>
-            </w:pPr>
             <w:r>
               <w:rPr>
                 <w:b/>
@@ -1286,22 +1245,15 @@
               </w:rPr>
               <w:t xml:space="preserve">{{ </w:t>
             </w:r>
-            <w:proofErr w:type="spellStart"/>
-            <w:r>
-              <w:t>template_dict</w:t>
-            </w:r>
-            <w:proofErr w:type="spellEnd"/>
-            <w:r>
-              <w:t>.</w:t>
-            </w:r>
-            <w:proofErr w:type="spellStart"/>
+            <w:r>
+              <w:t>template_dict.</w:t>
+            </w:r>
             <w:r>
               <w:rPr>
                 <w:lang w:val="en-US"/>
               </w:rPr>
               <w:t>ds_tree_info.path</w:t>
             </w:r>
-            <w:proofErr w:type="spellEnd"/>
             <w:r>
               <w:t>}}</w:t>
             </w:r>
@@ -1335,96 +1287,82 @@
               </w:rPr>
               <w:t xml:space="preserve">parent </w:t>
             </w:r>
-            <w:proofErr w:type="spellStart"/>
             <w:r>
               <w:rPr>
                 <w:rFonts w:hint="eastAsia"/>
                 <w:u w:val="single"/>
                 <w:lang w:val="en-US"/>
               </w:rPr>
-              <w:t>dataverse</w:t>
-            </w:r>
-            <w:proofErr w:type="spellEnd"/>
+              <w:t xml:space="preserve">dataverse </w:t>
+            </w:r>
+            <w:r>
+              <w:rPr>
+                <w:u w:val="single"/>
+                <w:lang w:val="en-US"/>
+              </w:rPr>
+              <w:t>collection</w:t>
+            </w:r>
             <w:r>
               <w:rPr>
                 <w:rFonts w:hint="eastAsia"/>
                 <w:u w:val="single"/>
                 <w:lang w:val="en-US"/>
               </w:rPr>
-              <w:t xml:space="preserve"> </w:t>
-            </w:r>
-            <w:r>
+              <w:t xml:space="preserve"> name:</w:t>
+            </w:r>
+            <w:r>
+              <w:rPr>
+                <w:lang w:val="en-US"/>
+              </w:rPr>
+              <w:br/>
+            </w:r>
+            <w:r>
+              <w:rPr>
+                <w:rFonts w:hint="eastAsia"/>
+                <w:lang w:val="en-US"/>
+              </w:rPr>
+              <w:t xml:space="preserve">{{ </w:t>
+            </w:r>
+            <w:r>
+              <w:t>template_dict</w:t>
+            </w:r>
+            <w:r>
+              <w:rPr>
+                <w:rFonts w:hint="eastAsia"/>
+              </w:rPr>
+              <w:t>.</w:t>
+            </w:r>
+            <w:r>
+              <w:rPr>
+                <w:lang w:val="en-US"/>
+              </w:rPr>
+              <w:t>ds_tree_info</w:t>
+            </w:r>
+            <w:r>
+              <w:rPr>
+                <w:lang w:val="en-US"/>
+              </w:rPr>
+              <w:t>.</w:t>
+            </w:r>
+            <w:r>
+              <w:rPr>
+                <w:lang w:val="en-US"/>
+              </w:rPr>
+              <w:t>parentDataverseName</w:t>
+            </w:r>
+            <w:r>
+              <w:rPr>
+                <w:rFonts w:hint="eastAsia"/>
+              </w:rPr>
+              <w:t xml:space="preserve"> }}</w:t>
+            </w:r>
+          </w:p>
+          <w:p>
+            <w:pPr>
               <w:rPr>
                 <w:u w:val="single"/>
                 <w:lang w:val="en-US"/>
               </w:rPr>
-              <w:t>collection</w:t>
-            </w:r>
-            <w:r>
-              <w:rPr>
-                <w:rFonts w:hint="eastAsia"/>
-                <w:u w:val="single"/>
-                <w:lang w:val="en-US"/>
-              </w:rPr>
-              <w:t xml:space="preserve"> name:</w:t>
-            </w:r>
-            <w:r>
-              <w:rPr>
-                <w:lang w:val="en-US"/>
-              </w:rPr>
-              <w:br/>
-            </w:r>
-            <w:r>
-              <w:rPr>
-                <w:rFonts w:hint="eastAsia"/>
-                <w:lang w:val="en-US"/>
-              </w:rPr>
-              <w:t xml:space="preserve">{{ </w:t>
-            </w:r>
-            <w:proofErr w:type="spellStart"/>
-            <w:r>
-              <w:t>template_dict</w:t>
-            </w:r>
-            <w:proofErr w:type="spellEnd"/>
-            <w:r>
-              <w:rPr>
-                <w:rFonts w:hint="eastAsia"/>
-              </w:rPr>
-              <w:t>.</w:t>
-            </w:r>
-            <w:proofErr w:type="spellStart"/>
-            <w:r>
-              <w:rPr>
-                <w:lang w:val="en-US"/>
-              </w:rPr>
-              <w:t>ds_tree_info</w:t>
-            </w:r>
-            <w:r>
-              <w:rPr>
-                <w:lang w:val="en-US"/>
-              </w:rPr>
-              <w:t>.</w:t>
-            </w:r>
-            <w:r>
-              <w:rPr>
-                <w:lang w:val="en-US"/>
-              </w:rPr>
-              <w:t>parentDataverseName</w:t>
-            </w:r>
-            <w:proofErr w:type="spellEnd"/>
-            <w:r>
-              <w:rPr>
-                <w:rFonts w:hint="eastAsia"/>
-              </w:rPr>
-              <w:t xml:space="preserve"> }}</w:t>
-            </w:r>
-          </w:p>
-          <w:p>
-            <w:pPr>
-              <w:rPr>
-                <w:u w:val="single"/>
-                <w:lang w:val="en-US"/>
-              </w:rPr>
             </w:pPr>
           </w:p>
         </w:tc>
@@ -1491,11 +1429,6 @@
             <w:hideMark/>
           </w:tcPr>
           <w:p>
-            <w:pPr>
-              <w:rPr>
-                <w:rFonts w:hint="eastAsia"/>
-              </w:rPr>
-            </w:pPr>
             <w:r>
               <w:rPr>
                 <w:b/>
@@ -1749,73 +1682,40 @@
               </w:rPr>
               <w:t xml:space="preserve">all </w:t>
             </w:r>
-            <w:proofErr w:type="spellStart"/>
             <w:r>
               <w:rPr>
                 <w:u w:val="single"/>
                 <w:lang w:val="en-US"/>
               </w:rPr>
-              <w:t>dataverse</w:t>
-            </w:r>
-            <w:proofErr w:type="spellEnd"/>
+              <w:t xml:space="preserve">dataverse that </w:t>
+            </w:r>
             <w:r>
               <w:rPr>
                 <w:u w:val="single"/>
                 <w:lang w:val="en-US"/>
               </w:rPr>
-              <w:t xml:space="preserve"> that </w:t>
+              <w:t>contain</w:t>
             </w:r>
             <w:r>
               <w:rPr>
                 <w:u w:val="single"/>
                 <w:lang w:val="en-US"/>
               </w:rPr>
-              <w:t>contain</w:t>
-            </w:r>
-            <w:r>
-              <w:rPr>
-                <w:u w:val="single"/>
+              <w:t xml:space="preserve"> the depositors' dataset:</w:t>
+            </w:r>
+            <w:r>
+              <w:rPr>
                 <w:lang w:val="en-US"/>
               </w:rPr>
-              <w:t xml:space="preserve"> the depositors' dataset:</w:t>
-            </w:r>
-            <w:r>
-              <w:rPr>
-                <w:lang w:val="en-US"/>
-              </w:rPr>
               <w:br/>
             </w:r>
             <w:r>
-              <w:t xml:space="preserve">{% for item in </w:t>
-            </w:r>
-            <w:proofErr w:type="spellStart"/>
-            <w:r>
-              <w:t>template_dict.dv_record.comments</w:t>
-            </w:r>
-            <w:proofErr w:type="spellEnd"/>
-            <w:r>
-              <w:t xml:space="preserve"> %} </w:t>
-            </w:r>
-          </w:p>
-          <w:p>
-            <w:r>
-              <w:t xml:space="preserve">{% for author, </w:t>
-            </w:r>
-            <w:proofErr w:type="spellStart"/>
-            <w:r>
-              <w:t>dataverses</w:t>
-            </w:r>
-            <w:proofErr w:type="spellEnd"/>
-            <w:r>
-              <w:t xml:space="preserve"> in </w:t>
-            </w:r>
-            <w:proofErr w:type="spellStart"/>
-            <w:r>
-              <w:t>item.items</w:t>
-            </w:r>
-            <w:proofErr w:type="spellEnd"/>
-            <w:r>
-              <w:t>() %} {{ author }}</w:t>
+              <w:t xml:space="preserve">{% for item in template_dict.dv_record.comments %} </w:t>
+            </w:r>
+          </w:p>
+          <w:p>
+            <w:r>
+              <w:t>{% for author, dataverses in item.items() %} {{ author }}</w:t>
             </w:r>
             <w:r>
               <w:rPr>
@@ -1826,26 +1726,10 @@
           </w:p>
           <w:p>
             <w:r>
-              <w:t xml:space="preserve">{% for dataverse in </w:t>
-            </w:r>
-            <w:proofErr w:type="spellStart"/>
-            <w:r>
-              <w:t>dataverses</w:t>
-            </w:r>
-            <w:proofErr w:type="spellEnd"/>
-            <w:r>
-              <w:t xml:space="preserve"> %} </w:t>
-            </w:r>
-            <w:r>
-              <w:t xml:space="preserve">{{ </w:t>
-            </w:r>
-            <w:proofErr w:type="spellStart"/>
-            <w:r>
-              <w:t>loop.index</w:t>
-            </w:r>
-            <w:proofErr w:type="spellEnd"/>
-            <w:r>
-              <w:t xml:space="preserve"> }}.</w:t>
+              <w:t xml:space="preserve">{% for dataverse in dataverses %} </w:t>
+            </w:r>
+            <w:r>
+              <w:t>{{ loop.index }}.</w:t>
             </w:r>
             <w:r>
               <w:rPr>
@@ -1861,37 +1745,13 @@
             </w:r>
             <w:r>
               <w:lastRenderedPageBreak/>
-              <w:t xml:space="preserve">{% </w:t>
-            </w:r>
-            <w:proofErr w:type="spellStart"/>
-            <w:r>
-              <w:t>endfor</w:t>
-            </w:r>
-            <w:proofErr w:type="spellEnd"/>
-            <w:r>
-              <w:t xml:space="preserve"> %} </w:t>
+              <w:t xml:space="preserve">{% endfor %} </w:t>
             </w:r>
             <w:r>
               <w:br/>
             </w:r>
             <w:r>
-              <w:t xml:space="preserve">{% </w:t>
-            </w:r>
-            <w:proofErr w:type="spellStart"/>
-            <w:r>
-              <w:t>endfor</w:t>
-            </w:r>
-            <w:proofErr w:type="spellEnd"/>
-            <w:r>
-              <w:t xml:space="preserve"> %} {% </w:t>
-            </w:r>
-            <w:proofErr w:type="spellStart"/>
-            <w:r>
-              <w:t>endfor</w:t>
-            </w:r>
-            <w:proofErr w:type="spellEnd"/>
-            <w:r>
-              <w:t xml:space="preserve"> %}</w:t>
+              <w:t>{% endfor %} {% endfor %}</w:t>
             </w:r>
           </w:p>
         </w:tc>
@@ -2636,61 +2496,33 @@
               <w:rPr>
                 <w:lang w:val="en-US"/>
               </w:rPr>
-              <w:t xml:space="preserve">{% if </w:t>
-            </w:r>
-            <w:proofErr w:type="spellStart"/>
+              <w:t>{% if template_dict.file_ext.comments|length == 0 %}X{% endif %}</w:t>
+            </w:r>
+          </w:p>
+        </w:tc>
+        <w:tc>
+          <w:tcPr>
+            <w:tcW w:w="0" w:type="auto"/>
+            <w:tcBorders>
+              <w:top w:val="single" w:sz="8" w:space="0" w:color="000000"/>
+              <w:left w:val="single" w:sz="8" w:space="0" w:color="000000"/>
+              <w:bottom w:val="single" w:sz="8" w:space="0" w:color="000000"/>
+              <w:right w:val="single" w:sz="8" w:space="0" w:color="000000"/>
+            </w:tcBorders>
+            <w:tcMar>
+              <w:top w:w="100" w:type="dxa"/>
+              <w:left w:w="100" w:type="dxa"/>
+              <w:bottom w:w="100" w:type="dxa"/>
+              <w:right w:w="100" w:type="dxa"/>
+            </w:tcMar>
+            <w:hideMark/>
+          </w:tcPr>
+          <w:p>
             <w:r>
               <w:rPr>
                 <w:lang w:val="en-US"/>
               </w:rPr>
-              <w:t>template_dict.file_ext.comments|length</w:t>
-            </w:r>
-            <w:proofErr w:type="spellEnd"/>
-            <w:r>
-              <w:rPr>
-                <w:lang w:val="en-US"/>
-              </w:rPr>
-              <w:t xml:space="preserve"> == 0 %}X{% endif %}</w:t>
-            </w:r>
-          </w:p>
-        </w:tc>
-        <w:tc>
-          <w:tcPr>
-            <w:tcW w:w="0" w:type="auto"/>
-            <w:tcBorders>
-              <w:top w:val="single" w:sz="8" w:space="0" w:color="000000"/>
-              <w:left w:val="single" w:sz="8" w:space="0" w:color="000000"/>
-              <w:bottom w:val="single" w:sz="8" w:space="0" w:color="000000"/>
-              <w:right w:val="single" w:sz="8" w:space="0" w:color="000000"/>
-            </w:tcBorders>
-            <w:tcMar>
-              <w:top w:w="100" w:type="dxa"/>
-              <w:left w:w="100" w:type="dxa"/>
-              <w:bottom w:w="100" w:type="dxa"/>
-              <w:right w:w="100" w:type="dxa"/>
-            </w:tcMar>
-            <w:hideMark/>
-          </w:tcPr>
-          <w:p>
-            <w:r>
-              <w:rPr>
-                <w:lang w:val="en-US"/>
-              </w:rPr>
-              <w:t xml:space="preserve">{% if </w:t>
-            </w:r>
-            <w:proofErr w:type="spellStart"/>
-            <w:r>
-              <w:rPr>
-                <w:lang w:val="en-US"/>
-              </w:rPr>
-              <w:t>template_dict.file_ext.comments|length</w:t>
-            </w:r>
-            <w:proofErr w:type="spellEnd"/>
-            <w:r>
-              <w:rPr>
-                <w:lang w:val="en-US"/>
-              </w:rPr>
-              <w:t xml:space="preserve"> &gt; 0 %}X{% endif %}</w:t>
+              <w:t>{% if template_dict.file_ext.comments|length &gt; 0 %}X{% endif %}</w:t>
             </w:r>
           </w:p>
         </w:tc>
@@ -2789,14 +2621,12 @@
             <w:r>
               <w:t xml:space="preserve">{% if </w:t>
             </w:r>
-            <w:proofErr w:type="spellStart"/>
             <w:r>
               <w:rPr>
                 <w:lang w:val="en-US"/>
               </w:rPr>
               <w:t>template_dict.file_open.comments</w:t>
             </w:r>
-            <w:proofErr w:type="spellEnd"/>
             <w:r>
               <w:t xml:space="preserve"> |length &gt; 0</w:t>
             </w:r>
@@ -2807,21 +2637,7 @@
               <w:rPr>
                 <w:lang w:val="en-US"/>
               </w:rPr>
-              <w:t xml:space="preserve">{% for item in </w:t>
-            </w:r>
-            <w:proofErr w:type="spellStart"/>
-            <w:r>
-              <w:rPr>
-                <w:lang w:val="en-US"/>
-              </w:rPr>
-              <w:t>template_dict.file_open.comments</w:t>
-            </w:r>
-            <w:proofErr w:type="spellEnd"/>
-            <w:r>
-              <w:rPr>
-                <w:lang w:val="en-US"/>
-              </w:rPr>
-              <w:t xml:space="preserve"> %}</w:t>
+              <w:t>{% for item in template_dict.file_open.comments %}</w:t>
             </w:r>
           </w:p>
           <w:p>
@@ -2839,35 +2655,7 @@
               <w:rPr>
                 <w:lang w:val="en-US"/>
               </w:rPr>
-              <w:t xml:space="preserve">{{ </w:t>
-            </w:r>
-            <w:proofErr w:type="spellStart"/>
-            <w:r>
-              <w:rPr>
-                <w:lang w:val="en-US"/>
-              </w:rPr>
-              <w:t>item.file_name</w:t>
-            </w:r>
-            <w:proofErr w:type="spellEnd"/>
-            <w:r>
-              <w:rPr>
-                <w:lang w:val="en-US"/>
-              </w:rPr>
-              <w:t xml:space="preserve"> }}{% </w:t>
-            </w:r>
-            <w:proofErr w:type="spellStart"/>
-            <w:r>
-              <w:rPr>
-                <w:lang w:val="en-US"/>
-              </w:rPr>
-              <w:t>endfor</w:t>
-            </w:r>
-            <w:proofErr w:type="spellEnd"/>
-            <w:r>
-              <w:rPr>
-                <w:lang w:val="en-US"/>
-              </w:rPr>
-              <w:t xml:space="preserve"> %}</w:t>
+              <w:t>{{ item.file_name }}{% endfor %}</w:t>
             </w:r>
           </w:p>
           <w:p>
@@ -2902,14 +2690,12 @@
             <w:r>
               <w:t xml:space="preserve">{% if </w:t>
             </w:r>
-            <w:proofErr w:type="spellStart"/>
             <w:r>
               <w:rPr>
                 <w:lang w:val="en-US"/>
               </w:rPr>
               <w:t>template_dict.file_open.not_checked</w:t>
             </w:r>
-            <w:proofErr w:type="spellEnd"/>
             <w:r>
               <w:t xml:space="preserve"> |length &gt; 0</w:t>
             </w:r>
@@ -2920,21 +2706,7 @@
               <w:rPr>
                 <w:lang w:val="en-US"/>
               </w:rPr>
-              <w:t xml:space="preserve">{% for item in </w:t>
-            </w:r>
-            <w:proofErr w:type="spellStart"/>
-            <w:r>
-              <w:rPr>
-                <w:lang w:val="en-US"/>
-              </w:rPr>
-              <w:t>template_dict.file_open.not_checked</w:t>
-            </w:r>
-            <w:proofErr w:type="spellEnd"/>
-            <w:r>
-              <w:rPr>
-                <w:lang w:val="en-US"/>
-              </w:rPr>
-              <w:t xml:space="preserve"> %}</w:t>
+              <w:t>{% for item in template_dict.file_open.not_checked %}</w:t>
             </w:r>
           </w:p>
           <w:p>
@@ -2952,35 +2724,7 @@
               <w:rPr>
                 <w:lang w:val="en-US"/>
               </w:rPr>
-              <w:t xml:space="preserve">{{ </w:t>
-            </w:r>
-            <w:proofErr w:type="spellStart"/>
-            <w:r>
-              <w:rPr>
-                <w:lang w:val="en-US"/>
-              </w:rPr>
-              <w:t>item.file_name</w:t>
-            </w:r>
-            <w:proofErr w:type="spellEnd"/>
-            <w:r>
-              <w:rPr>
-                <w:lang w:val="en-US"/>
-              </w:rPr>
-              <w:t xml:space="preserve"> }}{% </w:t>
-            </w:r>
-            <w:proofErr w:type="spellStart"/>
-            <w:r>
-              <w:rPr>
-                <w:lang w:val="en-US"/>
-              </w:rPr>
-              <w:t>endfor</w:t>
-            </w:r>
-            <w:proofErr w:type="spellEnd"/>
-            <w:r>
-              <w:rPr>
-                <w:lang w:val="en-US"/>
-              </w:rPr>
-              <w:t xml:space="preserve"> %}</w:t>
+              <w:t>{{ item.file_name }}{% endfor %}</w:t>
             </w:r>
           </w:p>
           <w:p>
@@ -3163,82 +2907,54 @@
               <w:rPr>
                 <w:lang w:val="en-US"/>
               </w:rPr>
-              <w:t xml:space="preserve">{% if </w:t>
-            </w:r>
-            <w:proofErr w:type="spellStart"/>
+              <w:t>{% if template_dict.special_characters.comments|length == 0 %}X{% endif %}</w:t>
+            </w:r>
+          </w:p>
+        </w:tc>
+        <w:tc>
+          <w:tcPr>
+            <w:tcW w:w="0" w:type="auto"/>
+            <w:tcBorders>
+              <w:top w:val="single" w:sz="8" w:space="0" w:color="000000"/>
+              <w:left w:val="single" w:sz="8" w:space="0" w:color="000000"/>
+              <w:bottom w:val="single" w:sz="8" w:space="0" w:color="000000"/>
+              <w:right w:val="single" w:sz="8" w:space="0" w:color="000000"/>
+            </w:tcBorders>
+            <w:shd w:val="clear" w:color="auto" w:fill="EFEFEF"/>
+            <w:tcMar>
+              <w:top w:w="100" w:type="dxa"/>
+              <w:left w:w="100" w:type="dxa"/>
+              <w:bottom w:w="100" w:type="dxa"/>
+              <w:right w:w="100" w:type="dxa"/>
+            </w:tcMar>
+            <w:hideMark/>
+          </w:tcPr>
+          <w:p/>
+        </w:tc>
+        <w:tc>
+          <w:tcPr>
+            <w:tcW w:w="0" w:type="auto"/>
+            <w:tcBorders>
+              <w:top w:val="single" w:sz="8" w:space="0" w:color="000000"/>
+              <w:left w:val="single" w:sz="8" w:space="0" w:color="000000"/>
+              <w:bottom w:val="single" w:sz="8" w:space="0" w:color="000000"/>
+              <w:right w:val="single" w:sz="8" w:space="0" w:color="000000"/>
+            </w:tcBorders>
+            <w:shd w:val="clear" w:color="auto" w:fill="EFEFEF"/>
+            <w:tcMar>
+              <w:top w:w="100" w:type="dxa"/>
+              <w:left w:w="100" w:type="dxa"/>
+              <w:bottom w:w="100" w:type="dxa"/>
+              <w:right w:w="100" w:type="dxa"/>
+            </w:tcMar>
+            <w:hideMark/>
+          </w:tcPr>
+          <w:p>
             <w:r>
               <w:rPr>
                 <w:lang w:val="en-US"/>
               </w:rPr>
-              <w:t>template_dict.special_characters.comments|length</w:t>
-            </w:r>
-            <w:proofErr w:type="spellEnd"/>
-            <w:r>
-              <w:rPr>
-                <w:lang w:val="en-US"/>
-              </w:rPr>
-              <w:t xml:space="preserve"> == 0 %}X{% endif %}</w:t>
-            </w:r>
-          </w:p>
-        </w:tc>
-        <w:tc>
-          <w:tcPr>
-            <w:tcW w:w="0" w:type="auto"/>
-            <w:tcBorders>
-              <w:top w:val="single" w:sz="8" w:space="0" w:color="000000"/>
-              <w:left w:val="single" w:sz="8" w:space="0" w:color="000000"/>
-              <w:bottom w:val="single" w:sz="8" w:space="0" w:color="000000"/>
-              <w:right w:val="single" w:sz="8" w:space="0" w:color="000000"/>
-            </w:tcBorders>
-            <w:shd w:val="clear" w:color="auto" w:fill="EFEFEF"/>
-            <w:tcMar>
-              <w:top w:w="100" w:type="dxa"/>
-              <w:left w:w="100" w:type="dxa"/>
-              <w:bottom w:w="100" w:type="dxa"/>
-              <w:right w:w="100" w:type="dxa"/>
-            </w:tcMar>
-            <w:hideMark/>
-          </w:tcPr>
-          <w:p/>
-        </w:tc>
-        <w:tc>
-          <w:tcPr>
-            <w:tcW w:w="0" w:type="auto"/>
-            <w:tcBorders>
-              <w:top w:val="single" w:sz="8" w:space="0" w:color="000000"/>
-              <w:left w:val="single" w:sz="8" w:space="0" w:color="000000"/>
-              <w:bottom w:val="single" w:sz="8" w:space="0" w:color="000000"/>
-              <w:right w:val="single" w:sz="8" w:space="0" w:color="000000"/>
-            </w:tcBorders>
-            <w:shd w:val="clear" w:color="auto" w:fill="EFEFEF"/>
-            <w:tcMar>
-              <w:top w:w="100" w:type="dxa"/>
-              <w:left w:w="100" w:type="dxa"/>
-              <w:bottom w:w="100" w:type="dxa"/>
-              <w:right w:w="100" w:type="dxa"/>
-            </w:tcMar>
-            <w:hideMark/>
-          </w:tcPr>
-          <w:p>
-            <w:r>
-              <w:rPr>
-                <w:lang w:val="en-US"/>
-              </w:rPr>
-              <w:t xml:space="preserve">{% if </w:t>
-            </w:r>
-            <w:proofErr w:type="spellStart"/>
-            <w:r>
-              <w:rPr>
-                <w:lang w:val="en-US"/>
-              </w:rPr>
-              <w:t>template_dict.special_characters.comments|length</w:t>
-            </w:r>
-            <w:proofErr w:type="spellEnd"/>
-            <w:r>
-              <w:rPr>
-                <w:lang w:val="en-US"/>
-              </w:rPr>
-              <w:t xml:space="preserve"> &gt; 0 %}X{% endif %}</w:t>
+              <w:t>{% if template_dict.special_characters.comments|length &gt; 0 %}X{% endif %}</w:t>
             </w:r>
           </w:p>
         </w:tc>
@@ -3319,11 +3035,7 @@
               <w:br/>
             </w:r>
             <w:r>
-              <w:t xml:space="preserve">{% if </w:t>
-            </w:r>
-            <w:proofErr w:type="spellStart"/>
-            <w:r>
-              <w:t>template_dict.restricted_files.comment</w:t>
+              <w:t>{% if template_dict.restricted_files.comment</w:t>
             </w:r>
             <w:r>
               <w:rPr>
@@ -3332,11 +3044,7 @@
               <w:t>s</w:t>
             </w:r>
             <w:r>
-              <w:t>|length</w:t>
-            </w:r>
-            <w:proofErr w:type="spellEnd"/>
-            <w:r>
-              <w:t xml:space="preserve"> &gt; 0</w:t>
+              <w:t>|length &gt; 0</w:t>
             </w:r>
             <w:r>
               <w:t xml:space="preserve"> %}</w:t>
@@ -3345,21 +3053,7 @@
               <w:rPr>
                 <w:lang w:val="en-US"/>
               </w:rPr>
-              <w:t xml:space="preserve">{% for item in </w:t>
-            </w:r>
-            <w:proofErr w:type="spellStart"/>
-            <w:r>
-              <w:rPr>
-                <w:lang w:val="en-US"/>
-              </w:rPr>
-              <w:t>template_dict.special_characters.comments</w:t>
-            </w:r>
-            <w:proofErr w:type="spellEnd"/>
-            <w:r>
-              <w:rPr>
-                <w:lang w:val="en-US"/>
-              </w:rPr>
-              <w:t xml:space="preserve"> %}</w:t>
+              <w:t>{% for item in template_dict.special_characters.comments %}</w:t>
             </w:r>
           </w:p>
           <w:p>
@@ -3374,35 +3068,7 @@
               <w:rPr>
                 <w:lang w:val="en-US"/>
               </w:rPr>
-              <w:t xml:space="preserve">{{ </w:t>
-            </w:r>
-            <w:proofErr w:type="spellStart"/>
-            <w:r>
-              <w:rPr>
-                <w:lang w:val="en-US"/>
-              </w:rPr>
-              <w:t>item.file_name</w:t>
-            </w:r>
-            <w:proofErr w:type="spellEnd"/>
-            <w:r>
-              <w:rPr>
-                <w:lang w:val="en-US"/>
-              </w:rPr>
-              <w:t xml:space="preserve"> }}{% </w:t>
-            </w:r>
-            <w:proofErr w:type="spellStart"/>
-            <w:r>
-              <w:rPr>
-                <w:lang w:val="en-US"/>
-              </w:rPr>
-              <w:t>endfor</w:t>
-            </w:r>
-            <w:proofErr w:type="spellEnd"/>
-            <w:r>
-              <w:rPr>
-                <w:lang w:val="en-US"/>
-              </w:rPr>
-              <w:t xml:space="preserve"> %}</w:t>
+              <w:t>{{ item.file_name }}{% endfor %}</w:t>
             </w:r>
           </w:p>
           <w:p>
@@ -3576,14 +3242,7 @@
                 <w:lang w:val="en-US"/>
               </w:rPr>
               <w:lastRenderedPageBreak/>
-              <w:t xml:space="preserve">{% if </w:t>
-            </w:r>
-            <w:proofErr w:type="spellStart"/>
-            <w:r>
-              <w:rPr>
-                <w:lang w:val="en-US"/>
-              </w:rPr>
-              <w:t>template_dict.</w:t>
+              <w:t>{% if template_dict.</w:t>
             </w:r>
             <w:r>
               <w:rPr>
@@ -3596,14 +3255,7 @@
               <w:rPr>
                 <w:lang w:val="en-US"/>
               </w:rPr>
-              <w:t>.comments|length</w:t>
-            </w:r>
-            <w:proofErr w:type="spellEnd"/>
-            <w:r>
-              <w:rPr>
-                <w:lang w:val="en-US"/>
-              </w:rPr>
-              <w:t xml:space="preserve"> </w:t>
+              <w:t xml:space="preserve">.comments|length </w:t>
             </w:r>
             <w:r>
               <w:rPr>
@@ -3643,21 +3295,7 @@
               <w:rPr>
                 <w:lang w:val="en-US"/>
               </w:rPr>
-              <w:t xml:space="preserve">{% if </w:t>
-            </w:r>
-            <w:proofErr w:type="spellStart"/>
-            <w:r>
-              <w:rPr>
-                <w:lang w:val="en-US"/>
-              </w:rPr>
-              <w:t>template_dict.file_ext.comments|length</w:t>
-            </w:r>
-            <w:proofErr w:type="spellEnd"/>
-            <w:r>
-              <w:rPr>
-                <w:lang w:val="en-US"/>
-              </w:rPr>
-              <w:t xml:space="preserve"> &gt; 0 %}X{% endif %}</w:t>
+              <w:t>{% if template_dict.file_ext.comments|length &gt; 0 %}X{% endif %}</w:t>
             </w:r>
           </w:p>
         </w:tc>
@@ -3761,14 +3399,12 @@
             <w:r>
               <w:t xml:space="preserve">{% if </w:t>
             </w:r>
-            <w:proofErr w:type="spellStart"/>
             <w:r>
               <w:rPr>
                 <w:lang w:val="en-US"/>
               </w:rPr>
               <w:t>template_dict.file_ext.comments</w:t>
             </w:r>
-            <w:proofErr w:type="spellEnd"/>
             <w:r>
               <w:t xml:space="preserve"> |length &gt; 0</w:t>
             </w:r>
@@ -3779,21 +3415,7 @@
               <w:rPr>
                 <w:lang w:val="en-US"/>
               </w:rPr>
-              <w:t xml:space="preserve">{% for item in </w:t>
-            </w:r>
-            <w:proofErr w:type="spellStart"/>
-            <w:r>
-              <w:rPr>
-                <w:lang w:val="en-US"/>
-              </w:rPr>
-              <w:t>template_dict.file_ext.comments</w:t>
-            </w:r>
-            <w:proofErr w:type="spellEnd"/>
-            <w:r>
-              <w:rPr>
-                <w:lang w:val="en-US"/>
-              </w:rPr>
-              <w:t xml:space="preserve"> %}</w:t>
+              <w:t>{% for item in template_dict.file_ext.comments %}</w:t>
             </w:r>
           </w:p>
           <w:p>
@@ -3810,35 +3432,7 @@
                 <w:lang w:val="en-US"/>
               </w:rPr>
               <w:lastRenderedPageBreak/>
-              <w:t xml:space="preserve">{{ </w:t>
-            </w:r>
-            <w:proofErr w:type="spellStart"/>
-            <w:r>
-              <w:rPr>
-                <w:lang w:val="en-US"/>
-              </w:rPr>
-              <w:t>item.file_name</w:t>
-            </w:r>
-            <w:proofErr w:type="spellEnd"/>
-            <w:r>
-              <w:rPr>
-                <w:lang w:val="en-US"/>
-              </w:rPr>
-              <w:t xml:space="preserve"> }}{% </w:t>
-            </w:r>
-            <w:proofErr w:type="spellStart"/>
-            <w:r>
-              <w:rPr>
-                <w:lang w:val="en-US"/>
-              </w:rPr>
-              <w:t>endfor</w:t>
-            </w:r>
-            <w:proofErr w:type="spellEnd"/>
-            <w:r>
-              <w:rPr>
-                <w:lang w:val="en-US"/>
-              </w:rPr>
-              <w:t xml:space="preserve"> %}</w:t>
+              <w:t>{{ item.file_name }}{% endfor %}</w:t>
             </w:r>
           </w:p>
           <w:p>
@@ -4122,7 +3716,6 @@
             <w:r>
               <w:t xml:space="preserve">{% if </w:t>
             </w:r>
-            <w:proofErr w:type="spellStart"/>
             <w:r>
               <w:rPr>
                 <w:lang w:val="en-US"/>
@@ -4141,7 +3734,6 @@
               </w:rPr>
               <w:t>.comments</w:t>
             </w:r>
-            <w:proofErr w:type="spellEnd"/>
             <w:r>
               <w:t>|length &gt; 0</w:t>
             </w:r>
@@ -4152,33 +3744,19 @@
               <w:rPr>
                 <w:lang w:val="en-US"/>
               </w:rPr>
-              <w:t xml:space="preserve">{% for item in </w:t>
-            </w:r>
-            <w:proofErr w:type="spellStart"/>
+              <w:t>{% for item in template_dict.</w:t>
+            </w:r>
             <w:r>
               <w:rPr>
                 <w:lang w:val="en-US"/>
               </w:rPr>
-              <w:t>template_dict.</w:t>
+              <w:t>common_file_format</w:t>
             </w:r>
             <w:r>
               <w:rPr>
                 <w:lang w:val="en-US"/>
               </w:rPr>
-              <w:t>common_file_format</w:t>
-            </w:r>
-            <w:r>
-              <w:rPr>
-                <w:lang w:val="en-US"/>
-              </w:rPr>
-              <w:t>.comments</w:t>
-            </w:r>
-            <w:proofErr w:type="spellEnd"/>
-            <w:r>
-              <w:rPr>
-                <w:lang w:val="en-US"/>
-              </w:rPr>
-              <w:t xml:space="preserve"> %}</w:t>
+              <w:t>.comments %}</w:t>
             </w:r>
           </w:p>
           <w:p>
@@ -4192,21 +3770,7 @@
               <w:rPr>
                 <w:lang w:val="en-US"/>
               </w:rPr>
-              <w:t xml:space="preserve">{{ </w:t>
-            </w:r>
-            <w:proofErr w:type="spellStart"/>
-            <w:r>
-              <w:rPr>
-                <w:lang w:val="en-US"/>
-              </w:rPr>
-              <w:t>item.file_name</w:t>
-            </w:r>
-            <w:proofErr w:type="spellEnd"/>
-            <w:r>
-              <w:rPr>
-                <w:lang w:val="en-US"/>
-              </w:rPr>
-              <w:t xml:space="preserve"> }}</w:t>
+              <w:t>{{ item.file_name }}</w:t>
             </w:r>
             <w:r>
               <w:rPr>
@@ -4215,19 +3779,11 @@
               </w:rPr>
               <w:t xml:space="preserve">{% </w:t>
             </w:r>
-            <w:proofErr w:type="spellStart"/>
             <w:r>
               <w:rPr>
                 <w:lang w:val="en-US"/>
               </w:rPr>
-              <w:t>endfor</w:t>
-            </w:r>
-            <w:proofErr w:type="spellEnd"/>
-            <w:r>
-              <w:rPr>
-                <w:lang w:val="en-US"/>
-              </w:rPr>
-              <w:t xml:space="preserve"> %}</w:t>
+              <w:t>endfor %}</w:t>
             </w:r>
           </w:p>
           <w:p>
@@ -4940,6 +4496,54 @@
               <w:t>Python scripted.</w:t>
             </w:r>
           </w:p>
+          <w:p>
+            <w:pPr>
+              <w:numPr>
+                <w:ilvl w:val="0"/>
+                <w:numId w:val="52"/>
+              </w:numPr>
+              <w:rPr>
+                <w:lang w:val="en-US"/>
+              </w:rPr>
+            </w:pPr>
+            <w:r>
+              <w:rPr>
+                <w:lang w:val="en-US"/>
+              </w:rPr>
+              <w:t>Read the `ds_tree.txt` file in the log_files folder to identify whether there is a README file</w:t>
+            </w:r>
+            <w:r>
+              <w:rPr>
+                <w:lang w:val="en-US"/>
+              </w:rPr>
+              <w:t>,</w:t>
+            </w:r>
+            <w:r>
+              <w:rPr>
+                <w:lang w:val="en-US"/>
+              </w:rPr>
+              <w:t xml:space="preserve"> but </w:t>
+            </w:r>
+            <w:r>
+              <w:rPr>
+                <w:lang w:val="en-US"/>
+              </w:rPr>
+              <w:t xml:space="preserve">it </w:t>
+            </w:r>
+            <w:r>
+              <w:rPr>
+                <w:lang w:val="en-US"/>
+              </w:rPr>
+              <w:t>is not named with ‘README’</w:t>
+            </w:r>
+          </w:p>
+          <w:p>
+            <w:pPr>
+              <w:rPr>
+                <w:lang w:val="en-US"/>
+              </w:rPr>
+            </w:pPr>
+          </w:p>
         </w:tc>
         <w:tc>
           <w:tcPr>
@@ -4964,67 +4568,39 @@
               <w:rPr>
                 <w:lang w:val="en-US"/>
               </w:rPr>
-              <w:t xml:space="preserve">{% if </w:t>
-            </w:r>
-            <w:proofErr w:type="spellStart"/>
-            <w:r>
+              <w:t>{% if template_dict.readme_file.comments|length &gt; 0 %}X{% endif %}</w:t>
+            </w:r>
+          </w:p>
+        </w:tc>
+        <w:tc>
+          <w:tcPr>
+            <w:tcW w:w="0" w:type="auto"/>
+            <w:tcBorders>
+              <w:top w:val="single" w:sz="8" w:space="0" w:color="000000"/>
+              <w:left w:val="single" w:sz="8" w:space="0" w:color="000000"/>
+              <w:bottom w:val="single" w:sz="8" w:space="0" w:color="000000"/>
+              <w:right w:val="single" w:sz="8" w:space="0" w:color="000000"/>
+            </w:tcBorders>
+            <w:shd w:val="clear" w:color="auto" w:fill="EFEFEF"/>
+            <w:tcMar>
+              <w:top w:w="100" w:type="dxa"/>
+              <w:left w:w="100" w:type="dxa"/>
+              <w:bottom w:w="100" w:type="dxa"/>
+              <w:right w:w="100" w:type="dxa"/>
+            </w:tcMar>
+            <w:hideMark/>
+          </w:tcPr>
+          <w:p>
+            <w:pPr>
               <w:rPr>
                 <w:lang w:val="en-US"/>
               </w:rPr>
-              <w:t>template_dict.readme_file.comments|length</w:t>
-            </w:r>
-            <w:proofErr w:type="spellEnd"/>
+            </w:pPr>
             <w:r>
               <w:rPr>
                 <w:lang w:val="en-US"/>
               </w:rPr>
-              <w:t xml:space="preserve"> &gt; 0 %}X{% endif %}</w:t>
-            </w:r>
-          </w:p>
-        </w:tc>
-        <w:tc>
-          <w:tcPr>
-            <w:tcW w:w="0" w:type="auto"/>
-            <w:tcBorders>
-              <w:top w:val="single" w:sz="8" w:space="0" w:color="000000"/>
-              <w:left w:val="single" w:sz="8" w:space="0" w:color="000000"/>
-              <w:bottom w:val="single" w:sz="8" w:space="0" w:color="000000"/>
-              <w:right w:val="single" w:sz="8" w:space="0" w:color="000000"/>
-            </w:tcBorders>
-            <w:shd w:val="clear" w:color="auto" w:fill="EFEFEF"/>
-            <w:tcMar>
-              <w:top w:w="100" w:type="dxa"/>
-              <w:left w:w="100" w:type="dxa"/>
-              <w:bottom w:w="100" w:type="dxa"/>
-              <w:right w:w="100" w:type="dxa"/>
-            </w:tcMar>
-            <w:hideMark/>
-          </w:tcPr>
-          <w:p>
-            <w:pPr>
-              <w:rPr>
-                <w:lang w:val="en-US"/>
-              </w:rPr>
-            </w:pPr>
-            <w:r>
-              <w:rPr>
-                <w:lang w:val="en-US"/>
-              </w:rPr>
-              <w:t xml:space="preserve">{% if </w:t>
-            </w:r>
-            <w:proofErr w:type="spellStart"/>
-            <w:r>
-              <w:rPr>
-                <w:lang w:val="en-US"/>
-              </w:rPr>
-              <w:t>template_dict.readme_file.comments|length</w:t>
-            </w:r>
-            <w:proofErr w:type="spellEnd"/>
-            <w:r>
-              <w:rPr>
-                <w:lang w:val="en-US"/>
-              </w:rPr>
-              <w:t xml:space="preserve"> == 0 %}X{% endif %}</w:t>
+              <w:t>{% if template_dict.readme_file.comments|length == 0 %}X{% endif %}</w:t>
             </w:r>
           </w:p>
           <w:p/>
@@ -5129,14 +4705,12 @@
             <w:r>
               <w:t xml:space="preserve">{% if </w:t>
             </w:r>
-            <w:proofErr w:type="spellStart"/>
             <w:r>
               <w:rPr>
                 <w:lang w:val="en-US"/>
               </w:rPr>
               <w:t>template_dict.readme_file.comments</w:t>
             </w:r>
-            <w:proofErr w:type="spellEnd"/>
             <w:r>
               <w:t xml:space="preserve"> |length &gt; 0</w:t>
             </w:r>
@@ -5147,73 +4721,23 @@
               <w:rPr>
                 <w:lang w:val="en-US"/>
               </w:rPr>
-              <w:t xml:space="preserve">{% for item in </w:t>
-            </w:r>
-            <w:proofErr w:type="spellStart"/>
-            <w:r>
+              <w:t>{% for item in template_dict.readme_file.comments %}{{ loop.index }}. {{ item.file_name }}{% endfor %}</w:t>
+            </w:r>
+          </w:p>
+          <w:p>
+            <w:pPr>
               <w:rPr>
                 <w:lang w:val="en-US"/>
               </w:rPr>
-              <w:t>template_dict.readme_file.comments</w:t>
-            </w:r>
-            <w:proofErr w:type="spellEnd"/>
-            <w:r>
-              <w:rPr>
-                <w:lang w:val="en-US"/>
-              </w:rPr>
-              <w:t xml:space="preserve"> %}{{ </w:t>
-            </w:r>
-            <w:proofErr w:type="spellStart"/>
-            <w:r>
-              <w:rPr>
-                <w:lang w:val="en-US"/>
-              </w:rPr>
-              <w:t>loop.index</w:t>
-            </w:r>
-            <w:proofErr w:type="spellEnd"/>
-            <w:r>
-              <w:rPr>
-                <w:lang w:val="en-US"/>
-              </w:rPr>
-              <w:t xml:space="preserve"> }}. {{ </w:t>
-            </w:r>
-            <w:proofErr w:type="spellStart"/>
-            <w:r>
-              <w:rPr>
-                <w:lang w:val="en-US"/>
-              </w:rPr>
-              <w:t>item.file_name</w:t>
-            </w:r>
-            <w:proofErr w:type="spellEnd"/>
-            <w:r>
-              <w:rPr>
-                <w:lang w:val="en-US"/>
-              </w:rPr>
-              <w:t xml:space="preserve"> }}{% </w:t>
-            </w:r>
-            <w:proofErr w:type="spellStart"/>
-            <w:r>
-              <w:rPr>
-                <w:lang w:val="en-US"/>
-              </w:rPr>
-              <w:t>endfor</w:t>
-            </w:r>
-            <w:proofErr w:type="spellEnd"/>
-            <w:r>
-              <w:rPr>
-                <w:lang w:val="en-US"/>
-              </w:rPr>
-              <w:t xml:space="preserve"> %}</w:t>
-            </w:r>
-          </w:p>
-          <w:p>
-            <w:pPr>
-              <w:rPr>
-                <w:lang w:val="en-US"/>
-              </w:rPr>
             </w:pPr>
             <w:r>
-              <w:t>{% else %}(NONE){% endif %}</w:t>
+              <w:t>{% else %}(</w:t>
+            </w:r>
+            <w:r>
+              <w:t>NO README FILE FOUND</w:t>
+            </w:r>
+            <w:r>
+              <w:t>){% endif %}</w:t>
             </w:r>
           </w:p>
           <w:p/>
@@ -6513,7 +6037,15 @@
                 <w:b/>
                 <w:bCs/>
               </w:rPr>
-              <w:t>Does the README file contain correct and complete information about ‘Files and organization’ </w:t>
+              <w:t xml:space="preserve">Does the README file contain correct and complete </w:t>
+            </w:r>
+            <w:r>
+              <w:rPr>
+                <w:b/>
+                <w:bCs/>
+              </w:rPr>
+              <w:lastRenderedPageBreak/>
+              <w:t>information about ‘Files and organization’ </w:t>
             </w:r>
           </w:p>
         </w:tc>
@@ -6542,7 +6074,12 @@
               </w:numPr>
             </w:pPr>
             <w:r>
-              <w:t>Check whether the files listed in the README match the files listed in the deposit.</w:t>
+              <w:lastRenderedPageBreak/>
+              <w:t xml:space="preserve">Check whether the files listed in the </w:t>
+            </w:r>
+            <w:r>
+              <w:lastRenderedPageBreak/>
+              <w:t>README match the files listed in the deposit.</w:t>
             </w:r>
           </w:p>
           <w:p>
@@ -6553,11 +6090,7 @@
               </w:numPr>
             </w:pPr>
             <w:r>
-              <w:t xml:space="preserve">If the files are </w:t>
-            </w:r>
-            <w:r>
-              <w:lastRenderedPageBreak/>
-              <w:t>not listed in the README, we can generate a file tree structure &amp; pass it to the depositors to include in their README, if applicable.</w:t>
+              <w:t>If the files are not listed in the README, we can generate a file tree structure &amp; pass it to the depositors to include in their README, if applicable.</w:t>
             </w:r>
           </w:p>
         </w:tc>
@@ -7325,6 +6858,7 @@
                 <w:b/>
                 <w:bCs/>
               </w:rPr>
+              <w:lastRenderedPageBreak/>
               <w:t>4.1</w:t>
             </w:r>
           </w:p>
@@ -7417,7 +6951,6 @@
               </w:numPr>
             </w:pPr>
             <w:r>
-              <w:lastRenderedPageBreak/>
               <w:t>Alternative Title</w:t>
             </w:r>
           </w:p>
@@ -7606,14 +7139,12 @@
             <w:r>
               <w:t xml:space="preserve">{% if </w:t>
             </w:r>
-            <w:proofErr w:type="spellStart"/>
             <w:r>
               <w:rPr>
                 <w:lang w:val="en-US"/>
               </w:rPr>
               <w:t>template_dict.typo.comments</w:t>
             </w:r>
-            <w:proofErr w:type="spellEnd"/>
             <w:r>
               <w:t xml:space="preserve"> |length &gt; 0</w:t>
             </w:r>
@@ -7624,21 +7155,7 @@
               <w:rPr>
                 <w:lang w:val="en-US"/>
               </w:rPr>
-              <w:t xml:space="preserve">{% for item in </w:t>
-            </w:r>
-            <w:proofErr w:type="spellStart"/>
-            <w:r>
-              <w:rPr>
-                <w:lang w:val="en-US"/>
-              </w:rPr>
-              <w:t>template_dict.typo.comments</w:t>
-            </w:r>
-            <w:proofErr w:type="spellEnd"/>
-            <w:r>
-              <w:rPr>
-                <w:lang w:val="en-US"/>
-              </w:rPr>
-              <w:t xml:space="preserve"> %}</w:t>
+              <w:t>{% for item in template_dict.typo.comments %}</w:t>
             </w:r>
           </w:p>
           <w:p>
@@ -7653,21 +7170,7 @@
               <w:rPr>
                 <w:lang w:val="en-US"/>
               </w:rPr>
-              <w:t xml:space="preserve">{{ item }}{% </w:t>
-            </w:r>
-            <w:proofErr w:type="spellStart"/>
-            <w:r>
-              <w:rPr>
-                <w:lang w:val="en-US"/>
-              </w:rPr>
-              <w:t>endfor</w:t>
-            </w:r>
-            <w:proofErr w:type="spellEnd"/>
-            <w:r>
-              <w:rPr>
-                <w:lang w:val="en-US"/>
-              </w:rPr>
-              <w:t xml:space="preserve"> %}</w:t>
+              <w:t>{{ item }}{% endfor %}</w:t>
             </w:r>
           </w:p>
           <w:p>
@@ -8120,7 +7623,15 @@
                 <w:b/>
                 <w:bCs/>
               </w:rPr>
-              <w:t>Does at least one author have an institutional affiliation listed?</w:t>
+              <w:t xml:space="preserve">Does at least one author have an </w:t>
+            </w:r>
+            <w:r>
+              <w:rPr>
+                <w:b/>
+                <w:bCs/>
+              </w:rPr>
+              <w:lastRenderedPageBreak/>
+              <w:t>institutional affiliation listed?</w:t>
             </w:r>
           </w:p>
         </w:tc>
@@ -8144,6 +7655,7 @@
           </w:tcPr>
           <w:p>
             <w:r>
+              <w:lastRenderedPageBreak/>
               <w:t>Python scripted.</w:t>
             </w:r>
           </w:p>
@@ -8167,15 +7679,7 @@
           </w:tcPr>
           <w:p>
             <w:r>
-              <w:t xml:space="preserve">{% if not </w:t>
-            </w:r>
-            <w:proofErr w:type="spellStart"/>
-            <w:r>
-              <w:t>template_dict.none_author_affiliation</w:t>
-            </w:r>
-            <w:proofErr w:type="spellEnd"/>
-            <w:r>
-              <w:t xml:space="preserve"> %}X{% endif %}</w:t>
+              <w:t>{% if not template_dict.none_author_affiliation %}X{% endif %}</w:t>
             </w:r>
           </w:p>
         </w:tc>
@@ -8198,15 +7702,7 @@
           </w:tcPr>
           <w:p>
             <w:r>
-              <w:t xml:space="preserve">{% if </w:t>
-            </w:r>
-            <w:proofErr w:type="spellStart"/>
-            <w:r>
-              <w:t>template_dict.none_author_affiliation</w:t>
-            </w:r>
-            <w:proofErr w:type="spellEnd"/>
-            <w:r>
-              <w:t xml:space="preserve"> %}X{% endif %}</w:t>
+              <w:t>{% if template_dict.none_author_affiliation %}X{% endif %}</w:t>
             </w:r>
           </w:p>
         </w:tc>
@@ -8288,7 +7784,14 @@
             </w:tcMar>
             <w:hideMark/>
           </w:tcPr>
-          <w:p/>
+          <w:p>
+            <w:r>
+              <w:rPr>
+                <w:u w:val="single"/>
+              </w:rPr>
+              <w:t>Curator’s comments:</w:t>
+            </w:r>
+          </w:p>
         </w:tc>
         <w:tc>
           <w:tcPr>
@@ -8429,7 +7932,6 @@
                 <w:b/>
                 <w:bCs/>
               </w:rPr>
-              <w:lastRenderedPageBreak/>
               <w:t>University of Toronto?</w:t>
             </w:r>
           </w:p>
@@ -8453,7 +7955,6 @@
           </w:tcPr>
           <w:p>
             <w:r>
-              <w:lastRenderedPageBreak/>
               <w:t>Python scripted.</w:t>
             </w:r>
           </w:p>
@@ -8468,28 +7969,11 @@
               </w:rPr>
             </w:pPr>
             <w:r>
-              <w:t>This will check either ‘</w:t>
-            </w:r>
-            <w:proofErr w:type="spellStart"/>
-            <w:r>
-              <w:t>uoft</w:t>
-            </w:r>
-            <w:proofErr w:type="spellEnd"/>
-            <w:r>
-              <w:t xml:space="preserve">’, ‘u </w:t>
-            </w:r>
-            <w:r>
-              <w:lastRenderedPageBreak/>
-              <w:t>of t’ or ‘</w:t>
-            </w:r>
-            <w:r>
-              <w:t xml:space="preserve">university of </w:t>
-            </w:r>
-            <w:proofErr w:type="spellStart"/>
-            <w:r>
-              <w:t>toronto</w:t>
-            </w:r>
-            <w:proofErr w:type="spellEnd"/>
+              <w:t>This will check either ‘uoft’, ‘u of t’ or ‘</w:t>
+            </w:r>
+            <w:r>
+              <w:t>university of toronto</w:t>
+            </w:r>
             <w:r>
               <w:t xml:space="preserve">’ is filled for the </w:t>
             </w:r>
@@ -8537,25 +8021,14 @@
               </w:rPr>
             </w:pPr>
             <w:r>
-              <w:lastRenderedPageBreak/>
-              <w:t xml:space="preserve">{% if not </w:t>
-            </w:r>
-            <w:proofErr w:type="spellStart"/>
-            <w:r>
-              <w:t>template_dict</w:t>
-            </w:r>
-            <w:proofErr w:type="spellEnd"/>
-            <w:r>
-              <w:t>.</w:t>
-            </w:r>
-            <w:proofErr w:type="spellStart"/>
+              <w:t>{% if not template_dict.</w:t>
+            </w:r>
             <w:r>
               <w:rPr>
                 <w:lang w:val="en-US"/>
               </w:rPr>
               <w:t>none_author_affiliation_UT</w:t>
             </w:r>
-            <w:proofErr w:type="spellEnd"/>
             <w:r>
               <w:t>%}X{% endif %}</w:t>
             </w:r>
@@ -8585,24 +8058,14 @@
               </w:rPr>
             </w:pPr>
             <w:r>
-              <w:t xml:space="preserve">{% if </w:t>
-            </w:r>
-            <w:proofErr w:type="spellStart"/>
-            <w:r>
-              <w:t>template_dict</w:t>
-            </w:r>
-            <w:proofErr w:type="spellEnd"/>
-            <w:r>
-              <w:t>.</w:t>
-            </w:r>
-            <w:proofErr w:type="spellStart"/>
+              <w:t>{% if template_dict.</w:t>
+            </w:r>
             <w:r>
               <w:rPr>
                 <w:lang w:val="en-US"/>
               </w:rPr>
               <w:t>none_author_affiliation_UT</w:t>
             </w:r>
-            <w:proofErr w:type="spellEnd"/>
             <w:r>
               <w:t xml:space="preserve"> %}X{% endif %}</w:t>
             </w:r>
@@ -8682,7 +8145,14 @@
               <w:right w:w="100" w:type="dxa"/>
             </w:tcMar>
           </w:tcPr>
-          <w:p/>
+          <w:p>
+            <w:r>
+              <w:rPr>
+                <w:u w:val="single"/>
+              </w:rPr>
+              <w:t>Curator’s comments:</w:t>
+            </w:r>
+          </w:p>
         </w:tc>
         <w:tc>
           <w:tcPr>
@@ -8810,7 +8280,11 @@
               </w:numPr>
             </w:pPr>
             <w:r>
-              <w:t>Read the description and README file and check them against metadata fields. For example, if a geographical location or data collection date/range is mentioned in the description, recommend filling in the relevant metadata fields</w:t>
+              <w:t>Read the description and README file and check them against metadata fields. For example, if a geographical location or data collection date/range is mentioned in the descripti</w:t>
+            </w:r>
+            <w:r>
+              <w:lastRenderedPageBreak/>
+              <w:t>on, recommend filling in the relevant metadata fields</w:t>
             </w:r>
           </w:p>
           <w:p>
@@ -9391,6 +8865,7 @@
           <w:p/>
           <w:p>
             <w:r>
+              <w:lastRenderedPageBreak/>
               <w:t>Some elements to look for may include:</w:t>
             </w:r>
           </w:p>
@@ -9424,7 +8899,6 @@
               </w:numPr>
             </w:pPr>
             <w:r>
-              <w:lastRenderedPageBreak/>
               <w:t>Type of data </w:t>
             </w:r>
           </w:p>
@@ -9749,11 +9223,8 @@
               </w:numPr>
             </w:pPr>
             <w:r>
-              <w:t xml:space="preserve">Can also provide information about controlled vocabulary (in that specific field) if </w:t>
-            </w:r>
-            <w:r>
               <w:lastRenderedPageBreak/>
-              <w:t>none is filled out.</w:t>
+              <w:t>Can also provide information about controlled vocabulary (in that specific field) if none is filled out.</w:t>
             </w:r>
           </w:p>
         </w:tc>
@@ -9780,14 +9251,7 @@
                 <w:lang w:val="en-US"/>
               </w:rPr>
               <w:lastRenderedPageBreak/>
-              <w:t xml:space="preserve">{% if </w:t>
-            </w:r>
-            <w:proofErr w:type="spellStart"/>
-            <w:r>
-              <w:rPr>
-                <w:lang w:val="en-US"/>
-              </w:rPr>
-              <w:t>template_dict.</w:t>
+              <w:t>{% if template_dict.</w:t>
             </w:r>
             <w:r>
               <w:rPr>
@@ -9800,71 +9264,57 @@
               <w:rPr>
                 <w:lang w:val="en-US"/>
               </w:rPr>
-              <w:t>|length</w:t>
-            </w:r>
-            <w:proofErr w:type="spellEnd"/>
-            <w:r>
+              <w:t>|length &gt; 0 %}X{% endif %}</w:t>
+            </w:r>
+          </w:p>
+        </w:tc>
+        <w:tc>
+          <w:tcPr>
+            <w:tcW w:w="0" w:type="auto"/>
+            <w:tcBorders>
+              <w:top w:val="single" w:sz="8" w:space="0" w:color="000000"/>
+              <w:left w:val="single" w:sz="8" w:space="0" w:color="000000"/>
+              <w:bottom w:val="single" w:sz="8" w:space="0" w:color="000000"/>
+              <w:right w:val="single" w:sz="8" w:space="0" w:color="000000"/>
+            </w:tcBorders>
+            <w:tcMar>
+              <w:top w:w="100" w:type="dxa"/>
+              <w:left w:w="100" w:type="dxa"/>
+              <w:bottom w:w="100" w:type="dxa"/>
+              <w:right w:w="100" w:type="dxa"/>
+            </w:tcMar>
+            <w:hideMark/>
+          </w:tcPr>
+          <w:p/>
+        </w:tc>
+        <w:tc>
+          <w:tcPr>
+            <w:tcW w:w="0" w:type="auto"/>
+            <w:tcBorders>
+              <w:top w:val="single" w:sz="8" w:space="0" w:color="000000"/>
+              <w:left w:val="single" w:sz="8" w:space="0" w:color="000000"/>
+              <w:bottom w:val="single" w:sz="8" w:space="0" w:color="000000"/>
+              <w:right w:val="single" w:sz="8" w:space="0" w:color="000000"/>
+            </w:tcBorders>
+            <w:tcMar>
+              <w:top w:w="100" w:type="dxa"/>
+              <w:left w:w="100" w:type="dxa"/>
+              <w:bottom w:w="100" w:type="dxa"/>
+              <w:right w:w="100" w:type="dxa"/>
+            </w:tcMar>
+            <w:hideMark/>
+          </w:tcPr>
+          <w:p>
+            <w:pPr>
               <w:rPr>
                 <w:lang w:val="en-US"/>
               </w:rPr>
-              <w:t xml:space="preserve"> &gt; 0 %}X{% endif %}</w:t>
-            </w:r>
-          </w:p>
-        </w:tc>
-        <w:tc>
-          <w:tcPr>
-            <w:tcW w:w="0" w:type="auto"/>
-            <w:tcBorders>
-              <w:top w:val="single" w:sz="8" w:space="0" w:color="000000"/>
-              <w:left w:val="single" w:sz="8" w:space="0" w:color="000000"/>
-              <w:bottom w:val="single" w:sz="8" w:space="0" w:color="000000"/>
-              <w:right w:val="single" w:sz="8" w:space="0" w:color="000000"/>
-            </w:tcBorders>
-            <w:tcMar>
-              <w:top w:w="100" w:type="dxa"/>
-              <w:left w:w="100" w:type="dxa"/>
-              <w:bottom w:w="100" w:type="dxa"/>
-              <w:right w:w="100" w:type="dxa"/>
-            </w:tcMar>
-            <w:hideMark/>
-          </w:tcPr>
-          <w:p/>
-        </w:tc>
-        <w:tc>
-          <w:tcPr>
-            <w:tcW w:w="0" w:type="auto"/>
-            <w:tcBorders>
-              <w:top w:val="single" w:sz="8" w:space="0" w:color="000000"/>
-              <w:left w:val="single" w:sz="8" w:space="0" w:color="000000"/>
-              <w:bottom w:val="single" w:sz="8" w:space="0" w:color="000000"/>
-              <w:right w:val="single" w:sz="8" w:space="0" w:color="000000"/>
-            </w:tcBorders>
-            <w:tcMar>
-              <w:top w:w="100" w:type="dxa"/>
-              <w:left w:w="100" w:type="dxa"/>
-              <w:bottom w:w="100" w:type="dxa"/>
-              <w:right w:w="100" w:type="dxa"/>
-            </w:tcMar>
-            <w:hideMark/>
-          </w:tcPr>
-          <w:p>
-            <w:pPr>
+            </w:pPr>
+            <w:r>
               <w:rPr>
                 <w:lang w:val="en-US"/>
               </w:rPr>
-            </w:pPr>
-            <w:r>
-              <w:rPr>
-                <w:lang w:val="en-US"/>
-              </w:rPr>
-              <w:t xml:space="preserve">{% if </w:t>
-            </w:r>
-            <w:proofErr w:type="spellStart"/>
-            <w:r>
-              <w:rPr>
-                <w:lang w:val="en-US"/>
-              </w:rPr>
-              <w:t>template_dict.</w:t>
+              <w:t>{% if template_dict.</w:t>
             </w:r>
             <w:r>
               <w:rPr>
@@ -9877,14 +9327,7 @@
               <w:rPr>
                 <w:lang w:val="en-US"/>
               </w:rPr>
-              <w:t>|length</w:t>
-            </w:r>
-            <w:proofErr w:type="spellEnd"/>
-            <w:r>
-              <w:rPr>
-                <w:lang w:val="en-US"/>
-              </w:rPr>
-              <w:t xml:space="preserve"> == 0 %}X{% endif %}</w:t>
+              <w:t>|length == 0 %}X{% endif %}</w:t>
             </w:r>
           </w:p>
         </w:tc>
@@ -9957,46 +9400,26 @@
             <w:r>
               <w:t xml:space="preserve">{% if </w:t>
             </w:r>
-            <w:proofErr w:type="spellStart"/>
             <w:r>
               <w:rPr>
                 <w:lang w:val="en-US"/>
               </w:rPr>
-              <w:t>template_dict</w:t>
-            </w:r>
-            <w:proofErr w:type="spellEnd"/>
+              <w:t>template_dict.</w:t>
+            </w:r>
+            <w:r>
+              <w:t>keywords</w:t>
+            </w:r>
+            <w:r>
+              <w:t>|length &gt; 0</w:t>
+            </w:r>
+            <w:r>
+              <w:t xml:space="preserve"> %}</w:t>
+            </w:r>
             <w:r>
               <w:rPr>
                 <w:lang w:val="en-US"/>
               </w:rPr>
-              <w:t>.</w:t>
-            </w:r>
-            <w:proofErr w:type="spellStart"/>
-            <w:r>
-              <w:t>keywords</w:t>
-            </w:r>
-            <w:r>
-              <w:t>|length</w:t>
-            </w:r>
-            <w:proofErr w:type="spellEnd"/>
-            <w:r>
-              <w:t xml:space="preserve"> &gt; 0</w:t>
-            </w:r>
-            <w:r>
-              <w:t xml:space="preserve"> %}</w:t>
-            </w:r>
-            <w:r>
-              <w:rPr>
-                <w:lang w:val="en-US"/>
-              </w:rPr>
-              <w:t xml:space="preserve">{% for item in </w:t>
-            </w:r>
-            <w:proofErr w:type="spellStart"/>
-            <w:r>
-              <w:rPr>
-                <w:lang w:val="en-US"/>
-              </w:rPr>
-              <w:t>template_dict.</w:t>
+              <w:t>{% for item in template_dict.</w:t>
             </w:r>
             <w:r>
               <w:rPr>
@@ -10005,7 +9428,6 @@
               </w:rPr>
               <w:t>keywords</w:t>
             </w:r>
-            <w:proofErr w:type="spellEnd"/>
             <w:r>
               <w:rPr>
                 <w:lang w:val="en-US"/>
@@ -10025,26 +9447,15 @@
               <w:rPr>
                 <w:lang w:val="en-US"/>
               </w:rPr>
-              <w:t xml:space="preserve">{{ item }}{% </w:t>
-            </w:r>
-            <w:proofErr w:type="spellStart"/>
-            <w:r>
-              <w:rPr>
-                <w:lang w:val="en-US"/>
-              </w:rPr>
-              <w:t>endfor</w:t>
-            </w:r>
-            <w:proofErr w:type="spellEnd"/>
-            <w:r>
-              <w:rPr>
-                <w:lang w:val="en-US"/>
-              </w:rPr>
-              <w:t xml:space="preserve"> %}</w:t>
-            </w:r>
-          </w:p>
-          <w:p>
-            <w:r>
-              <w:t>{% else %}(NONE</w:t>
+              <w:t>{{ item }}{% endfor %}</w:t>
+            </w:r>
+          </w:p>
+          <w:p>
+            <w:r>
+              <w:t>{% else %}(</w:t>
+            </w:r>
+            <w:r>
+              <w:t>NO KEYWORDS FOUND</w:t>
             </w:r>
             <w:r>
               <w:rPr>
@@ -10299,7 +9710,14 @@
             </w:tcMar>
             <w:hideMark/>
           </w:tcPr>
-          <w:p/>
+          <w:p>
+            <w:r>
+              <w:rPr>
+                <w:u w:val="single"/>
+              </w:rPr>
+              <w:t>Curator’s comments:</w:t>
+            </w:r>
+          </w:p>
         </w:tc>
         <w:tc>
           <w:tcPr>
@@ -10438,11 +9856,11 @@
               </w:numPr>
             </w:pPr>
             <w:r>
-              <w:t xml:space="preserve">If metadata indicates a related publication or project, suggest adding a corresponding </w:t>
+              <w:t xml:space="preserve">If metadata </w:t>
             </w:r>
             <w:r>
               <w:lastRenderedPageBreak/>
-              <w:t>suffix to the title.</w:t>
+              <w:t>indicates a related publication or project, suggest adding a corresponding suffix to the title.</w:t>
             </w:r>
           </w:p>
         </w:tc>
@@ -11308,7 +10726,11 @@
               </w:numPr>
             </w:pPr>
             <w:r>
-              <w:t>Review documentation and file names and see if there are any that should be opened and reviewed (e.g. if a file is named “participant survey” - maybe open that one)</w:t>
+              <w:t xml:space="preserve">Review documentation and file names and see if there are any that should be opened and reviewed (e.g. if a file is named </w:t>
+            </w:r>
+            <w:r>
+              <w:lastRenderedPageBreak/>
+              <w:t>“participant survey” - maybe open that one)</w:t>
             </w:r>
           </w:p>
           <w:p>
@@ -11319,11 +10741,7 @@
               </w:numPr>
             </w:pPr>
             <w:r>
-              <w:t>Review descripti</w:t>
-            </w:r>
-            <w:r>
-              <w:lastRenderedPageBreak/>
-              <w:t>on, notes, and terms of access metadata fields.</w:t>
+              <w:t>Review description, notes, and terms of access metadata fields.</w:t>
             </w:r>
           </w:p>
           <w:p>
@@ -11362,11 +10780,11 @@
               </w:numPr>
             </w:pPr>
             <w:r>
-              <w:t>Canadian Social Ins</w:t>
+              <w:t>Cana</w:t>
             </w:r>
             <w:r>
               <w:lastRenderedPageBreak/>
-              <w:t>urance Number (SINs)</w:t>
+              <w:t>dian Social Insurance Number (SINs)</w:t>
             </w:r>
           </w:p>
           <w:p>
@@ -11388,7 +10806,11 @@
               </w:numPr>
             </w:pPr>
             <w:r>
-              <w:t>Email addresses</w:t>
+              <w:t>Email addres</w:t>
+            </w:r>
+            <w:r>
+              <w:lastRenderedPageBreak/>
+              <w:t>ses</w:t>
             </w:r>
           </w:p>
           <w:p>
@@ -11399,11 +10821,7 @@
               </w:numPr>
             </w:pPr>
             <w:r>
-              <w:t>Phone n</w:t>
-            </w:r>
-            <w:r>
-              <w:lastRenderedPageBreak/>
-              <w:t>umbers</w:t>
+              <w:t>Phone numbers</w:t>
             </w:r>
           </w:p>
           <w:p>
@@ -11413,13 +10831,8 @@
                 <w:numId w:val="36"/>
               </w:numPr>
             </w:pPr>
-            <w:proofErr w:type="spellStart"/>
-            <w:r>
-              <w:t>vCards</w:t>
-            </w:r>
-            <w:proofErr w:type="spellEnd"/>
-            <w:r>
-              <w:t xml:space="preserve"> (Virtual Contact Files)</w:t>
+            <w:r>
+              <w:t>vCards (Virtual Contact Files)</w:t>
             </w:r>
           </w:p>
         </w:tc>
@@ -11723,7 +11136,11 @@
               </w:numPr>
             </w:pPr>
             <w:r>
-              <w:t>If something is flagged in the sensitive data review (see question above), check the intake form to confirm information about their REB status.</w:t>
+              <w:t xml:space="preserve">If something is flagged in the sensitive data review (see question above), check </w:t>
+            </w:r>
+            <w:r>
+              <w:lastRenderedPageBreak/>
+              <w:t>the intake form to confirm information about their REB status.</w:t>
             </w:r>
           </w:p>
         </w:tc>
@@ -11845,7 +11262,14 @@
             </w:tcMar>
             <w:hideMark/>
           </w:tcPr>
-          <w:p/>
+          <w:p>
+            <w:r>
+              <w:rPr>
+                <w:u w:val="single"/>
+              </w:rPr>
+              <w:t>Curator’s comments:</w:t>
+            </w:r>
+          </w:p>
         </w:tc>
         <w:tc>
           <w:tcPr>
@@ -11920,7 +11344,6 @@
                 <w:b/>
                 <w:bCs/>
               </w:rPr>
-              <w:lastRenderedPageBreak/>
               <w:t>5.3</w:t>
             </w:r>
           </w:p>
@@ -12140,11 +11563,7 @@
               <w:br/>
             </w:r>
             <w:r>
-              <w:t xml:space="preserve">{% if </w:t>
-            </w:r>
-            <w:proofErr w:type="spellStart"/>
-            <w:r>
-              <w:t>template_dict.restricted_files.comment</w:t>
+              <w:t>{% if template_dict.restricted_files.comment</w:t>
             </w:r>
             <w:r>
               <w:rPr>
@@ -12153,22 +11572,10 @@
               <w:t>s</w:t>
             </w:r>
             <w:r>
-              <w:t>|length</w:t>
-            </w:r>
-            <w:proofErr w:type="spellEnd"/>
-            <w:r>
-              <w:t xml:space="preserve"> &gt; 0</w:t>
-            </w:r>
-            <w:r>
-              <w:t xml:space="preserve"> %}{% for item in </w:t>
-            </w:r>
-            <w:proofErr w:type="spellStart"/>
-            <w:r>
-              <w:t>template_dict.restricted_files.comments</w:t>
-            </w:r>
-            <w:proofErr w:type="spellEnd"/>
-            <w:r>
-              <w:t xml:space="preserve"> %} </w:t>
+              <w:t>|length &gt; 0</w:t>
+            </w:r>
+            <w:r>
+              <w:t xml:space="preserve"> %}{% for item in template_dict.restricted_files.comments %} </w:t>
             </w:r>
           </w:p>
           <w:p>
@@ -12180,23 +11587,7 @@
               </w:numPr>
             </w:pPr>
             <w:r>
-              <w:t xml:space="preserve">{{ </w:t>
-            </w:r>
-            <w:proofErr w:type="spellStart"/>
-            <w:r>
-              <w:t>item.file_name</w:t>
-            </w:r>
-            <w:proofErr w:type="spellEnd"/>
-            <w:r>
-              <w:t xml:space="preserve"> }} {% </w:t>
-            </w:r>
-            <w:proofErr w:type="spellStart"/>
-            <w:r>
-              <w:t>endfor</w:t>
-            </w:r>
-            <w:proofErr w:type="spellEnd"/>
-            <w:r>
-              <w:t xml:space="preserve"> %}</w:t>
+              <w:t>{{ item.file_name }} {% endfor %}</w:t>
             </w:r>
           </w:p>
           <w:p>
@@ -12245,23 +11636,7 @@
               </w:rPr>
             </w:pPr>
             <w:r>
-              <w:t xml:space="preserve">{% if </w:t>
-            </w:r>
-            <w:proofErr w:type="spellStart"/>
-            <w:r>
-              <w:t>template_dict.terms_license.licenseName</w:t>
-            </w:r>
-            <w:proofErr w:type="spellEnd"/>
-            <w:r>
-              <w:t xml:space="preserve"> is not none %}{{ </w:t>
-            </w:r>
-            <w:proofErr w:type="spellStart"/>
-            <w:r>
-              <w:t>template_dict.terms_license.licenseName</w:t>
-            </w:r>
-            <w:proofErr w:type="spellEnd"/>
-            <w:r>
-              <w:t xml:space="preserve"> }}{% else %}(NONE){% endif %}</w:t>
+              <w:t>{% if template_dict.terms_license.licenseName is not none %}{{ template_dict.terms_license.licenseName }}{% else %}(NONE){% endif %}</w:t>
             </w:r>
           </w:p>
           <w:p>
@@ -12319,27 +11694,17 @@
                     </w:rPr>
                   </w:pPr>
                   <w:r>
-                    <w:t xml:space="preserve">{% if </w:t>
-                  </w:r>
-                  <w:proofErr w:type="spellStart"/>
-                  <w:r>
-                    <w:t>template_dict.terms_license.</w:t>
+                    <w:t>{% if template_dict.terms_license.</w:t>
                   </w:r>
                   <w:r>
                     <w:t>termsOfUse</w:t>
                   </w:r>
-                  <w:proofErr w:type="spellEnd"/>
                   <w:r>
-                    <w:t xml:space="preserve"> is not none %}{{ </w:t>
-                  </w:r>
-                  <w:proofErr w:type="spellStart"/>
-                  <w:r>
-                    <w:t>template_dict.terms_license.</w:t>
+                    <w:t xml:space="preserve"> is not none %}{{ template_dict.terms_license.</w:t>
                   </w:r>
                   <w:r>
                     <w:t>termsOfUse</w:t>
                   </w:r>
-                  <w:proofErr w:type="spellEnd"/>
                   <w:r>
                     <w:t xml:space="preserve"> }}{% else %}(NONE){% endif %}</w:t>
                   </w:r>
@@ -12482,7 +11847,11 @@
               </w:numPr>
             </w:pPr>
             <w:r>
-              <w:t>If there are restricted files and no Terms of Access, recommend including terms of access.</w:t>
+              <w:t xml:space="preserve">If there are restricted files and no Terms of Access, recommend </w:t>
+            </w:r>
+            <w:r>
+              <w:lastRenderedPageBreak/>
+              <w:t>including terms of access.</w:t>
             </w:r>
           </w:p>
           <w:p>
@@ -12493,11 +11862,7 @@
               </w:numPr>
             </w:pPr>
             <w:r>
-              <w:t xml:space="preserve">If there are Terms of Access, review to ensure </w:t>
-            </w:r>
-            <w:r>
-              <w:lastRenderedPageBreak/>
-              <w:t>they are clear.</w:t>
+              <w:t>If there are Terms of Access, review to ensure they are clear.</w:t>
             </w:r>
           </w:p>
         </w:tc>
@@ -12526,19 +11891,11 @@
               <w:lastRenderedPageBreak/>
               <w:t xml:space="preserve">{% if </w:t>
             </w:r>
-            <w:proofErr w:type="spellStart"/>
             <w:r>
               <w:rPr>
                 <w:lang w:val="en-US"/>
               </w:rPr>
-              <w:t>template_dict</w:t>
-            </w:r>
-            <w:proofErr w:type="spellEnd"/>
-            <w:r>
-              <w:rPr>
-                <w:lang w:val="en-US"/>
-              </w:rPr>
-              <w:t>.</w:t>
+              <w:t>template_dict.</w:t>
             </w:r>
             <w:r>
               <w:rPr>
@@ -12551,111 +11908,84 @@
               </w:rPr>
               <w:t xml:space="preserve"> </w:t>
             </w:r>
-            <w:proofErr w:type="spellStart"/>
             <w:r>
               <w:t>restricted_files</w:t>
             </w:r>
-            <w:proofErr w:type="spellEnd"/>
             <w:r>
               <w:rPr>
                 <w:lang w:val="en-US"/>
               </w:rPr>
-              <w:t>.</w:t>
-            </w:r>
-            <w:proofErr w:type="spellStart"/>
-            <w:r>
-              <w:rPr>
-                <w:lang w:val="en-US"/>
-              </w:rPr>
-              <w:t>comments</w:t>
+              <w:t>.comments</w:t>
             </w:r>
             <w:r>
               <w:rPr>
                 <w:rFonts w:hint="eastAsia"/>
                 <w:lang w:val="en-US"/>
               </w:rPr>
-              <w:t>|length</w:t>
-            </w:r>
-            <w:proofErr w:type="spellEnd"/>
+              <w:t>|length &gt;</w:t>
+            </w:r>
+            <w:r>
+              <w:rPr>
+                <w:lang w:val="en-US"/>
+              </w:rPr>
+              <w:t xml:space="preserve"> 0 </w:t>
+            </w:r>
             <w:r>
               <w:rPr>
                 <w:rFonts w:hint="eastAsia"/>
                 <w:lang w:val="en-US"/>
               </w:rPr>
-              <w:t xml:space="preserve"> &gt;</w:t>
+              <w:t xml:space="preserve">and </w:t>
+            </w:r>
+            <w:r>
+              <w:t>template_dict.terms_license.</w:t>
+            </w:r>
+            <w:r>
+              <w:t>termsOfAccess</w:t>
+            </w:r>
+            <w:r>
+              <w:t xml:space="preserve"> is not none</w:t>
             </w:r>
             <w:r>
               <w:rPr>
                 <w:lang w:val="en-US"/>
               </w:rPr>
-              <w:t xml:space="preserve"> 0 </w:t>
-            </w:r>
+              <w:t xml:space="preserve"> %}</w:t>
+            </w:r>
+            <w:r>
+              <w:t>X{% endif %}</w:t>
+            </w:r>
+          </w:p>
+        </w:tc>
+        <w:tc>
+          <w:tcPr>
+            <w:tcW w:w="0" w:type="auto"/>
+            <w:tcBorders>
+              <w:top w:val="single" w:sz="8" w:space="0" w:color="000000"/>
+              <w:left w:val="single" w:sz="8" w:space="0" w:color="000000"/>
+              <w:bottom w:val="single" w:sz="8" w:space="0" w:color="000000"/>
+              <w:right w:val="single" w:sz="8" w:space="0" w:color="000000"/>
+            </w:tcBorders>
+            <w:tcMar>
+              <w:top w:w="100" w:type="dxa"/>
+              <w:left w:w="100" w:type="dxa"/>
+              <w:bottom w:w="100" w:type="dxa"/>
+              <w:right w:w="100" w:type="dxa"/>
+            </w:tcMar>
+          </w:tcPr>
+          <w:p>
             <w:r>
               <w:rPr>
                 <w:rFonts w:hint="eastAsia"/>
                 <w:lang w:val="en-US"/>
               </w:rPr>
-              <w:t xml:space="preserve">and </w:t>
-            </w:r>
-            <w:proofErr w:type="spellStart"/>
-            <w:r>
-              <w:t>template_dict.terms_license.</w:t>
-            </w:r>
-            <w:r>
-              <w:t>termsOfAccess</w:t>
-            </w:r>
-            <w:proofErr w:type="spellEnd"/>
-            <w:r>
-              <w:t xml:space="preserve"> is not none</w:t>
+              <w:t xml:space="preserve">{% if </w:t>
             </w:r>
             <w:r>
               <w:rPr>
                 <w:lang w:val="en-US"/>
               </w:rPr>
-              <w:t xml:space="preserve"> %}</w:t>
-            </w:r>
-            <w:r>
-              <w:t>X{% endif %}</w:t>
-            </w:r>
-          </w:p>
-        </w:tc>
-        <w:tc>
-          <w:tcPr>
-            <w:tcW w:w="0" w:type="auto"/>
-            <w:tcBorders>
-              <w:top w:val="single" w:sz="8" w:space="0" w:color="000000"/>
-              <w:left w:val="single" w:sz="8" w:space="0" w:color="000000"/>
-              <w:bottom w:val="single" w:sz="8" w:space="0" w:color="000000"/>
-              <w:right w:val="single" w:sz="8" w:space="0" w:color="000000"/>
-            </w:tcBorders>
-            <w:tcMar>
-              <w:top w:w="100" w:type="dxa"/>
-              <w:left w:w="100" w:type="dxa"/>
-              <w:bottom w:w="100" w:type="dxa"/>
-              <w:right w:w="100" w:type="dxa"/>
-            </w:tcMar>
-          </w:tcPr>
-          <w:p>
-            <w:r>
-              <w:rPr>
-                <w:rFonts w:hint="eastAsia"/>
-                <w:lang w:val="en-US"/>
-              </w:rPr>
-              <w:t xml:space="preserve">{% if </w:t>
-            </w:r>
-            <w:proofErr w:type="spellStart"/>
-            <w:r>
-              <w:rPr>
-                <w:lang w:val="en-US"/>
-              </w:rPr>
-              <w:t>template_dict</w:t>
-            </w:r>
-            <w:proofErr w:type="spellEnd"/>
-            <w:r>
-              <w:rPr>
-                <w:lang w:val="en-US"/>
-              </w:rPr>
-              <w:t>.</w:t>
+              <w:t>template_dict.</w:t>
             </w:r>
             <w:r>
               <w:rPr>
@@ -12668,147 +11998,120 @@
               </w:rPr>
               <w:t xml:space="preserve"> </w:t>
             </w:r>
-            <w:proofErr w:type="spellStart"/>
             <w:r>
               <w:t>restricted_files</w:t>
             </w:r>
-            <w:proofErr w:type="spellEnd"/>
             <w:r>
               <w:rPr>
                 <w:lang w:val="en-US"/>
               </w:rPr>
-              <w:t>.</w:t>
-            </w:r>
-            <w:proofErr w:type="spellStart"/>
-            <w:r>
-              <w:rPr>
-                <w:lang w:val="en-US"/>
-              </w:rPr>
-              <w:t>comments</w:t>
+              <w:t>.comments</w:t>
             </w:r>
             <w:r>
               <w:rPr>
                 <w:rFonts w:hint="eastAsia"/>
                 <w:lang w:val="en-US"/>
               </w:rPr>
-              <w:t>|length</w:t>
-            </w:r>
-            <w:proofErr w:type="spellEnd"/>
+              <w:t>|length &gt;</w:t>
+            </w:r>
+            <w:r>
+              <w:rPr>
+                <w:lang w:val="en-US"/>
+              </w:rPr>
+              <w:t xml:space="preserve"> 0 </w:t>
+            </w:r>
             <w:r>
               <w:rPr>
                 <w:rFonts w:hint="eastAsia"/>
                 <w:lang w:val="en-US"/>
               </w:rPr>
-              <w:t xml:space="preserve"> &gt;</w:t>
+              <w:t xml:space="preserve">and </w:t>
+            </w:r>
+            <w:r>
+              <w:t>template_dict.terms_license.</w:t>
+            </w:r>
+            <w:r>
+              <w:t>termsOfAccess</w:t>
+            </w:r>
+            <w:r>
+              <w:t xml:space="preserve"> is none</w:t>
             </w:r>
             <w:r>
               <w:rPr>
                 <w:lang w:val="en-US"/>
               </w:rPr>
-              <w:t xml:space="preserve"> 0 </w:t>
-            </w:r>
+              <w:t xml:space="preserve"> %}</w:t>
+            </w:r>
+            <w:r>
+              <w:t>X{% endif %}</w:t>
+            </w:r>
+          </w:p>
+        </w:tc>
+        <w:tc>
+          <w:tcPr>
+            <w:tcW w:w="0" w:type="auto"/>
+            <w:tcBorders>
+              <w:top w:val="single" w:sz="8" w:space="0" w:color="000000"/>
+              <w:left w:val="single" w:sz="8" w:space="0" w:color="000000"/>
+              <w:bottom w:val="single" w:sz="8" w:space="0" w:color="000000"/>
+              <w:right w:val="single" w:sz="8" w:space="0" w:color="000000"/>
+            </w:tcBorders>
+            <w:tcMar>
+              <w:top w:w="100" w:type="dxa"/>
+              <w:left w:w="100" w:type="dxa"/>
+              <w:bottom w:w="100" w:type="dxa"/>
+              <w:right w:w="100" w:type="dxa"/>
+            </w:tcMar>
+          </w:tcPr>
+          <w:p/>
+        </w:tc>
+        <w:tc>
+          <w:tcPr>
+            <w:tcW w:w="0" w:type="auto"/>
+            <w:tcBorders>
+              <w:top w:val="single" w:sz="8" w:space="0" w:color="000000"/>
+              <w:left w:val="single" w:sz="8" w:space="0" w:color="000000"/>
+              <w:bottom w:val="single" w:sz="8" w:space="0" w:color="000000"/>
+              <w:right w:val="single" w:sz="8" w:space="0" w:color="000000"/>
+            </w:tcBorders>
+            <w:tcMar>
+              <w:top w:w="100" w:type="dxa"/>
+              <w:left w:w="100" w:type="dxa"/>
+              <w:bottom w:w="100" w:type="dxa"/>
+              <w:right w:w="100" w:type="dxa"/>
+            </w:tcMar>
+          </w:tcPr>
+          <w:p/>
+        </w:tc>
+        <w:tc>
+          <w:tcPr>
+            <w:tcW w:w="0" w:type="auto"/>
+            <w:tcBorders>
+              <w:top w:val="single" w:sz="8" w:space="0" w:color="000000"/>
+              <w:left w:val="single" w:sz="8" w:space="0" w:color="000000"/>
+              <w:bottom w:val="single" w:sz="8" w:space="0" w:color="000000"/>
+              <w:right w:val="single" w:sz="8" w:space="0" w:color="000000"/>
+            </w:tcBorders>
+            <w:tcMar>
+              <w:top w:w="100" w:type="dxa"/>
+              <w:left w:w="100" w:type="dxa"/>
+              <w:bottom w:w="100" w:type="dxa"/>
+              <w:right w:w="100" w:type="dxa"/>
+            </w:tcMar>
+          </w:tcPr>
+          <w:p>
             <w:r>
               <w:rPr>
                 <w:rFonts w:hint="eastAsia"/>
                 <w:lang w:val="en-US"/>
               </w:rPr>
-              <w:t xml:space="preserve">and </w:t>
-            </w:r>
-            <w:proofErr w:type="spellStart"/>
-            <w:r>
-              <w:t>template_dict.terms_license.</w:t>
-            </w:r>
-            <w:r>
-              <w:t>termsOfAccess</w:t>
-            </w:r>
-            <w:proofErr w:type="spellEnd"/>
-            <w:r>
-              <w:t xml:space="preserve"> is none</w:t>
+              <w:t xml:space="preserve">{% if </w:t>
             </w:r>
             <w:r>
               <w:rPr>
                 <w:lang w:val="en-US"/>
               </w:rPr>
-              <w:t xml:space="preserve"> %}</w:t>
-            </w:r>
-            <w:r>
-              <w:t>X{% endif %}</w:t>
-            </w:r>
-          </w:p>
-        </w:tc>
-        <w:tc>
-          <w:tcPr>
-            <w:tcW w:w="0" w:type="auto"/>
-            <w:tcBorders>
-              <w:top w:val="single" w:sz="8" w:space="0" w:color="000000"/>
-              <w:left w:val="single" w:sz="8" w:space="0" w:color="000000"/>
-              <w:bottom w:val="single" w:sz="8" w:space="0" w:color="000000"/>
-              <w:right w:val="single" w:sz="8" w:space="0" w:color="000000"/>
-            </w:tcBorders>
-            <w:tcMar>
-              <w:top w:w="100" w:type="dxa"/>
-              <w:left w:w="100" w:type="dxa"/>
-              <w:bottom w:w="100" w:type="dxa"/>
-              <w:right w:w="100" w:type="dxa"/>
-            </w:tcMar>
-          </w:tcPr>
-          <w:p/>
-        </w:tc>
-        <w:tc>
-          <w:tcPr>
-            <w:tcW w:w="0" w:type="auto"/>
-            <w:tcBorders>
-              <w:top w:val="single" w:sz="8" w:space="0" w:color="000000"/>
-              <w:left w:val="single" w:sz="8" w:space="0" w:color="000000"/>
-              <w:bottom w:val="single" w:sz="8" w:space="0" w:color="000000"/>
-              <w:right w:val="single" w:sz="8" w:space="0" w:color="000000"/>
-            </w:tcBorders>
-            <w:tcMar>
-              <w:top w:w="100" w:type="dxa"/>
-              <w:left w:w="100" w:type="dxa"/>
-              <w:bottom w:w="100" w:type="dxa"/>
-              <w:right w:w="100" w:type="dxa"/>
-            </w:tcMar>
-          </w:tcPr>
-          <w:p/>
-        </w:tc>
-        <w:tc>
-          <w:tcPr>
-            <w:tcW w:w="0" w:type="auto"/>
-            <w:tcBorders>
-              <w:top w:val="single" w:sz="8" w:space="0" w:color="000000"/>
-              <w:left w:val="single" w:sz="8" w:space="0" w:color="000000"/>
-              <w:bottom w:val="single" w:sz="8" w:space="0" w:color="000000"/>
-              <w:right w:val="single" w:sz="8" w:space="0" w:color="000000"/>
-            </w:tcBorders>
-            <w:tcMar>
-              <w:top w:w="100" w:type="dxa"/>
-              <w:left w:w="100" w:type="dxa"/>
-              <w:bottom w:w="100" w:type="dxa"/>
-              <w:right w:w="100" w:type="dxa"/>
-            </w:tcMar>
-          </w:tcPr>
-          <w:p>
-            <w:r>
-              <w:rPr>
-                <w:rFonts w:hint="eastAsia"/>
-                <w:lang w:val="en-US"/>
-              </w:rPr>
-              <w:t xml:space="preserve">{% if </w:t>
-            </w:r>
-            <w:proofErr w:type="spellStart"/>
-            <w:r>
-              <w:rPr>
-                <w:lang w:val="en-US"/>
-              </w:rPr>
-              <w:t>template_dict</w:t>
-            </w:r>
-            <w:proofErr w:type="spellEnd"/>
-            <w:r>
-              <w:rPr>
-                <w:lang w:val="en-US"/>
-              </w:rPr>
-              <w:t>.</w:t>
+              <w:t>template_dict.</w:t>
             </w:r>
             <w:r>
               <w:rPr>
@@ -12821,38 +12124,21 @@
               </w:rPr>
               <w:t xml:space="preserve"> </w:t>
             </w:r>
-            <w:proofErr w:type="spellStart"/>
             <w:r>
               <w:t>restricted_files</w:t>
             </w:r>
-            <w:proofErr w:type="spellEnd"/>
             <w:r>
               <w:rPr>
                 <w:lang w:val="en-US"/>
               </w:rPr>
-              <w:t>.</w:t>
-            </w:r>
-            <w:proofErr w:type="spellStart"/>
-            <w:r>
-              <w:rPr>
-                <w:lang w:val="en-US"/>
-              </w:rPr>
-              <w:t>comments</w:t>
+              <w:t>.comments</w:t>
             </w:r>
             <w:r>
               <w:rPr>
                 <w:rFonts w:hint="eastAsia"/>
                 <w:lang w:val="en-US"/>
               </w:rPr>
-              <w:t>|length</w:t>
-            </w:r>
-            <w:proofErr w:type="spellEnd"/>
-            <w:r>
-              <w:rPr>
-                <w:rFonts w:hint="eastAsia"/>
-                <w:lang w:val="en-US"/>
-              </w:rPr>
-              <w:t xml:space="preserve"> ==</w:t>
+              <w:t>|length ==</w:t>
             </w:r>
             <w:r>
               <w:rPr>
@@ -12943,27 +12229,17 @@
                     </w:rPr>
                   </w:pPr>
                   <w:r>
-                    <w:t xml:space="preserve">{% if </w:t>
-                  </w:r>
-                  <w:proofErr w:type="spellStart"/>
-                  <w:r>
-                    <w:t>template_dict.terms_license.</w:t>
+                    <w:t>{% if template_dict.terms_license.</w:t>
                   </w:r>
                   <w:r>
                     <w:t>termsOfAccess</w:t>
                   </w:r>
-                  <w:proofErr w:type="spellEnd"/>
                   <w:r>
-                    <w:t xml:space="preserve"> is not none %}{{ </w:t>
-                  </w:r>
-                  <w:proofErr w:type="spellStart"/>
-                  <w:r>
-                    <w:t>template_dict.terms_license.</w:t>
+                    <w:t xml:space="preserve"> is not none %}{{ template_dict.terms_license.</w:t>
                   </w:r>
                   <w:r>
                     <w:t>termsOfAccess</w:t>
                   </w:r>
-                  <w:proofErr w:type="spellEnd"/>
                   <w:r>
                     <w:t xml:space="preserve"> }}{% else %}(NONE){% endif %}</w:t>
                   </w:r>
@@ -13281,7 +12557,13 @@
         </w:tc>
       </w:tr>
     </w:tbl>
-    <w:p/>
+    <w:p>
+      <w:pPr>
+        <w:rPr>
+          <w:lang w:val="en-US"/>
+        </w:rPr>
+      </w:pPr>
+    </w:p>
     <w:sectPr>
       <w:pgSz w:w="23811" w:h="16838" w:orient="landscape" w:code="8"/>
       <w:pgMar w:top="720" w:right="720" w:bottom="720" w:left="720" w:header="720" w:footer="720" w:gutter="0"/>
@@ -13819,6 +13101,151 @@
     </w:lvl>
   </w:abstractNum>
   <w:abstractNum w:abstractNumId="4" w15:restartNumberingAfterBreak="0">
+    <w:nsid w:val="0C873FE0"/>
+    <w:multiLevelType w:val="multilevel"/>
+    <w:tmpl w:val="D7C8CDC0"/>
+    <w:lvl w:ilvl="0">
+      <w:start w:val="1"/>
+      <w:numFmt w:val="bullet"/>
+      <w:lvlText w:val=""/>
+      <w:lvlJc w:val="left"/>
+      <w:pPr>
+        <w:tabs>
+          <w:tab w:val="num" w:pos="720"/>
+        </w:tabs>
+        <w:ind w:left="720" w:hanging="360"/>
+      </w:pPr>
+      <w:rPr>
+        <w:rFonts w:ascii="Symbol" w:hAnsi="Symbol" w:hint="default"/>
+        <w:sz w:val="20"/>
+      </w:rPr>
+    </w:lvl>
+    <w:lvl w:ilvl="1">
+      <w:start w:val="1"/>
+      <w:numFmt w:val="decimal"/>
+      <w:lvlText w:val="%2."/>
+      <w:lvlJc w:val="left"/>
+      <w:pPr>
+        <w:ind w:left="1440" w:hanging="360"/>
+      </w:pPr>
+      <w:rPr>
+        <w:rFonts w:hint="default"/>
+      </w:rPr>
+    </w:lvl>
+    <w:lvl w:ilvl="2" w:tentative="1">
+      <w:start w:val="1"/>
+      <w:numFmt w:val="bullet"/>
+      <w:lvlText w:val=""/>
+      <w:lvlJc w:val="left"/>
+      <w:pPr>
+        <w:tabs>
+          <w:tab w:val="num" w:pos="2160"/>
+        </w:tabs>
+        <w:ind w:left="2160" w:hanging="360"/>
+      </w:pPr>
+      <w:rPr>
+        <w:rFonts w:ascii="Wingdings" w:hAnsi="Wingdings" w:hint="default"/>
+        <w:sz w:val="20"/>
+      </w:rPr>
+    </w:lvl>
+    <w:lvl w:ilvl="3" w:tentative="1">
+      <w:start w:val="1"/>
+      <w:numFmt w:val="bullet"/>
+      <w:lvlText w:val=""/>
+      <w:lvlJc w:val="left"/>
+      <w:pPr>
+        <w:tabs>
+          <w:tab w:val="num" w:pos="2880"/>
+        </w:tabs>
+        <w:ind w:left="2880" w:hanging="360"/>
+      </w:pPr>
+      <w:rPr>
+        <w:rFonts w:ascii="Wingdings" w:hAnsi="Wingdings" w:hint="default"/>
+        <w:sz w:val="20"/>
+      </w:rPr>
+    </w:lvl>
+    <w:lvl w:ilvl="4" w:tentative="1">
+      <w:start w:val="1"/>
+      <w:numFmt w:val="bullet"/>
+      <w:lvlText w:val=""/>
+      <w:lvlJc w:val="left"/>
+      <w:pPr>
+        <w:tabs>
+          <w:tab w:val="num" w:pos="3600"/>
+        </w:tabs>
+        <w:ind w:left="3600" w:hanging="360"/>
+      </w:pPr>
+      <w:rPr>
+        <w:rFonts w:ascii="Wingdings" w:hAnsi="Wingdings" w:hint="default"/>
+        <w:sz w:val="20"/>
+      </w:rPr>
+    </w:lvl>
+    <w:lvl w:ilvl="5" w:tentative="1">
+      <w:start w:val="1"/>
+      <w:numFmt w:val="bullet"/>
+      <w:lvlText w:val=""/>
+      <w:lvlJc w:val="left"/>
+      <w:pPr>
+        <w:tabs>
+          <w:tab w:val="num" w:pos="4320"/>
+        </w:tabs>
+        <w:ind w:left="4320" w:hanging="360"/>
+      </w:pPr>
+      <w:rPr>
+        <w:rFonts w:ascii="Wingdings" w:hAnsi="Wingdings" w:hint="default"/>
+        <w:sz w:val="20"/>
+      </w:rPr>
+    </w:lvl>
+    <w:lvl w:ilvl="6" w:tentative="1">
+      <w:start w:val="1"/>
+      <w:numFmt w:val="bullet"/>
+      <w:lvlText w:val=""/>
+      <w:lvlJc w:val="left"/>
+      <w:pPr>
+        <w:tabs>
+          <w:tab w:val="num" w:pos="5040"/>
+        </w:tabs>
+        <w:ind w:left="5040" w:hanging="360"/>
+      </w:pPr>
+      <w:rPr>
+        <w:rFonts w:ascii="Wingdings" w:hAnsi="Wingdings" w:hint="default"/>
+        <w:sz w:val="20"/>
+      </w:rPr>
+    </w:lvl>
+    <w:lvl w:ilvl="7" w:tentative="1">
+      <w:start w:val="1"/>
+      <w:numFmt w:val="bullet"/>
+      <w:lvlText w:val=""/>
+      <w:lvlJc w:val="left"/>
+      <w:pPr>
+        <w:tabs>
+          <w:tab w:val="num" w:pos="5760"/>
+        </w:tabs>
+        <w:ind w:left="5760" w:hanging="360"/>
+      </w:pPr>
+      <w:rPr>
+        <w:rFonts w:ascii="Wingdings" w:hAnsi="Wingdings" w:hint="default"/>
+        <w:sz w:val="20"/>
+      </w:rPr>
+    </w:lvl>
+    <w:lvl w:ilvl="8" w:tentative="1">
+      <w:start w:val="1"/>
+      <w:numFmt w:val="bullet"/>
+      <w:lvlText w:val=""/>
+      <w:lvlJc w:val="left"/>
+      <w:pPr>
+        <w:tabs>
+          <w:tab w:val="num" w:pos="6480"/>
+        </w:tabs>
+        <w:ind w:left="6480" w:hanging="360"/>
+      </w:pPr>
+      <w:rPr>
+        <w:rFonts w:ascii="Wingdings" w:hAnsi="Wingdings" w:hint="default"/>
+        <w:sz w:val="20"/>
+      </w:rPr>
+    </w:lvl>
+  </w:abstractNum>
+  <w:abstractNum w:abstractNumId="5" w15:restartNumberingAfterBreak="0">
     <w:nsid w:val="0C927377"/>
     <w:multiLevelType w:val="multilevel"/>
     <w:tmpl w:val="D6A6472E"/>
@@ -13931,7 +13358,7 @@
       </w:pPr>
     </w:lvl>
   </w:abstractNum>
-  <w:abstractNum w:abstractNumId="5" w15:restartNumberingAfterBreak="0">
+  <w:abstractNum w:abstractNumId="6" w15:restartNumberingAfterBreak="0">
     <w:nsid w:val="0F0F710E"/>
     <w:multiLevelType w:val="multilevel"/>
     <w:tmpl w:val="C7F47DFC"/>
@@ -14044,7 +13471,7 @@
       </w:pPr>
     </w:lvl>
   </w:abstractNum>
-  <w:abstractNum w:abstractNumId="6" w15:restartNumberingAfterBreak="0">
+  <w:abstractNum w:abstractNumId="7" w15:restartNumberingAfterBreak="0">
     <w:nsid w:val="0FE16AAD"/>
     <w:multiLevelType w:val="multilevel"/>
     <w:tmpl w:val="780829FE"/>
@@ -14193,7 +13620,7 @@
       </w:rPr>
     </w:lvl>
   </w:abstractNum>
-  <w:abstractNum w:abstractNumId="7" w15:restartNumberingAfterBreak="0">
+  <w:abstractNum w:abstractNumId="8" w15:restartNumberingAfterBreak="0">
     <w:nsid w:val="10425A85"/>
     <w:multiLevelType w:val="multilevel"/>
     <w:tmpl w:val="CD26C3EA"/>
@@ -14342,7 +13769,7 @@
       </w:rPr>
     </w:lvl>
   </w:abstractNum>
-  <w:abstractNum w:abstractNumId="8" w15:restartNumberingAfterBreak="0">
+  <w:abstractNum w:abstractNumId="9" w15:restartNumberingAfterBreak="0">
     <w:nsid w:val="10735190"/>
     <w:multiLevelType w:val="hybridMultilevel"/>
     <w:tmpl w:val="D42AF0FA"/>
@@ -14431,7 +13858,7 @@
       </w:pPr>
     </w:lvl>
   </w:abstractNum>
-  <w:abstractNum w:abstractNumId="9" w15:restartNumberingAfterBreak="0">
+  <w:abstractNum w:abstractNumId="10" w15:restartNumberingAfterBreak="0">
     <w:nsid w:val="10D74393"/>
     <w:multiLevelType w:val="hybridMultilevel"/>
     <w:tmpl w:val="646E37D8"/>
@@ -14517,7 +13944,7 @@
       </w:pPr>
     </w:lvl>
   </w:abstractNum>
-  <w:abstractNum w:abstractNumId="10" w15:restartNumberingAfterBreak="0">
+  <w:abstractNum w:abstractNumId="11" w15:restartNumberingAfterBreak="0">
     <w:nsid w:val="15564582"/>
     <w:multiLevelType w:val="multilevel"/>
     <w:tmpl w:val="7C3C904C"/>
@@ -14630,7 +14057,7 @@
       </w:pPr>
     </w:lvl>
   </w:abstractNum>
-  <w:abstractNum w:abstractNumId="11" w15:restartNumberingAfterBreak="0">
+  <w:abstractNum w:abstractNumId="12" w15:restartNumberingAfterBreak="0">
     <w:nsid w:val="155C25CB"/>
     <w:multiLevelType w:val="multilevel"/>
     <w:tmpl w:val="1E4A4092"/>
@@ -14779,7 +14206,7 @@
       </w:rPr>
     </w:lvl>
   </w:abstractNum>
-  <w:abstractNum w:abstractNumId="12" w15:restartNumberingAfterBreak="0">
+  <w:abstractNum w:abstractNumId="13" w15:restartNumberingAfterBreak="0">
     <w:nsid w:val="16863978"/>
     <w:multiLevelType w:val="multilevel"/>
     <w:tmpl w:val="01D0E324"/>
@@ -14928,7 +14355,7 @@
       </w:rPr>
     </w:lvl>
   </w:abstractNum>
-  <w:abstractNum w:abstractNumId="13" w15:restartNumberingAfterBreak="0">
+  <w:abstractNum w:abstractNumId="14" w15:restartNumberingAfterBreak="0">
     <w:nsid w:val="17931AC8"/>
     <w:multiLevelType w:val="multilevel"/>
     <w:tmpl w:val="4F20CD06"/>
@@ -15077,7 +14504,7 @@
       </w:rPr>
     </w:lvl>
   </w:abstractNum>
-  <w:abstractNum w:abstractNumId="14" w15:restartNumberingAfterBreak="0">
+  <w:abstractNum w:abstractNumId="15" w15:restartNumberingAfterBreak="0">
     <w:nsid w:val="17B70176"/>
     <w:multiLevelType w:val="multilevel"/>
     <w:tmpl w:val="768C49BA"/>
@@ -15226,7 +14653,7 @@
       </w:rPr>
     </w:lvl>
   </w:abstractNum>
-  <w:abstractNum w:abstractNumId="15" w15:restartNumberingAfterBreak="0">
+  <w:abstractNum w:abstractNumId="16" w15:restartNumberingAfterBreak="0">
     <w:nsid w:val="1856637B"/>
     <w:multiLevelType w:val="multilevel"/>
     <w:tmpl w:val="68F62F8A"/>
@@ -15339,7 +14766,7 @@
       </w:pPr>
     </w:lvl>
   </w:abstractNum>
-  <w:abstractNum w:abstractNumId="16" w15:restartNumberingAfterBreak="0">
+  <w:abstractNum w:abstractNumId="17" w15:restartNumberingAfterBreak="0">
     <w:nsid w:val="1C2B461B"/>
     <w:multiLevelType w:val="multilevel"/>
     <w:tmpl w:val="9508FA72"/>
@@ -15488,7 +14915,7 @@
       </w:rPr>
     </w:lvl>
   </w:abstractNum>
-  <w:abstractNum w:abstractNumId="17" w15:restartNumberingAfterBreak="0">
+  <w:abstractNum w:abstractNumId="18" w15:restartNumberingAfterBreak="0">
     <w:nsid w:val="1CED72A9"/>
     <w:multiLevelType w:val="multilevel"/>
     <w:tmpl w:val="37E6EC66"/>
@@ -15637,7 +15064,7 @@
       </w:rPr>
     </w:lvl>
   </w:abstractNum>
-  <w:abstractNum w:abstractNumId="18" w15:restartNumberingAfterBreak="0">
+  <w:abstractNum w:abstractNumId="19" w15:restartNumberingAfterBreak="0">
     <w:nsid w:val="20C265CE"/>
     <w:multiLevelType w:val="multilevel"/>
     <w:tmpl w:val="CD5CCDCE"/>
@@ -15750,7 +15177,7 @@
       </w:pPr>
     </w:lvl>
   </w:abstractNum>
-  <w:abstractNum w:abstractNumId="19" w15:restartNumberingAfterBreak="0">
+  <w:abstractNum w:abstractNumId="20" w15:restartNumberingAfterBreak="0">
     <w:nsid w:val="22F71639"/>
     <w:multiLevelType w:val="multilevel"/>
     <w:tmpl w:val="98880642"/>
@@ -15899,7 +15326,7 @@
       </w:rPr>
     </w:lvl>
   </w:abstractNum>
-  <w:abstractNum w:abstractNumId="20" w15:restartNumberingAfterBreak="0">
+  <w:abstractNum w:abstractNumId="21" w15:restartNumberingAfterBreak="0">
     <w:nsid w:val="24B73AAA"/>
     <w:multiLevelType w:val="hybridMultilevel"/>
     <w:tmpl w:val="4C4C890E"/>
@@ -15988,7 +15415,7 @@
       </w:pPr>
     </w:lvl>
   </w:abstractNum>
-  <w:abstractNum w:abstractNumId="21" w15:restartNumberingAfterBreak="0">
+  <w:abstractNum w:abstractNumId="22" w15:restartNumberingAfterBreak="0">
     <w:nsid w:val="28707D0C"/>
     <w:multiLevelType w:val="multilevel"/>
     <w:tmpl w:val="F81CFE00"/>
@@ -16101,7 +15528,7 @@
       </w:pPr>
     </w:lvl>
   </w:abstractNum>
-  <w:abstractNum w:abstractNumId="22" w15:restartNumberingAfterBreak="0">
+  <w:abstractNum w:abstractNumId="23" w15:restartNumberingAfterBreak="0">
     <w:nsid w:val="2A722569"/>
     <w:multiLevelType w:val="multilevel"/>
     <w:tmpl w:val="ED5A290E"/>
@@ -16250,7 +15677,7 @@
       </w:rPr>
     </w:lvl>
   </w:abstractNum>
-  <w:abstractNum w:abstractNumId="23" w15:restartNumberingAfterBreak="0">
+  <w:abstractNum w:abstractNumId="24" w15:restartNumberingAfterBreak="0">
     <w:nsid w:val="2D4144CE"/>
     <w:multiLevelType w:val="multilevel"/>
     <w:tmpl w:val="CDC0FEB0"/>
@@ -16399,7 +15826,7 @@
       </w:rPr>
     </w:lvl>
   </w:abstractNum>
-  <w:abstractNum w:abstractNumId="24" w15:restartNumberingAfterBreak="0">
+  <w:abstractNum w:abstractNumId="25" w15:restartNumberingAfterBreak="0">
     <w:nsid w:val="2E385FB5"/>
     <w:multiLevelType w:val="hybridMultilevel"/>
     <w:tmpl w:val="E5407B66"/>
@@ -16512,7 +15939,7 @@
       </w:rPr>
     </w:lvl>
   </w:abstractNum>
-  <w:abstractNum w:abstractNumId="25" w15:restartNumberingAfterBreak="0">
+  <w:abstractNum w:abstractNumId="26" w15:restartNumberingAfterBreak="0">
     <w:nsid w:val="2EFF2066"/>
     <w:multiLevelType w:val="multilevel"/>
     <w:tmpl w:val="50B21620"/>
@@ -16625,7 +16052,7 @@
       </w:pPr>
     </w:lvl>
   </w:abstractNum>
-  <w:abstractNum w:abstractNumId="26" w15:restartNumberingAfterBreak="0">
+  <w:abstractNum w:abstractNumId="27" w15:restartNumberingAfterBreak="0">
     <w:nsid w:val="32E23B9F"/>
     <w:multiLevelType w:val="multilevel"/>
     <w:tmpl w:val="20F262D0"/>
@@ -16738,7 +16165,7 @@
       </w:pPr>
     </w:lvl>
   </w:abstractNum>
-  <w:abstractNum w:abstractNumId="27" w15:restartNumberingAfterBreak="0">
+  <w:abstractNum w:abstractNumId="28" w15:restartNumberingAfterBreak="0">
     <w:nsid w:val="34846B28"/>
     <w:multiLevelType w:val="multilevel"/>
     <w:tmpl w:val="6E02A64C"/>
@@ -16851,7 +16278,7 @@
       </w:pPr>
     </w:lvl>
   </w:abstractNum>
-  <w:abstractNum w:abstractNumId="28" w15:restartNumberingAfterBreak="0">
+  <w:abstractNum w:abstractNumId="29" w15:restartNumberingAfterBreak="0">
     <w:nsid w:val="37237A51"/>
     <w:multiLevelType w:val="multilevel"/>
     <w:tmpl w:val="B01E1058"/>
@@ -16964,7 +16391,7 @@
       </w:pPr>
     </w:lvl>
   </w:abstractNum>
-  <w:abstractNum w:abstractNumId="29" w15:restartNumberingAfterBreak="0">
+  <w:abstractNum w:abstractNumId="30" w15:restartNumberingAfterBreak="0">
     <w:nsid w:val="426D13A0"/>
     <w:multiLevelType w:val="multilevel"/>
     <w:tmpl w:val="4992F020"/>
@@ -17077,7 +16504,7 @@
       </w:pPr>
     </w:lvl>
   </w:abstractNum>
-  <w:abstractNum w:abstractNumId="30" w15:restartNumberingAfterBreak="0">
+  <w:abstractNum w:abstractNumId="31" w15:restartNumberingAfterBreak="0">
     <w:nsid w:val="472F23DD"/>
     <w:multiLevelType w:val="hybridMultilevel"/>
     <w:tmpl w:val="03DEC164"/>
@@ -17190,7 +16617,7 @@
       </w:rPr>
     </w:lvl>
   </w:abstractNum>
-  <w:abstractNum w:abstractNumId="31" w15:restartNumberingAfterBreak="0">
+  <w:abstractNum w:abstractNumId="32" w15:restartNumberingAfterBreak="0">
     <w:nsid w:val="48CD376D"/>
     <w:multiLevelType w:val="multilevel"/>
     <w:tmpl w:val="2938D644"/>
@@ -17303,7 +16730,7 @@
       </w:pPr>
     </w:lvl>
   </w:abstractNum>
-  <w:abstractNum w:abstractNumId="32" w15:restartNumberingAfterBreak="0">
+  <w:abstractNum w:abstractNumId="33" w15:restartNumberingAfterBreak="0">
     <w:nsid w:val="48F76F1E"/>
     <w:multiLevelType w:val="hybridMultilevel"/>
     <w:tmpl w:val="03DEC164"/>
@@ -17416,7 +16843,7 @@
       </w:rPr>
     </w:lvl>
   </w:abstractNum>
-  <w:abstractNum w:abstractNumId="33" w15:restartNumberingAfterBreak="0">
+  <w:abstractNum w:abstractNumId="34" w15:restartNumberingAfterBreak="0">
     <w:nsid w:val="4DFE4E7F"/>
     <w:multiLevelType w:val="multilevel"/>
     <w:tmpl w:val="52F63172"/>
@@ -17529,7 +16956,7 @@
       </w:pPr>
     </w:lvl>
   </w:abstractNum>
-  <w:abstractNum w:abstractNumId="34" w15:restartNumberingAfterBreak="0">
+  <w:abstractNum w:abstractNumId="35" w15:restartNumberingAfterBreak="0">
     <w:nsid w:val="51D8212C"/>
     <w:multiLevelType w:val="multilevel"/>
     <w:tmpl w:val="947CF7C8"/>
@@ -17642,7 +17069,7 @@
       </w:pPr>
     </w:lvl>
   </w:abstractNum>
-  <w:abstractNum w:abstractNumId="35" w15:restartNumberingAfterBreak="0">
+  <w:abstractNum w:abstractNumId="36" w15:restartNumberingAfterBreak="0">
     <w:nsid w:val="5B7F6887"/>
     <w:multiLevelType w:val="multilevel"/>
     <w:tmpl w:val="84845E98"/>
@@ -17755,7 +17182,7 @@
       </w:pPr>
     </w:lvl>
   </w:abstractNum>
-  <w:abstractNum w:abstractNumId="36" w15:restartNumberingAfterBreak="0">
+  <w:abstractNum w:abstractNumId="37" w15:restartNumberingAfterBreak="0">
     <w:nsid w:val="5F3C4F5A"/>
     <w:multiLevelType w:val="multilevel"/>
     <w:tmpl w:val="EEF49AE0"/>
@@ -17904,7 +17331,7 @@
       </w:rPr>
     </w:lvl>
   </w:abstractNum>
-  <w:abstractNum w:abstractNumId="37" w15:restartNumberingAfterBreak="0">
+  <w:abstractNum w:abstractNumId="38" w15:restartNumberingAfterBreak="0">
     <w:nsid w:val="5F9D519B"/>
     <w:multiLevelType w:val="multilevel"/>
     <w:tmpl w:val="C99876E8"/>
@@ -18017,7 +17444,7 @@
       </w:pPr>
     </w:lvl>
   </w:abstractNum>
-  <w:abstractNum w:abstractNumId="38" w15:restartNumberingAfterBreak="0">
+  <w:abstractNum w:abstractNumId="39" w15:restartNumberingAfterBreak="0">
     <w:nsid w:val="61537B94"/>
     <w:multiLevelType w:val="multilevel"/>
     <w:tmpl w:val="7F0EC644"/>
@@ -18166,7 +17593,7 @@
       </w:rPr>
     </w:lvl>
   </w:abstractNum>
-  <w:abstractNum w:abstractNumId="39" w15:restartNumberingAfterBreak="0">
+  <w:abstractNum w:abstractNumId="40" w15:restartNumberingAfterBreak="0">
     <w:nsid w:val="618F7E45"/>
     <w:multiLevelType w:val="multilevel"/>
     <w:tmpl w:val="FB720BCA"/>
@@ -18315,7 +17742,7 @@
       </w:rPr>
     </w:lvl>
   </w:abstractNum>
-  <w:abstractNum w:abstractNumId="40" w15:restartNumberingAfterBreak="0">
+  <w:abstractNum w:abstractNumId="41" w15:restartNumberingAfterBreak="0">
     <w:nsid w:val="627F7105"/>
     <w:multiLevelType w:val="multilevel"/>
     <w:tmpl w:val="4BE2A6AE"/>
@@ -18428,7 +17855,7 @@
       </w:pPr>
     </w:lvl>
   </w:abstractNum>
-  <w:abstractNum w:abstractNumId="41" w15:restartNumberingAfterBreak="0">
+  <w:abstractNum w:abstractNumId="42" w15:restartNumberingAfterBreak="0">
     <w:nsid w:val="640D0320"/>
     <w:multiLevelType w:val="multilevel"/>
     <w:tmpl w:val="290620EC"/>
@@ -18577,7 +18004,7 @@
       </w:rPr>
     </w:lvl>
   </w:abstractNum>
-  <w:abstractNum w:abstractNumId="42" w15:restartNumberingAfterBreak="0">
+  <w:abstractNum w:abstractNumId="43" w15:restartNumberingAfterBreak="0">
     <w:nsid w:val="69F36F70"/>
     <w:multiLevelType w:val="multilevel"/>
     <w:tmpl w:val="CEC85A46"/>
@@ -18726,7 +18153,7 @@
       </w:rPr>
     </w:lvl>
   </w:abstractNum>
-  <w:abstractNum w:abstractNumId="43" w15:restartNumberingAfterBreak="0">
+  <w:abstractNum w:abstractNumId="44" w15:restartNumberingAfterBreak="0">
     <w:nsid w:val="6DCC79C9"/>
     <w:multiLevelType w:val="multilevel"/>
     <w:tmpl w:val="D6B0D266"/>
@@ -18875,7 +18302,7 @@
       </w:rPr>
     </w:lvl>
   </w:abstractNum>
-  <w:abstractNum w:abstractNumId="44" w15:restartNumberingAfterBreak="0">
+  <w:abstractNum w:abstractNumId="45" w15:restartNumberingAfterBreak="0">
     <w:nsid w:val="6DE2596E"/>
     <w:multiLevelType w:val="hybridMultilevel"/>
     <w:tmpl w:val="0D9C62AE"/>
@@ -18961,7 +18388,7 @@
       </w:pPr>
     </w:lvl>
   </w:abstractNum>
-  <w:abstractNum w:abstractNumId="45" w15:restartNumberingAfterBreak="0">
+  <w:abstractNum w:abstractNumId="46" w15:restartNumberingAfterBreak="0">
     <w:nsid w:val="728536DE"/>
     <w:multiLevelType w:val="multilevel"/>
     <w:tmpl w:val="4F76F00E"/>
@@ -19074,7 +18501,7 @@
       </w:pPr>
     </w:lvl>
   </w:abstractNum>
-  <w:abstractNum w:abstractNumId="46" w15:restartNumberingAfterBreak="0">
+  <w:abstractNum w:abstractNumId="47" w15:restartNumberingAfterBreak="0">
     <w:nsid w:val="736F3872"/>
     <w:multiLevelType w:val="multilevel"/>
     <w:tmpl w:val="55C249F2"/>
@@ -19223,7 +18650,7 @@
       </w:rPr>
     </w:lvl>
   </w:abstractNum>
-  <w:abstractNum w:abstractNumId="47" w15:restartNumberingAfterBreak="0">
+  <w:abstractNum w:abstractNumId="48" w15:restartNumberingAfterBreak="0">
     <w:nsid w:val="73886BC4"/>
     <w:multiLevelType w:val="multilevel"/>
     <w:tmpl w:val="19B0C78C"/>
@@ -19336,7 +18763,7 @@
       </w:pPr>
     </w:lvl>
   </w:abstractNum>
-  <w:abstractNum w:abstractNumId="48" w15:restartNumberingAfterBreak="0">
+  <w:abstractNum w:abstractNumId="49" w15:restartNumberingAfterBreak="0">
     <w:nsid w:val="73D87B47"/>
     <w:multiLevelType w:val="hybridMultilevel"/>
     <w:tmpl w:val="4C4C890E"/>
@@ -19425,7 +18852,7 @@
       </w:pPr>
     </w:lvl>
   </w:abstractNum>
-  <w:abstractNum w:abstractNumId="49" w15:restartNumberingAfterBreak="0">
+  <w:abstractNum w:abstractNumId="50" w15:restartNumberingAfterBreak="0">
     <w:nsid w:val="7919052C"/>
     <w:multiLevelType w:val="hybridMultilevel"/>
     <w:tmpl w:val="CA523B24"/>
@@ -19514,7 +18941,7 @@
       </w:pPr>
     </w:lvl>
   </w:abstractNum>
-  <w:abstractNum w:abstractNumId="50" w15:restartNumberingAfterBreak="0">
+  <w:abstractNum w:abstractNumId="51" w15:restartNumberingAfterBreak="0">
     <w:nsid w:val="7CE22D75"/>
     <w:multiLevelType w:val="multilevel"/>
     <w:tmpl w:val="1F045AB8"/>
@@ -19628,85 +19055,85 @@
     </w:lvl>
   </w:abstractNum>
   <w:num w:numId="1" w16cid:durableId="953443745">
+    <w:abstractNumId w:val="10"/>
+  </w:num>
+  <w:num w:numId="2" w16cid:durableId="1489975285">
     <w:abstractNumId w:val="9"/>
   </w:num>
-  <w:num w:numId="2" w16cid:durableId="1489975285">
-    <w:abstractNumId w:val="8"/>
+  <w:num w:numId="3" w16cid:durableId="1340504712">
+    <w:abstractNumId w:val="13"/>
   </w:num>
-  <w:num w:numId="3" w16cid:durableId="1340504712">
+  <w:num w:numId="4" w16cid:durableId="2104572005">
+    <w:abstractNumId w:val="15"/>
+  </w:num>
+  <w:num w:numId="5" w16cid:durableId="481194832">
+    <w:abstractNumId w:val="24"/>
+  </w:num>
+  <w:num w:numId="6" w16cid:durableId="63534430">
+    <w:abstractNumId w:val="14"/>
+  </w:num>
+  <w:num w:numId="7" w16cid:durableId="1845317547">
+    <w:abstractNumId w:val="48"/>
+  </w:num>
+  <w:num w:numId="8" w16cid:durableId="1838423190">
+    <w:abstractNumId w:val="22"/>
+  </w:num>
+  <w:num w:numId="9" w16cid:durableId="546376926">
+    <w:abstractNumId w:val="38"/>
+  </w:num>
+  <w:num w:numId="10" w16cid:durableId="131025225">
+    <w:abstractNumId w:val="37"/>
+  </w:num>
+  <w:num w:numId="11" w16cid:durableId="558904022">
+    <w:abstractNumId w:val="28"/>
+  </w:num>
+  <w:num w:numId="12" w16cid:durableId="1649240003">
+    <w:abstractNumId w:val="51"/>
+  </w:num>
+  <w:num w:numId="13" w16cid:durableId="1981767433">
+    <w:abstractNumId w:val="46"/>
+  </w:num>
+  <w:num w:numId="14" w16cid:durableId="398403253">
+    <w:abstractNumId w:val="11"/>
+  </w:num>
+  <w:num w:numId="15" w16cid:durableId="179777302">
+    <w:abstractNumId w:val="26"/>
+  </w:num>
+  <w:num w:numId="16" w16cid:durableId="1165974549">
+    <w:abstractNumId w:val="6"/>
+  </w:num>
+  <w:num w:numId="17" w16cid:durableId="1957176815">
+    <w:abstractNumId w:val="41"/>
+  </w:num>
+  <w:num w:numId="18" w16cid:durableId="549001344">
+    <w:abstractNumId w:val="47"/>
+  </w:num>
+  <w:num w:numId="19" w16cid:durableId="384453035">
+    <w:abstractNumId w:val="16"/>
+  </w:num>
+  <w:num w:numId="20" w16cid:durableId="584387679">
+    <w:abstractNumId w:val="42"/>
+  </w:num>
+  <w:num w:numId="21" w16cid:durableId="1056389349">
+    <w:abstractNumId w:val="35"/>
+  </w:num>
+  <w:num w:numId="22" w16cid:durableId="1121026007">
+    <w:abstractNumId w:val="36"/>
+  </w:num>
+  <w:num w:numId="23" w16cid:durableId="1071005938">
+    <w:abstractNumId w:val="29"/>
+  </w:num>
+  <w:num w:numId="24" w16cid:durableId="1640576430">
+    <w:abstractNumId w:val="30"/>
+  </w:num>
+  <w:num w:numId="25" w16cid:durableId="175195030">
+    <w:abstractNumId w:val="19"/>
+  </w:num>
+  <w:num w:numId="26" w16cid:durableId="1476295277">
     <w:abstractNumId w:val="12"/>
   </w:num>
-  <w:num w:numId="4" w16cid:durableId="2104572005">
-    <w:abstractNumId w:val="14"/>
-  </w:num>
-  <w:num w:numId="5" w16cid:durableId="481194832">
-    <w:abstractNumId w:val="23"/>
-  </w:num>
-  <w:num w:numId="6" w16cid:durableId="63534430">
-    <w:abstractNumId w:val="13"/>
-  </w:num>
-  <w:num w:numId="7" w16cid:durableId="1845317547">
-    <w:abstractNumId w:val="47"/>
-  </w:num>
-  <w:num w:numId="8" w16cid:durableId="1838423190">
-    <w:abstractNumId w:val="21"/>
-  </w:num>
-  <w:num w:numId="9" w16cid:durableId="546376926">
-    <w:abstractNumId w:val="37"/>
-  </w:num>
-  <w:num w:numId="10" w16cid:durableId="131025225">
-    <w:abstractNumId w:val="36"/>
-  </w:num>
-  <w:num w:numId="11" w16cid:durableId="558904022">
-    <w:abstractNumId w:val="27"/>
-  </w:num>
-  <w:num w:numId="12" w16cid:durableId="1649240003">
-    <w:abstractNumId w:val="50"/>
-  </w:num>
-  <w:num w:numId="13" w16cid:durableId="1981767433">
-    <w:abstractNumId w:val="45"/>
-  </w:num>
-  <w:num w:numId="14" w16cid:durableId="398403253">
-    <w:abstractNumId w:val="10"/>
-  </w:num>
-  <w:num w:numId="15" w16cid:durableId="179777302">
-    <w:abstractNumId w:val="25"/>
-  </w:num>
-  <w:num w:numId="16" w16cid:durableId="1165974549">
-    <w:abstractNumId w:val="5"/>
-  </w:num>
-  <w:num w:numId="17" w16cid:durableId="1957176815">
-    <w:abstractNumId w:val="40"/>
-  </w:num>
-  <w:num w:numId="18" w16cid:durableId="549001344">
-    <w:abstractNumId w:val="46"/>
-  </w:num>
-  <w:num w:numId="19" w16cid:durableId="384453035">
-    <w:abstractNumId w:val="15"/>
-  </w:num>
-  <w:num w:numId="20" w16cid:durableId="584387679">
-    <w:abstractNumId w:val="41"/>
-  </w:num>
-  <w:num w:numId="21" w16cid:durableId="1056389349">
-    <w:abstractNumId w:val="34"/>
-  </w:num>
-  <w:num w:numId="22" w16cid:durableId="1121026007">
-    <w:abstractNumId w:val="35"/>
-  </w:num>
-  <w:num w:numId="23" w16cid:durableId="1071005938">
-    <w:abstractNumId w:val="28"/>
-  </w:num>
-  <w:num w:numId="24" w16cid:durableId="1640576430">
-    <w:abstractNumId w:val="29"/>
-  </w:num>
-  <w:num w:numId="25" w16cid:durableId="175195030">
-    <w:abstractNumId w:val="18"/>
-  </w:num>
-  <w:num w:numId="26" w16cid:durableId="1476295277">
-    <w:abstractNumId w:val="11"/>
-  </w:num>
   <w:num w:numId="27" w16cid:durableId="610016934">
-    <w:abstractNumId w:val="43"/>
+    <w:abstractNumId w:val="44"/>
   </w:num>
   <w:num w:numId="28" w16cid:durableId="1558128045">
     <w:abstractNumId w:val="0"/>
@@ -19715,34 +19142,34 @@
     <w:abstractNumId w:val="1"/>
   </w:num>
   <w:num w:numId="30" w16cid:durableId="950864947">
-    <w:abstractNumId w:val="31"/>
+    <w:abstractNumId w:val="32"/>
   </w:num>
   <w:num w:numId="31" w16cid:durableId="723528897">
-    <w:abstractNumId w:val="19"/>
+    <w:abstractNumId w:val="20"/>
   </w:num>
   <w:num w:numId="32" w16cid:durableId="1175655407">
-    <w:abstractNumId w:val="22"/>
+    <w:abstractNumId w:val="23"/>
   </w:num>
   <w:num w:numId="33" w16cid:durableId="1242759725">
-    <w:abstractNumId w:val="39"/>
+    <w:abstractNumId w:val="40"/>
   </w:num>
   <w:num w:numId="34" w16cid:durableId="1172186322">
-    <w:abstractNumId w:val="16"/>
+    <w:abstractNumId w:val="17"/>
   </w:num>
   <w:num w:numId="35" w16cid:durableId="231938996">
-    <w:abstractNumId w:val="26"/>
+    <w:abstractNumId w:val="27"/>
   </w:num>
   <w:num w:numId="36" w16cid:durableId="1073969448">
-    <w:abstractNumId w:val="7"/>
+    <w:abstractNumId w:val="8"/>
   </w:num>
   <w:num w:numId="37" w16cid:durableId="442919269">
-    <w:abstractNumId w:val="33"/>
+    <w:abstractNumId w:val="34"/>
   </w:num>
   <w:num w:numId="38" w16cid:durableId="1486510809">
-    <w:abstractNumId w:val="17"/>
+    <w:abstractNumId w:val="18"/>
   </w:num>
   <w:num w:numId="39" w16cid:durableId="715199622">
-    <w:abstractNumId w:val="6"/>
+    <w:abstractNumId w:val="7"/>
   </w:num>
   <w:num w:numId="40" w16cid:durableId="2025552387">
     <w:abstractNumId w:val="3"/>
@@ -19751,28 +19178,28 @@
     <w:abstractNumId w:val="2"/>
   </w:num>
   <w:num w:numId="42" w16cid:durableId="1522863813">
-    <w:abstractNumId w:val="42"/>
+    <w:abstractNumId w:val="43"/>
   </w:num>
   <w:num w:numId="43" w16cid:durableId="1692758747">
-    <w:abstractNumId w:val="38"/>
+    <w:abstractNumId w:val="39"/>
   </w:num>
   <w:num w:numId="44" w16cid:durableId="566065764">
-    <w:abstractNumId w:val="4"/>
+    <w:abstractNumId w:val="5"/>
   </w:num>
   <w:num w:numId="45" w16cid:durableId="176846594">
-    <w:abstractNumId w:val="49"/>
+    <w:abstractNumId w:val="50"/>
   </w:num>
   <w:num w:numId="46" w16cid:durableId="1202403600">
-    <w:abstractNumId w:val="20"/>
+    <w:abstractNumId w:val="21"/>
   </w:num>
   <w:num w:numId="47" w16cid:durableId="101195959">
-    <w:abstractNumId w:val="30"/>
+    <w:abstractNumId w:val="31"/>
   </w:num>
   <w:num w:numId="48" w16cid:durableId="395199757">
-    <w:abstractNumId w:val="32"/>
+    <w:abstractNumId w:val="33"/>
   </w:num>
   <w:num w:numId="49" w16cid:durableId="287975869">
-    <w:abstractNumId w:val="44"/>
+    <w:abstractNumId w:val="45"/>
     <w:lvlOverride w:ilvl="0">
       <w:startOverride w:val="1"/>
     </w:lvlOverride>
@@ -19802,10 +19229,13 @@
     </w:lvlOverride>
   </w:num>
   <w:num w:numId="50" w16cid:durableId="806165786">
-    <w:abstractNumId w:val="24"/>
+    <w:abstractNumId w:val="25"/>
   </w:num>
   <w:num w:numId="51" w16cid:durableId="791243524">
-    <w:abstractNumId w:val="48"/>
+    <w:abstractNumId w:val="49"/>
+  </w:num>
+  <w:num w:numId="52" w16cid:durableId="1533764241">
+    <w:abstractNumId w:val="4"/>
   </w:num>
   <w:numIdMacAtCleanup w:val="44"/>
 </w:numbering>

</xml_diff>

<commit_message>
Added chain for 3.1-3.2-3.3 about README in high-level checklist - if README does not exists, then 3.2 & 3.3's status will be N/A.
</commit_message>
<xml_diff>
--- a/res/template_high.docx
+++ b/res/template_high.docx
@@ -100,6 +100,7 @@
               </w:rPr>
               <w:t xml:space="preserve">Ticket number: {{ </w:t>
             </w:r>
+            <w:proofErr w:type="spellStart"/>
             <w:r>
               <w:t>project_info</w:t>
             </w:r>
@@ -112,6 +113,7 @@
             <w:r>
               <w:t>ticket_number</w:t>
             </w:r>
+            <w:proofErr w:type="spellEnd"/>
             <w:r>
               <w:rPr>
                 <w:rFonts w:hint="eastAsia"/>
@@ -141,6 +143,7 @@
               </w:rPr>
               <w:t xml:space="preserve"> {{ </w:t>
             </w:r>
+            <w:proofErr w:type="spellStart"/>
             <w:r>
               <w:t>project_info</w:t>
             </w:r>
@@ -148,7 +151,14 @@
               <w:rPr>
                 <w:rFonts w:hint="eastAsia"/>
               </w:rPr>
-              <w:t>.curator_name }}</w:t>
+              <w:t>.curator_name</w:t>
+            </w:r>
+            <w:proofErr w:type="spellEnd"/>
+            <w:r>
+              <w:rPr>
+                <w:rFonts w:hint="eastAsia"/>
+              </w:rPr>
+              <w:t xml:space="preserve"> }}</w:t>
             </w:r>
           </w:p>
           <w:p>
@@ -161,6 +171,7 @@
               </w:rPr>
               <w:t xml:space="preserve">Curator email: {{ </w:t>
             </w:r>
+            <w:proofErr w:type="spellStart"/>
             <w:r>
               <w:t>project_info</w:t>
             </w:r>
@@ -173,6 +184,7 @@
             <w:r>
               <w:t>curator_email</w:t>
             </w:r>
+            <w:proofErr w:type="spellEnd"/>
             <w:r>
               <w:rPr>
                 <w:rFonts w:hint="eastAsia"/>
@@ -188,11 +200,19 @@
               <w:rPr>
                 <w:rFonts w:hint="eastAsia"/>
               </w:rPr>
-              <w:t>Dataset title: {{ dataset.</w:t>
+              <w:t xml:space="preserve">Dataset title: {{ </w:t>
+            </w:r>
+            <w:proofErr w:type="spellStart"/>
+            <w:r>
+              <w:rPr>
+                <w:rFonts w:hint="eastAsia"/>
+              </w:rPr>
+              <w:t>dataset.</w:t>
             </w:r>
             <w:r>
               <w:t>DatasetTitle</w:t>
             </w:r>
+            <w:proofErr w:type="spellEnd"/>
             <w:r>
               <w:rPr>
                 <w:rFonts w:hint="eastAsia"/>
@@ -217,11 +237,19 @@
               <w:rPr>
                 <w:rFonts w:hint="eastAsia"/>
               </w:rPr>
-              <w:t xml:space="preserve"> identifier: {{ dataset.</w:t>
+              <w:t xml:space="preserve"> identifier: {{ </w:t>
+            </w:r>
+            <w:proofErr w:type="spellStart"/>
+            <w:r>
+              <w:rPr>
+                <w:rFonts w:hint="eastAsia"/>
+              </w:rPr>
+              <w:t>dataset.</w:t>
             </w:r>
             <w:r>
               <w:t>DatasetPersistentId</w:t>
             </w:r>
+            <w:proofErr w:type="spellEnd"/>
             <w:r>
               <w:rPr>
                 <w:rFonts w:hint="eastAsia"/>
@@ -248,11 +276,19 @@
               <w:rPr>
                 <w:rFonts w:hint="eastAsia"/>
               </w:rPr>
-              <w:t>Dataset access URL: {{ dataset.</w:t>
+              <w:t xml:space="preserve">Dataset access URL: {{ </w:t>
+            </w:r>
+            <w:proofErr w:type="spellStart"/>
+            <w:r>
+              <w:rPr>
+                <w:rFonts w:hint="eastAsia"/>
+              </w:rPr>
+              <w:t>dataset.</w:t>
             </w:r>
             <w:r>
               <w:t>DatasetURL</w:t>
             </w:r>
+            <w:proofErr w:type="spellEnd"/>
             <w:r>
               <w:rPr>
                 <w:rFonts w:hint="eastAsia"/>
@@ -447,17 +483,17 @@
         <w:tblLook w:val="04A0" w:firstRow="1" w:lastRow="0" w:firstColumn="1" w:lastColumn="0" w:noHBand="0" w:noVBand="1"/>
       </w:tblPr>
       <w:tblGrid>
-        <w:gridCol w:w="491"/>
-        <w:gridCol w:w="1574"/>
-        <w:gridCol w:w="1836"/>
-        <w:gridCol w:w="3513"/>
-        <w:gridCol w:w="3053"/>
-        <w:gridCol w:w="3513"/>
-        <w:gridCol w:w="396"/>
-        <w:gridCol w:w="2319"/>
-        <w:gridCol w:w="4036"/>
-        <w:gridCol w:w="1023"/>
-        <w:gridCol w:w="597"/>
+        <w:gridCol w:w="479"/>
+        <w:gridCol w:w="1525"/>
+        <w:gridCol w:w="1777"/>
+        <w:gridCol w:w="3396"/>
+        <w:gridCol w:w="2952"/>
+        <w:gridCol w:w="3396"/>
+        <w:gridCol w:w="389"/>
+        <w:gridCol w:w="2952"/>
+        <w:gridCol w:w="3908"/>
+        <w:gridCol w:w="994"/>
+        <w:gridCol w:w="583"/>
       </w:tblGrid>
       <w:tr>
         <w:trPr>
@@ -1245,15 +1281,22 @@
               </w:rPr>
               <w:t xml:space="preserve">{{ </w:t>
             </w:r>
-            <w:r>
-              <w:t>template_dict.</w:t>
-            </w:r>
+            <w:proofErr w:type="spellStart"/>
+            <w:r>
+              <w:t>template_dict</w:t>
+            </w:r>
+            <w:proofErr w:type="spellEnd"/>
+            <w:r>
+              <w:t>.</w:t>
+            </w:r>
+            <w:proofErr w:type="spellStart"/>
             <w:r>
               <w:rPr>
                 <w:lang w:val="en-US"/>
               </w:rPr>
               <w:t>ds_tree_info.path</w:t>
             </w:r>
+            <w:proofErr w:type="spellEnd"/>
             <w:r>
               <w:t>}}</w:t>
             </w:r>
@@ -1287,27 +1330,37 @@
               </w:rPr>
               <w:t xml:space="preserve">parent </w:t>
             </w:r>
+            <w:proofErr w:type="spellStart"/>
             <w:r>
               <w:rPr>
                 <w:rFonts w:hint="eastAsia"/>
                 <w:u w:val="single"/>
                 <w:lang w:val="en-US"/>
               </w:rPr>
-              <w:t xml:space="preserve">dataverse </w:t>
-            </w:r>
-            <w:r>
-              <w:rPr>
-                <w:u w:val="single"/>
-                <w:lang w:val="en-US"/>
-              </w:rPr>
-              <w:t>collection</w:t>
-            </w:r>
+              <w:t>dataverse</w:t>
+            </w:r>
+            <w:proofErr w:type="spellEnd"/>
             <w:r>
               <w:rPr>
                 <w:rFonts w:hint="eastAsia"/>
                 <w:u w:val="single"/>
                 <w:lang w:val="en-US"/>
               </w:rPr>
+              <w:t xml:space="preserve"> </w:t>
+            </w:r>
+            <w:r>
+              <w:rPr>
+                <w:u w:val="single"/>
+                <w:lang w:val="en-US"/>
+              </w:rPr>
+              <w:t>collection</w:t>
+            </w:r>
+            <w:r>
+              <w:rPr>
+                <w:rFonts w:hint="eastAsia"/>
+                <w:u w:val="single"/>
+                <w:lang w:val="en-US"/>
+              </w:rPr>
               <w:t xml:space="preserve"> name:</w:t>
             </w:r>
             <w:r>
@@ -1323,15 +1376,18 @@
               </w:rPr>
               <w:t xml:space="preserve">{{ </w:t>
             </w:r>
+            <w:proofErr w:type="spellStart"/>
             <w:r>
               <w:t>template_dict</w:t>
             </w:r>
+            <w:proofErr w:type="spellEnd"/>
             <w:r>
               <w:rPr>
                 <w:rFonts w:hint="eastAsia"/>
               </w:rPr>
               <w:t>.</w:t>
             </w:r>
+            <w:proofErr w:type="spellStart"/>
             <w:r>
               <w:rPr>
                 <w:lang w:val="en-US"/>
@@ -1350,6 +1406,7 @@
               </w:rPr>
               <w:t>parentDataverseName</w:t>
             </w:r>
+            <w:proofErr w:type="spellEnd"/>
             <w:r>
               <w:rPr>
                 <w:rFonts w:hint="eastAsia"/>
@@ -1519,11 +1576,11 @@
               </w:numPr>
             </w:pPr>
             <w:r>
-              <w:t xml:space="preserve">Confirm whether the listed dataverse collection refers to the same </w:t>
+              <w:t xml:space="preserve">Confirm whether the listed dataverse collection refers to the </w:t>
             </w:r>
             <w:r>
               <w:lastRenderedPageBreak/>
-              <w:t>researcher/author</w:t>
+              <w:t>same researcher/author</w:t>
             </w:r>
           </w:p>
         </w:tc>
@@ -1682,18 +1739,27 @@
               </w:rPr>
               <w:t xml:space="preserve">all </w:t>
             </w:r>
+            <w:proofErr w:type="spellStart"/>
             <w:r>
               <w:rPr>
                 <w:u w:val="single"/>
                 <w:lang w:val="en-US"/>
               </w:rPr>
-              <w:t xml:space="preserve">dataverse that </w:t>
-            </w:r>
+              <w:t>dataverse</w:t>
+            </w:r>
+            <w:proofErr w:type="spellEnd"/>
             <w:r>
               <w:rPr>
                 <w:u w:val="single"/>
                 <w:lang w:val="en-US"/>
               </w:rPr>
+              <w:t xml:space="preserve"> that </w:t>
+            </w:r>
+            <w:r>
+              <w:rPr>
+                <w:u w:val="single"/>
+                <w:lang w:val="en-US"/>
+              </w:rPr>
               <w:t>contain</w:t>
             </w:r>
             <w:r>
@@ -1710,12 +1776,36 @@
               <w:br/>
             </w:r>
             <w:r>
-              <w:t xml:space="preserve">{% for item in template_dict.dv_record.comments %} </w:t>
-            </w:r>
-          </w:p>
-          <w:p>
-            <w:r>
-              <w:t>{% for author, dataverses in item.items() %} {{ author }}</w:t>
+              <w:t xml:space="preserve">{% for item in </w:t>
+            </w:r>
+            <w:proofErr w:type="spellStart"/>
+            <w:r>
+              <w:t>template_dict.dv_record.comments</w:t>
+            </w:r>
+            <w:proofErr w:type="spellEnd"/>
+            <w:r>
+              <w:t xml:space="preserve"> %} </w:t>
+            </w:r>
+          </w:p>
+          <w:p>
+            <w:r>
+              <w:t xml:space="preserve">{% for author, </w:t>
+            </w:r>
+            <w:proofErr w:type="spellStart"/>
+            <w:r>
+              <w:t>dataverses</w:t>
+            </w:r>
+            <w:proofErr w:type="spellEnd"/>
+            <w:r>
+              <w:t xml:space="preserve"> in </w:t>
+            </w:r>
+            <w:proofErr w:type="spellStart"/>
+            <w:r>
+              <w:t>item.items</w:t>
+            </w:r>
+            <w:proofErr w:type="spellEnd"/>
+            <w:r>
+              <w:t>() %} {{ author }}</w:t>
             </w:r>
             <w:r>
               <w:rPr>
@@ -1726,10 +1816,26 @@
           </w:p>
           <w:p>
             <w:r>
-              <w:t xml:space="preserve">{% for dataverse in dataverses %} </w:t>
-            </w:r>
-            <w:r>
-              <w:t>{{ loop.index }}.</w:t>
+              <w:t xml:space="preserve">{% for dataverse in </w:t>
+            </w:r>
+            <w:proofErr w:type="spellStart"/>
+            <w:r>
+              <w:t>dataverses</w:t>
+            </w:r>
+            <w:proofErr w:type="spellEnd"/>
+            <w:r>
+              <w:t xml:space="preserve"> %} </w:t>
+            </w:r>
+            <w:r>
+              <w:t xml:space="preserve">{{ </w:t>
+            </w:r>
+            <w:proofErr w:type="spellStart"/>
+            <w:r>
+              <w:t>loop.index</w:t>
+            </w:r>
+            <w:proofErr w:type="spellEnd"/>
+            <w:r>
+              <w:t xml:space="preserve"> }}.</w:t>
             </w:r>
             <w:r>
               <w:rPr>
@@ -1745,13 +1851,37 @@
             </w:r>
             <w:r>
               <w:lastRenderedPageBreak/>
-              <w:t xml:space="preserve">{% endfor %} </w:t>
+              <w:t xml:space="preserve">{% </w:t>
+            </w:r>
+            <w:proofErr w:type="spellStart"/>
+            <w:r>
+              <w:t>endfor</w:t>
+            </w:r>
+            <w:proofErr w:type="spellEnd"/>
+            <w:r>
+              <w:t xml:space="preserve"> %} </w:t>
             </w:r>
             <w:r>
               <w:br/>
             </w:r>
             <w:r>
-              <w:t>{% endfor %} {% endfor %}</w:t>
+              <w:t xml:space="preserve">{% </w:t>
+            </w:r>
+            <w:proofErr w:type="spellStart"/>
+            <w:r>
+              <w:t>endfor</w:t>
+            </w:r>
+            <w:proofErr w:type="spellEnd"/>
+            <w:r>
+              <w:t xml:space="preserve"> %} {% </w:t>
+            </w:r>
+            <w:proofErr w:type="spellStart"/>
+            <w:r>
+              <w:t>endfor</w:t>
+            </w:r>
+            <w:proofErr w:type="spellEnd"/>
+            <w:r>
+              <w:t xml:space="preserve"> %}</w:t>
             </w:r>
           </w:p>
         </w:tc>
@@ -1922,11 +2052,11 @@
               </w:numPr>
             </w:pPr>
             <w:r>
-              <w:t xml:space="preserve">Confirm with the depositor that they actually require a dataverse (e.g., </w:t>
+              <w:t xml:space="preserve">Confirm with the depositor that they actually </w:t>
             </w:r>
             <w:r>
               <w:lastRenderedPageBreak/>
-              <w:t>will there be future deposits?)</w:t>
+              <w:t>require a dataverse (e.g., will there be future deposits?)</w:t>
             </w:r>
           </w:p>
         </w:tc>
@@ -2496,33 +2626,61 @@
               <w:rPr>
                 <w:lang w:val="en-US"/>
               </w:rPr>
-              <w:t>{% if template_dict.file_ext.comments|length == 0 %}X{% endif %}</w:t>
-            </w:r>
-          </w:p>
-        </w:tc>
-        <w:tc>
-          <w:tcPr>
-            <w:tcW w:w="0" w:type="auto"/>
-            <w:tcBorders>
-              <w:top w:val="single" w:sz="8" w:space="0" w:color="000000"/>
-              <w:left w:val="single" w:sz="8" w:space="0" w:color="000000"/>
-              <w:bottom w:val="single" w:sz="8" w:space="0" w:color="000000"/>
-              <w:right w:val="single" w:sz="8" w:space="0" w:color="000000"/>
-            </w:tcBorders>
-            <w:tcMar>
-              <w:top w:w="100" w:type="dxa"/>
-              <w:left w:w="100" w:type="dxa"/>
-              <w:bottom w:w="100" w:type="dxa"/>
-              <w:right w:w="100" w:type="dxa"/>
-            </w:tcMar>
-            <w:hideMark/>
-          </w:tcPr>
-          <w:p>
-            <w:r>
-              <w:rPr>
-                <w:lang w:val="en-US"/>
-              </w:rPr>
-              <w:t>{% if template_dict.file_ext.comments|length &gt; 0 %}X{% endif %}</w:t>
+              <w:t xml:space="preserve">{% if </w:t>
+            </w:r>
+            <w:proofErr w:type="spellStart"/>
+            <w:r>
+              <w:rPr>
+                <w:lang w:val="en-US"/>
+              </w:rPr>
+              <w:t>template_dict.file_ext.comments|length</w:t>
+            </w:r>
+            <w:proofErr w:type="spellEnd"/>
+            <w:r>
+              <w:rPr>
+                <w:lang w:val="en-US"/>
+              </w:rPr>
+              <w:t xml:space="preserve"> == 0 %}X{% endif %}</w:t>
+            </w:r>
+          </w:p>
+        </w:tc>
+        <w:tc>
+          <w:tcPr>
+            <w:tcW w:w="0" w:type="auto"/>
+            <w:tcBorders>
+              <w:top w:val="single" w:sz="8" w:space="0" w:color="000000"/>
+              <w:left w:val="single" w:sz="8" w:space="0" w:color="000000"/>
+              <w:bottom w:val="single" w:sz="8" w:space="0" w:color="000000"/>
+              <w:right w:val="single" w:sz="8" w:space="0" w:color="000000"/>
+            </w:tcBorders>
+            <w:tcMar>
+              <w:top w:w="100" w:type="dxa"/>
+              <w:left w:w="100" w:type="dxa"/>
+              <w:bottom w:w="100" w:type="dxa"/>
+              <w:right w:w="100" w:type="dxa"/>
+            </w:tcMar>
+            <w:hideMark/>
+          </w:tcPr>
+          <w:p>
+            <w:r>
+              <w:rPr>
+                <w:lang w:val="en-US"/>
+              </w:rPr>
+              <w:t xml:space="preserve">{% if </w:t>
+            </w:r>
+            <w:proofErr w:type="spellStart"/>
+            <w:r>
+              <w:rPr>
+                <w:lang w:val="en-US"/>
+              </w:rPr>
+              <w:t>template_dict.file_ext.comments|length</w:t>
+            </w:r>
+            <w:proofErr w:type="spellEnd"/>
+            <w:r>
+              <w:rPr>
+                <w:lang w:val="en-US"/>
+              </w:rPr>
+              <w:t xml:space="preserve"> &gt; 0 %}X{% endif %}</w:t>
             </w:r>
           </w:p>
         </w:tc>
@@ -2621,12 +2779,14 @@
             <w:r>
               <w:t xml:space="preserve">{% if </w:t>
             </w:r>
+            <w:proofErr w:type="spellStart"/>
             <w:r>
               <w:rPr>
                 <w:lang w:val="en-US"/>
               </w:rPr>
               <w:t>template_dict.file_open.comments</w:t>
             </w:r>
+            <w:proofErr w:type="spellEnd"/>
             <w:r>
               <w:t xml:space="preserve"> |length &gt; 0</w:t>
             </w:r>
@@ -2637,7 +2797,21 @@
               <w:rPr>
                 <w:lang w:val="en-US"/>
               </w:rPr>
-              <w:t>{% for item in template_dict.file_open.comments %}</w:t>
+              <w:t xml:space="preserve">{% for item in </w:t>
+            </w:r>
+            <w:proofErr w:type="spellStart"/>
+            <w:r>
+              <w:rPr>
+                <w:lang w:val="en-US"/>
+              </w:rPr>
+              <w:t>template_dict.file_open.comments</w:t>
+            </w:r>
+            <w:proofErr w:type="spellEnd"/>
+            <w:r>
+              <w:rPr>
+                <w:lang w:val="en-US"/>
+              </w:rPr>
+              <w:t xml:space="preserve"> %}</w:t>
             </w:r>
           </w:p>
           <w:p>
@@ -2655,7 +2829,35 @@
               <w:rPr>
                 <w:lang w:val="en-US"/>
               </w:rPr>
-              <w:t>{{ item.file_name }}{% endfor %}</w:t>
+              <w:t xml:space="preserve">{{ </w:t>
+            </w:r>
+            <w:proofErr w:type="spellStart"/>
+            <w:r>
+              <w:rPr>
+                <w:lang w:val="en-US"/>
+              </w:rPr>
+              <w:t>item.file_name</w:t>
+            </w:r>
+            <w:proofErr w:type="spellEnd"/>
+            <w:r>
+              <w:rPr>
+                <w:lang w:val="en-US"/>
+              </w:rPr>
+              <w:t xml:space="preserve"> }}{% </w:t>
+            </w:r>
+            <w:proofErr w:type="spellStart"/>
+            <w:r>
+              <w:rPr>
+                <w:lang w:val="en-US"/>
+              </w:rPr>
+              <w:t>endfor</w:t>
+            </w:r>
+            <w:proofErr w:type="spellEnd"/>
+            <w:r>
+              <w:rPr>
+                <w:lang w:val="en-US"/>
+              </w:rPr>
+              <w:t xml:space="preserve"> %}</w:t>
             </w:r>
           </w:p>
           <w:p>
@@ -2690,12 +2892,14 @@
             <w:r>
               <w:t xml:space="preserve">{% if </w:t>
             </w:r>
+            <w:proofErr w:type="spellStart"/>
             <w:r>
               <w:rPr>
                 <w:lang w:val="en-US"/>
               </w:rPr>
               <w:t>template_dict.file_open.not_checked</w:t>
             </w:r>
+            <w:proofErr w:type="spellEnd"/>
             <w:r>
               <w:t xml:space="preserve"> |length &gt; 0</w:t>
             </w:r>
@@ -2706,7 +2910,21 @@
               <w:rPr>
                 <w:lang w:val="en-US"/>
               </w:rPr>
-              <w:t>{% for item in template_dict.file_open.not_checked %}</w:t>
+              <w:t xml:space="preserve">{% for item in </w:t>
+            </w:r>
+            <w:proofErr w:type="spellStart"/>
+            <w:r>
+              <w:rPr>
+                <w:lang w:val="en-US"/>
+              </w:rPr>
+              <w:t>template_dict.file_open.not_checked</w:t>
+            </w:r>
+            <w:proofErr w:type="spellEnd"/>
+            <w:r>
+              <w:rPr>
+                <w:lang w:val="en-US"/>
+              </w:rPr>
+              <w:t xml:space="preserve"> %}</w:t>
             </w:r>
           </w:p>
           <w:p>
@@ -2724,7 +2942,35 @@
               <w:rPr>
                 <w:lang w:val="en-US"/>
               </w:rPr>
-              <w:t>{{ item.file_name }}{% endfor %}</w:t>
+              <w:t xml:space="preserve">{{ </w:t>
+            </w:r>
+            <w:proofErr w:type="spellStart"/>
+            <w:r>
+              <w:rPr>
+                <w:lang w:val="en-US"/>
+              </w:rPr>
+              <w:t>item.file_name</w:t>
+            </w:r>
+            <w:proofErr w:type="spellEnd"/>
+            <w:r>
+              <w:rPr>
+                <w:lang w:val="en-US"/>
+              </w:rPr>
+              <w:t xml:space="preserve"> }}{% </w:t>
+            </w:r>
+            <w:proofErr w:type="spellStart"/>
+            <w:r>
+              <w:rPr>
+                <w:lang w:val="en-US"/>
+              </w:rPr>
+              <w:t>endfor</w:t>
+            </w:r>
+            <w:proofErr w:type="spellEnd"/>
+            <w:r>
+              <w:rPr>
+                <w:lang w:val="en-US"/>
+              </w:rPr>
+              <w:t xml:space="preserve"> %}</w:t>
             </w:r>
           </w:p>
           <w:p>
@@ -2907,7 +3153,21 @@
               <w:rPr>
                 <w:lang w:val="en-US"/>
               </w:rPr>
-              <w:t>{% if template_dict.special_characters.comments|length == 0 %}X{% endif %}</w:t>
+              <w:t xml:space="preserve">{% if </w:t>
+            </w:r>
+            <w:proofErr w:type="spellStart"/>
+            <w:r>
+              <w:rPr>
+                <w:lang w:val="en-US"/>
+              </w:rPr>
+              <w:t>template_dict.special_characters.comments|length</w:t>
+            </w:r>
+            <w:proofErr w:type="spellEnd"/>
+            <w:r>
+              <w:rPr>
+                <w:lang w:val="en-US"/>
+              </w:rPr>
+              <w:t xml:space="preserve"> == 0 %}X{% endif %}</w:t>
             </w:r>
           </w:p>
         </w:tc>
@@ -2954,7 +3214,21 @@
               <w:rPr>
                 <w:lang w:val="en-US"/>
               </w:rPr>
-              <w:t>{% if template_dict.special_characters.comments|length &gt; 0 %}X{% endif %}</w:t>
+              <w:t xml:space="preserve">{% if </w:t>
+            </w:r>
+            <w:proofErr w:type="spellStart"/>
+            <w:r>
+              <w:rPr>
+                <w:lang w:val="en-US"/>
+              </w:rPr>
+              <w:t>template_dict.special_characters.comments|length</w:t>
+            </w:r>
+            <w:proofErr w:type="spellEnd"/>
+            <w:r>
+              <w:rPr>
+                <w:lang w:val="en-US"/>
+              </w:rPr>
+              <w:t xml:space="preserve"> &gt; 0 %}X{% endif %}</w:t>
             </w:r>
           </w:p>
         </w:tc>
@@ -3035,7 +3309,11 @@
               <w:br/>
             </w:r>
             <w:r>
-              <w:t>{% if template_dict.restricted_files.comment</w:t>
+              <w:t xml:space="preserve">{% if </w:t>
+            </w:r>
+            <w:proofErr w:type="spellStart"/>
+            <w:r>
+              <w:t>template_dict.restricted_files.comment</w:t>
             </w:r>
             <w:r>
               <w:rPr>
@@ -3044,7 +3322,11 @@
               <w:t>s</w:t>
             </w:r>
             <w:r>
-              <w:t>|length &gt; 0</w:t>
+              <w:t>|length</w:t>
+            </w:r>
+            <w:proofErr w:type="spellEnd"/>
+            <w:r>
+              <w:t xml:space="preserve"> &gt; 0</w:t>
             </w:r>
             <w:r>
               <w:t xml:space="preserve"> %}</w:t>
@@ -3053,7 +3335,21 @@
               <w:rPr>
                 <w:lang w:val="en-US"/>
               </w:rPr>
-              <w:t>{% for item in template_dict.special_characters.comments %}</w:t>
+              <w:t xml:space="preserve">{% for item in </w:t>
+            </w:r>
+            <w:proofErr w:type="spellStart"/>
+            <w:r>
+              <w:rPr>
+                <w:lang w:val="en-US"/>
+              </w:rPr>
+              <w:t>template_dict.special_characters.comments</w:t>
+            </w:r>
+            <w:proofErr w:type="spellEnd"/>
+            <w:r>
+              <w:rPr>
+                <w:lang w:val="en-US"/>
+              </w:rPr>
+              <w:t xml:space="preserve"> %}</w:t>
             </w:r>
           </w:p>
           <w:p>
@@ -3068,7 +3364,35 @@
               <w:rPr>
                 <w:lang w:val="en-US"/>
               </w:rPr>
-              <w:t>{{ item.file_name }}{% endfor %}</w:t>
+              <w:t xml:space="preserve">{{ </w:t>
+            </w:r>
+            <w:proofErr w:type="spellStart"/>
+            <w:r>
+              <w:rPr>
+                <w:lang w:val="en-US"/>
+              </w:rPr>
+              <w:t>item.file_name</w:t>
+            </w:r>
+            <w:proofErr w:type="spellEnd"/>
+            <w:r>
+              <w:rPr>
+                <w:lang w:val="en-US"/>
+              </w:rPr>
+              <w:t xml:space="preserve"> }}{% </w:t>
+            </w:r>
+            <w:proofErr w:type="spellStart"/>
+            <w:r>
+              <w:rPr>
+                <w:lang w:val="en-US"/>
+              </w:rPr>
+              <w:t>endfor</w:t>
+            </w:r>
+            <w:proofErr w:type="spellEnd"/>
+            <w:r>
+              <w:rPr>
+                <w:lang w:val="en-US"/>
+              </w:rPr>
+              <w:t xml:space="preserve"> %}</w:t>
             </w:r>
           </w:p>
           <w:p>
@@ -3147,6 +3471,7 @@
                 <w:b/>
                 <w:bCs/>
               </w:rPr>
+              <w:lastRenderedPageBreak/>
               <w:t>2.3</w:t>
             </w:r>
           </w:p>
@@ -3210,11 +3535,7 @@
               </w:numPr>
             </w:pPr>
             <w:r>
-              <w:t>Not all the files require a file extensio</w:t>
-            </w:r>
-            <w:r>
-              <w:lastRenderedPageBreak/>
-              <w:t>n (e.g. a README file can either be ‘README’ or ‘README.md’). Curator needs to check on a case-by-case basis.</w:t>
+              <w:t>Not all the files require a file extension (e.g. a README file can either be ‘README’ or ‘README.md’). Curator needs to check on a case-by-case basis.</w:t>
             </w:r>
           </w:p>
         </w:tc>
@@ -3241,8 +3562,14 @@
               <w:rPr>
                 <w:lang w:val="en-US"/>
               </w:rPr>
-              <w:lastRenderedPageBreak/>
-              <w:t>{% if template_dict.</w:t>
+              <w:t xml:space="preserve">{% if </w:t>
+            </w:r>
+            <w:proofErr w:type="spellStart"/>
+            <w:r>
+              <w:rPr>
+                <w:lang w:val="en-US"/>
+              </w:rPr>
+              <w:t>template_dict.</w:t>
             </w:r>
             <w:r>
               <w:rPr>
@@ -3255,7 +3582,14 @@
               <w:rPr>
                 <w:lang w:val="en-US"/>
               </w:rPr>
-              <w:t xml:space="preserve">.comments|length </w:t>
+              <w:t>.comments|length</w:t>
+            </w:r>
+            <w:proofErr w:type="spellEnd"/>
+            <w:r>
+              <w:rPr>
+                <w:lang w:val="en-US"/>
+              </w:rPr>
+              <w:t xml:space="preserve"> </w:t>
             </w:r>
             <w:r>
               <w:rPr>
@@ -3295,7 +3629,21 @@
               <w:rPr>
                 <w:lang w:val="en-US"/>
               </w:rPr>
-              <w:t>{% if template_dict.file_ext.comments|length &gt; 0 %}X{% endif %}</w:t>
+              <w:t xml:space="preserve">{% if </w:t>
+            </w:r>
+            <w:proofErr w:type="spellStart"/>
+            <w:r>
+              <w:rPr>
+                <w:lang w:val="en-US"/>
+              </w:rPr>
+              <w:t>template_dict.file_ext.comments|length</w:t>
+            </w:r>
+            <w:proofErr w:type="spellEnd"/>
+            <w:r>
+              <w:rPr>
+                <w:lang w:val="en-US"/>
+              </w:rPr>
+              <w:t xml:space="preserve"> &gt; 0 %}X{% endif %}</w:t>
             </w:r>
           </w:p>
         </w:tc>
@@ -3399,12 +3747,14 @@
             <w:r>
               <w:t xml:space="preserve">{% if </w:t>
             </w:r>
+            <w:proofErr w:type="spellStart"/>
             <w:r>
               <w:rPr>
                 <w:lang w:val="en-US"/>
               </w:rPr>
               <w:t>template_dict.file_ext.comments</w:t>
             </w:r>
+            <w:proofErr w:type="spellEnd"/>
             <w:r>
               <w:t xml:space="preserve"> |length &gt; 0</w:t>
             </w:r>
@@ -3415,7 +3765,21 @@
               <w:rPr>
                 <w:lang w:val="en-US"/>
               </w:rPr>
-              <w:t>{% for item in template_dict.file_ext.comments %}</w:t>
+              <w:t xml:space="preserve">{% for item in </w:t>
+            </w:r>
+            <w:proofErr w:type="spellStart"/>
+            <w:r>
+              <w:rPr>
+                <w:lang w:val="en-US"/>
+              </w:rPr>
+              <w:t>template_dict.file_ext.comments</w:t>
+            </w:r>
+            <w:proofErr w:type="spellEnd"/>
+            <w:r>
+              <w:rPr>
+                <w:lang w:val="en-US"/>
+              </w:rPr>
+              <w:t xml:space="preserve"> %}</w:t>
             </w:r>
           </w:p>
           <w:p>
@@ -3431,8 +3795,35 @@
               <w:rPr>
                 <w:lang w:val="en-US"/>
               </w:rPr>
-              <w:lastRenderedPageBreak/>
-              <w:t>{{ item.file_name }}{% endfor %}</w:t>
+              <w:t xml:space="preserve">{{ </w:t>
+            </w:r>
+            <w:proofErr w:type="spellStart"/>
+            <w:r>
+              <w:rPr>
+                <w:lang w:val="en-US"/>
+              </w:rPr>
+              <w:t>item.file_name</w:t>
+            </w:r>
+            <w:proofErr w:type="spellEnd"/>
+            <w:r>
+              <w:rPr>
+                <w:lang w:val="en-US"/>
+              </w:rPr>
+              <w:t xml:space="preserve"> }}{% </w:t>
+            </w:r>
+            <w:proofErr w:type="spellStart"/>
+            <w:r>
+              <w:rPr>
+                <w:lang w:val="en-US"/>
+              </w:rPr>
+              <w:t>endfor</w:t>
+            </w:r>
+            <w:proofErr w:type="spellEnd"/>
+            <w:r>
+              <w:rPr>
+                <w:lang w:val="en-US"/>
+              </w:rPr>
+              <w:t xml:space="preserve"> %}</w:t>
             </w:r>
           </w:p>
           <w:p>
@@ -3464,7 +3855,6 @@
           </w:tcPr>
           <w:p>
             <w:r>
-              <w:lastRenderedPageBreak/>
               <w:t>Require</w:t>
             </w:r>
           </w:p>
@@ -3716,6 +4106,7 @@
             <w:r>
               <w:t xml:space="preserve">{% if </w:t>
             </w:r>
+            <w:proofErr w:type="spellStart"/>
             <w:r>
               <w:rPr>
                 <w:lang w:val="en-US"/>
@@ -3734,6 +4125,7 @@
               </w:rPr>
               <w:t>.comments</w:t>
             </w:r>
+            <w:proofErr w:type="spellEnd"/>
             <w:r>
               <w:t>|length &gt; 0</w:t>
             </w:r>
@@ -3744,7 +4136,14 @@
               <w:rPr>
                 <w:lang w:val="en-US"/>
               </w:rPr>
-              <w:t>{% for item in template_dict.</w:t>
+              <w:t xml:space="preserve">{% for item in </w:t>
+            </w:r>
+            <w:proofErr w:type="spellStart"/>
+            <w:r>
+              <w:rPr>
+                <w:lang w:val="en-US"/>
+              </w:rPr>
+              <w:t>template_dict.</w:t>
             </w:r>
             <w:r>
               <w:rPr>
@@ -3756,7 +4155,14 @@
               <w:rPr>
                 <w:lang w:val="en-US"/>
               </w:rPr>
-              <w:t>.comments %}</w:t>
+              <w:t>.comments</w:t>
+            </w:r>
+            <w:proofErr w:type="spellEnd"/>
+            <w:r>
+              <w:rPr>
+                <w:lang w:val="en-US"/>
+              </w:rPr>
+              <w:t xml:space="preserve"> %}</w:t>
             </w:r>
           </w:p>
           <w:p>
@@ -3770,7 +4176,21 @@
               <w:rPr>
                 <w:lang w:val="en-US"/>
               </w:rPr>
-              <w:t>{{ item.file_name }}</w:t>
+              <w:t xml:space="preserve">{{ </w:t>
+            </w:r>
+            <w:proofErr w:type="spellStart"/>
+            <w:r>
+              <w:rPr>
+                <w:lang w:val="en-US"/>
+              </w:rPr>
+              <w:t>item.file_name</w:t>
+            </w:r>
+            <w:proofErr w:type="spellEnd"/>
+            <w:r>
+              <w:rPr>
+                <w:lang w:val="en-US"/>
+              </w:rPr>
+              <w:t xml:space="preserve"> }}</w:t>
             </w:r>
             <w:r>
               <w:rPr>
@@ -3779,11 +4199,19 @@
               </w:rPr>
               <w:t xml:space="preserve">{% </w:t>
             </w:r>
-            <w:r>
-              <w:rPr>
-                <w:lang w:val="en-US"/>
-              </w:rPr>
-              <w:t>endfor %}</w:t>
+            <w:proofErr w:type="spellStart"/>
+            <w:r>
+              <w:rPr>
+                <w:lang w:val="en-US"/>
+              </w:rPr>
+              <w:t>endfor</w:t>
+            </w:r>
+            <w:proofErr w:type="spellEnd"/>
+            <w:r>
+              <w:rPr>
+                <w:lang w:val="en-US"/>
+              </w:rPr>
+              <w:t xml:space="preserve"> %}</w:t>
             </w:r>
           </w:p>
           <w:p>
@@ -3920,7 +4348,11 @@
               </w:numPr>
             </w:pPr>
             <w:r>
-              <w:t>Review documentation files (e.g., README, other relevant files based on name) to determine if there is information about uncommon file types. </w:t>
+              <w:t xml:space="preserve">Review documentation files (e.g., README, other relevant files based on name) to </w:t>
+            </w:r>
+            <w:r>
+              <w:lastRenderedPageBreak/>
+              <w:t>determine if there is information about uncommon file types. </w:t>
             </w:r>
           </w:p>
         </w:tc>
@@ -4159,7 +4591,6 @@
                 <w:b/>
                 <w:bCs/>
               </w:rPr>
-              <w:lastRenderedPageBreak/>
               <w:t>3.0</w:t>
             </w:r>
           </w:p>
@@ -4510,7 +4941,21 @@
               <w:rPr>
                 <w:lang w:val="en-US"/>
               </w:rPr>
-              <w:t>Read the `ds_tree.txt` file in the log_files folder to identify whether there is a README file</w:t>
+              <w:t xml:space="preserve">Read the `ds_tree.txt` file in the </w:t>
+            </w:r>
+            <w:proofErr w:type="spellStart"/>
+            <w:r>
+              <w:rPr>
+                <w:lang w:val="en-US"/>
+              </w:rPr>
+              <w:t>log_files</w:t>
+            </w:r>
+            <w:proofErr w:type="spellEnd"/>
+            <w:r>
+              <w:rPr>
+                <w:lang w:val="en-US"/>
+              </w:rPr>
+              <w:t xml:space="preserve"> folder to identify whether there is a README file</w:t>
             </w:r>
             <w:r>
               <w:rPr>
@@ -4568,7 +5013,21 @@
               <w:rPr>
                 <w:lang w:val="en-US"/>
               </w:rPr>
-              <w:t>{% if template_dict.readme_file.comments|length &gt; 0 %}X{% endif %}</w:t>
+              <w:t xml:space="preserve">{% if </w:t>
+            </w:r>
+            <w:proofErr w:type="spellStart"/>
+            <w:r>
+              <w:rPr>
+                <w:lang w:val="en-US"/>
+              </w:rPr>
+              <w:t>template_dict.readme_file.comments|length</w:t>
+            </w:r>
+            <w:proofErr w:type="spellEnd"/>
+            <w:r>
+              <w:rPr>
+                <w:lang w:val="en-US"/>
+              </w:rPr>
+              <w:t xml:space="preserve"> &gt; 0 %}X{% endif %}</w:t>
             </w:r>
           </w:p>
         </w:tc>
@@ -4600,7 +5059,21 @@
               <w:rPr>
                 <w:lang w:val="en-US"/>
               </w:rPr>
-              <w:t>{% if template_dict.readme_file.comments|length == 0 %}X{% endif %}</w:t>
+              <w:t xml:space="preserve">{% if </w:t>
+            </w:r>
+            <w:proofErr w:type="spellStart"/>
+            <w:r>
+              <w:rPr>
+                <w:lang w:val="en-US"/>
+              </w:rPr>
+              <w:t>template_dict.readme_file.comments|length</w:t>
+            </w:r>
+            <w:proofErr w:type="spellEnd"/>
+            <w:r>
+              <w:rPr>
+                <w:lang w:val="en-US"/>
+              </w:rPr>
+              <w:t xml:space="preserve"> == 0 %}X{% endif %}</w:t>
             </w:r>
           </w:p>
           <w:p/>
@@ -4705,12 +5178,14 @@
             <w:r>
               <w:t xml:space="preserve">{% if </w:t>
             </w:r>
+            <w:proofErr w:type="spellStart"/>
             <w:r>
               <w:rPr>
                 <w:lang w:val="en-US"/>
               </w:rPr>
               <w:t>template_dict.readme_file.comments</w:t>
             </w:r>
+            <w:proofErr w:type="spellEnd"/>
             <w:r>
               <w:t xml:space="preserve"> |length &gt; 0</w:t>
             </w:r>
@@ -4721,7 +5196,63 @@
               <w:rPr>
                 <w:lang w:val="en-US"/>
               </w:rPr>
-              <w:t>{% for item in template_dict.readme_file.comments %}{{ loop.index }}. {{ item.file_name }}{% endfor %}</w:t>
+              <w:t xml:space="preserve">{% for item in </w:t>
+            </w:r>
+            <w:proofErr w:type="spellStart"/>
+            <w:r>
+              <w:rPr>
+                <w:lang w:val="en-US"/>
+              </w:rPr>
+              <w:t>template_dict.readme_file.comments</w:t>
+            </w:r>
+            <w:proofErr w:type="spellEnd"/>
+            <w:r>
+              <w:rPr>
+                <w:lang w:val="en-US"/>
+              </w:rPr>
+              <w:t xml:space="preserve"> %}{{ </w:t>
+            </w:r>
+            <w:proofErr w:type="spellStart"/>
+            <w:r>
+              <w:rPr>
+                <w:lang w:val="en-US"/>
+              </w:rPr>
+              <w:t>loop.index</w:t>
+            </w:r>
+            <w:proofErr w:type="spellEnd"/>
+            <w:r>
+              <w:rPr>
+                <w:lang w:val="en-US"/>
+              </w:rPr>
+              <w:t xml:space="preserve"> }}. {{ </w:t>
+            </w:r>
+            <w:proofErr w:type="spellStart"/>
+            <w:r>
+              <w:rPr>
+                <w:lang w:val="en-US"/>
+              </w:rPr>
+              <w:t>item.file_name</w:t>
+            </w:r>
+            <w:proofErr w:type="spellEnd"/>
+            <w:r>
+              <w:rPr>
+                <w:lang w:val="en-US"/>
+              </w:rPr>
+              <w:t xml:space="preserve"> }}{% </w:t>
+            </w:r>
+            <w:proofErr w:type="spellStart"/>
+            <w:r>
+              <w:rPr>
+                <w:lang w:val="en-US"/>
+              </w:rPr>
+              <w:t>endfor</w:t>
+            </w:r>
+            <w:proofErr w:type="spellEnd"/>
+            <w:r>
+              <w:rPr>
+                <w:lang w:val="en-US"/>
+              </w:rPr>
+              <w:t xml:space="preserve"> %}</w:t>
             </w:r>
           </w:p>
           <w:p>
@@ -4963,7 +5494,40 @@
             </w:tcMar>
             <w:hideMark/>
           </w:tcPr>
-          <w:p/>
+          <w:p>
+            <w:pPr>
+              <w:rPr>
+                <w:lang w:val="en-US"/>
+              </w:rPr>
+            </w:pPr>
+            <w:r>
+              <w:rPr>
+                <w:lang w:val="en-US"/>
+              </w:rPr>
+              <w:t xml:space="preserve">{% if </w:t>
+            </w:r>
+            <w:proofErr w:type="spellStart"/>
+            <w:r>
+              <w:rPr>
+                <w:lang w:val="en-US"/>
+              </w:rPr>
+              <w:t>template_dict.readme_file.comments|length</w:t>
+            </w:r>
+            <w:proofErr w:type="spellEnd"/>
+            <w:r>
+              <w:rPr>
+                <w:lang w:val="en-US"/>
+              </w:rPr>
+              <w:t xml:space="preserve"> == 0 %}X{% endif %}</w:t>
+            </w:r>
+          </w:p>
+          <w:p>
+            <w:pPr>
+              <w:rPr>
+                <w:lang w:val="en-US"/>
+              </w:rPr>
+            </w:pPr>
+          </w:p>
         </w:tc>
         <w:tc>
           <w:tcPr>
@@ -5002,6 +5566,20 @@
                 <w:numId w:val="13"/>
               </w:numPr>
             </w:pPr>
+            <w:r>
+              <w:t xml:space="preserve">{% if </w:t>
+            </w:r>
+            <w:proofErr w:type="spellStart"/>
+            <w:r>
+              <w:t>template_dict.readme_file.comments|length</w:t>
+            </w:r>
+            <w:proofErr w:type="spellEnd"/>
+            <w:r>
+              <w:t xml:space="preserve"> == 0 %}(NO README FILE FOUND){% endif %</w:t>
+            </w:r>
+            <w:r>
+              <w:t>}</w:t>
+            </w:r>
           </w:p>
         </w:tc>
         <w:tc>
@@ -5197,6 +5775,33 @@
             </w:tcMar>
             <w:hideMark/>
           </w:tcPr>
+          <w:p>
+            <w:pPr>
+              <w:rPr>
+                <w:lang w:val="en-US"/>
+              </w:rPr>
+            </w:pPr>
+            <w:r>
+              <w:rPr>
+                <w:lang w:val="en-US"/>
+              </w:rPr>
+              <w:t xml:space="preserve">{% if </w:t>
+            </w:r>
+            <w:proofErr w:type="spellStart"/>
+            <w:r>
+              <w:rPr>
+                <w:lang w:val="en-US"/>
+              </w:rPr>
+              <w:t>template_dict.readme_file.comments|length</w:t>
+            </w:r>
+            <w:proofErr w:type="spellEnd"/>
+            <w:r>
+              <w:rPr>
+                <w:lang w:val="en-US"/>
+              </w:rPr>
+              <w:t xml:space="preserve"> == 0 %}X{% endif %}</w:t>
+            </w:r>
+          </w:p>
           <w:p/>
         </w:tc>
         <w:tc>
@@ -5236,27 +5841,46 @@
                 <w:numId w:val="14"/>
               </w:numPr>
             </w:pPr>
-          </w:p>
-        </w:tc>
-        <w:tc>
-          <w:tcPr>
-            <w:tcW w:w="0" w:type="auto"/>
-            <w:tcBorders>
-              <w:top w:val="single" w:sz="8" w:space="0" w:color="000000"/>
-              <w:left w:val="single" w:sz="8" w:space="0" w:color="000000"/>
-              <w:bottom w:val="single" w:sz="8" w:space="0" w:color="000000"/>
-              <w:right w:val="single" w:sz="8" w:space="0" w:color="000000"/>
-            </w:tcBorders>
-            <w:tcMar>
-              <w:top w:w="100" w:type="dxa"/>
-              <w:left w:w="100" w:type="dxa"/>
-              <w:bottom w:w="100" w:type="dxa"/>
-              <w:right w:w="100" w:type="dxa"/>
-            </w:tcMar>
-            <w:hideMark/>
-          </w:tcPr>
-          <w:p>
-            <w:r>
+            <w:r>
+              <w:t xml:space="preserve">{% if </w:t>
+            </w:r>
+            <w:proofErr w:type="spellStart"/>
+            <w:r>
+              <w:t>template_dict.readme_file.comments|length</w:t>
+            </w:r>
+            <w:proofErr w:type="spellEnd"/>
+            <w:r>
+              <w:t xml:space="preserve"> == 0 %}(NO </w:t>
+            </w:r>
+            <w:r>
+              <w:lastRenderedPageBreak/>
+              <w:t>README FILE FOUND){% endif %</w:t>
+            </w:r>
+            <w:r>
+              <w:t>}</w:t>
+            </w:r>
+          </w:p>
+        </w:tc>
+        <w:tc>
+          <w:tcPr>
+            <w:tcW w:w="0" w:type="auto"/>
+            <w:tcBorders>
+              <w:top w:val="single" w:sz="8" w:space="0" w:color="000000"/>
+              <w:left w:val="single" w:sz="8" w:space="0" w:color="000000"/>
+              <w:bottom w:val="single" w:sz="8" w:space="0" w:color="000000"/>
+              <w:right w:val="single" w:sz="8" w:space="0" w:color="000000"/>
+            </w:tcBorders>
+            <w:tcMar>
+              <w:top w:w="100" w:type="dxa"/>
+              <w:left w:w="100" w:type="dxa"/>
+              <w:bottom w:w="100" w:type="dxa"/>
+              <w:right w:w="100" w:type="dxa"/>
+            </w:tcMar>
+            <w:hideMark/>
+          </w:tcPr>
+          <w:p>
+            <w:r>
+              <w:lastRenderedPageBreak/>
               <w:t>Require</w:t>
             </w:r>
           </w:p>
@@ -5431,6 +6055,33 @@
             </w:tcMar>
             <w:hideMark/>
           </w:tcPr>
+          <w:p>
+            <w:pPr>
+              <w:rPr>
+                <w:lang w:val="en-US"/>
+              </w:rPr>
+            </w:pPr>
+            <w:r>
+              <w:rPr>
+                <w:lang w:val="en-US"/>
+              </w:rPr>
+              <w:t xml:space="preserve">{% if </w:t>
+            </w:r>
+            <w:proofErr w:type="spellStart"/>
+            <w:r>
+              <w:rPr>
+                <w:lang w:val="en-US"/>
+              </w:rPr>
+              <w:t>template_dict.readme_file.comments|length</w:t>
+            </w:r>
+            <w:proofErr w:type="spellEnd"/>
+            <w:r>
+              <w:rPr>
+                <w:lang w:val="en-US"/>
+              </w:rPr>
+              <w:t xml:space="preserve"> == 0 %}X{% endif %}</w:t>
+            </w:r>
+          </w:p>
           <w:p/>
         </w:tc>
         <w:tc>
@@ -5470,6 +6121,20 @@
                 <w:numId w:val="15"/>
               </w:numPr>
             </w:pPr>
+            <w:r>
+              <w:t xml:space="preserve">{% if </w:t>
+            </w:r>
+            <w:proofErr w:type="spellStart"/>
+            <w:r>
+              <w:t>template_dict.readme_file.comments|length</w:t>
+            </w:r>
+            <w:proofErr w:type="spellEnd"/>
+            <w:r>
+              <w:t xml:space="preserve"> == 0 %}(NO README FILE FOUND){% endif %</w:t>
+            </w:r>
+            <w:r>
+              <w:t>}</w:t>
+            </w:r>
           </w:p>
         </w:tc>
         <w:tc>
@@ -5665,6 +6330,33 @@
             </w:tcMar>
             <w:hideMark/>
           </w:tcPr>
+          <w:p>
+            <w:pPr>
+              <w:rPr>
+                <w:lang w:val="en-US"/>
+              </w:rPr>
+            </w:pPr>
+            <w:r>
+              <w:rPr>
+                <w:lang w:val="en-US"/>
+              </w:rPr>
+              <w:t xml:space="preserve">{% if </w:t>
+            </w:r>
+            <w:proofErr w:type="spellStart"/>
+            <w:r>
+              <w:rPr>
+                <w:lang w:val="en-US"/>
+              </w:rPr>
+              <w:t>template_dict.readme_file.comments|length</w:t>
+            </w:r>
+            <w:proofErr w:type="spellEnd"/>
+            <w:r>
+              <w:rPr>
+                <w:lang w:val="en-US"/>
+              </w:rPr>
+              <w:t xml:space="preserve"> == 0 %}X{% endif %}</w:t>
+            </w:r>
+          </w:p>
           <w:p/>
         </w:tc>
         <w:tc>
@@ -5704,6 +6396,20 @@
                 <w:numId w:val="16"/>
               </w:numPr>
             </w:pPr>
+            <w:r>
+              <w:t xml:space="preserve">{% if </w:t>
+            </w:r>
+            <w:proofErr w:type="spellStart"/>
+            <w:r>
+              <w:t>template_dict.readme_file.comments|length</w:t>
+            </w:r>
+            <w:proofErr w:type="spellEnd"/>
+            <w:r>
+              <w:t xml:space="preserve"> == 0 %}(NO README FILE FOUND){% endif %</w:t>
+            </w:r>
+            <w:r>
+              <w:t>}</w:t>
+            </w:r>
           </w:p>
         </w:tc>
         <w:tc>
@@ -5899,6 +6605,33 @@
             </w:tcMar>
             <w:hideMark/>
           </w:tcPr>
+          <w:p>
+            <w:pPr>
+              <w:rPr>
+                <w:lang w:val="en-US"/>
+              </w:rPr>
+            </w:pPr>
+            <w:r>
+              <w:rPr>
+                <w:lang w:val="en-US"/>
+              </w:rPr>
+              <w:t xml:space="preserve">{% if </w:t>
+            </w:r>
+            <w:proofErr w:type="spellStart"/>
+            <w:r>
+              <w:rPr>
+                <w:lang w:val="en-US"/>
+              </w:rPr>
+              <w:t>template_dict.readme_file.comments|length</w:t>
+            </w:r>
+            <w:proofErr w:type="spellEnd"/>
+            <w:r>
+              <w:rPr>
+                <w:lang w:val="en-US"/>
+              </w:rPr>
+              <w:t xml:space="preserve"> == 0 %}X{% endif %}</w:t>
+            </w:r>
+          </w:p>
           <w:p/>
         </w:tc>
         <w:tc>
@@ -5938,6 +6671,20 @@
                 <w:numId w:val="17"/>
               </w:numPr>
             </w:pPr>
+            <w:r>
+              <w:t xml:space="preserve">{% if </w:t>
+            </w:r>
+            <w:proofErr w:type="spellStart"/>
+            <w:r>
+              <w:t>template_dict.readme_file.comments|length</w:t>
+            </w:r>
+            <w:proofErr w:type="spellEnd"/>
+            <w:r>
+              <w:t xml:space="preserve"> == 0 %}(NO README FILE FOUND){% endif %</w:t>
+            </w:r>
+            <w:r>
+              <w:t>}</w:t>
+            </w:r>
           </w:p>
         </w:tc>
         <w:tc>
@@ -6037,15 +6784,7 @@
                 <w:b/>
                 <w:bCs/>
               </w:rPr>
-              <w:t xml:space="preserve">Does the README file contain correct and complete </w:t>
-            </w:r>
-            <w:r>
-              <w:rPr>
-                <w:b/>
-                <w:bCs/>
-              </w:rPr>
-              <w:lastRenderedPageBreak/>
-              <w:t>information about ‘Files and organization’ </w:t>
+              <w:t>Does the README file contain correct and complete information about ‘Files and organization’ </w:t>
             </w:r>
           </w:p>
         </w:tc>
@@ -6074,12 +6813,7 @@
               </w:numPr>
             </w:pPr>
             <w:r>
-              <w:lastRenderedPageBreak/>
-              <w:t xml:space="preserve">Check whether the files listed in the </w:t>
-            </w:r>
-            <w:r>
-              <w:lastRenderedPageBreak/>
-              <w:t>README match the files listed in the deposit.</w:t>
+              <w:t>Check whether the files listed in the README match the files listed in the deposit.</w:t>
             </w:r>
           </w:p>
           <w:p>
@@ -6090,7 +6824,11 @@
               </w:numPr>
             </w:pPr>
             <w:r>
-              <w:t>If the files are not listed in the README, we can generate a file tree structure &amp; pass it to the depositors to include in their README, if applicable.</w:t>
+              <w:t xml:space="preserve">If the files are not listed in the README, we can generate </w:t>
+            </w:r>
+            <w:r>
+              <w:lastRenderedPageBreak/>
+              <w:t>a file tree structure &amp; pass it to the depositors to include in their README, if applicable.</w:t>
             </w:r>
           </w:p>
         </w:tc>
@@ -6187,7 +6925,40 @@
             </w:tcMar>
             <w:hideMark/>
           </w:tcPr>
-          <w:p/>
+          <w:p>
+            <w:pPr>
+              <w:rPr>
+                <w:lang w:val="en-US"/>
+              </w:rPr>
+            </w:pPr>
+            <w:r>
+              <w:rPr>
+                <w:lang w:val="en-US"/>
+              </w:rPr>
+              <w:t xml:space="preserve">{% if </w:t>
+            </w:r>
+            <w:proofErr w:type="spellStart"/>
+            <w:r>
+              <w:rPr>
+                <w:lang w:val="en-US"/>
+              </w:rPr>
+              <w:t>template_dict.readme_file.comments|length</w:t>
+            </w:r>
+            <w:proofErr w:type="spellEnd"/>
+            <w:r>
+              <w:rPr>
+                <w:lang w:val="en-US"/>
+              </w:rPr>
+              <w:t xml:space="preserve"> == 0 %}X{% endif %}</w:t>
+            </w:r>
+          </w:p>
+          <w:p>
+            <w:pPr>
+              <w:rPr>
+                <w:lang w:val="en-US"/>
+              </w:rPr>
+            </w:pPr>
+          </w:p>
         </w:tc>
         <w:tc>
           <w:tcPr>
@@ -6240,6 +7011,17 @@
                 <w:numId w:val="19"/>
               </w:numPr>
             </w:pPr>
+            <w:r>
+              <w:t xml:space="preserve">{% if </w:t>
+            </w:r>
+            <w:proofErr w:type="spellStart"/>
+            <w:r>
+              <w:t>template_dict.readme_file.comments|length</w:t>
+            </w:r>
+            <w:proofErr w:type="spellEnd"/>
+            <w:r>
+              <w:t xml:space="preserve"> == 0 %}(NO README FILE FOUND){% endif %}</w:t>
+            </w:r>
           </w:p>
         </w:tc>
         <w:tc>
@@ -6465,7 +7247,40 @@
             </w:tcMar>
             <w:hideMark/>
           </w:tcPr>
-          <w:p/>
+          <w:p>
+            <w:pPr>
+              <w:rPr>
+                <w:lang w:val="en-US"/>
+              </w:rPr>
+            </w:pPr>
+            <w:r>
+              <w:rPr>
+                <w:lang w:val="en-US"/>
+              </w:rPr>
+              <w:t xml:space="preserve">{% if </w:t>
+            </w:r>
+            <w:proofErr w:type="spellStart"/>
+            <w:r>
+              <w:rPr>
+                <w:lang w:val="en-US"/>
+              </w:rPr>
+              <w:t>template_dict.readme_file.comments|length</w:t>
+            </w:r>
+            <w:proofErr w:type="spellEnd"/>
+            <w:r>
+              <w:rPr>
+                <w:lang w:val="en-US"/>
+              </w:rPr>
+              <w:t xml:space="preserve"> == 0 %}X{% endif %}</w:t>
+            </w:r>
+          </w:p>
+          <w:p>
+            <w:pPr>
+              <w:rPr>
+                <w:lang w:val="en-US"/>
+              </w:rPr>
+            </w:pPr>
+          </w:p>
         </w:tc>
         <w:tc>
           <w:tcPr>
@@ -6504,6 +7319,17 @@
                 <w:numId w:val="21"/>
               </w:numPr>
             </w:pPr>
+            <w:r>
+              <w:t xml:space="preserve">{% if </w:t>
+            </w:r>
+            <w:proofErr w:type="spellStart"/>
+            <w:r>
+              <w:t>template_dict.readme_file.comments|length</w:t>
+            </w:r>
+            <w:proofErr w:type="spellEnd"/>
+            <w:r>
+              <w:t xml:space="preserve"> == 0 %}(NO README FILE FOUND){% endif %}</w:t>
+            </w:r>
           </w:p>
         </w:tc>
         <w:tc>
@@ -6858,7 +7684,6 @@
                 <w:b/>
                 <w:bCs/>
               </w:rPr>
-              <w:lastRenderedPageBreak/>
               <w:t>4.1</w:t>
             </w:r>
           </w:p>
@@ -6962,6 +7787,7 @@
               </w:numPr>
             </w:pPr>
             <w:r>
+              <w:lastRenderedPageBreak/>
               <w:t>Description</w:t>
             </w:r>
           </w:p>
@@ -7139,12 +7965,14 @@
             <w:r>
               <w:t xml:space="preserve">{% if </w:t>
             </w:r>
+            <w:proofErr w:type="spellStart"/>
             <w:r>
               <w:rPr>
                 <w:lang w:val="en-US"/>
               </w:rPr>
               <w:t>template_dict.typo.comments</w:t>
             </w:r>
+            <w:proofErr w:type="spellEnd"/>
             <w:r>
               <w:t xml:space="preserve"> |length &gt; 0</w:t>
             </w:r>
@@ -7155,7 +7983,21 @@
               <w:rPr>
                 <w:lang w:val="en-US"/>
               </w:rPr>
-              <w:t>{% for item in template_dict.typo.comments %}</w:t>
+              <w:t xml:space="preserve">{% for item in </w:t>
+            </w:r>
+            <w:proofErr w:type="spellStart"/>
+            <w:r>
+              <w:rPr>
+                <w:lang w:val="en-US"/>
+              </w:rPr>
+              <w:t>template_dict.typo.comments</w:t>
+            </w:r>
+            <w:proofErr w:type="spellEnd"/>
+            <w:r>
+              <w:rPr>
+                <w:lang w:val="en-US"/>
+              </w:rPr>
+              <w:t xml:space="preserve"> %}</w:t>
             </w:r>
           </w:p>
           <w:p>
@@ -7170,7 +8012,21 @@
               <w:rPr>
                 <w:lang w:val="en-US"/>
               </w:rPr>
-              <w:t>{{ item }}{% endfor %}</w:t>
+              <w:t xml:space="preserve">{{ item }}{% </w:t>
+            </w:r>
+            <w:proofErr w:type="spellStart"/>
+            <w:r>
+              <w:rPr>
+                <w:lang w:val="en-US"/>
+              </w:rPr>
+              <w:t>endfor</w:t>
+            </w:r>
+            <w:proofErr w:type="spellEnd"/>
+            <w:r>
+              <w:rPr>
+                <w:lang w:val="en-US"/>
+              </w:rPr>
+              <w:t xml:space="preserve"> %}</w:t>
             </w:r>
           </w:p>
           <w:p>
@@ -7623,15 +8479,7 @@
                 <w:b/>
                 <w:bCs/>
               </w:rPr>
-              <w:t xml:space="preserve">Does at least one author have an </w:t>
-            </w:r>
-            <w:r>
-              <w:rPr>
-                <w:b/>
-                <w:bCs/>
-              </w:rPr>
-              <w:lastRenderedPageBreak/>
-              <w:t>institutional affiliation listed?</w:t>
+              <w:t>Does at least one author have an institutional affiliation listed?</w:t>
             </w:r>
           </w:p>
         </w:tc>
@@ -7655,7 +8503,6 @@
           </w:tcPr>
           <w:p>
             <w:r>
-              <w:lastRenderedPageBreak/>
               <w:t>Python scripted.</w:t>
             </w:r>
           </w:p>
@@ -7679,7 +8526,15 @@
           </w:tcPr>
           <w:p>
             <w:r>
-              <w:t>{% if not template_dict.none_author_affiliation %}X{% endif %}</w:t>
+              <w:t xml:space="preserve">{% if not </w:t>
+            </w:r>
+            <w:proofErr w:type="spellStart"/>
+            <w:r>
+              <w:t>template_dict.none_author_affiliation</w:t>
+            </w:r>
+            <w:proofErr w:type="spellEnd"/>
+            <w:r>
+              <w:t xml:space="preserve"> %}X{% endif %}</w:t>
             </w:r>
           </w:p>
         </w:tc>
@@ -7702,7 +8557,15 @@
           </w:tcPr>
           <w:p>
             <w:r>
-              <w:t>{% if template_dict.none_author_affiliation %}X{% endif %}</w:t>
+              <w:t xml:space="preserve">{% if </w:t>
+            </w:r>
+            <w:proofErr w:type="spellStart"/>
+            <w:r>
+              <w:t>template_dict.none_author_affiliation</w:t>
+            </w:r>
+            <w:proofErr w:type="spellEnd"/>
+            <w:r>
+              <w:t xml:space="preserve"> %}X{% endif %}</w:t>
             </w:r>
           </w:p>
         </w:tc>
@@ -7969,11 +8832,28 @@
               </w:rPr>
             </w:pPr>
             <w:r>
-              <w:t>This will check either ‘uoft’, ‘u of t’ or ‘</w:t>
-            </w:r>
-            <w:r>
-              <w:t>university of toronto</w:t>
-            </w:r>
+              <w:t>This will check either ‘</w:t>
+            </w:r>
+            <w:proofErr w:type="spellStart"/>
+            <w:r>
+              <w:t>uoft</w:t>
+            </w:r>
+            <w:proofErr w:type="spellEnd"/>
+            <w:r>
+              <w:t xml:space="preserve">’, ‘u of t’ or </w:t>
+            </w:r>
+            <w:r>
+              <w:lastRenderedPageBreak/>
+              <w:t>‘</w:t>
+            </w:r>
+            <w:r>
+              <w:t xml:space="preserve">university of </w:t>
+            </w:r>
+            <w:proofErr w:type="spellStart"/>
+            <w:r>
+              <w:t>toronto</w:t>
+            </w:r>
+            <w:proofErr w:type="spellEnd"/>
             <w:r>
               <w:t xml:space="preserve">’ is filled for the </w:t>
             </w:r>
@@ -8021,14 +8901,25 @@
               </w:rPr>
             </w:pPr>
             <w:r>
-              <w:t>{% if not template_dict.</w:t>
-            </w:r>
+              <w:lastRenderedPageBreak/>
+              <w:t xml:space="preserve">{% if not </w:t>
+            </w:r>
+            <w:proofErr w:type="spellStart"/>
+            <w:r>
+              <w:t>template_dict</w:t>
+            </w:r>
+            <w:proofErr w:type="spellEnd"/>
+            <w:r>
+              <w:t>.</w:t>
+            </w:r>
+            <w:proofErr w:type="spellStart"/>
             <w:r>
               <w:rPr>
                 <w:lang w:val="en-US"/>
               </w:rPr>
               <w:t>none_author_affiliation_UT</w:t>
             </w:r>
+            <w:proofErr w:type="spellEnd"/>
             <w:r>
               <w:t>%}X{% endif %}</w:t>
             </w:r>
@@ -8058,14 +8949,24 @@
               </w:rPr>
             </w:pPr>
             <w:r>
-              <w:t>{% if template_dict.</w:t>
-            </w:r>
+              <w:t xml:space="preserve">{% if </w:t>
+            </w:r>
+            <w:proofErr w:type="spellStart"/>
+            <w:r>
+              <w:t>template_dict</w:t>
+            </w:r>
+            <w:proofErr w:type="spellEnd"/>
+            <w:r>
+              <w:t>.</w:t>
+            </w:r>
+            <w:proofErr w:type="spellStart"/>
             <w:r>
               <w:rPr>
                 <w:lang w:val="en-US"/>
               </w:rPr>
               <w:t>none_author_affiliation_UT</w:t>
             </w:r>
+            <w:proofErr w:type="spellEnd"/>
             <w:r>
               <w:t xml:space="preserve"> %}X{% endif %}</w:t>
             </w:r>
@@ -8280,11 +9181,7 @@
               </w:numPr>
             </w:pPr>
             <w:r>
-              <w:t>Read the description and README file and check them against metadata fields. For example, if a geographical location or data collection date/range is mentioned in the descripti</w:t>
-            </w:r>
-            <w:r>
-              <w:lastRenderedPageBreak/>
-              <w:t>on, recommend filling in the relevant metadata fields</w:t>
+              <w:t>Read the description and README file and check them against metadata fields. For example, if a geographical location or data collection date/range is mentioned in the description, recommend filling in the relevant metadata fields</w:t>
             </w:r>
           </w:p>
           <w:p>
@@ -8295,7 +9192,11 @@
               </w:numPr>
             </w:pPr>
             <w:r>
-              <w:t xml:space="preserve">You may reference the </w:t>
+              <w:t>You may referenc</w:t>
+            </w:r>
+            <w:r>
+              <w:lastRenderedPageBreak/>
+              <w:t xml:space="preserve">e the </w:t>
             </w:r>
             <w:hyperlink r:id="rId5" w:history="1">
               <w:r>
@@ -8531,6 +9432,7 @@
                 <w:b/>
                 <w:bCs/>
               </w:rPr>
+              <w:lastRenderedPageBreak/>
               <w:t>4.5</w:t>
             </w:r>
           </w:p>
@@ -8865,7 +9767,6 @@
           <w:p/>
           <w:p>
             <w:r>
-              <w:lastRenderedPageBreak/>
               <w:t>Some elements to look for may include:</w:t>
             </w:r>
           </w:p>
@@ -8888,6 +9789,7 @@
               </w:numPr>
             </w:pPr>
             <w:r>
+              <w:lastRenderedPageBreak/>
               <w:t>Geographical location</w:t>
             </w:r>
           </w:p>
@@ -9223,8 +10125,11 @@
               </w:numPr>
             </w:pPr>
             <w:r>
+              <w:t>Can also provide information about controlle</w:t>
+            </w:r>
+            <w:r>
               <w:lastRenderedPageBreak/>
-              <w:t>Can also provide information about controlled vocabulary (in that specific field) if none is filled out.</w:t>
+              <w:t>d vocabulary (in that specific field) if none is filled out.</w:t>
             </w:r>
           </w:p>
         </w:tc>
@@ -9251,7 +10156,14 @@
                 <w:lang w:val="en-US"/>
               </w:rPr>
               <w:lastRenderedPageBreak/>
-              <w:t>{% if template_dict.</w:t>
+              <w:t xml:space="preserve">{% if </w:t>
+            </w:r>
+            <w:proofErr w:type="spellStart"/>
+            <w:r>
+              <w:rPr>
+                <w:lang w:val="en-US"/>
+              </w:rPr>
+              <w:t>template_dict.</w:t>
             </w:r>
             <w:r>
               <w:rPr>
@@ -9264,7 +10176,14 @@
               <w:rPr>
                 <w:lang w:val="en-US"/>
               </w:rPr>
-              <w:t>|length &gt; 0 %}X{% endif %}</w:t>
+              <w:t>|length</w:t>
+            </w:r>
+            <w:proofErr w:type="spellEnd"/>
+            <w:r>
+              <w:rPr>
+                <w:lang w:val="en-US"/>
+              </w:rPr>
+              <w:t xml:space="preserve"> &gt; 0 %}X{% endif %}</w:t>
             </w:r>
           </w:p>
         </w:tc>
@@ -9314,7 +10233,14 @@
               <w:rPr>
                 <w:lang w:val="en-US"/>
               </w:rPr>
-              <w:t>{% if template_dict.</w:t>
+              <w:t xml:space="preserve">{% if </w:t>
+            </w:r>
+            <w:proofErr w:type="spellStart"/>
+            <w:r>
+              <w:rPr>
+                <w:lang w:val="en-US"/>
+              </w:rPr>
+              <w:t>template_dict.</w:t>
             </w:r>
             <w:r>
               <w:rPr>
@@ -9327,7 +10253,14 @@
               <w:rPr>
                 <w:lang w:val="en-US"/>
               </w:rPr>
-              <w:t>|length == 0 %}X{% endif %}</w:t>
+              <w:t>|length</w:t>
+            </w:r>
+            <w:proofErr w:type="spellEnd"/>
+            <w:r>
+              <w:rPr>
+                <w:lang w:val="en-US"/>
+              </w:rPr>
+              <w:t xml:space="preserve"> == 0 %}X{% endif %}</w:t>
             </w:r>
           </w:p>
         </w:tc>
@@ -9400,6 +10333,41 @@
             <w:r>
               <w:t xml:space="preserve">{% if </w:t>
             </w:r>
+            <w:proofErr w:type="spellStart"/>
+            <w:r>
+              <w:rPr>
+                <w:lang w:val="en-US"/>
+              </w:rPr>
+              <w:t>template_dict</w:t>
+            </w:r>
+            <w:proofErr w:type="spellEnd"/>
+            <w:r>
+              <w:rPr>
+                <w:lang w:val="en-US"/>
+              </w:rPr>
+              <w:t>.</w:t>
+            </w:r>
+            <w:proofErr w:type="spellStart"/>
+            <w:r>
+              <w:t>keywords</w:t>
+            </w:r>
+            <w:r>
+              <w:t>|length</w:t>
+            </w:r>
+            <w:proofErr w:type="spellEnd"/>
+            <w:r>
+              <w:t xml:space="preserve"> &gt; 0</w:t>
+            </w:r>
+            <w:r>
+              <w:t xml:space="preserve"> %}</w:t>
+            </w:r>
+            <w:r>
+              <w:rPr>
+                <w:lang w:val="en-US"/>
+              </w:rPr>
+              <w:t xml:space="preserve">{% for item in </w:t>
+            </w:r>
+            <w:proofErr w:type="spellStart"/>
             <w:r>
               <w:rPr>
                 <w:lang w:val="en-US"/>
@@ -9407,27 +10375,13 @@
               <w:t>template_dict.</w:t>
             </w:r>
             <w:r>
+              <w:rPr>
+                <w:rFonts w:hint="eastAsia"/>
+                <w:lang w:val="en-US"/>
+              </w:rPr>
               <w:t>keywords</w:t>
             </w:r>
-            <w:r>
-              <w:t>|length &gt; 0</w:t>
-            </w:r>
-            <w:r>
-              <w:t xml:space="preserve"> %}</w:t>
-            </w:r>
-            <w:r>
-              <w:rPr>
-                <w:lang w:val="en-US"/>
-              </w:rPr>
-              <w:t>{% for item in template_dict.</w:t>
-            </w:r>
-            <w:r>
-              <w:rPr>
-                <w:rFonts w:hint="eastAsia"/>
-                <w:lang w:val="en-US"/>
-              </w:rPr>
-              <w:t>keywords</w:t>
-            </w:r>
+            <w:proofErr w:type="spellEnd"/>
             <w:r>
               <w:rPr>
                 <w:lang w:val="en-US"/>
@@ -9447,7 +10401,21 @@
               <w:rPr>
                 <w:lang w:val="en-US"/>
               </w:rPr>
-              <w:t>{{ item }}{% endfor %}</w:t>
+              <w:t xml:space="preserve">{{ item }}{% </w:t>
+            </w:r>
+            <w:proofErr w:type="spellStart"/>
+            <w:r>
+              <w:rPr>
+                <w:lang w:val="en-US"/>
+              </w:rPr>
+              <w:t>endfor</w:t>
+            </w:r>
+            <w:proofErr w:type="spellEnd"/>
+            <w:r>
+              <w:rPr>
+                <w:lang w:val="en-US"/>
+              </w:rPr>
+              <w:t xml:space="preserve"> %}</w:t>
             </w:r>
           </w:p>
           <w:p>
@@ -10726,11 +11694,11 @@
               </w:numPr>
             </w:pPr>
             <w:r>
-              <w:t xml:space="preserve">Review documentation and file names and see if there are any that should be opened and reviewed (e.g. if a file is named </w:t>
+              <w:t xml:space="preserve">Review documentation and file names and see if there are any that should be opened and reviewed (e.g. if a </w:t>
             </w:r>
             <w:r>
               <w:lastRenderedPageBreak/>
-              <w:t>“participant survey” - maybe open that one)</w:t>
+              <w:t>file is named “participant survey” - maybe open that one)</w:t>
             </w:r>
           </w:p>
           <w:p>
@@ -10769,7 +11737,11 @@
               </w:numPr>
             </w:pPr>
             <w:r>
-              <w:t>Social Security Numbers (SSNs)</w:t>
+              <w:t>Social Security Numbers (SS</w:t>
+            </w:r>
+            <w:r>
+              <w:lastRenderedPageBreak/>
+              <w:t>Ns)</w:t>
             </w:r>
           </w:p>
           <w:p>
@@ -10780,11 +11752,7 @@
               </w:numPr>
             </w:pPr>
             <w:r>
-              <w:t>Cana</w:t>
-            </w:r>
-            <w:r>
-              <w:lastRenderedPageBreak/>
-              <w:t>dian Social Insurance Number (SINs)</w:t>
+              <w:t>Canadian Social Insurance Number (SINs)</w:t>
             </w:r>
           </w:p>
           <w:p>
@@ -10795,7 +11763,11 @@
               </w:numPr>
             </w:pPr>
             <w:r>
-              <w:t>Credit card numbers</w:t>
+              <w:t>Credit ca</w:t>
+            </w:r>
+            <w:r>
+              <w:lastRenderedPageBreak/>
+              <w:t>rd numbers</w:t>
             </w:r>
           </w:p>
           <w:p>
@@ -10806,11 +11778,7 @@
               </w:numPr>
             </w:pPr>
             <w:r>
-              <w:t>Email addres</w:t>
-            </w:r>
-            <w:r>
-              <w:lastRenderedPageBreak/>
-              <w:t>ses</w:t>
+              <w:t>Email addresses</w:t>
             </w:r>
           </w:p>
           <w:p>
@@ -10831,8 +11799,17 @@
                 <w:numId w:val="36"/>
               </w:numPr>
             </w:pPr>
-            <w:r>
-              <w:t>vCards (Virtual Contact Files)</w:t>
+            <w:proofErr w:type="spellStart"/>
+            <w:r>
+              <w:t>vCards</w:t>
+            </w:r>
+            <w:proofErr w:type="spellEnd"/>
+            <w:r>
+              <w:t xml:space="preserve"> (Virtu</w:t>
+            </w:r>
+            <w:r>
+              <w:lastRenderedPageBreak/>
+              <w:t>al Contact Files)</w:t>
             </w:r>
           </w:p>
         </w:tc>
@@ -11136,11 +12113,7 @@
               </w:numPr>
             </w:pPr>
             <w:r>
-              <w:t xml:space="preserve">If something is flagged in the sensitive data review (see question above), check </w:t>
-            </w:r>
-            <w:r>
-              <w:lastRenderedPageBreak/>
-              <w:t>the intake form to confirm information about their REB status.</w:t>
+              <w:t>If something is flagged in the sensitive data review (see question above), check the intake form to confirm information about their REB status.</w:t>
             </w:r>
           </w:p>
         </w:tc>
@@ -11407,7 +12380,11 @@
               </w:numPr>
             </w:pPr>
             <w:r>
-              <w:t>If the dataset uses CC0 - confirm this is what the depositor wants </w:t>
+              <w:t xml:space="preserve">If the dataset uses CC0 - confirm this is </w:t>
+            </w:r>
+            <w:r>
+              <w:lastRenderedPageBreak/>
+              <w:t>what the depositor wants </w:t>
             </w:r>
           </w:p>
           <w:p>
@@ -11563,7 +12540,11 @@
               <w:br/>
             </w:r>
             <w:r>
-              <w:t>{% if template_dict.restricted_files.comment</w:t>
+              <w:t xml:space="preserve">{% if </w:t>
+            </w:r>
+            <w:proofErr w:type="spellStart"/>
+            <w:r>
+              <w:t>template_dict.restricted_files.comment</w:t>
             </w:r>
             <w:r>
               <w:rPr>
@@ -11572,10 +12553,22 @@
               <w:t>s</w:t>
             </w:r>
             <w:r>
-              <w:t>|length &gt; 0</w:t>
-            </w:r>
-            <w:r>
-              <w:t xml:space="preserve"> %}{% for item in template_dict.restricted_files.comments %} </w:t>
+              <w:t>|length</w:t>
+            </w:r>
+            <w:proofErr w:type="spellEnd"/>
+            <w:r>
+              <w:t xml:space="preserve"> &gt; 0</w:t>
+            </w:r>
+            <w:r>
+              <w:t xml:space="preserve"> %}{% for item in </w:t>
+            </w:r>
+            <w:proofErr w:type="spellStart"/>
+            <w:r>
+              <w:t>template_dict.restricted_files.comments</w:t>
+            </w:r>
+            <w:proofErr w:type="spellEnd"/>
+            <w:r>
+              <w:t xml:space="preserve"> %} </w:t>
             </w:r>
           </w:p>
           <w:p>
@@ -11587,7 +12580,24 @@
               </w:numPr>
             </w:pPr>
             <w:r>
-              <w:t>{{ item.file_name }} {% endfor %}</w:t>
+              <w:lastRenderedPageBreak/>
+              <w:t xml:space="preserve">{{ </w:t>
+            </w:r>
+            <w:proofErr w:type="spellStart"/>
+            <w:r>
+              <w:t>item.file_name</w:t>
+            </w:r>
+            <w:proofErr w:type="spellEnd"/>
+            <w:r>
+              <w:t xml:space="preserve"> }} {% </w:t>
+            </w:r>
+            <w:proofErr w:type="spellStart"/>
+            <w:r>
+              <w:t>endfor</w:t>
+            </w:r>
+            <w:proofErr w:type="spellEnd"/>
+            <w:r>
+              <w:t xml:space="preserve"> %}</w:t>
             </w:r>
           </w:p>
           <w:p>
@@ -11636,7 +12646,23 @@
               </w:rPr>
             </w:pPr>
             <w:r>
-              <w:t>{% if template_dict.terms_license.licenseName is not none %}{{ template_dict.terms_license.licenseName }}{% else %}(NONE){% endif %}</w:t>
+              <w:t xml:space="preserve">{% if </w:t>
+            </w:r>
+            <w:proofErr w:type="spellStart"/>
+            <w:r>
+              <w:t>template_dict.terms_license.licenseName</w:t>
+            </w:r>
+            <w:proofErr w:type="spellEnd"/>
+            <w:r>
+              <w:t xml:space="preserve"> is not none %}{{ </w:t>
+            </w:r>
+            <w:proofErr w:type="spellStart"/>
+            <w:r>
+              <w:t>template_dict.terms_license.licenseName</w:t>
+            </w:r>
+            <w:proofErr w:type="spellEnd"/>
+            <w:r>
+              <w:t xml:space="preserve"> }}{% else %}(NONE){% endif %}</w:t>
             </w:r>
           </w:p>
           <w:p>
@@ -11680,7 +12706,7 @@
               <w:tblLook w:val="04A0" w:firstRow="1" w:lastRow="0" w:firstColumn="1" w:lastColumn="0" w:noHBand="0" w:noVBand="1"/>
             </w:tblPr>
             <w:tblGrid>
-              <w:gridCol w:w="3826"/>
+              <w:gridCol w:w="3698"/>
             </w:tblGrid>
             <w:tr>
               <w:tc>
@@ -11694,17 +12720,27 @@
                     </w:rPr>
                   </w:pPr>
                   <w:r>
-                    <w:t>{% if template_dict.terms_license.</w:t>
+                    <w:t xml:space="preserve">{% if </w:t>
+                  </w:r>
+                  <w:proofErr w:type="spellStart"/>
+                  <w:r>
+                    <w:t>template_dict.terms_license.</w:t>
                   </w:r>
                   <w:r>
                     <w:t>termsOfUse</w:t>
                   </w:r>
+                  <w:proofErr w:type="spellEnd"/>
                   <w:r>
-                    <w:t xml:space="preserve"> is not none %}{{ template_dict.terms_license.</w:t>
+                    <w:t xml:space="preserve"> is not none %}{{ </w:t>
+                  </w:r>
+                  <w:proofErr w:type="spellStart"/>
+                  <w:r>
+                    <w:t>template_dict.terms_license.</w:t>
                   </w:r>
                   <w:r>
                     <w:t>termsOfUse</w:t>
                   </w:r>
+                  <w:proofErr w:type="spellEnd"/>
                   <w:r>
                     <w:t xml:space="preserve"> }}{% else %}(NONE){% endif %}</w:t>
                   </w:r>
@@ -11734,6 +12770,7 @@
           </w:tcPr>
           <w:p>
             <w:r>
+              <w:lastRenderedPageBreak/>
               <w:t>Require</w:t>
             </w:r>
           </w:p>
@@ -11847,11 +12884,7 @@
               </w:numPr>
             </w:pPr>
             <w:r>
-              <w:t xml:space="preserve">If there are restricted files and no Terms of Access, recommend </w:t>
-            </w:r>
-            <w:r>
-              <w:lastRenderedPageBreak/>
-              <w:t>including terms of access.</w:t>
+              <w:t>If there are restricted files and no Terms of Access, recommend including terms of access.</w:t>
             </w:r>
           </w:p>
           <w:p>
@@ -11888,14 +12921,21 @@
                 <w:rFonts w:hint="eastAsia"/>
                 <w:lang w:val="en-US"/>
               </w:rPr>
-              <w:lastRenderedPageBreak/>
               <w:t xml:space="preserve">{% if </w:t>
             </w:r>
-            <w:r>
-              <w:rPr>
-                <w:lang w:val="en-US"/>
-              </w:rPr>
-              <w:t>template_dict.</w:t>
+            <w:proofErr w:type="spellStart"/>
+            <w:r>
+              <w:rPr>
+                <w:lang w:val="en-US"/>
+              </w:rPr>
+              <w:t>template_dict</w:t>
+            </w:r>
+            <w:proofErr w:type="spellEnd"/>
+            <w:r>
+              <w:rPr>
+                <w:lang w:val="en-US"/>
+              </w:rPr>
+              <w:t>.</w:t>
             </w:r>
             <w:r>
               <w:rPr>
@@ -11908,21 +12948,38 @@
               </w:rPr>
               <w:t xml:space="preserve"> </w:t>
             </w:r>
+            <w:proofErr w:type="spellStart"/>
             <w:r>
               <w:t>restricted_files</w:t>
             </w:r>
-            <w:r>
-              <w:rPr>
-                <w:lang w:val="en-US"/>
-              </w:rPr>
-              <w:t>.comments</w:t>
+            <w:proofErr w:type="spellEnd"/>
+            <w:r>
+              <w:rPr>
+                <w:lang w:val="en-US"/>
+              </w:rPr>
+              <w:t>.</w:t>
+            </w:r>
+            <w:proofErr w:type="spellStart"/>
+            <w:r>
+              <w:rPr>
+                <w:lang w:val="en-US"/>
+              </w:rPr>
+              <w:t>comments</w:t>
             </w:r>
             <w:r>
               <w:rPr>
                 <w:rFonts w:hint="eastAsia"/>
                 <w:lang w:val="en-US"/>
               </w:rPr>
-              <w:t>|length &gt;</w:t>
+              <w:t>|length</w:t>
+            </w:r>
+            <w:proofErr w:type="spellEnd"/>
+            <w:r>
+              <w:rPr>
+                <w:rFonts w:hint="eastAsia"/>
+                <w:lang w:val="en-US"/>
+              </w:rPr>
+              <w:t xml:space="preserve"> &gt;</w:t>
             </w:r>
             <w:r>
               <w:rPr>
@@ -11937,12 +12994,14 @@
               </w:rPr>
               <w:t xml:space="preserve">and </w:t>
             </w:r>
+            <w:proofErr w:type="spellStart"/>
             <w:r>
               <w:t>template_dict.terms_license.</w:t>
             </w:r>
             <w:r>
               <w:t>termsOfAccess</w:t>
             </w:r>
+            <w:proofErr w:type="spellEnd"/>
             <w:r>
               <w:t xml:space="preserve"> is not none</w:t>
             </w:r>
@@ -11981,11 +13040,19 @@
               </w:rPr>
               <w:t xml:space="preserve">{% if </w:t>
             </w:r>
-            <w:r>
-              <w:rPr>
-                <w:lang w:val="en-US"/>
-              </w:rPr>
-              <w:t>template_dict.</w:t>
+            <w:proofErr w:type="spellStart"/>
+            <w:r>
+              <w:rPr>
+                <w:lang w:val="en-US"/>
+              </w:rPr>
+              <w:t>template_dict</w:t>
+            </w:r>
+            <w:proofErr w:type="spellEnd"/>
+            <w:r>
+              <w:rPr>
+                <w:lang w:val="en-US"/>
+              </w:rPr>
+              <w:t>.</w:t>
             </w:r>
             <w:r>
               <w:rPr>
@@ -11998,21 +13065,38 @@
               </w:rPr>
               <w:t xml:space="preserve"> </w:t>
             </w:r>
+            <w:proofErr w:type="spellStart"/>
             <w:r>
               <w:t>restricted_files</w:t>
             </w:r>
-            <w:r>
-              <w:rPr>
-                <w:lang w:val="en-US"/>
-              </w:rPr>
-              <w:t>.comments</w:t>
+            <w:proofErr w:type="spellEnd"/>
+            <w:r>
+              <w:rPr>
+                <w:lang w:val="en-US"/>
+              </w:rPr>
+              <w:t>.</w:t>
+            </w:r>
+            <w:proofErr w:type="spellStart"/>
+            <w:r>
+              <w:rPr>
+                <w:lang w:val="en-US"/>
+              </w:rPr>
+              <w:t>comments</w:t>
             </w:r>
             <w:r>
               <w:rPr>
                 <w:rFonts w:hint="eastAsia"/>
                 <w:lang w:val="en-US"/>
               </w:rPr>
-              <w:t>|length &gt;</w:t>
+              <w:t>|length</w:t>
+            </w:r>
+            <w:proofErr w:type="spellEnd"/>
+            <w:r>
+              <w:rPr>
+                <w:rFonts w:hint="eastAsia"/>
+                <w:lang w:val="en-US"/>
+              </w:rPr>
+              <w:t xml:space="preserve"> &gt;</w:t>
             </w:r>
             <w:r>
               <w:rPr>
@@ -12027,12 +13111,14 @@
               </w:rPr>
               <w:t xml:space="preserve">and </w:t>
             </w:r>
+            <w:proofErr w:type="spellStart"/>
             <w:r>
               <w:t>template_dict.terms_license.</w:t>
             </w:r>
             <w:r>
               <w:t>termsOfAccess</w:t>
             </w:r>
+            <w:proofErr w:type="spellEnd"/>
             <w:r>
               <w:t xml:space="preserve"> is none</w:t>
             </w:r>
@@ -12107,11 +13193,19 @@
               </w:rPr>
               <w:t xml:space="preserve">{% if </w:t>
             </w:r>
-            <w:r>
-              <w:rPr>
-                <w:lang w:val="en-US"/>
-              </w:rPr>
-              <w:t>template_dict.</w:t>
+            <w:proofErr w:type="spellStart"/>
+            <w:r>
+              <w:rPr>
+                <w:lang w:val="en-US"/>
+              </w:rPr>
+              <w:t>template_dict</w:t>
+            </w:r>
+            <w:proofErr w:type="spellEnd"/>
+            <w:r>
+              <w:rPr>
+                <w:lang w:val="en-US"/>
+              </w:rPr>
+              <w:t>.</w:t>
             </w:r>
             <w:r>
               <w:rPr>
@@ -12124,21 +13218,38 @@
               </w:rPr>
               <w:t xml:space="preserve"> </w:t>
             </w:r>
+            <w:proofErr w:type="spellStart"/>
             <w:r>
               <w:t>restricted_files</w:t>
             </w:r>
-            <w:r>
-              <w:rPr>
-                <w:lang w:val="en-US"/>
-              </w:rPr>
-              <w:t>.comments</w:t>
+            <w:proofErr w:type="spellEnd"/>
+            <w:r>
+              <w:rPr>
+                <w:lang w:val="en-US"/>
+              </w:rPr>
+              <w:t>.</w:t>
+            </w:r>
+            <w:proofErr w:type="spellStart"/>
+            <w:r>
+              <w:rPr>
+                <w:lang w:val="en-US"/>
+              </w:rPr>
+              <w:t>comments</w:t>
             </w:r>
             <w:r>
               <w:rPr>
                 <w:rFonts w:hint="eastAsia"/>
                 <w:lang w:val="en-US"/>
               </w:rPr>
-              <w:t>|length ==</w:t>
+              <w:t>|length</w:t>
+            </w:r>
+            <w:proofErr w:type="spellEnd"/>
+            <w:r>
+              <w:rPr>
+                <w:rFonts w:hint="eastAsia"/>
+                <w:lang w:val="en-US"/>
+              </w:rPr>
+              <w:t xml:space="preserve"> ==</w:t>
             </w:r>
             <w:r>
               <w:rPr>
@@ -12215,7 +13326,7 @@
               <w:tblLook w:val="04A0" w:firstRow="1" w:lastRow="0" w:firstColumn="1" w:lastColumn="0" w:noHBand="0" w:noVBand="1"/>
             </w:tblPr>
             <w:tblGrid>
-              <w:gridCol w:w="3826"/>
+              <w:gridCol w:w="3698"/>
             </w:tblGrid>
             <w:tr>
               <w:tc>
@@ -12229,17 +13340,27 @@
                     </w:rPr>
                   </w:pPr>
                   <w:r>
-                    <w:t>{% if template_dict.terms_license.</w:t>
+                    <w:t xml:space="preserve">{% if </w:t>
+                  </w:r>
+                  <w:proofErr w:type="spellStart"/>
+                  <w:r>
+                    <w:t>template_dict.terms_license.</w:t>
                   </w:r>
                   <w:r>
                     <w:t>termsOfAccess</w:t>
                   </w:r>
+                  <w:proofErr w:type="spellEnd"/>
                   <w:r>
-                    <w:t xml:space="preserve"> is not none %}{{ template_dict.terms_license.</w:t>
+                    <w:t xml:space="preserve"> is not none %}{{ </w:t>
+                  </w:r>
+                  <w:proofErr w:type="spellStart"/>
+                  <w:r>
+                    <w:t>template_dict.terms_license.</w:t>
                   </w:r>
                   <w:r>
                     <w:t>termsOfAccess</w:t>
                   </w:r>
+                  <w:proofErr w:type="spellEnd"/>
                   <w:r>
                     <w:t xml:space="preserve"> }}{% else %}(NONE){% endif %}</w:t>
                   </w:r>
@@ -12319,6 +13440,7 @@
                 <w:b/>
                 <w:bCs/>
               </w:rPr>
+              <w:lastRenderedPageBreak/>
               <w:t>5.5</w:t>
             </w:r>
           </w:p>
@@ -19641,7 +20763,7 @@
   <w:style w:type="paragraph" w:default="1" w:styleId="Normal">
     <w:name w:val="Normal"/>
     <w:qFormat/>
-    <w:rsid w:val="00947F09"/>
+    <w:rsid w:val="000F74F1"/>
     <w:rPr>
       <w:lang w:val="en-CA"/>
     </w:rPr>

</xml_diff>

<commit_message>
Added 00:00 timestamps for convenience in the `Time Spent` column
</commit_message>
<xml_diff>
--- a/res/template_high.docx
+++ b/res/template_high.docx
@@ -1406,7 +1406,11 @@
               <w:right w:w="100" w:type="dxa"/>
             </w:tcMar>
           </w:tcPr>
-          <w:p/>
+          <w:p>
+            <w:r>
+              <w:t>00:00</w:t>
+            </w:r>
+          </w:p>
         </w:tc>
       </w:tr>
       <w:tr>
@@ -1807,7 +1811,11 @@
             </w:tcMar>
             <w:hideMark/>
           </w:tcPr>
-          <w:p/>
+          <w:p>
+            <w:r>
+              <w:t>00:00</w:t>
+            </w:r>
+          </w:p>
         </w:tc>
       </w:tr>
       <w:tr>
@@ -2110,7 +2118,11 @@
             </w:tcMar>
             <w:hideMark/>
           </w:tcPr>
-          <w:p/>
+          <w:p>
+            <w:r>
+              <w:t>00:00</w:t>
+            </w:r>
+          </w:p>
         </w:tc>
       </w:tr>
       <w:tr>
@@ -2779,7 +2791,11 @@
             </w:tcMar>
             <w:hideMark/>
           </w:tcPr>
-          <w:p/>
+          <w:p>
+            <w:r>
+              <w:t>00:00</w:t>
+            </w:r>
+          </w:p>
         </w:tc>
       </w:tr>
       <w:tr>
@@ -3126,7 +3142,11 @@
             </w:tcMar>
             <w:hideMark/>
           </w:tcPr>
-          <w:p/>
+          <w:p>
+            <w:r>
+              <w:t>00:00</w:t>
+            </w:r>
+          </w:p>
         </w:tc>
       </w:tr>
       <w:tr>
@@ -3487,7 +3507,11 @@
             </w:tcMar>
             <w:hideMark/>
           </w:tcPr>
-          <w:p/>
+          <w:p>
+            <w:r>
+              <w:t>00:00</w:t>
+            </w:r>
+          </w:p>
         </w:tc>
       </w:tr>
       <w:tr>
@@ -3845,7 +3869,11 @@
             </w:tcMar>
             <w:hideMark/>
           </w:tcPr>
-          <w:p/>
+          <w:p>
+            <w:r>
+              <w:t>00:00</w:t>
+            </w:r>
+          </w:p>
         </w:tc>
       </w:tr>
       <w:tr>
@@ -4139,7 +4167,11 @@
             </w:tcMar>
             <w:hideMark/>
           </w:tcPr>
-          <w:p/>
+          <w:p>
+            <w:r>
+              <w:t>00:00</w:t>
+            </w:r>
+          </w:p>
         </w:tc>
       </w:tr>
       <w:tr>
@@ -4804,7 +4836,11 @@
             </w:tcMar>
             <w:hideMark/>
           </w:tcPr>
-          <w:p/>
+          <w:p>
+            <w:r>
+              <w:t>00:00</w:t>
+            </w:r>
+          </w:p>
         </w:tc>
       </w:tr>
       <w:tr>
@@ -5089,7 +5125,11 @@
             </w:tcMar>
             <w:hideMark/>
           </w:tcPr>
-          <w:p/>
+          <w:p>
+            <w:r>
+              <w:t>00:00</w:t>
+            </w:r>
+          </w:p>
         </w:tc>
       </w:tr>
       <w:tr>
@@ -5342,7 +5382,11 @@
             </w:tcMar>
             <w:hideMark/>
           </w:tcPr>
-          <w:p/>
+          <w:p>
+            <w:r>
+              <w:t>00:00</w:t>
+            </w:r>
+          </w:p>
         </w:tc>
       </w:tr>
       <w:tr>
@@ -5595,7 +5639,11 @@
             </w:tcMar>
             <w:hideMark/>
           </w:tcPr>
-          <w:p/>
+          <w:p>
+            <w:r>
+              <w:t>00:00</w:t>
+            </w:r>
+          </w:p>
         </w:tc>
       </w:tr>
       <w:tr>
@@ -5848,7 +5896,11 @@
             </w:tcMar>
             <w:hideMark/>
           </w:tcPr>
-          <w:p/>
+          <w:p>
+            <w:r>
+              <w:t>00:00</w:t>
+            </w:r>
+          </w:p>
         </w:tc>
       </w:tr>
       <w:tr>
@@ -6101,7 +6153,11 @@
             </w:tcMar>
             <w:hideMark/>
           </w:tcPr>
-          <w:p/>
+          <w:p>
+            <w:r>
+              <w:t>00:00</w:t>
+            </w:r>
+          </w:p>
         </w:tc>
       </w:tr>
       <w:tr>
@@ -6412,7 +6468,11 @@
             </w:tcMar>
             <w:hideMark/>
           </w:tcPr>
-          <w:p/>
+          <w:p>
+            <w:r>
+              <w:t>00:00</w:t>
+            </w:r>
+          </w:p>
         </w:tc>
       </w:tr>
       <w:tr>
@@ -6699,7 +6759,11 @@
             </w:tcMar>
             <w:hideMark/>
           </w:tcPr>
-          <w:p/>
+          <w:p>
+            <w:r>
+              <w:t>00:00</w:t>
+            </w:r>
+          </w:p>
         </w:tc>
       </w:tr>
       <w:tr>
@@ -7389,7 +7453,11 @@
             </w:tcMar>
             <w:hideMark/>
           </w:tcPr>
-          <w:p/>
+          <w:p>
+            <w:r>
+              <w:t>00:00</w:t>
+            </w:r>
+          </w:p>
         </w:tc>
       </w:tr>
       <w:tr>
@@ -7716,7 +7784,11 @@
             </w:tcMar>
             <w:hideMark/>
           </w:tcPr>
-          <w:p/>
+          <w:p>
+            <w:r>
+              <w:t>00:00</w:t>
+            </w:r>
+          </w:p>
         </w:tc>
       </w:tr>
       <w:tr>
@@ -7985,7 +8057,11 @@
             </w:tcMar>
             <w:hideMark/>
           </w:tcPr>
-          <w:p/>
+          <w:p>
+            <w:r>
+              <w:t>00:00</w:t>
+            </w:r>
+          </w:p>
         </w:tc>
       </w:tr>
       <w:tr>
@@ -8346,7 +8422,11 @@
               <w:right w:w="100" w:type="dxa"/>
             </w:tcMar>
           </w:tcPr>
-          <w:p/>
+          <w:p>
+            <w:r>
+              <w:t>00:00</w:t>
+            </w:r>
+          </w:p>
         </w:tc>
       </w:tr>
       <w:tr>
@@ -8653,7 +8733,11 @@
             </w:tcMar>
             <w:hideMark/>
           </w:tcPr>
-          <w:p/>
+          <w:p>
+            <w:r>
+              <w:t>00:00</w:t>
+            </w:r>
+          </w:p>
         </w:tc>
       </w:tr>
       <w:tr>
@@ -8931,7 +9015,11 @@
             </w:tcMar>
             <w:hideMark/>
           </w:tcPr>
-          <w:p/>
+          <w:p>
+            <w:r>
+              <w:t>00:00</w:t>
+            </w:r>
+          </w:p>
         </w:tc>
       </w:tr>
       <w:tr>
@@ -9285,7 +9373,11 @@
             </w:tcMar>
             <w:hideMark/>
           </w:tcPr>
-          <w:p/>
+          <w:p>
+            <w:r>
+              <w:t>00:00</w:t>
+            </w:r>
+          </w:p>
         </w:tc>
       </w:tr>
       <w:tr>
@@ -9671,7 +9763,11 @@
             </w:tcMar>
             <w:hideMark/>
           </w:tcPr>
-          <w:p/>
+          <w:p>
+            <w:r>
+              <w:t>00:00</w:t>
+            </w:r>
+          </w:p>
         </w:tc>
       </w:tr>
       <w:tr>
@@ -10163,7 +10259,11 @@
             </w:tcMar>
             <w:hideMark/>
           </w:tcPr>
-          <w:p/>
+          <w:p>
+            <w:r>
+              <w:t>00:00</w:t>
+            </w:r>
+          </w:p>
         </w:tc>
       </w:tr>
       <w:tr>
@@ -10469,7 +10569,11 @@
               <w:right w:w="100" w:type="dxa"/>
             </w:tcMar>
           </w:tcPr>
-          <w:p/>
+          <w:p>
+            <w:r>
+              <w:t>00:00</w:t>
+            </w:r>
+          </w:p>
         </w:tc>
       </w:tr>
       <w:tr>
@@ -10782,7 +10886,11 @@
             </w:tcMar>
             <w:hideMark/>
           </w:tcPr>
-          <w:p/>
+          <w:p>
+            <w:r>
+              <w:t>00:00</w:t>
+            </w:r>
+          </w:p>
         </w:tc>
       </w:tr>
       <w:tr>
@@ -11480,7 +11588,11 @@
             </w:tcMar>
             <w:hideMark/>
           </w:tcPr>
-          <w:p/>
+          <w:p>
+            <w:r>
+              <w:t>00:00</w:t>
+            </w:r>
+          </w:p>
         </w:tc>
       </w:tr>
       <w:tr>
@@ -11743,7 +11855,11 @@
             </w:tcMar>
             <w:hideMark/>
           </w:tcPr>
-          <w:p/>
+          <w:p>
+            <w:r>
+              <w:t>00:00</w:t>
+            </w:r>
+          </w:p>
         </w:tc>
       </w:tr>
       <w:tr>
@@ -12192,7 +12308,11 @@
             </w:tcMar>
             <w:hideMark/>
           </w:tcPr>
-          <w:p/>
+          <w:p>
+            <w:r>
+              <w:t>00:00</w:t>
+            </w:r>
+          </w:p>
         </w:tc>
       </w:tr>
       <w:tr>
@@ -12725,7 +12845,11 @@
             </w:tcMar>
             <w:hideMark/>
           </w:tcPr>
-          <w:p/>
+          <w:p>
+            <w:r>
+              <w:t>00:00</w:t>
+            </w:r>
+          </w:p>
         </w:tc>
       </w:tr>
       <w:tr>
@@ -12989,7 +13113,11 @@
             </w:tcMar>
             <w:hideMark/>
           </w:tcPr>
-          <w:p/>
+          <w:p>
+            <w:r>
+              <w:t>00:00</w:t>
+            </w:r>
+          </w:p>
         </w:tc>
       </w:tr>
     </w:tbl>

</xml_diff>

<commit_message>
Changed question of item 3.4 to 'Is there any documentation about data files?'
</commit_message>
<xml_diff>
--- a/res/template_high.docx
+++ b/res/template_high.docx
@@ -448,16 +448,16 @@
       </w:tblPr>
       <w:tblGrid>
         <w:gridCol w:w="462"/>
-        <w:gridCol w:w="1434"/>
-        <w:gridCol w:w="1670"/>
-        <w:gridCol w:w="3765"/>
-        <w:gridCol w:w="2764"/>
-        <w:gridCol w:w="3765"/>
-        <w:gridCol w:w="376"/>
-        <w:gridCol w:w="2764"/>
-        <w:gridCol w:w="3854"/>
-        <w:gridCol w:w="940"/>
-        <w:gridCol w:w="557"/>
+        <w:gridCol w:w="1153"/>
+        <w:gridCol w:w="1836"/>
+        <w:gridCol w:w="3789"/>
+        <w:gridCol w:w="2782"/>
+        <w:gridCol w:w="3789"/>
+        <w:gridCol w:w="377"/>
+        <w:gridCol w:w="2782"/>
+        <w:gridCol w:w="3877"/>
+        <w:gridCol w:w="945"/>
+        <w:gridCol w:w="559"/>
       </w:tblGrid>
       <w:tr>
         <w:trPr>
@@ -1532,11 +1532,11 @@
               </w:numPr>
             </w:pPr>
             <w:r>
-              <w:t>Confirm whether the listed dataverse collecti</w:t>
+              <w:t xml:space="preserve">Confirm whether the listed dataverse collection refers to the </w:t>
             </w:r>
             <w:r>
               <w:lastRenderedPageBreak/>
-              <w:t>on refers to the same researcher/author</w:t>
+              <w:t>same researcher/author</w:t>
             </w:r>
           </w:p>
         </w:tc>
@@ -1939,8 +1939,11 @@
               </w:numPr>
             </w:pPr>
             <w:r>
+              <w:t xml:space="preserve">Confirm with the depositor that they actually require a </w:t>
+            </w:r>
+            <w:r>
               <w:lastRenderedPageBreak/>
-              <w:t>Confirm with the depositor that they actually require a dataverse (e.g., will there be future deposits?)</w:t>
+              <w:t>dataverse (e.g., will there be future deposits?)</w:t>
             </w:r>
           </w:p>
         </w:tc>
@@ -2826,7 +2829,6 @@
                 <w:b/>
                 <w:bCs/>
               </w:rPr>
-              <w:lastRenderedPageBreak/>
               <w:t>2.2</w:t>
             </w:r>
           </w:p>
@@ -3174,6 +3176,7 @@
                 <w:b/>
                 <w:bCs/>
               </w:rPr>
+              <w:lastRenderedPageBreak/>
               <w:t>2.3</w:t>
             </w:r>
           </w:p>
@@ -3568,15 +3571,7 @@
                 <w:b/>
                 <w:bCs/>
               </w:rPr>
-              <w:t xml:space="preserve">Do all files appear on the </w:t>
-            </w:r>
-            <w:r>
-              <w:rPr>
-                <w:b/>
-                <w:bCs/>
-              </w:rPr>
-              <w:lastRenderedPageBreak/>
-              <w:t>common file format list?</w:t>
+              <w:t>Do all files appear on the common file format list?</w:t>
             </w:r>
           </w:p>
         </w:tc>
@@ -3600,7 +3595,6 @@
           </w:tcPr>
           <w:p>
             <w:r>
-              <w:lastRenderedPageBreak/>
               <w:t>Python scripted.</w:t>
             </w:r>
           </w:p>
@@ -3753,7 +3747,6 @@
               <w:rPr>
                 <w:lang w:val="en-US"/>
               </w:rPr>
-              <w:lastRenderedPageBreak/>
               <w:t>template_dict.</w:t>
             </w:r>
             <w:r>
@@ -3846,7 +3839,6 @@
           </w:tcPr>
           <w:p>
             <w:r>
-              <w:lastRenderedPageBreak/>
               <w:t>Info</w:t>
             </w:r>
           </w:p>
@@ -3929,7 +3921,15 @@
                 <w:b/>
                 <w:bCs/>
               </w:rPr>
-              <w:t>If some files do not appear on the common file format list, is there information or documentation about how to open the files(s)?</w:t>
+              <w:t xml:space="preserve">If some files do not appear on the common file format list, is there information or </w:t>
+            </w:r>
+            <w:r>
+              <w:rPr>
+                <w:b/>
+                <w:bCs/>
+              </w:rPr>
+              <w:lastRenderedPageBreak/>
+              <w:t>documentation about how to open the files(s)?</w:t>
             </w:r>
           </w:p>
         </w:tc>
@@ -3959,7 +3959,12 @@
               </w:numPr>
             </w:pPr>
             <w:r>
-              <w:t>Review documentation files (e.g., README, other relevant files based on name) to determine if there is information about uncommon file types. </w:t>
+              <w:lastRenderedPageBreak/>
+              <w:t xml:space="preserve">Review documentation files (e.g., README, other relevant files based on name) to determine if there </w:t>
+            </w:r>
+            <w:r>
+              <w:lastRenderedPageBreak/>
+              <w:t>is information about uncommon file types. </w:t>
             </w:r>
           </w:p>
         </w:tc>
@@ -4552,72 +4557,64 @@
               <w:rPr>
                 <w:lang w:val="en-US"/>
               </w:rPr>
-              <w:t>Read the `ds_tree.txt` file in the log_file</w:t>
+              <w:t>Read the `ds_tree.txt` file in the log_files folder to identify whether there is a README file</w:t>
             </w:r>
             <w:r>
               <w:rPr>
                 <w:lang w:val="en-US"/>
               </w:rPr>
-              <w:lastRenderedPageBreak/>
-              <w:t>s folder to identify whether there is a README file</w:t>
+              <w:t>,</w:t>
             </w:r>
             <w:r>
               <w:rPr>
                 <w:lang w:val="en-US"/>
               </w:rPr>
-              <w:t>,</w:t>
+              <w:t xml:space="preserve"> but </w:t>
             </w:r>
             <w:r>
               <w:rPr>
                 <w:lang w:val="en-US"/>
               </w:rPr>
-              <w:t xml:space="preserve"> but </w:t>
+              <w:t xml:space="preserve">it </w:t>
             </w:r>
             <w:r>
               <w:rPr>
                 <w:lang w:val="en-US"/>
               </w:rPr>
-              <w:t xml:space="preserve">it </w:t>
-            </w:r>
-            <w:r>
+              <w:t>is not named with ‘README’</w:t>
+            </w:r>
+          </w:p>
+          <w:p>
+            <w:pPr>
               <w:rPr>
                 <w:lang w:val="en-US"/>
               </w:rPr>
-              <w:t>is not named with ‘README’</w:t>
-            </w:r>
-          </w:p>
-          <w:p>
-            <w:pPr>
+            </w:pPr>
+          </w:p>
+        </w:tc>
+        <w:tc>
+          <w:tcPr>
+            <w:tcW w:w="0" w:type="auto"/>
+            <w:tcBorders>
+              <w:top w:val="single" w:sz="8" w:space="0" w:color="000000"/>
+              <w:left w:val="single" w:sz="8" w:space="0" w:color="000000"/>
+              <w:bottom w:val="single" w:sz="8" w:space="0" w:color="000000"/>
+              <w:right w:val="single" w:sz="8" w:space="0" w:color="000000"/>
+            </w:tcBorders>
+            <w:shd w:val="clear" w:color="auto" w:fill="EFEFEF"/>
+            <w:tcMar>
+              <w:top w:w="100" w:type="dxa"/>
+              <w:left w:w="100" w:type="dxa"/>
+              <w:bottom w:w="100" w:type="dxa"/>
+              <w:right w:w="100" w:type="dxa"/>
+            </w:tcMar>
+            <w:hideMark/>
+          </w:tcPr>
+          <w:p>
+            <w:r>
               <w:rPr>
                 <w:lang w:val="en-US"/>
               </w:rPr>
-            </w:pPr>
-          </w:p>
-        </w:tc>
-        <w:tc>
-          <w:tcPr>
-            <w:tcW w:w="0" w:type="auto"/>
-            <w:tcBorders>
-              <w:top w:val="single" w:sz="8" w:space="0" w:color="000000"/>
-              <w:left w:val="single" w:sz="8" w:space="0" w:color="000000"/>
-              <w:bottom w:val="single" w:sz="8" w:space="0" w:color="000000"/>
-              <w:right w:val="single" w:sz="8" w:space="0" w:color="000000"/>
-            </w:tcBorders>
-            <w:shd w:val="clear" w:color="auto" w:fill="EFEFEF"/>
-            <w:tcMar>
-              <w:top w:w="100" w:type="dxa"/>
-              <w:left w:w="100" w:type="dxa"/>
-              <w:bottom w:w="100" w:type="dxa"/>
-              <w:right w:w="100" w:type="dxa"/>
-            </w:tcMar>
-            <w:hideMark/>
-          </w:tcPr>
-          <w:p>
-            <w:r>
-              <w:rPr>
-                <w:lang w:val="en-US"/>
-              </w:rPr>
-              <w:lastRenderedPageBreak/>
               <w:t>{% if template_dict.readme_file.comments|length &gt; 0 %}X{% endif %}</w:t>
             </w:r>
           </w:p>
@@ -4781,7 +4778,6 @@
               </w:rPr>
             </w:pPr>
             <w:r>
-              <w:lastRenderedPageBreak/>
               <w:t>{% else %}(</w:t>
             </w:r>
             <w:r>
@@ -4813,7 +4809,6 @@
           </w:tcPr>
           <w:p>
             <w:r>
-              <w:lastRenderedPageBreak/>
               <w:t>Require</w:t>
             </w:r>
           </w:p>
@@ -6254,7 +6249,11 @@
               </w:numPr>
             </w:pPr>
             <w:r>
-              <w:t>If the files are not listed in the README, we can generate a file tree structure &amp; pass it to the depositors to include in their README, if applicable.</w:t>
+              <w:t xml:space="preserve">If the files are not listed in the README, we can generate a file tree structure &amp; pass it to the </w:t>
+            </w:r>
+            <w:r>
+              <w:lastRenderedPageBreak/>
+              <w:t>depositors to include in their README, if applicable.</w:t>
             </w:r>
           </w:p>
         </w:tc>
@@ -6502,7 +6501,6 @@
                 <w:b/>
                 <w:bCs/>
               </w:rPr>
-              <w:lastRenderedPageBreak/>
               <w:t>3.4</w:t>
             </w:r>
           </w:p>
@@ -6526,11 +6524,7 @@
           </w:tcPr>
           <w:p>
             <w:r>
-              <w:rPr>
-                <w:b/>
-                <w:bCs/>
-              </w:rPr>
-              <w:t>Does tabular data contain documentation about its headers/structures?</w:t>
+              <w:t>Are there any documentation about data files?</w:t>
             </w:r>
           </w:p>
         </w:tc>
@@ -6562,6 +6556,35 @@
               <w:t>Review README, documentation, and data files, to see if there is anything explaining variable headings etc.</w:t>
             </w:r>
           </w:p>
+          <w:p>
+            <w:pPr>
+              <w:numPr>
+                <w:ilvl w:val="0"/>
+                <w:numId w:val="20"/>
+              </w:numPr>
+            </w:pPr>
+            <w:r>
+              <w:t>Does any data documentation explain</w:t>
+            </w:r>
+            <w:r>
+              <w:t xml:space="preserve"> the </w:t>
+            </w:r>
+            <w:r>
+              <w:t xml:space="preserve">tabular </w:t>
+            </w:r>
+            <w:r>
+              <w:t>data file’s</w:t>
+            </w:r>
+            <w:r>
+              <w:t xml:space="preserve"> header</w:t>
+            </w:r>
+            <w:r>
+              <w:t xml:space="preserve"> /</w:t>
+            </w:r>
+            <w:r>
+              <w:t>structure?</w:t>
+            </w:r>
+          </w:p>
         </w:tc>
         <w:tc>
           <w:tcPr>
@@ -6656,19 +6679,6 @@
             </w:tcMar>
             <w:hideMark/>
           </w:tcPr>
-          <w:p>
-            <w:pPr>
-              <w:rPr>
-                <w:lang w:val="en-US"/>
-              </w:rPr>
-            </w:pPr>
-            <w:r>
-              <w:rPr>
-                <w:lang w:val="en-US"/>
-              </w:rPr>
-              <w:t>{% if template_dict.readme_file.comments|length == 0 %}X{% endif %}</w:t>
-            </w:r>
-          </w:p>
           <w:p>
             <w:pPr>
               <w:rPr>
@@ -7156,6 +7166,7 @@
               </w:numPr>
             </w:pPr>
             <w:r>
+              <w:lastRenderedPageBreak/>
               <w:t>Subtitle</w:t>
             </w:r>
           </w:p>
@@ -7197,14 +7208,7 @@
               <w:rPr>
                 <w:lang w:val="en-US"/>
               </w:rPr>
-              <w:t xml:space="preserve">Note that the automated process might flag wrongly (such as </w:t>
-            </w:r>
-            <w:r>
-              <w:rPr>
-                <w:lang w:val="en-US"/>
-              </w:rPr>
-              <w:lastRenderedPageBreak/>
-              <w:t>acronyms/specialized terms. Delete the items from the list accordingly.</w:t>
+              <w:t>Note that the automated process might flag wrongly (such as acronyms/specialized terms. Delete the items from the list accordingly.</w:t>
             </w:r>
           </w:p>
         </w:tc>
@@ -7398,6 +7402,7 @@
           </w:p>
           <w:p>
             <w:r>
+              <w:lastRenderedPageBreak/>
               <w:t>{% else %}(NONE</w:t>
             </w:r>
             <w:r>
@@ -7431,6 +7436,7 @@
           </w:tcPr>
           <w:p>
             <w:r>
+              <w:lastRenderedPageBreak/>
               <w:t>Require</w:t>
             </w:r>
           </w:p>
@@ -8097,6 +8103,7 @@
                 <w:b/>
                 <w:bCs/>
               </w:rPr>
+              <w:lastRenderedPageBreak/>
               <w:t>4.3b</w:t>
             </w:r>
           </w:p>
@@ -8204,7 +8211,6 @@
               <w:t xml:space="preserve">’ is filled for the </w:t>
             </w:r>
             <w:r>
-              <w:lastRenderedPageBreak/>
               <w:t>author</w:t>
             </w:r>
             <w:r>
@@ -8248,7 +8254,6 @@
               </w:rPr>
             </w:pPr>
             <w:r>
-              <w:lastRenderedPageBreak/>
               <w:t>{% if not template_dict.</w:t>
             </w:r>
             <w:r>
@@ -8512,11 +8517,11 @@
               </w:numPr>
             </w:pPr>
             <w:r>
-              <w:t>Read the description and README file and check them against metadata fields. For example, if a geographical location or data collection date/range is mentioned in the description, recommend filling in the relevant metada</w:t>
+              <w:t xml:space="preserve">Read the description and README file and check them against metadata fields. For example, if a geographical location or data collection date/range is mentioned in the description, recommend filling in the relevant </w:t>
             </w:r>
             <w:r>
               <w:lastRenderedPageBreak/>
-              <w:t>ta fields</w:t>
+              <w:t>metadata fields</w:t>
             </w:r>
           </w:p>
           <w:p>
@@ -8552,6 +8557,43 @@
               <w:t xml:space="preserve"> to view the available metadata blocks</w:t>
             </w:r>
           </w:p>
+          <w:p>
+            <w:pPr>
+              <w:numPr>
+                <w:ilvl w:val="0"/>
+                <w:numId w:val="26"/>
+              </w:numPr>
+            </w:pPr>
+            <w:r>
+              <w:t>Note: Valid info means the information is relevant. Examples of items to flag:</w:t>
+            </w:r>
+          </w:p>
+          <w:p>
+            <w:pPr>
+              <w:numPr>
+                <w:ilvl w:val="1"/>
+                <w:numId w:val="26"/>
+              </w:numPr>
+            </w:pPr>
+            <w:r>
+              <w:t>Placeholders (Comin</w:t>
+            </w:r>
+            <w:r>
+              <w:lastRenderedPageBreak/>
+              <w:t>g soon, etc.)</w:t>
+            </w:r>
+          </w:p>
+          <w:p>
+            <w:pPr>
+              <w:numPr>
+                <w:ilvl w:val="1"/>
+                <w:numId w:val="26"/>
+              </w:numPr>
+            </w:pPr>
+            <w:r>
+              <w:t>Wong filed (e.g. put author name in the title)</w:t>
+            </w:r>
+          </w:p>
         </w:tc>
         <w:tc>
           <w:tcPr>
@@ -8767,6 +8809,7 @@
                 <w:b/>
                 <w:bCs/>
               </w:rPr>
+              <w:lastRenderedPageBreak/>
               <w:t>4.5</w:t>
             </w:r>
           </w:p>
@@ -9049,6 +9092,7 @@
                 <w:b/>
                 <w:bCs/>
               </w:rPr>
+              <w:lastRenderedPageBreak/>
               <w:t>4.6</w:t>
             </w:r>
           </w:p>
@@ -9076,43 +9120,30 @@
                 <w:b/>
                 <w:bCs/>
               </w:rPr>
-              <w:t xml:space="preserve">Does the dataset description provide </w:t>
-            </w:r>
-            <w:r>
-              <w:rPr>
-                <w:b/>
-                <w:bCs/>
-              </w:rPr>
-              <w:lastRenderedPageBreak/>
-              <w:t>sufficient information?</w:t>
-            </w:r>
-          </w:p>
-        </w:tc>
-        <w:tc>
-          <w:tcPr>
-            <w:tcW w:w="0" w:type="auto"/>
-            <w:tcBorders>
-              <w:top w:val="single" w:sz="8" w:space="0" w:color="000000"/>
-              <w:left w:val="single" w:sz="8" w:space="0" w:color="000000"/>
-              <w:bottom w:val="single" w:sz="8" w:space="0" w:color="000000"/>
-              <w:right w:val="single" w:sz="8" w:space="0" w:color="000000"/>
-            </w:tcBorders>
-            <w:tcMar>
-              <w:top w:w="100" w:type="dxa"/>
-              <w:left w:w="100" w:type="dxa"/>
-              <w:bottom w:w="100" w:type="dxa"/>
-              <w:right w:w="100" w:type="dxa"/>
-            </w:tcMar>
-            <w:hideMark/>
-          </w:tcPr>
-          <w:p>
-            <w:r>
-              <w:lastRenderedPageBreak/>
-              <w:t xml:space="preserve">Still need to discover/formulate the best practices for </w:t>
-            </w:r>
-            <w:r>
-              <w:lastRenderedPageBreak/>
-              <w:t>writing dataset descriptions.</w:t>
+              <w:t>Does the dataset description provide sufficient information?</w:t>
+            </w:r>
+          </w:p>
+        </w:tc>
+        <w:tc>
+          <w:tcPr>
+            <w:tcW w:w="0" w:type="auto"/>
+            <w:tcBorders>
+              <w:top w:val="single" w:sz="8" w:space="0" w:color="000000"/>
+              <w:left w:val="single" w:sz="8" w:space="0" w:color="000000"/>
+              <w:bottom w:val="single" w:sz="8" w:space="0" w:color="000000"/>
+              <w:right w:val="single" w:sz="8" w:space="0" w:color="000000"/>
+            </w:tcBorders>
+            <w:tcMar>
+              <w:top w:w="100" w:type="dxa"/>
+              <w:left w:w="100" w:type="dxa"/>
+              <w:bottom w:w="100" w:type="dxa"/>
+              <w:right w:w="100" w:type="dxa"/>
+            </w:tcMar>
+            <w:hideMark/>
+          </w:tcPr>
+          <w:p>
+            <w:r>
+              <w:t>Still need to discover/formulate the best practices for writing dataset descriptions.</w:t>
             </w:r>
           </w:p>
           <w:p/>
@@ -9407,7 +9438,6 @@
                 <w:b/>
                 <w:bCs/>
               </w:rPr>
-              <w:lastRenderedPageBreak/>
               <w:t>4.7</w:t>
             </w:r>
           </w:p>
@@ -9435,29 +9465,38 @@
                 <w:b/>
                 <w:bCs/>
               </w:rPr>
-              <w:t>Does the dataset include keywords?</w:t>
-            </w:r>
-          </w:p>
-        </w:tc>
-        <w:tc>
-          <w:tcPr>
-            <w:tcW w:w="0" w:type="auto"/>
-            <w:tcBorders>
-              <w:top w:val="single" w:sz="8" w:space="0" w:color="000000"/>
-              <w:left w:val="single" w:sz="8" w:space="0" w:color="000000"/>
-              <w:bottom w:val="single" w:sz="8" w:space="0" w:color="000000"/>
-              <w:right w:val="single" w:sz="8" w:space="0" w:color="000000"/>
-            </w:tcBorders>
-            <w:tcMar>
-              <w:top w:w="100" w:type="dxa"/>
-              <w:left w:w="100" w:type="dxa"/>
-              <w:bottom w:w="100" w:type="dxa"/>
-              <w:right w:w="100" w:type="dxa"/>
-            </w:tcMar>
-            <w:hideMark/>
-          </w:tcPr>
-          <w:p>
-            <w:r>
+              <w:t xml:space="preserve">Does the dataset include </w:t>
+            </w:r>
+            <w:r>
+              <w:rPr>
+                <w:b/>
+                <w:bCs/>
+              </w:rPr>
+              <w:lastRenderedPageBreak/>
+              <w:t>keywords?</w:t>
+            </w:r>
+          </w:p>
+        </w:tc>
+        <w:tc>
+          <w:tcPr>
+            <w:tcW w:w="0" w:type="auto"/>
+            <w:tcBorders>
+              <w:top w:val="single" w:sz="8" w:space="0" w:color="000000"/>
+              <w:left w:val="single" w:sz="8" w:space="0" w:color="000000"/>
+              <w:bottom w:val="single" w:sz="8" w:space="0" w:color="000000"/>
+              <w:right w:val="single" w:sz="8" w:space="0" w:color="000000"/>
+            </w:tcBorders>
+            <w:tcMar>
+              <w:top w:w="100" w:type="dxa"/>
+              <w:left w:w="100" w:type="dxa"/>
+              <w:bottom w:w="100" w:type="dxa"/>
+              <w:right w:w="100" w:type="dxa"/>
+            </w:tcMar>
+            <w:hideMark/>
+          </w:tcPr>
+          <w:p>
+            <w:r>
+              <w:lastRenderedPageBreak/>
               <w:t>Python scripted.</w:t>
             </w:r>
           </w:p>
@@ -9469,7 +9508,11 @@
               </w:numPr>
             </w:pPr>
             <w:r>
-              <w:t>If no/few keywords are included, recommend including some. </w:t>
+              <w:t xml:space="preserve">If no/few keywords </w:t>
+            </w:r>
+            <w:r>
+              <w:lastRenderedPageBreak/>
+              <w:t>are included, recommend including some. </w:t>
             </w:r>
           </w:p>
           <w:p>
@@ -9506,6 +9549,7 @@
               <w:rPr>
                 <w:lang w:val="en-US"/>
               </w:rPr>
+              <w:lastRenderedPageBreak/>
               <w:t>{% if template_dict.</w:t>
             </w:r>
             <w:r>
@@ -9665,7 +9709,11 @@
               <w:t>keywords</w:t>
             </w:r>
             <w:r>
-              <w:t>|length &gt; 0</w:t>
+              <w:t xml:space="preserve">|length &gt; </w:t>
+            </w:r>
+            <w:r>
+              <w:lastRenderedPageBreak/>
+              <w:t>0</w:t>
             </w:r>
             <w:r>
               <w:t xml:space="preserve"> %}</w:t>
@@ -9742,6 +9790,7 @@
           </w:tcPr>
           <w:p>
             <w:r>
+              <w:lastRenderedPageBreak/>
               <w:t>Recommend</w:t>
             </w:r>
           </w:p>
@@ -9845,6 +9894,11 @@
             </w:tcMar>
             <w:hideMark/>
           </w:tcPr>
+          <w:p>
+            <w:r>
+              <w:t>Python scripted.</w:t>
+            </w:r>
+          </w:p>
           <w:p>
             <w:pPr>
               <w:numPr>
@@ -9853,11 +9907,7 @@
               </w:numPr>
             </w:pPr>
             <w:r>
-              <w:t xml:space="preserve">If no Researcher ID (such as ORCID, or other identifier) is listed, let them know they may </w:t>
-            </w:r>
-            <w:r>
-              <w:lastRenderedPageBreak/>
-              <w:t>want to include it</w:t>
+              <w:t>If no Researcher ID (such as ORCID, or other identifier) is listed, let them know they may want to include it</w:t>
             </w:r>
           </w:p>
         </w:tc>
@@ -9888,7 +9938,6 @@
               <w:rPr>
                 <w:lang w:val="en-US"/>
               </w:rPr>
-              <w:lastRenderedPageBreak/>
               <w:t>{% if template_dict.</w:t>
             </w:r>
             <w:r>
@@ -10337,7 +10386,15 @@
                 <w:b/>
                 <w:bCs/>
               </w:rPr>
-              <w:t>If there is a related dataset associated with the dataset, has a DOI or other identifier been included in the publication metadata?</w:t>
+              <w:t xml:space="preserve">If there is a related dataset associated with the dataset, has a DOI or other identifier </w:t>
+            </w:r>
+            <w:r>
+              <w:rPr>
+                <w:b/>
+                <w:bCs/>
+              </w:rPr>
+              <w:lastRenderedPageBreak/>
+              <w:t>been included in the publication metadata?</w:t>
             </w:r>
           </w:p>
         </w:tc>
@@ -10365,13 +10422,18 @@
               </w:numPr>
             </w:pPr>
             <w:r>
+              <w:lastRenderedPageBreak/>
               <w:t xml:space="preserve">If there’s a related article, has the DOI or other </w:t>
             </w:r>
             <w:r>
               <w:t xml:space="preserve">persistent </w:t>
             </w:r>
             <w:r>
-              <w:t>identifier been included </w:t>
+              <w:t xml:space="preserve">identifier </w:t>
+            </w:r>
+            <w:r>
+              <w:lastRenderedPageBreak/>
+              <w:t>been included </w:t>
             </w:r>
           </w:p>
         </w:tc>
@@ -10677,11 +10739,7 @@
               </w:numPr>
             </w:pPr>
             <w:r>
-              <w:t xml:space="preserve">If metadata indicates a related publication or project, </w:t>
-            </w:r>
-            <w:r>
-              <w:lastRenderedPageBreak/>
-              <w:t>suggest adding a corresponding suffix to the title.</w:t>
+              <w:t>If metadata indicates a related publication or project, suggest adding a corresponding suffix to the title.</w:t>
             </w:r>
           </w:p>
         </w:tc>
@@ -11237,7 +11295,15 @@
                 <w:b/>
                 <w:bCs/>
               </w:rPr>
-              <w:t>Does the dataset contain any obvious sensitivity issues, such as direct identifiers?</w:t>
+              <w:t xml:space="preserve">Does the dataset contain </w:t>
+            </w:r>
+            <w:r>
+              <w:rPr>
+                <w:b/>
+                <w:bCs/>
+              </w:rPr>
+              <w:lastRenderedPageBreak/>
+              <w:t>any obvious sensitivity issues, such as direct identifiers?</w:t>
             </w:r>
           </w:p>
         </w:tc>
@@ -11267,7 +11333,12 @@
               </w:numPr>
             </w:pPr>
             <w:r>
-              <w:t>Review documentation and file names and see if there are any that should be opened and reviewed (e.g. if a file is named “participant survey” - maybe open that one)</w:t>
+              <w:lastRenderedPageBreak/>
+              <w:t xml:space="preserve">Review documentation </w:t>
+            </w:r>
+            <w:r>
+              <w:lastRenderedPageBreak/>
+              <w:t>and file names and see if there are any that should be opened and reviewed (e.g. if a file is named “participant survey” - maybe open that one)</w:t>
             </w:r>
           </w:p>
           <w:p>
@@ -11278,11 +11349,7 @@
               </w:numPr>
             </w:pPr>
             <w:r>
-              <w:t xml:space="preserve">Review description, notes, and terms of </w:t>
-            </w:r>
-            <w:r>
-              <w:lastRenderedPageBreak/>
-              <w:t>access metadata fields.</w:t>
+              <w:t>Review description, notes, and terms of access metadata fields.</w:t>
             </w:r>
           </w:p>
           <w:p>
@@ -11310,7 +11377,11 @@
               </w:numPr>
             </w:pPr>
             <w:r>
-              <w:t>Social Security Numbers (SSNs)</w:t>
+              <w:t>Social Security Nu</w:t>
+            </w:r>
+            <w:r>
+              <w:lastRenderedPageBreak/>
+              <w:t>mbers (SSNs)</w:t>
             </w:r>
           </w:p>
           <w:p>
@@ -11321,11 +11392,7 @@
               </w:numPr>
             </w:pPr>
             <w:r>
-              <w:t>Canadia</w:t>
-            </w:r>
-            <w:r>
-              <w:lastRenderedPageBreak/>
-              <w:t>n Social Insurance Number (SINs)</w:t>
+              <w:t>Canadian Social Insurance Number (SINs)</w:t>
             </w:r>
           </w:p>
           <w:p>
@@ -11336,7 +11403,11 @@
               </w:numPr>
             </w:pPr>
             <w:r>
-              <w:t>Credit card numbers</w:t>
+              <w:t>Credit card num</w:t>
+            </w:r>
+            <w:r>
+              <w:lastRenderedPageBreak/>
+              <w:t>bers</w:t>
             </w:r>
           </w:p>
           <w:p>
@@ -11347,7 +11418,6 @@
               </w:numPr>
             </w:pPr>
             <w:r>
-              <w:lastRenderedPageBreak/>
               <w:t>Email addresses</w:t>
             </w:r>
           </w:p>
@@ -11370,11 +11440,7 @@
               </w:numPr>
             </w:pPr>
             <w:r>
-              <w:t>vCards (Virtual Conta</w:t>
-            </w:r>
-            <w:r>
-              <w:lastRenderedPageBreak/>
-              <w:t>ct Files)</w:t>
+              <w:t>vCards (Virtual Contact Files)</w:t>
             </w:r>
           </w:p>
         </w:tc>
@@ -11566,6 +11632,7 @@
           </w:tcPr>
           <w:p>
             <w:r>
+              <w:lastRenderedPageBreak/>
               <w:t>Require</w:t>
             </w:r>
           </w:p>
@@ -11953,11 +12020,7 @@
               </w:numPr>
             </w:pPr>
             <w:r>
-              <w:t>If the dataset uses CC0 - confirm this is what the deposit</w:t>
-            </w:r>
-            <w:r>
-              <w:lastRenderedPageBreak/>
-              <w:t>or wants </w:t>
+              <w:t>If the dataset uses CC0 - confirm this is what the depositor wants </w:t>
             </w:r>
           </w:p>
           <w:p>
@@ -12186,7 +12249,6 @@
               </w:rPr>
             </w:pPr>
             <w:r>
-              <w:lastRenderedPageBreak/>
               <w:t>{% if template_dict.terms_license.licenseName is not none %}{{ template_dict.terms_license.licenseName }}{% else %}(NONE){% endif %}</w:t>
             </w:r>
           </w:p>
@@ -12231,7 +12293,7 @@
               <w:tblLook w:val="04A0" w:firstRow="1" w:lastRow="0" w:firstColumn="1" w:lastColumn="0" w:noHBand="0" w:noVBand="1"/>
             </w:tblPr>
             <w:tblGrid>
-              <w:gridCol w:w="3644"/>
+              <w:gridCol w:w="3662"/>
             </w:tblGrid>
             <w:tr>
               <w:tc>
@@ -12254,7 +12316,11 @@
                     <w:t xml:space="preserve"> is not none %}{{ template_dict.terms_license.</w:t>
                   </w:r>
                   <w:r>
-                    <w:t>termsOfUse</w:t>
+                    <w:t>ter</w:t>
+                  </w:r>
+                  <w:r>
+                    <w:lastRenderedPageBreak/>
+                    <w:t>msOfUse</w:t>
                   </w:r>
                   <w:r>
                     <w:t xml:space="preserve"> }}{% else %}(NONE){% endif %}</w:t>
@@ -12414,11 +12480,7 @@
               </w:numPr>
             </w:pPr>
             <w:r>
-              <w:t xml:space="preserve">If there are Terms of Access, review to ensure they </w:t>
-            </w:r>
-            <w:r>
-              <w:lastRenderedPageBreak/>
-              <w:t>are clear.</w:t>
+              <w:t>If there are Terms of Access, review to ensure they are clear.</w:t>
             </w:r>
           </w:p>
         </w:tc>
@@ -12444,7 +12506,6 @@
                 <w:rFonts w:hint="eastAsia"/>
                 <w:lang w:val="en-US"/>
               </w:rPr>
-              <w:lastRenderedPageBreak/>
               <w:t xml:space="preserve">{% if </w:t>
             </w:r>
             <w:r>
@@ -12771,7 +12832,7 @@
               <w:tblLook w:val="04A0" w:firstRow="1" w:lastRow="0" w:firstColumn="1" w:lastColumn="0" w:noHBand="0" w:noVBand="1"/>
             </w:tblPr>
             <w:tblGrid>
-              <w:gridCol w:w="3644"/>
+              <w:gridCol w:w="3662"/>
             </w:tblGrid>
             <w:tr>
               <w:tc>
@@ -14641,7 +14702,7 @@
         <w:sz w:val="20"/>
       </w:rPr>
     </w:lvl>
-    <w:lvl w:ilvl="1" w:tentative="1">
+    <w:lvl w:ilvl="1">
       <w:start w:val="1"/>
       <w:numFmt w:val="bullet"/>
       <w:lvlText w:val="o"/>

</xml_diff>

<commit_message>
Added support for exporting long file lists (cat. 2 in the checklist) to a txt file, rather that being a long list in docx that make the log unusable.
</commit_message>
<xml_diff>
--- a/res/template_high.docx
+++ b/res/template_high.docx
@@ -447,17 +447,17 @@
         <w:tblLook w:val="04A0" w:firstRow="1" w:lastRow="0" w:firstColumn="1" w:lastColumn="0" w:noHBand="0" w:noVBand="1"/>
       </w:tblPr>
       <w:tblGrid>
-        <w:gridCol w:w="462"/>
-        <w:gridCol w:w="1153"/>
-        <w:gridCol w:w="1836"/>
-        <w:gridCol w:w="3789"/>
-        <w:gridCol w:w="2782"/>
-        <w:gridCol w:w="3789"/>
-        <w:gridCol w:w="377"/>
-        <w:gridCol w:w="2782"/>
-        <w:gridCol w:w="3877"/>
-        <w:gridCol w:w="945"/>
-        <w:gridCol w:w="559"/>
+        <w:gridCol w:w="460"/>
+        <w:gridCol w:w="1145"/>
+        <w:gridCol w:w="1824"/>
+        <w:gridCol w:w="3763"/>
+        <w:gridCol w:w="2763"/>
+        <w:gridCol w:w="3763"/>
+        <w:gridCol w:w="376"/>
+        <w:gridCol w:w="2763"/>
+        <w:gridCol w:w="3852"/>
+        <w:gridCol w:w="939"/>
+        <w:gridCol w:w="703"/>
       </w:tblGrid>
       <w:tr>
         <w:trPr>
@@ -1408,7 +1408,7 @@
           </w:tcPr>
           <w:p>
             <w:r>
-              <w:t>00:00</w:t>
+              <w:t>00:00:00</w:t>
             </w:r>
           </w:p>
         </w:tc>
@@ -1474,7 +1474,7 @@
                 <w:b/>
                 <w:bCs/>
               </w:rPr>
-              <w:t xml:space="preserve">Has the depositor (or their research group) previously created or submitted to a </w:t>
+              <w:t>Has the depositor (or their research group) previously created or submitted to a datavers</w:t>
             </w:r>
             <w:r>
               <w:rPr>
@@ -1482,7 +1482,7 @@
                 <w:bCs/>
               </w:rPr>
               <w:lastRenderedPageBreak/>
-              <w:t>dataverse</w:t>
+              <w:t>e</w:t>
             </w:r>
             <w:r>
               <w:rPr>
@@ -1532,11 +1532,11 @@
               </w:numPr>
             </w:pPr>
             <w:r>
-              <w:t xml:space="preserve">Confirm whether the listed dataverse collection refers to the </w:t>
+              <w:t xml:space="preserve">Confirm whether the listed dataverse collection refers to the same </w:t>
             </w:r>
             <w:r>
               <w:lastRenderedPageBreak/>
-              <w:t>same researcher/author</w:t>
+              <w:t>researcher/author</w:t>
             </w:r>
           </w:p>
         </w:tc>
@@ -1767,6 +1767,14 @@
               <w:t>{% endfor %} {% endfor %}</w:t>
             </w:r>
           </w:p>
+          <w:p>
+            <w:r>
+              <w:rPr>
+                <w:u w:val="single"/>
+              </w:rPr>
+              <w:t>Curator’s comments:</w:t>
+            </w:r>
+          </w:p>
         </w:tc>
         <w:tc>
           <w:tcPr>
@@ -1813,7 +1821,7 @@
           </w:tcPr>
           <w:p>
             <w:r>
-              <w:t>00:00</w:t>
+              <w:t>00:00:00</w:t>
             </w:r>
           </w:p>
         </w:tc>
@@ -2123,7 +2131,7 @@
           </w:tcPr>
           <w:p>
             <w:r>
-              <w:t>00:00</w:t>
+              <w:t>00:00:00</w:t>
             </w:r>
           </w:p>
         </w:tc>
@@ -2640,25 +2648,13 @@
               <w:br/>
             </w:r>
             <w:r>
-              <w:t xml:space="preserve">{% if </w:t>
-            </w:r>
-            <w:r>
-              <w:rPr>
-                <w:lang w:val="en-US"/>
-              </w:rPr>
-              <w:t>template_dict.file_open.comments</w:t>
-            </w:r>
-            <w:r>
-              <w:t xml:space="preserve"> |length &gt; 0</w:t>
-            </w:r>
-            <w:r>
-              <w:t xml:space="preserve"> %}</w:t>
-            </w:r>
-            <w:r>
-              <w:rPr>
-                <w:lang w:val="en-US"/>
-              </w:rPr>
-              <w:t>{% for item in template_dict.file_open.comments %}</w:t>
+              <w:t xml:space="preserve">{% if template_dict.file_open.comments |length &gt; 0 and template_dict.file_open.comments |length &lt; </w:t>
+            </w:r>
+            <w:r>
+              <w:t>50</w:t>
+            </w:r>
+            <w:r>
+              <w:t xml:space="preserve"> %}{% for item in template_dict.file_open.comments %}</w:t>
             </w:r>
           </w:p>
           <w:p>
@@ -2680,11 +2676,35 @@
             </w:r>
           </w:p>
           <w:p>
-            <w:pPr>
-              <w:rPr>
-                <w:lang w:val="en-US"/>
-              </w:rPr>
-            </w:pPr>
+            <w:r>
+              <w:t xml:space="preserve">{% elif template_dict.file_open.comments |length &gt;= </w:t>
+            </w:r>
+            <w:r>
+              <w:t>50</w:t>
+            </w:r>
+            <w:r>
+              <w:t xml:space="preserve"> %}</w:t>
+            </w:r>
+            <w:r>
+              <w:t>(</w:t>
+            </w:r>
+            <w:r>
+              <w:t xml:space="preserve">See the </w:t>
+            </w:r>
+            <w:r>
+              <w:t>corrupted_file</w:t>
+            </w:r>
+            <w:r>
+              <w:t>s</w:t>
+            </w:r>
+            <w:r>
+              <w:t>.txt</w:t>
+            </w:r>
+            <w:r>
+              <w:t>)</w:t>
+            </w:r>
+          </w:p>
+          <w:p>
             <w:r>
               <w:t>{% else %}(NONE){% endif %}</w:t>
             </w:r>
@@ -2709,25 +2729,13 @@
               <w:br/>
             </w:r>
             <w:r>
-              <w:t xml:space="preserve">{% if </w:t>
-            </w:r>
-            <w:r>
-              <w:rPr>
-                <w:lang w:val="en-US"/>
-              </w:rPr>
-              <w:t>template_dict.file_open.not_checked</w:t>
-            </w:r>
-            <w:r>
-              <w:t xml:space="preserve"> |length &gt; 0</w:t>
-            </w:r>
-            <w:r>
-              <w:t xml:space="preserve"> %}</w:t>
-            </w:r>
-            <w:r>
-              <w:rPr>
-                <w:lang w:val="en-US"/>
-              </w:rPr>
-              <w:t>{% for item in template_dict.file_open.not_checked %}</w:t>
+              <w:t xml:space="preserve">{% if template_dict.file_open.not_checked |length &gt; 0 and template_dict.file_open.not_checked |length &lt; </w:t>
+            </w:r>
+            <w:r>
+              <w:t>50</w:t>
+            </w:r>
+            <w:r>
+              <w:t xml:space="preserve"> %}{% for item in template_dict.file_open.not_checked %}</w:t>
             </w:r>
           </w:p>
           <w:p>
@@ -2750,7 +2758,21 @@
           </w:p>
           <w:p>
             <w:r>
-              <w:t>{% else %}(NONE){% endif %}</w:t>
+              <w:t xml:space="preserve">{% elif template_dict.file_open.not_checked |length &gt;= </w:t>
+            </w:r>
+            <w:r>
+              <w:t>2</w:t>
+            </w:r>
+            <w:r>
+              <w:t xml:space="preserve"> %}(See the unchecked_file_list.txt){% else %}(NONE){% endif %}</w:t>
+            </w:r>
+          </w:p>
+          <w:p>
+            <w:r>
+              <w:rPr>
+                <w:u w:val="single"/>
+              </w:rPr>
+              <w:t>Curator’s comments:</w:t>
             </w:r>
           </w:p>
         </w:tc>
@@ -2796,7 +2818,7 @@
           </w:tcPr>
           <w:p>
             <w:r>
-              <w:t>00:00</w:t>
+              <w:t>00:00:00</w:t>
             </w:r>
           </w:p>
         </w:tc>
@@ -2829,6 +2851,7 @@
                 <w:b/>
                 <w:bCs/>
               </w:rPr>
+              <w:lastRenderedPageBreak/>
               <w:t>2.2</w:t>
             </w:r>
           </w:p>
@@ -3060,25 +3083,7 @@
               <w:br/>
             </w:r>
             <w:r>
-              <w:t>{% if template_dict.restricted_files.comment</w:t>
-            </w:r>
-            <w:r>
-              <w:rPr>
-                <w:rFonts w:hint="eastAsia"/>
-              </w:rPr>
-              <w:t>s</w:t>
-            </w:r>
-            <w:r>
-              <w:t>|length &gt; 0</w:t>
-            </w:r>
-            <w:r>
-              <w:t xml:space="preserve"> %}</w:t>
-            </w:r>
-            <w:r>
-              <w:rPr>
-                <w:lang w:val="en-US"/>
-              </w:rPr>
-              <w:t>{% for item in template_dict.special_characters.comments %}</w:t>
+              <w:t>{% if template_dict.restricted_files.comments|length &gt; 0 and template_dict.restricted_files.comments|length &lt; 50 %}{% for item in template_dict.special_characters.comments %}</w:t>
             </w:r>
           </w:p>
           <w:p>
@@ -3098,9 +3103,27 @@
           </w:p>
           <w:p>
             <w:r>
+              <w:t>{% elif template_dict.restricted_files.comments|length &gt;= 50 %}(See the special_characters.txt)</w:t>
+            </w:r>
+          </w:p>
+          <w:p>
+            <w:r>
               <w:t>{% else %}(NONE){% endif %}</w:t>
             </w:r>
           </w:p>
+          <w:p>
+            <w:pPr>
+              <w:rPr>
+                <w:u w:val="single"/>
+              </w:rPr>
+            </w:pPr>
+            <w:r>
+              <w:rPr>
+                <w:u w:val="single"/>
+              </w:rPr>
+              <w:t>Curator’s comments:</w:t>
+            </w:r>
+          </w:p>
         </w:tc>
         <w:tc>
           <w:tcPr>
@@ -3146,7 +3169,7 @@
           </w:tcPr>
           <w:p>
             <w:r>
-              <w:t>00:00</w:t>
+              <w:t>00:00:00</w:t>
             </w:r>
           </w:p>
         </w:tc>
@@ -3176,7 +3199,6 @@
                 <w:b/>
                 <w:bCs/>
               </w:rPr>
-              <w:lastRenderedPageBreak/>
               <w:t>2.3</w:t>
             </w:r>
           </w:p>
@@ -3422,25 +3444,7 @@
               <w:br/>
             </w:r>
             <w:r>
-              <w:t xml:space="preserve">{% if </w:t>
-            </w:r>
-            <w:r>
-              <w:rPr>
-                <w:lang w:val="en-US"/>
-              </w:rPr>
-              <w:t>template_dict.file_ext.comments</w:t>
-            </w:r>
-            <w:r>
-              <w:t xml:space="preserve"> |length &gt; 0</w:t>
-            </w:r>
-            <w:r>
-              <w:t xml:space="preserve"> %}</w:t>
-            </w:r>
-            <w:r>
-              <w:rPr>
-                <w:lang w:val="en-US"/>
-              </w:rPr>
-              <w:t>{% for item in template_dict.file_ext.comments %}</w:t>
+              <w:t>{% if template_dict.file_ext.comments |length &gt; 0 and template_dict.file_ext.comments |length &lt; 50 %}{% for item in template_dict.file_ext.comments %}</w:t>
             </w:r>
           </w:p>
           <w:p>
@@ -3464,8 +3468,26 @@
               <w:spacing w:line="256" w:lineRule="auto"/>
             </w:pPr>
             <w:r>
-              <w:t>{% else %}(NONE){% endif %}</w:t>
-            </w:r>
+              <w:t>{% elif template_dict.file_ext.comments |length &gt;= 50 %}(See the no_file_extension.txt) {% else %}(NONE){% endif %}</w:t>
+            </w:r>
+          </w:p>
+          <w:p>
+            <w:pPr>
+              <w:rPr>
+                <w:u w:val="single"/>
+              </w:rPr>
+            </w:pPr>
+            <w:r>
+              <w:rPr>
+                <w:u w:val="single"/>
+              </w:rPr>
+              <w:t>Curator’s comments:</w:t>
+            </w:r>
+          </w:p>
+          <w:p>
+            <w:pPr>
+              <w:spacing w:line="256" w:lineRule="auto"/>
+            </w:pPr>
           </w:p>
         </w:tc>
         <w:tc>
@@ -3512,7 +3534,7 @@
           </w:tcPr>
           <w:p>
             <w:r>
-              <w:t>00:00</w:t>
+              <w:t>00:00:00</w:t>
             </w:r>
           </w:p>
         </w:tc>
@@ -3571,7 +3593,15 @@
                 <w:b/>
                 <w:bCs/>
               </w:rPr>
-              <w:t>Do all files appear on the common file format list?</w:t>
+              <w:t xml:space="preserve">Do all files appear on the common </w:t>
+            </w:r>
+            <w:r>
+              <w:rPr>
+                <w:b/>
+                <w:bCs/>
+              </w:rPr>
+              <w:lastRenderedPageBreak/>
+              <w:t>file format list?</w:t>
             </w:r>
           </w:p>
         </w:tc>
@@ -3595,6 +3625,7 @@
           </w:tcPr>
           <w:p>
             <w:r>
+              <w:lastRenderedPageBreak/>
               <w:t>Python scripted.</w:t>
             </w:r>
           </w:p>
@@ -3741,49 +3772,11 @@
               <w:br/>
             </w:r>
             <w:r>
-              <w:t xml:space="preserve">{% if </w:t>
-            </w:r>
-            <w:r>
-              <w:rPr>
-                <w:lang w:val="en-US"/>
-              </w:rPr>
-              <w:t>template_dict.</w:t>
-            </w:r>
-            <w:r>
-              <w:rPr>
-                <w:lang w:val="en-US"/>
-              </w:rPr>
-              <w:t>common_file_format</w:t>
-            </w:r>
-            <w:r>
-              <w:rPr>
-                <w:lang w:val="en-US"/>
-              </w:rPr>
-              <w:t>.comments</w:t>
-            </w:r>
-            <w:r>
-              <w:t>|length &gt; 0</w:t>
-            </w:r>
-            <w:r>
-              <w:t xml:space="preserve"> %}</w:t>
-            </w:r>
-            <w:r>
-              <w:rPr>
-                <w:lang w:val="en-US"/>
-              </w:rPr>
-              <w:t>{% for item in template_dict.</w:t>
-            </w:r>
-            <w:r>
-              <w:rPr>
-                <w:lang w:val="en-US"/>
-              </w:rPr>
-              <w:t>common_file_format</w:t>
-            </w:r>
-            <w:r>
-              <w:rPr>
-                <w:lang w:val="en-US"/>
-              </w:rPr>
-              <w:t>.comments %}</w:t>
+              <w:t xml:space="preserve">{% if template_dict.common_file_format.comments|length &gt; 0 and </w:t>
+            </w:r>
+            <w:r>
+              <w:lastRenderedPageBreak/>
+              <w:t>template_dict.common_file_format.comments|length &lt; 50 %}{% for item in template_dict.common_file_format.comments %}</w:t>
             </w:r>
           </w:p>
           <w:p>
@@ -3815,6 +3808,11 @@
           </w:p>
           <w:p>
             <w:r>
+              <w:t>{% elif template_dict.common_file_format.comments|length &gt;= 50 %}(See the uncommon_file_extension.txt)</w:t>
+            </w:r>
+          </w:p>
+          <w:p>
+            <w:r>
               <w:t>{% else %}(NONE){% endif %}</w:t>
             </w:r>
           </w:p>
@@ -3839,6 +3837,7 @@
           </w:tcPr>
           <w:p>
             <w:r>
+              <w:lastRenderedPageBreak/>
               <w:t>Info</w:t>
             </w:r>
           </w:p>
@@ -3863,7 +3862,7 @@
           </w:tcPr>
           <w:p>
             <w:r>
-              <w:t>00:00</w:t>
+              <w:t>00:00:00</w:t>
             </w:r>
           </w:p>
         </w:tc>
@@ -3921,15 +3920,7 @@
                 <w:b/>
                 <w:bCs/>
               </w:rPr>
-              <w:t xml:space="preserve">If some files do not appear on the common file format list, is there information or </w:t>
-            </w:r>
-            <w:r>
-              <w:rPr>
-                <w:b/>
-                <w:bCs/>
-              </w:rPr>
-              <w:lastRenderedPageBreak/>
-              <w:t>documentation about how to open the files(s)?</w:t>
+              <w:t>If some files do not appear on the common file format list, is there information or documentation about how to open the files(s)?</w:t>
             </w:r>
           </w:p>
         </w:tc>
@@ -3959,12 +3950,7 @@
               </w:numPr>
             </w:pPr>
             <w:r>
-              <w:lastRenderedPageBreak/>
-              <w:t xml:space="preserve">Review documentation files (e.g., README, other relevant files based on name) to determine if there </w:t>
-            </w:r>
-            <w:r>
-              <w:lastRenderedPageBreak/>
-              <w:t>is information about uncommon file types. </w:t>
+              <w:t>Review documentation files (e.g., README, other relevant files based on name) to determine if there is information about uncommon file types. </w:t>
             </w:r>
           </w:p>
         </w:tc>
@@ -4125,10 +4111,30 @@
             <w:pPr>
               <w:numPr>
                 <w:ilvl w:val="0"/>
-                <w:numId w:val="12"/>
+                <w:numId w:val="54"/>
               </w:numPr>
             </w:pPr>
           </w:p>
+          <w:p>
+            <w:pPr>
+              <w:rPr>
+                <w:u w:val="single"/>
+              </w:rPr>
+            </w:pPr>
+          </w:p>
+          <w:p>
+            <w:pPr>
+              <w:rPr>
+                <w:u w:val="single"/>
+              </w:rPr>
+            </w:pPr>
+            <w:r>
+              <w:rPr>
+                <w:u w:val="single"/>
+              </w:rPr>
+              <w:t>Curator’s comments:</w:t>
+            </w:r>
+          </w:p>
         </w:tc>
         <w:tc>
           <w:tcPr>
@@ -4174,7 +4180,7 @@
           </w:tcPr>
           <w:p>
             <w:r>
-              <w:t>00:00</w:t>
+              <w:t>00:00:00</w:t>
             </w:r>
           </w:p>
         </w:tc>
@@ -4557,12 +4563,19 @@
               <w:rPr>
                 <w:lang w:val="en-US"/>
               </w:rPr>
-              <w:t>Read the `ds_tree.txt` file in the log_files folder to identify whether there is a README file</w:t>
+              <w:t xml:space="preserve">Read the `ds_tree.txt` file in the log_files folder to identify whether </w:t>
             </w:r>
             <w:r>
               <w:rPr>
                 <w:lang w:val="en-US"/>
               </w:rPr>
+              <w:lastRenderedPageBreak/>
+              <w:t>there is a README file</w:t>
+            </w:r>
+            <w:r>
+              <w:rPr>
+                <w:lang w:val="en-US"/>
+              </w:rPr>
               <w:t>,</w:t>
             </w:r>
             <w:r>
@@ -4615,6 +4628,7 @@
               <w:rPr>
                 <w:lang w:val="en-US"/>
               </w:rPr>
+              <w:lastRenderedPageBreak/>
               <w:t>{% if template_dict.readme_file.comments|length &gt; 0 %}X{% endif %}</w:t>
             </w:r>
           </w:p>
@@ -4788,6 +4802,14 @@
             </w:r>
           </w:p>
           <w:p/>
+          <w:p>
+            <w:r>
+              <w:rPr>
+                <w:u w:val="single"/>
+              </w:rPr>
+              <w:t>Curator’s comments:</w:t>
+            </w:r>
+          </w:p>
         </w:tc>
         <w:tc>
           <w:tcPr>
@@ -4809,6 +4831,7 @@
           </w:tcPr>
           <w:p>
             <w:r>
+              <w:lastRenderedPageBreak/>
               <w:t>Require</w:t>
             </w:r>
           </w:p>
@@ -4833,7 +4856,7 @@
           </w:tcPr>
           <w:p>
             <w:r>
-              <w:t>00:00</w:t>
+              <w:t>00:00:00</w:t>
             </w:r>
           </w:p>
         </w:tc>
@@ -5079,6 +5102,15 @@
               <w:t>}</w:t>
             </w:r>
           </w:p>
+          <w:p/>
+          <w:p>
+            <w:r>
+              <w:rPr>
+                <w:u w:val="single"/>
+              </w:rPr>
+              <w:t>Curator’s comments:</w:t>
+            </w:r>
+          </w:p>
         </w:tc>
         <w:tc>
           <w:tcPr>
@@ -5122,7 +5154,7 @@
           </w:tcPr>
           <w:p>
             <w:r>
-              <w:t>00:00</w:t>
+              <w:t>00:00:00</w:t>
             </w:r>
           </w:p>
         </w:tc>
@@ -5336,6 +5368,15 @@
               <w:t>}</w:t>
             </w:r>
           </w:p>
+          <w:p/>
+          <w:p>
+            <w:r>
+              <w:rPr>
+                <w:u w:val="single"/>
+              </w:rPr>
+              <w:t>Curator’s comments:</w:t>
+            </w:r>
+          </w:p>
         </w:tc>
         <w:tc>
           <w:tcPr>
@@ -5379,7 +5420,7 @@
           </w:tcPr>
           <w:p>
             <w:r>
-              <w:t>00:00</w:t>
+              <w:t>00:00:00</w:t>
             </w:r>
           </w:p>
         </w:tc>
@@ -5593,6 +5634,15 @@
               <w:t>}</w:t>
             </w:r>
           </w:p>
+          <w:p/>
+          <w:p>
+            <w:r>
+              <w:rPr>
+                <w:u w:val="single"/>
+              </w:rPr>
+              <w:t>Curator’s comments:</w:t>
+            </w:r>
+          </w:p>
         </w:tc>
         <w:tc>
           <w:tcPr>
@@ -5636,7 +5686,7 @@
           </w:tcPr>
           <w:p>
             <w:r>
-              <w:t>00:00</w:t>
+              <w:t>00:00:00</w:t>
             </w:r>
           </w:p>
         </w:tc>
@@ -5844,32 +5894,45 @@
               </w:numPr>
             </w:pPr>
             <w:r>
-              <w:t>{% if template_dict.readme_file.comments|length == 0 %}(NO README FILE FOUND){% endif %</w:t>
+              <w:t xml:space="preserve">{% if template_dict.readme_file.comments|length == 0 %}(NO </w:t>
+            </w:r>
+            <w:r>
+              <w:lastRenderedPageBreak/>
+              <w:t>README FILE FOUND){% endif %</w:t>
             </w:r>
             <w:r>
               <w:t>}</w:t>
             </w:r>
           </w:p>
-        </w:tc>
-        <w:tc>
-          <w:tcPr>
-            <w:tcW w:w="0" w:type="auto"/>
-            <w:tcBorders>
-              <w:top w:val="single" w:sz="8" w:space="0" w:color="000000"/>
-              <w:left w:val="single" w:sz="8" w:space="0" w:color="000000"/>
-              <w:bottom w:val="single" w:sz="8" w:space="0" w:color="000000"/>
-              <w:right w:val="single" w:sz="8" w:space="0" w:color="000000"/>
-            </w:tcBorders>
-            <w:tcMar>
-              <w:top w:w="100" w:type="dxa"/>
-              <w:left w:w="100" w:type="dxa"/>
-              <w:bottom w:w="100" w:type="dxa"/>
-              <w:right w:w="100" w:type="dxa"/>
-            </w:tcMar>
-            <w:hideMark/>
-          </w:tcPr>
-          <w:p>
-            <w:r>
+          <w:p>
+            <w:r>
+              <w:rPr>
+                <w:u w:val="single"/>
+              </w:rPr>
+              <w:t>Curator’s comments:</w:t>
+            </w:r>
+          </w:p>
+        </w:tc>
+        <w:tc>
+          <w:tcPr>
+            <w:tcW w:w="0" w:type="auto"/>
+            <w:tcBorders>
+              <w:top w:val="single" w:sz="8" w:space="0" w:color="000000"/>
+              <w:left w:val="single" w:sz="8" w:space="0" w:color="000000"/>
+              <w:bottom w:val="single" w:sz="8" w:space="0" w:color="000000"/>
+              <w:right w:val="single" w:sz="8" w:space="0" w:color="000000"/>
+            </w:tcBorders>
+            <w:tcMar>
+              <w:top w:w="100" w:type="dxa"/>
+              <w:left w:w="100" w:type="dxa"/>
+              <w:bottom w:w="100" w:type="dxa"/>
+              <w:right w:w="100" w:type="dxa"/>
+            </w:tcMar>
+            <w:hideMark/>
+          </w:tcPr>
+          <w:p>
+            <w:r>
+              <w:lastRenderedPageBreak/>
               <w:t>Require</w:t>
             </w:r>
           </w:p>
@@ -5893,7 +5956,7 @@
           </w:tcPr>
           <w:p>
             <w:r>
-              <w:t>00:00</w:t>
+              <w:t>00:00:00</w:t>
             </w:r>
           </w:p>
         </w:tc>
@@ -6107,6 +6170,14 @@
               <w:t>}</w:t>
             </w:r>
           </w:p>
+          <w:p>
+            <w:r>
+              <w:rPr>
+                <w:u w:val="single"/>
+              </w:rPr>
+              <w:t>Curator’s comments:</w:t>
+            </w:r>
+          </w:p>
         </w:tc>
         <w:tc>
           <w:tcPr>
@@ -6150,7 +6221,7 @@
           </w:tcPr>
           <w:p>
             <w:r>
-              <w:t>00:00</w:t>
+              <w:t>00:00:00</w:t>
             </w:r>
           </w:p>
         </w:tc>
@@ -6249,11 +6320,7 @@
               </w:numPr>
             </w:pPr>
             <w:r>
-              <w:t xml:space="preserve">If the files are not listed in the README, we can generate a file tree structure &amp; pass it to the </w:t>
-            </w:r>
-            <w:r>
-              <w:lastRenderedPageBreak/>
-              <w:t>depositors to include in their README, if applicable.</w:t>
+              <w:t>If the files are not listed in the README, we can generate a file tree structure &amp; pass it to the depositors to include in their README, if applicable.</w:t>
             </w:r>
           </w:p>
         </w:tc>
@@ -6426,6 +6493,14 @@
               <w:t>{% if template_dict.readme_file.comments|length == 0 %}(NO README FILE FOUND){% endif %}</w:t>
             </w:r>
           </w:p>
+          <w:p>
+            <w:r>
+              <w:rPr>
+                <w:u w:val="single"/>
+              </w:rPr>
+              <w:t>Curator’s comments:</w:t>
+            </w:r>
+          </w:p>
         </w:tc>
         <w:tc>
           <w:tcPr>
@@ -6469,7 +6544,7 @@
           </w:tcPr>
           <w:p>
             <w:r>
-              <w:t>00:00</w:t>
+              <w:t>00:00:00</w:t>
             </w:r>
           </w:p>
         </w:tc>
@@ -6501,6 +6576,7 @@
                 <w:b/>
                 <w:bCs/>
               </w:rPr>
+              <w:lastRenderedPageBreak/>
               <w:t>3.4</w:t>
             </w:r>
           </w:p>
@@ -6728,6 +6804,15 @@
               <w:t>{% if template_dict.readme_file.comments|length == 0 %}(NO README FILE FOUND){% endif %}</w:t>
             </w:r>
           </w:p>
+          <w:p/>
+          <w:p>
+            <w:r>
+              <w:rPr>
+                <w:u w:val="single"/>
+              </w:rPr>
+              <w:t>Curator’s comments:</w:t>
+            </w:r>
+          </w:p>
         </w:tc>
         <w:tc>
           <w:tcPr>
@@ -6771,7 +6856,7 @@
           </w:tcPr>
           <w:p>
             <w:r>
-              <w:t>00:00</w:t>
+              <w:t>00:00:00</w:t>
             </w:r>
           </w:p>
         </w:tc>
@@ -7166,7 +7251,6 @@
               </w:numPr>
             </w:pPr>
             <w:r>
-              <w:lastRenderedPageBreak/>
               <w:t>Subtitle</w:t>
             </w:r>
           </w:p>
@@ -7208,6 +7292,7 @@
               <w:rPr>
                 <w:lang w:val="en-US"/>
               </w:rPr>
+              <w:lastRenderedPageBreak/>
               <w:t>Note that the automated process might flag wrongly (such as acronyms/specialized terms. Delete the items from the list accordingly.</w:t>
             </w:r>
           </w:p>
@@ -7402,7 +7487,6 @@
           </w:p>
           <w:p>
             <w:r>
-              <w:lastRenderedPageBreak/>
               <w:t>{% else %}(NONE</w:t>
             </w:r>
             <w:r>
@@ -7415,6 +7499,15 @@
               <w:t>{% endif %}</w:t>
             </w:r>
           </w:p>
+          <w:p/>
+          <w:p>
+            <w:r>
+              <w:rPr>
+                <w:u w:val="single"/>
+              </w:rPr>
+              <w:t>Curator’s comments:</w:t>
+            </w:r>
+          </w:p>
         </w:tc>
         <w:tc>
           <w:tcPr>
@@ -7436,7 +7529,6 @@
           </w:tcPr>
           <w:p>
             <w:r>
-              <w:lastRenderedPageBreak/>
               <w:t>Require</w:t>
             </w:r>
           </w:p>
@@ -7461,7 +7553,7 @@
           </w:tcPr>
           <w:p>
             <w:r>
-              <w:t>00:00</w:t>
+              <w:t>00:00:00</w:t>
             </w:r>
           </w:p>
         </w:tc>
@@ -7747,6 +7839,15 @@
               </w:numPr>
             </w:pPr>
           </w:p>
+          <w:p/>
+          <w:p>
+            <w:r>
+              <w:rPr>
+                <w:u w:val="single"/>
+              </w:rPr>
+              <w:t>Curator’s comments:</w:t>
+            </w:r>
+          </w:p>
         </w:tc>
         <w:tc>
           <w:tcPr>
@@ -7792,7 +7893,7 @@
           </w:tcPr>
           <w:p>
             <w:r>
-              <w:t>00:00</w:t>
+              <w:t>00:00:00</w:t>
             </w:r>
           </w:p>
         </w:tc>
@@ -8065,7 +8166,7 @@
           </w:tcPr>
           <w:p>
             <w:r>
-              <w:t>00:00</w:t>
+              <w:t>00:00:00</w:t>
             </w:r>
           </w:p>
         </w:tc>
@@ -8103,7 +8204,6 @@
                 <w:b/>
                 <w:bCs/>
               </w:rPr>
-              <w:lastRenderedPageBreak/>
               <w:t>4.3b</w:t>
             </w:r>
           </w:p>
@@ -8208,7 +8308,11 @@
               <w:t>university of toronto</w:t>
             </w:r>
             <w:r>
-              <w:t xml:space="preserve">’ is filled for the </w:t>
+              <w:t xml:space="preserve">’ is filled </w:t>
+            </w:r>
+            <w:r>
+              <w:lastRenderedPageBreak/>
+              <w:t xml:space="preserve">for the </w:t>
             </w:r>
             <w:r>
               <w:t>author</w:t>
@@ -8254,6 +8358,7 @@
               </w:rPr>
             </w:pPr>
             <w:r>
+              <w:lastRenderedPageBreak/>
               <w:t>{% if not template_dict.</w:t>
             </w:r>
             <w:r>
@@ -8429,7 +8534,7 @@
           </w:tcPr>
           <w:p>
             <w:r>
-              <w:t>00:00</w:t>
+              <w:t>00:00:00</w:t>
             </w:r>
           </w:p>
         </w:tc>
@@ -8517,11 +8622,7 @@
               </w:numPr>
             </w:pPr>
             <w:r>
-              <w:t xml:space="preserve">Read the description and README file and check them against metadata fields. For example, if a geographical location or data collection date/range is mentioned in the description, recommend filling in the relevant </w:t>
-            </w:r>
-            <w:r>
-              <w:lastRenderedPageBreak/>
-              <w:t>metadata fields</w:t>
+              <w:t>Read the description and README file and check them against metadata fields. For example, if a geographical location or data collection date/range is mentioned in the description, recommend filling in the relevant metadata fields</w:t>
             </w:r>
           </w:p>
           <w:p>
@@ -8539,7 +8640,14 @@
                 <w:rPr>
                   <w:rStyle w:val="Hyperlink"/>
                 </w:rPr>
-                <w:t>Dataverse North Metadata Best Practices (pdf)</w:t>
+                <w:t xml:space="preserve">Dataverse North Metadata Best Practices </w:t>
+              </w:r>
+              <w:r>
+                <w:rPr>
+                  <w:rStyle w:val="Hyperlink"/>
+                </w:rPr>
+                <w:lastRenderedPageBreak/>
+                <w:t>(pdf)</w:t>
               </w:r>
             </w:hyperlink>
             <w:r>
@@ -8576,11 +8684,7 @@
               </w:numPr>
             </w:pPr>
             <w:r>
-              <w:t>Placeholders (Comin</w:t>
-            </w:r>
-            <w:r>
-              <w:lastRenderedPageBreak/>
-              <w:t>g soon, etc.)</w:t>
+              <w:t>Placeholders (Coming soon, etc.)</w:t>
             </w:r>
           </w:p>
           <w:p>
@@ -8591,6 +8695,7 @@
               </w:numPr>
             </w:pPr>
             <w:r>
+              <w:lastRenderedPageBreak/>
               <w:t>Wong filed (e.g. put author name in the title)</w:t>
             </w:r>
           </w:p>
@@ -8734,6 +8839,26 @@
               <w:t>:</w:t>
             </w:r>
           </w:p>
+          <w:p>
+            <w:pPr>
+              <w:rPr>
+                <w:u w:val="single"/>
+              </w:rPr>
+            </w:pPr>
+          </w:p>
+          <w:p>
+            <w:pPr>
+              <w:rPr>
+                <w:u w:val="single"/>
+              </w:rPr>
+            </w:pPr>
+            <w:r>
+              <w:rPr>
+                <w:u w:val="single"/>
+              </w:rPr>
+              <w:t>Curator’s comments:</w:t>
+            </w:r>
+          </w:p>
         </w:tc>
         <w:tc>
           <w:tcPr>
@@ -8777,7 +8902,7 @@
           </w:tcPr>
           <w:p>
             <w:r>
-              <w:t>00:00</w:t>
+              <w:t>00:00:00</w:t>
             </w:r>
           </w:p>
         </w:tc>
@@ -9017,6 +9142,15 @@
               </w:numPr>
             </w:pPr>
           </w:p>
+          <w:p/>
+          <w:p>
+            <w:r>
+              <w:rPr>
+                <w:u w:val="single"/>
+              </w:rPr>
+              <w:t>Curator’s comments:</w:t>
+            </w:r>
+          </w:p>
         </w:tc>
         <w:tc>
           <w:tcPr>
@@ -9060,7 +9194,7 @@
           </w:tcPr>
           <w:p>
             <w:r>
-              <w:t>00:00</w:t>
+              <w:t>00:00:00</w:t>
             </w:r>
           </w:p>
         </w:tc>
@@ -9092,7 +9226,6 @@
                 <w:b/>
                 <w:bCs/>
               </w:rPr>
-              <w:lastRenderedPageBreak/>
               <w:t>4.6</w:t>
             </w:r>
           </w:p>
@@ -9120,30 +9253,43 @@
                 <w:b/>
                 <w:bCs/>
               </w:rPr>
-              <w:t>Does the dataset description provide sufficient information?</w:t>
-            </w:r>
-          </w:p>
-        </w:tc>
-        <w:tc>
-          <w:tcPr>
-            <w:tcW w:w="0" w:type="auto"/>
-            <w:tcBorders>
-              <w:top w:val="single" w:sz="8" w:space="0" w:color="000000"/>
-              <w:left w:val="single" w:sz="8" w:space="0" w:color="000000"/>
-              <w:bottom w:val="single" w:sz="8" w:space="0" w:color="000000"/>
-              <w:right w:val="single" w:sz="8" w:space="0" w:color="000000"/>
-            </w:tcBorders>
-            <w:tcMar>
-              <w:top w:w="100" w:type="dxa"/>
-              <w:left w:w="100" w:type="dxa"/>
-              <w:bottom w:w="100" w:type="dxa"/>
-              <w:right w:w="100" w:type="dxa"/>
-            </w:tcMar>
-            <w:hideMark/>
-          </w:tcPr>
-          <w:p>
-            <w:r>
-              <w:t>Still need to discover/formulate the best practices for writing dataset descriptions.</w:t>
+              <w:t xml:space="preserve">Does the dataset description </w:t>
+            </w:r>
+            <w:r>
+              <w:rPr>
+                <w:b/>
+                <w:bCs/>
+              </w:rPr>
+              <w:lastRenderedPageBreak/>
+              <w:t>provide sufficient information?</w:t>
+            </w:r>
+          </w:p>
+        </w:tc>
+        <w:tc>
+          <w:tcPr>
+            <w:tcW w:w="0" w:type="auto"/>
+            <w:tcBorders>
+              <w:top w:val="single" w:sz="8" w:space="0" w:color="000000"/>
+              <w:left w:val="single" w:sz="8" w:space="0" w:color="000000"/>
+              <w:bottom w:val="single" w:sz="8" w:space="0" w:color="000000"/>
+              <w:right w:val="single" w:sz="8" w:space="0" w:color="000000"/>
+            </w:tcBorders>
+            <w:tcMar>
+              <w:top w:w="100" w:type="dxa"/>
+              <w:left w:w="100" w:type="dxa"/>
+              <w:bottom w:w="100" w:type="dxa"/>
+              <w:right w:w="100" w:type="dxa"/>
+            </w:tcMar>
+            <w:hideMark/>
+          </w:tcPr>
+          <w:p>
+            <w:r>
+              <w:lastRenderedPageBreak/>
+              <w:t xml:space="preserve">Still need to discover/formulate the best practices for </w:t>
+            </w:r>
+            <w:r>
+              <w:lastRenderedPageBreak/>
+              <w:t>writing dataset descriptions.</w:t>
             </w:r>
           </w:p>
           <w:p/>
@@ -9363,26 +9509,36 @@
               </w:numPr>
             </w:pPr>
           </w:p>
-        </w:tc>
-        <w:tc>
-          <w:tcPr>
-            <w:tcW w:w="0" w:type="auto"/>
-            <w:tcBorders>
-              <w:top w:val="single" w:sz="8" w:space="0" w:color="000000"/>
-              <w:left w:val="single" w:sz="8" w:space="0" w:color="000000"/>
-              <w:bottom w:val="single" w:sz="8" w:space="0" w:color="000000"/>
-              <w:right w:val="single" w:sz="8" w:space="0" w:color="000000"/>
-            </w:tcBorders>
-            <w:tcMar>
-              <w:top w:w="100" w:type="dxa"/>
-              <w:left w:w="100" w:type="dxa"/>
-              <w:bottom w:w="100" w:type="dxa"/>
-              <w:right w:w="100" w:type="dxa"/>
-            </w:tcMar>
-            <w:hideMark/>
-          </w:tcPr>
-          <w:p>
-            <w:r>
+          <w:p>
+            <w:r>
+              <w:rPr>
+                <w:u w:val="single"/>
+              </w:rPr>
+              <w:lastRenderedPageBreak/>
+              <w:t>Curator’s comments:</w:t>
+            </w:r>
+          </w:p>
+        </w:tc>
+        <w:tc>
+          <w:tcPr>
+            <w:tcW w:w="0" w:type="auto"/>
+            <w:tcBorders>
+              <w:top w:val="single" w:sz="8" w:space="0" w:color="000000"/>
+              <w:left w:val="single" w:sz="8" w:space="0" w:color="000000"/>
+              <w:bottom w:val="single" w:sz="8" w:space="0" w:color="000000"/>
+              <w:right w:val="single" w:sz="8" w:space="0" w:color="000000"/>
+            </w:tcBorders>
+            <w:tcMar>
+              <w:top w:w="100" w:type="dxa"/>
+              <w:left w:w="100" w:type="dxa"/>
+              <w:bottom w:w="100" w:type="dxa"/>
+              <w:right w:w="100" w:type="dxa"/>
+            </w:tcMar>
+            <w:hideMark/>
+          </w:tcPr>
+          <w:p>
+            <w:r>
+              <w:lastRenderedPageBreak/>
               <w:t>Recommend</w:t>
             </w:r>
           </w:p>
@@ -9406,7 +9562,7 @@
           </w:tcPr>
           <w:p>
             <w:r>
-              <w:t>00:00</w:t>
+              <w:t>00:00:00</w:t>
             </w:r>
           </w:p>
         </w:tc>
@@ -9465,38 +9621,29 @@
                 <w:b/>
                 <w:bCs/>
               </w:rPr>
-              <w:t xml:space="preserve">Does the dataset include </w:t>
-            </w:r>
-            <w:r>
-              <w:rPr>
-                <w:b/>
-                <w:bCs/>
-              </w:rPr>
-              <w:lastRenderedPageBreak/>
-              <w:t>keywords?</w:t>
-            </w:r>
-          </w:p>
-        </w:tc>
-        <w:tc>
-          <w:tcPr>
-            <w:tcW w:w="0" w:type="auto"/>
-            <w:tcBorders>
-              <w:top w:val="single" w:sz="8" w:space="0" w:color="000000"/>
-              <w:left w:val="single" w:sz="8" w:space="0" w:color="000000"/>
-              <w:bottom w:val="single" w:sz="8" w:space="0" w:color="000000"/>
-              <w:right w:val="single" w:sz="8" w:space="0" w:color="000000"/>
-            </w:tcBorders>
-            <w:tcMar>
-              <w:top w:w="100" w:type="dxa"/>
-              <w:left w:w="100" w:type="dxa"/>
-              <w:bottom w:w="100" w:type="dxa"/>
-              <w:right w:w="100" w:type="dxa"/>
-            </w:tcMar>
-            <w:hideMark/>
-          </w:tcPr>
-          <w:p>
-            <w:r>
-              <w:lastRenderedPageBreak/>
+              <w:t>Does the dataset include keywords?</w:t>
+            </w:r>
+          </w:p>
+        </w:tc>
+        <w:tc>
+          <w:tcPr>
+            <w:tcW w:w="0" w:type="auto"/>
+            <w:tcBorders>
+              <w:top w:val="single" w:sz="8" w:space="0" w:color="000000"/>
+              <w:left w:val="single" w:sz="8" w:space="0" w:color="000000"/>
+              <w:bottom w:val="single" w:sz="8" w:space="0" w:color="000000"/>
+              <w:right w:val="single" w:sz="8" w:space="0" w:color="000000"/>
+            </w:tcBorders>
+            <w:tcMar>
+              <w:top w:w="100" w:type="dxa"/>
+              <w:left w:w="100" w:type="dxa"/>
+              <w:bottom w:w="100" w:type="dxa"/>
+              <w:right w:w="100" w:type="dxa"/>
+            </w:tcMar>
+            <w:hideMark/>
+          </w:tcPr>
+          <w:p>
+            <w:r>
               <w:t>Python scripted.</w:t>
             </w:r>
           </w:p>
@@ -9508,11 +9655,11 @@
               </w:numPr>
             </w:pPr>
             <w:r>
-              <w:t xml:space="preserve">If no/few keywords </w:t>
+              <w:t xml:space="preserve">If no/few keywords are included, recommend </w:t>
             </w:r>
             <w:r>
               <w:lastRenderedPageBreak/>
-              <w:t>are included, recommend including some. </w:t>
+              <w:t>including some. </w:t>
             </w:r>
           </w:p>
           <w:p>
@@ -9709,11 +9856,7 @@
               <w:t>keywords</w:t>
             </w:r>
             <w:r>
-              <w:t xml:space="preserve">|length &gt; </w:t>
-            </w:r>
-            <w:r>
-              <w:lastRenderedPageBreak/>
-              <w:t>0</w:t>
+              <w:t>|length &gt; 0</w:t>
             </w:r>
             <w:r>
               <w:t xml:space="preserve"> %}</w:t>
@@ -9755,6 +9898,7 @@
           </w:p>
           <w:p>
             <w:r>
+              <w:lastRenderedPageBreak/>
               <w:t>{% else %}(</w:t>
             </w:r>
             <w:r>
@@ -9768,6 +9912,14 @@
             </w:r>
             <w:r>
               <w:t>{% endif %}</w:t>
+            </w:r>
+          </w:p>
+          <w:p>
+            <w:r>
+              <w:rPr>
+                <w:u w:val="single"/>
+              </w:rPr>
+              <w:t>Curator’s comments:</w:t>
             </w:r>
           </w:p>
         </w:tc>
@@ -9814,7 +9966,7 @@
           </w:tcPr>
           <w:p>
             <w:r>
-              <w:t>00:00</w:t>
+              <w:t>00:00:00</w:t>
             </w:r>
           </w:p>
         </w:tc>
@@ -10267,6 +10419,14 @@
               <w:t>{% endif %}</w:t>
             </w:r>
           </w:p>
+          <w:p>
+            <w:r>
+              <w:rPr>
+                <w:u w:val="single"/>
+              </w:rPr>
+              <w:t>Curator’s comments:</w:t>
+            </w:r>
+          </w:p>
         </w:tc>
         <w:tc>
           <w:tcPr>
@@ -10310,7 +10470,7 @@
           </w:tcPr>
           <w:p>
             <w:r>
-              <w:t>00:00</w:t>
+              <w:t>00:00:00</w:t>
             </w:r>
           </w:p>
         </w:tc>
@@ -10386,7 +10546,7 @@
                 <w:b/>
                 <w:bCs/>
               </w:rPr>
-              <w:t xml:space="preserve">If there is a related dataset associated with the dataset, has a DOI or other identifier </w:t>
+              <w:t xml:space="preserve">If there is a related dataset associated with the dataset, has a DOI or other identifier been included in the publication </w:t>
             </w:r>
             <w:r>
               <w:rPr>
@@ -10394,7 +10554,7 @@
                 <w:bCs/>
               </w:rPr>
               <w:lastRenderedPageBreak/>
-              <w:t>been included in the publication metadata?</w:t>
+              <w:t>metadata?</w:t>
             </w:r>
           </w:p>
         </w:tc>
@@ -10429,11 +10589,7 @@
               <w:t xml:space="preserve">persistent </w:t>
             </w:r>
             <w:r>
-              <w:t xml:space="preserve">identifier </w:t>
-            </w:r>
-            <w:r>
-              <w:lastRenderedPageBreak/>
-              <w:t>been included </w:t>
+              <w:t>identifier been included </w:t>
             </w:r>
           </w:p>
         </w:tc>
@@ -10591,11 +10747,23 @@
           <w:p>
             <w:pPr>
               <w:rPr>
-                <w:rFonts w:hint="eastAsia"/>
                 <w:u w:val="single"/>
               </w:rPr>
             </w:pPr>
           </w:p>
+          <w:p>
+            <w:pPr>
+              <w:rPr>
+                <w:u w:val="single"/>
+              </w:rPr>
+            </w:pPr>
+            <w:r>
+              <w:rPr>
+                <w:u w:val="single"/>
+              </w:rPr>
+              <w:t>Curator’s comments:</w:t>
+            </w:r>
+          </w:p>
         </w:tc>
         <w:tc>
           <w:tcPr>
@@ -10633,7 +10801,7 @@
           </w:tcPr>
           <w:p>
             <w:r>
-              <w:t>00:00</w:t>
+              <w:t>00:00:00</w:t>
             </w:r>
           </w:p>
         </w:tc>
@@ -10902,6 +11070,15 @@
               <w:t>NA</w:t>
             </w:r>
           </w:p>
+          <w:p/>
+          <w:p>
+            <w:r>
+              <w:rPr>
+                <w:u w:val="single"/>
+              </w:rPr>
+              <w:t>Curator’s comments:</w:t>
+            </w:r>
+          </w:p>
         </w:tc>
         <w:tc>
           <w:tcPr>
@@ -10946,7 +11123,7 @@
           </w:tcPr>
           <w:p>
             <w:r>
-              <w:t>00:00</w:t>
+              <w:t>00:00:00</w:t>
             </w:r>
           </w:p>
         </w:tc>
@@ -11295,7 +11472,7 @@
                 <w:b/>
                 <w:bCs/>
               </w:rPr>
-              <w:t xml:space="preserve">Does the dataset contain </w:t>
+              <w:t xml:space="preserve">Does the dataset contain any obvious sensitivity issues, such as </w:t>
             </w:r>
             <w:r>
               <w:rPr>
@@ -11303,7 +11480,7 @@
                 <w:bCs/>
               </w:rPr>
               <w:lastRenderedPageBreak/>
-              <w:t>any obvious sensitivity issues, such as direct identifiers?</w:t>
+              <w:t>direct identifiers?</w:t>
             </w:r>
           </w:p>
         </w:tc>
@@ -11334,11 +11511,11 @@
             </w:pPr>
             <w:r>
               <w:lastRenderedPageBreak/>
-              <w:t xml:space="preserve">Review documentation </w:t>
+              <w:t xml:space="preserve">Review documentation and file names and see if there are any </w:t>
             </w:r>
             <w:r>
               <w:lastRenderedPageBreak/>
-              <w:t>and file names and see if there are any that should be opened and reviewed (e.g. if a file is named “participant survey” - maybe open that one)</w:t>
+              <w:t>that should be opened and reviewed (e.g. if a file is named “participant survey” - maybe open that one)</w:t>
             </w:r>
           </w:p>
           <w:p>
@@ -11377,11 +11554,11 @@
               </w:numPr>
             </w:pPr>
             <w:r>
-              <w:t>Social Security Nu</w:t>
+              <w:t>Social Security Numbers (</w:t>
             </w:r>
             <w:r>
               <w:lastRenderedPageBreak/>
-              <w:t>mbers (SSNs)</w:t>
+              <w:t>SSNs)</w:t>
             </w:r>
           </w:p>
           <w:p>
@@ -11403,11 +11580,11 @@
               </w:numPr>
             </w:pPr>
             <w:r>
-              <w:t>Credit card num</w:t>
+              <w:t>Credit card numb</w:t>
             </w:r>
             <w:r>
               <w:lastRenderedPageBreak/>
-              <w:t>bers</w:t>
+              <w:t>ers</w:t>
             </w:r>
           </w:p>
           <w:p>
@@ -11440,7 +11617,11 @@
               </w:numPr>
             </w:pPr>
             <w:r>
-              <w:t>vCards (Virtual Contact Files)</w:t>
+              <w:t>vCards (Virtual Contact Fi</w:t>
+            </w:r>
+            <w:r>
+              <w:lastRenderedPageBreak/>
+              <w:t>les)</w:t>
             </w:r>
           </w:p>
         </w:tc>
@@ -11611,6 +11792,15 @@
               </w:numPr>
             </w:pPr>
           </w:p>
+          <w:p/>
+          <w:p>
+            <w:r>
+              <w:rPr>
+                <w:u w:val="single"/>
+              </w:rPr>
+              <w:t>Curator’s comments:</w:t>
+            </w:r>
+          </w:p>
         </w:tc>
         <w:tc>
           <w:tcPr>
@@ -11632,7 +11822,6 @@
           </w:tcPr>
           <w:p>
             <w:r>
-              <w:lastRenderedPageBreak/>
               <w:t>Require</w:t>
             </w:r>
           </w:p>
@@ -11657,7 +11846,7 @@
           </w:tcPr>
           <w:p>
             <w:r>
-              <w:t>00:00</w:t>
+              <w:t>00:00:00</w:t>
             </w:r>
           </w:p>
         </w:tc>
@@ -11924,7 +12113,7 @@
           </w:tcPr>
           <w:p>
             <w:r>
-              <w:t>00:00</w:t>
+              <w:t>00:00:00</w:t>
             </w:r>
           </w:p>
         </w:tc>
@@ -12031,7 +12220,11 @@
               </w:numPr>
             </w:pPr>
             <w:r>
-              <w:t>Check if the deposit includes restricted files (if yes, recommend they use custom terms)</w:t>
+              <w:t xml:space="preserve">Check if the deposit includes restricted files (if yes, recommend they use </w:t>
+            </w:r>
+            <w:r>
+              <w:lastRenderedPageBreak/>
+              <w:t>custom terms)</w:t>
             </w:r>
           </w:p>
         </w:tc>
@@ -12293,7 +12486,7 @@
               <w:tblLook w:val="04A0" w:firstRow="1" w:lastRow="0" w:firstColumn="1" w:lastColumn="0" w:noHBand="0" w:noVBand="1"/>
             </w:tblPr>
             <w:tblGrid>
-              <w:gridCol w:w="3662"/>
+              <w:gridCol w:w="3642"/>
             </w:tblGrid>
             <w:tr>
               <w:tc>
@@ -12310,17 +12503,17 @@
                     <w:t>{% if template_dict.terms_license.</w:t>
                   </w:r>
                   <w:r>
-                    <w:t>termsOfUse</w:t>
+                    <w:t>terms</w:t>
+                  </w:r>
+                  <w:r>
+                    <w:lastRenderedPageBreak/>
+                    <w:t>OfUse</w:t>
                   </w:r>
                   <w:r>
                     <w:t xml:space="preserve"> is not none %}{{ template_dict.terms_license.</w:t>
                   </w:r>
                   <w:r>
-                    <w:t>ter</w:t>
-                  </w:r>
-                  <w:r>
-                    <w:lastRenderedPageBreak/>
-                    <w:t>msOfUse</w:t>
+                    <w:t>termsOfUse</w:t>
                   </w:r>
                   <w:r>
                     <w:t xml:space="preserve"> }}{% else %}(NONE){% endif %}</w:t>
@@ -12376,7 +12569,7 @@
           </w:tcPr>
           <w:p>
             <w:r>
-              <w:t>00:00</w:t>
+              <w:t>00:00:00</w:t>
             </w:r>
           </w:p>
         </w:tc>
@@ -12832,7 +13025,7 @@
               <w:tblLook w:val="04A0" w:firstRow="1" w:lastRow="0" w:firstColumn="1" w:lastColumn="0" w:noHBand="0" w:noVBand="1"/>
             </w:tblPr>
             <w:tblGrid>
-              <w:gridCol w:w="3662"/>
+              <w:gridCol w:w="3642"/>
             </w:tblGrid>
             <w:tr>
               <w:tc>
@@ -12865,6 +13058,14 @@
             </w:tr>
           </w:tbl>
           <w:p/>
+          <w:p>
+            <w:r>
+              <w:rPr>
+                <w:u w:val="single"/>
+              </w:rPr>
+              <w:t>Curator’s comments:</w:t>
+            </w:r>
+          </w:p>
         </w:tc>
         <w:tc>
           <w:tcPr>
@@ -12908,7 +13109,7 @@
           </w:tcPr>
           <w:p>
             <w:r>
-              <w:t>00:00</w:t>
+              <w:t>00:00:00</w:t>
             </w:r>
           </w:p>
         </w:tc>
@@ -13133,6 +13334,15 @@
               </w:numPr>
             </w:pPr>
           </w:p>
+          <w:p/>
+          <w:p>
+            <w:r>
+              <w:rPr>
+                <w:u w:val="single"/>
+              </w:rPr>
+              <w:t>Curator’s comments:</w:t>
+            </w:r>
+          </w:p>
         </w:tc>
         <w:tc>
           <w:tcPr>
@@ -13175,6 +13385,9 @@
             <w:hideMark/>
           </w:tcPr>
           <w:p>
+            <w:r>
+              <w:t>00:</w:t>
+            </w:r>
             <w:r>
               <w:t>00:00</w:t>
             </w:r>
@@ -17106,6 +17319,119 @@
     </w:lvl>
   </w:abstractNum>
   <w:abstractNum w:abstractNumId="31" w15:restartNumberingAfterBreak="0">
+    <w:nsid w:val="3B1C7325"/>
+    <w:multiLevelType w:val="multilevel"/>
+    <w:tmpl w:val="C99876E8"/>
+    <w:lvl w:ilvl="0">
+      <w:start w:val="1"/>
+      <w:numFmt w:val="decimal"/>
+      <w:lvlText w:val="%1."/>
+      <w:lvlJc w:val="left"/>
+      <w:pPr>
+        <w:tabs>
+          <w:tab w:val="num" w:pos="720"/>
+        </w:tabs>
+        <w:ind w:left="720" w:hanging="360"/>
+      </w:pPr>
+    </w:lvl>
+    <w:lvl w:ilvl="1" w:tentative="1">
+      <w:start w:val="1"/>
+      <w:numFmt w:val="decimal"/>
+      <w:lvlText w:val="%2."/>
+      <w:lvlJc w:val="left"/>
+      <w:pPr>
+        <w:tabs>
+          <w:tab w:val="num" w:pos="1440"/>
+        </w:tabs>
+        <w:ind w:left="1440" w:hanging="360"/>
+      </w:pPr>
+    </w:lvl>
+    <w:lvl w:ilvl="2" w:tentative="1">
+      <w:start w:val="1"/>
+      <w:numFmt w:val="decimal"/>
+      <w:lvlText w:val="%3."/>
+      <w:lvlJc w:val="left"/>
+      <w:pPr>
+        <w:tabs>
+          <w:tab w:val="num" w:pos="2160"/>
+        </w:tabs>
+        <w:ind w:left="2160" w:hanging="360"/>
+      </w:pPr>
+    </w:lvl>
+    <w:lvl w:ilvl="3" w:tentative="1">
+      <w:start w:val="1"/>
+      <w:numFmt w:val="decimal"/>
+      <w:lvlText w:val="%4."/>
+      <w:lvlJc w:val="left"/>
+      <w:pPr>
+        <w:tabs>
+          <w:tab w:val="num" w:pos="2880"/>
+        </w:tabs>
+        <w:ind w:left="2880" w:hanging="360"/>
+      </w:pPr>
+    </w:lvl>
+    <w:lvl w:ilvl="4" w:tentative="1">
+      <w:start w:val="1"/>
+      <w:numFmt w:val="decimal"/>
+      <w:lvlText w:val="%5."/>
+      <w:lvlJc w:val="left"/>
+      <w:pPr>
+        <w:tabs>
+          <w:tab w:val="num" w:pos="3600"/>
+        </w:tabs>
+        <w:ind w:left="3600" w:hanging="360"/>
+      </w:pPr>
+    </w:lvl>
+    <w:lvl w:ilvl="5" w:tentative="1">
+      <w:start w:val="1"/>
+      <w:numFmt w:val="decimal"/>
+      <w:lvlText w:val="%6."/>
+      <w:lvlJc w:val="left"/>
+      <w:pPr>
+        <w:tabs>
+          <w:tab w:val="num" w:pos="4320"/>
+        </w:tabs>
+        <w:ind w:left="4320" w:hanging="360"/>
+      </w:pPr>
+    </w:lvl>
+    <w:lvl w:ilvl="6" w:tentative="1">
+      <w:start w:val="1"/>
+      <w:numFmt w:val="decimal"/>
+      <w:lvlText w:val="%7."/>
+      <w:lvlJc w:val="left"/>
+      <w:pPr>
+        <w:tabs>
+          <w:tab w:val="num" w:pos="5040"/>
+        </w:tabs>
+        <w:ind w:left="5040" w:hanging="360"/>
+      </w:pPr>
+    </w:lvl>
+    <w:lvl w:ilvl="7" w:tentative="1">
+      <w:start w:val="1"/>
+      <w:numFmt w:val="decimal"/>
+      <w:lvlText w:val="%8."/>
+      <w:lvlJc w:val="left"/>
+      <w:pPr>
+        <w:tabs>
+          <w:tab w:val="num" w:pos="5760"/>
+        </w:tabs>
+        <w:ind w:left="5760" w:hanging="360"/>
+      </w:pPr>
+    </w:lvl>
+    <w:lvl w:ilvl="8" w:tentative="1">
+      <w:start w:val="1"/>
+      <w:numFmt w:val="decimal"/>
+      <w:lvlText w:val="%9."/>
+      <w:lvlJc w:val="left"/>
+      <w:pPr>
+        <w:tabs>
+          <w:tab w:val="num" w:pos="6480"/>
+        </w:tabs>
+        <w:ind w:left="6480" w:hanging="360"/>
+      </w:pPr>
+    </w:lvl>
+  </w:abstractNum>
+  <w:abstractNum w:abstractNumId="32" w15:restartNumberingAfterBreak="0">
     <w:nsid w:val="426D13A0"/>
     <w:multiLevelType w:val="multilevel"/>
     <w:tmpl w:val="4992F020"/>
@@ -17218,7 +17544,7 @@
       </w:pPr>
     </w:lvl>
   </w:abstractNum>
-  <w:abstractNum w:abstractNumId="32" w15:restartNumberingAfterBreak="0">
+  <w:abstractNum w:abstractNumId="33" w15:restartNumberingAfterBreak="0">
     <w:nsid w:val="472F23DD"/>
     <w:multiLevelType w:val="hybridMultilevel"/>
     <w:tmpl w:val="03DEC164"/>
@@ -17331,7 +17657,7 @@
       </w:rPr>
     </w:lvl>
   </w:abstractNum>
-  <w:abstractNum w:abstractNumId="33" w15:restartNumberingAfterBreak="0">
+  <w:abstractNum w:abstractNumId="34" w15:restartNumberingAfterBreak="0">
     <w:nsid w:val="48CD376D"/>
     <w:multiLevelType w:val="multilevel"/>
     <w:tmpl w:val="2938D644"/>
@@ -17444,7 +17770,7 @@
       </w:pPr>
     </w:lvl>
   </w:abstractNum>
-  <w:abstractNum w:abstractNumId="34" w15:restartNumberingAfterBreak="0">
+  <w:abstractNum w:abstractNumId="35" w15:restartNumberingAfterBreak="0">
     <w:nsid w:val="48F76F1E"/>
     <w:multiLevelType w:val="hybridMultilevel"/>
     <w:tmpl w:val="03DEC164"/>
@@ -17557,7 +17883,7 @@
       </w:rPr>
     </w:lvl>
   </w:abstractNum>
-  <w:abstractNum w:abstractNumId="35" w15:restartNumberingAfterBreak="0">
+  <w:abstractNum w:abstractNumId="36" w15:restartNumberingAfterBreak="0">
     <w:nsid w:val="4DFE4E7F"/>
     <w:multiLevelType w:val="multilevel"/>
     <w:tmpl w:val="52F63172"/>
@@ -17670,7 +17996,7 @@
       </w:pPr>
     </w:lvl>
   </w:abstractNum>
-  <w:abstractNum w:abstractNumId="36" w15:restartNumberingAfterBreak="0">
+  <w:abstractNum w:abstractNumId="37" w15:restartNumberingAfterBreak="0">
     <w:nsid w:val="51D8212C"/>
     <w:multiLevelType w:val="multilevel"/>
     <w:tmpl w:val="947CF7C8"/>
@@ -17783,7 +18109,7 @@
       </w:pPr>
     </w:lvl>
   </w:abstractNum>
-  <w:abstractNum w:abstractNumId="37" w15:restartNumberingAfterBreak="0">
+  <w:abstractNum w:abstractNumId="38" w15:restartNumberingAfterBreak="0">
     <w:nsid w:val="5B7F6887"/>
     <w:multiLevelType w:val="multilevel"/>
     <w:tmpl w:val="84845E98"/>
@@ -17896,7 +18222,7 @@
       </w:pPr>
     </w:lvl>
   </w:abstractNum>
-  <w:abstractNum w:abstractNumId="38" w15:restartNumberingAfterBreak="0">
+  <w:abstractNum w:abstractNumId="39" w15:restartNumberingAfterBreak="0">
     <w:nsid w:val="5F3C4F5A"/>
     <w:multiLevelType w:val="multilevel"/>
     <w:tmpl w:val="EEF49AE0"/>
@@ -18045,7 +18371,7 @@
       </w:rPr>
     </w:lvl>
   </w:abstractNum>
-  <w:abstractNum w:abstractNumId="39" w15:restartNumberingAfterBreak="0">
+  <w:abstractNum w:abstractNumId="40" w15:restartNumberingAfterBreak="0">
     <w:nsid w:val="5F9D519B"/>
     <w:multiLevelType w:val="multilevel"/>
     <w:tmpl w:val="C99876E8"/>
@@ -18158,7 +18484,7 @@
       </w:pPr>
     </w:lvl>
   </w:abstractNum>
-  <w:abstractNum w:abstractNumId="40" w15:restartNumberingAfterBreak="0">
+  <w:abstractNum w:abstractNumId="41" w15:restartNumberingAfterBreak="0">
     <w:nsid w:val="61537B94"/>
     <w:multiLevelType w:val="multilevel"/>
     <w:tmpl w:val="7F0EC644"/>
@@ -18307,7 +18633,7 @@
       </w:rPr>
     </w:lvl>
   </w:abstractNum>
-  <w:abstractNum w:abstractNumId="41" w15:restartNumberingAfterBreak="0">
+  <w:abstractNum w:abstractNumId="42" w15:restartNumberingAfterBreak="0">
     <w:nsid w:val="618F7E45"/>
     <w:multiLevelType w:val="multilevel"/>
     <w:tmpl w:val="FB720BCA"/>
@@ -18456,7 +18782,7 @@
       </w:rPr>
     </w:lvl>
   </w:abstractNum>
-  <w:abstractNum w:abstractNumId="42" w15:restartNumberingAfterBreak="0">
+  <w:abstractNum w:abstractNumId="43" w15:restartNumberingAfterBreak="0">
     <w:nsid w:val="627F7105"/>
     <w:multiLevelType w:val="multilevel"/>
     <w:tmpl w:val="4BE2A6AE"/>
@@ -18569,7 +18895,7 @@
       </w:pPr>
     </w:lvl>
   </w:abstractNum>
-  <w:abstractNum w:abstractNumId="43" w15:restartNumberingAfterBreak="0">
+  <w:abstractNum w:abstractNumId="44" w15:restartNumberingAfterBreak="0">
     <w:nsid w:val="640D0320"/>
     <w:multiLevelType w:val="multilevel"/>
     <w:tmpl w:val="290620EC"/>
@@ -18718,7 +19044,7 @@
       </w:rPr>
     </w:lvl>
   </w:abstractNum>
-  <w:abstractNum w:abstractNumId="44" w15:restartNumberingAfterBreak="0">
+  <w:abstractNum w:abstractNumId="45" w15:restartNumberingAfterBreak="0">
     <w:nsid w:val="69F36F70"/>
     <w:multiLevelType w:val="multilevel"/>
     <w:tmpl w:val="CEC85A46"/>
@@ -18867,7 +19193,7 @@
       </w:rPr>
     </w:lvl>
   </w:abstractNum>
-  <w:abstractNum w:abstractNumId="45" w15:restartNumberingAfterBreak="0">
+  <w:abstractNum w:abstractNumId="46" w15:restartNumberingAfterBreak="0">
     <w:nsid w:val="6DCC79C9"/>
     <w:multiLevelType w:val="multilevel"/>
     <w:tmpl w:val="D6B0D266"/>
@@ -19016,7 +19342,7 @@
       </w:rPr>
     </w:lvl>
   </w:abstractNum>
-  <w:abstractNum w:abstractNumId="46" w15:restartNumberingAfterBreak="0">
+  <w:abstractNum w:abstractNumId="47" w15:restartNumberingAfterBreak="0">
     <w:nsid w:val="6DE2596E"/>
     <w:multiLevelType w:val="hybridMultilevel"/>
     <w:tmpl w:val="0D9C62AE"/>
@@ -19102,7 +19428,7 @@
       </w:pPr>
     </w:lvl>
   </w:abstractNum>
-  <w:abstractNum w:abstractNumId="47" w15:restartNumberingAfterBreak="0">
+  <w:abstractNum w:abstractNumId="48" w15:restartNumberingAfterBreak="0">
     <w:nsid w:val="728536DE"/>
     <w:multiLevelType w:val="multilevel"/>
     <w:tmpl w:val="4F76F00E"/>
@@ -19215,7 +19541,7 @@
       </w:pPr>
     </w:lvl>
   </w:abstractNum>
-  <w:abstractNum w:abstractNumId="48" w15:restartNumberingAfterBreak="0">
+  <w:abstractNum w:abstractNumId="49" w15:restartNumberingAfterBreak="0">
     <w:nsid w:val="736F3872"/>
     <w:multiLevelType w:val="multilevel"/>
     <w:tmpl w:val="55C249F2"/>
@@ -19364,7 +19690,7 @@
       </w:rPr>
     </w:lvl>
   </w:abstractNum>
-  <w:abstractNum w:abstractNumId="49" w15:restartNumberingAfterBreak="0">
+  <w:abstractNum w:abstractNumId="50" w15:restartNumberingAfterBreak="0">
     <w:nsid w:val="73886BC4"/>
     <w:multiLevelType w:val="multilevel"/>
     <w:tmpl w:val="19B0C78C"/>
@@ -19477,7 +19803,7 @@
       </w:pPr>
     </w:lvl>
   </w:abstractNum>
-  <w:abstractNum w:abstractNumId="50" w15:restartNumberingAfterBreak="0">
+  <w:abstractNum w:abstractNumId="51" w15:restartNumberingAfterBreak="0">
     <w:nsid w:val="73D87B47"/>
     <w:multiLevelType w:val="hybridMultilevel"/>
     <w:tmpl w:val="4C4C890E"/>
@@ -19566,7 +19892,7 @@
       </w:pPr>
     </w:lvl>
   </w:abstractNum>
-  <w:abstractNum w:abstractNumId="51" w15:restartNumberingAfterBreak="0">
+  <w:abstractNum w:abstractNumId="52" w15:restartNumberingAfterBreak="0">
     <w:nsid w:val="7919052C"/>
     <w:multiLevelType w:val="hybridMultilevel"/>
     <w:tmpl w:val="CA523B24"/>
@@ -19655,7 +19981,7 @@
       </w:pPr>
     </w:lvl>
   </w:abstractNum>
-  <w:abstractNum w:abstractNumId="52" w15:restartNumberingAfterBreak="0">
+  <w:abstractNum w:abstractNumId="53" w15:restartNumberingAfterBreak="0">
     <w:nsid w:val="7CE22D75"/>
     <w:multiLevelType w:val="multilevel"/>
     <w:tmpl w:val="1F045AB8"/>
@@ -19787,25 +20113,25 @@
     <w:abstractNumId w:val="14"/>
   </w:num>
   <w:num w:numId="7" w16cid:durableId="1845317547">
-    <w:abstractNumId w:val="49"/>
+    <w:abstractNumId w:val="50"/>
   </w:num>
   <w:num w:numId="8" w16cid:durableId="1838423190">
     <w:abstractNumId w:val="22"/>
   </w:num>
   <w:num w:numId="9" w16cid:durableId="546376926">
-    <w:abstractNumId w:val="39"/>
+    <w:abstractNumId w:val="40"/>
   </w:num>
   <w:num w:numId="10" w16cid:durableId="131025225">
-    <w:abstractNumId w:val="38"/>
+    <w:abstractNumId w:val="39"/>
   </w:num>
   <w:num w:numId="11" w16cid:durableId="558904022">
     <w:abstractNumId w:val="28"/>
   </w:num>
   <w:num w:numId="12" w16cid:durableId="1649240003">
-    <w:abstractNumId w:val="52"/>
+    <w:abstractNumId w:val="53"/>
   </w:num>
   <w:num w:numId="13" w16cid:durableId="1981767433">
-    <w:abstractNumId w:val="47"/>
+    <w:abstractNumId w:val="48"/>
   </w:num>
   <w:num w:numId="14" w16cid:durableId="398403253">
     <w:abstractNumId w:val="11"/>
@@ -19817,28 +20143,28 @@
     <w:abstractNumId w:val="6"/>
   </w:num>
   <w:num w:numId="17" w16cid:durableId="1957176815">
-    <w:abstractNumId w:val="42"/>
+    <w:abstractNumId w:val="43"/>
   </w:num>
   <w:num w:numId="18" w16cid:durableId="549001344">
-    <w:abstractNumId w:val="48"/>
+    <w:abstractNumId w:val="49"/>
   </w:num>
   <w:num w:numId="19" w16cid:durableId="384453035">
     <w:abstractNumId w:val="16"/>
   </w:num>
   <w:num w:numId="20" w16cid:durableId="584387679">
-    <w:abstractNumId w:val="43"/>
+    <w:abstractNumId w:val="44"/>
   </w:num>
   <w:num w:numId="21" w16cid:durableId="1056389349">
-    <w:abstractNumId w:val="36"/>
+    <w:abstractNumId w:val="37"/>
   </w:num>
   <w:num w:numId="22" w16cid:durableId="1121026007">
-    <w:abstractNumId w:val="37"/>
+    <w:abstractNumId w:val="38"/>
   </w:num>
   <w:num w:numId="23" w16cid:durableId="1071005938">
     <w:abstractNumId w:val="29"/>
   </w:num>
   <w:num w:numId="24" w16cid:durableId="1640576430">
-    <w:abstractNumId w:val="31"/>
+    <w:abstractNumId w:val="32"/>
   </w:num>
   <w:num w:numId="25" w16cid:durableId="175195030">
     <w:abstractNumId w:val="19"/>
@@ -19847,7 +20173,7 @@
     <w:abstractNumId w:val="12"/>
   </w:num>
   <w:num w:numId="27" w16cid:durableId="610016934">
-    <w:abstractNumId w:val="45"/>
+    <w:abstractNumId w:val="46"/>
   </w:num>
   <w:num w:numId="28" w16cid:durableId="1558128045">
     <w:abstractNumId w:val="0"/>
@@ -19856,7 +20182,7 @@
     <w:abstractNumId w:val="1"/>
   </w:num>
   <w:num w:numId="30" w16cid:durableId="950864947">
-    <w:abstractNumId w:val="33"/>
+    <w:abstractNumId w:val="34"/>
   </w:num>
   <w:num w:numId="31" w16cid:durableId="723528897">
     <w:abstractNumId w:val="20"/>
@@ -19865,7 +20191,7 @@
     <w:abstractNumId w:val="23"/>
   </w:num>
   <w:num w:numId="33" w16cid:durableId="1242759725">
-    <w:abstractNumId w:val="41"/>
+    <w:abstractNumId w:val="42"/>
   </w:num>
   <w:num w:numId="34" w16cid:durableId="1172186322">
     <w:abstractNumId w:val="17"/>
@@ -19877,7 +20203,7 @@
     <w:abstractNumId w:val="8"/>
   </w:num>
   <w:num w:numId="37" w16cid:durableId="442919269">
-    <w:abstractNumId w:val="35"/>
+    <w:abstractNumId w:val="36"/>
   </w:num>
   <w:num w:numId="38" w16cid:durableId="1486510809">
     <w:abstractNumId w:val="18"/>
@@ -19892,28 +20218,28 @@
     <w:abstractNumId w:val="2"/>
   </w:num>
   <w:num w:numId="42" w16cid:durableId="1522863813">
-    <w:abstractNumId w:val="44"/>
+    <w:abstractNumId w:val="45"/>
   </w:num>
   <w:num w:numId="43" w16cid:durableId="1692758747">
-    <w:abstractNumId w:val="40"/>
+    <w:abstractNumId w:val="41"/>
   </w:num>
   <w:num w:numId="44" w16cid:durableId="566065764">
     <w:abstractNumId w:val="5"/>
   </w:num>
   <w:num w:numId="45" w16cid:durableId="176846594">
-    <w:abstractNumId w:val="51"/>
+    <w:abstractNumId w:val="52"/>
   </w:num>
   <w:num w:numId="46" w16cid:durableId="1202403600">
     <w:abstractNumId w:val="21"/>
   </w:num>
   <w:num w:numId="47" w16cid:durableId="101195959">
-    <w:abstractNumId w:val="32"/>
+    <w:abstractNumId w:val="33"/>
   </w:num>
   <w:num w:numId="48" w16cid:durableId="395199757">
-    <w:abstractNumId w:val="34"/>
+    <w:abstractNumId w:val="35"/>
   </w:num>
   <w:num w:numId="49" w16cid:durableId="287975869">
-    <w:abstractNumId w:val="46"/>
+    <w:abstractNumId w:val="47"/>
     <w:lvlOverride w:ilvl="0">
       <w:startOverride w:val="1"/>
     </w:lvlOverride>
@@ -19946,13 +20272,16 @@
     <w:abstractNumId w:val="25"/>
   </w:num>
   <w:num w:numId="51" w16cid:durableId="791243524">
-    <w:abstractNumId w:val="50"/>
+    <w:abstractNumId w:val="51"/>
   </w:num>
   <w:num w:numId="52" w16cid:durableId="1533764241">
     <w:abstractNumId w:val="4"/>
   </w:num>
   <w:num w:numId="53" w16cid:durableId="856696896">
     <w:abstractNumId w:val="30"/>
+  </w:num>
+  <w:num w:numId="54" w16cid:durableId="541671923">
+    <w:abstractNumId w:val="31"/>
   </w:num>
   <w:numIdMacAtCleanup w:val="44"/>
 </w:numbering>
@@ -20358,7 +20687,7 @@
   <w:style w:type="paragraph" w:default="1" w:styleId="Normal">
     <w:name w:val="Normal"/>
     <w:qFormat/>
-    <w:rsid w:val="00242B53"/>
+    <w:rsid w:val="00402FED"/>
     <w:rPr>
       <w:lang w:val="en-CA"/>
     </w:rPr>
@@ -20565,7 +20894,6 @@
   <w:style w:type="character" w:default="1" w:styleId="DefaultParagraphFont">
     <w:name w:val="Default Paragraph Font"/>
     <w:uiPriority w:val="1"/>
-    <w:semiHidden/>
     <w:unhideWhenUsed/>
   </w:style>
   <w:style w:type="table" w:default="1" w:styleId="TableNormal">

</xml_diff>

<commit_message>
Added Borealis_Metadata_Fields_UOFT_MDL to item 4.4 for referencing metadata fields available
</commit_message>
<xml_diff>
--- a/res/template_high.docx
+++ b/res/template_high.docx
@@ -98,25 +98,57 @@
               <w:rPr>
                 <w:rFonts w:hint="eastAsia"/>
               </w:rPr>
-              <w:t xml:space="preserve">Ticket number: {{ </w:t>
-            </w:r>
-            <w:r>
-              <w:t>project_info</w:t>
-            </w:r>
+              <w:t xml:space="preserve">Ticket number: </w:t>
+            </w:r>
+            <w:proofErr w:type="gramStart"/>
             <w:r>
               <w:rPr>
                 <w:rFonts w:hint="eastAsia"/>
               </w:rPr>
+              <w:t xml:space="preserve">{{ </w:t>
+            </w:r>
+            <w:proofErr w:type="spellStart"/>
+            <w:r>
+              <w:t>project</w:t>
+            </w:r>
+            <w:proofErr w:type="gramEnd"/>
+            <w:r>
+              <w:t>_</w:t>
+            </w:r>
+            <w:proofErr w:type="gramStart"/>
+            <w:r>
+              <w:t>info</w:t>
+            </w:r>
+            <w:r>
+              <w:rPr>
+                <w:rFonts w:hint="eastAsia"/>
+              </w:rPr>
               <w:t>.</w:t>
             </w:r>
             <w:r>
-              <w:t>ticket_number</w:t>
-            </w:r>
+              <w:t>ticket</w:t>
+            </w:r>
+            <w:proofErr w:type="gramEnd"/>
+            <w:r>
+              <w:t>_</w:t>
+            </w:r>
+            <w:proofErr w:type="gramStart"/>
+            <w:r>
+              <w:t>number</w:t>
+            </w:r>
+            <w:proofErr w:type="spellEnd"/>
             <w:r>
               <w:rPr>
                 <w:rFonts w:hint="eastAsia"/>
               </w:rPr>
-              <w:t xml:space="preserve"> }}</w:t>
+              <w:t xml:space="preserve"> }</w:t>
+            </w:r>
+            <w:proofErr w:type="gramEnd"/>
+            <w:r>
+              <w:rPr>
+                <w:rFonts w:hint="eastAsia"/>
+              </w:rPr>
+              <w:t>}</w:t>
             </w:r>
           </w:p>
           <w:p>
@@ -139,16 +171,60 @@
               <w:rPr>
                 <w:rFonts w:hint="eastAsia"/>
               </w:rPr>
-              <w:t xml:space="preserve"> {{ </w:t>
-            </w:r>
-            <w:r>
-              <w:t>project_info</w:t>
-            </w:r>
+              <w:t xml:space="preserve"> </w:t>
+            </w:r>
+            <w:proofErr w:type="gramStart"/>
             <w:r>
               <w:rPr>
                 <w:rFonts w:hint="eastAsia"/>
               </w:rPr>
-              <w:t>.curator_name }}</w:t>
+              <w:t xml:space="preserve">{{ </w:t>
+            </w:r>
+            <w:proofErr w:type="spellStart"/>
+            <w:r>
+              <w:t>project</w:t>
+            </w:r>
+            <w:proofErr w:type="gramEnd"/>
+            <w:r>
+              <w:t>_</w:t>
+            </w:r>
+            <w:proofErr w:type="gramStart"/>
+            <w:r>
+              <w:t>info</w:t>
+            </w:r>
+            <w:r>
+              <w:rPr>
+                <w:rFonts w:hint="eastAsia"/>
+              </w:rPr>
+              <w:t>.curator</w:t>
+            </w:r>
+            <w:proofErr w:type="gramEnd"/>
+            <w:r>
+              <w:rPr>
+                <w:rFonts w:hint="eastAsia"/>
+              </w:rPr>
+              <w:t>_</w:t>
+            </w:r>
+            <w:proofErr w:type="gramStart"/>
+            <w:r>
+              <w:rPr>
+                <w:rFonts w:hint="eastAsia"/>
+              </w:rPr>
+              <w:t>name</w:t>
+            </w:r>
+            <w:proofErr w:type="spellEnd"/>
+            <w:r>
+              <w:rPr>
+                <w:rFonts w:hint="eastAsia"/>
+              </w:rPr>
+              <w:t xml:space="preserve"> }</w:t>
+            </w:r>
+            <w:proofErr w:type="gramEnd"/>
+            <w:r>
+              <w:rPr>
+                <w:rFonts w:hint="eastAsia"/>
+              </w:rPr>
+              <w:t>}</w:t>
             </w:r>
           </w:p>
           <w:p>
@@ -159,25 +235,57 @@
               <w:rPr>
                 <w:rFonts w:hint="eastAsia"/>
               </w:rPr>
-              <w:t xml:space="preserve">Curator email: {{ </w:t>
-            </w:r>
-            <w:r>
-              <w:t>project_info</w:t>
-            </w:r>
+              <w:t xml:space="preserve">Curator email: </w:t>
+            </w:r>
+            <w:proofErr w:type="gramStart"/>
             <w:r>
               <w:rPr>
                 <w:rFonts w:hint="eastAsia"/>
               </w:rPr>
+              <w:t xml:space="preserve">{{ </w:t>
+            </w:r>
+            <w:proofErr w:type="spellStart"/>
+            <w:r>
+              <w:t>project</w:t>
+            </w:r>
+            <w:proofErr w:type="gramEnd"/>
+            <w:r>
+              <w:t>_</w:t>
+            </w:r>
+            <w:proofErr w:type="gramStart"/>
+            <w:r>
+              <w:t>info</w:t>
+            </w:r>
+            <w:r>
+              <w:rPr>
+                <w:rFonts w:hint="eastAsia"/>
+              </w:rPr>
               <w:t>.</w:t>
             </w:r>
             <w:r>
-              <w:t>curator_email</w:t>
-            </w:r>
+              <w:t>curator</w:t>
+            </w:r>
+            <w:proofErr w:type="gramEnd"/>
+            <w:r>
+              <w:t>_</w:t>
+            </w:r>
+            <w:proofErr w:type="gramStart"/>
+            <w:r>
+              <w:t>email</w:t>
+            </w:r>
+            <w:proofErr w:type="spellEnd"/>
             <w:r>
               <w:rPr>
                 <w:rFonts w:hint="eastAsia"/>
               </w:rPr>
-              <w:t xml:space="preserve"> }}</w:t>
+              <w:t xml:space="preserve"> }</w:t>
+            </w:r>
+            <w:proofErr w:type="gramEnd"/>
+            <w:r>
+              <w:rPr>
+                <w:rFonts w:hint="eastAsia"/>
+              </w:rPr>
+              <w:t>}</w:t>
             </w:r>
           </w:p>
           <w:p>
@@ -188,16 +296,46 @@
               <w:rPr>
                 <w:rFonts w:hint="eastAsia"/>
               </w:rPr>
-              <w:t>Dataset title: {{ dataset.</w:t>
-            </w:r>
+              <w:t xml:space="preserve">Dataset title: </w:t>
+            </w:r>
+            <w:proofErr w:type="gramStart"/>
+            <w:r>
+              <w:rPr>
+                <w:rFonts w:hint="eastAsia"/>
+              </w:rPr>
+              <w:t xml:space="preserve">{{ </w:t>
+            </w:r>
+            <w:proofErr w:type="spellStart"/>
+            <w:r>
+              <w:rPr>
+                <w:rFonts w:hint="eastAsia"/>
+              </w:rPr>
+              <w:t>dataset</w:t>
+            </w:r>
+            <w:proofErr w:type="gramEnd"/>
+            <w:r>
+              <w:rPr>
+                <w:rFonts w:hint="eastAsia"/>
+              </w:rPr>
+              <w:t>.</w:t>
+            </w:r>
+            <w:proofErr w:type="gramStart"/>
             <w:r>
               <w:t>DatasetTitle</w:t>
             </w:r>
+            <w:proofErr w:type="spellEnd"/>
             <w:r>
               <w:rPr>
                 <w:rFonts w:hint="eastAsia"/>
               </w:rPr>
-              <w:t xml:space="preserve"> }}</w:t>
+              <w:t xml:space="preserve"> }</w:t>
+            </w:r>
+            <w:proofErr w:type="gramEnd"/>
+            <w:r>
+              <w:rPr>
+                <w:rFonts w:hint="eastAsia"/>
+              </w:rPr>
+              <w:t>}</w:t>
             </w:r>
           </w:p>
           <w:p>
@@ -217,16 +355,46 @@
               <w:rPr>
                 <w:rFonts w:hint="eastAsia"/>
               </w:rPr>
-              <w:t xml:space="preserve"> identifier: {{ dataset.</w:t>
-            </w:r>
+              <w:t xml:space="preserve"> identifier: </w:t>
+            </w:r>
+            <w:proofErr w:type="gramStart"/>
+            <w:r>
+              <w:rPr>
+                <w:rFonts w:hint="eastAsia"/>
+              </w:rPr>
+              <w:t xml:space="preserve">{{ </w:t>
+            </w:r>
+            <w:proofErr w:type="spellStart"/>
+            <w:r>
+              <w:rPr>
+                <w:rFonts w:hint="eastAsia"/>
+              </w:rPr>
+              <w:t>dataset</w:t>
+            </w:r>
+            <w:proofErr w:type="gramEnd"/>
+            <w:r>
+              <w:rPr>
+                <w:rFonts w:hint="eastAsia"/>
+              </w:rPr>
+              <w:t>.</w:t>
+            </w:r>
+            <w:proofErr w:type="gramStart"/>
             <w:r>
               <w:t>DatasetPersistentId</w:t>
             </w:r>
+            <w:proofErr w:type="spellEnd"/>
             <w:r>
               <w:rPr>
                 <w:rFonts w:hint="eastAsia"/>
               </w:rPr>
-              <w:t xml:space="preserve">  }}</w:t>
+              <w:t xml:space="preserve">  }</w:t>
+            </w:r>
+            <w:proofErr w:type="gramEnd"/>
+            <w:r>
+              <w:rPr>
+                <w:rFonts w:hint="eastAsia"/>
+              </w:rPr>
+              <w:t>}</w:t>
             </w:r>
           </w:p>
           <w:p>
@@ -237,7 +405,21 @@
               <w:rPr>
                 <w:rFonts w:hint="eastAsia"/>
               </w:rPr>
-              <w:t>Dataset ID (versioned): {{ dataset.ID  }}</w:t>
+              <w:t xml:space="preserve">Dataset ID (versioned): </w:t>
+            </w:r>
+            <w:proofErr w:type="gramStart"/>
+            <w:r>
+              <w:rPr>
+                <w:rFonts w:hint="eastAsia"/>
+              </w:rPr>
+              <w:t>{{ dataset.ID  }</w:t>
+            </w:r>
+            <w:proofErr w:type="gramEnd"/>
+            <w:r>
+              <w:rPr>
+                <w:rFonts w:hint="eastAsia"/>
+              </w:rPr>
+              <w:t>}</w:t>
             </w:r>
           </w:p>
           <w:p>
@@ -248,16 +430,46 @@
               <w:rPr>
                 <w:rFonts w:hint="eastAsia"/>
               </w:rPr>
-              <w:t>Dataset access URL: {{ dataset.</w:t>
-            </w:r>
+              <w:t xml:space="preserve">Dataset access URL: </w:t>
+            </w:r>
+            <w:proofErr w:type="gramStart"/>
+            <w:r>
+              <w:rPr>
+                <w:rFonts w:hint="eastAsia"/>
+              </w:rPr>
+              <w:t xml:space="preserve">{{ </w:t>
+            </w:r>
+            <w:proofErr w:type="spellStart"/>
+            <w:r>
+              <w:rPr>
+                <w:rFonts w:hint="eastAsia"/>
+              </w:rPr>
+              <w:t>dataset</w:t>
+            </w:r>
+            <w:proofErr w:type="gramEnd"/>
+            <w:r>
+              <w:rPr>
+                <w:rFonts w:hint="eastAsia"/>
+              </w:rPr>
+              <w:t>.</w:t>
+            </w:r>
+            <w:proofErr w:type="gramStart"/>
             <w:r>
               <w:t>DatasetURL</w:t>
             </w:r>
+            <w:proofErr w:type="spellEnd"/>
             <w:r>
               <w:rPr>
                 <w:rFonts w:hint="eastAsia"/>
               </w:rPr>
-              <w:t xml:space="preserve"> }}</w:t>
+              <w:t xml:space="preserve"> }</w:t>
+            </w:r>
+            <w:proofErr w:type="gramEnd"/>
+            <w:r>
+              <w:rPr>
+                <w:rFonts w:hint="eastAsia"/>
+              </w:rPr>
+              <w:t>}</w:t>
             </w:r>
           </w:p>
           <w:p>
@@ -277,7 +489,21 @@
               <w:rPr>
                 <w:rFonts w:hint="eastAsia"/>
               </w:rPr>
-              <w:t xml:space="preserve"> generated date: {{ timestamp }}</w:t>
+              <w:t xml:space="preserve"> generated date: </w:t>
+            </w:r>
+            <w:proofErr w:type="gramStart"/>
+            <w:r>
+              <w:rPr>
+                <w:rFonts w:hint="eastAsia"/>
+              </w:rPr>
+              <w:t>{{ timestamp</w:t>
+            </w:r>
+            <w:proofErr w:type="gramEnd"/>
+            <w:r>
+              <w:rPr>
+                <w:rFonts w:hint="eastAsia"/>
+              </w:rPr>
+              <w:t xml:space="preserve"> }}</w:t>
             </w:r>
           </w:p>
           <w:p>
@@ -447,17 +673,17 @@
         <w:tblLook w:val="04A0" w:firstRow="1" w:lastRow="0" w:firstColumn="1" w:lastColumn="0" w:noHBand="0" w:noVBand="1"/>
       </w:tblPr>
       <w:tblGrid>
-        <w:gridCol w:w="459"/>
-        <w:gridCol w:w="1142"/>
-        <w:gridCol w:w="1895"/>
-        <w:gridCol w:w="3749"/>
-        <w:gridCol w:w="2753"/>
-        <w:gridCol w:w="3749"/>
-        <w:gridCol w:w="375"/>
-        <w:gridCol w:w="2753"/>
-        <w:gridCol w:w="3839"/>
-        <w:gridCol w:w="936"/>
-        <w:gridCol w:w="701"/>
+        <w:gridCol w:w="448"/>
+        <w:gridCol w:w="1101"/>
+        <w:gridCol w:w="2697"/>
+        <w:gridCol w:w="3593"/>
+        <w:gridCol w:w="2640"/>
+        <w:gridCol w:w="3593"/>
+        <w:gridCol w:w="368"/>
+        <w:gridCol w:w="2640"/>
+        <w:gridCol w:w="3688"/>
+        <w:gridCol w:w="904"/>
+        <w:gridCol w:w="679"/>
       </w:tblGrid>
       <w:tr>
         <w:trPr>
@@ -1098,7 +1324,15 @@
           </w:p>
           <w:p>
             <w:r>
-              <w:t>If the dataset is deposited in a sub-dataverse collection, include the name of the collection. </w:t>
+              <w:t>If the dataset is deposited in a sub-</w:t>
+            </w:r>
+            <w:proofErr w:type="spellStart"/>
+            <w:r>
+              <w:t>dataverse</w:t>
+            </w:r>
+            <w:proofErr w:type="spellEnd"/>
+            <w:r>
+              <w:t xml:space="preserve"> collection, include the name of the collection. </w:t>
             </w:r>
           </w:p>
         </w:tc>
@@ -1239,21 +1473,44 @@
             <w:r>
               <w:br/>
             </w:r>
+            <w:proofErr w:type="gramStart"/>
             <w:r>
               <w:rPr>
                 <w:lang w:val="en-US"/>
               </w:rPr>
               <w:t xml:space="preserve">{{ </w:t>
             </w:r>
-            <w:r>
-              <w:t>template_dict.</w:t>
-            </w:r>
-            <w:r>
-              <w:rPr>
-                <w:lang w:val="en-US"/>
-              </w:rPr>
-              <w:t>ds_tree_info.path</w:t>
-            </w:r>
+            <w:proofErr w:type="spellStart"/>
+            <w:r>
+              <w:t>template_dict</w:t>
+            </w:r>
+            <w:proofErr w:type="spellEnd"/>
+            <w:r>
+              <w:t>.</w:t>
+            </w:r>
+            <w:proofErr w:type="spellStart"/>
+            <w:r>
+              <w:rPr>
+                <w:lang w:val="en-US"/>
+              </w:rPr>
+              <w:t>ds</w:t>
+            </w:r>
+            <w:proofErr w:type="gramEnd"/>
+            <w:r>
+              <w:rPr>
+                <w:lang w:val="en-US"/>
+              </w:rPr>
+              <w:t>_tree_</w:t>
+            </w:r>
+            <w:proofErr w:type="gramStart"/>
+            <w:r>
+              <w:rPr>
+                <w:lang w:val="en-US"/>
+              </w:rPr>
+              <w:t>info.path</w:t>
+            </w:r>
+            <w:proofErr w:type="spellEnd"/>
+            <w:proofErr w:type="gramEnd"/>
             <w:r>
               <w:t>}}</w:t>
             </w:r>
@@ -1330,15 +1587,18 @@
               </w:rPr>
               <w:t xml:space="preserve">{{ </w:t>
             </w:r>
+            <w:proofErr w:type="spellStart"/>
             <w:r>
               <w:t>template_dict</w:t>
             </w:r>
+            <w:proofErr w:type="spellEnd"/>
             <w:r>
               <w:rPr>
                 <w:rFonts w:hint="eastAsia"/>
               </w:rPr>
               <w:t>.</w:t>
             </w:r>
+            <w:proofErr w:type="spellStart"/>
             <w:r>
               <w:rPr>
                 <w:lang w:val="en-US"/>
@@ -1357,6 +1617,7 @@
               </w:rPr>
               <w:t>parentDataverseName</w:t>
             </w:r>
+            <w:proofErr w:type="spellEnd"/>
             <w:r>
               <w:rPr>
                 <w:rFonts w:hint="eastAsia"/>
@@ -1473,22 +1734,31 @@
                 <w:b/>
                 <w:bCs/>
               </w:rPr>
-              <w:t>Has the depositor (or their research group) previously created or submitted to a dataverse</w:t>
+              <w:t>Has the depositor (or their research group) previously created or submitt</w:t>
             </w:r>
             <w:r>
               <w:rPr>
                 <w:b/>
                 <w:bCs/>
               </w:rPr>
-              <w:t xml:space="preserve"> </w:t>
-            </w:r>
+              <w:lastRenderedPageBreak/>
+              <w:t xml:space="preserve">ed to a </w:t>
+            </w:r>
+            <w:proofErr w:type="spellStart"/>
             <w:r>
               <w:rPr>
                 <w:b/>
                 <w:bCs/>
               </w:rPr>
-              <w:lastRenderedPageBreak/>
-              <w:t>collection</w:t>
+              <w:t>dataverse</w:t>
+            </w:r>
+            <w:proofErr w:type="spellEnd"/>
+            <w:r>
+              <w:rPr>
+                <w:b/>
+                <w:bCs/>
+              </w:rPr>
+              <w:t xml:space="preserve"> collection</w:t>
             </w:r>
             <w:r>
               <w:rPr>
@@ -1531,7 +1801,15 @@
               </w:numPr>
             </w:pPr>
             <w:r>
-              <w:t>Confirm whether the listed dataverse collection refers to the same researcher/author</w:t>
+              <w:t xml:space="preserve">Confirm whether the listed </w:t>
+            </w:r>
+            <w:proofErr w:type="spellStart"/>
+            <w:r>
+              <w:t>dataverse</w:t>
+            </w:r>
+            <w:proofErr w:type="spellEnd"/>
+            <w:r>
+              <w:t xml:space="preserve"> collection refers to the same researcher/author</w:t>
             </w:r>
           </w:p>
         </w:tc>
@@ -1725,12 +2003,54 @@
               <w:br/>
             </w:r>
             <w:r>
-              <w:t xml:space="preserve">{% for item in template_dict.dv_record.comments %} </w:t>
-            </w:r>
-          </w:p>
-          <w:p>
-            <w:r>
-              <w:t>{% for author, dataverses in item.items() %} {{ author }}</w:t>
+              <w:t xml:space="preserve">{% for item in </w:t>
+            </w:r>
+            <w:proofErr w:type="spellStart"/>
+            <w:r>
+              <w:t>template_dict.dv_record.</w:t>
+            </w:r>
+            <w:proofErr w:type="gramStart"/>
+            <w:r>
+              <w:t>comments</w:t>
+            </w:r>
+            <w:proofErr w:type="spellEnd"/>
+            <w:r>
+              <w:t xml:space="preserve"> %}</w:t>
+            </w:r>
+            <w:proofErr w:type="gramEnd"/>
+            <w:r>
+              <w:t xml:space="preserve"> </w:t>
+            </w:r>
+          </w:p>
+          <w:p>
+            <w:r>
+              <w:t xml:space="preserve">{% for author, </w:t>
+            </w:r>
+            <w:proofErr w:type="spellStart"/>
+            <w:r>
+              <w:t>dataverses</w:t>
+            </w:r>
+            <w:proofErr w:type="spellEnd"/>
+            <w:r>
+              <w:t xml:space="preserve"> in </w:t>
+            </w:r>
+            <w:proofErr w:type="spellStart"/>
+            <w:proofErr w:type="gramStart"/>
+            <w:r>
+              <w:t>item.items</w:t>
+            </w:r>
+            <w:proofErr w:type="spellEnd"/>
+            <w:proofErr w:type="gramEnd"/>
+            <w:r>
+              <w:t xml:space="preserve">() %} </w:t>
+            </w:r>
+            <w:proofErr w:type="gramStart"/>
+            <w:r>
+              <w:t>{{ author</w:t>
+            </w:r>
+            <w:proofErr w:type="gramEnd"/>
+            <w:r>
+              <w:t xml:space="preserve"> }}</w:t>
             </w:r>
             <w:r>
               <w:rPr>
@@ -1741,10 +2061,47 @@
           </w:p>
           <w:p>
             <w:r>
-              <w:t xml:space="preserve">{% for dataverse in dataverses %} </w:t>
-            </w:r>
-            <w:r>
-              <w:t>{{ loop.index }}.</w:t>
+              <w:t xml:space="preserve">{% for </w:t>
+            </w:r>
+            <w:proofErr w:type="spellStart"/>
+            <w:r>
+              <w:t>dataverse</w:t>
+            </w:r>
+            <w:proofErr w:type="spellEnd"/>
+            <w:r>
+              <w:t xml:space="preserve"> in </w:t>
+            </w:r>
+            <w:proofErr w:type="spellStart"/>
+            <w:r>
+              <w:t>dataverses</w:t>
+            </w:r>
+            <w:proofErr w:type="spellEnd"/>
+            <w:r>
+              <w:t xml:space="preserve"> %} </w:t>
+            </w:r>
+            <w:proofErr w:type="gramStart"/>
+            <w:r>
+              <w:t xml:space="preserve">{{ </w:t>
+            </w:r>
+            <w:proofErr w:type="spellStart"/>
+            <w:r>
+              <w:t>loop</w:t>
+            </w:r>
+            <w:proofErr w:type="gramEnd"/>
+            <w:r>
+              <w:t>.</w:t>
+            </w:r>
+            <w:proofErr w:type="gramStart"/>
+            <w:r>
+              <w:t>index</w:t>
+            </w:r>
+            <w:proofErr w:type="spellEnd"/>
+            <w:r>
+              <w:t xml:space="preserve"> }</w:t>
+            </w:r>
+            <w:proofErr w:type="gramEnd"/>
+            <w:r>
+              <w:t>}.</w:t>
             </w:r>
             <w:r>
               <w:rPr>
@@ -1752,20 +2109,55 @@
               </w:rPr>
               <w:t xml:space="preserve"> </w:t>
             </w:r>
-            <w:r>
-              <w:t>{{ dataverse }}</w:t>
+            <w:proofErr w:type="gramStart"/>
+            <w:r>
+              <w:t xml:space="preserve">{{ </w:t>
+            </w:r>
+            <w:proofErr w:type="spellStart"/>
+            <w:r>
+              <w:t>dataverse</w:t>
+            </w:r>
+            <w:proofErr w:type="spellEnd"/>
+            <w:proofErr w:type="gramEnd"/>
+            <w:r>
+              <w:t xml:space="preserve"> }}</w:t>
             </w:r>
             <w:r>
               <w:br/>
             </w:r>
             <w:r>
-              <w:t xml:space="preserve">{% endfor %} </w:t>
+              <w:lastRenderedPageBreak/>
+              <w:t xml:space="preserve">{% </w:t>
+            </w:r>
+            <w:proofErr w:type="spellStart"/>
+            <w:r>
+              <w:t>endfor</w:t>
+            </w:r>
+            <w:proofErr w:type="spellEnd"/>
+            <w:r>
+              <w:t xml:space="preserve"> %} </w:t>
             </w:r>
             <w:r>
               <w:br/>
             </w:r>
             <w:r>
-              <w:t>{% endfor %} {% endfor %}</w:t>
+              <w:t xml:space="preserve">{% </w:t>
+            </w:r>
+            <w:proofErr w:type="spellStart"/>
+            <w:r>
+              <w:t>endfor</w:t>
+            </w:r>
+            <w:proofErr w:type="spellEnd"/>
+            <w:r>
+              <w:t xml:space="preserve"> %} {% </w:t>
+            </w:r>
+            <w:proofErr w:type="spellStart"/>
+            <w:r>
+              <w:t>endfor</w:t>
+            </w:r>
+            <w:proofErr w:type="spellEnd"/>
+            <w:r>
+              <w:t xml:space="preserve"> %}</w:t>
             </w:r>
           </w:p>
           <w:p>
@@ -1778,7 +2170,6 @@
               <w:rPr>
                 <w:u w:val="single"/>
               </w:rPr>
-              <w:lastRenderedPageBreak/>
               <w:t>Curator’s comments:</w:t>
             </w:r>
           </w:p>
@@ -1887,7 +2278,55 @@
                 <w:b/>
                 <w:bCs/>
               </w:rPr>
-              <w:t>If the dataset was deposited in a sub-dataverse collection, does it require its own dataverse or is there an associated dataverse?</w:t>
+              <w:t>If the dataset was deposited in a sub-</w:t>
+            </w:r>
+            <w:proofErr w:type="spellStart"/>
+            <w:r>
+              <w:rPr>
+                <w:b/>
+                <w:bCs/>
+              </w:rPr>
+              <w:t>dataverse</w:t>
+            </w:r>
+            <w:proofErr w:type="spellEnd"/>
+            <w:r>
+              <w:rPr>
+                <w:b/>
+                <w:bCs/>
+              </w:rPr>
+              <w:t xml:space="preserve"> collection, does it require its own </w:t>
+            </w:r>
+            <w:proofErr w:type="spellStart"/>
+            <w:r>
+              <w:rPr>
+                <w:b/>
+                <w:bCs/>
+              </w:rPr>
+              <w:t>dataverse</w:t>
+            </w:r>
+            <w:proofErr w:type="spellEnd"/>
+            <w:r>
+              <w:rPr>
+                <w:b/>
+                <w:bCs/>
+              </w:rPr>
+              <w:t xml:space="preserve"> or is there an associated </w:t>
+            </w:r>
+            <w:proofErr w:type="spellStart"/>
+            <w:r>
+              <w:rPr>
+                <w:b/>
+                <w:bCs/>
+              </w:rPr>
+              <w:t>dataverse</w:t>
+            </w:r>
+            <w:proofErr w:type="spellEnd"/>
+            <w:r>
+              <w:rPr>
+                <w:b/>
+                <w:bCs/>
+              </w:rPr>
+              <w:t>?</w:t>
             </w:r>
           </w:p>
         </w:tc>
@@ -1911,7 +2350,15 @@
           </w:tcPr>
           <w:p>
             <w:r>
-              <w:t>If the depositor created a dataverse with one dataset:</w:t>
+              <w:t xml:space="preserve">If the depositor created a </w:t>
+            </w:r>
+            <w:proofErr w:type="spellStart"/>
+            <w:r>
+              <w:t>dataverse</w:t>
+            </w:r>
+            <w:proofErr w:type="spellEnd"/>
+            <w:r>
+              <w:t xml:space="preserve"> with one dataset:</w:t>
             </w:r>
           </w:p>
           <w:p>
@@ -1922,7 +2369,15 @@
               </w:numPr>
             </w:pPr>
             <w:r>
-              <w:t>Is it the only dataset in the sub-dataverse collection?</w:t>
+              <w:t>Is it the only dataset in the sub-</w:t>
+            </w:r>
+            <w:proofErr w:type="spellStart"/>
+            <w:r>
+              <w:t>dataverse</w:t>
+            </w:r>
+            <w:proofErr w:type="spellEnd"/>
+            <w:r>
+              <w:t xml:space="preserve"> collection?</w:t>
             </w:r>
           </w:p>
           <w:p>
@@ -1933,7 +2388,15 @@
               </w:numPr>
             </w:pPr>
             <w:r>
-              <w:t>Is there another sub-dataverse collection it should be in?</w:t>
+              <w:t>Is there another sub-</w:t>
+            </w:r>
+            <w:proofErr w:type="spellStart"/>
+            <w:r>
+              <w:t>dataverse</w:t>
+            </w:r>
+            <w:proofErr w:type="spellEnd"/>
+            <w:r>
+              <w:t xml:space="preserve"> collection it should be in?</w:t>
             </w:r>
           </w:p>
           <w:p>
@@ -1955,7 +2418,23 @@
               </w:numPr>
             </w:pPr>
             <w:r>
-              <w:t>Confirm with the depositor that they actually require a dataverse (e.g., will there be future deposits?)</w:t>
+              <w:t xml:space="preserve">Confirm with the depositor that they </w:t>
+            </w:r>
+            <w:proofErr w:type="gramStart"/>
+            <w:r>
+              <w:t>actually require</w:t>
+            </w:r>
+            <w:proofErr w:type="gramEnd"/>
+            <w:r>
+              <w:t xml:space="preserve"> a </w:t>
+            </w:r>
+            <w:proofErr w:type="spellStart"/>
+            <w:r>
+              <w:t>dataverse</w:t>
+            </w:r>
+            <w:proofErr w:type="spellEnd"/>
+            <w:r>
+              <w:t xml:space="preserve"> (e.g., will there be future deposits?)</w:t>
             </w:r>
           </w:p>
         </w:tc>
@@ -2166,7 +2645,6 @@
                 <w:b/>
                 <w:bCs/>
               </w:rPr>
-              <w:lastRenderedPageBreak/>
               <w:t>2.0</w:t>
             </w:r>
           </w:p>
@@ -2531,33 +3009,61 @@
               <w:rPr>
                 <w:lang w:val="en-US"/>
               </w:rPr>
-              <w:t>{% if template_dict.file_ext.comments|length == 0 %}X{% endif %}</w:t>
-            </w:r>
-          </w:p>
-        </w:tc>
-        <w:tc>
-          <w:tcPr>
-            <w:tcW w:w="0" w:type="auto"/>
-            <w:tcBorders>
-              <w:top w:val="single" w:sz="8" w:space="0" w:color="000000"/>
-              <w:left w:val="single" w:sz="8" w:space="0" w:color="000000"/>
-              <w:bottom w:val="single" w:sz="8" w:space="0" w:color="000000"/>
-              <w:right w:val="single" w:sz="8" w:space="0" w:color="000000"/>
-            </w:tcBorders>
-            <w:tcMar>
-              <w:top w:w="100" w:type="dxa"/>
-              <w:left w:w="100" w:type="dxa"/>
-              <w:bottom w:w="100" w:type="dxa"/>
-              <w:right w:w="100" w:type="dxa"/>
-            </w:tcMar>
-            <w:hideMark/>
-          </w:tcPr>
-          <w:p>
-            <w:r>
-              <w:rPr>
-                <w:lang w:val="en-US"/>
-              </w:rPr>
-              <w:t>{% if template_dict.file_ext.comments|length &gt; 0 %}X{% endif %}</w:t>
+              <w:t xml:space="preserve">{% if </w:t>
+            </w:r>
+            <w:proofErr w:type="spellStart"/>
+            <w:r>
+              <w:rPr>
+                <w:lang w:val="en-US"/>
+              </w:rPr>
+              <w:t>template_dict.file_ext.comments|length</w:t>
+            </w:r>
+            <w:proofErr w:type="spellEnd"/>
+            <w:r>
+              <w:rPr>
+                <w:lang w:val="en-US"/>
+              </w:rPr>
+              <w:t xml:space="preserve"> == 0 %}X{% endif %}</w:t>
+            </w:r>
+          </w:p>
+        </w:tc>
+        <w:tc>
+          <w:tcPr>
+            <w:tcW w:w="0" w:type="auto"/>
+            <w:tcBorders>
+              <w:top w:val="single" w:sz="8" w:space="0" w:color="000000"/>
+              <w:left w:val="single" w:sz="8" w:space="0" w:color="000000"/>
+              <w:bottom w:val="single" w:sz="8" w:space="0" w:color="000000"/>
+              <w:right w:val="single" w:sz="8" w:space="0" w:color="000000"/>
+            </w:tcBorders>
+            <w:tcMar>
+              <w:top w:w="100" w:type="dxa"/>
+              <w:left w:w="100" w:type="dxa"/>
+              <w:bottom w:w="100" w:type="dxa"/>
+              <w:right w:w="100" w:type="dxa"/>
+            </w:tcMar>
+            <w:hideMark/>
+          </w:tcPr>
+          <w:p>
+            <w:r>
+              <w:rPr>
+                <w:lang w:val="en-US"/>
+              </w:rPr>
+              <w:t xml:space="preserve">{% if </w:t>
+            </w:r>
+            <w:proofErr w:type="spellStart"/>
+            <w:r>
+              <w:rPr>
+                <w:lang w:val="en-US"/>
+              </w:rPr>
+              <w:t>template_dict.file_ext.comments|length</w:t>
+            </w:r>
+            <w:proofErr w:type="spellEnd"/>
+            <w:r>
+              <w:rPr>
+                <w:lang w:val="en-US"/>
+              </w:rPr>
+              <w:t xml:space="preserve"> &gt; 0 %}X{% endif %}</w:t>
             </w:r>
           </w:p>
         </w:tc>
@@ -2654,14 +3160,48 @@
               <w:br/>
             </w:r>
             <w:r>
-              <w:t xml:space="preserve">{% if template_dict.file_open.comments |length &gt; 0 and template_dict.file_open.comments |length &lt; </w:t>
-            </w:r>
+              <w:t xml:space="preserve">{% if </w:t>
+            </w:r>
+            <w:proofErr w:type="spellStart"/>
+            <w:r>
+              <w:t>template_dict.file_open.comments</w:t>
+            </w:r>
+            <w:proofErr w:type="spellEnd"/>
+            <w:r>
+              <w:t xml:space="preserve"> |length &gt; 0 and </w:t>
+            </w:r>
+            <w:proofErr w:type="spellStart"/>
+            <w:r>
+              <w:t>template_dict.file_open.comments</w:t>
+            </w:r>
+            <w:proofErr w:type="spellEnd"/>
+            <w:r>
+              <w:t xml:space="preserve"> |length &lt; </w:t>
+            </w:r>
+            <w:proofErr w:type="gramStart"/>
             <w:r>
               <w:t>50</w:t>
             </w:r>
             <w:r>
-              <w:t xml:space="preserve"> %}{% for item in template_dict.file_open.comments %}</w:t>
-            </w:r>
+              <w:t xml:space="preserve"> %}{%</w:t>
+            </w:r>
+            <w:proofErr w:type="gramEnd"/>
+            <w:r>
+              <w:t xml:space="preserve"> for item in </w:t>
+            </w:r>
+            <w:proofErr w:type="spellStart"/>
+            <w:r>
+              <w:t>template_dict.file_open.</w:t>
+            </w:r>
+            <w:proofErr w:type="gramStart"/>
+            <w:r>
+              <w:t>comments</w:t>
+            </w:r>
+            <w:proofErr w:type="spellEnd"/>
+            <w:r>
+              <w:t xml:space="preserve"> %}</w:t>
+            </w:r>
+            <w:proofErr w:type="gramEnd"/>
           </w:p>
           <w:p>
             <w:pPr>
@@ -2678,68 +3218,197 @@
               <w:rPr>
                 <w:lang w:val="en-US"/>
               </w:rPr>
-              <w:t>{{ item.file_name }}{% endfor %}</w:t>
-            </w:r>
-          </w:p>
-          <w:p>
-            <w:r>
-              <w:t xml:space="preserve">{% elif template_dict.file_open.comments |length &gt;= </w:t>
+              <w:lastRenderedPageBreak/>
+              <w:t xml:space="preserve">{{ </w:t>
+            </w:r>
+            <w:proofErr w:type="spellStart"/>
+            <w:r>
+              <w:rPr>
+                <w:lang w:val="en-US"/>
+              </w:rPr>
+              <w:t>item.file_</w:t>
+            </w:r>
+            <w:proofErr w:type="gramStart"/>
+            <w:r>
+              <w:rPr>
+                <w:lang w:val="en-US"/>
+              </w:rPr>
+              <w:t>name</w:t>
+            </w:r>
+            <w:proofErr w:type="spellEnd"/>
+            <w:r>
+              <w:rPr>
+                <w:lang w:val="en-US"/>
+              </w:rPr>
+              <w:t xml:space="preserve"> }}{%</w:t>
+            </w:r>
+            <w:proofErr w:type="gramEnd"/>
+            <w:r>
+              <w:rPr>
+                <w:lang w:val="en-US"/>
+              </w:rPr>
+              <w:t xml:space="preserve"> </w:t>
+            </w:r>
+            <w:proofErr w:type="spellStart"/>
+            <w:proofErr w:type="gramStart"/>
+            <w:r>
+              <w:rPr>
+                <w:lang w:val="en-US"/>
+              </w:rPr>
+              <w:t>endfor</w:t>
+            </w:r>
+            <w:proofErr w:type="spellEnd"/>
+            <w:r>
+              <w:rPr>
+                <w:lang w:val="en-US"/>
+              </w:rPr>
+              <w:t xml:space="preserve"> %}</w:t>
+            </w:r>
+            <w:proofErr w:type="gramEnd"/>
+          </w:p>
+          <w:p>
+            <w:r>
+              <w:t xml:space="preserve">{% </w:t>
+            </w:r>
+            <w:proofErr w:type="spellStart"/>
+            <w:r>
+              <w:t>elif</w:t>
+            </w:r>
+            <w:proofErr w:type="spellEnd"/>
+            <w:r>
+              <w:t xml:space="preserve"> </w:t>
+            </w:r>
+            <w:proofErr w:type="spellStart"/>
+            <w:r>
+              <w:t>template_</w:t>
+            </w:r>
+            <w:proofErr w:type="gramStart"/>
+            <w:r>
+              <w:t>dict.file</w:t>
+            </w:r>
+            <w:proofErr w:type="gramEnd"/>
+            <w:r>
+              <w:t>_</w:t>
+            </w:r>
+            <w:proofErr w:type="gramStart"/>
+            <w:r>
+              <w:t>open.comments</w:t>
+            </w:r>
+            <w:proofErr w:type="spellEnd"/>
+            <w:proofErr w:type="gramEnd"/>
+            <w:r>
+              <w:t xml:space="preserve"> |length &gt;= </w:t>
             </w:r>
             <w:r>
               <w:t>50</w:t>
             </w:r>
             <w:r>
+              <w:t xml:space="preserve"> </w:t>
+            </w:r>
+            <w:proofErr w:type="gramStart"/>
+            <w:r>
+              <w:t>%}</w:t>
+            </w:r>
+            <w:r>
+              <w:t>(</w:t>
+            </w:r>
+            <w:proofErr w:type="gramEnd"/>
+            <w:r>
+              <w:t>See the corrupted_file</w:t>
+            </w:r>
+            <w:r>
+              <w:t>s</w:t>
+            </w:r>
+            <w:r>
+              <w:t>.txt</w:t>
+            </w:r>
+            <w:r>
+              <w:t>)</w:t>
+            </w:r>
+          </w:p>
+          <w:p>
+            <w:r>
+              <w:t xml:space="preserve">{% else </w:t>
+            </w:r>
+            <w:proofErr w:type="gramStart"/>
+            <w:r>
+              <w:t>%}(</w:t>
+            </w:r>
+            <w:proofErr w:type="gramEnd"/>
+            <w:r>
+              <w:t>NONE</w:t>
+            </w:r>
+            <w:proofErr w:type="gramStart"/>
+            <w:r>
+              <w:t>){</w:t>
+            </w:r>
+            <w:proofErr w:type="gramEnd"/>
+            <w:r>
+              <w:t>% endif %}</w:t>
+            </w:r>
+          </w:p>
+          <w:p>
+            <w:pPr>
+              <w:rPr>
+                <w:lang w:val="en-US"/>
+              </w:rPr>
+            </w:pPr>
+            <w:r>
+              <w:rPr>
+                <w:u w:val="single"/>
+                <w:lang w:val="en-US"/>
+              </w:rPr>
+              <w:t>List all files that were not checked:</w:t>
+            </w:r>
+            <w:r>
+              <w:rPr>
+                <w:lang w:val="en-US"/>
+              </w:rPr>
+              <w:br/>
+            </w:r>
+            <w:r>
+              <w:t xml:space="preserve">{% if </w:t>
+            </w:r>
+            <w:proofErr w:type="spellStart"/>
+            <w:r>
+              <w:t>template_dict.file_open.not_checked</w:t>
+            </w:r>
+            <w:proofErr w:type="spellEnd"/>
+            <w:r>
+              <w:t xml:space="preserve"> |length &gt; 0 and </w:t>
+            </w:r>
+            <w:proofErr w:type="spellStart"/>
+            <w:r>
+              <w:t>template_dict.file_open.not_checked</w:t>
+            </w:r>
+            <w:proofErr w:type="spellEnd"/>
+            <w:r>
+              <w:t xml:space="preserve"> |length &lt; </w:t>
+            </w:r>
+            <w:proofErr w:type="gramStart"/>
+            <w:r>
+              <w:t>50</w:t>
+            </w:r>
+            <w:r>
+              <w:t xml:space="preserve"> %}{%</w:t>
+            </w:r>
+            <w:proofErr w:type="gramEnd"/>
+            <w:r>
+              <w:t xml:space="preserve"> for item in </w:t>
+            </w:r>
+            <w:proofErr w:type="spellStart"/>
+            <w:r>
+              <w:t>template_dict.file_open.not_</w:t>
+            </w:r>
+            <w:proofErr w:type="gramStart"/>
+            <w:r>
+              <w:t>checked</w:t>
+            </w:r>
+            <w:proofErr w:type="spellEnd"/>
+            <w:r>
               <w:t xml:space="preserve"> %}</w:t>
             </w:r>
-            <w:r>
-              <w:t>(</w:t>
-            </w:r>
-            <w:r>
-              <w:t>See the corrupted_file</w:t>
-            </w:r>
-            <w:r>
-              <w:t>s</w:t>
-            </w:r>
-            <w:r>
-              <w:t>.txt</w:t>
-            </w:r>
-            <w:r>
-              <w:t>)</w:t>
-            </w:r>
-          </w:p>
-          <w:p>
-            <w:r>
-              <w:t>{% else %}(NONE){% endif %}</w:t>
-            </w:r>
-          </w:p>
-          <w:p>
-            <w:pPr>
-              <w:rPr>
-                <w:lang w:val="en-US"/>
-              </w:rPr>
-            </w:pPr>
-            <w:r>
-              <w:rPr>
-                <w:u w:val="single"/>
-                <w:lang w:val="en-US"/>
-              </w:rPr>
-              <w:t>List all files that were not checked:</w:t>
-            </w:r>
-            <w:r>
-              <w:rPr>
-                <w:lang w:val="en-US"/>
-              </w:rPr>
-              <w:br/>
-            </w:r>
-            <w:r>
-              <w:t xml:space="preserve">{% if template_dict.file_open.not_checked |length &gt; 0 and template_dict.file_open.not_checked |length &lt; </w:t>
-            </w:r>
-            <w:r>
-              <w:t>50</w:t>
-            </w:r>
-            <w:r>
-              <w:t xml:space="preserve"> %}{% for item in template_dict.file_open.not_checked %}</w:t>
-            </w:r>
+            <w:proofErr w:type="gramEnd"/>
           </w:p>
           <w:p>
             <w:pPr>
@@ -2756,18 +3425,110 @@
               <w:rPr>
                 <w:lang w:val="en-US"/>
               </w:rPr>
-              <w:t>{{ item.file_name }}{% endfor %}</w:t>
-            </w:r>
-          </w:p>
-          <w:p>
-            <w:r>
-              <w:t xml:space="preserve">{% elif template_dict.file_open.not_checked |length &gt;= </w:t>
+              <w:t xml:space="preserve">{{ </w:t>
+            </w:r>
+            <w:proofErr w:type="spellStart"/>
+            <w:r>
+              <w:rPr>
+                <w:lang w:val="en-US"/>
+              </w:rPr>
+              <w:t>item.file_</w:t>
+            </w:r>
+            <w:proofErr w:type="gramStart"/>
+            <w:r>
+              <w:rPr>
+                <w:lang w:val="en-US"/>
+              </w:rPr>
+              <w:t>name</w:t>
+            </w:r>
+            <w:proofErr w:type="spellEnd"/>
+            <w:r>
+              <w:rPr>
+                <w:lang w:val="en-US"/>
+              </w:rPr>
+              <w:t xml:space="preserve"> }}{%</w:t>
+            </w:r>
+            <w:proofErr w:type="gramEnd"/>
+            <w:r>
+              <w:rPr>
+                <w:lang w:val="en-US"/>
+              </w:rPr>
+              <w:t xml:space="preserve"> </w:t>
+            </w:r>
+            <w:proofErr w:type="spellStart"/>
+            <w:proofErr w:type="gramStart"/>
+            <w:r>
+              <w:rPr>
+                <w:lang w:val="en-US"/>
+              </w:rPr>
+              <w:t>endfor</w:t>
+            </w:r>
+            <w:proofErr w:type="spellEnd"/>
+            <w:r>
+              <w:rPr>
+                <w:lang w:val="en-US"/>
+              </w:rPr>
+              <w:t xml:space="preserve"> %}</w:t>
+            </w:r>
+            <w:proofErr w:type="gramEnd"/>
+          </w:p>
+          <w:p>
+            <w:r>
+              <w:t xml:space="preserve">{% </w:t>
+            </w:r>
+            <w:proofErr w:type="spellStart"/>
+            <w:r>
+              <w:t>elif</w:t>
+            </w:r>
+            <w:proofErr w:type="spellEnd"/>
+            <w:r>
+              <w:t xml:space="preserve"> </w:t>
+            </w:r>
+            <w:proofErr w:type="spellStart"/>
+            <w:r>
+              <w:t>template_dict.file_open.not_checked</w:t>
+            </w:r>
+            <w:proofErr w:type="spellEnd"/>
+            <w:r>
+              <w:t xml:space="preserve"> |length &gt;= </w:t>
             </w:r>
             <w:r>
               <w:t>2</w:t>
             </w:r>
             <w:r>
-              <w:t xml:space="preserve"> %}(See the unchecked_file_list.txt){% else %}(NONE){% endif %}</w:t>
+              <w:t xml:space="preserve"> </w:t>
+            </w:r>
+            <w:proofErr w:type="gramStart"/>
+            <w:r>
+              <w:t>%}(</w:t>
+            </w:r>
+            <w:proofErr w:type="gramEnd"/>
+            <w:r>
+              <w:t xml:space="preserve">See the </w:t>
+            </w:r>
+            <w:proofErr w:type="gramStart"/>
+            <w:r>
+              <w:t>unchecked_file_list.txt){</w:t>
+            </w:r>
+            <w:proofErr w:type="gramEnd"/>
+            <w:r>
+              <w:t xml:space="preserve">% else </w:t>
+            </w:r>
+            <w:proofErr w:type="gramStart"/>
+            <w:r>
+              <w:t>%}(</w:t>
+            </w:r>
+            <w:proofErr w:type="gramEnd"/>
+            <w:r>
+              <w:t>NONE</w:t>
+            </w:r>
+            <w:proofErr w:type="gramStart"/>
+            <w:r>
+              <w:t>){</w:t>
+            </w:r>
+            <w:proofErr w:type="gramEnd"/>
+            <w:r>
+              <w:t>% endif %}</w:t>
             </w:r>
           </w:p>
           <w:p>
@@ -2804,6 +3565,7 @@
           </w:tcPr>
           <w:p>
             <w:r>
+              <w:lastRenderedPageBreak/>
               <w:t>Require</w:t>
             </w:r>
           </w:p>
@@ -2896,7 +3658,6 @@
                 <w:bCs/>
                 <w:lang w:val="en-US"/>
               </w:rPr>
-              <w:lastRenderedPageBreak/>
               <w:t>(</w:t>
             </w:r>
             <w:r>
@@ -2905,14 +3666,24 @@
                 <w:bCs/>
                 <w:lang w:val="en-US"/>
               </w:rPr>
-              <w:t>&lt;&gt;:"/\|?*</w:t>
-            </w:r>
+              <w:t>&lt;&gt;:"/\</w:t>
+            </w:r>
+            <w:proofErr w:type="gramStart"/>
             <w:r>
               <w:rPr>
                 <w:b/>
                 <w:bCs/>
                 <w:lang w:val="en-US"/>
               </w:rPr>
+              <w:t>|?*</w:t>
+            </w:r>
+            <w:proofErr w:type="gramEnd"/>
+            <w:r>
+              <w:rPr>
+                <w:b/>
+                <w:bCs/>
+                <w:lang w:val="en-US"/>
+              </w:rPr>
               <w:t>,@$~)?</w:t>
             </w:r>
           </w:p>
@@ -2937,7 +3708,6 @@
           </w:tcPr>
           <w:p>
             <w:r>
-              <w:lastRenderedPageBreak/>
               <w:t>Python scripted.</w:t>
             </w:r>
           </w:p>
@@ -2965,7 +3735,21 @@
               <w:rPr>
                 <w:lang w:val="en-US"/>
               </w:rPr>
-              <w:t>{% if template_dict.special_characters.comments|length == 0 %}X{% endif %}</w:t>
+              <w:t xml:space="preserve">{% if </w:t>
+            </w:r>
+            <w:proofErr w:type="spellStart"/>
+            <w:r>
+              <w:rPr>
+                <w:lang w:val="en-US"/>
+              </w:rPr>
+              <w:t>template_dict.special_characters.comments|length</w:t>
+            </w:r>
+            <w:proofErr w:type="spellEnd"/>
+            <w:r>
+              <w:rPr>
+                <w:lang w:val="en-US"/>
+              </w:rPr>
+              <w:t xml:space="preserve"> == 0 %}X{% endif %}</w:t>
             </w:r>
           </w:p>
         </w:tc>
@@ -3012,7 +3796,21 @@
               <w:rPr>
                 <w:lang w:val="en-US"/>
               </w:rPr>
-              <w:t>{% if template_dict.special_characters.comments|length &gt; 0 %}X{% endif %}</w:t>
+              <w:t xml:space="preserve">{% if </w:t>
+            </w:r>
+            <w:proofErr w:type="spellStart"/>
+            <w:r>
+              <w:rPr>
+                <w:lang w:val="en-US"/>
+              </w:rPr>
+              <w:t>template_dict.special_characters.comments|length</w:t>
+            </w:r>
+            <w:proofErr w:type="spellEnd"/>
+            <w:r>
+              <w:rPr>
+                <w:lang w:val="en-US"/>
+              </w:rPr>
+              <w:t xml:space="preserve"> &gt; 0 %}X{% endif %}</w:t>
             </w:r>
           </w:p>
         </w:tc>
@@ -3093,11 +3891,31 @@
               <w:br/>
             </w:r>
             <w:r>
-              <w:t xml:space="preserve">{% if template_dict.restricted_files.comments|length &gt; 0 and template_dict.restricted_files.comments|length &lt; 50 %}{% for item in </w:t>
-            </w:r>
-            <w:r>
-              <w:lastRenderedPageBreak/>
-              <w:t>template_dict.special_characters.comments %}</w:t>
+              <w:t xml:space="preserve">{% if </w:t>
+            </w:r>
+            <w:proofErr w:type="spellStart"/>
+            <w:r>
+              <w:t>template_dict.restricted_files.comments|length</w:t>
+            </w:r>
+            <w:proofErr w:type="spellEnd"/>
+            <w:r>
+              <w:t xml:space="preserve"> &gt; 0 and </w:t>
+            </w:r>
+            <w:proofErr w:type="spellStart"/>
+            <w:r>
+              <w:t>template_dict.restricted_files.comments|length</w:t>
+            </w:r>
+            <w:proofErr w:type="spellEnd"/>
+            <w:r>
+              <w:t xml:space="preserve"> &lt; 50 %}{% for item in </w:t>
+            </w:r>
+            <w:proofErr w:type="spellStart"/>
+            <w:r>
+              <w:t>template_dict.special_characters.comments</w:t>
+            </w:r>
+            <w:proofErr w:type="spellEnd"/>
+            <w:r>
+              <w:t xml:space="preserve"> %}</w:t>
             </w:r>
           </w:p>
           <w:p>
@@ -3112,17 +3930,117 @@
               <w:rPr>
                 <w:lang w:val="en-US"/>
               </w:rPr>
-              <w:t>{{ item.file_name }}{% endfor %}</w:t>
-            </w:r>
-          </w:p>
-          <w:p>
-            <w:r>
-              <w:t>{% elif template_dict.restricted_files.comments|length &gt;= 50 %}(See the special_characters.txt)</w:t>
-            </w:r>
-          </w:p>
-          <w:p>
-            <w:r>
-              <w:t>{% else %}(NONE){% endif %}</w:t>
+              <w:t xml:space="preserve">{{ </w:t>
+            </w:r>
+            <w:proofErr w:type="spellStart"/>
+            <w:r>
+              <w:rPr>
+                <w:lang w:val="en-US"/>
+              </w:rPr>
+              <w:t>item.file_</w:t>
+            </w:r>
+            <w:proofErr w:type="gramStart"/>
+            <w:r>
+              <w:rPr>
+                <w:lang w:val="en-US"/>
+              </w:rPr>
+              <w:t>name</w:t>
+            </w:r>
+            <w:proofErr w:type="spellEnd"/>
+            <w:r>
+              <w:rPr>
+                <w:lang w:val="en-US"/>
+              </w:rPr>
+              <w:t xml:space="preserve"> }}{%</w:t>
+            </w:r>
+            <w:proofErr w:type="gramEnd"/>
+            <w:r>
+              <w:rPr>
+                <w:lang w:val="en-US"/>
+              </w:rPr>
+              <w:t xml:space="preserve"> </w:t>
+            </w:r>
+            <w:proofErr w:type="spellStart"/>
+            <w:proofErr w:type="gramStart"/>
+            <w:r>
+              <w:rPr>
+                <w:lang w:val="en-US"/>
+              </w:rPr>
+              <w:t>endfor</w:t>
+            </w:r>
+            <w:proofErr w:type="spellEnd"/>
+            <w:r>
+              <w:rPr>
+                <w:lang w:val="en-US"/>
+              </w:rPr>
+              <w:t xml:space="preserve"> %}</w:t>
+            </w:r>
+            <w:proofErr w:type="gramEnd"/>
+          </w:p>
+          <w:p>
+            <w:r>
+              <w:t xml:space="preserve">{% </w:t>
+            </w:r>
+            <w:proofErr w:type="spellStart"/>
+            <w:r>
+              <w:t>elif</w:t>
+            </w:r>
+            <w:proofErr w:type="spellEnd"/>
+            <w:r>
+              <w:t xml:space="preserve"> </w:t>
+            </w:r>
+            <w:proofErr w:type="spellStart"/>
+            <w:r>
+              <w:t>template_</w:t>
+            </w:r>
+            <w:proofErr w:type="gramStart"/>
+            <w:r>
+              <w:t>dict.restricted</w:t>
+            </w:r>
+            <w:proofErr w:type="gramEnd"/>
+            <w:r>
+              <w:t>_</w:t>
+            </w:r>
+            <w:proofErr w:type="gramStart"/>
+            <w:r>
+              <w:t>files.comments</w:t>
+            </w:r>
+            <w:proofErr w:type="gramEnd"/>
+            <w:r>
+              <w:t>|length</w:t>
+            </w:r>
+            <w:proofErr w:type="spellEnd"/>
+            <w:r>
+              <w:t xml:space="preserve"> &gt;= 50 </w:t>
+            </w:r>
+            <w:proofErr w:type="gramStart"/>
+            <w:r>
+              <w:t>%}(</w:t>
+            </w:r>
+            <w:proofErr w:type="gramEnd"/>
+            <w:r>
+              <w:t>See the special_characters.txt)</w:t>
+            </w:r>
+          </w:p>
+          <w:p>
+            <w:r>
+              <w:t xml:space="preserve">{% else </w:t>
+            </w:r>
+            <w:proofErr w:type="gramStart"/>
+            <w:r>
+              <w:t>%}(</w:t>
+            </w:r>
+            <w:proofErr w:type="gramEnd"/>
+            <w:r>
+              <w:t>NONE</w:t>
+            </w:r>
+            <w:proofErr w:type="gramStart"/>
+            <w:r>
+              <w:t>){</w:t>
+            </w:r>
+            <w:proofErr w:type="gramEnd"/>
+            <w:r>
+              <w:t>% endif %}</w:t>
             </w:r>
           </w:p>
           <w:p>
@@ -3135,6 +4053,7 @@
               <w:rPr>
                 <w:u w:val="single"/>
               </w:rPr>
+              <w:lastRenderedPageBreak/>
               <w:t>Curator’s comments:</w:t>
             </w:r>
           </w:p>
@@ -3305,7 +4224,14 @@
               <w:rPr>
                 <w:lang w:val="en-US"/>
               </w:rPr>
-              <w:t>{% if template_dict.</w:t>
+              <w:t xml:space="preserve">{% if </w:t>
+            </w:r>
+            <w:proofErr w:type="spellStart"/>
+            <w:r>
+              <w:rPr>
+                <w:lang w:val="en-US"/>
+              </w:rPr>
+              <w:t>template_dict.</w:t>
             </w:r>
             <w:r>
               <w:rPr>
@@ -3318,7 +4244,14 @@
               <w:rPr>
                 <w:lang w:val="en-US"/>
               </w:rPr>
-              <w:t xml:space="preserve">.comments|length </w:t>
+              <w:t>.comments|length</w:t>
+            </w:r>
+            <w:proofErr w:type="spellEnd"/>
+            <w:r>
+              <w:rPr>
+                <w:lang w:val="en-US"/>
+              </w:rPr>
+              <w:t xml:space="preserve"> </w:t>
             </w:r>
             <w:r>
               <w:rPr>
@@ -3358,7 +4291,21 @@
               <w:rPr>
                 <w:lang w:val="en-US"/>
               </w:rPr>
-              <w:t>{% if template_dict.file_ext.comments|length &gt; 0 %}X{% endif %}</w:t>
+              <w:t xml:space="preserve">{% if </w:t>
+            </w:r>
+            <w:proofErr w:type="spellStart"/>
+            <w:r>
+              <w:rPr>
+                <w:lang w:val="en-US"/>
+              </w:rPr>
+              <w:t>template_dict.file_ext.comments|length</w:t>
+            </w:r>
+            <w:proofErr w:type="spellEnd"/>
+            <w:r>
+              <w:rPr>
+                <w:lang w:val="en-US"/>
+              </w:rPr>
+              <w:t xml:space="preserve"> &gt; 0 %}X{% endif %}</w:t>
             </w:r>
           </w:p>
         </w:tc>
@@ -3460,7 +4407,31 @@
               <w:br/>
             </w:r>
             <w:r>
-              <w:t>{% if template_dict.file_ext.comments |length &gt; 0 and template_dict.file_ext.comments |length &lt; 50 %}{% for item in template_dict.file_ext.comments %}</w:t>
+              <w:t xml:space="preserve">{% if </w:t>
+            </w:r>
+            <w:proofErr w:type="spellStart"/>
+            <w:r>
+              <w:t>template_dict.file_ext.comments</w:t>
+            </w:r>
+            <w:proofErr w:type="spellEnd"/>
+            <w:r>
+              <w:t xml:space="preserve"> |length &gt; 0 and </w:t>
+            </w:r>
+            <w:proofErr w:type="spellStart"/>
+            <w:r>
+              <w:t>template_dict.file_ext.comments</w:t>
+            </w:r>
+            <w:proofErr w:type="spellEnd"/>
+            <w:r>
+              <w:t xml:space="preserve"> |length &lt; 50 %}{% for item in </w:t>
+            </w:r>
+            <w:proofErr w:type="spellStart"/>
+            <w:r>
+              <w:t>template_dict.file_ext.comments</w:t>
+            </w:r>
+            <w:proofErr w:type="spellEnd"/>
+            <w:r>
+              <w:t xml:space="preserve"> %}</w:t>
             </w:r>
           </w:p>
           <w:p>
@@ -3476,15 +4447,112 @@
               <w:rPr>
                 <w:lang w:val="en-US"/>
               </w:rPr>
-              <w:t>{{ item.file_name }}{% endfor %}</w:t>
-            </w:r>
+              <w:t xml:space="preserve">{{ </w:t>
+            </w:r>
+            <w:proofErr w:type="spellStart"/>
+            <w:r>
+              <w:rPr>
+                <w:lang w:val="en-US"/>
+              </w:rPr>
+              <w:t>item.file_</w:t>
+            </w:r>
+            <w:proofErr w:type="gramStart"/>
+            <w:r>
+              <w:rPr>
+                <w:lang w:val="en-US"/>
+              </w:rPr>
+              <w:t>name</w:t>
+            </w:r>
+            <w:proofErr w:type="spellEnd"/>
+            <w:r>
+              <w:rPr>
+                <w:lang w:val="en-US"/>
+              </w:rPr>
+              <w:t xml:space="preserve"> }}{%</w:t>
+            </w:r>
+            <w:proofErr w:type="gramEnd"/>
+            <w:r>
+              <w:rPr>
+                <w:lang w:val="en-US"/>
+              </w:rPr>
+              <w:t xml:space="preserve"> </w:t>
+            </w:r>
+            <w:proofErr w:type="spellStart"/>
+            <w:proofErr w:type="gramStart"/>
+            <w:r>
+              <w:rPr>
+                <w:lang w:val="en-US"/>
+              </w:rPr>
+              <w:t>endfor</w:t>
+            </w:r>
+            <w:proofErr w:type="spellEnd"/>
+            <w:r>
+              <w:rPr>
+                <w:lang w:val="en-US"/>
+              </w:rPr>
+              <w:t xml:space="preserve"> %}</w:t>
+            </w:r>
+            <w:proofErr w:type="gramEnd"/>
           </w:p>
           <w:p>
             <w:pPr>
               <w:spacing w:line="256" w:lineRule="auto"/>
             </w:pPr>
             <w:r>
-              <w:t>{% elif template_dict.file_ext.comments |length &gt;= 50 %}(See the no_file_extension.txt) {% else %}(NONE){% endif %}</w:t>
+              <w:t xml:space="preserve">{% </w:t>
+            </w:r>
+            <w:proofErr w:type="spellStart"/>
+            <w:r>
+              <w:t>elif</w:t>
+            </w:r>
+            <w:proofErr w:type="spellEnd"/>
+            <w:r>
+              <w:t xml:space="preserve"> </w:t>
+            </w:r>
+            <w:proofErr w:type="spellStart"/>
+            <w:r>
+              <w:t>template_</w:t>
+            </w:r>
+            <w:proofErr w:type="gramStart"/>
+            <w:r>
+              <w:t>dict.file</w:t>
+            </w:r>
+            <w:proofErr w:type="gramEnd"/>
+            <w:r>
+              <w:t>_</w:t>
+            </w:r>
+            <w:proofErr w:type="gramStart"/>
+            <w:r>
+              <w:t>ext.comments</w:t>
+            </w:r>
+            <w:proofErr w:type="spellEnd"/>
+            <w:proofErr w:type="gramEnd"/>
+            <w:r>
+              <w:t xml:space="preserve"> |length &gt;= 50 </w:t>
+            </w:r>
+            <w:proofErr w:type="gramStart"/>
+            <w:r>
+              <w:t>%}(</w:t>
+            </w:r>
+            <w:proofErr w:type="gramEnd"/>
+            <w:r>
+              <w:t xml:space="preserve">See the no_file_extension.txt) {% else </w:t>
+            </w:r>
+            <w:proofErr w:type="gramStart"/>
+            <w:r>
+              <w:t>%}(</w:t>
+            </w:r>
+            <w:proofErr w:type="gramEnd"/>
+            <w:r>
+              <w:t>NONE</w:t>
+            </w:r>
+            <w:proofErr w:type="gramStart"/>
+            <w:r>
+              <w:t>){</w:t>
+            </w:r>
+            <w:proofErr w:type="gramEnd"/>
+            <w:r>
+              <w:t>% endif %}</w:t>
             </w:r>
           </w:p>
           <w:p>
@@ -3780,7 +4848,31 @@
               <w:br/>
             </w:r>
             <w:r>
-              <w:t>{% if template_dict.common_file_format.comments|length &gt; 0 and template_dict.common_file_format.comments|length &lt; 50 %}{% for item in template_dict.common_file_format.comments %}</w:t>
+              <w:t xml:space="preserve">{% if </w:t>
+            </w:r>
+            <w:proofErr w:type="spellStart"/>
+            <w:r>
+              <w:t>template_dict.common_file_format.comments|length</w:t>
+            </w:r>
+            <w:proofErr w:type="spellEnd"/>
+            <w:r>
+              <w:t xml:space="preserve"> &gt; 0 and </w:t>
+            </w:r>
+            <w:proofErr w:type="spellStart"/>
+            <w:r>
+              <w:t>template_dict.common_file_format.comments|length</w:t>
+            </w:r>
+            <w:proofErr w:type="spellEnd"/>
+            <w:r>
+              <w:t xml:space="preserve"> &lt; 50 %}{% for item in </w:t>
+            </w:r>
+            <w:proofErr w:type="spellStart"/>
+            <w:r>
+              <w:t>template_dict.common_file_format.comments</w:t>
+            </w:r>
+            <w:proofErr w:type="spellEnd"/>
+            <w:r>
+              <w:t xml:space="preserve"> %}</w:t>
             </w:r>
           </w:p>
           <w:p>
@@ -3794,31 +4886,125 @@
               <w:rPr>
                 <w:lang w:val="en-US"/>
               </w:rPr>
-              <w:lastRenderedPageBreak/>
-              <w:t>{{ item.file_name }}</w:t>
+              <w:t xml:space="preserve">{{ </w:t>
+            </w:r>
+            <w:proofErr w:type="spellStart"/>
+            <w:r>
+              <w:rPr>
+                <w:lang w:val="en-US"/>
+              </w:rPr>
+              <w:t>item.file_</w:t>
+            </w:r>
+            <w:proofErr w:type="gramStart"/>
+            <w:r>
+              <w:rPr>
+                <w:lang w:val="en-US"/>
+              </w:rPr>
+              <w:t>name</w:t>
+            </w:r>
+            <w:proofErr w:type="spellEnd"/>
+            <w:r>
+              <w:rPr>
+                <w:lang w:val="en-US"/>
+              </w:rPr>
+              <w:t xml:space="preserve"> }}</w:t>
             </w:r>
             <w:r>
               <w:rPr>
                 <w:rFonts w:hint="eastAsia"/>
                 <w:lang w:val="en-US"/>
               </w:rPr>
+              <w:t>{%</w:t>
+            </w:r>
+            <w:proofErr w:type="gramEnd"/>
+            <w:r>
+              <w:rPr>
+                <w:rFonts w:hint="eastAsia"/>
+                <w:lang w:val="en-US"/>
+              </w:rPr>
+              <w:t xml:space="preserve"> </w:t>
+            </w:r>
+            <w:proofErr w:type="spellStart"/>
+            <w:proofErr w:type="gramStart"/>
+            <w:r>
+              <w:rPr>
+                <w:lang w:val="en-US"/>
+              </w:rPr>
+              <w:t>endfor</w:t>
+            </w:r>
+            <w:proofErr w:type="spellEnd"/>
+            <w:r>
+              <w:rPr>
+                <w:lang w:val="en-US"/>
+              </w:rPr>
+              <w:t xml:space="preserve"> %}</w:t>
+            </w:r>
+            <w:proofErr w:type="gramEnd"/>
+          </w:p>
+          <w:p>
+            <w:r>
               <w:t xml:space="preserve">{% </w:t>
             </w:r>
-            <w:r>
-              <w:rPr>
-                <w:lang w:val="en-US"/>
-              </w:rPr>
-              <w:t>endfor %}</w:t>
-            </w:r>
-          </w:p>
-          <w:p>
-            <w:r>
-              <w:t>{% elif template_dict.common_file_format.comments|length &gt;= 50 %}(See the uncommon_file_extension.txt)</w:t>
-            </w:r>
-          </w:p>
-          <w:p>
-            <w:r>
-              <w:t>{% else %}(NONE){% endif %}</w:t>
+            <w:proofErr w:type="spellStart"/>
+            <w:r>
+              <w:t>elif</w:t>
+            </w:r>
+            <w:proofErr w:type="spellEnd"/>
+            <w:r>
+              <w:t xml:space="preserve"> </w:t>
+            </w:r>
+            <w:proofErr w:type="spellStart"/>
+            <w:r>
+              <w:t>template_</w:t>
+            </w:r>
+            <w:proofErr w:type="gramStart"/>
+            <w:r>
+              <w:t>dict.common</w:t>
+            </w:r>
+            <w:proofErr w:type="gramEnd"/>
+            <w:r>
+              <w:t>_file_</w:t>
+            </w:r>
+            <w:proofErr w:type="gramStart"/>
+            <w:r>
+              <w:t>format.comments</w:t>
+            </w:r>
+            <w:proofErr w:type="gramEnd"/>
+            <w:r>
+              <w:t>|length</w:t>
+            </w:r>
+            <w:proofErr w:type="spellEnd"/>
+            <w:r>
+              <w:t xml:space="preserve"> &gt;= 50 </w:t>
+            </w:r>
+            <w:proofErr w:type="gramStart"/>
+            <w:r>
+              <w:t>%}(</w:t>
+            </w:r>
+            <w:proofErr w:type="gramEnd"/>
+            <w:r>
+              <w:t>See the uncommon_file_extension.txt)</w:t>
+            </w:r>
+          </w:p>
+          <w:p>
+            <w:r>
+              <w:t xml:space="preserve">{% else </w:t>
+            </w:r>
+            <w:proofErr w:type="gramStart"/>
+            <w:r>
+              <w:t>%}(</w:t>
+            </w:r>
+            <w:proofErr w:type="gramEnd"/>
+            <w:r>
+              <w:t>NONE</w:t>
+            </w:r>
+            <w:proofErr w:type="gramStart"/>
+            <w:r>
+              <w:t>){</w:t>
+            </w:r>
+            <w:proofErr w:type="gramEnd"/>
+            <w:r>
+              <w:t>% endif %}</w:t>
             </w:r>
           </w:p>
         </w:tc>
@@ -3842,7 +5028,6 @@
           </w:tcPr>
           <w:p>
             <w:r>
-              <w:lastRenderedPageBreak/>
               <w:t>Info</w:t>
             </w:r>
           </w:p>
@@ -3897,6 +5082,7 @@
                 <w:b/>
                 <w:bCs/>
               </w:rPr>
+              <w:lastRenderedPageBreak/>
               <w:t>2.5</w:t>
             </w:r>
           </w:p>
@@ -4569,7 +5755,21 @@
               <w:rPr>
                 <w:lang w:val="en-US"/>
               </w:rPr>
-              <w:t>Read the `ds_tree.txt` file in the log_files folder to identify whether there is a README file</w:t>
+              <w:t xml:space="preserve">Read the `ds_tree.txt` file in the </w:t>
+            </w:r>
+            <w:proofErr w:type="spellStart"/>
+            <w:r>
+              <w:rPr>
+                <w:lang w:val="en-US"/>
+              </w:rPr>
+              <w:t>log_files</w:t>
+            </w:r>
+            <w:proofErr w:type="spellEnd"/>
+            <w:r>
+              <w:rPr>
+                <w:lang w:val="en-US"/>
+              </w:rPr>
+              <w:t xml:space="preserve"> folder to identify whether there is a README file</w:t>
             </w:r>
             <w:r>
               <w:rPr>
@@ -4593,14 +5793,7 @@
               <w:rPr>
                 <w:lang w:val="en-US"/>
               </w:rPr>
-              <w:t xml:space="preserve">is not named </w:t>
-            </w:r>
-            <w:r>
-              <w:rPr>
-                <w:lang w:val="en-US"/>
-              </w:rPr>
-              <w:lastRenderedPageBreak/>
-              <w:t>with ‘README’</w:t>
+              <w:t>is not named with ‘README’</w:t>
             </w:r>
           </w:p>
           <w:p>
@@ -4634,8 +5827,21 @@
               <w:rPr>
                 <w:lang w:val="en-US"/>
               </w:rPr>
-              <w:lastRenderedPageBreak/>
-              <w:t>{% if template_dict.readme_file.comments|length &gt; 0 %}X{% endif %}</w:t>
+              <w:t xml:space="preserve">{% if </w:t>
+            </w:r>
+            <w:proofErr w:type="spellStart"/>
+            <w:r>
+              <w:rPr>
+                <w:lang w:val="en-US"/>
+              </w:rPr>
+              <w:t>template_dict.readme_file.comments|length</w:t>
+            </w:r>
+            <w:proofErr w:type="spellEnd"/>
+            <w:r>
+              <w:rPr>
+                <w:lang w:val="en-US"/>
+              </w:rPr>
+              <w:t xml:space="preserve"> &gt; 0 %}X{% endif %}</w:t>
             </w:r>
           </w:p>
         </w:tc>
@@ -4667,7 +5873,21 @@
               <w:rPr>
                 <w:lang w:val="en-US"/>
               </w:rPr>
-              <w:t>{% if template_dict.readme_file.comments|length == 0 %}X{% endif %}</w:t>
+              <w:t xml:space="preserve">{% if </w:t>
+            </w:r>
+            <w:proofErr w:type="spellStart"/>
+            <w:r>
+              <w:rPr>
+                <w:lang w:val="en-US"/>
+              </w:rPr>
+              <w:t>template_dict.readme_file.comments|length</w:t>
+            </w:r>
+            <w:proofErr w:type="spellEnd"/>
+            <w:r>
+              <w:rPr>
+                <w:lang w:val="en-US"/>
+              </w:rPr>
+              <w:t xml:space="preserve"> == 0 %}X{% endif %}</w:t>
             </w:r>
           </w:p>
           <w:p/>
@@ -4772,14 +5992,20 @@
             <w:r>
               <w:t xml:space="preserve">{% if </w:t>
             </w:r>
+            <w:proofErr w:type="spellStart"/>
             <w:r>
               <w:rPr>
                 <w:lang w:val="en-US"/>
               </w:rPr>
               <w:t>template_dict.readme_file.comments</w:t>
             </w:r>
-            <w:r>
-              <w:t xml:space="preserve"> |length &gt; 0</w:t>
+            <w:proofErr w:type="spellEnd"/>
+            <w:r>
+              <w:t xml:space="preserve"> |length &gt; </w:t>
+            </w:r>
+            <w:proofErr w:type="gramStart"/>
+            <w:r>
+              <w:t>0</w:t>
             </w:r>
             <w:r>
               <w:t xml:space="preserve"> %}</w:t>
@@ -4788,8 +6014,115 @@
               <w:rPr>
                 <w:lang w:val="en-US"/>
               </w:rPr>
-              <w:t>{% for item in template_dict.readme_file.comments %}{{ loop.index }}. {{ item.file_name }}{% endfor %}</w:t>
-            </w:r>
+              <w:t>{%</w:t>
+            </w:r>
+            <w:proofErr w:type="gramEnd"/>
+            <w:r>
+              <w:rPr>
+                <w:lang w:val="en-US"/>
+              </w:rPr>
+              <w:t xml:space="preserve"> for item in </w:t>
+            </w:r>
+            <w:proofErr w:type="spellStart"/>
+            <w:r>
+              <w:rPr>
+                <w:lang w:val="en-US"/>
+              </w:rPr>
+              <w:t>template_dict.readme_file.</w:t>
+            </w:r>
+            <w:proofErr w:type="gramStart"/>
+            <w:r>
+              <w:rPr>
+                <w:lang w:val="en-US"/>
+              </w:rPr>
+              <w:t>comments</w:t>
+            </w:r>
+            <w:proofErr w:type="spellEnd"/>
+            <w:r>
+              <w:rPr>
+                <w:lang w:val="en-US"/>
+              </w:rPr>
+              <w:t xml:space="preserve"> %}{{</w:t>
+            </w:r>
+            <w:proofErr w:type="gramEnd"/>
+            <w:r>
+              <w:rPr>
+                <w:lang w:val="en-US"/>
+              </w:rPr>
+              <w:t xml:space="preserve"> </w:t>
+            </w:r>
+            <w:proofErr w:type="spellStart"/>
+            <w:r>
+              <w:rPr>
+                <w:lang w:val="en-US"/>
+              </w:rPr>
+              <w:t>loop.</w:t>
+            </w:r>
+            <w:proofErr w:type="gramStart"/>
+            <w:r>
+              <w:rPr>
+                <w:lang w:val="en-US"/>
+              </w:rPr>
+              <w:t>index</w:t>
+            </w:r>
+            <w:proofErr w:type="spellEnd"/>
+            <w:r>
+              <w:rPr>
+                <w:lang w:val="en-US"/>
+              </w:rPr>
+              <w:t xml:space="preserve"> }}.</w:t>
+            </w:r>
+            <w:proofErr w:type="gramEnd"/>
+            <w:r>
+              <w:rPr>
+                <w:lang w:val="en-US"/>
+              </w:rPr>
+              <w:t xml:space="preserve"> {{ </w:t>
+            </w:r>
+            <w:proofErr w:type="spellStart"/>
+            <w:r>
+              <w:rPr>
+                <w:lang w:val="en-US"/>
+              </w:rPr>
+              <w:t>item.file_</w:t>
+            </w:r>
+            <w:proofErr w:type="gramStart"/>
+            <w:r>
+              <w:rPr>
+                <w:lang w:val="en-US"/>
+              </w:rPr>
+              <w:t>name</w:t>
+            </w:r>
+            <w:proofErr w:type="spellEnd"/>
+            <w:r>
+              <w:rPr>
+                <w:lang w:val="en-US"/>
+              </w:rPr>
+              <w:t xml:space="preserve"> }}{%</w:t>
+            </w:r>
+            <w:proofErr w:type="gramEnd"/>
+            <w:r>
+              <w:rPr>
+                <w:lang w:val="en-US"/>
+              </w:rPr>
+              <w:t xml:space="preserve"> </w:t>
+            </w:r>
+            <w:proofErr w:type="spellStart"/>
+            <w:proofErr w:type="gramStart"/>
+            <w:r>
+              <w:rPr>
+                <w:lang w:val="en-US"/>
+              </w:rPr>
+              <w:t>endfor</w:t>
+            </w:r>
+            <w:proofErr w:type="spellEnd"/>
+            <w:r>
+              <w:rPr>
+                <w:lang w:val="en-US"/>
+              </w:rPr>
+              <w:t xml:space="preserve"> %}</w:t>
+            </w:r>
+            <w:proofErr w:type="gramEnd"/>
           </w:p>
           <w:p>
             <w:pPr>
@@ -4798,13 +6131,26 @@
               </w:rPr>
             </w:pPr>
             <w:r>
-              <w:t>{% else %}(</w:t>
-            </w:r>
-            <w:r>
-              <w:t>NO README FILE FOUND</w:t>
-            </w:r>
-            <w:r>
-              <w:t>){% endif %}</w:t>
+              <w:t xml:space="preserve">{% else </w:t>
+            </w:r>
+            <w:proofErr w:type="gramStart"/>
+            <w:r>
+              <w:t>%}(</w:t>
+            </w:r>
+            <w:proofErr w:type="gramEnd"/>
+            <w:r>
+              <w:t xml:space="preserve">NO README FILE </w:t>
+            </w:r>
+            <w:proofErr w:type="gramStart"/>
+            <w:r>
+              <w:t>FOUND</w:t>
+            </w:r>
+            <w:r>
+              <w:t>){</w:t>
+            </w:r>
+            <w:proofErr w:type="gramEnd"/>
+            <w:r>
+              <w:t>% endif %}</w:t>
             </w:r>
           </w:p>
           <w:p/>
@@ -4928,7 +6274,15 @@
                 <w:b/>
                 <w:bCs/>
               </w:rPr>
-              <w:t>Does the README contain the following information, and does it match the dataset’s metadata?</w:t>
+              <w:t xml:space="preserve">Does the README contain the following information, and does it match </w:t>
+            </w:r>
+            <w:r>
+              <w:rPr>
+                <w:b/>
+                <w:bCs/>
+              </w:rPr>
+              <w:lastRenderedPageBreak/>
+              <w:t>the dataset’s metadata?</w:t>
             </w:r>
           </w:p>
         </w:tc>
@@ -4951,6 +6305,7 @@
           </w:tcPr>
           <w:p>
             <w:r>
+              <w:lastRenderedPageBreak/>
               <w:t>Dataset Title</w:t>
             </w:r>
           </w:p>
@@ -5058,7 +6413,21 @@
               <w:rPr>
                 <w:lang w:val="en-US"/>
               </w:rPr>
-              <w:t>{% if template_dict.readme_file.comments|length == 0 %}X{% endif %}</w:t>
+              <w:t xml:space="preserve">{% if </w:t>
+            </w:r>
+            <w:proofErr w:type="spellStart"/>
+            <w:r>
+              <w:rPr>
+                <w:lang w:val="en-US"/>
+              </w:rPr>
+              <w:t>template_dict.readme_file.comments|length</w:t>
+            </w:r>
+            <w:proofErr w:type="spellEnd"/>
+            <w:r>
+              <w:rPr>
+                <w:lang w:val="en-US"/>
+              </w:rPr>
+              <w:t xml:space="preserve"> == 0 %}X{% endif %}</w:t>
             </w:r>
           </w:p>
           <w:p>
@@ -5107,7 +6476,47 @@
               </w:numPr>
             </w:pPr>
             <w:r>
-              <w:t>{% if template_dict.readme_file.comments|length == 0 %}(NO README FILE FOUND){% endif %</w:t>
+              <w:t xml:space="preserve">{% if </w:t>
+            </w:r>
+            <w:proofErr w:type="spellStart"/>
+            <w:r>
+              <w:t>template_</w:t>
+            </w:r>
+            <w:proofErr w:type="gramStart"/>
+            <w:r>
+              <w:t>dict.readme</w:t>
+            </w:r>
+            <w:proofErr w:type="gramEnd"/>
+            <w:r>
+              <w:t>_</w:t>
+            </w:r>
+            <w:proofErr w:type="gramStart"/>
+            <w:r>
+              <w:t>file.comments</w:t>
+            </w:r>
+            <w:proofErr w:type="gramEnd"/>
+            <w:r>
+              <w:t>|length</w:t>
+            </w:r>
+            <w:proofErr w:type="spellEnd"/>
+            <w:r>
+              <w:t xml:space="preserve"> == 0 </w:t>
+            </w:r>
+            <w:proofErr w:type="gramStart"/>
+            <w:r>
+              <w:t>%}(</w:t>
+            </w:r>
+            <w:proofErr w:type="gramEnd"/>
+            <w:r>
+              <w:t xml:space="preserve">NO README FILE </w:t>
+            </w:r>
+            <w:proofErr w:type="gramStart"/>
+            <w:r>
+              <w:t>FOUND){</w:t>
+            </w:r>
+            <w:proofErr w:type="gramEnd"/>
+            <w:r>
+              <w:t>% endif %</w:t>
             </w:r>
             <w:r>
               <w:t>}</w:t>
@@ -5336,7 +6745,21 @@
               <w:rPr>
                 <w:lang w:val="en-US"/>
               </w:rPr>
-              <w:t>{% if template_dict.readme_file.comments|length == 0 %}X{% endif %}</w:t>
+              <w:t xml:space="preserve">{% if </w:t>
+            </w:r>
+            <w:proofErr w:type="spellStart"/>
+            <w:r>
+              <w:rPr>
+                <w:lang w:val="en-US"/>
+              </w:rPr>
+              <w:t>template_dict.readme_file.comments|length</w:t>
+            </w:r>
+            <w:proofErr w:type="spellEnd"/>
+            <w:r>
+              <w:rPr>
+                <w:lang w:val="en-US"/>
+              </w:rPr>
+              <w:t xml:space="preserve"> == 0 %}X{% endif %}</w:t>
             </w:r>
           </w:p>
           <w:p/>
@@ -5379,7 +6802,47 @@
               </w:numPr>
             </w:pPr>
             <w:r>
-              <w:t>{% if template_dict.readme_file.comments|length == 0 %}(NO README FILE FOUND){% endif %</w:t>
+              <w:t xml:space="preserve">{% if </w:t>
+            </w:r>
+            <w:proofErr w:type="spellStart"/>
+            <w:r>
+              <w:t>template_</w:t>
+            </w:r>
+            <w:proofErr w:type="gramStart"/>
+            <w:r>
+              <w:t>dict.readme</w:t>
+            </w:r>
+            <w:proofErr w:type="gramEnd"/>
+            <w:r>
+              <w:t>_</w:t>
+            </w:r>
+            <w:proofErr w:type="gramStart"/>
+            <w:r>
+              <w:t>file.comments</w:t>
+            </w:r>
+            <w:proofErr w:type="gramEnd"/>
+            <w:r>
+              <w:t>|length</w:t>
+            </w:r>
+            <w:proofErr w:type="spellEnd"/>
+            <w:r>
+              <w:t xml:space="preserve"> == 0 </w:t>
+            </w:r>
+            <w:proofErr w:type="gramStart"/>
+            <w:r>
+              <w:t>%}(</w:t>
+            </w:r>
+            <w:proofErr w:type="gramEnd"/>
+            <w:r>
+              <w:t xml:space="preserve">NO README FILE </w:t>
+            </w:r>
+            <w:proofErr w:type="gramStart"/>
+            <w:r>
+              <w:t>FOUND){</w:t>
+            </w:r>
+            <w:proofErr w:type="gramEnd"/>
+            <w:r>
+              <w:t>% endif %</w:t>
             </w:r>
             <w:r>
               <w:t>}</w:t>
@@ -5608,7 +7071,21 @@
               <w:rPr>
                 <w:lang w:val="en-US"/>
               </w:rPr>
-              <w:t>{% if template_dict.readme_file.comments|length == 0 %}X{% endif %}</w:t>
+              <w:t xml:space="preserve">{% if </w:t>
+            </w:r>
+            <w:proofErr w:type="spellStart"/>
+            <w:r>
+              <w:rPr>
+                <w:lang w:val="en-US"/>
+              </w:rPr>
+              <w:t>template_dict.readme_file.comments|length</w:t>
+            </w:r>
+            <w:proofErr w:type="spellEnd"/>
+            <w:r>
+              <w:rPr>
+                <w:lang w:val="en-US"/>
+              </w:rPr>
+              <w:t xml:space="preserve"> == 0 %}X{% endif %}</w:t>
             </w:r>
           </w:p>
           <w:p/>
@@ -5651,7 +7128,47 @@
               </w:numPr>
             </w:pPr>
             <w:r>
-              <w:t>{% if template_dict.readme_file.comments|length == 0 %}(NO README FILE FOUND){% endif %</w:t>
+              <w:t xml:space="preserve">{% if </w:t>
+            </w:r>
+            <w:proofErr w:type="spellStart"/>
+            <w:r>
+              <w:t>template_</w:t>
+            </w:r>
+            <w:proofErr w:type="gramStart"/>
+            <w:r>
+              <w:t>dict.readme</w:t>
+            </w:r>
+            <w:proofErr w:type="gramEnd"/>
+            <w:r>
+              <w:t>_</w:t>
+            </w:r>
+            <w:proofErr w:type="gramStart"/>
+            <w:r>
+              <w:t>file.comments</w:t>
+            </w:r>
+            <w:proofErr w:type="gramEnd"/>
+            <w:r>
+              <w:t>|length</w:t>
+            </w:r>
+            <w:proofErr w:type="spellEnd"/>
+            <w:r>
+              <w:t xml:space="preserve"> == 0 </w:t>
+            </w:r>
+            <w:proofErr w:type="gramStart"/>
+            <w:r>
+              <w:t>%}(</w:t>
+            </w:r>
+            <w:proofErr w:type="gramEnd"/>
+            <w:r>
+              <w:t xml:space="preserve">NO README FILE </w:t>
+            </w:r>
+            <w:proofErr w:type="gramStart"/>
+            <w:r>
+              <w:t>FOUND){</w:t>
+            </w:r>
+            <w:proofErr w:type="gramEnd"/>
+            <w:r>
+              <w:t>% endif %</w:t>
             </w:r>
             <w:r>
               <w:t>}</w:t>
@@ -5880,7 +7397,21 @@
               <w:rPr>
                 <w:lang w:val="en-US"/>
               </w:rPr>
-              <w:t>{% if template_dict.readme_file.comments|length == 0 %}X{% endif %}</w:t>
+              <w:t xml:space="preserve">{% if </w:t>
+            </w:r>
+            <w:proofErr w:type="spellStart"/>
+            <w:r>
+              <w:rPr>
+                <w:lang w:val="en-US"/>
+              </w:rPr>
+              <w:t>template_dict.readme_file.comments|length</w:t>
+            </w:r>
+            <w:proofErr w:type="spellEnd"/>
+            <w:r>
+              <w:rPr>
+                <w:lang w:val="en-US"/>
+              </w:rPr>
+              <w:t xml:space="preserve"> == 0 %}X{% endif %}</w:t>
             </w:r>
           </w:p>
           <w:p/>
@@ -5923,7 +7454,47 @@
               </w:numPr>
             </w:pPr>
             <w:r>
-              <w:t>{% if template_dict.readme_file.comments|length == 0 %}(NO README FILE FOUND){% endif %</w:t>
+              <w:t xml:space="preserve">{% if </w:t>
+            </w:r>
+            <w:proofErr w:type="spellStart"/>
+            <w:r>
+              <w:t>template_</w:t>
+            </w:r>
+            <w:proofErr w:type="gramStart"/>
+            <w:r>
+              <w:t>dict.readme</w:t>
+            </w:r>
+            <w:proofErr w:type="gramEnd"/>
+            <w:r>
+              <w:t>_</w:t>
+            </w:r>
+            <w:proofErr w:type="gramStart"/>
+            <w:r>
+              <w:t>file.comments</w:t>
+            </w:r>
+            <w:proofErr w:type="gramEnd"/>
+            <w:r>
+              <w:t>|length</w:t>
+            </w:r>
+            <w:proofErr w:type="spellEnd"/>
+            <w:r>
+              <w:t xml:space="preserve"> == 0 </w:t>
+            </w:r>
+            <w:proofErr w:type="gramStart"/>
+            <w:r>
+              <w:t>%}(</w:t>
+            </w:r>
+            <w:proofErr w:type="gramEnd"/>
+            <w:r>
+              <w:t xml:space="preserve">NO README FILE </w:t>
+            </w:r>
+            <w:proofErr w:type="gramStart"/>
+            <w:r>
+              <w:t>FOUND){</w:t>
+            </w:r>
+            <w:proofErr w:type="gramEnd"/>
+            <w:r>
+              <w:t>% endif %</w:t>
             </w:r>
             <w:r>
               <w:t>}</w:t>
@@ -6145,7 +7716,21 @@
               <w:rPr>
                 <w:lang w:val="en-US"/>
               </w:rPr>
-              <w:t>{% if template_dict.readme_file.comments|length == 0 %}X{% endif %}</w:t>
+              <w:t xml:space="preserve">{% if </w:t>
+            </w:r>
+            <w:proofErr w:type="spellStart"/>
+            <w:r>
+              <w:rPr>
+                <w:lang w:val="en-US"/>
+              </w:rPr>
+              <w:t>template_dict.readme_file.comments|length</w:t>
+            </w:r>
+            <w:proofErr w:type="spellEnd"/>
+            <w:r>
+              <w:rPr>
+                <w:lang w:val="en-US"/>
+              </w:rPr>
+              <w:t xml:space="preserve"> == 0 %}X{% endif %}</w:t>
             </w:r>
           </w:p>
           <w:p/>
@@ -6188,7 +7773,47 @@
               </w:numPr>
             </w:pPr>
             <w:r>
-              <w:t>{% if template_dict.readme_file.comments|length == 0 %}(NO README FILE FOUND){% endif %</w:t>
+              <w:t xml:space="preserve">{% if </w:t>
+            </w:r>
+            <w:proofErr w:type="spellStart"/>
+            <w:r>
+              <w:t>template_</w:t>
+            </w:r>
+            <w:proofErr w:type="gramStart"/>
+            <w:r>
+              <w:t>dict.readme</w:t>
+            </w:r>
+            <w:proofErr w:type="gramEnd"/>
+            <w:r>
+              <w:t>_</w:t>
+            </w:r>
+            <w:proofErr w:type="gramStart"/>
+            <w:r>
+              <w:t>file.comments</w:t>
+            </w:r>
+            <w:proofErr w:type="gramEnd"/>
+            <w:r>
+              <w:t>|length</w:t>
+            </w:r>
+            <w:proofErr w:type="spellEnd"/>
+            <w:r>
+              <w:t xml:space="preserve"> == 0 </w:t>
+            </w:r>
+            <w:proofErr w:type="gramStart"/>
+            <w:r>
+              <w:t>%}(</w:t>
+            </w:r>
+            <w:proofErr w:type="gramEnd"/>
+            <w:r>
+              <w:t xml:space="preserve">NO README FILE </w:t>
+            </w:r>
+            <w:proofErr w:type="gramStart"/>
+            <w:r>
+              <w:t>FOUND){</w:t>
+            </w:r>
+            <w:proofErr w:type="gramEnd"/>
+            <w:r>
+              <w:t>% endif %</w:t>
             </w:r>
             <w:r>
               <w:t>}</w:t>
@@ -6310,7 +7935,15 @@
                 <w:b/>
                 <w:bCs/>
               </w:rPr>
-              <w:t>Does the README file contain correct and complete information about ‘Files and organization’ </w:t>
+              <w:t xml:space="preserve">Does the README file contain correct and </w:t>
+            </w:r>
+            <w:r>
+              <w:rPr>
+                <w:b/>
+                <w:bCs/>
+              </w:rPr>
+              <w:lastRenderedPageBreak/>
+              <w:t>complete information about ‘Files and organization’ </w:t>
             </w:r>
           </w:p>
         </w:tc>
@@ -6339,7 +7972,12 @@
               </w:numPr>
             </w:pPr>
             <w:r>
-              <w:t>Check whether the files listed in the README match the files listed in the deposit.</w:t>
+              <w:lastRenderedPageBreak/>
+              <w:t xml:space="preserve">Check whether the files listed in the README match the files </w:t>
+            </w:r>
+            <w:r>
+              <w:lastRenderedPageBreak/>
+              <w:t>listed in the deposit.</w:t>
             </w:r>
           </w:p>
           <w:p>
@@ -6457,7 +8095,21 @@
               <w:rPr>
                 <w:lang w:val="en-US"/>
               </w:rPr>
-              <w:t>{% if template_dict.readme_file.comments|length == 0 %}X{% endif %}</w:t>
+              <w:t xml:space="preserve">{% if </w:t>
+            </w:r>
+            <w:proofErr w:type="spellStart"/>
+            <w:r>
+              <w:rPr>
+                <w:lang w:val="en-US"/>
+              </w:rPr>
+              <w:t>template_dict.readme_file.comments|length</w:t>
+            </w:r>
+            <w:proofErr w:type="spellEnd"/>
+            <w:r>
+              <w:rPr>
+                <w:lang w:val="en-US"/>
+              </w:rPr>
+              <w:t xml:space="preserve"> == 0 %}X{% endif %}</w:t>
             </w:r>
           </w:p>
           <w:p>
@@ -6520,7 +8172,51 @@
               </w:numPr>
             </w:pPr>
             <w:r>
-              <w:t>{% if template_dict.readme_file.comments|length == 0 %}(NO README FILE FOUND){% endif %}</w:t>
+              <w:t xml:space="preserve">{% if </w:t>
+            </w:r>
+            <w:proofErr w:type="spellStart"/>
+            <w:r>
+              <w:t>template_</w:t>
+            </w:r>
+            <w:proofErr w:type="gramStart"/>
+            <w:r>
+              <w:t>dict.readme</w:t>
+            </w:r>
+            <w:proofErr w:type="gramEnd"/>
+            <w:r>
+              <w:t>_</w:t>
+            </w:r>
+            <w:proofErr w:type="gramStart"/>
+            <w:r>
+              <w:t>file.comments</w:t>
+            </w:r>
+            <w:proofErr w:type="gramEnd"/>
+            <w:r>
+              <w:t>|length</w:t>
+            </w:r>
+            <w:proofErr w:type="spellEnd"/>
+            <w:r>
+              <w:t xml:space="preserve"> == 0 </w:t>
+            </w:r>
+            <w:proofErr w:type="gramStart"/>
+            <w:r>
+              <w:t>%}(</w:t>
+            </w:r>
+            <w:proofErr w:type="gramEnd"/>
+            <w:r>
+              <w:t xml:space="preserve">NO </w:t>
+            </w:r>
+            <w:r>
+              <w:lastRenderedPageBreak/>
+              <w:t xml:space="preserve">README FILE </w:t>
+            </w:r>
+            <w:proofErr w:type="gramStart"/>
+            <w:r>
+              <w:t>FOUND){</w:t>
+            </w:r>
+            <w:proofErr w:type="gramEnd"/>
+            <w:r>
+              <w:t>% endif %}</w:t>
             </w:r>
           </w:p>
           <w:p>
@@ -6557,6 +8253,7 @@
           </w:tcPr>
           <w:p>
             <w:r>
+              <w:lastRenderedPageBreak/>
               <w:t>Require</w:t>
             </w:r>
           </w:p>
@@ -6664,11 +8361,7 @@
               </w:numPr>
             </w:pPr>
             <w:r>
-              <w:t xml:space="preserve">Review README, documentation, and data files, to see if </w:t>
-            </w:r>
-            <w:r>
-              <w:lastRenderedPageBreak/>
-              <w:t>there is anything explaining variable headings etc.</w:t>
+              <w:t>Review README, documentation, and data files, to see if there is anything explaining variable headings etc.</w:t>
             </w:r>
           </w:p>
           <w:p>
@@ -6840,11 +8533,47 @@
               </w:numPr>
             </w:pPr>
             <w:r>
-              <w:t xml:space="preserve">{% if template_dict.readme_file.comments|length == 0 %}(NO </w:t>
-            </w:r>
-            <w:r>
-              <w:lastRenderedPageBreak/>
-              <w:t>README FILE FOUND){% endif %}</w:t>
+              <w:t xml:space="preserve">{% if </w:t>
+            </w:r>
+            <w:proofErr w:type="spellStart"/>
+            <w:r>
+              <w:t>template_</w:t>
+            </w:r>
+            <w:proofErr w:type="gramStart"/>
+            <w:r>
+              <w:t>dict.readme</w:t>
+            </w:r>
+            <w:proofErr w:type="gramEnd"/>
+            <w:r>
+              <w:t>_</w:t>
+            </w:r>
+            <w:proofErr w:type="gramStart"/>
+            <w:r>
+              <w:t>file.comments</w:t>
+            </w:r>
+            <w:proofErr w:type="gramEnd"/>
+            <w:r>
+              <w:t>|length</w:t>
+            </w:r>
+            <w:proofErr w:type="spellEnd"/>
+            <w:r>
+              <w:t xml:space="preserve"> == 0 </w:t>
+            </w:r>
+            <w:proofErr w:type="gramStart"/>
+            <w:r>
+              <w:t>%}(</w:t>
+            </w:r>
+            <w:proofErr w:type="gramEnd"/>
+            <w:r>
+              <w:t xml:space="preserve">NO README FILE </w:t>
+            </w:r>
+            <w:proofErr w:type="gramStart"/>
+            <w:r>
+              <w:t>FOUND){</w:t>
+            </w:r>
+            <w:proofErr w:type="gramEnd"/>
+            <w:r>
+              <w:t>% endif %}</w:t>
             </w:r>
           </w:p>
           <w:p/>
@@ -6882,7 +8611,6 @@
           </w:tcPr>
           <w:p>
             <w:r>
-              <w:lastRenderedPageBreak/>
               <w:t>Recommend</w:t>
             </w:r>
           </w:p>
@@ -7342,14 +9070,14 @@
               <w:rPr>
                 <w:lang w:val="en-US"/>
               </w:rPr>
-              <w:t xml:space="preserve">Note that the automated process might flag wrongly (such as acronyms/specialized terms. Delete the items </w:t>
+              <w:t xml:space="preserve">Note that the automated process might flag wrongly (such as </w:t>
             </w:r>
             <w:r>
               <w:rPr>
                 <w:lang w:val="en-US"/>
               </w:rPr>
               <w:lastRenderedPageBreak/>
-              <w:t>from the list accordingly.</w:t>
+              <w:t>acronyms/specialized terms. Delete the items from the list accordingly.</w:t>
             </w:r>
           </w:p>
         </w:tc>
@@ -7507,14 +9235,20 @@
             <w:r>
               <w:t xml:space="preserve">{% if </w:t>
             </w:r>
+            <w:proofErr w:type="spellStart"/>
             <w:r>
               <w:rPr>
                 <w:lang w:val="en-US"/>
               </w:rPr>
               <w:t>template_dict.typo.comments</w:t>
             </w:r>
-            <w:r>
-              <w:t xml:space="preserve"> |length &gt; 0</w:t>
+            <w:proofErr w:type="spellEnd"/>
+            <w:r>
+              <w:t xml:space="preserve"> |length &gt; </w:t>
+            </w:r>
+            <w:proofErr w:type="gramStart"/>
+            <w:r>
+              <w:t>0</w:t>
             </w:r>
             <w:r>
               <w:t xml:space="preserve"> %}</w:t>
@@ -7523,8 +9257,37 @@
               <w:rPr>
                 <w:lang w:val="en-US"/>
               </w:rPr>
-              <w:t>{% for item in template_dict.typo.comments %}</w:t>
-            </w:r>
+              <w:t>{%</w:t>
+            </w:r>
+            <w:proofErr w:type="gramEnd"/>
+            <w:r>
+              <w:rPr>
+                <w:lang w:val="en-US"/>
+              </w:rPr>
+              <w:t xml:space="preserve"> for item in </w:t>
+            </w:r>
+            <w:proofErr w:type="spellStart"/>
+            <w:r>
+              <w:rPr>
+                <w:lang w:val="en-US"/>
+              </w:rPr>
+              <w:t>template_dict.typo.</w:t>
+            </w:r>
+            <w:proofErr w:type="gramStart"/>
+            <w:r>
+              <w:rPr>
+                <w:lang w:val="en-US"/>
+              </w:rPr>
+              <w:t>comments</w:t>
+            </w:r>
+            <w:proofErr w:type="spellEnd"/>
+            <w:r>
+              <w:rPr>
+                <w:lang w:val="en-US"/>
+              </w:rPr>
+              <w:t xml:space="preserve"> %}</w:t>
+            </w:r>
+            <w:proofErr w:type="gramEnd"/>
           </w:p>
           <w:p>
             <w:pPr>
@@ -7534,17 +9297,50 @@
                 <w:numId w:val="37"/>
               </w:numPr>
             </w:pPr>
-            <w:r>
-              <w:rPr>
-                <w:lang w:val="en-US"/>
-              </w:rPr>
-              <w:t>{{ item }}{% endfor %}</w:t>
-            </w:r>
-          </w:p>
-          <w:p>
-            <w:r>
-              <w:t>{% else %}(NONE</w:t>
-            </w:r>
+            <w:proofErr w:type="gramStart"/>
+            <w:r>
+              <w:rPr>
+                <w:lang w:val="en-US"/>
+              </w:rPr>
+              <w:t>{{ item }}{%</w:t>
+            </w:r>
+            <w:proofErr w:type="gramEnd"/>
+            <w:r>
+              <w:rPr>
+                <w:lang w:val="en-US"/>
+              </w:rPr>
+              <w:t xml:space="preserve"> </w:t>
+            </w:r>
+            <w:proofErr w:type="spellStart"/>
+            <w:proofErr w:type="gramStart"/>
+            <w:r>
+              <w:rPr>
+                <w:lang w:val="en-US"/>
+              </w:rPr>
+              <w:t>endfor</w:t>
+            </w:r>
+            <w:proofErr w:type="spellEnd"/>
+            <w:r>
+              <w:rPr>
+                <w:lang w:val="en-US"/>
+              </w:rPr>
+              <w:t xml:space="preserve"> %}</w:t>
+            </w:r>
+            <w:proofErr w:type="gramEnd"/>
+          </w:p>
+          <w:p>
+            <w:r>
+              <w:t xml:space="preserve">{% else </w:t>
+            </w:r>
+            <w:proofErr w:type="gramStart"/>
+            <w:r>
+              <w:t>%}(</w:t>
+            </w:r>
+            <w:proofErr w:type="gramEnd"/>
+            <w:r>
+              <w:t>NONE</w:t>
+            </w:r>
+            <w:proofErr w:type="gramStart"/>
             <w:r>
               <w:rPr>
                 <w:rFonts w:hint="eastAsia"/>
@@ -7552,7 +9348,11 @@
               <w:t>)</w:t>
             </w:r>
             <w:r>
-              <w:t>{% endif %}</w:t>
+              <w:t>{</w:t>
+            </w:r>
+            <w:proofErr w:type="gramEnd"/>
+            <w:r>
+              <w:t>% endif %}</w:t>
             </w:r>
           </w:p>
           <w:p/>
@@ -8103,7 +9903,31 @@
           </w:tcPr>
           <w:p>
             <w:r>
-              <w:t>{% if not template_dict.none_author_affiliation %}X{% endif %}</w:t>
+              <w:t xml:space="preserve">{% if not </w:t>
+            </w:r>
+            <w:proofErr w:type="spellStart"/>
+            <w:r>
+              <w:t>template_</w:t>
+            </w:r>
+            <w:proofErr w:type="gramStart"/>
+            <w:r>
+              <w:t>dict.none</w:t>
+            </w:r>
+            <w:proofErr w:type="gramEnd"/>
+            <w:r>
+              <w:t>_author_affiliation</w:t>
+            </w:r>
+            <w:proofErr w:type="spellEnd"/>
+            <w:r>
+              <w:t xml:space="preserve"> %}</w:t>
+            </w:r>
+            <w:proofErr w:type="gramStart"/>
+            <w:r>
+              <w:t>X{</w:t>
+            </w:r>
+            <w:proofErr w:type="gramEnd"/>
+            <w:r>
+              <w:t>% endif %}</w:t>
             </w:r>
           </w:p>
         </w:tc>
@@ -8126,7 +9950,31 @@
           </w:tcPr>
           <w:p>
             <w:r>
-              <w:t>{% if template_dict.none_author_affiliation %}X{% endif %}</w:t>
+              <w:t xml:space="preserve">{% if </w:t>
+            </w:r>
+            <w:proofErr w:type="spellStart"/>
+            <w:r>
+              <w:t>template_</w:t>
+            </w:r>
+            <w:proofErr w:type="gramStart"/>
+            <w:r>
+              <w:t>dict.none</w:t>
+            </w:r>
+            <w:proofErr w:type="gramEnd"/>
+            <w:r>
+              <w:t>_author_affiliation</w:t>
+            </w:r>
+            <w:proofErr w:type="spellEnd"/>
+            <w:r>
+              <w:t xml:space="preserve"> %}</w:t>
+            </w:r>
+            <w:proofErr w:type="gramStart"/>
+            <w:r>
+              <w:t>X{</w:t>
+            </w:r>
+            <w:proofErr w:type="gramEnd"/>
+            <w:r>
+              <w:t>% endif %}</w:t>
             </w:r>
           </w:p>
         </w:tc>
@@ -8305,7 +10153,6 @@
                 <w:b/>
                 <w:bCs/>
               </w:rPr>
-              <w:lastRenderedPageBreak/>
               <w:t>4.3b</w:t>
             </w:r>
           </w:p>
@@ -8367,7 +10214,15 @@
                 <w:b/>
                 <w:bCs/>
               </w:rPr>
-              <w:t>University of Toronto?</w:t>
+              <w:t>Universit</w:t>
+            </w:r>
+            <w:r>
+              <w:rPr>
+                <w:b/>
+                <w:bCs/>
+              </w:rPr>
+              <w:lastRenderedPageBreak/>
+              <w:t>y of Toronto?</w:t>
             </w:r>
           </w:p>
         </w:tc>
@@ -8390,6 +10245,7 @@
           </w:tcPr>
           <w:p>
             <w:r>
+              <w:lastRenderedPageBreak/>
               <w:t>Python scripted.</w:t>
             </w:r>
           </w:p>
@@ -8404,11 +10260,24 @@
               </w:rPr>
             </w:pPr>
             <w:r>
-              <w:t>This will check either ‘uoft’, ‘u of t’ or ‘</w:t>
-            </w:r>
-            <w:r>
-              <w:t>university of toronto</w:t>
-            </w:r>
+              <w:t>This will check either ‘</w:t>
+            </w:r>
+            <w:proofErr w:type="spellStart"/>
+            <w:r>
+              <w:t>uoft</w:t>
+            </w:r>
+            <w:proofErr w:type="spellEnd"/>
+            <w:r>
+              <w:t>’, ‘u of t’ or ‘</w:t>
+            </w:r>
+            <w:r>
+              <w:t xml:space="preserve">university of </w:t>
+            </w:r>
+            <w:proofErr w:type="spellStart"/>
+            <w:r>
+              <w:t>toronto</w:t>
+            </w:r>
+            <w:proofErr w:type="spellEnd"/>
             <w:r>
               <w:t xml:space="preserve">’ is filled for the </w:t>
             </w:r>
@@ -8456,16 +10325,45 @@
               </w:rPr>
             </w:pPr>
             <w:r>
-              <w:t>{% if not template_dict.</w:t>
-            </w:r>
-            <w:r>
-              <w:rPr>
-                <w:lang w:val="en-US"/>
-              </w:rPr>
-              <w:t>none_author_affiliation_UT</w:t>
-            </w:r>
-            <w:r>
-              <w:t>%}X{% endif %}</w:t>
+              <w:t xml:space="preserve">{% if not </w:t>
+            </w:r>
+            <w:proofErr w:type="spellStart"/>
+            <w:r>
+              <w:t>template_</w:t>
+            </w:r>
+            <w:proofErr w:type="gramStart"/>
+            <w:r>
+              <w:t>dict</w:t>
+            </w:r>
+            <w:proofErr w:type="spellEnd"/>
+            <w:r>
+              <w:t>.</w:t>
+            </w:r>
+            <w:proofErr w:type="spellStart"/>
+            <w:r>
+              <w:rPr>
+                <w:lang w:val="en-US"/>
+              </w:rPr>
+              <w:t>none</w:t>
+            </w:r>
+            <w:proofErr w:type="gramEnd"/>
+            <w:r>
+              <w:rPr>
+                <w:lang w:val="en-US"/>
+              </w:rPr>
+              <w:t>_author_affiliation_UT</w:t>
+            </w:r>
+            <w:proofErr w:type="spellEnd"/>
+            <w:r>
+              <w:t>%}</w:t>
+            </w:r>
+            <w:proofErr w:type="gramStart"/>
+            <w:r>
+              <w:t>X{</w:t>
+            </w:r>
+            <w:proofErr w:type="gramEnd"/>
+            <w:r>
+              <w:t>% endif %}</w:t>
             </w:r>
           </w:p>
         </w:tc>
@@ -8493,16 +10391,45 @@
               </w:rPr>
             </w:pPr>
             <w:r>
-              <w:t>{% if template_dict.</w:t>
-            </w:r>
-            <w:r>
-              <w:rPr>
-                <w:lang w:val="en-US"/>
-              </w:rPr>
-              <w:t>none_author_affiliation_UT</w:t>
-            </w:r>
-            <w:r>
-              <w:t xml:space="preserve"> %}X{% endif %}</w:t>
+              <w:t xml:space="preserve">{% if </w:t>
+            </w:r>
+            <w:proofErr w:type="spellStart"/>
+            <w:r>
+              <w:t>template_</w:t>
+            </w:r>
+            <w:proofErr w:type="gramStart"/>
+            <w:r>
+              <w:t>dict</w:t>
+            </w:r>
+            <w:proofErr w:type="spellEnd"/>
+            <w:r>
+              <w:t>.</w:t>
+            </w:r>
+            <w:proofErr w:type="spellStart"/>
+            <w:r>
+              <w:rPr>
+                <w:lang w:val="en-US"/>
+              </w:rPr>
+              <w:t>none</w:t>
+            </w:r>
+            <w:proofErr w:type="gramEnd"/>
+            <w:r>
+              <w:rPr>
+                <w:lang w:val="en-US"/>
+              </w:rPr>
+              <w:t>_author_affiliation_UT</w:t>
+            </w:r>
+            <w:proofErr w:type="spellEnd"/>
+            <w:r>
+              <w:t xml:space="preserve"> %}</w:t>
+            </w:r>
+            <w:proofErr w:type="gramStart"/>
+            <w:r>
+              <w:t>X{</w:t>
+            </w:r>
+            <w:proofErr w:type="gramEnd"/>
+            <w:r>
+              <w:t>% endif %}</w:t>
             </w:r>
           </w:p>
         </w:tc>
@@ -8736,7 +10663,6 @@
               </w:numPr>
             </w:pPr>
             <w:r>
-              <w:lastRenderedPageBreak/>
               <w:t xml:space="preserve">You may reference the </w:t>
             </w:r>
             <w:hyperlink r:id="rId5" w:history="1">
@@ -8751,11 +10677,19 @@
               <w:t xml:space="preserve"> or </w:t>
             </w:r>
             <w:hyperlink r:id="rId6" w:history="1">
+              <w:proofErr w:type="spellStart"/>
               <w:r>
                 <w:rPr>
                   <w:rStyle w:val="Hyperlink"/>
                 </w:rPr>
-                <w:t>Borealis metadata template (xlsx)</w:t>
+                <w:t>Borealis_Metadata_Fields_UOFT_MDL</w:t>
+              </w:r>
+              <w:proofErr w:type="spellEnd"/>
+              <w:r>
+                <w:rPr>
+                  <w:rStyle w:val="Hyperlink"/>
+                </w:rPr>
+                <w:t xml:space="preserve"> (xlsx)</w:t>
               </w:r>
             </w:hyperlink>
             <w:r>
@@ -9322,7 +11256,15 @@
                 <w:b/>
                 <w:bCs/>
               </w:rPr>
-              <w:t>Does the dataset description provide sufficient information?</w:t>
+              <w:t>Does the dataset description provide sufficien</w:t>
+            </w:r>
+            <w:r>
+              <w:rPr>
+                <w:b/>
+                <w:bCs/>
+              </w:rPr>
+              <w:lastRenderedPageBreak/>
+              <w:t>t information?</w:t>
             </w:r>
           </w:p>
         </w:tc>
@@ -9345,12 +11287,14 @@
           </w:tcPr>
           <w:p>
             <w:r>
+              <w:lastRenderedPageBreak/>
               <w:t>Still need to discover/formulate the best practices for writing dataset descriptions.</w:t>
             </w:r>
           </w:p>
           <w:p/>
           <w:p>
             <w:r>
+              <w:lastRenderedPageBreak/>
               <w:t>Some elements to look for may include:</w:t>
             </w:r>
           </w:p>
@@ -9384,7 +11328,6 @@
               </w:numPr>
             </w:pPr>
             <w:r>
-              <w:lastRenderedPageBreak/>
               <w:t>Type of data </w:t>
             </w:r>
           </w:p>
@@ -9732,7 +11675,14 @@
               <w:rPr>
                 <w:lang w:val="en-US"/>
               </w:rPr>
-              <w:t>{% if template_dict.</w:t>
+              <w:t xml:space="preserve">{% if </w:t>
+            </w:r>
+            <w:proofErr w:type="spellStart"/>
+            <w:r>
+              <w:rPr>
+                <w:lang w:val="en-US"/>
+              </w:rPr>
+              <w:t>template_dict.</w:t>
             </w:r>
             <w:r>
               <w:rPr>
@@ -9745,7 +11695,14 @@
               <w:rPr>
                 <w:lang w:val="en-US"/>
               </w:rPr>
-              <w:t>|length &gt; 0 %}X{% endif %}</w:t>
+              <w:t>|length</w:t>
+            </w:r>
+            <w:proofErr w:type="spellEnd"/>
+            <w:r>
+              <w:rPr>
+                <w:lang w:val="en-US"/>
+              </w:rPr>
+              <w:t xml:space="preserve"> &gt; 0 %}X{% endif %}</w:t>
             </w:r>
           </w:p>
         </w:tc>
@@ -9795,7 +11752,14 @@
               <w:rPr>
                 <w:lang w:val="en-US"/>
               </w:rPr>
-              <w:t>{% if template_dict.</w:t>
+              <w:t xml:space="preserve">{% if </w:t>
+            </w:r>
+            <w:proofErr w:type="spellStart"/>
+            <w:r>
+              <w:rPr>
+                <w:lang w:val="en-US"/>
+              </w:rPr>
+              <w:t>template_dict.</w:t>
             </w:r>
             <w:r>
               <w:rPr>
@@ -9808,7 +11772,14 @@
               <w:rPr>
                 <w:lang w:val="en-US"/>
               </w:rPr>
-              <w:t>|length == 0 %}X{% endif %}</w:t>
+              <w:t>|length</w:t>
+            </w:r>
+            <w:proofErr w:type="spellEnd"/>
+            <w:r>
+              <w:rPr>
+                <w:lang w:val="en-US"/>
+              </w:rPr>
+              <w:t xml:space="preserve"> == 0 %}X{% endif %}</w:t>
             </w:r>
           </w:p>
         </w:tc>
@@ -9881,26 +11852,72 @@
             <w:r>
               <w:t xml:space="preserve">{% if </w:t>
             </w:r>
-            <w:r>
-              <w:rPr>
-                <w:lang w:val="en-US"/>
-              </w:rPr>
-              <w:t>template_dict.</w:t>
-            </w:r>
+            <w:proofErr w:type="spellStart"/>
+            <w:r>
+              <w:rPr>
+                <w:lang w:val="en-US"/>
+              </w:rPr>
+              <w:t>template_</w:t>
+            </w:r>
+            <w:proofErr w:type="gramStart"/>
+            <w:r>
+              <w:rPr>
+                <w:lang w:val="en-US"/>
+              </w:rPr>
+              <w:t>dict</w:t>
+            </w:r>
+            <w:proofErr w:type="spellEnd"/>
+            <w:r>
+              <w:rPr>
+                <w:lang w:val="en-US"/>
+              </w:rPr>
+              <w:t>.</w:t>
+            </w:r>
+            <w:proofErr w:type="spellStart"/>
             <w:r>
               <w:t>keywords</w:t>
             </w:r>
-            <w:r>
-              <w:t>|length &gt; 0</w:t>
-            </w:r>
-            <w:r>
-              <w:t xml:space="preserve"> %}</w:t>
-            </w:r>
-            <w:r>
-              <w:rPr>
-                <w:lang w:val="en-US"/>
-              </w:rPr>
-              <w:t>{% for item in template_dict.</w:t>
+            <w:proofErr w:type="gramEnd"/>
+            <w:r>
+              <w:t>|length</w:t>
+            </w:r>
+            <w:proofErr w:type="spellEnd"/>
+            <w:r>
+              <w:t xml:space="preserve"> &gt; 0</w:t>
+            </w:r>
+            <w:r>
+              <w:t xml:space="preserve"> </w:t>
+            </w:r>
+            <w:proofErr w:type="gramStart"/>
+            <w:r>
+              <w:t>%}</w:t>
+            </w:r>
+            <w:r>
+              <w:rPr>
+                <w:lang w:val="en-US"/>
+              </w:rPr>
+              <w:t>{</w:t>
+            </w:r>
+            <w:proofErr w:type="gramEnd"/>
+            <w:r>
+              <w:rPr>
+                <w:lang w:val="en-US"/>
+              </w:rPr>
+              <w:t xml:space="preserve">% for item in </w:t>
+            </w:r>
+            <w:proofErr w:type="spellStart"/>
+            <w:r>
+              <w:rPr>
+                <w:lang w:val="en-US"/>
+              </w:rPr>
+              <w:t>template_</w:t>
+            </w:r>
+            <w:proofErr w:type="gramStart"/>
+            <w:r>
+              <w:rPr>
+                <w:lang w:val="en-US"/>
+              </w:rPr>
+              <w:t>dict.</w:t>
             </w:r>
             <w:r>
               <w:rPr>
@@ -9909,6 +11926,8 @@
               </w:rPr>
               <w:t>keywords</w:t>
             </w:r>
+            <w:proofErr w:type="spellEnd"/>
+            <w:proofErr w:type="gramEnd"/>
             <w:r>
               <w:rPr>
                 <w:lang w:val="en-US"/>
@@ -9924,19 +11943,52 @@
                 <w:numId w:val="41"/>
               </w:numPr>
             </w:pPr>
-            <w:r>
-              <w:rPr>
-                <w:lang w:val="en-US"/>
-              </w:rPr>
-              <w:t>{{ item }}{% endfor %}</w:t>
-            </w:r>
-          </w:p>
-          <w:p>
-            <w:r>
-              <w:t>{% else %}(</w:t>
-            </w:r>
-            <w:r>
-              <w:t>NO KEYWORDS FOUND</w:t>
+            <w:proofErr w:type="gramStart"/>
+            <w:r>
+              <w:rPr>
+                <w:lang w:val="en-US"/>
+              </w:rPr>
+              <w:t>{{ item }}{%</w:t>
+            </w:r>
+            <w:proofErr w:type="gramEnd"/>
+            <w:r>
+              <w:rPr>
+                <w:lang w:val="en-US"/>
+              </w:rPr>
+              <w:t xml:space="preserve"> </w:t>
+            </w:r>
+            <w:proofErr w:type="spellStart"/>
+            <w:proofErr w:type="gramStart"/>
+            <w:r>
+              <w:rPr>
+                <w:lang w:val="en-US"/>
+              </w:rPr>
+              <w:t>endfor</w:t>
+            </w:r>
+            <w:proofErr w:type="spellEnd"/>
+            <w:r>
+              <w:rPr>
+                <w:lang w:val="en-US"/>
+              </w:rPr>
+              <w:t xml:space="preserve"> %}</w:t>
+            </w:r>
+            <w:proofErr w:type="gramEnd"/>
+          </w:p>
+          <w:p>
+            <w:r>
+              <w:t xml:space="preserve">{% else </w:t>
+            </w:r>
+            <w:proofErr w:type="gramStart"/>
+            <w:r>
+              <w:t>%}(</w:t>
+            </w:r>
+            <w:proofErr w:type="gramEnd"/>
+            <w:r>
+              <w:t xml:space="preserve">NO KEYWORDS </w:t>
+            </w:r>
+            <w:proofErr w:type="gramStart"/>
+            <w:r>
+              <w:t>FOUND</w:t>
             </w:r>
             <w:r>
               <w:rPr>
@@ -9945,7 +11997,11 @@
               <w:t>)</w:t>
             </w:r>
             <w:r>
-              <w:t>{% endif %}</w:t>
+              <w:t>{</w:t>
+            </w:r>
+            <w:proofErr w:type="gramEnd"/>
+            <w:r>
+              <w:t>% endif %}</w:t>
             </w:r>
           </w:p>
           <w:p>
@@ -10037,7 +12093,6 @@
                 <w:b/>
                 <w:bCs/>
               </w:rPr>
-              <w:lastRenderedPageBreak/>
               <w:t>4.8</w:t>
             </w:r>
           </w:p>
@@ -10130,7 +12185,14 @@
               <w:rPr>
                 <w:lang w:val="en-US"/>
               </w:rPr>
-              <w:t>{% if template_dict.missing_field.</w:t>
+              <w:t xml:space="preserve">{% if </w:t>
+            </w:r>
+            <w:proofErr w:type="spellStart"/>
+            <w:r>
+              <w:rPr>
+                <w:lang w:val="en-US"/>
+              </w:rPr>
+              <w:t>template_dict.missing_field.</w:t>
             </w:r>
             <w:r>
               <w:rPr>
@@ -10149,7 +12211,14 @@
               <w:rPr>
                 <w:lang w:val="en-US"/>
               </w:rPr>
-              <w:t xml:space="preserve">|length </w:t>
+              <w:t>|length</w:t>
+            </w:r>
+            <w:proofErr w:type="spellEnd"/>
+            <w:r>
+              <w:rPr>
+                <w:lang w:val="en-US"/>
+              </w:rPr>
+              <w:t xml:space="preserve"> </w:t>
             </w:r>
             <w:r>
               <w:rPr>
@@ -10207,7 +12276,14 @@
               <w:rPr>
                 <w:lang w:val="en-US"/>
               </w:rPr>
-              <w:t>{% if template_dict.missing_field.</w:t>
+              <w:t xml:space="preserve">{% if </w:t>
+            </w:r>
+            <w:proofErr w:type="spellStart"/>
+            <w:r>
+              <w:rPr>
+                <w:lang w:val="en-US"/>
+              </w:rPr>
+              <w:t>template_dict.missing_field.</w:t>
             </w:r>
             <w:r>
               <w:rPr>
@@ -10226,7 +12302,14 @@
               <w:rPr>
                 <w:lang w:val="en-US"/>
               </w:rPr>
-              <w:t>|length &gt; 0 %}X{% endif %}</w:t>
+              <w:t>|length</w:t>
+            </w:r>
+            <w:proofErr w:type="spellEnd"/>
+            <w:r>
+              <w:rPr>
+                <w:lang w:val="en-US"/>
+              </w:rPr>
+              <w:t xml:space="preserve"> &gt; 0 %}X{% endif %}</w:t>
             </w:r>
           </w:p>
         </w:tc>
@@ -10319,11 +12402,33 @@
             <w:r>
               <w:t xml:space="preserve">{% if </w:t>
             </w:r>
-            <w:r>
-              <w:rPr>
-                <w:lang w:val="en-US"/>
-              </w:rPr>
-              <w:t>template_dict.missing_field.</w:t>
+            <w:proofErr w:type="spellStart"/>
+            <w:r>
+              <w:rPr>
+                <w:lang w:val="en-US"/>
+              </w:rPr>
+              <w:t>template_</w:t>
+            </w:r>
+            <w:proofErr w:type="gramStart"/>
+            <w:r>
+              <w:rPr>
+                <w:lang w:val="en-US"/>
+              </w:rPr>
+              <w:t>dict.missing</w:t>
+            </w:r>
+            <w:proofErr w:type="gramEnd"/>
+            <w:r>
+              <w:rPr>
+                <w:lang w:val="en-US"/>
+              </w:rPr>
+              <w:t>_</w:t>
+            </w:r>
+            <w:proofErr w:type="gramStart"/>
+            <w:r>
+              <w:rPr>
+                <w:lang w:val="en-US"/>
+              </w:rPr>
+              <w:t>field.</w:t>
             </w:r>
             <w:r>
               <w:rPr>
@@ -10335,8 +12440,16 @@
               <w:rPr>
                 <w:lang w:val="en-US"/>
               </w:rPr>
-              <w:t>.comments|length</w:t>
-            </w:r>
+              <w:t>.comments</w:t>
+            </w:r>
+            <w:proofErr w:type="gramEnd"/>
+            <w:r>
+              <w:rPr>
+                <w:lang w:val="en-US"/>
+              </w:rPr>
+              <w:t>|length</w:t>
+            </w:r>
+            <w:proofErr w:type="spellEnd"/>
             <w:r>
               <w:rPr>
                 <w:rFonts w:hint="eastAsia"/>
@@ -10347,13 +12460,24 @@
               <w:t>&gt; 0</w:t>
             </w:r>
             <w:r>
-              <w:t xml:space="preserve"> %}</w:t>
-            </w:r>
-            <w:r>
-              <w:rPr>
-                <w:lang w:val="en-US"/>
-              </w:rPr>
-              <w:t>{% for item in</w:t>
+              <w:t xml:space="preserve"> </w:t>
+            </w:r>
+            <w:proofErr w:type="gramStart"/>
+            <w:r>
+              <w:t>%}</w:t>
+            </w:r>
+            <w:r>
+              <w:rPr>
+                <w:lang w:val="en-US"/>
+              </w:rPr>
+              <w:t>{</w:t>
+            </w:r>
+            <w:proofErr w:type="gramEnd"/>
+            <w:r>
+              <w:rPr>
+                <w:lang w:val="en-US"/>
+              </w:rPr>
+              <w:t>% for item in</w:t>
             </w:r>
             <w:r>
               <w:rPr>
@@ -10362,17 +12486,39 @@
               </w:rPr>
               <w:t xml:space="preserve"> </w:t>
             </w:r>
-            <w:r>
-              <w:rPr>
-                <w:lang w:val="en-US"/>
-              </w:rPr>
-              <w:t>template_dict.</w:t>
-            </w:r>
-            <w:r>
-              <w:rPr>
-                <w:lang w:val="en-US"/>
-              </w:rPr>
-              <w:t>missing_field</w:t>
+            <w:proofErr w:type="spellStart"/>
+            <w:r>
+              <w:rPr>
+                <w:lang w:val="en-US"/>
+              </w:rPr>
+              <w:t>template_</w:t>
+            </w:r>
+            <w:proofErr w:type="gramStart"/>
+            <w:r>
+              <w:rPr>
+                <w:lang w:val="en-US"/>
+              </w:rPr>
+              <w:t>dict.</w:t>
+            </w:r>
+            <w:r>
+              <w:rPr>
+                <w:lang w:val="en-US"/>
+              </w:rPr>
+              <w:t>missing</w:t>
+            </w:r>
+            <w:proofErr w:type="gramEnd"/>
+            <w:r>
+              <w:rPr>
+                <w:lang w:val="en-US"/>
+              </w:rPr>
+              <w:t>_</w:t>
+            </w:r>
+            <w:proofErr w:type="gramStart"/>
+            <w:r>
+              <w:rPr>
+                <w:lang w:val="en-US"/>
+              </w:rPr>
+              <w:t>field</w:t>
             </w:r>
             <w:r>
               <w:rPr>
@@ -10393,6 +12539,8 @@
               </w:rPr>
               <w:t>.comments</w:t>
             </w:r>
+            <w:proofErr w:type="spellEnd"/>
+            <w:proofErr w:type="gramEnd"/>
             <w:r>
               <w:rPr>
                 <w:lang w:val="en-US"/>
@@ -10408,17 +12556,51 @@
                 <w:numId w:val="43"/>
               </w:numPr>
             </w:pPr>
-            <w:r>
-              <w:rPr>
-                <w:lang w:val="en-US"/>
-              </w:rPr>
-              <w:t>{{ item }}{% endfor %}</w:t>
-            </w:r>
-          </w:p>
-          <w:p>
-            <w:r>
-              <w:t>{% else %}(NONE</w:t>
-            </w:r>
+            <w:proofErr w:type="gramStart"/>
+            <w:r>
+              <w:rPr>
+                <w:lang w:val="en-US"/>
+              </w:rPr>
+              <w:t>{{ item }}{%</w:t>
+            </w:r>
+            <w:proofErr w:type="gramEnd"/>
+            <w:r>
+              <w:rPr>
+                <w:lang w:val="en-US"/>
+              </w:rPr>
+              <w:t xml:space="preserve"> </w:t>
+            </w:r>
+            <w:proofErr w:type="spellStart"/>
+            <w:proofErr w:type="gramStart"/>
+            <w:r>
+              <w:rPr>
+                <w:lang w:val="en-US"/>
+              </w:rPr>
+              <w:t>endfor</w:t>
+            </w:r>
+            <w:proofErr w:type="spellEnd"/>
+            <w:r>
+              <w:rPr>
+                <w:lang w:val="en-US"/>
+              </w:rPr>
+              <w:t xml:space="preserve"> %}</w:t>
+            </w:r>
+            <w:proofErr w:type="gramEnd"/>
+          </w:p>
+          <w:p>
+            <w:r>
+              <w:lastRenderedPageBreak/>
+              <w:t xml:space="preserve">{% else </w:t>
+            </w:r>
+            <w:proofErr w:type="gramStart"/>
+            <w:r>
+              <w:t>%}(</w:t>
+            </w:r>
+            <w:proofErr w:type="gramEnd"/>
+            <w:r>
+              <w:t>NONE</w:t>
+            </w:r>
+            <w:proofErr w:type="gramStart"/>
             <w:r>
               <w:rPr>
                 <w:rFonts w:hint="eastAsia"/>
@@ -10426,7 +12608,11 @@
               <w:t>)</w:t>
             </w:r>
             <w:r>
-              <w:t>{% endif %}</w:t>
+              <w:t>{</w:t>
+            </w:r>
+            <w:proofErr w:type="gramEnd"/>
+            <w:r>
+              <w:t>% endif %}</w:t>
             </w:r>
           </w:p>
           <w:p>
@@ -10463,6 +12649,7 @@
           </w:tcPr>
           <w:p>
             <w:r>
+              <w:lastRenderedPageBreak/>
               <w:t>Recommend</w:t>
             </w:r>
           </w:p>
@@ -10644,11 +12831,16 @@
               </w:rPr>
             </w:pPr>
             <w:r>
-              <w:t>If metadata indicates a related publication or project,</w:t>
+              <w:t xml:space="preserve">If metadata indicates a related publication or </w:t>
+            </w:r>
+            <w:proofErr w:type="gramStart"/>
+            <w:r>
+              <w:t>project,</w:t>
             </w:r>
             <w:r>
               <w:t>:</w:t>
             </w:r>
+            <w:proofErr w:type="gramEnd"/>
           </w:p>
           <w:p>
             <w:pPr>
@@ -10664,11 +12856,7 @@
               <w:t>Suggest</w:t>
             </w:r>
             <w:r>
-              <w:t xml:space="preserve"> adding a corr</w:t>
-            </w:r>
-            <w:r>
-              <w:lastRenderedPageBreak/>
-              <w:t>esponding suffix to the title.</w:t>
+              <w:t xml:space="preserve"> adding a corresponding suffix to the title.</w:t>
             </w:r>
             <w:r>
               <w:rPr>
@@ -10996,14 +13184,21 @@
               <w:rPr>
                 <w:rFonts w:hint="eastAsia"/>
               </w:rPr>
-              <w:t xml:space="preserve">title, description or notes  </w:t>
-            </w:r>
-            <w:r>
-              <w:t xml:space="preserve">indicate there is a related dataset that </w:t>
-            </w:r>
-            <w:r>
-              <w:lastRenderedPageBreak/>
-              <w:t>should be included in the metadata</w:t>
+              <w:t xml:space="preserve">title, description or </w:t>
+            </w:r>
+            <w:proofErr w:type="gramStart"/>
+            <w:r>
+              <w:rPr>
+                <w:rFonts w:hint="eastAsia"/>
+              </w:rPr>
+              <w:t xml:space="preserve">notes  </w:t>
+            </w:r>
+            <w:r>
+              <w:t>indicate</w:t>
+            </w:r>
+            <w:proofErr w:type="gramEnd"/>
+            <w:r>
+              <w:t xml:space="preserve"> there is a related dataset that should be included in the metadata</w:t>
             </w:r>
           </w:p>
         </w:tc>
@@ -11530,7 +13725,15 @@
                 <w:b/>
                 <w:bCs/>
               </w:rPr>
-              <w:t>Does the dataset contain any obvious sensitivity issues, such as direct identifiers?</w:t>
+              <w:t xml:space="preserve">Does the dataset contain </w:t>
+            </w:r>
+            <w:r>
+              <w:rPr>
+                <w:b/>
+                <w:bCs/>
+              </w:rPr>
+              <w:lastRenderedPageBreak/>
+              <w:t>any obvious sensitivity issues, such as direct identifiers?</w:t>
             </w:r>
           </w:p>
         </w:tc>
@@ -11560,7 +13763,12 @@
               </w:numPr>
             </w:pPr>
             <w:r>
-              <w:t>Review documentation and file names and see if there are any that should be opened and reviewed (e.g. if a file is named “participant survey” - maybe open that one)</w:t>
+              <w:lastRenderedPageBreak/>
+              <w:t xml:space="preserve">Review documentation and file names </w:t>
+            </w:r>
+            <w:r>
+              <w:lastRenderedPageBreak/>
+              <w:t>and see if there are any that should be opened and reviewed (e.g. if a file is named “participant survey” - maybe open that one)</w:t>
             </w:r>
           </w:p>
           <w:p>
@@ -11599,11 +13807,7 @@
               </w:numPr>
             </w:pPr>
             <w:r>
-              <w:t>Social Secu</w:t>
-            </w:r>
-            <w:r>
-              <w:lastRenderedPageBreak/>
-              <w:t>rity Numbers (SSNs)</w:t>
+              <w:t>Social Security Numbers (SSNs)</w:t>
             </w:r>
           </w:p>
           <w:p>
@@ -11636,11 +13840,7 @@
               </w:numPr>
             </w:pPr>
             <w:r>
-              <w:t>Email addr</w:t>
-            </w:r>
-            <w:r>
-              <w:lastRenderedPageBreak/>
-              <w:t>esses</w:t>
+              <w:t>Email addresses</w:t>
             </w:r>
           </w:p>
           <w:p>
@@ -11661,8 +13861,13 @@
                 <w:numId w:val="28"/>
               </w:numPr>
             </w:pPr>
-            <w:r>
-              <w:t>vCards (Virtual Contact Files)</w:t>
+            <w:proofErr w:type="spellStart"/>
+            <w:r>
+              <w:t>vCards</w:t>
+            </w:r>
+            <w:proofErr w:type="spellEnd"/>
+            <w:r>
+              <w:t xml:space="preserve"> (Virtual Contact Files)</w:t>
             </w:r>
           </w:p>
         </w:tc>
@@ -11869,6 +14074,7 @@
           </w:tcPr>
           <w:p>
             <w:r>
+              <w:lastRenderedPageBreak/>
               <w:t>Require</w:t>
             </w:r>
           </w:p>
@@ -11926,7 +14132,6 @@
                 <w:b/>
                 <w:bCs/>
               </w:rPr>
-              <w:lastRenderedPageBreak/>
               <w:t>5.2</w:t>
             </w:r>
           </w:p>
@@ -11955,7 +14160,15 @@
                 <w:b/>
                 <w:bCs/>
               </w:rPr>
-              <w:t>If something is flagged in the sensitive data review, does the depositor have REB approval to share the dataset?</w:t>
+              <w:t xml:space="preserve">If something is flagged in the sensitive data </w:t>
+            </w:r>
+            <w:r>
+              <w:rPr>
+                <w:b/>
+                <w:bCs/>
+              </w:rPr>
+              <w:lastRenderedPageBreak/>
+              <w:t>review, does the depositor have REB approval to share the dataset?</w:t>
             </w:r>
           </w:p>
         </w:tc>
@@ -11985,7 +14198,12 @@
               </w:numPr>
             </w:pPr>
             <w:r>
-              <w:t>If something is flagged in the sensitive data review (see question above), check the intake form to confirm information about their REB status.</w:t>
+              <w:lastRenderedPageBreak/>
+              <w:t xml:space="preserve">If something is flagged in the sensitive data review (see question above), check the intake form to confirm </w:t>
+            </w:r>
+            <w:r>
+              <w:lastRenderedPageBreak/>
+              <w:t>information about their REB status.</w:t>
             </w:r>
           </w:p>
         </w:tc>
@@ -12199,7 +14417,6 @@
                 <w:b/>
                 <w:bCs/>
               </w:rPr>
-              <w:lastRenderedPageBreak/>
               <w:t>5.3</w:t>
             </w:r>
           </w:p>
@@ -12419,7 +14636,23 @@
               <w:br/>
             </w:r>
             <w:r>
-              <w:t>{% if template_dict.restricted_files.comment</w:t>
+              <w:t xml:space="preserve">{% if </w:t>
+            </w:r>
+            <w:proofErr w:type="spellStart"/>
+            <w:r>
+              <w:t>template_</w:t>
+            </w:r>
+            <w:proofErr w:type="gramStart"/>
+            <w:r>
+              <w:t>dict.restricted</w:t>
+            </w:r>
+            <w:proofErr w:type="gramEnd"/>
+            <w:r>
+              <w:t>_</w:t>
+            </w:r>
+            <w:proofErr w:type="gramStart"/>
+            <w:r>
+              <w:t>files.comment</w:t>
             </w:r>
             <w:r>
               <w:rPr>
@@ -12427,11 +14660,45 @@
               </w:rPr>
               <w:t>s</w:t>
             </w:r>
-            <w:r>
-              <w:t>|length &gt; 0</w:t>
-            </w:r>
-            <w:r>
-              <w:t xml:space="preserve"> %}{% for item in template_dict.restricted_files.comments %} </w:t>
+            <w:proofErr w:type="gramEnd"/>
+            <w:r>
+              <w:t>|length</w:t>
+            </w:r>
+            <w:proofErr w:type="spellEnd"/>
+            <w:r>
+              <w:t xml:space="preserve"> &gt; 0</w:t>
+            </w:r>
+            <w:r>
+              <w:t xml:space="preserve"> </w:t>
+            </w:r>
+            <w:proofErr w:type="gramStart"/>
+            <w:r>
+              <w:t>%}{</w:t>
+            </w:r>
+            <w:proofErr w:type="gramEnd"/>
+            <w:r>
+              <w:t xml:space="preserve">% for item in </w:t>
+            </w:r>
+            <w:proofErr w:type="spellStart"/>
+            <w:r>
+              <w:t>template_</w:t>
+            </w:r>
+            <w:proofErr w:type="gramStart"/>
+            <w:r>
+              <w:t>dict.restricted</w:t>
+            </w:r>
+            <w:proofErr w:type="gramEnd"/>
+            <w:r>
+              <w:t>_</w:t>
+            </w:r>
+            <w:proofErr w:type="gramStart"/>
+            <w:r>
+              <w:t>files.comments</w:t>
+            </w:r>
+            <w:proofErr w:type="spellEnd"/>
+            <w:proofErr w:type="gramEnd"/>
+            <w:r>
+              <w:t xml:space="preserve"> %} </w:t>
             </w:r>
           </w:p>
           <w:p>
@@ -12442,13 +14709,58 @@
                 <w:numId w:val="38"/>
               </w:numPr>
             </w:pPr>
-            <w:r>
-              <w:t>{{ item.file_name }} {% endfor %}</w:t>
-            </w:r>
-          </w:p>
-          <w:p>
-            <w:r>
-              <w:t>{% else %}(NONE){% endif %}</w:t>
+            <w:proofErr w:type="gramStart"/>
+            <w:r>
+              <w:t xml:space="preserve">{{ </w:t>
+            </w:r>
+            <w:proofErr w:type="spellStart"/>
+            <w:r>
+              <w:t>item</w:t>
+            </w:r>
+            <w:proofErr w:type="gramEnd"/>
+            <w:r>
+              <w:t>.file_</w:t>
+            </w:r>
+            <w:proofErr w:type="gramStart"/>
+            <w:r>
+              <w:t>name</w:t>
+            </w:r>
+            <w:proofErr w:type="spellEnd"/>
+            <w:r>
+              <w:t xml:space="preserve"> }</w:t>
+            </w:r>
+            <w:proofErr w:type="gramEnd"/>
+            <w:r>
+              <w:t xml:space="preserve">} {% </w:t>
+            </w:r>
+            <w:proofErr w:type="spellStart"/>
+            <w:r>
+              <w:t>endfor</w:t>
+            </w:r>
+            <w:proofErr w:type="spellEnd"/>
+            <w:r>
+              <w:t xml:space="preserve"> %}</w:t>
+            </w:r>
+          </w:p>
+          <w:p>
+            <w:r>
+              <w:t xml:space="preserve">{% else </w:t>
+            </w:r>
+            <w:proofErr w:type="gramStart"/>
+            <w:r>
+              <w:t>%}(</w:t>
+            </w:r>
+            <w:proofErr w:type="gramEnd"/>
+            <w:r>
+              <w:t>NONE</w:t>
+            </w:r>
+            <w:proofErr w:type="gramStart"/>
+            <w:r>
+              <w:t>){</w:t>
+            </w:r>
+            <w:proofErr w:type="gramEnd"/>
+            <w:r>
+              <w:t>% endif %}</w:t>
             </w:r>
           </w:p>
           <w:p>
@@ -12492,7 +14804,81 @@
               </w:rPr>
             </w:pPr>
             <w:r>
-              <w:t>{% if template_dict.terms_license.licenseName is not none %}{{ template_dict.terms_license.licenseName }}{% else %}(NONE){% endif %}</w:t>
+              <w:t xml:space="preserve">{% if </w:t>
+            </w:r>
+            <w:proofErr w:type="spellStart"/>
+            <w:r>
+              <w:t>template_</w:t>
+            </w:r>
+            <w:proofErr w:type="gramStart"/>
+            <w:r>
+              <w:t>dict.terms</w:t>
+            </w:r>
+            <w:proofErr w:type="gramEnd"/>
+            <w:r>
+              <w:t>_</w:t>
+            </w:r>
+            <w:proofErr w:type="gramStart"/>
+            <w:r>
+              <w:t>license.licenseName</w:t>
+            </w:r>
+            <w:proofErr w:type="spellEnd"/>
+            <w:proofErr w:type="gramEnd"/>
+            <w:r>
+              <w:t xml:space="preserve"> is not none </w:t>
+            </w:r>
+            <w:proofErr w:type="gramStart"/>
+            <w:r>
+              <w:t xml:space="preserve">%}{{ </w:t>
+            </w:r>
+            <w:proofErr w:type="spellStart"/>
+            <w:r>
+              <w:t>template</w:t>
+            </w:r>
+            <w:proofErr w:type="gramEnd"/>
+            <w:r>
+              <w:t>_</w:t>
+            </w:r>
+            <w:proofErr w:type="gramStart"/>
+            <w:r>
+              <w:t>dict.terms</w:t>
+            </w:r>
+            <w:proofErr w:type="gramEnd"/>
+            <w:r>
+              <w:t>_</w:t>
+            </w:r>
+            <w:proofErr w:type="gramStart"/>
+            <w:r>
+              <w:t>license.licenseName</w:t>
+            </w:r>
+            <w:proofErr w:type="spellEnd"/>
+            <w:proofErr w:type="gramEnd"/>
+            <w:r>
+              <w:t xml:space="preserve"> </w:t>
+            </w:r>
+            <w:proofErr w:type="gramStart"/>
+            <w:r>
+              <w:t>}}{</w:t>
+            </w:r>
+            <w:proofErr w:type="gramEnd"/>
+            <w:r>
+              <w:t xml:space="preserve">% else </w:t>
+            </w:r>
+            <w:proofErr w:type="gramStart"/>
+            <w:r>
+              <w:t>%}(</w:t>
+            </w:r>
+            <w:proofErr w:type="gramEnd"/>
+            <w:r>
+              <w:t>NONE</w:t>
+            </w:r>
+            <w:proofErr w:type="gramStart"/>
+            <w:r>
+              <w:t>){</w:t>
+            </w:r>
+            <w:proofErr w:type="gramEnd"/>
+            <w:r>
+              <w:t>% endif %}</w:t>
             </w:r>
           </w:p>
           <w:p>
@@ -12536,7 +14922,7 @@
               <w:tblLook w:val="04A0" w:firstRow="1" w:lastRow="0" w:firstColumn="1" w:lastColumn="0" w:noHBand="0" w:noVBand="1"/>
             </w:tblPr>
             <w:tblGrid>
-              <w:gridCol w:w="3629"/>
+              <w:gridCol w:w="3478"/>
             </w:tblGrid>
             <w:tr>
               <w:tc>
@@ -12550,19 +14936,87 @@
                     </w:rPr>
                   </w:pPr>
                   <w:r>
-                    <w:t>{% if template_dict.terms_license.</w:t>
+                    <w:t xml:space="preserve">{% if </w:t>
+                  </w:r>
+                  <w:proofErr w:type="spellStart"/>
+                  <w:r>
+                    <w:t>template_</w:t>
+                  </w:r>
+                  <w:proofErr w:type="gramStart"/>
+                  <w:r>
+                    <w:t>dict.terms</w:t>
+                  </w:r>
+                  <w:proofErr w:type="gramEnd"/>
+                  <w:r>
+                    <w:t>_</w:t>
+                  </w:r>
+                  <w:proofErr w:type="gramStart"/>
+                  <w:r>
+                    <w:t>license.</w:t>
                   </w:r>
                   <w:r>
                     <w:t>termsOfUse</w:t>
                   </w:r>
+                  <w:proofErr w:type="spellEnd"/>
+                  <w:proofErr w:type="gramEnd"/>
                   <w:r>
-                    <w:t xml:space="preserve"> is not none %}{{ template_dict.terms_license.</w:t>
+                    <w:t xml:space="preserve"> is not none </w:t>
+                  </w:r>
+                  <w:proofErr w:type="gramStart"/>
+                  <w:r>
+                    <w:t xml:space="preserve">%}{{ </w:t>
+                  </w:r>
+                  <w:proofErr w:type="spellStart"/>
+                  <w:r>
+                    <w:t>template</w:t>
+                  </w:r>
+                  <w:proofErr w:type="gramEnd"/>
+                  <w:r>
+                    <w:t>_</w:t>
+                  </w:r>
+                  <w:proofErr w:type="gramStart"/>
+                  <w:r>
+                    <w:t>dict.terms</w:t>
+                  </w:r>
+                  <w:proofErr w:type="gramEnd"/>
+                  <w:r>
+                    <w:t>_</w:t>
+                  </w:r>
+                  <w:proofErr w:type="gramStart"/>
+                  <w:r>
+                    <w:t>license.</w:t>
                   </w:r>
                   <w:r>
                     <w:t>termsOfUse</w:t>
                   </w:r>
+                  <w:proofErr w:type="spellEnd"/>
+                  <w:proofErr w:type="gramEnd"/>
                   <w:r>
-                    <w:t xml:space="preserve"> }}{% else %}(NONE){% endif %}</w:t>
+                    <w:t xml:space="preserve"> </w:t>
+                  </w:r>
+                  <w:proofErr w:type="gramStart"/>
+                  <w:r>
+                    <w:t>}}{</w:t>
+                  </w:r>
+                  <w:proofErr w:type="gramEnd"/>
+                  <w:r>
+                    <w:t xml:space="preserve">% else </w:t>
+                  </w:r>
+                  <w:proofErr w:type="gramStart"/>
+                  <w:r>
+                    <w:t>%}(</w:t>
+                  </w:r>
+                  <w:proofErr w:type="gramEnd"/>
+                  <w:r>
+                    <w:t>NONE</w:t>
+                  </w:r>
+                  <w:proofErr w:type="gramStart"/>
+                  <w:r>
+                    <w:t>){</w:t>
+                  </w:r>
+                  <w:proofErr w:type="gramEnd"/>
+                  <w:r>
+                    <w:t>% endif %}</w:t>
                   </w:r>
                 </w:p>
               </w:tc>
@@ -12687,7 +15141,15 @@
                 <w:b/>
                 <w:bCs/>
               </w:rPr>
-              <w:t>Is the Terms of Access field complete if there are restricted files in the dataset?</w:t>
+              <w:t xml:space="preserve">Is the Terms of Access field </w:t>
+            </w:r>
+            <w:r>
+              <w:rPr>
+                <w:b/>
+                <w:bCs/>
+              </w:rPr>
+              <w:lastRenderedPageBreak/>
+              <w:t>complete if there are restricted files in the dataset?</w:t>
             </w:r>
           </w:p>
         </w:tc>
@@ -12710,6 +15172,7 @@
           </w:tcPr>
           <w:p>
             <w:r>
+              <w:lastRenderedPageBreak/>
               <w:t>Python scripted.</w:t>
             </w:r>
           </w:p>
@@ -12721,7 +15184,11 @@
               </w:numPr>
             </w:pPr>
             <w:r>
-              <w:t>If there are restricted files and no Terms of Access, recommend including terms of access.</w:t>
+              <w:t xml:space="preserve">If there are restricted files and no Terms of </w:t>
+            </w:r>
+            <w:r>
+              <w:lastRenderedPageBreak/>
+              <w:t>Access, recommend including terms of access.</w:t>
             </w:r>
           </w:p>
           <w:p>
@@ -12732,11 +15199,7 @@
               </w:numPr>
             </w:pPr>
             <w:r>
-              <w:t xml:space="preserve">If there are Terms of </w:t>
-            </w:r>
-            <w:r>
-              <w:lastRenderedPageBreak/>
-              <w:t>Access, review to ensure they are clear.</w:t>
+              <w:t>If there are Terms of Access, review to ensure they are clear.</w:t>
             </w:r>
           </w:p>
         </w:tc>
@@ -12765,11 +15228,19 @@
               <w:lastRenderedPageBreak/>
               <w:t xml:space="preserve">{% if </w:t>
             </w:r>
-            <w:r>
-              <w:rPr>
-                <w:lang w:val="en-US"/>
-              </w:rPr>
-              <w:t>template_dict.</w:t>
+            <w:proofErr w:type="spellStart"/>
+            <w:r>
+              <w:rPr>
+                <w:lang w:val="en-US"/>
+              </w:rPr>
+              <w:t>template_dict</w:t>
+            </w:r>
+            <w:proofErr w:type="spellEnd"/>
+            <w:r>
+              <w:rPr>
+                <w:lang w:val="en-US"/>
+              </w:rPr>
+              <w:t>.</w:t>
             </w:r>
             <w:r>
               <w:rPr>
@@ -12782,21 +15253,38 @@
               </w:rPr>
               <w:t xml:space="preserve"> </w:t>
             </w:r>
+            <w:proofErr w:type="spellStart"/>
             <w:r>
               <w:t>restricted_files</w:t>
             </w:r>
-            <w:r>
-              <w:rPr>
-                <w:lang w:val="en-US"/>
-              </w:rPr>
-              <w:t>.comments</w:t>
+            <w:proofErr w:type="spellEnd"/>
+            <w:r>
+              <w:rPr>
+                <w:lang w:val="en-US"/>
+              </w:rPr>
+              <w:t>.</w:t>
+            </w:r>
+            <w:proofErr w:type="spellStart"/>
+            <w:r>
+              <w:rPr>
+                <w:lang w:val="en-US"/>
+              </w:rPr>
+              <w:t>comments</w:t>
             </w:r>
             <w:r>
               <w:rPr>
                 <w:rFonts w:hint="eastAsia"/>
                 <w:lang w:val="en-US"/>
               </w:rPr>
-              <w:t>|length &gt;</w:t>
+              <w:t>|length</w:t>
+            </w:r>
+            <w:proofErr w:type="spellEnd"/>
+            <w:r>
+              <w:rPr>
+                <w:rFonts w:hint="eastAsia"/>
+                <w:lang w:val="en-US"/>
+              </w:rPr>
+              <w:t xml:space="preserve"> &gt;</w:t>
             </w:r>
             <w:r>
               <w:rPr>
@@ -12811,12 +15299,18 @@
               </w:rPr>
               <w:t xml:space="preserve">and </w:t>
             </w:r>
+            <w:proofErr w:type="spellStart"/>
             <w:r>
               <w:t>template_dict.terms_license.</w:t>
             </w:r>
             <w:r>
-              <w:t>termsOfAccess</w:t>
-            </w:r>
+              <w:t>terms</w:t>
+            </w:r>
+            <w:r>
+              <w:lastRenderedPageBreak/>
+              <w:t>OfAccess</w:t>
+            </w:r>
+            <w:proofErr w:type="spellEnd"/>
             <w:r>
               <w:t xml:space="preserve"> is not none</w:t>
             </w:r>
@@ -12853,13 +15347,22 @@
                 <w:rFonts w:hint="eastAsia"/>
                 <w:lang w:val="en-US"/>
               </w:rPr>
+              <w:lastRenderedPageBreak/>
               <w:t xml:space="preserve">{% if </w:t>
             </w:r>
-            <w:r>
-              <w:rPr>
-                <w:lang w:val="en-US"/>
-              </w:rPr>
-              <w:t>template_dict.</w:t>
+            <w:proofErr w:type="spellStart"/>
+            <w:r>
+              <w:rPr>
+                <w:lang w:val="en-US"/>
+              </w:rPr>
+              <w:t>template_dict</w:t>
+            </w:r>
+            <w:proofErr w:type="spellEnd"/>
+            <w:r>
+              <w:rPr>
+                <w:lang w:val="en-US"/>
+              </w:rPr>
+              <w:t>.</w:t>
             </w:r>
             <w:r>
               <w:rPr>
@@ -12872,21 +15375,38 @@
               </w:rPr>
               <w:t xml:space="preserve"> </w:t>
             </w:r>
+            <w:proofErr w:type="spellStart"/>
             <w:r>
               <w:t>restricted_files</w:t>
             </w:r>
-            <w:r>
-              <w:rPr>
-                <w:lang w:val="en-US"/>
-              </w:rPr>
-              <w:t>.comments</w:t>
+            <w:proofErr w:type="spellEnd"/>
+            <w:r>
+              <w:rPr>
+                <w:lang w:val="en-US"/>
+              </w:rPr>
+              <w:t>.</w:t>
+            </w:r>
+            <w:proofErr w:type="spellStart"/>
+            <w:r>
+              <w:rPr>
+                <w:lang w:val="en-US"/>
+              </w:rPr>
+              <w:t>comments</w:t>
             </w:r>
             <w:r>
               <w:rPr>
                 <w:rFonts w:hint="eastAsia"/>
                 <w:lang w:val="en-US"/>
               </w:rPr>
-              <w:t>|length &gt;</w:t>
+              <w:t>|length</w:t>
+            </w:r>
+            <w:proofErr w:type="spellEnd"/>
+            <w:r>
+              <w:rPr>
+                <w:rFonts w:hint="eastAsia"/>
+                <w:lang w:val="en-US"/>
+              </w:rPr>
+              <w:t xml:space="preserve"> &gt;</w:t>
             </w:r>
             <w:r>
               <w:rPr>
@@ -12901,12 +15421,18 @@
               </w:rPr>
               <w:t xml:space="preserve">and </w:t>
             </w:r>
-            <w:r>
-              <w:t>template_dict.terms_license.</w:t>
+            <w:proofErr w:type="spellStart"/>
+            <w:r>
+              <w:t>template_dict.terms_lice</w:t>
+            </w:r>
+            <w:r>
+              <w:lastRenderedPageBreak/>
+              <w:t>nse.</w:t>
             </w:r>
             <w:r>
               <w:t>termsOfAccess</w:t>
             </w:r>
+            <w:proofErr w:type="spellEnd"/>
             <w:r>
               <w:t xml:space="preserve"> is none</w:t>
             </w:r>
@@ -12981,11 +15507,19 @@
               </w:rPr>
               <w:t xml:space="preserve">{% if </w:t>
             </w:r>
-            <w:r>
-              <w:rPr>
-                <w:lang w:val="en-US"/>
-              </w:rPr>
-              <w:t>template_dict.</w:t>
+            <w:proofErr w:type="spellStart"/>
+            <w:r>
+              <w:rPr>
+                <w:lang w:val="en-US"/>
+              </w:rPr>
+              <w:t>template_dict</w:t>
+            </w:r>
+            <w:proofErr w:type="spellEnd"/>
+            <w:r>
+              <w:rPr>
+                <w:lang w:val="en-US"/>
+              </w:rPr>
+              <w:t>.</w:t>
             </w:r>
             <w:r>
               <w:rPr>
@@ -12998,21 +15532,38 @@
               </w:rPr>
               <w:t xml:space="preserve"> </w:t>
             </w:r>
+            <w:proofErr w:type="spellStart"/>
             <w:r>
               <w:t>restricted_files</w:t>
             </w:r>
-            <w:r>
-              <w:rPr>
-                <w:lang w:val="en-US"/>
-              </w:rPr>
-              <w:t>.comments</w:t>
+            <w:proofErr w:type="spellEnd"/>
+            <w:r>
+              <w:rPr>
+                <w:lang w:val="en-US"/>
+              </w:rPr>
+              <w:t>.</w:t>
+            </w:r>
+            <w:proofErr w:type="spellStart"/>
+            <w:r>
+              <w:rPr>
+                <w:lang w:val="en-US"/>
+              </w:rPr>
+              <w:t>comments</w:t>
             </w:r>
             <w:r>
               <w:rPr>
                 <w:rFonts w:hint="eastAsia"/>
                 <w:lang w:val="en-US"/>
               </w:rPr>
-              <w:t>|length ==</w:t>
+              <w:t>|length</w:t>
+            </w:r>
+            <w:proofErr w:type="spellEnd"/>
+            <w:r>
+              <w:rPr>
+                <w:rFonts w:hint="eastAsia"/>
+                <w:lang w:val="en-US"/>
+              </w:rPr>
+              <w:t xml:space="preserve"> ==</w:t>
             </w:r>
             <w:r>
               <w:rPr>
@@ -13089,7 +15640,7 @@
               <w:tblLook w:val="04A0" w:firstRow="1" w:lastRow="0" w:firstColumn="1" w:lastColumn="0" w:noHBand="0" w:noVBand="1"/>
             </w:tblPr>
             <w:tblGrid>
-              <w:gridCol w:w="3629"/>
+              <w:gridCol w:w="3478"/>
             </w:tblGrid>
             <w:tr>
               <w:tc>
@@ -13103,19 +15654,91 @@
                     </w:rPr>
                   </w:pPr>
                   <w:r>
-                    <w:t>{% if template_dict.terms_license.</w:t>
+                    <w:t xml:space="preserve">{% if </w:t>
+                  </w:r>
+                  <w:proofErr w:type="spellStart"/>
+                  <w:r>
+                    <w:t>template_</w:t>
+                  </w:r>
+                  <w:proofErr w:type="gramStart"/>
+                  <w:r>
+                    <w:t>dict.terms</w:t>
+                  </w:r>
+                  <w:proofErr w:type="gramEnd"/>
+                  <w:r>
+                    <w:t>_</w:t>
+                  </w:r>
+                  <w:proofErr w:type="gramStart"/>
+                  <w:r>
+                    <w:t>license.</w:t>
+                  </w:r>
+                  <w:r>
+                    <w:t>term</w:t>
+                  </w:r>
+                  <w:r>
+                    <w:lastRenderedPageBreak/>
+                    <w:t>sOfAccess</w:t>
+                  </w:r>
+                  <w:proofErr w:type="spellEnd"/>
+                  <w:proofErr w:type="gramEnd"/>
+                  <w:r>
+                    <w:t xml:space="preserve"> is not none </w:t>
+                  </w:r>
+                  <w:proofErr w:type="gramStart"/>
+                  <w:r>
+                    <w:t xml:space="preserve">%}{{ </w:t>
+                  </w:r>
+                  <w:proofErr w:type="spellStart"/>
+                  <w:r>
+                    <w:t>template</w:t>
+                  </w:r>
+                  <w:proofErr w:type="gramEnd"/>
+                  <w:r>
+                    <w:t>_</w:t>
+                  </w:r>
+                  <w:proofErr w:type="gramStart"/>
+                  <w:r>
+                    <w:t>dict.terms</w:t>
+                  </w:r>
+                  <w:proofErr w:type="gramEnd"/>
+                  <w:r>
+                    <w:t>_</w:t>
+                  </w:r>
+                  <w:proofErr w:type="gramStart"/>
+                  <w:r>
+                    <w:t>license.</w:t>
                   </w:r>
                   <w:r>
                     <w:t>termsOfAccess</w:t>
                   </w:r>
+                  <w:proofErr w:type="spellEnd"/>
+                  <w:proofErr w:type="gramEnd"/>
                   <w:r>
-                    <w:t xml:space="preserve"> is not none %}{{ template_dict.terms_license.</w:t>
+                    <w:t xml:space="preserve"> </w:t>
                   </w:r>
+                  <w:proofErr w:type="gramStart"/>
                   <w:r>
-                    <w:t>termsOfAccess</w:t>
+                    <w:t>}}{</w:t>
                   </w:r>
+                  <w:proofErr w:type="gramEnd"/>
                   <w:r>
-                    <w:t xml:space="preserve"> }}{% else %}(NONE){% endif %}</w:t>
+                    <w:t xml:space="preserve">% else </w:t>
+                  </w:r>
+                  <w:proofErr w:type="gramStart"/>
+                  <w:r>
+                    <w:t>%}(</w:t>
+                  </w:r>
+                  <w:proofErr w:type="gramEnd"/>
+                  <w:r>
+                    <w:t>NONE</w:t>
+                  </w:r>
+                  <w:proofErr w:type="gramStart"/>
+                  <w:r>
+                    <w:t>){</w:t>
+                  </w:r>
+                  <w:proofErr w:type="gramEnd"/>
+                  <w:r>
+                    <w:t>% endif %}</w:t>
                   </w:r>
                 </w:p>
               </w:tc>
@@ -13156,6 +15779,7 @@
           </w:tcPr>
           <w:p>
             <w:r>
+              <w:lastRenderedPageBreak/>
               <w:t>Require</w:t>
             </w:r>
           </w:p>

</xml_diff>

<commit_message>
Moved all the template generation fields to template_dict for centralized management. Updated the template docx files & template_dict.json accordingly
</commit_message>
<xml_diff>
--- a/res/template_high.docx
+++ b/res/template_high.docx
@@ -109,6 +109,23 @@
             </w:r>
             <w:proofErr w:type="spellStart"/>
             <w:r>
+              <w:t>template</w:t>
+            </w:r>
+            <w:proofErr w:type="gramEnd"/>
+            <w:r>
+              <w:t>_</w:t>
+            </w:r>
+            <w:proofErr w:type="gramStart"/>
+            <w:r>
+              <w:t>dict</w:t>
+            </w:r>
+            <w:r>
+              <w:rPr>
+                <w:rFonts w:hint="eastAsia"/>
+              </w:rPr>
+              <w:t>.</w:t>
+            </w:r>
+            <w:r>
               <w:t>project</w:t>
             </w:r>
             <w:proofErr w:type="gramEnd"/>
@@ -182,6 +199,23 @@
             </w:r>
             <w:proofErr w:type="spellStart"/>
             <w:r>
+              <w:t>template</w:t>
+            </w:r>
+            <w:proofErr w:type="gramEnd"/>
+            <w:r>
+              <w:t>_</w:t>
+            </w:r>
+            <w:proofErr w:type="gramStart"/>
+            <w:r>
+              <w:t>dict</w:t>
+            </w:r>
+            <w:r>
+              <w:rPr>
+                <w:rFonts w:hint="eastAsia"/>
+              </w:rPr>
+              <w:t>.</w:t>
+            </w:r>
+            <w:r>
               <w:t>project</w:t>
             </w:r>
             <w:proofErr w:type="gramEnd"/>
@@ -246,6 +280,23 @@
             </w:r>
             <w:proofErr w:type="spellStart"/>
             <w:r>
+              <w:t>template</w:t>
+            </w:r>
+            <w:proofErr w:type="gramEnd"/>
+            <w:r>
+              <w:t>_</w:t>
+            </w:r>
+            <w:proofErr w:type="gramStart"/>
+            <w:r>
+              <w:t>dict</w:t>
+            </w:r>
+            <w:r>
+              <w:rPr>
+                <w:rFonts w:hint="eastAsia"/>
+              </w:rPr>
+              <w:t>.</w:t>
+            </w:r>
+            <w:r>
               <w:t>project</w:t>
             </w:r>
             <w:proofErr w:type="gramEnd"/>
@@ -286,6 +337,86 @@
                 <w:rFonts w:hint="eastAsia"/>
               </w:rPr>
               <w:t>}</w:t>
+            </w:r>
+          </w:p>
+          <w:p>
+            <w:pPr>
+              <w:spacing w:line="480" w:lineRule="auto"/>
+              <w:rPr>
+                <w:lang w:val="en-US"/>
+              </w:rPr>
+            </w:pPr>
+            <w:r>
+              <w:rPr>
+                <w:rFonts w:hint="eastAsia"/>
+              </w:rPr>
+              <w:t xml:space="preserve">Dataset title: </w:t>
+            </w:r>
+            <w:proofErr w:type="gramStart"/>
+            <w:r>
+              <w:rPr>
+                <w:rFonts w:hint="eastAsia"/>
+              </w:rPr>
+              <w:t xml:space="preserve">{{ </w:t>
+            </w:r>
+            <w:proofErr w:type="spellStart"/>
+            <w:r>
+              <w:t>template</w:t>
+            </w:r>
+            <w:proofErr w:type="gramEnd"/>
+            <w:r>
+              <w:t>_</w:t>
+            </w:r>
+            <w:proofErr w:type="gramStart"/>
+            <w:r>
+              <w:t>dict</w:t>
+            </w:r>
+            <w:proofErr w:type="spellEnd"/>
+            <w:r>
+              <w:rPr>
+                <w:rFonts w:hint="eastAsia"/>
+              </w:rPr>
+              <w:t>.</w:t>
+            </w:r>
+            <w:proofErr w:type="spellStart"/>
+            <w:r>
+              <w:rPr>
+                <w:lang w:val="en-US"/>
+              </w:rPr>
+              <w:t>dataset</w:t>
+            </w:r>
+            <w:proofErr w:type="gramEnd"/>
+            <w:r>
+              <w:rPr>
+                <w:lang w:val="en-US"/>
+              </w:rPr>
+              <w:t>_</w:t>
+            </w:r>
+            <w:proofErr w:type="gramStart"/>
+            <w:r>
+              <w:rPr>
+                <w:lang w:val="en-US"/>
+              </w:rPr>
+              <w:t>info</w:t>
+            </w:r>
+            <w:proofErr w:type="spellEnd"/>
+            <w:r>
+              <w:rPr>
+                <w:rFonts w:hint="eastAsia"/>
+              </w:rPr>
+              <w:t>.</w:t>
+            </w:r>
+            <w:proofErr w:type="spellStart"/>
+            <w:r>
+              <w:t>DatasetTitle</w:t>
+            </w:r>
+            <w:proofErr w:type="spellEnd"/>
+            <w:proofErr w:type="gramEnd"/>
+            <w:r>
+              <w:rPr>
+                <w:rFonts w:hint="eastAsia"/>
+              </w:rPr>
+              <w:t xml:space="preserve"> }}</w:t>
             </w:r>
           </w:p>
           <w:p>
@@ -296,7 +427,16 @@
               <w:rPr>
                 <w:rFonts w:hint="eastAsia"/>
               </w:rPr>
-              <w:t xml:space="preserve">Dataset title: </w:t>
+              <w:t xml:space="preserve">Dataset </w:t>
+            </w:r>
+            <w:r>
+              <w:t>persistent</w:t>
+            </w:r>
+            <w:r>
+              <w:rPr>
+                <w:rFonts w:hint="eastAsia"/>
+              </w:rPr>
+              <w:t xml:space="preserve"> identifier: </w:t>
             </w:r>
             <w:proofErr w:type="gramStart"/>
             <w:r>
@@ -307,28 +447,61 @@
             </w:r>
             <w:proofErr w:type="spellStart"/>
             <w:r>
+              <w:t>template</w:t>
+            </w:r>
+            <w:proofErr w:type="gramEnd"/>
+            <w:r>
+              <w:t>_</w:t>
+            </w:r>
+            <w:proofErr w:type="gramStart"/>
+            <w:r>
+              <w:t>dict</w:t>
+            </w:r>
+            <w:proofErr w:type="spellEnd"/>
+            <w:r>
               <w:rPr>
                 <w:rFonts w:hint="eastAsia"/>
               </w:rPr>
+              <w:t>.</w:t>
+            </w:r>
+            <w:proofErr w:type="spellStart"/>
+            <w:r>
+              <w:rPr>
+                <w:lang w:val="en-US"/>
+              </w:rPr>
               <w:t>dataset</w:t>
             </w:r>
             <w:proofErr w:type="gramEnd"/>
             <w:r>
               <w:rPr>
+                <w:lang w:val="en-US"/>
+              </w:rPr>
+              <w:t>_</w:t>
+            </w:r>
+            <w:proofErr w:type="gramStart"/>
+            <w:r>
+              <w:rPr>
+                <w:lang w:val="en-US"/>
+              </w:rPr>
+              <w:t>info</w:t>
+            </w:r>
+            <w:proofErr w:type="spellEnd"/>
+            <w:r>
+              <w:rPr>
                 <w:rFonts w:hint="eastAsia"/>
               </w:rPr>
               <w:t>.</w:t>
             </w:r>
-            <w:proofErr w:type="gramStart"/>
-            <w:r>
-              <w:t>DatasetTitle</w:t>
+            <w:proofErr w:type="spellStart"/>
+            <w:r>
+              <w:t>DatasetPersistentId</w:t>
             </w:r>
             <w:proofErr w:type="spellEnd"/>
             <w:r>
               <w:rPr>
                 <w:rFonts w:hint="eastAsia"/>
               </w:rPr>
-              <w:t xml:space="preserve"> }</w:t>
+              <w:t xml:space="preserve">  }</w:t>
             </w:r>
             <w:proofErr w:type="gramEnd"/>
             <w:r>
@@ -346,48 +519,39 @@
               <w:rPr>
                 <w:rFonts w:hint="eastAsia"/>
               </w:rPr>
-              <w:t xml:space="preserve">Dataset </w:t>
-            </w:r>
-            <w:r>
-              <w:t>persistent</w:t>
-            </w:r>
+              <w:t xml:space="preserve">Dataset ID (versioned): </w:t>
+            </w:r>
+            <w:proofErr w:type="gramStart"/>
             <w:r>
               <w:rPr>
                 <w:rFonts w:hint="eastAsia"/>
               </w:rPr>
-              <w:t xml:space="preserve"> identifier: </w:t>
-            </w:r>
-            <w:proofErr w:type="gramStart"/>
+              <w:t xml:space="preserve">{{ </w:t>
+            </w:r>
+            <w:proofErr w:type="spellStart"/>
+            <w:r>
+              <w:t>template_dict</w:t>
+            </w:r>
+            <w:proofErr w:type="spellEnd"/>
             <w:r>
               <w:rPr>
                 <w:rFonts w:hint="eastAsia"/>
               </w:rPr>
-              <w:t xml:space="preserve">{{ </w:t>
+              <w:t>.</w:t>
             </w:r>
             <w:proofErr w:type="spellStart"/>
             <w:r>
               <w:rPr>
+                <w:lang w:val="en-US"/>
+              </w:rPr>
+              <w:t>dataset_info</w:t>
+            </w:r>
+            <w:proofErr w:type="spellEnd"/>
+            <w:r>
+              <w:rPr>
                 <w:rFonts w:hint="eastAsia"/>
               </w:rPr>
-              <w:t>dataset</w:t>
-            </w:r>
-            <w:proofErr w:type="gramEnd"/>
-            <w:r>
-              <w:rPr>
-                <w:rFonts w:hint="eastAsia"/>
-              </w:rPr>
-              <w:t>.</w:t>
-            </w:r>
-            <w:proofErr w:type="gramStart"/>
-            <w:r>
-              <w:t>DatasetPersistentId</w:t>
-            </w:r>
-            <w:proofErr w:type="spellEnd"/>
-            <w:r>
-              <w:rPr>
-                <w:rFonts w:hint="eastAsia"/>
-              </w:rPr>
-              <w:t xml:space="preserve">  }</w:t>
+              <w:t>.ID  }</w:t>
             </w:r>
             <w:proofErr w:type="gramEnd"/>
             <w:r>
@@ -405,71 +569,73 @@
               <w:rPr>
                 <w:rFonts w:hint="eastAsia"/>
               </w:rPr>
-              <w:t xml:space="preserve">Dataset ID (versioned): </w:t>
+              <w:t xml:space="preserve">Dataset access URL: </w:t>
             </w:r>
             <w:proofErr w:type="gramStart"/>
             <w:r>
               <w:rPr>
                 <w:rFonts w:hint="eastAsia"/>
               </w:rPr>
-              <w:t>{{ dataset.ID  }</w:t>
+              <w:t xml:space="preserve">{{ </w:t>
+            </w:r>
+            <w:proofErr w:type="spellStart"/>
+            <w:r>
+              <w:t>template</w:t>
             </w:r>
             <w:proofErr w:type="gramEnd"/>
             <w:r>
+              <w:t>_</w:t>
+            </w:r>
+            <w:proofErr w:type="gramStart"/>
+            <w:r>
+              <w:t>dict</w:t>
+            </w:r>
+            <w:proofErr w:type="spellEnd"/>
+            <w:r>
               <w:rPr>
                 <w:rFonts w:hint="eastAsia"/>
               </w:rPr>
-              <w:t>}</w:t>
-            </w:r>
-          </w:p>
-          <w:p>
-            <w:pPr>
-              <w:spacing w:line="480" w:lineRule="auto"/>
-            </w:pPr>
+              <w:t>.</w:t>
+            </w:r>
+            <w:proofErr w:type="spellStart"/>
+            <w:r>
+              <w:rPr>
+                <w:lang w:val="en-US"/>
+              </w:rPr>
+              <w:t>dataset</w:t>
+            </w:r>
+            <w:proofErr w:type="gramEnd"/>
+            <w:r>
+              <w:rPr>
+                <w:lang w:val="en-US"/>
+              </w:rPr>
+              <w:t>_</w:t>
+            </w:r>
+            <w:proofErr w:type="gramStart"/>
+            <w:r>
+              <w:rPr>
+                <w:lang w:val="en-US"/>
+              </w:rPr>
+              <w:t>info</w:t>
+            </w:r>
+            <w:proofErr w:type="spellEnd"/>
             <w:r>
               <w:rPr>
                 <w:rFonts w:hint="eastAsia"/>
               </w:rPr>
-              <w:t xml:space="preserve">Dataset access URL: </w:t>
-            </w:r>
-            <w:proofErr w:type="gramStart"/>
+              <w:t>.</w:t>
+            </w:r>
+            <w:proofErr w:type="spellStart"/>
+            <w:r>
+              <w:t>DatasetURL</w:t>
+            </w:r>
+            <w:proofErr w:type="spellEnd"/>
+            <w:proofErr w:type="gramEnd"/>
             <w:r>
               <w:rPr>
                 <w:rFonts w:hint="eastAsia"/>
               </w:rPr>
-              <w:t xml:space="preserve">{{ </w:t>
-            </w:r>
-            <w:proofErr w:type="spellStart"/>
-            <w:r>
-              <w:rPr>
-                <w:rFonts w:hint="eastAsia"/>
-              </w:rPr>
-              <w:t>dataset</w:t>
-            </w:r>
-            <w:proofErr w:type="gramEnd"/>
-            <w:r>
-              <w:rPr>
-                <w:rFonts w:hint="eastAsia"/>
-              </w:rPr>
-              <w:t>.</w:t>
-            </w:r>
-            <w:proofErr w:type="gramStart"/>
-            <w:r>
-              <w:t>DatasetURL</w:t>
-            </w:r>
-            <w:proofErr w:type="spellEnd"/>
-            <w:r>
-              <w:rPr>
-                <w:rFonts w:hint="eastAsia"/>
-              </w:rPr>
-              <w:t xml:space="preserve"> }</w:t>
-            </w:r>
-            <w:proofErr w:type="gramEnd"/>
-            <w:r>
-              <w:rPr>
-                <w:rFonts w:hint="eastAsia"/>
-              </w:rPr>
-              <w:t>}</w:t>
+              <w:t xml:space="preserve"> }}</w:t>
             </w:r>
           </w:p>
           <w:p>
@@ -1324,15 +1490,7 @@
           </w:p>
           <w:p>
             <w:r>
-              <w:t>If the dataset is deposited in a sub-</w:t>
-            </w:r>
-            <w:proofErr w:type="spellStart"/>
-            <w:r>
-              <w:t>dataverse</w:t>
-            </w:r>
-            <w:proofErr w:type="spellEnd"/>
-            <w:r>
-              <w:t xml:space="preserve"> collection, include the name of the collection. </w:t>
+              <w:t>If the dataset is deposited in a sub-dataverse collection, include the name of the collection. </w:t>
             </w:r>
           </w:p>
         </w:tc>
@@ -1742,17 +1900,8 @@
                 <w:bCs/>
               </w:rPr>
               <w:lastRenderedPageBreak/>
-              <w:t xml:space="preserve">ed to a </w:t>
-            </w:r>
-            <w:proofErr w:type="spellStart"/>
-            <w:r>
-              <w:rPr>
-                <w:b/>
-                <w:bCs/>
-              </w:rPr>
-              <w:t>dataverse</w:t>
-            </w:r>
-            <w:proofErr w:type="spellEnd"/>
+              <w:t>ed to a dataverse</w:t>
+            </w:r>
             <w:r>
               <w:rPr>
                 <w:b/>
@@ -1801,225 +1950,222 @@
               </w:numPr>
             </w:pPr>
             <w:r>
-              <w:t xml:space="preserve">Confirm whether the listed </w:t>
+              <w:t>Confirm whether the listed dataverse collection refers to the same researcher/author</w:t>
+            </w:r>
+          </w:p>
+        </w:tc>
+        <w:tc>
+          <w:tcPr>
+            <w:tcW w:w="1606" w:type="dxa"/>
+            <w:tcBorders>
+              <w:top w:val="single" w:sz="8" w:space="0" w:color="000000"/>
+              <w:left w:val="single" w:sz="8" w:space="0" w:color="000000"/>
+              <w:bottom w:val="single" w:sz="8" w:space="0" w:color="000000"/>
+              <w:right w:val="single" w:sz="8" w:space="0" w:color="000000"/>
+            </w:tcBorders>
+            <w:shd w:val="clear" w:color="auto" w:fill="EFEFEF"/>
+            <w:tcMar>
+              <w:top w:w="100" w:type="dxa"/>
+              <w:left w:w="100" w:type="dxa"/>
+              <w:bottom w:w="100" w:type="dxa"/>
+              <w:right w:w="100" w:type="dxa"/>
+            </w:tcMar>
+            <w:hideMark/>
+          </w:tcPr>
+          <w:p/>
+        </w:tc>
+        <w:tc>
+          <w:tcPr>
+            <w:tcW w:w="0" w:type="auto"/>
+            <w:tcBorders>
+              <w:top w:val="single" w:sz="8" w:space="0" w:color="000000"/>
+              <w:left w:val="single" w:sz="8" w:space="0" w:color="000000"/>
+              <w:bottom w:val="single" w:sz="8" w:space="0" w:color="000000"/>
+              <w:right w:val="single" w:sz="8" w:space="0" w:color="000000"/>
+            </w:tcBorders>
+            <w:shd w:val="clear" w:color="auto" w:fill="EFEFEF"/>
+            <w:tcMar>
+              <w:top w:w="100" w:type="dxa"/>
+              <w:left w:w="100" w:type="dxa"/>
+              <w:bottom w:w="100" w:type="dxa"/>
+              <w:right w:w="100" w:type="dxa"/>
+            </w:tcMar>
+          </w:tcPr>
+          <w:p/>
+        </w:tc>
+        <w:tc>
+          <w:tcPr>
+            <w:tcW w:w="0" w:type="auto"/>
+            <w:tcBorders>
+              <w:top w:val="single" w:sz="8" w:space="0" w:color="000000"/>
+              <w:left w:val="single" w:sz="8" w:space="0" w:color="000000"/>
+              <w:bottom w:val="single" w:sz="8" w:space="0" w:color="000000"/>
+              <w:right w:val="single" w:sz="8" w:space="0" w:color="000000"/>
+            </w:tcBorders>
+            <w:shd w:val="clear" w:color="auto" w:fill="EFEFEF"/>
+            <w:tcMar>
+              <w:top w:w="100" w:type="dxa"/>
+              <w:left w:w="100" w:type="dxa"/>
+              <w:bottom w:w="100" w:type="dxa"/>
+              <w:right w:w="100" w:type="dxa"/>
+            </w:tcMar>
+            <w:hideMark/>
+          </w:tcPr>
+          <w:p/>
+        </w:tc>
+        <w:tc>
+          <w:tcPr>
+            <w:tcW w:w="0" w:type="auto"/>
+            <w:tcBorders>
+              <w:top w:val="single" w:sz="8" w:space="0" w:color="000000"/>
+              <w:left w:val="single" w:sz="8" w:space="0" w:color="000000"/>
+              <w:bottom w:val="single" w:sz="8" w:space="0" w:color="000000"/>
+              <w:right w:val="single" w:sz="8" w:space="0" w:color="000000"/>
+            </w:tcBorders>
+            <w:shd w:val="clear" w:color="auto" w:fill="EFEFEF"/>
+            <w:tcMar>
+              <w:top w:w="100" w:type="dxa"/>
+              <w:left w:w="100" w:type="dxa"/>
+              <w:bottom w:w="100" w:type="dxa"/>
+              <w:right w:w="100" w:type="dxa"/>
+            </w:tcMar>
+            <w:hideMark/>
+          </w:tcPr>
+          <w:p/>
+        </w:tc>
+        <w:tc>
+          <w:tcPr>
+            <w:tcW w:w="0" w:type="auto"/>
+            <w:tcBorders>
+              <w:top w:val="single" w:sz="8" w:space="0" w:color="000000"/>
+              <w:left w:val="single" w:sz="8" w:space="0" w:color="000000"/>
+              <w:bottom w:val="single" w:sz="8" w:space="0" w:color="000000"/>
+              <w:right w:val="single" w:sz="8" w:space="0" w:color="000000"/>
+            </w:tcBorders>
+            <w:shd w:val="clear" w:color="auto" w:fill="EFEFEF"/>
+            <w:tcMar>
+              <w:top w:w="100" w:type="dxa"/>
+              <w:left w:w="100" w:type="dxa"/>
+              <w:bottom w:w="100" w:type="dxa"/>
+              <w:right w:w="100" w:type="dxa"/>
+            </w:tcMar>
+          </w:tcPr>
+          <w:p>
+            <w:pPr>
+              <w:rPr>
+                <w:lang w:val="en-US"/>
+              </w:rPr>
+            </w:pPr>
+            <w:r>
+              <w:rPr>
+                <w:lang w:val="en-US"/>
+              </w:rPr>
+              <w:t>X</w:t>
+            </w:r>
+          </w:p>
+        </w:tc>
+        <w:tc>
+          <w:tcPr>
+            <w:tcW w:w="0" w:type="auto"/>
+            <w:tcBorders>
+              <w:top w:val="single" w:sz="8" w:space="0" w:color="000000"/>
+              <w:left w:val="single" w:sz="8" w:space="0" w:color="000000"/>
+              <w:bottom w:val="single" w:sz="8" w:space="0" w:color="000000"/>
+              <w:right w:val="single" w:sz="8" w:space="0" w:color="000000"/>
+            </w:tcBorders>
+            <w:shd w:val="clear" w:color="auto" w:fill="EFEFEF"/>
+            <w:tcMar>
+              <w:top w:w="100" w:type="dxa"/>
+              <w:left w:w="100" w:type="dxa"/>
+              <w:bottom w:w="100" w:type="dxa"/>
+              <w:right w:w="100" w:type="dxa"/>
+            </w:tcMar>
+            <w:hideMark/>
+          </w:tcPr>
+          <w:p>
+            <w:pPr>
+              <w:rPr>
+                <w:lang w:val="en-US"/>
+              </w:rPr>
+            </w:pPr>
+            <w:r>
+              <w:rPr>
+                <w:u w:val="single"/>
+                <w:lang w:val="en-US"/>
+              </w:rPr>
+              <w:t>L</w:t>
+            </w:r>
+            <w:r>
+              <w:rPr>
+                <w:u w:val="single"/>
+                <w:lang w:val="en-US"/>
+              </w:rPr>
+              <w:t xml:space="preserve">ist </w:t>
+            </w:r>
+            <w:r>
+              <w:rPr>
+                <w:u w:val="single"/>
+                <w:lang w:val="en-US"/>
+              </w:rPr>
+              <w:t xml:space="preserve">all </w:t>
+            </w:r>
+            <w:r>
+              <w:rPr>
+                <w:u w:val="single"/>
+                <w:lang w:val="en-US"/>
+              </w:rPr>
+              <w:t>Dataverse collections</w:t>
+            </w:r>
+            <w:r>
+              <w:rPr>
+                <w:u w:val="single"/>
+                <w:lang w:val="en-US"/>
+              </w:rPr>
+              <w:t xml:space="preserve"> that </w:t>
+            </w:r>
+            <w:r>
+              <w:rPr>
+                <w:u w:val="single"/>
+                <w:lang w:val="en-US"/>
+              </w:rPr>
+              <w:t>contain</w:t>
+            </w:r>
+            <w:r>
+              <w:rPr>
+                <w:u w:val="single"/>
+                <w:lang w:val="en-US"/>
+              </w:rPr>
+              <w:t xml:space="preserve"> the depositors' dataset:</w:t>
+            </w:r>
+            <w:r>
+              <w:rPr>
+                <w:lang w:val="en-US"/>
+              </w:rPr>
+              <w:br/>
+            </w:r>
+            <w:r>
+              <w:t xml:space="preserve">{% for item in </w:t>
             </w:r>
             <w:proofErr w:type="spellStart"/>
             <w:r>
-              <w:t>dataverse</w:t>
+              <w:t>template_</w:t>
+            </w:r>
+            <w:proofErr w:type="gramStart"/>
+            <w:r>
+              <w:t>dict.dv</w:t>
+            </w:r>
+            <w:proofErr w:type="gramEnd"/>
+            <w:r>
+              <w:t>_</w:t>
+            </w:r>
+            <w:proofErr w:type="gramStart"/>
+            <w:r>
+              <w:t>record.comments</w:t>
             </w:r>
             <w:proofErr w:type="spellEnd"/>
-            <w:r>
-              <w:t xml:space="preserve"> collection refers to the same researcher/author</w:t>
-            </w:r>
-          </w:p>
-        </w:tc>
-        <w:tc>
-          <w:tcPr>
-            <w:tcW w:w="1606" w:type="dxa"/>
-            <w:tcBorders>
-              <w:top w:val="single" w:sz="8" w:space="0" w:color="000000"/>
-              <w:left w:val="single" w:sz="8" w:space="0" w:color="000000"/>
-              <w:bottom w:val="single" w:sz="8" w:space="0" w:color="000000"/>
-              <w:right w:val="single" w:sz="8" w:space="0" w:color="000000"/>
-            </w:tcBorders>
-            <w:shd w:val="clear" w:color="auto" w:fill="EFEFEF"/>
-            <w:tcMar>
-              <w:top w:w="100" w:type="dxa"/>
-              <w:left w:w="100" w:type="dxa"/>
-              <w:bottom w:w="100" w:type="dxa"/>
-              <w:right w:w="100" w:type="dxa"/>
-            </w:tcMar>
-            <w:hideMark/>
-          </w:tcPr>
-          <w:p/>
-        </w:tc>
-        <w:tc>
-          <w:tcPr>
-            <w:tcW w:w="0" w:type="auto"/>
-            <w:tcBorders>
-              <w:top w:val="single" w:sz="8" w:space="0" w:color="000000"/>
-              <w:left w:val="single" w:sz="8" w:space="0" w:color="000000"/>
-              <w:bottom w:val="single" w:sz="8" w:space="0" w:color="000000"/>
-              <w:right w:val="single" w:sz="8" w:space="0" w:color="000000"/>
-            </w:tcBorders>
-            <w:shd w:val="clear" w:color="auto" w:fill="EFEFEF"/>
-            <w:tcMar>
-              <w:top w:w="100" w:type="dxa"/>
-              <w:left w:w="100" w:type="dxa"/>
-              <w:bottom w:w="100" w:type="dxa"/>
-              <w:right w:w="100" w:type="dxa"/>
-            </w:tcMar>
-          </w:tcPr>
-          <w:p/>
-        </w:tc>
-        <w:tc>
-          <w:tcPr>
-            <w:tcW w:w="0" w:type="auto"/>
-            <w:tcBorders>
-              <w:top w:val="single" w:sz="8" w:space="0" w:color="000000"/>
-              <w:left w:val="single" w:sz="8" w:space="0" w:color="000000"/>
-              <w:bottom w:val="single" w:sz="8" w:space="0" w:color="000000"/>
-              <w:right w:val="single" w:sz="8" w:space="0" w:color="000000"/>
-            </w:tcBorders>
-            <w:shd w:val="clear" w:color="auto" w:fill="EFEFEF"/>
-            <w:tcMar>
-              <w:top w:w="100" w:type="dxa"/>
-              <w:left w:w="100" w:type="dxa"/>
-              <w:bottom w:w="100" w:type="dxa"/>
-              <w:right w:w="100" w:type="dxa"/>
-            </w:tcMar>
-            <w:hideMark/>
-          </w:tcPr>
-          <w:p/>
-        </w:tc>
-        <w:tc>
-          <w:tcPr>
-            <w:tcW w:w="0" w:type="auto"/>
-            <w:tcBorders>
-              <w:top w:val="single" w:sz="8" w:space="0" w:color="000000"/>
-              <w:left w:val="single" w:sz="8" w:space="0" w:color="000000"/>
-              <w:bottom w:val="single" w:sz="8" w:space="0" w:color="000000"/>
-              <w:right w:val="single" w:sz="8" w:space="0" w:color="000000"/>
-            </w:tcBorders>
-            <w:shd w:val="clear" w:color="auto" w:fill="EFEFEF"/>
-            <w:tcMar>
-              <w:top w:w="100" w:type="dxa"/>
-              <w:left w:w="100" w:type="dxa"/>
-              <w:bottom w:w="100" w:type="dxa"/>
-              <w:right w:w="100" w:type="dxa"/>
-            </w:tcMar>
-            <w:hideMark/>
-          </w:tcPr>
-          <w:p/>
-        </w:tc>
-        <w:tc>
-          <w:tcPr>
-            <w:tcW w:w="0" w:type="auto"/>
-            <w:tcBorders>
-              <w:top w:val="single" w:sz="8" w:space="0" w:color="000000"/>
-              <w:left w:val="single" w:sz="8" w:space="0" w:color="000000"/>
-              <w:bottom w:val="single" w:sz="8" w:space="0" w:color="000000"/>
-              <w:right w:val="single" w:sz="8" w:space="0" w:color="000000"/>
-            </w:tcBorders>
-            <w:shd w:val="clear" w:color="auto" w:fill="EFEFEF"/>
-            <w:tcMar>
-              <w:top w:w="100" w:type="dxa"/>
-              <w:left w:w="100" w:type="dxa"/>
-              <w:bottom w:w="100" w:type="dxa"/>
-              <w:right w:w="100" w:type="dxa"/>
-            </w:tcMar>
-          </w:tcPr>
-          <w:p>
-            <w:pPr>
-              <w:rPr>
-                <w:lang w:val="en-US"/>
-              </w:rPr>
-            </w:pPr>
-            <w:r>
-              <w:rPr>
-                <w:lang w:val="en-US"/>
-              </w:rPr>
-              <w:t>X</w:t>
-            </w:r>
-          </w:p>
-        </w:tc>
-        <w:tc>
-          <w:tcPr>
-            <w:tcW w:w="0" w:type="auto"/>
-            <w:tcBorders>
-              <w:top w:val="single" w:sz="8" w:space="0" w:color="000000"/>
-              <w:left w:val="single" w:sz="8" w:space="0" w:color="000000"/>
-              <w:bottom w:val="single" w:sz="8" w:space="0" w:color="000000"/>
-              <w:right w:val="single" w:sz="8" w:space="0" w:color="000000"/>
-            </w:tcBorders>
-            <w:shd w:val="clear" w:color="auto" w:fill="EFEFEF"/>
-            <w:tcMar>
-              <w:top w:w="100" w:type="dxa"/>
-              <w:left w:w="100" w:type="dxa"/>
-              <w:bottom w:w="100" w:type="dxa"/>
-              <w:right w:w="100" w:type="dxa"/>
-            </w:tcMar>
-            <w:hideMark/>
-          </w:tcPr>
-          <w:p>
-            <w:pPr>
-              <w:rPr>
-                <w:lang w:val="en-US"/>
-              </w:rPr>
-            </w:pPr>
-            <w:r>
-              <w:rPr>
-                <w:u w:val="single"/>
-                <w:lang w:val="en-US"/>
-              </w:rPr>
-              <w:t>L</w:t>
-            </w:r>
-            <w:r>
-              <w:rPr>
-                <w:u w:val="single"/>
-                <w:lang w:val="en-US"/>
-              </w:rPr>
-              <w:t xml:space="preserve">ist </w:t>
-            </w:r>
-            <w:r>
-              <w:rPr>
-                <w:u w:val="single"/>
-                <w:lang w:val="en-US"/>
-              </w:rPr>
-              <w:t xml:space="preserve">all </w:t>
-            </w:r>
-            <w:r>
-              <w:rPr>
-                <w:u w:val="single"/>
-                <w:lang w:val="en-US"/>
-              </w:rPr>
-              <w:t>Dataverse collections</w:t>
-            </w:r>
-            <w:r>
-              <w:rPr>
-                <w:u w:val="single"/>
-                <w:lang w:val="en-US"/>
-              </w:rPr>
-              <w:t xml:space="preserve"> that </w:t>
-            </w:r>
-            <w:r>
-              <w:rPr>
-                <w:u w:val="single"/>
-                <w:lang w:val="en-US"/>
-              </w:rPr>
-              <w:t>contain</w:t>
-            </w:r>
-            <w:r>
-              <w:rPr>
-                <w:u w:val="single"/>
-                <w:lang w:val="en-US"/>
-              </w:rPr>
-              <w:t xml:space="preserve"> the depositors' dataset:</w:t>
-            </w:r>
-            <w:r>
-              <w:rPr>
-                <w:lang w:val="en-US"/>
-              </w:rPr>
-              <w:br/>
-            </w:r>
-            <w:r>
-              <w:t xml:space="preserve">{% for item in </w:t>
-            </w:r>
-            <w:proofErr w:type="spellStart"/>
-            <w:r>
-              <w:t>template_dict.dv_record.</w:t>
-            </w:r>
-            <w:proofErr w:type="gramStart"/>
-            <w:r>
-              <w:t>comments</w:t>
-            </w:r>
-            <w:proofErr w:type="spellEnd"/>
-            <w:r>
-              <w:t xml:space="preserve"> %}</w:t>
-            </w:r>
             <w:proofErr w:type="gramEnd"/>
             <w:r>
-              <w:t xml:space="preserve"> </w:t>
+              <w:t xml:space="preserve"> %} </w:t>
             </w:r>
           </w:p>
           <w:p>
@@ -2061,63 +2207,50 @@
           </w:p>
           <w:p>
             <w:r>
-              <w:t xml:space="preserve">{% for </w:t>
+              <w:t xml:space="preserve">{% for dataverse in </w:t>
             </w:r>
             <w:proofErr w:type="spellStart"/>
             <w:r>
-              <w:t>dataverse</w:t>
+              <w:t>dataverses</w:t>
             </w:r>
             <w:proofErr w:type="spellEnd"/>
             <w:r>
-              <w:t xml:space="preserve"> in </w:t>
+              <w:t xml:space="preserve"> %} </w:t>
+            </w:r>
+            <w:proofErr w:type="gramStart"/>
+            <w:r>
+              <w:t xml:space="preserve">{{ </w:t>
             </w:r>
             <w:proofErr w:type="spellStart"/>
             <w:r>
-              <w:t>dataverses</w:t>
+              <w:t>loop</w:t>
+            </w:r>
+            <w:proofErr w:type="gramEnd"/>
+            <w:r>
+              <w:t>.</w:t>
+            </w:r>
+            <w:proofErr w:type="gramStart"/>
+            <w:r>
+              <w:t>index</w:t>
             </w:r>
             <w:proofErr w:type="spellEnd"/>
             <w:r>
-              <w:t xml:space="preserve"> %} </w:t>
+              <w:t xml:space="preserve"> }</w:t>
+            </w:r>
+            <w:proofErr w:type="gramEnd"/>
+            <w:r>
+              <w:t>}.</w:t>
+            </w:r>
+            <w:r>
+              <w:rPr>
+                <w:rFonts w:hint="eastAsia"/>
+              </w:rPr>
+              <w:t xml:space="preserve"> </w:t>
             </w:r>
             <w:proofErr w:type="gramStart"/>
             <w:r>
-              <w:t xml:space="preserve">{{ </w:t>
-            </w:r>
-            <w:proofErr w:type="spellStart"/>
-            <w:r>
-              <w:t>loop</w:t>
-            </w:r>
-            <w:proofErr w:type="gramEnd"/>
-            <w:r>
-              <w:t>.</w:t>
-            </w:r>
-            <w:proofErr w:type="gramStart"/>
-            <w:r>
-              <w:t>index</w:t>
-            </w:r>
-            <w:proofErr w:type="spellEnd"/>
-            <w:r>
-              <w:t xml:space="preserve"> }</w:t>
-            </w:r>
-            <w:proofErr w:type="gramEnd"/>
-            <w:r>
-              <w:t>}.</w:t>
-            </w:r>
-            <w:r>
-              <w:rPr>
-                <w:rFonts w:hint="eastAsia"/>
-              </w:rPr>
-              <w:t xml:space="preserve"> </w:t>
-            </w:r>
-            <w:proofErr w:type="gramStart"/>
-            <w:r>
-              <w:t xml:space="preserve">{{ </w:t>
-            </w:r>
-            <w:proofErr w:type="spellStart"/>
-            <w:r>
-              <w:t>dataverse</w:t>
-            </w:r>
-            <w:proofErr w:type="spellEnd"/>
+              <w:t>{{ dataverse</w:t>
+            </w:r>
             <w:proofErr w:type="gramEnd"/>
             <w:r>
               <w:t xml:space="preserve"> }}</w:t>
@@ -2278,55 +2411,7 @@
                 <w:b/>
                 <w:bCs/>
               </w:rPr>
-              <w:t>If the dataset was deposited in a sub-</w:t>
-            </w:r>
-            <w:proofErr w:type="spellStart"/>
-            <w:r>
-              <w:rPr>
-                <w:b/>
-                <w:bCs/>
-              </w:rPr>
-              <w:t>dataverse</w:t>
-            </w:r>
-            <w:proofErr w:type="spellEnd"/>
-            <w:r>
-              <w:rPr>
-                <w:b/>
-                <w:bCs/>
-              </w:rPr>
-              <w:t xml:space="preserve"> collection, does it require its own </w:t>
-            </w:r>
-            <w:proofErr w:type="spellStart"/>
-            <w:r>
-              <w:rPr>
-                <w:b/>
-                <w:bCs/>
-              </w:rPr>
-              <w:t>dataverse</w:t>
-            </w:r>
-            <w:proofErr w:type="spellEnd"/>
-            <w:r>
-              <w:rPr>
-                <w:b/>
-                <w:bCs/>
-              </w:rPr>
-              <w:t xml:space="preserve"> or is there an associated </w:t>
-            </w:r>
-            <w:proofErr w:type="spellStart"/>
-            <w:r>
-              <w:rPr>
-                <w:b/>
-                <w:bCs/>
-              </w:rPr>
-              <w:t>dataverse</w:t>
-            </w:r>
-            <w:proofErr w:type="spellEnd"/>
-            <w:r>
-              <w:rPr>
-                <w:b/>
-                <w:bCs/>
-              </w:rPr>
-              <w:t>?</w:t>
+              <w:t>If the dataset was deposited in a sub-dataverse collection, does it require its own dataverse or is there an associated dataverse?</w:t>
             </w:r>
           </w:p>
         </w:tc>
@@ -2350,15 +2435,7 @@
           </w:tcPr>
           <w:p>
             <w:r>
-              <w:t xml:space="preserve">If the depositor created a </w:t>
-            </w:r>
-            <w:proofErr w:type="spellStart"/>
-            <w:r>
-              <w:t>dataverse</w:t>
-            </w:r>
-            <w:proofErr w:type="spellEnd"/>
-            <w:r>
-              <w:t xml:space="preserve"> with one dataset:</w:t>
+              <w:t>If the depositor created a dataverse with one dataset:</w:t>
             </w:r>
           </w:p>
           <w:p>
@@ -2369,15 +2446,7 @@
               </w:numPr>
             </w:pPr>
             <w:r>
-              <w:t>Is it the only dataset in the sub-</w:t>
-            </w:r>
-            <w:proofErr w:type="spellStart"/>
-            <w:r>
-              <w:t>dataverse</w:t>
-            </w:r>
-            <w:proofErr w:type="spellEnd"/>
-            <w:r>
-              <w:t xml:space="preserve"> collection?</w:t>
+              <w:t>Is it the only dataset in the sub-dataverse collection?</w:t>
             </w:r>
           </w:p>
           <w:p>
@@ -2388,15 +2457,7 @@
               </w:numPr>
             </w:pPr>
             <w:r>
-              <w:t>Is there another sub-</w:t>
-            </w:r>
-            <w:proofErr w:type="spellStart"/>
-            <w:r>
-              <w:t>dataverse</w:t>
-            </w:r>
-            <w:proofErr w:type="spellEnd"/>
-            <w:r>
-              <w:t xml:space="preserve"> collection it should be in?</w:t>
+              <w:t>Is there another sub-dataverse collection it should be in?</w:t>
             </w:r>
           </w:p>
           <w:p>
@@ -2426,15 +2487,7 @@
             </w:r>
             <w:proofErr w:type="gramEnd"/>
             <w:r>
-              <w:t xml:space="preserve"> a </w:t>
-            </w:r>
-            <w:proofErr w:type="spellStart"/>
-            <w:r>
-              <w:t>dataverse</w:t>
-            </w:r>
-            <w:proofErr w:type="spellEnd"/>
-            <w:r>
-              <w:t xml:space="preserve"> (e.g., will there be future deposits?)</w:t>
+              <w:t xml:space="preserve"> a dataverse (e.g., will there be future deposits?)</w:t>
             </w:r>
           </w:p>
         </w:tc>
@@ -3164,44 +3217,81 @@
             </w:r>
             <w:proofErr w:type="spellStart"/>
             <w:r>
-              <w:t>template_dict.file_open.comments</w:t>
+              <w:t>template_</w:t>
+            </w:r>
+            <w:proofErr w:type="gramStart"/>
+            <w:r>
+              <w:t>dict.file</w:t>
+            </w:r>
+            <w:proofErr w:type="gramEnd"/>
+            <w:r>
+              <w:t>_</w:t>
+            </w:r>
+            <w:proofErr w:type="gramStart"/>
+            <w:r>
+              <w:t>open.comments</w:t>
             </w:r>
             <w:proofErr w:type="spellEnd"/>
+            <w:proofErr w:type="gramEnd"/>
             <w:r>
               <w:t xml:space="preserve"> |length &gt; 0 and </w:t>
             </w:r>
             <w:proofErr w:type="spellStart"/>
             <w:r>
-              <w:t>template_dict.file_open.comments</w:t>
+              <w:t>template_</w:t>
+            </w:r>
+            <w:proofErr w:type="gramStart"/>
+            <w:r>
+              <w:t>dict.file</w:t>
+            </w:r>
+            <w:proofErr w:type="gramEnd"/>
+            <w:r>
+              <w:t>_</w:t>
+            </w:r>
+            <w:proofErr w:type="gramStart"/>
+            <w:r>
+              <w:t>open.comments</w:t>
             </w:r>
             <w:proofErr w:type="spellEnd"/>
+            <w:proofErr w:type="gramEnd"/>
             <w:r>
               <w:t xml:space="preserve"> |length &lt; </w:t>
             </w:r>
+            <w:r>
+              <w:t>50</w:t>
+            </w:r>
+            <w:r>
+              <w:t xml:space="preserve"> </w:t>
+            </w:r>
             <w:proofErr w:type="gramStart"/>
             <w:r>
-              <w:t>50</w:t>
-            </w:r>
-            <w:r>
-              <w:t xml:space="preserve"> %}{%</w:t>
+              <w:t>%}{</w:t>
             </w:r>
             <w:proofErr w:type="gramEnd"/>
             <w:r>
-              <w:t xml:space="preserve"> for item in </w:t>
+              <w:t xml:space="preserve">% for item in </w:t>
             </w:r>
             <w:proofErr w:type="spellStart"/>
             <w:r>
-              <w:t>template_dict.file_open.</w:t>
+              <w:t>template_</w:t>
             </w:r>
             <w:proofErr w:type="gramStart"/>
             <w:r>
-              <w:t>comments</w:t>
+              <w:t>dict.file</w:t>
+            </w:r>
+            <w:proofErr w:type="gramEnd"/>
+            <w:r>
+              <w:t>_</w:t>
+            </w:r>
+            <w:proofErr w:type="gramStart"/>
+            <w:r>
+              <w:t>open.comments</w:t>
             </w:r>
             <w:proofErr w:type="spellEnd"/>
+            <w:proofErr w:type="gramEnd"/>
             <w:r>
               <w:t xml:space="preserve"> %}</w:t>
             </w:r>
-            <w:proofErr w:type="gramEnd"/>
           </w:p>
           <w:p>
             <w:pPr>
@@ -3214,6 +3304,7 @@
                 <w:lang w:val="en-US"/>
               </w:rPr>
             </w:pPr>
+            <w:proofErr w:type="gramStart"/>
             <w:r>
               <w:rPr>
                 <w:lang w:val="en-US"/>
@@ -3226,7 +3317,14 @@
               <w:rPr>
                 <w:lang w:val="en-US"/>
               </w:rPr>
-              <w:t>item.file_</w:t>
+              <w:t>item</w:t>
+            </w:r>
+            <w:proofErr w:type="gramEnd"/>
+            <w:r>
+              <w:rPr>
+                <w:lang w:val="en-US"/>
+              </w:rPr>
+              <w:t>.file_</w:t>
             </w:r>
             <w:proofErr w:type="gramStart"/>
             <w:r>
@@ -3240,14 +3338,14 @@
               <w:rPr>
                 <w:lang w:val="en-US"/>
               </w:rPr>
-              <w:t xml:space="preserve"> }}{%</w:t>
+              <w:t xml:space="preserve"> }}{</w:t>
             </w:r>
             <w:proofErr w:type="gramEnd"/>
             <w:r>
               <w:rPr>
                 <w:lang w:val="en-US"/>
               </w:rPr>
-              <w:t xml:space="preserve"> </w:t>
+              <w:t xml:space="preserve">% </w:t>
             </w:r>
             <w:proofErr w:type="spellStart"/>
             <w:proofErr w:type="gramStart"/>
@@ -3385,16 +3483,19 @@
             <w:r>
               <w:t xml:space="preserve"> |length &lt; </w:t>
             </w:r>
+            <w:r>
+              <w:t>50</w:t>
+            </w:r>
+            <w:r>
+              <w:t xml:space="preserve"> </w:t>
+            </w:r>
             <w:proofErr w:type="gramStart"/>
             <w:r>
-              <w:t>50</w:t>
-            </w:r>
-            <w:r>
-              <w:t xml:space="preserve"> %}{%</w:t>
+              <w:t>%}{</w:t>
             </w:r>
             <w:proofErr w:type="gramEnd"/>
             <w:r>
-              <w:t xml:space="preserve"> for item in </w:t>
+              <w:t xml:space="preserve">% for item in </w:t>
             </w:r>
             <w:proofErr w:type="spellStart"/>
             <w:r>
@@ -3421,6 +3522,7 @@
                 <w:lang w:val="en-US"/>
               </w:rPr>
             </w:pPr>
+            <w:proofErr w:type="gramStart"/>
             <w:r>
               <w:rPr>
                 <w:lang w:val="en-US"/>
@@ -3432,7 +3534,14 @@
               <w:rPr>
                 <w:lang w:val="en-US"/>
               </w:rPr>
-              <w:t>item.file_</w:t>
+              <w:t>item</w:t>
+            </w:r>
+            <w:proofErr w:type="gramEnd"/>
+            <w:r>
+              <w:rPr>
+                <w:lang w:val="en-US"/>
+              </w:rPr>
+              <w:t>.file_</w:t>
             </w:r>
             <w:proofErr w:type="gramStart"/>
             <w:r>
@@ -3446,14 +3555,14 @@
               <w:rPr>
                 <w:lang w:val="en-US"/>
               </w:rPr>
-              <w:t xml:space="preserve"> }}{%</w:t>
+              <w:t xml:space="preserve"> }}{</w:t>
             </w:r>
             <w:proofErr w:type="gramEnd"/>
             <w:r>
               <w:rPr>
                 <w:lang w:val="en-US"/>
               </w:rPr>
-              <w:t xml:space="preserve"> </w:t>
+              <w:t xml:space="preserve">% </w:t>
             </w:r>
             <w:proofErr w:type="spellStart"/>
             <w:proofErr w:type="gramStart"/>
@@ -3926,6 +4035,7 @@
                 <w:numId w:val="36"/>
               </w:numPr>
             </w:pPr>
+            <w:proofErr w:type="gramStart"/>
             <w:r>
               <w:rPr>
                 <w:lang w:val="en-US"/>
@@ -3937,7 +4047,14 @@
               <w:rPr>
                 <w:lang w:val="en-US"/>
               </w:rPr>
-              <w:t>item.file_</w:t>
+              <w:t>item</w:t>
+            </w:r>
+            <w:proofErr w:type="gramEnd"/>
+            <w:r>
+              <w:rPr>
+                <w:lang w:val="en-US"/>
+              </w:rPr>
+              <w:t>.file_</w:t>
             </w:r>
             <w:proofErr w:type="gramStart"/>
             <w:r>
@@ -3951,14 +4068,14 @@
               <w:rPr>
                 <w:lang w:val="en-US"/>
               </w:rPr>
-              <w:t xml:space="preserve"> }}{%</w:t>
+              <w:t xml:space="preserve"> }}{</w:t>
             </w:r>
             <w:proofErr w:type="gramEnd"/>
             <w:r>
               <w:rPr>
                 <w:lang w:val="en-US"/>
               </w:rPr>
-              <w:t xml:space="preserve"> </w:t>
+              <w:t xml:space="preserve">% </w:t>
             </w:r>
             <w:proofErr w:type="spellStart"/>
             <w:proofErr w:type="gramStart"/>
@@ -4443,6 +4560,7 @@
               </w:numPr>
               <w:spacing w:line="256" w:lineRule="auto"/>
             </w:pPr>
+            <w:proofErr w:type="gramStart"/>
             <w:r>
               <w:rPr>
                 <w:lang w:val="en-US"/>
@@ -4454,7 +4572,14 @@
               <w:rPr>
                 <w:lang w:val="en-US"/>
               </w:rPr>
-              <w:t>item.file_</w:t>
+              <w:t>item</w:t>
+            </w:r>
+            <w:proofErr w:type="gramEnd"/>
+            <w:r>
+              <w:rPr>
+                <w:lang w:val="en-US"/>
+              </w:rPr>
+              <w:t>.file_</w:t>
             </w:r>
             <w:proofErr w:type="gramStart"/>
             <w:r>
@@ -4468,14 +4593,14 @@
               <w:rPr>
                 <w:lang w:val="en-US"/>
               </w:rPr>
-              <w:t xml:space="preserve"> }}{%</w:t>
+              <w:t xml:space="preserve"> }}{</w:t>
             </w:r>
             <w:proofErr w:type="gramEnd"/>
             <w:r>
               <w:rPr>
                 <w:lang w:val="en-US"/>
               </w:rPr>
-              <w:t xml:space="preserve"> </w:t>
+              <w:t xml:space="preserve">% </w:t>
             </w:r>
             <w:proofErr w:type="spellStart"/>
             <w:proofErr w:type="gramStart"/>
@@ -4882,6 +5007,7 @@
                 <w:numId w:val="6"/>
               </w:numPr>
             </w:pPr>
+            <w:proofErr w:type="gramStart"/>
             <w:r>
               <w:rPr>
                 <w:lang w:val="en-US"/>
@@ -4893,7 +5019,14 @@
               <w:rPr>
                 <w:lang w:val="en-US"/>
               </w:rPr>
-              <w:t>item.file_</w:t>
+              <w:t>item</w:t>
+            </w:r>
+            <w:proofErr w:type="gramEnd"/>
+            <w:r>
+              <w:rPr>
+                <w:lang w:val="en-US"/>
+              </w:rPr>
+              <w:t>.file_</w:t>
             </w:r>
             <w:proofErr w:type="gramStart"/>
             <w:r>
@@ -4914,7 +5047,7 @@
                 <w:rFonts w:hint="eastAsia"/>
                 <w:lang w:val="en-US"/>
               </w:rPr>
-              <w:t>{%</w:t>
+              <w:t>{</w:t>
             </w:r>
             <w:proofErr w:type="gramEnd"/>
             <w:r>
@@ -4922,7 +5055,7 @@
                 <w:rFonts w:hint="eastAsia"/>
                 <w:lang w:val="en-US"/>
               </w:rPr>
-              <w:t xml:space="preserve"> </w:t>
+              <w:t xml:space="preserve">% </w:t>
             </w:r>
             <w:proofErr w:type="spellStart"/>
             <w:proofErr w:type="gramStart"/>
@@ -5997,53 +6130,83 @@
               <w:rPr>
                 <w:lang w:val="en-US"/>
               </w:rPr>
-              <w:t>template_dict.readme_file.comments</w:t>
+              <w:t>template_</w:t>
+            </w:r>
+            <w:proofErr w:type="gramStart"/>
+            <w:r>
+              <w:rPr>
+                <w:lang w:val="en-US"/>
+              </w:rPr>
+              <w:t>dict.readme</w:t>
+            </w:r>
+            <w:proofErr w:type="gramEnd"/>
+            <w:r>
+              <w:rPr>
+                <w:lang w:val="en-US"/>
+              </w:rPr>
+              <w:t>_</w:t>
+            </w:r>
+            <w:proofErr w:type="gramStart"/>
+            <w:r>
+              <w:rPr>
+                <w:lang w:val="en-US"/>
+              </w:rPr>
+              <w:t>file.comments</w:t>
             </w:r>
             <w:proofErr w:type="spellEnd"/>
-            <w:r>
-              <w:t xml:space="preserve"> |length &gt; </w:t>
+            <w:proofErr w:type="gramEnd"/>
+            <w:r>
+              <w:t xml:space="preserve"> |length &gt; 0</w:t>
+            </w:r>
+            <w:r>
+              <w:t xml:space="preserve"> </w:t>
             </w:r>
             <w:proofErr w:type="gramStart"/>
             <w:r>
-              <w:t>0</w:t>
-            </w:r>
-            <w:r>
-              <w:t xml:space="preserve"> %}</w:t>
-            </w:r>
-            <w:r>
-              <w:rPr>
-                <w:lang w:val="en-US"/>
-              </w:rPr>
-              <w:t>{%</w:t>
+              <w:t>%}</w:t>
+            </w:r>
+            <w:r>
+              <w:rPr>
+                <w:lang w:val="en-US"/>
+              </w:rPr>
+              <w:t>{</w:t>
             </w:r>
             <w:proofErr w:type="gramEnd"/>
             <w:r>
               <w:rPr>
                 <w:lang w:val="en-US"/>
               </w:rPr>
-              <w:t xml:space="preserve"> for item in </w:t>
+              <w:t xml:space="preserve">% for item in </w:t>
             </w:r>
             <w:proofErr w:type="spellStart"/>
             <w:r>
               <w:rPr>
                 <w:lang w:val="en-US"/>
               </w:rPr>
-              <w:t>template_dict.readme_file.</w:t>
+              <w:t>template_</w:t>
             </w:r>
             <w:proofErr w:type="gramStart"/>
             <w:r>
               <w:rPr>
                 <w:lang w:val="en-US"/>
               </w:rPr>
-              <w:t>comments</w:t>
+              <w:t>dict.readme</w:t>
+            </w:r>
+            <w:proofErr w:type="gramEnd"/>
+            <w:r>
+              <w:rPr>
+                <w:lang w:val="en-US"/>
+              </w:rPr>
+              <w:t>_</w:t>
+            </w:r>
+            <w:proofErr w:type="gramStart"/>
+            <w:r>
+              <w:rPr>
+                <w:lang w:val="en-US"/>
+              </w:rPr>
+              <w:t>file.comments</w:t>
             </w:r>
             <w:proofErr w:type="spellEnd"/>
-            <w:r>
-              <w:rPr>
-                <w:lang w:val="en-US"/>
-              </w:rPr>
-              <w:t xml:space="preserve"> %}{{</w:t>
-            </w:r>
             <w:proofErr w:type="gramEnd"/>
             <w:r>
               <w:rPr>
@@ -6051,12 +6214,26 @@
               </w:rPr>
               <w:t xml:space="preserve"> </w:t>
             </w:r>
+            <w:proofErr w:type="gramStart"/>
+            <w:r>
+              <w:rPr>
+                <w:lang w:val="en-US"/>
+              </w:rPr>
+              <w:t xml:space="preserve">%}{{ </w:t>
+            </w:r>
             <w:proofErr w:type="spellStart"/>
             <w:r>
               <w:rPr>
                 <w:lang w:val="en-US"/>
               </w:rPr>
-              <w:t>loop.</w:t>
+              <w:t>loop</w:t>
+            </w:r>
+            <w:proofErr w:type="gramEnd"/>
+            <w:r>
+              <w:rPr>
+                <w:lang w:val="en-US"/>
+              </w:rPr>
+              <w:t>.</w:t>
             </w:r>
             <w:proofErr w:type="gramStart"/>
             <w:r>
@@ -6070,21 +6247,35 @@
               <w:rPr>
                 <w:lang w:val="en-US"/>
               </w:rPr>
-              <w:t xml:space="preserve"> }}.</w:t>
+              <w:t xml:space="preserve"> }</w:t>
             </w:r>
             <w:proofErr w:type="gramEnd"/>
             <w:r>
               <w:rPr>
                 <w:lang w:val="en-US"/>
               </w:rPr>
-              <w:t xml:space="preserve"> {{ </w:t>
+              <w:t xml:space="preserve">}. </w:t>
+            </w:r>
+            <w:proofErr w:type="gramStart"/>
+            <w:r>
+              <w:rPr>
+                <w:lang w:val="en-US"/>
+              </w:rPr>
+              <w:t xml:space="preserve">{{ </w:t>
             </w:r>
             <w:proofErr w:type="spellStart"/>
             <w:r>
               <w:rPr>
                 <w:lang w:val="en-US"/>
               </w:rPr>
-              <w:t>item.file_</w:t>
+              <w:t>item</w:t>
+            </w:r>
+            <w:proofErr w:type="gramEnd"/>
+            <w:r>
+              <w:rPr>
+                <w:lang w:val="en-US"/>
+              </w:rPr>
+              <w:t>.file_</w:t>
             </w:r>
             <w:proofErr w:type="gramStart"/>
             <w:r>
@@ -6098,14 +6289,14 @@
               <w:rPr>
                 <w:lang w:val="en-US"/>
               </w:rPr>
-              <w:t xml:space="preserve"> }}{%</w:t>
+              <w:t xml:space="preserve"> }}{</w:t>
             </w:r>
             <w:proofErr w:type="gramEnd"/>
             <w:r>
               <w:rPr>
                 <w:lang w:val="en-US"/>
               </w:rPr>
-              <w:t xml:space="preserve"> </w:t>
+              <w:t xml:space="preserve">% </w:t>
             </w:r>
             <w:proofErr w:type="spellStart"/>
             <w:proofErr w:type="gramStart"/>
@@ -9240,38 +9431,77 @@
               <w:rPr>
                 <w:lang w:val="en-US"/>
               </w:rPr>
-              <w:t>template_dict.typo.comments</w:t>
+              <w:t>template_</w:t>
+            </w:r>
+            <w:proofErr w:type="gramStart"/>
+            <w:r>
+              <w:rPr>
+                <w:lang w:val="en-US"/>
+              </w:rPr>
+              <w:t>dict.typo</w:t>
+            </w:r>
+            <w:proofErr w:type="gramEnd"/>
+            <w:r>
+              <w:rPr>
+                <w:lang w:val="en-US"/>
+              </w:rPr>
+              <w:t>.</w:t>
+            </w:r>
+            <w:proofErr w:type="gramStart"/>
+            <w:r>
+              <w:rPr>
+                <w:lang w:val="en-US"/>
+              </w:rPr>
+              <w:t>comments</w:t>
             </w:r>
             <w:proofErr w:type="spellEnd"/>
             <w:r>
-              <w:t xml:space="preserve"> |length &gt; </w:t>
+              <w:t xml:space="preserve"> |length</w:t>
+            </w:r>
+            <w:proofErr w:type="gramEnd"/>
+            <w:r>
+              <w:t xml:space="preserve"> &gt; 0</w:t>
+            </w:r>
+            <w:r>
+              <w:t xml:space="preserve"> </w:t>
             </w:r>
             <w:proofErr w:type="gramStart"/>
             <w:r>
-              <w:t>0</w:t>
-            </w:r>
-            <w:r>
-              <w:t xml:space="preserve"> %}</w:t>
-            </w:r>
-            <w:r>
-              <w:rPr>
-                <w:lang w:val="en-US"/>
-              </w:rPr>
-              <w:t>{%</w:t>
+              <w:t>%}</w:t>
+            </w:r>
+            <w:r>
+              <w:rPr>
+                <w:lang w:val="en-US"/>
+              </w:rPr>
+              <w:t>{</w:t>
             </w:r>
             <w:proofErr w:type="gramEnd"/>
             <w:r>
               <w:rPr>
                 <w:lang w:val="en-US"/>
               </w:rPr>
-              <w:t xml:space="preserve"> for item in </w:t>
+              <w:t xml:space="preserve">% for item in </w:t>
             </w:r>
             <w:proofErr w:type="spellStart"/>
             <w:r>
               <w:rPr>
                 <w:lang w:val="en-US"/>
               </w:rPr>
-              <w:t>template_dict.typo.</w:t>
+              <w:t>template_</w:t>
+            </w:r>
+            <w:proofErr w:type="gramStart"/>
+            <w:r>
+              <w:rPr>
+                <w:lang w:val="en-US"/>
+              </w:rPr>
+              <w:t>dict.typo</w:t>
+            </w:r>
+            <w:proofErr w:type="gramEnd"/>
+            <w:r>
+              <w:rPr>
+                <w:lang w:val="en-US"/>
+              </w:rPr>
+              <w:t>.</w:t>
             </w:r>
             <w:proofErr w:type="gramStart"/>
             <w:r>
@@ -9302,7 +9532,7 @@
               <w:rPr>
                 <w:lang w:val="en-US"/>
               </w:rPr>
-              <w:t>{{ item }}{%</w:t>
+              <w:t>{{ item</w:t>
             </w:r>
             <w:proofErr w:type="gramEnd"/>
             <w:r>
@@ -9310,6 +9540,20 @@
                 <w:lang w:val="en-US"/>
               </w:rPr>
               <w:t xml:space="preserve"> </w:t>
+            </w:r>
+            <w:proofErr w:type="gramStart"/>
+            <w:r>
+              <w:rPr>
+                <w:lang w:val="en-US"/>
+              </w:rPr>
+              <w:t>}}{</w:t>
+            </w:r>
+            <w:proofErr w:type="gramEnd"/>
+            <w:r>
+              <w:rPr>
+                <w:lang w:val="en-US"/>
+              </w:rPr>
+              <w:t xml:space="preserve">% </w:t>
             </w:r>
             <w:proofErr w:type="spellStart"/>
             <w:proofErr w:type="gramStart"/>
@@ -11948,7 +12192,7 @@
               <w:rPr>
                 <w:lang w:val="en-US"/>
               </w:rPr>
-              <w:t>{{ item }}{%</w:t>
+              <w:t>{{ item</w:t>
             </w:r>
             <w:proofErr w:type="gramEnd"/>
             <w:r>
@@ -11956,6 +12200,20 @@
                 <w:lang w:val="en-US"/>
               </w:rPr>
               <w:t xml:space="preserve"> </w:t>
+            </w:r>
+            <w:proofErr w:type="gramStart"/>
+            <w:r>
+              <w:rPr>
+                <w:lang w:val="en-US"/>
+              </w:rPr>
+              <w:t>}}{</w:t>
+            </w:r>
+            <w:proofErr w:type="gramEnd"/>
+            <w:r>
+              <w:rPr>
+                <w:lang w:val="en-US"/>
+              </w:rPr>
+              <w:t xml:space="preserve">% </w:t>
             </w:r>
             <w:proofErr w:type="spellStart"/>
             <w:proofErr w:type="gramStart"/>
@@ -12561,7 +12819,7 @@
               <w:rPr>
                 <w:lang w:val="en-US"/>
               </w:rPr>
-              <w:t>{{ item }}{%</w:t>
+              <w:t>{{ item</w:t>
             </w:r>
             <w:proofErr w:type="gramEnd"/>
             <w:r>
@@ -12569,6 +12827,20 @@
                 <w:lang w:val="en-US"/>
               </w:rPr>
               <w:t xml:space="preserve"> </w:t>
+            </w:r>
+            <w:proofErr w:type="gramStart"/>
+            <w:r>
+              <w:rPr>
+                <w:lang w:val="en-US"/>
+              </w:rPr>
+              <w:t>}}{</w:t>
+            </w:r>
+            <w:proofErr w:type="gramEnd"/>
+            <w:r>
+              <w:rPr>
+                <w:lang w:val="en-US"/>
+              </w:rPr>
+              <w:t xml:space="preserve">% </w:t>
             </w:r>
             <w:proofErr w:type="spellStart"/>
             <w:proofErr w:type="gramStart"/>
@@ -22831,7 +23103,6 @@
   <w:style w:type="character" w:default="1" w:styleId="DefaultParagraphFont">
     <w:name w:val="Default Paragraph Font"/>
     <w:uiPriority w:val="1"/>
-    <w:semiHidden/>
     <w:unhideWhenUsed/>
   </w:style>
   <w:style w:type="table" w:default="1" w:styleId="TableNormal">

</xml_diff>